<commit_message>
Integrate Bar-Ofir (execution law) and Weisman (property law) source scans
Added the Bukar-reversal point and the rule that failure to register a
caution note is not held against the buyer versus an attaching creditor
(Bar-Ofir, Execution ch. 20; Levy v. Hijazi at 761; Caspi v. Ness), and
Weisman's point that caution notes are only available for registered land.
Sources confirmed the existing Weisman and Reichman citations.

Co-Authored-By: Claude Fable 5 <noreply@anthropic.com>
Claude-Session: https://claude.ai/code/session_01PTzmkyUzTNm9DT35momqLP
</commit_message>
<xml_diff>
--- a/seminar/סמינריון-מקרקעין-לא-רשומים.docx
+++ b/seminar/סמינריון-מקרקעין-לא-רשומים.docx
@@ -1340,6 +1340,38 @@
     </w:p>
     <w:p>
       <w:pPr>
+        <w:bidi/>
+        <w:spacing w:after="160" w:line="360"/>
+        <w:ind w:firstLine="420"/>
+        <w:jc w:val="both"/>
+      </w:pPr>
+      <w:r>
+        <w:rPr>
+          <w:rFonts w:ascii="David" w:cs="David" w:eastAsia="David" w:hAnsi="David"/>
+          <w:sz w:val="24"/>
+          <w:szCs w:val="24"/>
+          <w:rtl/>
+        </w:rPr>
+        <w:t xml:space="preserve">להשלמת התמונה חשוב דיוק אחד, שהובלט בספרות ההוצאה לפועל: מחדלו של הקונה מרישום הערת אזהרה אינו נזקף לחובתו במערכה מול הנושה המעקל. הערת האזהרה נועדה למנוע "תאונות משפטיות" בהתנגשות בין עסקאות נוגדות – להזהיר רוכש פוטנציאלי מפני התקשרות עם מי שכבר התחייב; ואולם הנושה הכספי, שנשייתו נולדה בלא כל זיקה לנכס ואשר אינו מסתמך על מצבו הרישומי, אינו נמנה עם מי שההערה נועדה להגן עליהם, ולכן אין הצדקה להעדיפו רק בשל אי־הרישום.</w:t>
+      </w:r>
+      <w:r>
+        <w:rPr>
+          <w:rStyle w:val="FootnoteReference"/>
+        </w:rPr>
+        <w:footnoteReference w:id="23"/>
+      </w:r>
+      <w:r>
+        <w:rPr>
+          <w:rFonts w:ascii="David" w:cs="David" w:eastAsia="David" w:hAnsi="David"/>
+          <w:sz w:val="24"/>
+          <w:szCs w:val="24"/>
+          <w:rtl/>
+        </w:rPr>
+        <w:t xml:space="preserve"> לקביעה זו חשיבות מעשית ראשונה במעלה בענייננו: בסכסוכים הפנים־משפחתיים איש אינו רושם הערות אזהרה – ובמקרקעין שאינם רשומים כלל אף אין אפשרות לרשמן – ובכל זאת אין בכך כדי להפקיר את זכות בני המשפחה לנושי המקנה.</w:t>
+      </w:r>
+    </w:p>
+    <w:p>
+      <w:pPr>
         <w:pStyle w:val="Heading2"/>
         <w:bidi/>
         <w:spacing w:after="180" w:before="280"/>
@@ -1397,7 +1429,7 @@
         <w:rPr>
           <w:rStyle w:val="FootnoteReference"/>
         </w:rPr>
-        <w:footnoteReference w:id="23"/>
+        <w:footnoteReference w:id="24"/>
       </w:r>
       <w:r>
         <w:rPr>
@@ -1432,7 +1464,7 @@
         <w:rPr>
           <w:rStyle w:val="FootnoteReference"/>
         </w:rPr>
-        <w:footnoteReference w:id="24"/>
+        <w:footnoteReference w:id="25"/>
       </w:r>
     </w:p>
     <w:p>
@@ -1475,7 +1507,7 @@
         <w:rPr>
           <w:rStyle w:val="FootnoteReference"/>
         </w:rPr>
-        <w:footnoteReference w:id="25"/>
+        <w:footnoteReference w:id="26"/>
       </w:r>
       <w:r>
         <w:rPr>
@@ -1490,7 +1522,7 @@
         <w:rPr>
           <w:rStyle w:val="FootnoteReference"/>
         </w:rPr>
-        <w:footnoteReference w:id="26"/>
+        <w:footnoteReference w:id="27"/>
       </w:r>
       <w:r>
         <w:rPr>
@@ -1522,7 +1554,7 @@
         <w:rPr>
           <w:rStyle w:val="FootnoteReference"/>
         </w:rPr>
-        <w:footnoteReference w:id="27"/>
+        <w:footnoteReference w:id="28"/>
       </w:r>
       <w:r>
         <w:rPr>
@@ -1557,7 +1589,7 @@
         <w:rPr>
           <w:rStyle w:val="FootnoteReference"/>
         </w:rPr>
-        <w:footnoteReference w:id="28"/>
+        <w:footnoteReference w:id="29"/>
       </w:r>
       <w:r>
         <w:rPr>
@@ -1572,7 +1604,7 @@
         <w:rPr>
           <w:rStyle w:val="FootnoteReference"/>
         </w:rPr>
-        <w:footnoteReference w:id="29"/>
+        <w:footnoteReference w:id="30"/>
       </w:r>
     </w:p>
     <w:p>
@@ -1634,7 +1666,7 @@
         <w:rPr>
           <w:rStyle w:val="FootnoteReference"/>
         </w:rPr>
-        <w:footnoteReference w:id="30"/>
+        <w:footnoteReference w:id="31"/>
       </w:r>
       <w:r>
         <w:rPr>
@@ -1685,7 +1717,7 @@
         <w:rPr>
           <w:rStyle w:val="FootnoteReference"/>
         </w:rPr>
-        <w:footnoteReference w:id="31"/>
+        <w:footnoteReference w:id="32"/>
       </w:r>
       <w:r>
         <w:rPr>
@@ -1700,7 +1732,7 @@
         <w:rPr>
           <w:rStyle w:val="FootnoteReference"/>
         </w:rPr>
-        <w:footnoteReference w:id="32"/>
+        <w:footnoteReference w:id="33"/>
       </w:r>
     </w:p>
     <w:p>
@@ -1723,7 +1755,7 @@
         <w:rPr>
           <w:rStyle w:val="FootnoteReference"/>
         </w:rPr>
-        <w:footnoteReference w:id="33"/>
+        <w:footnoteReference w:id="34"/>
       </w:r>
       <w:r>
         <w:rPr>
@@ -1738,7 +1770,7 @@
         <w:rPr>
           <w:rStyle w:val="FootnoteReference"/>
         </w:rPr>
-        <w:footnoteReference w:id="34"/>
+        <w:footnoteReference w:id="35"/>
       </w:r>
       <w:r>
         <w:rPr>
@@ -1770,7 +1802,7 @@
         <w:rPr>
           <w:rStyle w:val="FootnoteReference"/>
         </w:rPr>
-        <w:footnoteReference w:id="35"/>
+        <w:footnoteReference w:id="36"/>
       </w:r>
       <w:r>
         <w:rPr>
@@ -1821,7 +1853,7 @@
         <w:rPr>
           <w:rStyle w:val="FootnoteReference"/>
         </w:rPr>
-        <w:footnoteReference w:id="36"/>
+        <w:footnoteReference w:id="37"/>
       </w:r>
       <w:r>
         <w:rPr>
@@ -1836,7 +1868,7 @@
         <w:rPr>
           <w:rStyle w:val="FootnoteReference"/>
         </w:rPr>
-        <w:footnoteReference w:id="37"/>
+        <w:footnoteReference w:id="38"/>
       </w:r>
     </w:p>
     <w:p>
@@ -1859,7 +1891,7 @@
         <w:rPr>
           <w:rStyle w:val="FootnoteReference"/>
         </w:rPr>
-        <w:footnoteReference w:id="38"/>
+        <w:footnoteReference w:id="39"/>
       </w:r>
       <w:r>
         <w:rPr>
@@ -1930,7 +1962,7 @@
         <w:rPr>
           <w:rStyle w:val="FootnoteReference"/>
         </w:rPr>
-        <w:footnoteReference w:id="39"/>
+        <w:footnoteReference w:id="40"/>
       </w:r>
       <w:r>
         <w:rPr>
@@ -1945,7 +1977,7 @@
         <w:rPr>
           <w:rStyle w:val="FootnoteReference"/>
         </w:rPr>
-        <w:footnoteReference w:id="40"/>
+        <w:footnoteReference w:id="41"/>
       </w:r>
     </w:p>
     <w:p>
@@ -1987,7 +2019,7 @@
         <w:rPr>
           <w:rStyle w:val="FootnoteReference"/>
         </w:rPr>
-        <w:footnoteReference w:id="41"/>
+        <w:footnoteReference w:id="42"/>
       </w:r>
       <w:r>
         <w:rPr>
@@ -2038,7 +2070,7 @@
         <w:rPr>
           <w:rStyle w:val="FootnoteReference"/>
         </w:rPr>
-        <w:footnoteReference w:id="42"/>
+        <w:footnoteReference w:id="43"/>
       </w:r>
     </w:p>
     <w:p>
@@ -2116,7 +2148,7 @@
         <w:rPr>
           <w:rStyle w:val="FootnoteReference"/>
         </w:rPr>
-        <w:footnoteReference w:id="43"/>
+        <w:footnoteReference w:id="44"/>
       </w:r>
       <w:r>
         <w:rPr>
@@ -2148,7 +2180,7 @@
         <w:rPr>
           <w:rStyle w:val="FootnoteReference"/>
         </w:rPr>
-        <w:footnoteReference w:id="44"/>
+        <w:footnoteReference w:id="45"/>
       </w:r>
     </w:p>
     <w:p>
@@ -2190,7 +2222,7 @@
         <w:rPr>
           <w:rStyle w:val="FootnoteReference"/>
         </w:rPr>
-        <w:footnoteReference w:id="45"/>
+        <w:footnoteReference w:id="46"/>
       </w:r>
       <w:r>
         <w:rPr>
@@ -2241,7 +2273,7 @@
         <w:rPr>
           <w:rStyle w:val="FootnoteReference"/>
         </w:rPr>
-        <w:footnoteReference w:id="46"/>
+        <w:footnoteReference w:id="47"/>
       </w:r>
       <w:r>
         <w:rPr>
@@ -2292,7 +2324,7 @@
         <w:rPr>
           <w:rStyle w:val="FootnoteReference"/>
         </w:rPr>
-        <w:footnoteReference w:id="47"/>
+        <w:footnoteReference w:id="48"/>
       </w:r>
       <w:r>
         <w:rPr>
@@ -2343,7 +2375,7 @@
         <w:rPr>
           <w:rStyle w:val="FootnoteReference"/>
         </w:rPr>
-        <w:footnoteReference w:id="48"/>
+        <w:footnoteReference w:id="49"/>
       </w:r>
       <w:r>
         <w:rPr>
@@ -2413,7 +2445,7 @@
         <w:rPr>
           <w:rStyle w:val="FootnoteReference"/>
         </w:rPr>
-        <w:footnoteReference w:id="49"/>
+        <w:footnoteReference w:id="50"/>
       </w:r>
       <w:r>
         <w:rPr>
@@ -2428,7 +2460,7 @@
         <w:rPr>
           <w:rStyle w:val="FootnoteReference"/>
         </w:rPr>
-        <w:footnoteReference w:id="50"/>
+        <w:footnoteReference w:id="51"/>
       </w:r>
       <w:r>
         <w:rPr>
@@ -2443,7 +2475,7 @@
         <w:rPr>
           <w:rStyle w:val="FootnoteReference"/>
         </w:rPr>
-        <w:footnoteReference w:id="51"/>
+        <w:footnoteReference w:id="52"/>
       </w:r>
       <w:r>
         <w:rPr>
@@ -2458,7 +2490,7 @@
         <w:rPr>
           <w:rStyle w:val="FootnoteReference"/>
         </w:rPr>
-        <w:footnoteReference w:id="52"/>
+        <w:footnoteReference w:id="53"/>
       </w:r>
       <w:r>
         <w:rPr>
@@ -2473,7 +2505,7 @@
         <w:rPr>
           <w:rStyle w:val="FootnoteReference"/>
         </w:rPr>
-        <w:footnoteReference w:id="53"/>
+        <w:footnoteReference w:id="54"/>
       </w:r>
     </w:p>
     <w:p>
@@ -2496,7 +2528,7 @@
         <w:rPr>
           <w:rStyle w:val="FootnoteReference"/>
         </w:rPr>
-        <w:footnoteReference w:id="54"/>
+        <w:footnoteReference w:id="55"/>
       </w:r>
       <w:r>
         <w:rPr>
@@ -2547,7 +2579,7 @@
         <w:rPr>
           <w:rStyle w:val="FootnoteReference"/>
         </w:rPr>
-        <w:footnoteReference w:id="55"/>
+        <w:footnoteReference w:id="56"/>
       </w:r>
       <w:r>
         <w:rPr>
@@ -2579,7 +2611,7 @@
         <w:rPr>
           <w:rStyle w:val="FootnoteReference"/>
         </w:rPr>
-        <w:footnoteReference w:id="56"/>
+        <w:footnoteReference w:id="57"/>
       </w:r>
       <w:r>
         <w:rPr>
@@ -2630,7 +2662,7 @@
         <w:rPr>
           <w:rStyle w:val="FootnoteReference"/>
         </w:rPr>
-        <w:footnoteReference w:id="57"/>
+        <w:footnoteReference w:id="58"/>
       </w:r>
     </w:p>
     <w:p>
@@ -2670,7 +2702,7 @@
         <w:rPr>
           <w:rStyle w:val="FootnoteReference"/>
         </w:rPr>
-        <w:footnoteReference w:id="58"/>
+        <w:footnoteReference w:id="59"/>
       </w:r>
       <w:r>
         <w:rPr>
@@ -2702,7 +2734,7 @@
         <w:rPr>
           <w:rStyle w:val="FootnoteReference"/>
         </w:rPr>
-        <w:footnoteReference w:id="59"/>
+        <w:footnoteReference w:id="60"/>
       </w:r>
       <w:r>
         <w:rPr>
@@ -2827,7 +2859,7 @@
         <w:rPr>
           <w:rStyle w:val="FootnoteReference"/>
         </w:rPr>
-        <w:footnoteReference w:id="60"/>
+        <w:footnoteReference w:id="61"/>
       </w:r>
       <w:r>
         <w:rPr>
@@ -2861,7 +2893,7 @@
         <w:rPr>
           <w:rStyle w:val="FootnoteReference"/>
         </w:rPr>
-        <w:footnoteReference w:id="61"/>
+        <w:footnoteReference w:id="62"/>
       </w:r>
       <w:r>
         <w:rPr>
@@ -2896,7 +2928,7 @@
         <w:rPr>
           <w:rStyle w:val="FootnoteReference"/>
         </w:rPr>
-        <w:footnoteReference w:id="62"/>
+        <w:footnoteReference w:id="63"/>
       </w:r>
     </w:p>
     <w:p>
@@ -2938,7 +2970,7 @@
         <w:rPr>
           <w:rStyle w:val="FootnoteReference"/>
         </w:rPr>
-        <w:footnoteReference w:id="63"/>
+        <w:footnoteReference w:id="64"/>
       </w:r>
       <w:r>
         <w:rPr>
@@ -2989,7 +3021,7 @@
         <w:rPr>
           <w:rStyle w:val="FootnoteReference"/>
         </w:rPr>
-        <w:footnoteReference w:id="64"/>
+        <w:footnoteReference w:id="65"/>
       </w:r>
       <w:r>
         <w:rPr>
@@ -3004,7 +3036,7 @@
         <w:rPr>
           <w:rStyle w:val="FootnoteReference"/>
         </w:rPr>
-        <w:footnoteReference w:id="65"/>
+        <w:footnoteReference w:id="66"/>
       </w:r>
     </w:p>
     <w:p>
@@ -3063,7 +3095,7 @@
         <w:rPr>
           <w:rStyle w:val="FootnoteReference"/>
         </w:rPr>
-        <w:footnoteReference w:id="66"/>
+        <w:footnoteReference w:id="67"/>
       </w:r>
       <w:r>
         <w:rPr>
@@ -3114,7 +3146,7 @@
         <w:rPr>
           <w:rStyle w:val="FootnoteReference"/>
         </w:rPr>
-        <w:footnoteReference w:id="67"/>
+        <w:footnoteReference w:id="68"/>
       </w:r>
       <w:r>
         <w:rPr>
@@ -3148,7 +3180,7 @@
         <w:rPr>
           <w:rStyle w:val="FootnoteReference"/>
         </w:rPr>
-        <w:footnoteReference w:id="68"/>
+        <w:footnoteReference w:id="69"/>
       </w:r>
       <w:r>
         <w:rPr>
@@ -3236,7 +3268,7 @@
         <w:rPr>
           <w:rStyle w:val="FootnoteReference"/>
         </w:rPr>
-        <w:footnoteReference w:id="69"/>
+        <w:footnoteReference w:id="70"/>
       </w:r>
       <w:r>
         <w:rPr>
@@ -3270,7 +3302,7 @@
         <w:rPr>
           <w:rStyle w:val="FootnoteReference"/>
         </w:rPr>
-        <w:footnoteReference w:id="70"/>
+        <w:footnoteReference w:id="71"/>
       </w:r>
       <w:r>
         <w:rPr>
@@ -3304,7 +3336,7 @@
         <w:rPr>
           <w:rStyle w:val="FootnoteReference"/>
         </w:rPr>
-        <w:footnoteReference w:id="71"/>
+        <w:footnoteReference w:id="72"/>
       </w:r>
       <w:r>
         <w:rPr>
@@ -3319,7 +3351,7 @@
         <w:rPr>
           <w:rStyle w:val="FootnoteReference"/>
         </w:rPr>
-        <w:footnoteReference w:id="72"/>
+        <w:footnoteReference w:id="73"/>
       </w:r>
       <w:r>
         <w:rPr>
@@ -3334,7 +3366,7 @@
         <w:rPr>
           <w:rStyle w:val="FootnoteReference"/>
         </w:rPr>
-        <w:footnoteReference w:id="73"/>
+        <w:footnoteReference w:id="74"/>
       </w:r>
     </w:p>
     <w:p>
@@ -3395,7 +3427,7 @@
         <w:rPr>
           <w:rStyle w:val="FootnoteReference"/>
         </w:rPr>
-        <w:footnoteReference w:id="74"/>
+        <w:footnoteReference w:id="75"/>
       </w:r>
       <w:r>
         <w:rPr>
@@ -3410,7 +3442,7 @@
         <w:rPr>
           <w:rStyle w:val="FootnoteReference"/>
         </w:rPr>
-        <w:footnoteReference w:id="75"/>
+        <w:footnoteReference w:id="76"/>
       </w:r>
       <w:r>
         <w:rPr>
@@ -3425,7 +3457,7 @@
         <w:rPr>
           <w:rStyle w:val="FootnoteReference"/>
         </w:rPr>
-        <w:footnoteReference w:id="76"/>
+        <w:footnoteReference w:id="77"/>
       </w:r>
     </w:p>
     <w:p>
@@ -3467,7 +3499,7 @@
         <w:rPr>
           <w:rStyle w:val="FootnoteReference"/>
         </w:rPr>
-        <w:footnoteReference w:id="77"/>
+        <w:footnoteReference w:id="78"/>
       </w:r>
       <w:r>
         <w:rPr>
@@ -3482,7 +3514,7 @@
         <w:rPr>
           <w:rStyle w:val="FootnoteReference"/>
         </w:rPr>
-        <w:footnoteReference w:id="78"/>
+        <w:footnoteReference w:id="79"/>
       </w:r>
     </w:p>
     <w:p>
@@ -3524,7 +3556,7 @@
         <w:rPr>
           <w:rStyle w:val="FootnoteReference"/>
         </w:rPr>
-        <w:footnoteReference w:id="79"/>
+        <w:footnoteReference w:id="80"/>
       </w:r>
       <w:r>
         <w:rPr>
@@ -3539,7 +3571,7 @@
         <w:rPr>
           <w:rStyle w:val="FootnoteReference"/>
         </w:rPr>
-        <w:footnoteReference w:id="80"/>
+        <w:footnoteReference w:id="81"/>
       </w:r>
       <w:r>
         <w:rPr>
@@ -3554,7 +3586,7 @@
         <w:rPr>
           <w:rStyle w:val="FootnoteReference"/>
         </w:rPr>
-        <w:footnoteReference w:id="81"/>
+        <w:footnoteReference w:id="82"/>
       </w:r>
       <w:r>
         <w:rPr>
@@ -3569,7 +3601,7 @@
         <w:rPr>
           <w:rStyle w:val="FootnoteReference"/>
         </w:rPr>
-        <w:footnoteReference w:id="82"/>
+        <w:footnoteReference w:id="83"/>
       </w:r>
     </w:p>
     <w:p>
@@ -3611,7 +3643,7 @@
         <w:rPr>
           <w:rStyle w:val="FootnoteReference"/>
         </w:rPr>
-        <w:footnoteReference w:id="83"/>
+        <w:footnoteReference w:id="84"/>
       </w:r>
       <w:r>
         <w:rPr>
@@ -3626,7 +3658,7 @@
         <w:rPr>
           <w:rStyle w:val="FootnoteReference"/>
         </w:rPr>
-        <w:footnoteReference w:id="84"/>
+        <w:footnoteReference w:id="85"/>
       </w:r>
       <w:r>
         <w:rPr>
@@ -3641,7 +3673,7 @@
         <w:rPr>
           <w:rStyle w:val="FootnoteReference"/>
         </w:rPr>
-        <w:footnoteReference w:id="85"/>
+        <w:footnoteReference w:id="86"/>
       </w:r>
       <w:r>
         <w:rPr>
@@ -3711,7 +3743,7 @@
         <w:rPr>
           <w:rStyle w:val="FootnoteReference"/>
         </w:rPr>
-        <w:footnoteReference w:id="86"/>
+        <w:footnoteReference w:id="87"/>
       </w:r>
       <w:r>
         <w:rPr>
@@ -3762,7 +3794,7 @@
         <w:rPr>
           <w:rStyle w:val="FootnoteReference"/>
         </w:rPr>
-        <w:footnoteReference w:id="87"/>
+        <w:footnoteReference w:id="88"/>
       </w:r>
       <w:r>
         <w:rPr>
@@ -3777,7 +3809,7 @@
         <w:rPr>
           <w:rStyle w:val="FootnoteReference"/>
         </w:rPr>
-        <w:footnoteReference w:id="88"/>
+        <w:footnoteReference w:id="89"/>
       </w:r>
       <w:r>
         <w:rPr>
@@ -3792,7 +3824,7 @@
         <w:rPr>
           <w:rStyle w:val="FootnoteReference"/>
         </w:rPr>
-        <w:footnoteReference w:id="89"/>
+        <w:footnoteReference w:id="90"/>
       </w:r>
     </w:p>
     <w:p>
@@ -3815,7 +3847,7 @@
         <w:rPr>
           <w:rStyle w:val="FootnoteReference"/>
         </w:rPr>
-        <w:footnoteReference w:id="90"/>
+        <w:footnoteReference w:id="91"/>
       </w:r>
     </w:p>
     <w:p>
@@ -3857,7 +3889,7 @@
         <w:rPr>
           <w:rStyle w:val="FootnoteReference"/>
         </w:rPr>
-        <w:footnoteReference w:id="91"/>
+        <w:footnoteReference w:id="92"/>
       </w:r>
       <w:r>
         <w:rPr>
@@ -3872,7 +3904,7 @@
         <w:rPr>
           <w:rStyle w:val="FootnoteReference"/>
         </w:rPr>
-        <w:footnoteReference w:id="92"/>
+        <w:footnoteReference w:id="93"/>
       </w:r>
       <w:r>
         <w:rPr>
@@ -3887,7 +3919,7 @@
         <w:rPr>
           <w:rStyle w:val="FootnoteReference"/>
         </w:rPr>
-        <w:footnoteReference w:id="93"/>
+        <w:footnoteReference w:id="94"/>
       </w:r>
       <w:r>
         <w:rPr>
@@ -3938,7 +3970,7 @@
         <w:rPr>
           <w:rStyle w:val="FootnoteReference"/>
         </w:rPr>
-        <w:footnoteReference w:id="94"/>
+        <w:footnoteReference w:id="95"/>
       </w:r>
       <w:r>
         <w:rPr>
@@ -3953,7 +3985,7 @@
         <w:rPr>
           <w:rStyle w:val="FootnoteReference"/>
         </w:rPr>
-        <w:footnoteReference w:id="95"/>
+        <w:footnoteReference w:id="96"/>
       </w:r>
       <w:r>
         <w:rPr>
@@ -3968,7 +4000,7 @@
         <w:rPr>
           <w:rStyle w:val="FootnoteReference"/>
         </w:rPr>
-        <w:footnoteReference w:id="96"/>
+        <w:footnoteReference w:id="97"/>
       </w:r>
       <w:r>
         <w:rPr>
@@ -3983,7 +4015,7 @@
         <w:rPr>
           <w:rStyle w:val="FootnoteReference"/>
         </w:rPr>
-        <w:footnoteReference w:id="97"/>
+        <w:footnoteReference w:id="98"/>
       </w:r>
       <w:r>
         <w:rPr>
@@ -4129,7 +4161,7 @@
         <w:rPr>
           <w:rStyle w:val="FootnoteReference"/>
         </w:rPr>
-        <w:footnoteReference w:id="98"/>
+        <w:footnoteReference w:id="99"/>
       </w:r>
     </w:p>
     <w:p>
@@ -4254,7 +4286,7 @@
         <w:rPr>
           <w:rStyle w:val="FootnoteReference"/>
         </w:rPr>
-        <w:footnoteReference w:id="99"/>
+        <w:footnoteReference w:id="100"/>
       </w:r>
       <w:r>
         <w:rPr>
@@ -4269,7 +4301,7 @@
         <w:rPr>
           <w:rStyle w:val="FootnoteReference"/>
         </w:rPr>
-        <w:footnoteReference w:id="100"/>
+        <w:footnoteReference w:id="101"/>
       </w:r>
       <w:r>
         <w:rPr>
@@ -4301,7 +4333,7 @@
         <w:rPr>
           <w:rStyle w:val="FootnoteReference"/>
         </w:rPr>
-        <w:footnoteReference w:id="101"/>
+        <w:footnoteReference w:id="102"/>
       </w:r>
       <w:r>
         <w:rPr>
@@ -4363,7 +4395,7 @@
         <w:rPr>
           <w:rStyle w:val="FootnoteReference"/>
         </w:rPr>
-        <w:footnoteReference w:id="102"/>
+        <w:footnoteReference w:id="103"/>
       </w:r>
     </w:p>
     <w:p>
@@ -4397,7 +4429,7 @@
         <w:rPr>
           <w:rStyle w:val="FootnoteReference"/>
         </w:rPr>
-        <w:footnoteReference w:id="103"/>
+        <w:footnoteReference w:id="104"/>
       </w:r>
     </w:p>
     <w:p>
@@ -4888,7 +4920,7 @@
           <w:szCs w:val="24"/>
           <w:rtl/>
         </w:rPr>
-        <w:t xml:space="preserve">ע"א 726/71 </w:t>
+        <w:t xml:space="preserve">בר"ע 178/70 </w:t>
       </w:r>
       <w:r>
         <w:rPr>
@@ -4899,16 +4931,16 @@
           <w:szCs w:val="24"/>
           <w:rtl/>
         </w:rPr>
-        <w:t xml:space="preserve">גרוסמן את ק.ב.ק. בע"מ נ׳ מנהלי עזבון בידרמן</w:t>
-      </w:r>
-      <w:r>
-        <w:rPr>
-          <w:rFonts w:ascii="David" w:cs="David" w:eastAsia="David" w:hAnsi="David"/>
-          <w:sz w:val="24"/>
-          <w:szCs w:val="24"/>
-          <w:rtl/>
-        </w:rPr>
-        <w:t xml:space="preserve">, פ"ד כו(2) 781 (1972).</w:t>
+        <w:t xml:space="preserve">בוקר נ׳ חברה אנגלו-ישראלית לניהול ואחריות בע"מ</w:t>
+      </w:r>
+      <w:r>
+        <w:rPr>
+          <w:rFonts w:ascii="David" w:cs="David" w:eastAsia="David" w:hAnsi="David"/>
+          <w:sz w:val="24"/>
+          <w:szCs w:val="24"/>
+          <w:rtl/>
+        </w:rPr>
+        <w:t xml:space="preserve">, פ"ד כה(2) 121 (1971).</w:t>
       </w:r>
     </w:p>
     <w:p>
@@ -4925,7 +4957,7 @@
           <w:szCs w:val="24"/>
           <w:rtl/>
         </w:rPr>
-        <w:t xml:space="preserve">ע"א 463/79 </w:t>
+        <w:t xml:space="preserve">ע"א 726/71 </w:t>
       </w:r>
       <w:r>
         <w:rPr>
@@ -4936,16 +4968,16 @@
           <w:szCs w:val="24"/>
           <w:rtl/>
         </w:rPr>
-        <w:t xml:space="preserve">ג׳בראן נ׳ ג׳בראן</w:t>
-      </w:r>
-      <w:r>
-        <w:rPr>
-          <w:rFonts w:ascii="David" w:cs="David" w:eastAsia="David" w:hAnsi="David"/>
-          <w:sz w:val="24"/>
-          <w:szCs w:val="24"/>
-          <w:rtl/>
-        </w:rPr>
-        <w:t xml:space="preserve">, פ"ד לו(4) 403 (1982).</w:t>
+        <w:t xml:space="preserve">גרוסמן את ק.ב.ק. בע"מ נ׳ מנהלי עזבון בידרמן</w:t>
+      </w:r>
+      <w:r>
+        <w:rPr>
+          <w:rFonts w:ascii="David" w:cs="David" w:eastAsia="David" w:hAnsi="David"/>
+          <w:sz w:val="24"/>
+          <w:szCs w:val="24"/>
+          <w:rtl/>
+        </w:rPr>
+        <w:t xml:space="preserve">, פ"ד כו(2) 781 (1972).</w:t>
       </w:r>
     </w:p>
     <w:p>
@@ -4962,7 +4994,7 @@
           <w:szCs w:val="24"/>
           <w:rtl/>
         </w:rPr>
-        <w:t xml:space="preserve">ע"א 496/82 </w:t>
+        <w:t xml:space="preserve">ע"א 463/79 </w:t>
       </w:r>
       <w:r>
         <w:rPr>
@@ -4973,16 +5005,16 @@
           <w:szCs w:val="24"/>
           <w:rtl/>
         </w:rPr>
-        <w:t xml:space="preserve">רוזן נ׳ סלונים</w:t>
-      </w:r>
-      <w:r>
-        <w:rPr>
-          <w:rFonts w:ascii="David" w:cs="David" w:eastAsia="David" w:hAnsi="David"/>
-          <w:sz w:val="24"/>
-          <w:szCs w:val="24"/>
-          <w:rtl/>
-        </w:rPr>
-        <w:t xml:space="preserve">, פ"ד לט(2) 337 (1985).</w:t>
+        <w:t xml:space="preserve">ג׳בראן נ׳ ג׳בראן</w:t>
+      </w:r>
+      <w:r>
+        <w:rPr>
+          <w:rFonts w:ascii="David" w:cs="David" w:eastAsia="David" w:hAnsi="David"/>
+          <w:sz w:val="24"/>
+          <w:szCs w:val="24"/>
+          <w:rtl/>
+        </w:rPr>
+        <w:t xml:space="preserve">, פ"ד לו(4) 403 (1982).</w:t>
       </w:r>
     </w:p>
     <w:p>
@@ -4999,7 +5031,7 @@
           <w:szCs w:val="24"/>
           <w:rtl/>
         </w:rPr>
-        <w:t xml:space="preserve">ע"א 986/93 </w:t>
+        <w:t xml:space="preserve">ע"א 496/82 </w:t>
       </w:r>
       <w:r>
         <w:rPr>
@@ -5010,16 +5042,16 @@
           <w:szCs w:val="24"/>
           <w:rtl/>
         </w:rPr>
-        <w:t xml:space="preserve">קלמר נ׳ גיא</w:t>
-      </w:r>
-      <w:r>
-        <w:rPr>
-          <w:rFonts w:ascii="David" w:cs="David" w:eastAsia="David" w:hAnsi="David"/>
-          <w:sz w:val="24"/>
-          <w:szCs w:val="24"/>
-          <w:rtl/>
-        </w:rPr>
-        <w:t xml:space="preserve">, פ"ד נ(1) 185 (1996).</w:t>
+        <w:t xml:space="preserve">רוזן נ׳ סלונים</w:t>
+      </w:r>
+      <w:r>
+        <w:rPr>
+          <w:rFonts w:ascii="David" w:cs="David" w:eastAsia="David" w:hAnsi="David"/>
+          <w:sz w:val="24"/>
+          <w:szCs w:val="24"/>
+          <w:rtl/>
+        </w:rPr>
+        <w:t xml:space="preserve">, פ"ד לט(2) 337 (1985).</w:t>
       </w:r>
     </w:p>
     <w:p>
@@ -5036,7 +5068,7 @@
           <w:szCs w:val="24"/>
           <w:rtl/>
         </w:rPr>
-        <w:t xml:space="preserve">ע"א 189/95 </w:t>
+        <w:t xml:space="preserve">ע"א 986/93 </w:t>
       </w:r>
       <w:r>
         <w:rPr>
@@ -5047,16 +5079,16 @@
           <w:szCs w:val="24"/>
           <w:rtl/>
         </w:rPr>
-        <w:t xml:space="preserve">בנק אוצר החייל בע"מ נ׳ אהרונוב</w:t>
-      </w:r>
-      <w:r>
-        <w:rPr>
-          <w:rFonts w:ascii="David" w:cs="David" w:eastAsia="David" w:hAnsi="David"/>
-          <w:sz w:val="24"/>
-          <w:szCs w:val="24"/>
-          <w:rtl/>
-        </w:rPr>
-        <w:t xml:space="preserve">, פ"ד נג(4) 199 (1999).</w:t>
+        <w:t xml:space="preserve">קלמר נ׳ גיא</w:t>
+      </w:r>
+      <w:r>
+        <w:rPr>
+          <w:rFonts w:ascii="David" w:cs="David" w:eastAsia="David" w:hAnsi="David"/>
+          <w:sz w:val="24"/>
+          <w:szCs w:val="24"/>
+          <w:rtl/>
+        </w:rPr>
+        <w:t xml:space="preserve">, פ"ד נ(1) 185 (1996).</w:t>
       </w:r>
     </w:p>
     <w:p>
@@ -5073,7 +5105,7 @@
           <w:szCs w:val="24"/>
           <w:rtl/>
         </w:rPr>
-        <w:t xml:space="preserve">ע"א 1516/99 </w:t>
+        <w:t xml:space="preserve">ע"א 189/95 </w:t>
       </w:r>
       <w:r>
         <w:rPr>
@@ -5084,16 +5116,16 @@
           <w:szCs w:val="24"/>
           <w:rtl/>
         </w:rPr>
-        <w:t xml:space="preserve">לוי נ׳ חיג׳אזי</w:t>
-      </w:r>
-      <w:r>
-        <w:rPr>
-          <w:rFonts w:ascii="David" w:cs="David" w:eastAsia="David" w:hAnsi="David"/>
-          <w:sz w:val="24"/>
-          <w:szCs w:val="24"/>
-          <w:rtl/>
-        </w:rPr>
-        <w:t xml:space="preserve">, פ"ד נה(4) 730 (2001).</w:t>
+        <w:t xml:space="preserve">בנק אוצר החייל בע"מ נ׳ אהרונוב</w:t>
+      </w:r>
+      <w:r>
+        <w:rPr>
+          <w:rFonts w:ascii="David" w:cs="David" w:eastAsia="David" w:hAnsi="David"/>
+          <w:sz w:val="24"/>
+          <w:szCs w:val="24"/>
+          <w:rtl/>
+        </w:rPr>
+        <w:t xml:space="preserve">, פ"ד נג(4) 199 (1999).</w:t>
       </w:r>
     </w:p>
     <w:p>
@@ -5110,7 +5142,7 @@
           <w:szCs w:val="24"/>
           <w:rtl/>
         </w:rPr>
-        <w:t xml:space="preserve">ע"א 3205/00 </w:t>
+        <w:t xml:space="preserve">ע"א 1516/99 </w:t>
       </w:r>
       <w:r>
         <w:rPr>
@@ -5121,6 +5153,43 @@
           <w:szCs w:val="24"/>
           <w:rtl/>
         </w:rPr>
+        <w:t xml:space="preserve">לוי נ׳ חיג׳אזי</w:t>
+      </w:r>
+      <w:r>
+        <w:rPr>
+          <w:rFonts w:ascii="David" w:cs="David" w:eastAsia="David" w:hAnsi="David"/>
+          <w:sz w:val="24"/>
+          <w:szCs w:val="24"/>
+          <w:rtl/>
+        </w:rPr>
+        <w:t xml:space="preserve">, פ"ד נה(4) 730 (2001).</w:t>
+      </w:r>
+    </w:p>
+    <w:p>
+      <w:pPr>
+        <w:bidi/>
+        <w:spacing w:after="120" w:line="300"/>
+        <w:ind w:start="420" w:hanging="420"/>
+        <w:jc w:val="both"/>
+      </w:pPr>
+      <w:r>
+        <w:rPr>
+          <w:rFonts w:ascii="David" w:cs="David" w:eastAsia="David" w:hAnsi="David"/>
+          <w:sz w:val="24"/>
+          <w:szCs w:val="24"/>
+          <w:rtl/>
+        </w:rPr>
+        <w:t xml:space="preserve">ע"א 3205/00 </w:t>
+      </w:r>
+      <w:r>
+        <w:rPr>
+          <w:rFonts w:ascii="David" w:cs="David" w:eastAsia="David" w:hAnsi="David"/>
+          <w:i/>
+          <w:iCs/>
+          <w:sz w:val="24"/>
+          <w:szCs w:val="24"/>
+          <w:rtl/>
+        </w:rPr>
         <w:t xml:space="preserve">נאטור נ׳ יאסין</w:t>
       </w:r>
       <w:r>
@@ -5131,6 +5200,43 @@
           <w:rtl/>
         </w:rPr>
         <w:t xml:space="preserve">, פ"ד נה(4) 145 (2001).</w:t>
+      </w:r>
+    </w:p>
+    <w:p>
+      <w:pPr>
+        <w:bidi/>
+        <w:spacing w:after="120" w:line="300"/>
+        <w:ind w:start="420" w:hanging="420"/>
+        <w:jc w:val="both"/>
+      </w:pPr>
+      <w:r>
+        <w:rPr>
+          <w:rFonts w:ascii="David" w:cs="David" w:eastAsia="David" w:hAnsi="David"/>
+          <w:sz w:val="24"/>
+          <w:szCs w:val="24"/>
+          <w:rtl/>
+        </w:rPr>
+        <w:t xml:space="preserve">ע"א 3911/01 </w:t>
+      </w:r>
+      <w:r>
+        <w:rPr>
+          <w:rFonts w:ascii="David" w:cs="David" w:eastAsia="David" w:hAnsi="David"/>
+          <w:i/>
+          <w:iCs/>
+          <w:sz w:val="24"/>
+          <w:szCs w:val="24"/>
+          <w:rtl/>
+        </w:rPr>
+        <w:t xml:space="preserve">כספי נ׳ נס</w:t>
+      </w:r>
+      <w:r>
+        <w:rPr>
+          <w:rFonts w:ascii="David" w:cs="David" w:eastAsia="David" w:hAnsi="David"/>
+          <w:sz w:val="24"/>
+          <w:szCs w:val="24"/>
+          <w:rtl/>
+        </w:rPr>
+        <w:t xml:space="preserve">, פ"ד נו(6) 752 (2002).</w:t>
       </w:r>
     </w:p>
     <w:p>
@@ -5567,6 +5673,43 @@
           <w:rtl/>
         </w:rPr>
         <w:t xml:space="preserve">ספרות עברית</w:t>
+      </w:r>
+    </w:p>
+    <w:p>
+      <w:pPr>
+        <w:bidi/>
+        <w:spacing w:after="120" w:line="300"/>
+        <w:ind w:start="420" w:hanging="420"/>
+        <w:jc w:val="both"/>
+      </w:pPr>
+      <w:r>
+        <w:rPr>
+          <w:rFonts w:ascii="David" w:cs="David" w:eastAsia="David" w:hAnsi="David"/>
+          <w:sz w:val="24"/>
+          <w:szCs w:val="24"/>
+          <w:rtl/>
+        </w:rPr>
+        <w:t xml:space="preserve">דוד בר-אופיר </w:t>
+      </w:r>
+      <w:r>
+        <w:rPr>
+          <w:rFonts w:ascii="David" w:cs="David" w:eastAsia="David" w:hAnsi="David"/>
+          <w:i/>
+          <w:iCs/>
+          <w:sz w:val="24"/>
+          <w:szCs w:val="24"/>
+          <w:rtl/>
+        </w:rPr>
+        <w:t xml:space="preserve">הוצאה לפועל – הליכים והלכות</w:t>
+      </w:r>
+      <w:r>
+        <w:rPr>
+          <w:rFonts w:ascii="David" w:cs="David" w:eastAsia="David" w:hAnsi="David"/>
+          <w:sz w:val="24"/>
+          <w:szCs w:val="24"/>
+          <w:rtl/>
+        </w:rPr>
+        <w:t xml:space="preserve"> (מהדורה שביעית, 2018).</w:t>
       </w:r>
     </w:p>
     <w:p>
@@ -7064,7 +7207,27 @@
           <w:szCs w:val="20"/>
           <w:rtl/>
         </w:rPr>
-        <w:t xml:space="preserve">ס׳ 126–127 לחוק המקרקעין. לניתוח מוסדי ראו אוריאל רייכמן "הערת האזהרה – מהות, יצירה והגנה כנגד עסקות נוגדות" עיוני משפט י 297 (1984).</w:t>
+        <w:t xml:space="preserve">ס׳ 126–127 לחוק המקרקעין. לניתוח מוסדי ראו אוריאל רייכמן "הערת האזהרה – מהות, יצירה והגנה כנגד עסקות נוגדות" עיוני משפט י 297 (1984). ודוק: הערת אזהרה ניתנת לרישום רק במקרקעין הרשומים במרשם, כך שבמקרקעין בלתי רשומים אין אפילו כלי ביניים זה זמין: יהושע ויסמן </w:t>
+      </w:r>
+      <w:r>
+        <w:rPr>
+          <w:rFonts w:ascii="David" w:cs="David" w:eastAsia="David" w:hAnsi="David"/>
+          <w:i/>
+          <w:iCs/>
+          <w:sz w:val="20"/>
+          <w:szCs w:val="20"/>
+          <w:rtl/>
+        </w:rPr>
+        <w:t xml:space="preserve">דיני קניין – חלק כללי</w:t>
+      </w:r>
+      <w:r>
+        <w:rPr>
+          <w:rFonts w:ascii="David" w:cs="David" w:eastAsia="David" w:hAnsi="David"/>
+          <w:sz w:val="20"/>
+          <w:szCs w:val="20"/>
+          <w:rtl/>
+        </w:rPr>
+        <w:t xml:space="preserve"> 327–328 (1993).</w:t>
       </w:r>
     </w:p>
   </w:footnote>
@@ -7450,7 +7613,27 @@
           <w:szCs w:val="20"/>
           <w:rtl/>
         </w:rPr>
-        <w:t xml:space="preserve">).</w:t>
+        <w:t xml:space="preserve">). בכך נהפכה ההלכה הקודמת, שראתה בזכות הבלתי רשומה זכות הנסוגה מפני עיקול: בר"ע 178/70 </w:t>
+      </w:r>
+      <w:r>
+        <w:rPr>
+          <w:rFonts w:ascii="David" w:cs="David" w:eastAsia="David" w:hAnsi="David"/>
+          <w:i/>
+          <w:iCs/>
+          <w:sz w:val="20"/>
+          <w:szCs w:val="20"/>
+          <w:rtl/>
+        </w:rPr>
+        <w:t xml:space="preserve">בוקר נ׳ חברה אנגלו-ישראלית לניהול ואחריות בע"מ</w:t>
+      </w:r>
+      <w:r>
+        <w:rPr>
+          <w:rFonts w:ascii="David" w:cs="David" w:eastAsia="David" w:hAnsi="David"/>
+          <w:sz w:val="20"/>
+          <w:szCs w:val="20"/>
+          <w:rtl/>
+        </w:rPr>
+        <w:t xml:space="preserve">, פ"ד כה(2) 121 (1971).</w:t>
       </w:r>
     </w:p>
   </w:footnote>
@@ -7582,7 +7765,7 @@
           <w:szCs w:val="20"/>
           <w:rtl/>
         </w:rPr>
-        <w:t xml:space="preserve">ע"א 3205/00 </w:t>
+        <w:t xml:space="preserve">דוד בר-אופיר </w:t>
       </w:r>
       <w:r>
         <w:rPr>
@@ -7593,16 +7776,74 @@
           <w:szCs w:val="20"/>
           <w:rtl/>
         </w:rPr>
-        <w:t xml:space="preserve">נאטור נ׳ יאסין</w:t>
-      </w:r>
-      <w:r>
-        <w:rPr>
-          <w:rFonts w:ascii="David" w:cs="David" w:eastAsia="David" w:hAnsi="David"/>
-          <w:sz w:val="20"/>
-          <w:szCs w:val="20"/>
-          <w:rtl/>
-        </w:rPr>
-        <w:t xml:space="preserve">, פ"ד נה(4) 145 (2001).</w:t>
+        <w:t xml:space="preserve">הוצאה לפועל – הליכים והלכות</w:t>
+      </w:r>
+      <w:r>
+        <w:rPr>
+          <w:rFonts w:ascii="David" w:cs="David" w:eastAsia="David" w:hAnsi="David"/>
+          <w:sz w:val="20"/>
+          <w:szCs w:val="20"/>
+          <w:rtl/>
+        </w:rPr>
+        <w:t xml:space="preserve"> 687–691 (מהדורה שביעית, 2018); עניין </w:t>
+      </w:r>
+      <w:r>
+        <w:rPr>
+          <w:rFonts w:ascii="David" w:cs="David" w:eastAsia="David" w:hAnsi="David"/>
+          <w:i/>
+          <w:iCs/>
+          <w:sz w:val="20"/>
+          <w:szCs w:val="20"/>
+          <w:rtl/>
+        </w:rPr>
+        <w:t xml:space="preserve">לוי נ׳ חיג׳אזי</w:t>
+      </w:r>
+      <w:r>
+        <w:rPr>
+          <w:rFonts w:ascii="David" w:cs="David" w:eastAsia="David" w:hAnsi="David"/>
+          <w:sz w:val="20"/>
+          <w:szCs w:val="20"/>
+          <w:rtl/>
+        </w:rPr>
+        <w:t xml:space="preserve">, </w:t>
+      </w:r>
+      <w:r>
+        <w:rPr>
+          <w:rFonts w:ascii="David" w:cs="David" w:eastAsia="David" w:hAnsi="David"/>
+          <w:sz w:val="20"/>
+          <w:szCs w:val="20"/>
+          <w:rtl/>
+        </w:rPr>
+        <w:t xml:space="preserve">לעיל ה"ש 21</w:t>
+      </w:r>
+      <w:r>
+        <w:rPr>
+          <w:rFonts w:ascii="David" w:cs="David" w:eastAsia="David" w:hAnsi="David"/>
+          <w:sz w:val="20"/>
+          <w:szCs w:val="20"/>
+          <w:rtl/>
+        </w:rPr>
+        <w:t xml:space="preserve">, בעמ׳ 761; ע"א 3911/01 </w:t>
+      </w:r>
+      <w:r>
+        <w:rPr>
+          <w:rFonts w:ascii="David" w:cs="David" w:eastAsia="David" w:hAnsi="David"/>
+          <w:i/>
+          <w:iCs/>
+          <w:sz w:val="20"/>
+          <w:szCs w:val="20"/>
+          <w:rtl/>
+        </w:rPr>
+        <w:t xml:space="preserve">כספי נ׳ נס</w:t>
+      </w:r>
+      <w:r>
+        <w:rPr>
+          <w:rFonts w:ascii="David" w:cs="David" w:eastAsia="David" w:hAnsi="David"/>
+          <w:sz w:val="20"/>
+          <w:szCs w:val="20"/>
+          <w:rtl/>
+        </w:rPr>
+        <w:t xml:space="preserve">, פ"ד נו(6) 752 (2002).</w:t>
       </w:r>
     </w:p>
   </w:footnote>
@@ -7625,7 +7866,7 @@
           <w:szCs w:val="20"/>
           <w:rtl/>
         </w:rPr>
-        <w:t xml:space="preserve">עניין </w:t>
+        <w:t xml:space="preserve">ע"א 3205/00 </w:t>
       </w:r>
       <w:r>
         <w:rPr>
@@ -7636,34 +7877,16 @@
           <w:szCs w:val="20"/>
           <w:rtl/>
         </w:rPr>
-        <w:t xml:space="preserve">לוי נ׳ חיג׳אזי</w:t>
-      </w:r>
-      <w:r>
-        <w:rPr>
-          <w:rFonts w:ascii="David" w:cs="David" w:eastAsia="David" w:hAnsi="David"/>
-          <w:sz w:val="20"/>
-          <w:szCs w:val="20"/>
-          <w:rtl/>
-        </w:rPr>
-        <w:t xml:space="preserve">, </w:t>
-      </w:r>
-      <w:r>
-        <w:rPr>
-          <w:rFonts w:ascii="David" w:cs="David" w:eastAsia="David" w:hAnsi="David"/>
-          <w:sz w:val="20"/>
-          <w:szCs w:val="20"/>
-          <w:rtl/>
-        </w:rPr>
-        <w:t xml:space="preserve">לעיל ה"ש 21</w:t>
-      </w:r>
-      <w:r>
-        <w:rPr>
-          <w:rFonts w:ascii="David" w:cs="David" w:eastAsia="David" w:hAnsi="David"/>
-          <w:sz w:val="20"/>
-          <w:szCs w:val="20"/>
-          <w:rtl/>
-        </w:rPr>
-        <w:t xml:space="preserve">.</w:t>
+        <w:t xml:space="preserve">נאטור נ׳ יאסין</w:t>
+      </w:r>
+      <w:r>
+        <w:rPr>
+          <w:rFonts w:ascii="David" w:cs="David" w:eastAsia="David" w:hAnsi="David"/>
+          <w:sz w:val="20"/>
+          <w:szCs w:val="20"/>
+          <w:rtl/>
+        </w:rPr>
+        <w:t xml:space="preserve">, פ"ד נה(4) 145 (2001).</w:t>
       </w:r>
     </w:p>
   </w:footnote>
@@ -7686,7 +7909,7 @@
           <w:szCs w:val="20"/>
           <w:rtl/>
         </w:rPr>
-        <w:t xml:space="preserve">ע"א 3274/18 </w:t>
+        <w:t xml:space="preserve">עניין </w:t>
       </w:r>
       <w:r>
         <w:rPr>
@@ -7697,16 +7920,34 @@
           <w:szCs w:val="20"/>
           <w:rtl/>
         </w:rPr>
-        <w:t xml:space="preserve">אבו אסמעיל נ׳ סלימאן</w:t>
-      </w:r>
-      <w:r>
-        <w:rPr>
-          <w:rFonts w:ascii="David" w:cs="David" w:eastAsia="David" w:hAnsi="David"/>
-          <w:sz w:val="20"/>
-          <w:szCs w:val="20"/>
-          <w:rtl/>
-        </w:rPr>
-        <w:t xml:space="preserve"> (נבו 28.7.2020).</w:t>
+        <w:t xml:space="preserve">לוי נ׳ חיג׳אזי</w:t>
+      </w:r>
+      <w:r>
+        <w:rPr>
+          <w:rFonts w:ascii="David" w:cs="David" w:eastAsia="David" w:hAnsi="David"/>
+          <w:sz w:val="20"/>
+          <w:szCs w:val="20"/>
+          <w:rtl/>
+        </w:rPr>
+        <w:t xml:space="preserve">, </w:t>
+      </w:r>
+      <w:r>
+        <w:rPr>
+          <w:rFonts w:ascii="David" w:cs="David" w:eastAsia="David" w:hAnsi="David"/>
+          <w:sz w:val="20"/>
+          <w:szCs w:val="20"/>
+          <w:rtl/>
+        </w:rPr>
+        <w:t xml:space="preserve">לעיל ה"ש 21</w:t>
+      </w:r>
+      <w:r>
+        <w:rPr>
+          <w:rFonts w:ascii="David" w:cs="David" w:eastAsia="David" w:hAnsi="David"/>
+          <w:sz w:val="20"/>
+          <w:szCs w:val="20"/>
+          <w:rtl/>
+        </w:rPr>
+        <w:t xml:space="preserve">.</w:t>
       </w:r>
     </w:p>
   </w:footnote>
@@ -7729,7 +7970,7 @@
           <w:szCs w:val="20"/>
           <w:rtl/>
         </w:rPr>
-        <w:t xml:space="preserve">ת"א (שלום נצ׳) 19781-06-18 </w:t>
+        <w:t xml:space="preserve">ע"א 3274/18 </w:t>
       </w:r>
       <w:r>
         <w:rPr>
@@ -7740,16 +7981,16 @@
           <w:szCs w:val="20"/>
           <w:rtl/>
         </w:rPr>
-        <w:t xml:space="preserve">אבו ליל נ׳ פאהום</w:t>
-      </w:r>
-      <w:r>
-        <w:rPr>
-          <w:rFonts w:ascii="David" w:cs="David" w:eastAsia="David" w:hAnsi="David"/>
-          <w:sz w:val="20"/>
-          <w:szCs w:val="20"/>
-          <w:rtl/>
-        </w:rPr>
-        <w:t xml:space="preserve"> (נבו 18.10.2023).</w:t>
+        <w:t xml:space="preserve">אבו אסמעיל נ׳ סלימאן</w:t>
+      </w:r>
+      <w:r>
+        <w:rPr>
+          <w:rFonts w:ascii="David" w:cs="David" w:eastAsia="David" w:hAnsi="David"/>
+          <w:sz w:val="20"/>
+          <w:szCs w:val="20"/>
+          <w:rtl/>
+        </w:rPr>
+        <w:t xml:space="preserve"> (נבו 28.7.2020).</w:t>
       </w:r>
     </w:p>
   </w:footnote>
@@ -7772,25 +8013,7 @@
           <w:szCs w:val="20"/>
           <w:rtl/>
         </w:rPr>
-        <w:t xml:space="preserve">ס׳ 14(ב) לחוק השליחות, התשכ"ה-1965. לדיון היסודי בשאלה אם ייפוי כוח בלתי חוזר מעמיד את הקונה במעמד שווה ערך לבעלים ראו ויסמן, </w:t>
-      </w:r>
-      <w:r>
-        <w:rPr>
-          <w:rFonts w:ascii="David" w:cs="David" w:eastAsia="David" w:hAnsi="David"/>
-          <w:sz w:val="20"/>
-          <w:szCs w:val="20"/>
-          <w:rtl/>
-        </w:rPr>
-        <w:t xml:space="preserve">לעיל ה"ש 16</w:t>
-      </w:r>
-      <w:r>
-        <w:rPr>
-          <w:rFonts w:ascii="David" w:cs="David" w:eastAsia="David" w:hAnsi="David"/>
-          <w:sz w:val="20"/>
-          <w:szCs w:val="20"/>
-          <w:rtl/>
-        </w:rPr>
-        <w:t xml:space="preserve">; אהרן ברק </w:t>
+        <w:t xml:space="preserve">ת"א (שלום נצ׳) 19781-06-18 </w:t>
       </w:r>
       <w:r>
         <w:rPr>
@@ -7801,16 +8024,16 @@
           <w:szCs w:val="20"/>
           <w:rtl/>
         </w:rPr>
-        <w:t xml:space="preserve">חוק השליחות</w:t>
-      </w:r>
-      <w:r>
-        <w:rPr>
-          <w:rFonts w:ascii="David" w:cs="David" w:eastAsia="David" w:hAnsi="David"/>
-          <w:sz w:val="20"/>
-          <w:szCs w:val="20"/>
-          <w:rtl/>
-        </w:rPr>
-        <w:t xml:space="preserve"> כרך ב (מהדורה שנייה, 1996).</w:t>
+        <w:t xml:space="preserve">אבו ליל נ׳ פאהום</w:t>
+      </w:r>
+      <w:r>
+        <w:rPr>
+          <w:rFonts w:ascii="David" w:cs="David" w:eastAsia="David" w:hAnsi="David"/>
+          <w:sz w:val="20"/>
+          <w:szCs w:val="20"/>
+          <w:rtl/>
+        </w:rPr>
+        <w:t xml:space="preserve"> (נבו 18.10.2023).</w:t>
       </w:r>
     </w:p>
   </w:footnote>
@@ -7833,7 +8056,25 @@
           <w:szCs w:val="20"/>
           <w:rtl/>
         </w:rPr>
-        <w:t xml:space="preserve">ע"א 1559/99 </w:t>
+        <w:t xml:space="preserve">ס׳ 14(ב) לחוק השליחות, התשכ"ה-1965. לדיון היסודי בשאלה אם ייפוי כוח בלתי חוזר מעמיד את הקונה במעמד שווה ערך לבעלים ראו ויסמן, </w:t>
+      </w:r>
+      <w:r>
+        <w:rPr>
+          <w:rFonts w:ascii="David" w:cs="David" w:eastAsia="David" w:hAnsi="David"/>
+          <w:sz w:val="20"/>
+          <w:szCs w:val="20"/>
+          <w:rtl/>
+        </w:rPr>
+        <w:t xml:space="preserve">לעיל ה"ש 16</w:t>
+      </w:r>
+      <w:r>
+        <w:rPr>
+          <w:rFonts w:ascii="David" w:cs="David" w:eastAsia="David" w:hAnsi="David"/>
+          <w:sz w:val="20"/>
+          <w:szCs w:val="20"/>
+          <w:rtl/>
+        </w:rPr>
+        <w:t xml:space="preserve">; אהרן ברק </w:t>
       </w:r>
       <w:r>
         <w:rPr>
@@ -7844,16 +8085,16 @@
           <w:szCs w:val="20"/>
           <w:rtl/>
         </w:rPr>
-        <w:t xml:space="preserve">צימבלר נ׳ תורג׳מן</w:t>
-      </w:r>
-      <w:r>
-        <w:rPr>
-          <w:rFonts w:ascii="David" w:cs="David" w:eastAsia="David" w:hAnsi="David"/>
-          <w:sz w:val="20"/>
-          <w:szCs w:val="20"/>
-          <w:rtl/>
-        </w:rPr>
-        <w:t xml:space="preserve">, פ"ד נז(5) 49 (2003).</w:t>
+        <w:t xml:space="preserve">חוק השליחות</w:t>
+      </w:r>
+      <w:r>
+        <w:rPr>
+          <w:rFonts w:ascii="David" w:cs="David" w:eastAsia="David" w:hAnsi="David"/>
+          <w:sz w:val="20"/>
+          <w:szCs w:val="20"/>
+          <w:rtl/>
+        </w:rPr>
+        <w:t xml:space="preserve"> כרך ב (מהדורה שנייה, 1996).</w:t>
       </w:r>
     </w:p>
   </w:footnote>
@@ -7876,7 +8117,7 @@
           <w:szCs w:val="20"/>
           <w:rtl/>
         </w:rPr>
-        <w:t xml:space="preserve">עניין </w:t>
+        <w:t xml:space="preserve">ע"א 1559/99 </w:t>
       </w:r>
       <w:r>
         <w:rPr>
@@ -7887,34 +8128,16 @@
           <w:szCs w:val="20"/>
           <w:rtl/>
         </w:rPr>
-        <w:t xml:space="preserve">בדארנה</w:t>
-      </w:r>
-      <w:r>
-        <w:rPr>
-          <w:rFonts w:ascii="David" w:cs="David" w:eastAsia="David" w:hAnsi="David"/>
-          <w:sz w:val="20"/>
-          <w:szCs w:val="20"/>
-          <w:rtl/>
-        </w:rPr>
-        <w:t xml:space="preserve">, </w:t>
-      </w:r>
-      <w:r>
-        <w:rPr>
-          <w:rFonts w:ascii="David" w:cs="David" w:eastAsia="David" w:hAnsi="David"/>
-          <w:sz w:val="20"/>
-          <w:szCs w:val="20"/>
-          <w:rtl/>
-        </w:rPr>
-        <w:t xml:space="preserve">לעיל ה"ש 8</w:t>
-      </w:r>
-      <w:r>
-        <w:rPr>
-          <w:rFonts w:ascii="David" w:cs="David" w:eastAsia="David" w:hAnsi="David"/>
-          <w:sz w:val="20"/>
-          <w:szCs w:val="20"/>
-          <w:rtl/>
-        </w:rPr>
-        <w:t xml:space="preserve">.</w:t>
+        <w:t xml:space="preserve">צימבלר נ׳ תורג׳מן</w:t>
+      </w:r>
+      <w:r>
+        <w:rPr>
+          <w:rFonts w:ascii="David" w:cs="David" w:eastAsia="David" w:hAnsi="David"/>
+          <w:sz w:val="20"/>
+          <w:szCs w:val="20"/>
+          <w:rtl/>
+        </w:rPr>
+        <w:t xml:space="preserve">, פ"ד נז(5) 49 (2003).</w:t>
       </w:r>
     </w:p>
   </w:footnote>
@@ -7937,7 +8160,7 @@
           <w:szCs w:val="20"/>
           <w:rtl/>
         </w:rPr>
-        <w:t xml:space="preserve">ע"א 986/93 </w:t>
+        <w:t xml:space="preserve">עניין </w:t>
       </w:r>
       <w:r>
         <w:rPr>
@@ -7948,16 +8171,34 @@
           <w:szCs w:val="20"/>
           <w:rtl/>
         </w:rPr>
-        <w:t xml:space="preserve">קלמר נ׳ גיא</w:t>
-      </w:r>
-      <w:r>
-        <w:rPr>
-          <w:rFonts w:ascii="David" w:cs="David" w:eastAsia="David" w:hAnsi="David"/>
-          <w:sz w:val="20"/>
-          <w:szCs w:val="20"/>
-          <w:rtl/>
-        </w:rPr>
-        <w:t xml:space="preserve">, פ"ד נ(1) 185 (1996). לדרישת הכתב וגלגוליה ראו נילי כהן "צורת החוזה" הפרקליט לח 383 (תשמ"ט).</w:t>
+        <w:t xml:space="preserve">בדארנה</w:t>
+      </w:r>
+      <w:r>
+        <w:rPr>
+          <w:rFonts w:ascii="David" w:cs="David" w:eastAsia="David" w:hAnsi="David"/>
+          <w:sz w:val="20"/>
+          <w:szCs w:val="20"/>
+          <w:rtl/>
+        </w:rPr>
+        <w:t xml:space="preserve">, </w:t>
+      </w:r>
+      <w:r>
+        <w:rPr>
+          <w:rFonts w:ascii="David" w:cs="David" w:eastAsia="David" w:hAnsi="David"/>
+          <w:sz w:val="20"/>
+          <w:szCs w:val="20"/>
+          <w:rtl/>
+        </w:rPr>
+        <w:t xml:space="preserve">לעיל ה"ש 8</w:t>
+      </w:r>
+      <w:r>
+        <w:rPr>
+          <w:rFonts w:ascii="David" w:cs="David" w:eastAsia="David" w:hAnsi="David"/>
+          <w:sz w:val="20"/>
+          <w:szCs w:val="20"/>
+          <w:rtl/>
+        </w:rPr>
+        <w:t xml:space="preserve">.</w:t>
       </w:r>
     </w:p>
   </w:footnote>
@@ -7980,7 +8221,7 @@
           <w:szCs w:val="20"/>
           <w:rtl/>
         </w:rPr>
-        <w:t xml:space="preserve">ס׳ 5(א) לחוק המתנה, התשכ"ח-1968. במקרקעין כפופה ההתחייבות גם לס׳ 8 לחוק המקרקעין. ראו מרדכי אלפרדו ראבילו </w:t>
+        <w:t xml:space="preserve">ע"א 986/93 </w:t>
       </w:r>
       <w:r>
         <w:rPr>
@@ -7991,16 +8232,16 @@
           <w:szCs w:val="20"/>
           <w:rtl/>
         </w:rPr>
-        <w:t xml:space="preserve">חוק המתנה, תשכ"ח-1968</w:t>
-      </w:r>
-      <w:r>
-        <w:rPr>
-          <w:rFonts w:ascii="David" w:cs="David" w:eastAsia="David" w:hAnsi="David"/>
-          <w:sz w:val="20"/>
-          <w:szCs w:val="20"/>
-          <w:rtl/>
-        </w:rPr>
-        <w:t xml:space="preserve"> 331–346 (פירוש לחוקי החוזים מיסודו של ג׳ טדסקי, מהדורה שנייה, תשנ"ז).</w:t>
+        <w:t xml:space="preserve">קלמר נ׳ גיא</w:t>
+      </w:r>
+      <w:r>
+        <w:rPr>
+          <w:rFonts w:ascii="David" w:cs="David" w:eastAsia="David" w:hAnsi="David"/>
+          <w:sz w:val="20"/>
+          <w:szCs w:val="20"/>
+          <w:rtl/>
+        </w:rPr>
+        <w:t xml:space="preserve">, פ"ד נ(1) 185 (1996). לדרישת הכתב וגלגוליה ראו נילי כהן "צורת החוזה" הפרקליט לח 383 (תשמ"ט).</w:t>
       </w:r>
     </w:p>
   </w:footnote>
@@ -8023,25 +8264,27 @@
           <w:szCs w:val="20"/>
           <w:rtl/>
         </w:rPr>
-        <w:t xml:space="preserve">ס׳ 5(ב)–5(ג) לחוק המתנה; ראבילו, </w:t>
-      </w:r>
-      <w:r>
-        <w:rPr>
-          <w:rFonts w:ascii="David" w:cs="David" w:eastAsia="David" w:hAnsi="David"/>
-          <w:sz w:val="20"/>
-          <w:szCs w:val="20"/>
-          <w:rtl/>
-        </w:rPr>
-        <w:t xml:space="preserve">לעיל ה"ש 31</w:t>
-      </w:r>
-      <w:r>
-        <w:rPr>
-          <w:rFonts w:ascii="David" w:cs="David" w:eastAsia="David" w:hAnsi="David"/>
-          <w:sz w:val="20"/>
-          <w:szCs w:val="20"/>
-          <w:rtl/>
-        </w:rPr>
-        <w:t xml:space="preserve">, בעמ׳ 344 ואילך.</w:t>
+        <w:t xml:space="preserve">ס׳ 5(א) לחוק המתנה, התשכ"ח-1968. במקרקעין כפופה ההתחייבות גם לס׳ 8 לחוק המקרקעין. ראו מרדכי אלפרדו ראבילו </w:t>
+      </w:r>
+      <w:r>
+        <w:rPr>
+          <w:rFonts w:ascii="David" w:cs="David" w:eastAsia="David" w:hAnsi="David"/>
+          <w:i/>
+          <w:iCs/>
+          <w:sz w:val="20"/>
+          <w:szCs w:val="20"/>
+          <w:rtl/>
+        </w:rPr>
+        <w:t xml:space="preserve">חוק המתנה, תשכ"ח-1968</w:t>
+      </w:r>
+      <w:r>
+        <w:rPr>
+          <w:rFonts w:ascii="David" w:cs="David" w:eastAsia="David" w:hAnsi="David"/>
+          <w:sz w:val="20"/>
+          <w:szCs w:val="20"/>
+          <w:rtl/>
+        </w:rPr>
+        <w:t xml:space="preserve"> 331–346 (פירוש לחוקי החוזים מיסודו של ג׳ טדסקי, מהדורה שנייה, תשנ"ז).</w:t>
       </w:r>
     </w:p>
   </w:footnote>
@@ -8064,6 +8307,47 @@
           <w:szCs w:val="20"/>
           <w:rtl/>
         </w:rPr>
+        <w:t xml:space="preserve">ס׳ 5(ב)–5(ג) לחוק המתנה; ראבילו, </w:t>
+      </w:r>
+      <w:r>
+        <w:rPr>
+          <w:rFonts w:ascii="David" w:cs="David" w:eastAsia="David" w:hAnsi="David"/>
+          <w:sz w:val="20"/>
+          <w:szCs w:val="20"/>
+          <w:rtl/>
+        </w:rPr>
+        <w:t xml:space="preserve">לעיל ה"ש 32</w:t>
+      </w:r>
+      <w:r>
+        <w:rPr>
+          <w:rFonts w:ascii="David" w:cs="David" w:eastAsia="David" w:hAnsi="David"/>
+          <w:sz w:val="20"/>
+          <w:szCs w:val="20"/>
+          <w:rtl/>
+        </w:rPr>
+        <w:t xml:space="preserve">, בעמ׳ 344 ואילך.</w:t>
+      </w:r>
+    </w:p>
+  </w:footnote>
+  <w:footnote w:id="34">
+    <w:p>
+      <w:pPr>
+        <w:bidi/>
+        <w:spacing w:after="60"/>
+      </w:pPr>
+      <w:r>
+        <w:rPr>
+          <w:rStyle w:val="FootnoteReference"/>
+        </w:rPr>
+        <w:footnoteRef/>
+      </w:r>
+      <w:r>
+        <w:rPr>
+          <w:rFonts w:ascii="David" w:cs="David" w:eastAsia="David" w:hAnsi="David"/>
+          <w:sz w:val="20"/>
+          <w:szCs w:val="20"/>
+          <w:rtl/>
+        </w:rPr>
         <w:t xml:space="preserve">עמ"ש (מחוזי מר׳) 52601-10-23 </w:t>
       </w:r>
       <w:r>
@@ -8093,7 +8377,7 @@
           <w:szCs w:val="20"/>
           <w:rtl/>
         </w:rPr>
-        <w:t xml:space="preserve">לעיל ה"ש 31</w:t>
+        <w:t xml:space="preserve">לעיל ה"ש 32</w:t>
       </w:r>
       <w:r>
         <w:rPr>
@@ -8106,7 +8390,7 @@
       </w:r>
     </w:p>
   </w:footnote>
-  <w:footnote w:id="34">
+  <w:footnote w:id="35">
     <w:p>
       <w:pPr>
         <w:bidi/>
@@ -8149,7 +8433,7 @@
       </w:r>
     </w:p>
   </w:footnote>
-  <w:footnote w:id="35">
+  <w:footnote w:id="36">
     <w:p>
       <w:pPr>
         <w:bidi/>
@@ -8177,7 +8461,7 @@
           <w:szCs w:val="20"/>
           <w:rtl/>
         </w:rPr>
-        <w:t xml:space="preserve">לעיל ה"ש 31</w:t>
+        <w:t xml:space="preserve">לעיל ה"ש 32</w:t>
       </w:r>
       <w:r>
         <w:rPr>
@@ -8187,29 +8471,6 @@
           <w:rtl/>
         </w:rPr>
         <w:t xml:space="preserve">, בעמ׳ 333–337; להשלמת מתנה בקבלת החזקה ראו גם להלן פרק ו.3 לעניין דרישת הקַבְּץ׳ (התפיסה) במשפט השרעי.</w:t>
-      </w:r>
-    </w:p>
-  </w:footnote>
-  <w:footnote w:id="36">
-    <w:p>
-      <w:pPr>
-        <w:bidi/>
-        <w:spacing w:after="60"/>
-      </w:pPr>
-      <w:r>
-        <w:rPr>
-          <w:rStyle w:val="FootnoteReference"/>
-        </w:rPr>
-        <w:footnoteRef/>
-      </w:r>
-      <w:r>
-        <w:rPr>
-          <w:rFonts w:ascii="David" w:cs="David" w:eastAsia="David" w:hAnsi="David"/>
-          <w:sz w:val="20"/>
-          <w:szCs w:val="20"/>
-          <w:rtl/>
-        </w:rPr>
-        <w:t xml:space="preserve">נינה זלצמן "רישיון במקרקעין" הפרקליט מב 24 (תשנ"ה).</w:t>
       </w:r>
     </w:p>
   </w:footnote>
@@ -8232,6 +8493,29 @@
           <w:szCs w:val="20"/>
           <w:rtl/>
         </w:rPr>
+        <w:t xml:space="preserve">נינה זלצמן "רישיון במקרקעין" הפרקליט מב 24 (תשנ"ה).</w:t>
+      </w:r>
+    </w:p>
+  </w:footnote>
+  <w:footnote w:id="38">
+    <w:p>
+      <w:pPr>
+        <w:bidi/>
+        <w:spacing w:after="60"/>
+      </w:pPr>
+      <w:r>
+        <w:rPr>
+          <w:rStyle w:val="FootnoteReference"/>
+        </w:rPr>
+        <w:footnoteRef/>
+      </w:r>
+      <w:r>
+        <w:rPr>
+          <w:rFonts w:ascii="David" w:cs="David" w:eastAsia="David" w:hAnsi="David"/>
+          <w:sz w:val="20"/>
+          <w:szCs w:val="20"/>
+          <w:rtl/>
+        </w:rPr>
         <w:t xml:space="preserve">ע"א 463/79 </w:t>
       </w:r>
       <w:r>
@@ -8276,7 +8560,7 @@
       </w:r>
     </w:p>
   </w:footnote>
-  <w:footnote w:id="38">
+  <w:footnote w:id="39">
     <w:p>
       <w:pPr>
         <w:bidi/>
@@ -8339,7 +8623,7 @@
       </w:r>
     </w:p>
   </w:footnote>
-  <w:footnote w:id="39">
+  <w:footnote w:id="40">
     <w:p>
       <w:pPr>
         <w:bidi/>
@@ -8402,7 +8686,7 @@
       </w:r>
     </w:p>
   </w:footnote>
-  <w:footnote w:id="40">
+  <w:footnote w:id="41">
     <w:p>
       <w:pPr>
         <w:bidi/>
@@ -8430,7 +8714,7 @@
           <w:szCs w:val="20"/>
           <w:rtl/>
         </w:rPr>
-        <w:t xml:space="preserve">לעיל ה"ש 39</w:t>
+        <w:t xml:space="preserve">לעיל ה"ש 40</w:t>
       </w:r>
       <w:r>
         <w:rPr>
@@ -8448,7 +8732,7 @@
           <w:szCs w:val="20"/>
           <w:rtl/>
         </w:rPr>
-        <w:t xml:space="preserve">לעיל ה"ש 36</w:t>
+        <w:t xml:space="preserve">לעיל ה"ש 37</w:t>
       </w:r>
       <w:r>
         <w:rPr>
@@ -8461,7 +8745,7 @@
       </w:r>
     </w:p>
   </w:footnote>
-  <w:footnote w:id="41">
+  <w:footnote w:id="42">
     <w:p>
       <w:pPr>
         <w:bidi/>
@@ -8549,66 +8833,7 @@
           <w:szCs w:val="20"/>
           <w:rtl/>
         </w:rPr>
-        <w:t xml:space="preserve">לעיל ה"ש 26</w:t>
-      </w:r>
-      <w:r>
-        <w:rPr>
-          <w:rFonts w:ascii="David" w:cs="David" w:eastAsia="David" w:hAnsi="David"/>
-          <w:sz w:val="20"/>
-          <w:szCs w:val="20"/>
-          <w:rtl/>
-        </w:rPr>
-        <w:t xml:space="preserve">.</w:t>
-      </w:r>
-    </w:p>
-  </w:footnote>
-  <w:footnote w:id="42">
-    <w:p>
-      <w:pPr>
-        <w:bidi/>
-        <w:spacing w:after="60"/>
-      </w:pPr>
-      <w:r>
-        <w:rPr>
-          <w:rStyle w:val="FootnoteReference"/>
-        </w:rPr>
-        <w:footnoteRef/>
-      </w:r>
-      <w:r>
-        <w:rPr>
-          <w:rFonts w:ascii="David" w:cs="David" w:eastAsia="David" w:hAnsi="David"/>
-          <w:sz w:val="20"/>
-          <w:szCs w:val="20"/>
-          <w:rtl/>
-        </w:rPr>
-        <w:t xml:space="preserve">לביקורת עקרונית על אי-הוודאות הנובעת משסתומי יושר ותום לב בדיני הקניין השוו רייכמן, </w:t>
-      </w:r>
-      <w:r>
-        <w:rPr>
-          <w:rFonts w:ascii="David" w:cs="David" w:eastAsia="David" w:hAnsi="David"/>
-          <w:sz w:val="20"/>
-          <w:szCs w:val="20"/>
-          <w:rtl/>
-        </w:rPr>
-        <w:t xml:space="preserve">לעיל ה"ש 9</w:t>
-      </w:r>
-      <w:r>
-        <w:rPr>
-          <w:rFonts w:ascii="David" w:cs="David" w:eastAsia="David" w:hAnsi="David"/>
-          <w:sz w:val="20"/>
-          <w:szCs w:val="20"/>
-          <w:rtl/>
-        </w:rPr>
-        <w:t xml:space="preserve">, בעמ׳ 297 ואילך; וכהן, </w:t>
-      </w:r>
-      <w:r>
-        <w:rPr>
-          <w:rFonts w:ascii="David" w:cs="David" w:eastAsia="David" w:hAnsi="David"/>
-          <w:sz w:val="20"/>
-          <w:szCs w:val="20"/>
-          <w:rtl/>
-        </w:rPr>
-        <w:t xml:space="preserve">לעיל ה"ש 30</w:t>
+        <w:t xml:space="preserve">לעיל ה"ש 27</w:t>
       </w:r>
       <w:r>
         <w:rPr>
@@ -8640,7 +8865,43 @@
           <w:szCs w:val="20"/>
           <w:rtl/>
         </w:rPr>
-        <w:t xml:space="preserve">תק׳ 36–38 לתקנות התכנון והבניה (רישוי בניה), התשע"ו-2016; וקודם לכן תק׳ 2א לתקנות התכנון והבניה (בקשה להיתר, תנאיו ואגרות), התש"ל-1970. ההלכה חזרה והדגישה כי מוסדות התכנון אינם מכריעים בסכסוכי קניין.</w:t>
+        <w:t xml:space="preserve">לביקורת עקרונית על אי-הוודאות הנובעת משסתומי יושר ותום לב בדיני הקניין השוו רייכמן, </w:t>
+      </w:r>
+      <w:r>
+        <w:rPr>
+          <w:rFonts w:ascii="David" w:cs="David" w:eastAsia="David" w:hAnsi="David"/>
+          <w:sz w:val="20"/>
+          <w:szCs w:val="20"/>
+          <w:rtl/>
+        </w:rPr>
+        <w:t xml:space="preserve">לעיל ה"ש 9</w:t>
+      </w:r>
+      <w:r>
+        <w:rPr>
+          <w:rFonts w:ascii="David" w:cs="David" w:eastAsia="David" w:hAnsi="David"/>
+          <w:sz w:val="20"/>
+          <w:szCs w:val="20"/>
+          <w:rtl/>
+        </w:rPr>
+        <w:t xml:space="preserve">, בעמ׳ 297 ואילך; וכהן, </w:t>
+      </w:r>
+      <w:r>
+        <w:rPr>
+          <w:rFonts w:ascii="David" w:cs="David" w:eastAsia="David" w:hAnsi="David"/>
+          <w:sz w:val="20"/>
+          <w:szCs w:val="20"/>
+          <w:rtl/>
+        </w:rPr>
+        <w:t xml:space="preserve">לעיל ה"ש 31</w:t>
+      </w:r>
+      <w:r>
+        <w:rPr>
+          <w:rFonts w:ascii="David" w:cs="David" w:eastAsia="David" w:hAnsi="David"/>
+          <w:sz w:val="20"/>
+          <w:szCs w:val="20"/>
+          <w:rtl/>
+        </w:rPr>
+        <w:t xml:space="preserve">.</w:t>
       </w:r>
     </w:p>
   </w:footnote>
@@ -8663,6 +8924,29 @@
           <w:szCs w:val="20"/>
           <w:rtl/>
         </w:rPr>
+        <w:t xml:space="preserve">תק׳ 36–38 לתקנות התכנון והבניה (רישוי בניה), התשע"ו-2016; וקודם לכן תק׳ 2א לתקנות התכנון והבניה (בקשה להיתר, תנאיו ואגרות), התש"ל-1970. ההלכה חזרה והדגישה כי מוסדות התכנון אינם מכריעים בסכסוכי קניין.</w:t>
+      </w:r>
+    </w:p>
+  </w:footnote>
+  <w:footnote w:id="45">
+    <w:p>
+      <w:pPr>
+        <w:bidi/>
+        <w:spacing w:after="60"/>
+      </w:pPr>
+      <w:r>
+        <w:rPr>
+          <w:rStyle w:val="FootnoteReference"/>
+        </w:rPr>
+        <w:footnoteRef/>
+      </w:r>
+      <w:r>
+        <w:rPr>
+          <w:rFonts w:ascii="David" w:cs="David" w:eastAsia="David" w:hAnsi="David"/>
+          <w:sz w:val="20"/>
+          <w:szCs w:val="20"/>
+          <w:rtl/>
+        </w:rPr>
         <w:t xml:space="preserve">ראו פסיקת ערכאות המשפחה שנסקרה לעיל, </w:t>
       </w:r>
       <w:r>
@@ -8672,7 +8956,7 @@
           <w:szCs w:val="20"/>
           <w:rtl/>
         </w:rPr>
-        <w:t xml:space="preserve">לעיל ה"ש 41</w:t>
+        <w:t xml:space="preserve">לעיל ה"ש 42</w:t>
       </w:r>
       <w:r>
         <w:rPr>
@@ -8710,7 +8994,7 @@
           <w:szCs w:val="20"/>
           <w:rtl/>
         </w:rPr>
-        <w:t xml:space="preserve">לעיל ה"ש 37</w:t>
+        <w:t xml:space="preserve">לעיל ה"ש 38</w:t>
       </w:r>
       <w:r>
         <w:rPr>
@@ -8720,29 +9004,6 @@
           <w:rtl/>
         </w:rPr>
         <w:t xml:space="preserve">.</w:t>
-      </w:r>
-    </w:p>
-  </w:footnote>
-  <w:footnote w:id="45">
-    <w:p>
-      <w:pPr>
-        <w:bidi/>
-        <w:spacing w:after="60"/>
-      </w:pPr>
-      <w:r>
-        <w:rPr>
-          <w:rStyle w:val="FootnoteReference"/>
-        </w:rPr>
-        <w:footnoteRef/>
-      </w:r>
-      <w:r>
-        <w:rPr>
-          <w:rFonts w:ascii="David" w:cs="David" w:eastAsia="David" w:hAnsi="David"/>
-          <w:sz w:val="20"/>
-          <w:szCs w:val="20"/>
-          <w:rtl/>
-        </w:rPr>
-        <w:t xml:space="preserve">ס׳ 269 ו-326 לפקודת העיריות [נוסח חדש]. שוכר, בר-רשות ואף פולש עשויים להירשם כמחזיקים לצורכי ארנונה.</w:t>
       </w:r>
     </w:p>
   </w:footnote>
@@ -8765,6 +9026,29 @@
           <w:szCs w:val="20"/>
           <w:rtl/>
         </w:rPr>
+        <w:t xml:space="preserve">ס׳ 269 ו-326 לפקודת העיריות [נוסח חדש]. שוכר, בר-רשות ואף פולש עשויים להירשם כמחזיקים לצורכי ארנונה.</w:t>
+      </w:r>
+    </w:p>
+  </w:footnote>
+  <w:footnote w:id="47">
+    <w:p>
+      <w:pPr>
+        <w:bidi/>
+        <w:spacing w:after="60"/>
+      </w:pPr>
+      <w:r>
+        <w:rPr>
+          <w:rStyle w:val="FootnoteReference"/>
+        </w:rPr>
+        <w:footnoteRef/>
+      </w:r>
+      <w:r>
+        <w:rPr>
+          <w:rFonts w:ascii="David" w:cs="David" w:eastAsia="David" w:hAnsi="David"/>
+          <w:sz w:val="20"/>
+          <w:szCs w:val="20"/>
+          <w:rtl/>
+        </w:rPr>
         <w:t xml:space="preserve">ראו עניין </w:t>
       </w:r>
       <w:r>
@@ -8794,7 +9078,7 @@
           <w:szCs w:val="20"/>
           <w:rtl/>
         </w:rPr>
-        <w:t xml:space="preserve">לעיל ה"ש 23</w:t>
+        <w:t xml:space="preserve">לעיל ה"ש 24</w:t>
       </w:r>
       <w:r>
         <w:rPr>
@@ -8832,7 +9116,7 @@
           <w:szCs w:val="20"/>
           <w:rtl/>
         </w:rPr>
-        <w:t xml:space="preserve">לעיל ה"ש 26</w:t>
+        <w:t xml:space="preserve">לעיל ה"ש 27</w:t>
       </w:r>
       <w:r>
         <w:rPr>
@@ -8842,33 +9126,33 @@
           <w:rtl/>
         </w:rPr>
         <w:t xml:space="preserve">.</w:t>
-      </w:r>
-    </w:p>
-  </w:footnote>
-  <w:footnote w:id="47">
-    <w:p>
-      <w:pPr>
-        <w:bidi/>
-        <w:spacing w:after="60"/>
-      </w:pPr>
-      <w:r>
-        <w:rPr>
-          <w:rStyle w:val="FootnoteReference"/>
-        </w:rPr>
-        <w:footnoteRef/>
-      </w:r>
-      <w:r>
-        <w:rPr>
-          <w:rFonts w:ascii="David" w:cs="David" w:eastAsia="David" w:hAnsi="David"/>
-          <w:sz w:val="20"/>
-          <w:szCs w:val="20"/>
-          <w:rtl/>
-        </w:rPr>
-        <w:t xml:space="preserve">ס׳ 54(4) לפקודת הראיות [נוסח חדש], התשל"א-1971.</w:t>
       </w:r>
     </w:p>
   </w:footnote>
   <w:footnote w:id="48">
+    <w:p>
+      <w:pPr>
+        <w:bidi/>
+        <w:spacing w:after="60"/>
+      </w:pPr>
+      <w:r>
+        <w:rPr>
+          <w:rStyle w:val="FootnoteReference"/>
+        </w:rPr>
+        <w:footnoteRef/>
+      </w:r>
+      <w:r>
+        <w:rPr>
+          <w:rFonts w:ascii="David" w:cs="David" w:eastAsia="David" w:hAnsi="David"/>
+          <w:sz w:val="20"/>
+          <w:szCs w:val="20"/>
+          <w:rtl/>
+        </w:rPr>
+        <w:t xml:space="preserve">ס׳ 54(4) לפקודת הראיות [נוסח חדש], התשל"א-1971.</w:t>
+      </w:r>
+    </w:p>
+  </w:footnote>
+  <w:footnote w:id="49">
     <w:p>
       <w:pPr>
         <w:bidi/>
@@ -8921,7 +9205,7 @@
       </w:r>
     </w:p>
   </w:footnote>
-  <w:footnote w:id="49">
+  <w:footnote w:id="50">
     <w:p>
       <w:pPr>
         <w:bidi/>
@@ -8964,7 +9248,7 @@
       </w:r>
     </w:p>
   </w:footnote>
-  <w:footnote w:id="50">
+  <w:footnote w:id="51">
     <w:p>
       <w:pPr>
         <w:bidi/>
@@ -8992,7 +9276,7 @@
           <w:szCs w:val="20"/>
           <w:rtl/>
         </w:rPr>
-        <w:t xml:space="preserve">לעיל ה"ש 49</w:t>
+        <w:t xml:space="preserve">לעיל ה"ש 50</w:t>
       </w:r>
       <w:r>
         <w:rPr>
@@ -9002,29 +9286,6 @@
           <w:rtl/>
         </w:rPr>
         <w:t xml:space="preserve">, בעמ׳ 282.</w:t>
-      </w:r>
-    </w:p>
-  </w:footnote>
-  <w:footnote w:id="51">
-    <w:p>
-      <w:pPr>
-        <w:bidi/>
-        <w:spacing w:after="60"/>
-      </w:pPr>
-      <w:r>
-        <w:rPr>
-          <w:rStyle w:val="FootnoteReference"/>
-        </w:rPr>
-        <w:footnoteRef/>
-      </w:r>
-      <w:r>
-        <w:rPr>
-          <w:rFonts w:ascii="David" w:cs="David" w:eastAsia="David" w:hAnsi="David"/>
-          <w:sz w:val="20"/>
-          <w:szCs w:val="20"/>
-          <w:rtl/>
-        </w:rPr>
-        <w:t xml:space="preserve">ס׳ 16(ב) לחוק מיסוי מקרקעין. המחוקק זיהה כבר בשנות השישים את ייפוי הכוח כמסלול עוקף-דיווח, וביקש ללכוד גם אותו ברשת ההצהרה.</w:t>
       </w:r>
     </w:p>
   </w:footnote>
@@ -9047,7 +9308,7 @@
           <w:szCs w:val="20"/>
           <w:rtl/>
         </w:rPr>
-        <w:t xml:space="preserve">ס׳ 73 לחוק מיסוי מקרקעין.</w:t>
+        <w:t xml:space="preserve">ס׳ 16(ב) לחוק מיסוי מקרקעין. המחוקק זיהה כבר בשנות השישים את ייפוי הכוח כמסלול עוקף-דיווח, וביקש ללכוד גם אותו ברשת ההצהרה.</w:t>
       </w:r>
     </w:p>
   </w:footnote>
@@ -9070,7 +9331,7 @@
           <w:szCs w:val="20"/>
           <w:rtl/>
         </w:rPr>
-        <w:t xml:space="preserve">ס׳ 324(א) לפקודת העיריות [נוסח חדש]; ולעניין היטל השבחה – ס׳ 10 לתוספת השלישית לחוק התכנון והבנייה, התשכ"ה-1965.</w:t>
+        <w:t xml:space="preserve">ס׳ 73 לחוק מיסוי מקרקעין.</w:t>
       </w:r>
     </w:p>
   </w:footnote>
@@ -9093,25 +9354,7 @@
           <w:szCs w:val="20"/>
           <w:rtl/>
         </w:rPr>
-        <w:t xml:space="preserve">להגדרות "זכות במקרקעין" ו"מכירה" ראו ס׳ 1 לחוק מיסוי מקרקעין; ולעקרון המהות הכלכלית ראו גורמן ואהרונוביץ׳, </w:t>
-      </w:r>
-      <w:r>
-        <w:rPr>
-          <w:rFonts w:ascii="David" w:cs="David" w:eastAsia="David" w:hAnsi="David"/>
-          <w:sz w:val="20"/>
-          <w:szCs w:val="20"/>
-          <w:rtl/>
-        </w:rPr>
-        <w:t xml:space="preserve">לעיל ה"ש 49</w:t>
-      </w:r>
-      <w:r>
-        <w:rPr>
-          <w:rFonts w:ascii="David" w:cs="David" w:eastAsia="David" w:hAnsi="David"/>
-          <w:sz w:val="20"/>
-          <w:szCs w:val="20"/>
-          <w:rtl/>
-        </w:rPr>
-        <w:t xml:space="preserve">, פרק ראשון.</w:t>
+        <w:t xml:space="preserve">ס׳ 324(א) לפקודת העיריות [נוסח חדש]; ולעניין היטל השבחה – ס׳ 10 לתוספת השלישית לחוק התכנון והבנייה, התשכ"ה-1965.</w:t>
       </w:r>
     </w:p>
   </w:footnote>
@@ -9134,25 +9377,25 @@
           <w:szCs w:val="20"/>
           <w:rtl/>
         </w:rPr>
-        <w:t xml:space="preserve">לקנסות בגין אי-הגשת הצהרה ולהפרשי הצמדה וריבית ראו פרק אחד-עשר לחוק מיסוי מקרקעין; גורמן ואהרונוביץ׳, </w:t>
-      </w:r>
-      <w:r>
-        <w:rPr>
-          <w:rFonts w:ascii="David" w:cs="David" w:eastAsia="David" w:hAnsi="David"/>
-          <w:sz w:val="20"/>
-          <w:szCs w:val="20"/>
-          <w:rtl/>
-        </w:rPr>
-        <w:t xml:space="preserve">לעיל ה"ש 49</w:t>
-      </w:r>
-      <w:r>
-        <w:rPr>
-          <w:rFonts w:ascii="David" w:cs="David" w:eastAsia="David" w:hAnsi="David"/>
-          <w:sz w:val="20"/>
-          <w:szCs w:val="20"/>
-          <w:rtl/>
-        </w:rPr>
-        <w:t xml:space="preserve">.</w:t>
+        <w:t xml:space="preserve">להגדרות "זכות במקרקעין" ו"מכירה" ראו ס׳ 1 לחוק מיסוי מקרקעין; ולעקרון המהות הכלכלית ראו גורמן ואהרונוביץ׳, </w:t>
+      </w:r>
+      <w:r>
+        <w:rPr>
+          <w:rFonts w:ascii="David" w:cs="David" w:eastAsia="David" w:hAnsi="David"/>
+          <w:sz w:val="20"/>
+          <w:szCs w:val="20"/>
+          <w:rtl/>
+        </w:rPr>
+        <w:t xml:space="preserve">לעיל ה"ש 50</w:t>
+      </w:r>
+      <w:r>
+        <w:rPr>
+          <w:rFonts w:ascii="David" w:cs="David" w:eastAsia="David" w:hAnsi="David"/>
+          <w:sz w:val="20"/>
+          <w:szCs w:val="20"/>
+          <w:rtl/>
+        </w:rPr>
+        <w:t xml:space="preserve">, פרק ראשון.</w:t>
       </w:r>
     </w:p>
   </w:footnote>
@@ -9175,25 +9418,25 @@
           <w:szCs w:val="20"/>
           <w:rtl/>
         </w:rPr>
-        <w:t xml:space="preserve">גורמן ואהרונוביץ׳, </w:t>
-      </w:r>
-      <w:r>
-        <w:rPr>
-          <w:rFonts w:ascii="David" w:cs="David" w:eastAsia="David" w:hAnsi="David"/>
-          <w:sz w:val="20"/>
-          <w:szCs w:val="20"/>
-          <w:rtl/>
-        </w:rPr>
-        <w:t xml:space="preserve">לעיל ה"ש 49</w:t>
-      </w:r>
-      <w:r>
-        <w:rPr>
-          <w:rFonts w:ascii="David" w:cs="David" w:eastAsia="David" w:hAnsi="David"/>
-          <w:sz w:val="20"/>
-          <w:szCs w:val="20"/>
-          <w:rtl/>
-        </w:rPr>
-        <w:t xml:space="preserve">, בעמ׳ 282–284, והפסיקה הנסקרת שם.</w:t>
+        <w:t xml:space="preserve">לקנסות בגין אי-הגשת הצהרה ולהפרשי הצמדה וריבית ראו פרק אחד-עשר לחוק מיסוי מקרקעין; גורמן ואהרונוביץ׳, </w:t>
+      </w:r>
+      <w:r>
+        <w:rPr>
+          <w:rFonts w:ascii="David" w:cs="David" w:eastAsia="David" w:hAnsi="David"/>
+          <w:sz w:val="20"/>
+          <w:szCs w:val="20"/>
+          <w:rtl/>
+        </w:rPr>
+        <w:t xml:space="preserve">לעיל ה"ש 50</w:t>
+      </w:r>
+      <w:r>
+        <w:rPr>
+          <w:rFonts w:ascii="David" w:cs="David" w:eastAsia="David" w:hAnsi="David"/>
+          <w:sz w:val="20"/>
+          <w:szCs w:val="20"/>
+          <w:rtl/>
+        </w:rPr>
+        <w:t xml:space="preserve">.</w:t>
       </w:r>
     </w:p>
   </w:footnote>
@@ -9216,7 +9459,7 @@
           <w:szCs w:val="20"/>
           <w:rtl/>
         </w:rPr>
-        <w:t xml:space="preserve">להיגיון הגבייתי של הסעיף ראו גורמן ואהרונוביץ׳, </w:t>
+        <w:t xml:space="preserve">גורמן ואהרונוביץ׳, </w:t>
       </w:r>
       <w:r>
         <w:rPr>
@@ -9234,7 +9477,7 @@
           <w:szCs w:val="20"/>
           <w:rtl/>
         </w:rPr>
-        <w:t xml:space="preserve">.</w:t>
+        <w:t xml:space="preserve">, בעמ׳ 282–284, והפסיקה הנסקרת שם.</w:t>
       </w:r>
     </w:p>
   </w:footnote>
@@ -9257,24 +9500,25 @@
           <w:szCs w:val="20"/>
           <w:rtl/>
         </w:rPr>
-        <w:t xml:space="preserve">למונח "הון מת" ראו </w:t>
-      </w:r>
-      <w:r>
-        <w:rPr>
-          <w:rFonts w:ascii="Times New Roman" w:cs="Times New Roman" w:eastAsia="Times New Roman" w:hAnsi="Times New Roman"/>
-          <w:sz w:val="20"/>
-          <w:szCs w:val="20"/>
-        </w:rPr>
-        <w:t xml:space="preserve">Hernando de Soto, The Mystery of Capital: Why Capitalism Triumphs in the West and Fails Everywhere Else (2000)</w:t>
-      </w:r>
-      <w:r>
-        <w:rPr>
-          <w:rFonts w:ascii="David" w:cs="David" w:eastAsia="David" w:hAnsi="David"/>
-          <w:sz w:val="20"/>
-          <w:szCs w:val="20"/>
-          <w:rtl/>
-        </w:rPr>
-        <w:t xml:space="preserve">. דה-סוטו פיתח את הניתוח על יסוד עבודת שדה במצרים, שבה נאמד שיעור הנכסים המוחזקים בלא רישום ביותר מ-90%; ראו להלן פרק ו.2.</w:t>
+        <w:t xml:space="preserve">להיגיון הגבייתי של הסעיף ראו גורמן ואהרונוביץ׳, </w:t>
+      </w:r>
+      <w:r>
+        <w:rPr>
+          <w:rFonts w:ascii="David" w:cs="David" w:eastAsia="David" w:hAnsi="David"/>
+          <w:sz w:val="20"/>
+          <w:szCs w:val="20"/>
+          <w:rtl/>
+        </w:rPr>
+        <w:t xml:space="preserve">לעיל ה"ש 51</w:t>
+      </w:r>
+      <w:r>
+        <w:rPr>
+          <w:rFonts w:ascii="David" w:cs="David" w:eastAsia="David" w:hAnsi="David"/>
+          <w:sz w:val="20"/>
+          <w:szCs w:val="20"/>
+          <w:rtl/>
+        </w:rPr>
+        <w:t xml:space="preserve">.</w:t>
       </w:r>
     </w:p>
   </w:footnote>
@@ -9297,6 +9541,46 @@
           <w:szCs w:val="20"/>
           <w:rtl/>
         </w:rPr>
+        <w:t xml:space="preserve">למונח "הון מת" ראו </w:t>
+      </w:r>
+      <w:r>
+        <w:rPr>
+          <w:rFonts w:ascii="Times New Roman" w:cs="Times New Roman" w:eastAsia="Times New Roman" w:hAnsi="Times New Roman"/>
+          <w:sz w:val="20"/>
+          <w:szCs w:val="20"/>
+        </w:rPr>
+        <w:t xml:space="preserve">Hernando de Soto, The Mystery of Capital: Why Capitalism Triumphs in the West and Fails Everywhere Else (2000)</w:t>
+      </w:r>
+      <w:r>
+        <w:rPr>
+          <w:rFonts w:ascii="David" w:cs="David" w:eastAsia="David" w:hAnsi="David"/>
+          <w:sz w:val="20"/>
+          <w:szCs w:val="20"/>
+          <w:rtl/>
+        </w:rPr>
+        <w:t xml:space="preserve">. דה-סוטו פיתח את הניתוח על יסוד עבודת שדה במצרים, שבה נאמד שיעור הנכסים המוחזקים בלא רישום ביותר מ-90%; ראו להלן פרק ו.2.</w:t>
+      </w:r>
+    </w:p>
+  </w:footnote>
+  <w:footnote w:id="60">
+    <w:p>
+      <w:pPr>
+        <w:bidi/>
+        <w:spacing w:after="60"/>
+      </w:pPr>
+      <w:r>
+        <w:rPr>
+          <w:rStyle w:val="FootnoteReference"/>
+        </w:rPr>
+        <w:footnoteRef/>
+      </w:r>
+      <w:r>
+        <w:rPr>
+          <w:rFonts w:ascii="David" w:cs="David" w:eastAsia="David" w:hAnsi="David"/>
+          <w:sz w:val="20"/>
+          <w:szCs w:val="20"/>
+          <w:rtl/>
+        </w:rPr>
         <w:t xml:space="preserve">השוו עניין </w:t>
       </w:r>
       <w:r>
@@ -9326,7 +9610,7 @@
           <w:szCs w:val="20"/>
           <w:rtl/>
         </w:rPr>
-        <w:t xml:space="preserve">לעיל ה"ש 28</w:t>
+        <w:t xml:space="preserve">לעיל ה"ש 29</w:t>
       </w:r>
       <w:r>
         <w:rPr>
@@ -9336,37 +9620,6 @@
           <w:rtl/>
         </w:rPr>
         <w:t xml:space="preserve">, שבו לא נזקפה ההתנהלות הבלתי פורמלית רבת-השנים לחובת הרוכשת.</w:t>
-      </w:r>
-    </w:p>
-  </w:footnote>
-  <w:footnote w:id="60">
-    <w:p>
-      <w:pPr>
-        <w:bidi/>
-        <w:spacing w:after="60"/>
-      </w:pPr>
-      <w:r>
-        <w:rPr>
-          <w:rStyle w:val="FootnoteReference"/>
-        </w:rPr>
-        <w:footnoteRef/>
-      </w:r>
-      <w:r>
-        <w:rPr>
-          <w:rFonts w:ascii="Times New Roman" w:cs="Times New Roman" w:eastAsia="Times New Roman" w:hAnsi="Times New Roman"/>
-          <w:sz w:val="20"/>
-          <w:szCs w:val="20"/>
-        </w:rPr>
-        <w:t xml:space="preserve">Lysaght v Edwards (1876) 2 Ch D 499 (Ch)</w:t>
-      </w:r>
-      <w:r>
-        <w:rPr>
-          <w:rFonts w:ascii="David" w:cs="David" w:eastAsia="David" w:hAnsi="David"/>
-          <w:sz w:val="20"/>
-          <w:szCs w:val="20"/>
-          <w:rtl/>
-        </w:rPr>
-        <w:t xml:space="preserve">.</w:t>
       </w:r>
     </w:p>
   </w:footnote>
@@ -9388,7 +9641,7 @@
           <w:sz w:val="20"/>
           <w:szCs w:val="20"/>
         </w:rPr>
-        <w:t xml:space="preserve">Walsh v Lonsdale (1882) 21 Ch D 9 (CA)</w:t>
+        <w:t xml:space="preserve">Lysaght v Edwards (1876) 2 Ch D 499 (Ch)</w:t>
       </w:r>
       <w:r>
         <w:rPr>
@@ -9415,6 +9668,37 @@
       </w:r>
       <w:r>
         <w:rPr>
+          <w:rFonts w:ascii="Times New Roman" w:cs="Times New Roman" w:eastAsia="Times New Roman" w:hAnsi="Times New Roman"/>
+          <w:sz w:val="20"/>
+          <w:szCs w:val="20"/>
+        </w:rPr>
+        <w:t xml:space="preserve">Walsh v Lonsdale (1882) 21 Ch D 9 (CA)</w:t>
+      </w:r>
+      <w:r>
+        <w:rPr>
+          <w:rFonts w:ascii="David" w:cs="David" w:eastAsia="David" w:hAnsi="David"/>
+          <w:sz w:val="20"/>
+          <w:szCs w:val="20"/>
+          <w:rtl/>
+        </w:rPr>
+        <w:t xml:space="preserve">.</w:t>
+      </w:r>
+    </w:p>
+  </w:footnote>
+  <w:footnote w:id="63">
+    <w:p>
+      <w:pPr>
+        <w:bidi/>
+        <w:spacing w:after="60"/>
+      </w:pPr>
+      <w:r>
+        <w:rPr>
+          <w:rStyle w:val="FootnoteReference"/>
+        </w:rPr>
+        <w:footnoteRef/>
+      </w:r>
+      <w:r>
+        <w:rPr>
           <w:rFonts w:ascii="David" w:cs="David" w:eastAsia="David" w:hAnsi="David"/>
           <w:sz w:val="20"/>
           <w:szCs w:val="20"/>
@@ -9462,7 +9746,7 @@
       </w:r>
     </w:p>
   </w:footnote>
-  <w:footnote w:id="63">
+  <w:footnote w:id="64">
     <w:p>
       <w:pPr>
         <w:bidi/>
@@ -9481,54 +9765,6 @@
           <w:szCs w:val="20"/>
         </w:rPr>
         <w:t xml:space="preserve">Land Registration Act 2002, s 27</w:t>
-      </w:r>
-      <w:r>
-        <w:rPr>
-          <w:rFonts w:ascii="David" w:cs="David" w:eastAsia="David" w:hAnsi="David"/>
-          <w:sz w:val="20"/>
-          <w:szCs w:val="20"/>
-          <w:rtl/>
-        </w:rPr>
-        <w:t xml:space="preserve">.</w:t>
-      </w:r>
-    </w:p>
-  </w:footnote>
-  <w:footnote w:id="64">
-    <w:p>
-      <w:pPr>
-        <w:bidi/>
-        <w:spacing w:after="60"/>
-      </w:pPr>
-      <w:r>
-        <w:rPr>
-          <w:rStyle w:val="FootnoteReference"/>
-        </w:rPr>
-        <w:footnoteRef/>
-      </w:r>
-      <w:r>
-        <w:rPr>
-          <w:rFonts w:ascii="Times New Roman" w:cs="Times New Roman" w:eastAsia="Times New Roman" w:hAnsi="Times New Roman"/>
-          <w:sz w:val="20"/>
-          <w:szCs w:val="20"/>
-        </w:rPr>
-        <w:t xml:space="preserve">Williams &amp; Glyn’s Bank Ltd v Boland [1981] AC 487 (HL)</w:t>
-      </w:r>
-      <w:r>
-        <w:rPr>
-          <w:rFonts w:ascii="David" w:cs="David" w:eastAsia="David" w:hAnsi="David"/>
-          <w:sz w:val="20"/>
-          <w:szCs w:val="20"/>
-          <w:rtl/>
-        </w:rPr>
-        <w:t xml:space="preserve">; והמשכה של ההגנה כיום ב-</w:t>
-      </w:r>
-      <w:r>
-        <w:rPr>
-          <w:rFonts w:ascii="Times New Roman" w:cs="Times New Roman" w:eastAsia="Times New Roman" w:hAnsi="Times New Roman"/>
-          <w:sz w:val="20"/>
-          <w:szCs w:val="20"/>
-        </w:rPr>
-        <w:t xml:space="preserve">Land Registration Act 2002, sch 3, para 2</w:t>
       </w:r>
       <w:r>
         <w:rPr>
@@ -9555,20 +9791,28 @@
       </w:r>
       <w:r>
         <w:rPr>
-          <w:rFonts w:ascii="David" w:cs="David" w:eastAsia="David" w:hAnsi="David"/>
-          <w:sz w:val="20"/>
-          <w:szCs w:val="20"/>
-          <w:rtl/>
-        </w:rPr>
-        <w:t xml:space="preserve">לביקורת עדכנית על מוסד הזכויות הגוברות כסדק ב"עקרון המראה" של המרשם ראו </w:t>
-      </w:r>
-      <w:r>
-        <w:rPr>
           <w:rFonts w:ascii="Times New Roman" w:cs="Times New Roman" w:eastAsia="Times New Roman" w:hAnsi="Times New Roman"/>
           <w:sz w:val="20"/>
           <w:szCs w:val="20"/>
         </w:rPr>
-        <w:t xml:space="preserve">Chris Bevan, "Overriding Interests under the Land Registration Act 2002: Time to Repair the ‘Cracked Mirror’?" [2024] Conv. 123</w:t>
+        <w:t xml:space="preserve">Williams &amp; Glyn’s Bank Ltd v Boland [1981] AC 487 (HL)</w:t>
+      </w:r>
+      <w:r>
+        <w:rPr>
+          <w:rFonts w:ascii="David" w:cs="David" w:eastAsia="David" w:hAnsi="David"/>
+          <w:sz w:val="20"/>
+          <w:szCs w:val="20"/>
+          <w:rtl/>
+        </w:rPr>
+        <w:t xml:space="preserve">; והמשכה של ההגנה כיום ב-</w:t>
+      </w:r>
+      <w:r>
+        <w:rPr>
+          <w:rFonts w:ascii="Times New Roman" w:cs="Times New Roman" w:eastAsia="Times New Roman" w:hAnsi="Times New Roman"/>
+          <w:sz w:val="20"/>
+          <w:szCs w:val="20"/>
+        </w:rPr>
+        <w:t xml:space="preserve">Land Registration Act 2002, sch 3, para 2</w:t>
       </w:r>
       <w:r>
         <w:rPr>
@@ -9595,11 +9839,20 @@
       </w:r>
       <w:r>
         <w:rPr>
+          <w:rFonts w:ascii="David" w:cs="David" w:eastAsia="David" w:hAnsi="David"/>
+          <w:sz w:val="20"/>
+          <w:szCs w:val="20"/>
+          <w:rtl/>
+        </w:rPr>
+        <w:t xml:space="preserve">לביקורת עדכנית על מוסד הזכויות הגוברות כסדק ב"עקרון המראה" של המרשם ראו </w:t>
+      </w:r>
+      <w:r>
+        <w:rPr>
           <w:rFonts w:ascii="Times New Roman" w:cs="Times New Roman" w:eastAsia="Times New Roman" w:hAnsi="Times New Roman"/>
           <w:sz w:val="20"/>
           <w:szCs w:val="20"/>
         </w:rPr>
-        <w:t xml:space="preserve">Stack v Dowden [2007] UKHL 17, [2007] 2 AC 432; Jones v Kernott [2011] UKSC 53, [2012] 1 AC 776</w:t>
+        <w:t xml:space="preserve">Chris Bevan, "Overriding Interests under the Land Registration Act 2002: Time to Repair the ‘Cracked Mirror’?" [2024] Conv. 123</w:t>
       </w:r>
       <w:r>
         <w:rPr>
@@ -9630,7 +9883,7 @@
           <w:sz w:val="20"/>
           <w:szCs w:val="20"/>
         </w:rPr>
-        <w:t xml:space="preserve">Thorner v Major [2009] UKHL 18, [2009] 1 WLR 776</w:t>
+        <w:t xml:space="preserve">Stack v Dowden [2007] UKHL 17, [2007] 2 AC 432; Jones v Kernott [2011] UKSC 53, [2012] 1 AC 776</w:t>
       </w:r>
       <w:r>
         <w:rPr>
@@ -9661,24 +9914,7 @@
           <w:sz w:val="20"/>
           <w:szCs w:val="20"/>
         </w:rPr>
-        <w:t xml:space="preserve">Guest v Guest [2022] UKSC 27, [2022] 3 WLR 911</w:t>
-      </w:r>
-      <w:r>
-        <w:rPr>
-          <w:rFonts w:ascii="David" w:cs="David" w:eastAsia="David" w:hAnsi="David"/>
-          <w:sz w:val="20"/>
-          <w:szCs w:val="20"/>
-          <w:rtl/>
-        </w:rPr>
-        <w:t xml:space="preserve">. לניתוח עדכני ראו </w:t>
-      </w:r>
-      <w:r>
-        <w:rPr>
-          <w:rFonts w:ascii="Times New Roman" w:cs="Times New Roman" w:eastAsia="Times New Roman" w:hAnsi="Times New Roman"/>
-          <w:sz w:val="20"/>
-          <w:szCs w:val="20"/>
-        </w:rPr>
-        <w:t xml:space="preserve">Alex Waghorn, "Promises in Equity and at Law: Proprietary Estoppel after Guest v Guest" (2023) 86 MLR 1504; Brian Sloan, "Proprietary Estoppel in the Supreme Court: Banquo’s Ghost?" (2023) 82 CLJ 13</w:t>
+        <w:t xml:space="preserve">Thorner v Major [2009] UKHL 18, [2009] 1 WLR 776</w:t>
       </w:r>
       <w:r>
         <w:rPr>
@@ -9709,34 +9945,33 @@
           <w:sz w:val="20"/>
           <w:szCs w:val="20"/>
         </w:rPr>
-        <w:t xml:space="preserve">Law of Property (Miscellaneous Provisions) Act 1989, ss 1–2</w:t>
-      </w:r>
-      <w:r>
-        <w:rPr>
-          <w:rFonts w:ascii="David" w:cs="David" w:eastAsia="David" w:hAnsi="David"/>
-          <w:sz w:val="20"/>
-          <w:szCs w:val="20"/>
-          <w:rtl/>
-        </w:rPr>
-        <w:t xml:space="preserve">. וראו כבר את ראבילו, </w:t>
-      </w:r>
-      <w:r>
-        <w:rPr>
-          <w:rFonts w:ascii="David" w:cs="David" w:eastAsia="David" w:hAnsi="David"/>
-          <w:sz w:val="20"/>
-          <w:szCs w:val="20"/>
-          <w:rtl/>
-        </w:rPr>
-        <w:t xml:space="preserve">לעיל ה"ש 31</w:t>
-      </w:r>
-      <w:r>
-        <w:rPr>
-          <w:rFonts w:ascii="David" w:cs="David" w:eastAsia="David" w:hAnsi="David"/>
-          <w:sz w:val="20"/>
-          <w:szCs w:val="20"/>
-          <w:rtl/>
-        </w:rPr>
-        <w:t xml:space="preserve">, המצטט את הכלל האנגלי שלפיו הבטחת מתנה גרידא אינה מעבירה בעלות וטעונה מסירה.</w:t>
+        <w:t xml:space="preserve">Guest v Guest [2022] UKSC 27, [2022] 3 WLR 911</w:t>
+      </w:r>
+      <w:r>
+        <w:rPr>
+          <w:rFonts w:ascii="David" w:cs="David" w:eastAsia="David" w:hAnsi="David"/>
+          <w:sz w:val="20"/>
+          <w:szCs w:val="20"/>
+          <w:rtl/>
+        </w:rPr>
+        <w:t xml:space="preserve">. לניתוח עדכני ראו </w:t>
+      </w:r>
+      <w:r>
+        <w:rPr>
+          <w:rFonts w:ascii="Times New Roman" w:cs="Times New Roman" w:eastAsia="Times New Roman" w:hAnsi="Times New Roman"/>
+          <w:sz w:val="20"/>
+          <w:szCs w:val="20"/>
+        </w:rPr>
+        <w:t xml:space="preserve">Alex Waghorn, "Promises in Equity and at Law: Proprietary Estoppel after Guest v Guest" (2023) 86 MLR 1504; Brian Sloan, "Proprietary Estoppel in the Supreme Court: Banquo’s Ghost?" (2023) 82 CLJ 13</w:t>
+      </w:r>
+      <w:r>
+        <w:rPr>
+          <w:rFonts w:ascii="David" w:cs="David" w:eastAsia="David" w:hAnsi="David"/>
+          <w:sz w:val="20"/>
+          <w:szCs w:val="20"/>
+          <w:rtl/>
+        </w:rPr>
+        <w:t xml:space="preserve">.</w:t>
       </w:r>
     </w:p>
   </w:footnote>
@@ -9758,16 +9993,34 @@
           <w:sz w:val="20"/>
           <w:szCs w:val="20"/>
         </w:rPr>
-        <w:t xml:space="preserve">Re Rose [1952] Ch 499 (CA)</w:t>
-      </w:r>
-      <w:r>
-        <w:rPr>
-          <w:rFonts w:ascii="David" w:cs="David" w:eastAsia="David" w:hAnsi="David"/>
-          <w:sz w:val="20"/>
-          <w:szCs w:val="20"/>
-          <w:rtl/>
-        </w:rPr>
-        <w:t xml:space="preserve">.</w:t>
+        <w:t xml:space="preserve">Law of Property (Miscellaneous Provisions) Act 1989, ss 1–2</w:t>
+      </w:r>
+      <w:r>
+        <w:rPr>
+          <w:rFonts w:ascii="David" w:cs="David" w:eastAsia="David" w:hAnsi="David"/>
+          <w:sz w:val="20"/>
+          <w:szCs w:val="20"/>
+          <w:rtl/>
+        </w:rPr>
+        <w:t xml:space="preserve">. וראו כבר את ראבילו, </w:t>
+      </w:r>
+      <w:r>
+        <w:rPr>
+          <w:rFonts w:ascii="David" w:cs="David" w:eastAsia="David" w:hAnsi="David"/>
+          <w:sz w:val="20"/>
+          <w:szCs w:val="20"/>
+          <w:rtl/>
+        </w:rPr>
+        <w:t xml:space="preserve">לעיל ה"ש 32</w:t>
+      </w:r>
+      <w:r>
+        <w:rPr>
+          <w:rFonts w:ascii="David" w:cs="David" w:eastAsia="David" w:hAnsi="David"/>
+          <w:sz w:val="20"/>
+          <w:szCs w:val="20"/>
+          <w:rtl/>
+        </w:rPr>
+        <w:t xml:space="preserve">, המצטט את הכלל האנגלי שלפיו הבטחת מתנה גרידא אינה מעבירה בעלות וטעונה מסירה.</w:t>
       </w:r>
     </w:p>
   </w:footnote>
@@ -9789,7 +10042,7 @@
           <w:sz w:val="20"/>
           <w:szCs w:val="20"/>
         </w:rPr>
-        <w:t xml:space="preserve">Pennington v Waine [2002] EWCA Civ 227, [2002] 1 WLR 2075</w:t>
+        <w:t xml:space="preserve">Re Rose [1952] Ch 499 (CA)</w:t>
       </w:r>
       <w:r>
         <w:rPr>
@@ -9820,16 +10073,16 @@
           <w:sz w:val="20"/>
           <w:szCs w:val="20"/>
         </w:rPr>
-        <w:t xml:space="preserve">Powers of Attorney Act 1971, s 4</w:t>
-      </w:r>
-      <w:r>
-        <w:rPr>
-          <w:rFonts w:ascii="David" w:cs="David" w:eastAsia="David" w:hAnsi="David"/>
-          <w:sz w:val="20"/>
-          <w:szCs w:val="20"/>
-          <w:rtl/>
-        </w:rPr>
-        <w:t xml:space="preserve">. זהו המקור ההיסטורי של ס׳ 14(ב) לחוק השליחות הישראלי.</w:t>
+        <w:t xml:space="preserve">Pennington v Waine [2002] EWCA Civ 227, [2002] 1 WLR 2075</w:t>
+      </w:r>
+      <w:r>
+        <w:rPr>
+          <w:rFonts w:ascii="David" w:cs="David" w:eastAsia="David" w:hAnsi="David"/>
+          <w:sz w:val="20"/>
+          <w:szCs w:val="20"/>
+          <w:rtl/>
+        </w:rPr>
+        <w:t xml:space="preserve">.</w:t>
       </w:r>
     </w:p>
   </w:footnote>
@@ -9847,29 +10100,20 @@
       </w:r>
       <w:r>
         <w:rPr>
-          <w:rFonts w:ascii="David" w:cs="David" w:eastAsia="David" w:hAnsi="David"/>
-          <w:sz w:val="20"/>
-          <w:szCs w:val="20"/>
-          <w:rtl/>
-        </w:rPr>
-        <w:t xml:space="preserve">לניתוח השוואתי של גורל ההתיישנות הרוכשת בשיטות הרישום המודרניות ראו </w:t>
-      </w:r>
-      <w:r>
-        <w:rPr>
           <w:rFonts w:ascii="Times New Roman" w:cs="Times New Roman" w:eastAsia="Times New Roman" w:hAnsi="Times New Roman"/>
           <w:sz w:val="20"/>
           <w:szCs w:val="20"/>
         </w:rPr>
-        <w:t xml:space="preserve">Nadav Shoked, "Who Needs Adverse Possession?," 89 Fordham L. Rev. 2639 (2021)</w:t>
-      </w:r>
-      <w:r>
-        <w:rPr>
-          <w:rFonts w:ascii="David" w:cs="David" w:eastAsia="David" w:hAnsi="David"/>
-          <w:sz w:val="20"/>
-          <w:szCs w:val="20"/>
-          <w:rtl/>
-        </w:rPr>
-        <w:t xml:space="preserve">.</w:t>
+        <w:t xml:space="preserve">Powers of Attorney Act 1971, s 4</w:t>
+      </w:r>
+      <w:r>
+        <w:rPr>
+          <w:rFonts w:ascii="David" w:cs="David" w:eastAsia="David" w:hAnsi="David"/>
+          <w:sz w:val="20"/>
+          <w:szCs w:val="20"/>
+          <w:rtl/>
+        </w:rPr>
+        <w:t xml:space="preserve">. זהו המקור ההיסטורי של ס׳ 14(ב) לחוק השליחות הישראלי.</w:t>
       </w:r>
     </w:p>
   </w:footnote>
@@ -9892,7 +10136,24 @@
           <w:szCs w:val="20"/>
           <w:rtl/>
         </w:rPr>
-        <w:t xml:space="preserve">ס׳ 418 לקוד האזרחי המצרי (חוק מס׳ 131 לשנת 1948).</w:t>
+        <w:t xml:space="preserve">לניתוח השוואתי של גורל ההתיישנות הרוכשת בשיטות הרישום המודרניות ראו </w:t>
+      </w:r>
+      <w:r>
+        <w:rPr>
+          <w:rFonts w:ascii="Times New Roman" w:cs="Times New Roman" w:eastAsia="Times New Roman" w:hAnsi="Times New Roman"/>
+          <w:sz w:val="20"/>
+          <w:szCs w:val="20"/>
+        </w:rPr>
+        <w:t xml:space="preserve">Nadav Shoked, "Who Needs Adverse Possession?," 89 Fordham L. Rev. 2639 (2021)</w:t>
+      </w:r>
+      <w:r>
+        <w:rPr>
+          <w:rFonts w:ascii="David" w:cs="David" w:eastAsia="David" w:hAnsi="David"/>
+          <w:sz w:val="20"/>
+          <w:szCs w:val="20"/>
+          <w:rtl/>
+        </w:rPr>
+        <w:t xml:space="preserve">.</w:t>
       </w:r>
     </w:p>
   </w:footnote>
@@ -9915,7 +10176,7 @@
           <w:szCs w:val="20"/>
           <w:rtl/>
         </w:rPr>
-        <w:t xml:space="preserve">ס׳ 934 לקוד האזרחי המצרי; ס׳ 9 לחוק ארגון הפומביות המקרקעית, חוק מס׳ 114 לשנת 1946. במצרים פועלות במקביל שתי שיטות רישום: רישום שטרות פרסונלי לפי חוק 114/1946, החולש על מרבית המדינה, ורישום זכויות קדסטרלי לפי חוק מס׳ 142 לשנת 1964, שתחולתו מוגבלת.</w:t>
+        <w:t xml:space="preserve">ס׳ 418 לקוד האזרחי המצרי (חוק מס׳ 131 לשנת 1948).</w:t>
       </w:r>
     </w:p>
   </w:footnote>
@@ -9933,38 +10194,12 @@
       </w:r>
       <w:r>
         <w:rPr>
-          <w:rFonts w:ascii="Times New Roman" w:cs="Times New Roman" w:eastAsia="Times New Roman" w:hAnsi="Times New Roman"/>
-          <w:sz w:val="20"/>
-          <w:szCs w:val="20"/>
-        </w:rPr>
-        <w:t xml:space="preserve">“More than 90% of Egypt’s Properties Are Unregistered: Justice Minister,” Daily News Egypt (Feb. 14, 2022); “Egypt’s Property Registration Rate Remains Below 10%…: World Bank,” Daily News Egypt (July 5, 2026)</w:t>
-      </w:r>
-      <w:r>
-        <w:rPr>
-          <w:rFonts w:ascii="David" w:cs="David" w:eastAsia="David" w:hAnsi="David"/>
-          <w:sz w:val="20"/>
-          <w:szCs w:val="20"/>
-          <w:rtl/>
-        </w:rPr>
-        <w:t xml:space="preserve">. הרנדו דה-סוטו ביסס על מצרים את מחקר "ההון המת" שלו: </w:t>
-      </w:r>
-      <w:r>
-        <w:rPr>
-          <w:rFonts w:ascii="David" w:cs="David" w:eastAsia="David" w:hAnsi="David"/>
-          <w:sz w:val="20"/>
-          <w:szCs w:val="20"/>
-          <w:rtl/>
-        </w:rPr>
-        <w:t xml:space="preserve">לעיל ה"ש 58</w:t>
-      </w:r>
-      <w:r>
-        <w:rPr>
-          <w:rFonts w:ascii="David" w:cs="David" w:eastAsia="David" w:hAnsi="David"/>
-          <w:sz w:val="20"/>
-          <w:szCs w:val="20"/>
-          <w:rtl/>
-        </w:rPr>
-        <w:t xml:space="preserve">.</w:t>
+          <w:rFonts w:ascii="David" w:cs="David" w:eastAsia="David" w:hAnsi="David"/>
+          <w:sz w:val="20"/>
+          <w:szCs w:val="20"/>
+          <w:rtl/>
+        </w:rPr>
+        <w:t xml:space="preserve">ס׳ 934 לקוד האזרחי המצרי; ס׳ 9 לחוק ארגון הפומביות המקרקעית, חוק מס׳ 114 לשנת 1946. במצרים פועלות במקביל שתי שיטות רישום: רישום שטרות פרסונלי לפי חוק 114/1946, החולש על מרבית המדינה, ורישום זכויות קדסטרלי לפי חוק מס׳ 142 לשנת 1964, שתחולתו מוגבלת.</w:t>
       </w:r>
     </w:p>
   </w:footnote>
@@ -9982,12 +10217,38 @@
       </w:r>
       <w:r>
         <w:rPr>
-          <w:rFonts w:ascii="David" w:cs="David" w:eastAsia="David" w:hAnsi="David"/>
-          <w:sz w:val="20"/>
-          <w:szCs w:val="20"/>
-          <w:rtl/>
-        </w:rPr>
-        <w:t xml:space="preserve">ס׳ 715 לקוד האזרחי המצרי. בית המשפט החוקתי העליון של מצרים שב ואישר בשנת 2021 כי ייפוי כוח כזה אינו ניתן לביטול חד-צדדי. ואולם ס׳ 714 מורה כי השליחות פוקעת במות השולח – נקודת תורפה מרכזית של הפרקטיקה, שפסיקת בית המשפט לקסאציה בעניינה אינה אחידה.</w:t>
+          <w:rFonts w:ascii="Times New Roman" w:cs="Times New Roman" w:eastAsia="Times New Roman" w:hAnsi="Times New Roman"/>
+          <w:sz w:val="20"/>
+          <w:szCs w:val="20"/>
+        </w:rPr>
+        <w:t xml:space="preserve">“More than 90% of Egypt’s Properties Are Unregistered: Justice Minister,” Daily News Egypt (Feb. 14, 2022); “Egypt’s Property Registration Rate Remains Below 10%…: World Bank,” Daily News Egypt (July 5, 2026)</w:t>
+      </w:r>
+      <w:r>
+        <w:rPr>
+          <w:rFonts w:ascii="David" w:cs="David" w:eastAsia="David" w:hAnsi="David"/>
+          <w:sz w:val="20"/>
+          <w:szCs w:val="20"/>
+          <w:rtl/>
+        </w:rPr>
+        <w:t xml:space="preserve">. הרנדו דה-סוטו ביסס על מצרים את מחקר "ההון המת" שלו: </w:t>
+      </w:r>
+      <w:r>
+        <w:rPr>
+          <w:rFonts w:ascii="David" w:cs="David" w:eastAsia="David" w:hAnsi="David"/>
+          <w:sz w:val="20"/>
+          <w:szCs w:val="20"/>
+          <w:rtl/>
+        </w:rPr>
+        <w:t xml:space="preserve">לעיל ה"ש 59</w:t>
+      </w:r>
+      <w:r>
+        <w:rPr>
+          <w:rFonts w:ascii="David" w:cs="David" w:eastAsia="David" w:hAnsi="David"/>
+          <w:sz w:val="20"/>
+          <w:szCs w:val="20"/>
+          <w:rtl/>
+        </w:rPr>
+        <w:t xml:space="preserve">.</w:t>
       </w:r>
     </w:p>
   </w:footnote>
@@ -10010,24 +10271,7 @@
           <w:szCs w:val="20"/>
           <w:rtl/>
         </w:rPr>
-        <w:t xml:space="preserve">לפסיקת בית המשפט לקסאציה המצרי על תביעות אלה ראו הסקירות שבמאגרי לשכת עורכי הדין המצרית; ולתיאור אנליטי באנגלית ראו </w:t>
-      </w:r>
-      <w:r>
-        <w:rPr>
-          <w:rFonts w:ascii="Times New Roman" w:cs="Times New Roman" w:eastAsia="Times New Roman" w:hAnsi="Times New Roman"/>
-          <w:sz w:val="20"/>
-          <w:szCs w:val="20"/>
-        </w:rPr>
-        <w:t xml:space="preserve">David Sims, "Securing Land Tenure in Egypt: Who Needs Registered Titles?" Metropolitics (June 14, 2016)</w:t>
-      </w:r>
-      <w:r>
-        <w:rPr>
-          <w:rFonts w:ascii="David" w:cs="David" w:eastAsia="David" w:hAnsi="David"/>
-          <w:sz w:val="20"/>
-          <w:szCs w:val="20"/>
-          <w:rtl/>
-        </w:rPr>
-        <w:t xml:space="preserve">.</w:t>
+        <w:t xml:space="preserve">ס׳ 715 לקוד האזרחי המצרי. בית המשפט החוקתי העליון של מצרים שב ואישר בשנת 2021 כי ייפוי כוח כזה אינו ניתן לביטול חד-צדדי. ואולם ס׳ 714 מורה כי השליחות פוקעת במות השולח – נקודת תורפה מרכזית של הפרקטיקה, שפסיקת בית המשפט לקסאציה בעניינה אינה אחידה.</w:t>
       </w:r>
     </w:p>
   </w:footnote>
@@ -10050,7 +10294,24 @@
           <w:szCs w:val="20"/>
           <w:rtl/>
         </w:rPr>
-        <w:t xml:space="preserve">ס׳ 968 לקוד האזרחי המצרי. הפרקטיקה המצרית דנה בכך תחת הכותרת "וַצְ׳ע אל-יַד" (הנחת היד) – ההחזקה בפועל כמקור קניין.</w:t>
+        <w:t xml:space="preserve">לפסיקת בית המשפט לקסאציה המצרי על תביעות אלה ראו הסקירות שבמאגרי לשכת עורכי הדין המצרית; ולתיאור אנליטי באנגלית ראו </w:t>
+      </w:r>
+      <w:r>
+        <w:rPr>
+          <w:rFonts w:ascii="Times New Roman" w:cs="Times New Roman" w:eastAsia="Times New Roman" w:hAnsi="Times New Roman"/>
+          <w:sz w:val="20"/>
+          <w:szCs w:val="20"/>
+        </w:rPr>
+        <w:t xml:space="preserve">David Sims, "Securing Land Tenure in Egypt: Who Needs Registered Titles?" Metropolitics (June 14, 2016)</w:t>
+      </w:r>
+      <w:r>
+        <w:rPr>
+          <w:rFonts w:ascii="David" w:cs="David" w:eastAsia="David" w:hAnsi="David"/>
+          <w:sz w:val="20"/>
+          <w:szCs w:val="20"/>
+          <w:rtl/>
+        </w:rPr>
+        <w:t xml:space="preserve">.</w:t>
       </w:r>
     </w:p>
   </w:footnote>
@@ -10073,7 +10334,7 @@
           <w:szCs w:val="20"/>
           <w:rtl/>
         </w:rPr>
-        <w:t xml:space="preserve">ס׳ 969 לקוד האזרחי המצרי.</w:t>
+        <w:t xml:space="preserve">ס׳ 968 לקוד האזרחי המצרי. הפרקטיקה המצרית דנה בכך תחת הכותרת "וַצְ׳ע אל-יַד" (הנחת היד) – ההחזקה בפועל כמקור קניין.</w:t>
       </w:r>
     </w:p>
   </w:footnote>
@@ -10096,7 +10357,7 @@
           <w:szCs w:val="20"/>
           <w:rtl/>
         </w:rPr>
-        <w:t xml:space="preserve">ס׳ 970 לקוד האזרחי המצרי, כפי שתוקן בחוק מס׳ 55 לשנת 1970; ולנכסי הציבור ראו גם ס׳ 87(2) לקוד.</w:t>
+        <w:t xml:space="preserve">ס׳ 969 לקוד האזרחי המצרי.</w:t>
       </w:r>
     </w:p>
   </w:footnote>
@@ -10119,42 +10380,7 @@
           <w:szCs w:val="20"/>
           <w:rtl/>
         </w:rPr>
-        <w:t xml:space="preserve">להשוואה בין גישות שיטות הרישום להתיישנות רוכשת ראו </w:t>
-      </w:r>
-      <w:r>
-        <w:rPr>
-          <w:rFonts w:ascii="Times New Roman" w:cs="Times New Roman" w:eastAsia="Times New Roman" w:hAnsi="Times New Roman"/>
-          <w:sz w:val="20"/>
-          <w:szCs w:val="20"/>
-        </w:rPr>
-        <w:t xml:space="preserve">Shoked</w:t>
-      </w:r>
-      <w:r>
-        <w:rPr>
-          <w:rFonts w:ascii="David" w:cs="David" w:eastAsia="David" w:hAnsi="David"/>
-          <w:sz w:val="20"/>
-          <w:szCs w:val="20"/>
-          <w:rtl/>
-        </w:rPr>
-        <w:t xml:space="preserve">, </w:t>
-      </w:r>
-      <w:r>
-        <w:rPr>
-          <w:rFonts w:ascii="David" w:cs="David" w:eastAsia="David" w:hAnsi="David"/>
-          <w:sz w:val="20"/>
-          <w:szCs w:val="20"/>
-          <w:rtl/>
-        </w:rPr>
-        <w:t xml:space="preserve">לעיל ה"ש 73</w:t>
-      </w:r>
-      <w:r>
-        <w:rPr>
-          <w:rFonts w:ascii="David" w:cs="David" w:eastAsia="David" w:hAnsi="David"/>
-          <w:sz w:val="20"/>
-          <w:szCs w:val="20"/>
-          <w:rtl/>
-        </w:rPr>
-        <w:t xml:space="preserve">. ודוק: בישראל נחסם מסלול זה כמעט כליל – ס׳ 159(ב) לחוק המקרקעין שלל התיישנות במקרקעין מוסדרים, וחזקתו של בן משפחה מסווגת כ"חזקה מרשות"; ראו לעיל פרק ג.6.</w:t>
+        <w:t xml:space="preserve">ס׳ 970 לקוד האזרחי המצרי, כפי שתוקן בחוק מס׳ 55 לשנת 1970; ולנכסי הציבור ראו גם ס׳ 87(2) לקוד.</w:t>
       </w:r>
     </w:p>
   </w:footnote>
@@ -10172,37 +10398,47 @@
       </w:r>
       <w:r>
         <w:rPr>
+          <w:rFonts w:ascii="David" w:cs="David" w:eastAsia="David" w:hAnsi="David"/>
+          <w:sz w:val="20"/>
+          <w:szCs w:val="20"/>
+          <w:rtl/>
+        </w:rPr>
+        <w:t xml:space="preserve">להשוואה בין גישות שיטות הרישום להתיישנות רוכשת ראו </w:t>
+      </w:r>
+      <w:r>
+        <w:rPr>
           <w:rFonts w:ascii="Times New Roman" w:cs="Times New Roman" w:eastAsia="Times New Roman" w:hAnsi="Times New Roman"/>
           <w:sz w:val="20"/>
           <w:szCs w:val="20"/>
         </w:rPr>
-        <w:t xml:space="preserve">“Sisi Orders Delaying Implementation of Controversial Real Estate Law for 2 Years,” Ahram Online (Feb. 28, 2021); “‘Unjust’: Egypt’s Property Registration Plans Face Popular Backlash,” Middle East Eye (2021)</w:t>
-      </w:r>
-      <w:r>
-        <w:rPr>
-          <w:rFonts w:ascii="David" w:cs="David" w:eastAsia="David" w:hAnsi="David"/>
-          <w:sz w:val="20"/>
-          <w:szCs w:val="20"/>
-          <w:rtl/>
-        </w:rPr>
-        <w:t xml:space="preserve">. לניתוח מדיניות ראו </w:t>
-      </w:r>
-      <w:r>
-        <w:rPr>
-          <w:rFonts w:ascii="Times New Roman" w:cs="Times New Roman" w:eastAsia="Times New Roman" w:hAnsi="Times New Roman"/>
-          <w:sz w:val="20"/>
-          <w:szCs w:val="20"/>
-        </w:rPr>
-        <w:t xml:space="preserve">“Real Estate Registration Law Amendments – Development Brief,” The Built Environment Observatory (May 2021)</w:t>
-      </w:r>
-      <w:r>
-        <w:rPr>
-          <w:rFonts w:ascii="David" w:cs="David" w:eastAsia="David" w:hAnsi="David"/>
-          <w:sz w:val="20"/>
-          <w:szCs w:val="20"/>
-          <w:rtl/>
-        </w:rPr>
-        <w:t xml:space="preserve">.</w:t>
+        <w:t xml:space="preserve">Shoked</w:t>
+      </w:r>
+      <w:r>
+        <w:rPr>
+          <w:rFonts w:ascii="David" w:cs="David" w:eastAsia="David" w:hAnsi="David"/>
+          <w:sz w:val="20"/>
+          <w:szCs w:val="20"/>
+          <w:rtl/>
+        </w:rPr>
+        <w:t xml:space="preserve">, </w:t>
+      </w:r>
+      <w:r>
+        <w:rPr>
+          <w:rFonts w:ascii="David" w:cs="David" w:eastAsia="David" w:hAnsi="David"/>
+          <w:sz w:val="20"/>
+          <w:szCs w:val="20"/>
+          <w:rtl/>
+        </w:rPr>
+        <w:t xml:space="preserve">לעיל ה"ש 74</w:t>
+      </w:r>
+      <w:r>
+        <w:rPr>
+          <w:rFonts w:ascii="David" w:cs="David" w:eastAsia="David" w:hAnsi="David"/>
+          <w:sz w:val="20"/>
+          <w:szCs w:val="20"/>
+          <w:rtl/>
+        </w:rPr>
+        <w:t xml:space="preserve">. ודוק: בישראל נחסם מסלול זה כמעט כליל – ס׳ 159(ב) לחוק המקרקעין שלל התיישנות במקרקעין מוסדרים, וחזקתו של בן משפחה מסווגת כ"חזקה מרשות"; ראו לעיל פרק ג.6.</w:t>
       </w:r>
     </w:p>
   </w:footnote>
@@ -10220,20 +10456,28 @@
       </w:r>
       <w:r>
         <w:rPr>
-          <w:rFonts w:ascii="David" w:cs="David" w:eastAsia="David" w:hAnsi="David"/>
-          <w:sz w:val="20"/>
-          <w:szCs w:val="20"/>
-          <w:rtl/>
-        </w:rPr>
-        <w:t xml:space="preserve">חוק מס׳ 9 לשנת 2022 (מצרים), המתקן את חוק מס׳ 114 לשנת 1946; ראו </w:t>
-      </w:r>
-      <w:r>
-        <w:rPr>
           <w:rFonts w:ascii="Times New Roman" w:cs="Times New Roman" w:eastAsia="Times New Roman" w:hAnsi="Times New Roman"/>
           <w:sz w:val="20"/>
           <w:szCs w:val="20"/>
         </w:rPr>
-        <w:t xml:space="preserve">Shalakany Law Office, “New Amendments to Real Estate Registration Law” (2022)</w:t>
+        <w:t xml:space="preserve">“Sisi Orders Delaying Implementation of Controversial Real Estate Law for 2 Years,” Ahram Online (Feb. 28, 2021); “‘Unjust’: Egypt’s Property Registration Plans Face Popular Backlash,” Middle East Eye (2021)</w:t>
+      </w:r>
+      <w:r>
+        <w:rPr>
+          <w:rFonts w:ascii="David" w:cs="David" w:eastAsia="David" w:hAnsi="David"/>
+          <w:sz w:val="20"/>
+          <w:szCs w:val="20"/>
+          <w:rtl/>
+        </w:rPr>
+        <w:t xml:space="preserve">. לניתוח מדיניות ראו </w:t>
+      </w:r>
+      <w:r>
+        <w:rPr>
+          <w:rFonts w:ascii="Times New Roman" w:cs="Times New Roman" w:eastAsia="Times New Roman" w:hAnsi="Times New Roman"/>
+          <w:sz w:val="20"/>
+          <w:szCs w:val="20"/>
+        </w:rPr>
+        <w:t xml:space="preserve">“Real Estate Registration Law Amendments – Development Brief,” The Built Environment Observatory (May 2021)</w:t>
       </w:r>
       <w:r>
         <w:rPr>
@@ -10265,7 +10509,24 @@
           <w:szCs w:val="20"/>
           <w:rtl/>
         </w:rPr>
-        <w:t xml:space="preserve">ס׳ 2 לחוקת מצרים (2014); ס׳ 1 לקוד האזרחי המצרי (ובו מדרג: חקיקה, מנהג, עקרונות השריעה, עקרונות הצדק); חוק הירושה המצרי, חוק מס׳ 77 לשנת 1943; ולצוואות – חוק מס׳ 71 לשנת 1946.</w:t>
+        <w:t xml:space="preserve">חוק מס׳ 9 לשנת 2022 (מצרים), המתקן את חוק מס׳ 114 לשנת 1946; ראו </w:t>
+      </w:r>
+      <w:r>
+        <w:rPr>
+          <w:rFonts w:ascii="Times New Roman" w:cs="Times New Roman" w:eastAsia="Times New Roman" w:hAnsi="Times New Roman"/>
+          <w:sz w:val="20"/>
+          <w:szCs w:val="20"/>
+        </w:rPr>
+        <w:t xml:space="preserve">Shalakany Law Office, “New Amendments to Real Estate Registration Law” (2022)</w:t>
+      </w:r>
+      <w:r>
+        <w:rPr>
+          <w:rFonts w:ascii="David" w:cs="David" w:eastAsia="David" w:hAnsi="David"/>
+          <w:sz w:val="20"/>
+          <w:szCs w:val="20"/>
+          <w:rtl/>
+        </w:rPr>
+        <w:t xml:space="preserve">.</w:t>
       </w:r>
     </w:p>
   </w:footnote>
@@ -10288,24 +10549,7 @@
           <w:szCs w:val="20"/>
           <w:rtl/>
         </w:rPr>
-        <w:t xml:space="preserve">לתרגום האנגלי המקובל ראו </w:t>
-      </w:r>
-      <w:r>
-        <w:rPr>
-          <w:rFonts w:ascii="Times New Roman" w:cs="Times New Roman" w:eastAsia="Times New Roman" w:hAnsi="Times New Roman"/>
-          <w:sz w:val="20"/>
-          <w:szCs w:val="20"/>
-        </w:rPr>
-        <w:t xml:space="preserve">C.R. Tyser, D.G. Demetriades &amp; Ismail Haqqi Effendi (trans.), The Mejelle: Being an English Translation of Majallah el-Ahkam-i-Adliya (1901)</w:t>
-      </w:r>
-      <w:r>
-        <w:rPr>
-          <w:rFonts w:ascii="David" w:cs="David" w:eastAsia="David" w:hAnsi="David"/>
-          <w:sz w:val="20"/>
-          <w:szCs w:val="20"/>
-          <w:rtl/>
-        </w:rPr>
-        <w:t xml:space="preserve">; חוק לביטול המג׳לה, התשמ"ד-1984.</w:t>
+        <w:t xml:space="preserve">ס׳ 2 לחוקת מצרים (2014); ס׳ 1 לקוד האזרחי המצרי (ובו מדרג: חקיקה, מנהג, עקרונות השריעה, עקרונות הצדק); חוק הירושה המצרי, חוק מס׳ 77 לשנת 1943; ולצוואות – חוק מס׳ 71 לשנת 1946.</w:t>
       </w:r>
     </w:p>
   </w:footnote>
@@ -10328,7 +10572,7 @@
           <w:szCs w:val="20"/>
           <w:rtl/>
         </w:rPr>
-        <w:t xml:space="preserve">ס׳ 837, 861–862 למג׳לה. לדוקטרינת ההִבָּה הקלאסית ראו </w:t>
+        <w:t xml:space="preserve">לתרגום האנגלי המקובל ראו </w:t>
       </w:r>
       <w:r>
         <w:rPr>
@@ -10336,16 +10580,16 @@
           <w:sz w:val="20"/>
           <w:szCs w:val="20"/>
         </w:rPr>
-        <w:t xml:space="preserve">Joseph Schacht, An Introduction to Islamic Law (1964); Y. Linant de Bellefonds, “Hiba,” in The Encyclopaedia of Islam (2d ed.)</w:t>
-      </w:r>
-      <w:r>
-        <w:rPr>
-          <w:rFonts w:ascii="David" w:cs="David" w:eastAsia="David" w:hAnsi="David"/>
-          <w:sz w:val="20"/>
-          <w:szCs w:val="20"/>
-          <w:rtl/>
-        </w:rPr>
-        <w:t xml:space="preserve">.</w:t>
+        <w:t xml:space="preserve">C.R. Tyser, D.G. Demetriades &amp; Ismail Haqqi Effendi (trans.), The Mejelle: Being an English Translation of Majallah el-Ahkam-i-Adliya (1901)</w:t>
+      </w:r>
+      <w:r>
+        <w:rPr>
+          <w:rFonts w:ascii="David" w:cs="David" w:eastAsia="David" w:hAnsi="David"/>
+          <w:sz w:val="20"/>
+          <w:szCs w:val="20"/>
+          <w:rtl/>
+        </w:rPr>
+        <w:t xml:space="preserve">; חוק לביטול המג׳לה, התשמ"ד-1984.</w:t>
       </w:r>
     </w:p>
   </w:footnote>
@@ -10368,7 +10612,24 @@
           <w:szCs w:val="20"/>
           <w:rtl/>
         </w:rPr>
-        <w:t xml:space="preserve">ס׳ 866 למג׳לה; וכן ס׳ 872 – מות אחד הצדדים חוסם את החזרה.</w:t>
+        <w:t xml:space="preserve">ס׳ 837, 861–862 למג׳לה. לדוקטרינת ההִבָּה הקלאסית ראו </w:t>
+      </w:r>
+      <w:r>
+        <w:rPr>
+          <w:rFonts w:ascii="Times New Roman" w:cs="Times New Roman" w:eastAsia="Times New Roman" w:hAnsi="Times New Roman"/>
+          <w:sz w:val="20"/>
+          <w:szCs w:val="20"/>
+        </w:rPr>
+        <w:t xml:space="preserve">Joseph Schacht, An Introduction to Islamic Law (1964); Y. Linant de Bellefonds, “Hiba,” in The Encyclopaedia of Islam (2d ed.)</w:t>
+      </w:r>
+      <w:r>
+        <w:rPr>
+          <w:rFonts w:ascii="David" w:cs="David" w:eastAsia="David" w:hAnsi="David"/>
+          <w:sz w:val="20"/>
+          <w:szCs w:val="20"/>
+          <w:rtl/>
+        </w:rPr>
+        <w:t xml:space="preserve">.</w:t>
       </w:r>
     </w:p>
   </w:footnote>
@@ -10391,24 +10652,7 @@
           <w:szCs w:val="20"/>
           <w:rtl/>
         </w:rPr>
-        <w:t xml:space="preserve">ס׳ 879 למג׳לה; לדיון עדכני ראו </w:t>
-      </w:r>
-      <w:r>
-        <w:rPr>
-          <w:rFonts w:ascii="Times New Roman" w:cs="Times New Roman" w:eastAsia="Times New Roman" w:hAnsi="Times New Roman"/>
-          <w:sz w:val="20"/>
-          <w:szCs w:val="20"/>
-        </w:rPr>
-        <w:t xml:space="preserve">Siti Norfatirah Abdul Rahmani &amp; Mohd Zamro Muda, “Ownership Status of Hibah Marad al-Mawt,” 34(8) al-Qanatir Int’l J. Islamic Stud. (2025)</w:t>
-      </w:r>
-      <w:r>
-        <w:rPr>
-          <w:rFonts w:ascii="David" w:cs="David" w:eastAsia="David" w:hAnsi="David"/>
-          <w:sz w:val="20"/>
-          <w:szCs w:val="20"/>
-          <w:rtl/>
-        </w:rPr>
-        <w:t xml:space="preserve">.</w:t>
+        <w:t xml:space="preserve">ס׳ 866 למג׳לה; וכן ס׳ 872 – מות אחד הצדדים חוסם את החזרה.</w:t>
       </w:r>
     </w:p>
   </w:footnote>
@@ -10431,25 +10675,7 @@
           <w:szCs w:val="20"/>
           <w:rtl/>
         </w:rPr>
-        <w:t xml:space="preserve">להוראת המעבר ראו ראבילו, </w:t>
-      </w:r>
-      <w:r>
-        <w:rPr>
-          <w:rFonts w:ascii="David" w:cs="David" w:eastAsia="David" w:hAnsi="David"/>
-          <w:sz w:val="20"/>
-          <w:szCs w:val="20"/>
-          <w:rtl/>
-        </w:rPr>
-        <w:t xml:space="preserve">לעיל ה"ש 31</w:t>
-      </w:r>
-      <w:r>
-        <w:rPr>
-          <w:rFonts w:ascii="David" w:cs="David" w:eastAsia="David" w:hAnsi="David"/>
-          <w:sz w:val="20"/>
-          <w:szCs w:val="20"/>
-          <w:rtl/>
-        </w:rPr>
-        <w:t xml:space="preserve">, בעמ׳ 333–337, המתאר את הדין ערב חוק המתנה; והשוו </w:t>
+        <w:t xml:space="preserve">ס׳ 879 למג׳לה; לדיון עדכני ראו </w:t>
       </w:r>
       <w:r>
         <w:rPr>
@@ -10457,16 +10683,16 @@
           <w:sz w:val="20"/>
           <w:szCs w:val="20"/>
         </w:rPr>
-        <w:t xml:space="preserve">L. Landau, “The Gift Law, 1968,” 4 Isr. L. Rev. 260 (1969)</w:t>
-      </w:r>
-      <w:r>
-        <w:rPr>
-          <w:rFonts w:ascii="David" w:cs="David" w:eastAsia="David" w:hAnsi="David"/>
-          <w:sz w:val="20"/>
-          <w:szCs w:val="20"/>
-          <w:rtl/>
-        </w:rPr>
-        <w:t xml:space="preserve">, על החלפת דיני ההִבָּה של המג׳לה בחוק המתנה הישראלי.</w:t>
+        <w:t xml:space="preserve">Siti Norfatirah Abdul Rahmani &amp; Mohd Zamro Muda, “Ownership Status of Hibah Marad al-Mawt,” 34(8) al-Qanatir Int’l J. Islamic Stud. (2025)</w:t>
+      </w:r>
+      <w:r>
+        <w:rPr>
+          <w:rFonts w:ascii="David" w:cs="David" w:eastAsia="David" w:hAnsi="David"/>
+          <w:sz w:val="20"/>
+          <w:szCs w:val="20"/>
+          <w:rtl/>
+        </w:rPr>
+        <w:t xml:space="preserve">.</w:t>
       </w:r>
     </w:p>
   </w:footnote>
@@ -10489,7 +10715,42 @@
           <w:szCs w:val="20"/>
           <w:rtl/>
         </w:rPr>
-        <w:t xml:space="preserve">ס׳ 1660 למג׳לה (ולתביעות בעניין יסוד הוקף – 36 שנים, ס׳ 1661).</w:t>
+        <w:t xml:space="preserve">להוראת המעבר ראו ראבילו, </w:t>
+      </w:r>
+      <w:r>
+        <w:rPr>
+          <w:rFonts w:ascii="David" w:cs="David" w:eastAsia="David" w:hAnsi="David"/>
+          <w:sz w:val="20"/>
+          <w:szCs w:val="20"/>
+          <w:rtl/>
+        </w:rPr>
+        <w:t xml:space="preserve">לעיל ה"ש 32</w:t>
+      </w:r>
+      <w:r>
+        <w:rPr>
+          <w:rFonts w:ascii="David" w:cs="David" w:eastAsia="David" w:hAnsi="David"/>
+          <w:sz w:val="20"/>
+          <w:szCs w:val="20"/>
+          <w:rtl/>
+        </w:rPr>
+        <w:t xml:space="preserve">, בעמ׳ 333–337, המתאר את הדין ערב חוק המתנה; והשוו </w:t>
+      </w:r>
+      <w:r>
+        <w:rPr>
+          <w:rFonts w:ascii="Times New Roman" w:cs="Times New Roman" w:eastAsia="Times New Roman" w:hAnsi="Times New Roman"/>
+          <w:sz w:val="20"/>
+          <w:szCs w:val="20"/>
+        </w:rPr>
+        <w:t xml:space="preserve">L. Landau, “The Gift Law, 1968,” 4 Isr. L. Rev. 260 (1969)</w:t>
+      </w:r>
+      <w:r>
+        <w:rPr>
+          <w:rFonts w:ascii="David" w:cs="David" w:eastAsia="David" w:hAnsi="David"/>
+          <w:sz w:val="20"/>
+          <w:szCs w:val="20"/>
+          <w:rtl/>
+        </w:rPr>
+        <w:t xml:space="preserve">, על החלפת דיני ההִבָּה של המג׳לה בחוק המתנה הישראלי.</w:t>
       </w:r>
     </w:p>
   </w:footnote>
@@ -10512,7 +10773,7 @@
           <w:szCs w:val="20"/>
           <w:rtl/>
         </w:rPr>
-        <w:t xml:space="preserve">ס׳ 1674 למג׳לה. ההקבלה לס׳ 2 לחוק ההתיישנות, התשי"ח-1958, שאף הוא קובע התיישנות דיונית שאינה מפקיעה את הזכות, גלויה לעין.</w:t>
+        <w:t xml:space="preserve">ס׳ 1660 למג׳לה (ולתביעות בעניין יסוד הוקף – 36 שנים, ס׳ 1661).</w:t>
       </w:r>
     </w:p>
   </w:footnote>
@@ -10535,42 +10796,7 @@
           <w:szCs w:val="20"/>
           <w:rtl/>
         </w:rPr>
-        <w:t xml:space="preserve">ס׳ 20 ו-78 לחוק הקרקעות העות׳מאני, 1858. להיסטוריה של יישום הוראות אלה בארץ ישראל ולגלגולן בפסיקה הישראלית ראו </w:t>
-      </w:r>
-      <w:r>
-        <w:rPr>
-          <w:rFonts w:ascii="Times New Roman" w:cs="Times New Roman" w:eastAsia="Times New Roman" w:hAnsi="Times New Roman"/>
-          <w:sz w:val="20"/>
-          <w:szCs w:val="20"/>
-        </w:rPr>
-        <w:t xml:space="preserve">Ahmad Amara, “Dispossession by Law: How the Israeli Judicial System Utilizes Ottoman Land Law to Expel and Dispossess the Bedouins,” J. Levantine Stud. (2015)</w:t>
-      </w:r>
-      <w:r>
-        <w:rPr>
-          <w:rFonts w:ascii="David" w:cs="David" w:eastAsia="David" w:hAnsi="David"/>
-          <w:sz w:val="20"/>
-          <w:szCs w:val="20"/>
-          <w:rtl/>
-        </w:rPr>
-        <w:t xml:space="preserve">; זנדברג, </w:t>
-      </w:r>
-      <w:r>
-        <w:rPr>
-          <w:rFonts w:ascii="David" w:cs="David" w:eastAsia="David" w:hAnsi="David"/>
-          <w:sz w:val="20"/>
-          <w:szCs w:val="20"/>
-          <w:rtl/>
-        </w:rPr>
-        <w:t xml:space="preserve">לעיל ה"ש 10</w:t>
-      </w:r>
-      <w:r>
-        <w:rPr>
-          <w:rFonts w:ascii="David" w:cs="David" w:eastAsia="David" w:hAnsi="David"/>
-          <w:sz w:val="20"/>
-          <w:szCs w:val="20"/>
-          <w:rtl/>
-        </w:rPr>
-        <w:t xml:space="preserve">.</w:t>
+        <w:t xml:space="preserve">ס׳ 1674 למג׳לה. ההקבלה לס׳ 2 לחוק ההתיישנות, התשי"ח-1958, שאף הוא קובע התיישנות דיונית שאינה מפקיעה את הזכות, גלויה לעין.</w:t>
       </w:r>
     </w:p>
   </w:footnote>
@@ -10593,7 +10819,7 @@
           <w:szCs w:val="20"/>
           <w:rtl/>
         </w:rPr>
-        <w:t xml:space="preserve">ס׳ 1521 למג׳לה. השליחות פוקעת ככלל במות השולח – כלל שהעמיד בסימן שאלה את ייפויי הכוח הוותיקים שנועדו לפעול "לאחר אריכות ימים". לניסוח מודרני של דיני הוַכַּאלָה ראו </w:t>
+        <w:t xml:space="preserve">ס׳ 20 ו-78 לחוק הקרקעות העות׳מאני, 1858. להיסטוריה של יישום הוראות אלה בארץ ישראל ולגלגולן בפסיקה הישראלית ראו </w:t>
       </w:r>
       <w:r>
         <w:rPr>
@@ -10601,7 +10827,25 @@
           <w:sz w:val="20"/>
           <w:szCs w:val="20"/>
         </w:rPr>
-        <w:t xml:space="preserve">AAOIFI, Shari’ah Standard No. 23: Agency (2015)</w:t>
+        <w:t xml:space="preserve">Ahmad Amara, “Dispossession by Law: How the Israeli Judicial System Utilizes Ottoman Land Law to Expel and Dispossess the Bedouins,” J. Levantine Stud. (2015)</w:t>
+      </w:r>
+      <w:r>
+        <w:rPr>
+          <w:rFonts w:ascii="David" w:cs="David" w:eastAsia="David" w:hAnsi="David"/>
+          <w:sz w:val="20"/>
+          <w:szCs w:val="20"/>
+          <w:rtl/>
+        </w:rPr>
+        <w:t xml:space="preserve">; זנדברג, </w:t>
+      </w:r>
+      <w:r>
+        <w:rPr>
+          <w:rFonts w:ascii="David" w:cs="David" w:eastAsia="David" w:hAnsi="David"/>
+          <w:sz w:val="20"/>
+          <w:szCs w:val="20"/>
+          <w:rtl/>
+        </w:rPr>
+        <w:t xml:space="preserve">לעיל ה"ש 10</w:t>
       </w:r>
       <w:r>
         <w:rPr>
@@ -10628,11 +10872,20 @@
       </w:r>
       <w:r>
         <w:rPr>
+          <w:rFonts w:ascii="David" w:cs="David" w:eastAsia="David" w:hAnsi="David"/>
+          <w:sz w:val="20"/>
+          <w:szCs w:val="20"/>
+          <w:rtl/>
+        </w:rPr>
+        <w:t xml:space="preserve">ס׳ 1521 למג׳לה. השליחות פוקעת ככלל במות השולח – כלל שהעמיד בסימן שאלה את ייפויי הכוח הוותיקים שנועדו לפעול "לאחר אריכות ימים". לניסוח מודרני של דיני הוַכַּאלָה ראו </w:t>
+      </w:r>
+      <w:r>
+        <w:rPr>
           <w:rFonts w:ascii="Times New Roman" w:cs="Times New Roman" w:eastAsia="Times New Roman" w:hAnsi="Times New Roman"/>
           <w:sz w:val="20"/>
           <w:szCs w:val="20"/>
         </w:rPr>
-        <w:t xml:space="preserve">N.J. Coulson, Succession in the Muslim Family (1971)</w:t>
+        <w:t xml:space="preserve">AAOIFI, Shari’ah Standard No. 23: Agency (2015)</w:t>
       </w:r>
       <w:r>
         <w:rPr>
@@ -10663,24 +10916,7 @@
           <w:sz w:val="20"/>
           <w:szCs w:val="20"/>
         </w:rPr>
-        <w:t xml:space="preserve">Annelies Moors, Women, Property and Islam: Palestinian Experiences, 1920–1990 (1995)</w:t>
-      </w:r>
-      <w:r>
-        <w:rPr>
-          <w:rFonts w:ascii="David" w:cs="David" w:eastAsia="David" w:hAnsi="David"/>
-          <w:sz w:val="20"/>
-          <w:szCs w:val="20"/>
-          <w:rtl/>
-        </w:rPr>
-        <w:t xml:space="preserve">; ולפרקטיקה בבתי הדין השרעיים בישראל ראו </w:t>
-      </w:r>
-      <w:r>
-        <w:rPr>
-          <w:rFonts w:ascii="Times New Roman" w:cs="Times New Roman" w:eastAsia="Times New Roman" w:hAnsi="Times New Roman"/>
-          <w:sz w:val="20"/>
-          <w:szCs w:val="20"/>
-        </w:rPr>
-        <w:t xml:space="preserve">Aharon Layish, Women and Islamic Law in a Non-Muslim State (1975)</w:t>
+        <w:t xml:space="preserve">N.J. Coulson, Succession in the Muslim Family (1971)</w:t>
       </w:r>
       <w:r>
         <w:rPr>
@@ -10711,25 +10947,24 @@
           <w:sz w:val="20"/>
           <w:szCs w:val="20"/>
         </w:rPr>
-        <w:t xml:space="preserve">Ruth Kark, “Consequences of the Ottoman Land Law: Agrarian and Privatization Processes in Palestine, 1858–1918,” in Societies, Social Inequalities and Marginalization 101 (R. Chand et al. eds., 2017)</w:t>
-      </w:r>
-      <w:r>
-        <w:rPr>
-          <w:rFonts w:ascii="David" w:cs="David" w:eastAsia="David" w:hAnsi="David"/>
-          <w:sz w:val="20"/>
-          <w:szCs w:val="20"/>
-          <w:rtl/>
-        </w:rPr>
-        <w:t xml:space="preserve">; נדן, </w:t>
-      </w:r>
-      <w:r>
-        <w:rPr>
-          <w:rFonts w:ascii="David" w:cs="David" w:eastAsia="David" w:hAnsi="David"/>
-          <w:sz w:val="20"/>
-          <w:szCs w:val="20"/>
-          <w:rtl/>
-        </w:rPr>
-        <w:t xml:space="preserve">לעיל ה"ש 14</w:t>
+        <w:t xml:space="preserve">Annelies Moors, Women, Property and Islam: Palestinian Experiences, 1920–1990 (1995)</w:t>
+      </w:r>
+      <w:r>
+        <w:rPr>
+          <w:rFonts w:ascii="David" w:cs="David" w:eastAsia="David" w:hAnsi="David"/>
+          <w:sz w:val="20"/>
+          <w:szCs w:val="20"/>
+          <w:rtl/>
+        </w:rPr>
+        <w:t xml:space="preserve">; ולפרקטיקה בבתי הדין השרעיים בישראל ראו </w:t>
+      </w:r>
+      <w:r>
+        <w:rPr>
+          <w:rFonts w:ascii="Times New Roman" w:cs="Times New Roman" w:eastAsia="Times New Roman" w:hAnsi="Times New Roman"/>
+          <w:sz w:val="20"/>
+          <w:szCs w:val="20"/>
+        </w:rPr>
+        <w:t xml:space="preserve">Aharon Layish, Women and Islamic Law in a Non-Muslim State (1975)</w:t>
       </w:r>
       <w:r>
         <w:rPr>
@@ -10756,20 +10991,29 @@
       </w:r>
       <w:r>
         <w:rPr>
-          <w:rFonts w:ascii="David" w:cs="David" w:eastAsia="David" w:hAnsi="David"/>
-          <w:sz w:val="20"/>
-          <w:szCs w:val="20"/>
-          <w:rtl/>
-        </w:rPr>
-        <w:t xml:space="preserve">ראו לעיל פרק ה ופרק ו.2.4; והשוו </w:t>
-      </w:r>
-      <w:r>
-        <w:rPr>
           <w:rFonts w:ascii="Times New Roman" w:cs="Times New Roman" w:eastAsia="Times New Roman" w:hAnsi="Times New Roman"/>
           <w:sz w:val="20"/>
           <w:szCs w:val="20"/>
         </w:rPr>
-        <w:t xml:space="preserve">Kareem Ibrahim &amp; Deena Khalil, “Land Titling: A Tool, not a Panacea — Insights from Egypt,” Metropolitics (Dec. 20, 2016)</w:t>
+        <w:t xml:space="preserve">Ruth Kark, “Consequences of the Ottoman Land Law: Agrarian and Privatization Processes in Palestine, 1858–1918,” in Societies, Social Inequalities and Marginalization 101 (R. Chand et al. eds., 2017)</w:t>
+      </w:r>
+      <w:r>
+        <w:rPr>
+          <w:rFonts w:ascii="David" w:cs="David" w:eastAsia="David" w:hAnsi="David"/>
+          <w:sz w:val="20"/>
+          <w:szCs w:val="20"/>
+          <w:rtl/>
+        </w:rPr>
+        <w:t xml:space="preserve">; נדן, </w:t>
+      </w:r>
+      <w:r>
+        <w:rPr>
+          <w:rFonts w:ascii="David" w:cs="David" w:eastAsia="David" w:hAnsi="David"/>
+          <w:sz w:val="20"/>
+          <w:szCs w:val="20"/>
+          <w:rtl/>
+        </w:rPr>
+        <w:t xml:space="preserve">לעיל ה"ש 14</w:t>
       </w:r>
       <w:r>
         <w:rPr>
@@ -10801,6 +11045,46 @@
           <w:szCs w:val="20"/>
           <w:rtl/>
         </w:rPr>
+        <w:t xml:space="preserve">ראו לעיל פרק ה ופרק ו.2.4; והשוו </w:t>
+      </w:r>
+      <w:r>
+        <w:rPr>
+          <w:rFonts w:ascii="Times New Roman" w:cs="Times New Roman" w:eastAsia="Times New Roman" w:hAnsi="Times New Roman"/>
+          <w:sz w:val="20"/>
+          <w:szCs w:val="20"/>
+        </w:rPr>
+        <w:t xml:space="preserve">Kareem Ibrahim &amp; Deena Khalil, “Land Titling: A Tool, not a Panacea — Insights from Egypt,” Metropolitics (Dec. 20, 2016)</w:t>
+      </w:r>
+      <w:r>
+        <w:rPr>
+          <w:rFonts w:ascii="David" w:cs="David" w:eastAsia="David" w:hAnsi="David"/>
+          <w:sz w:val="20"/>
+          <w:szCs w:val="20"/>
+          <w:rtl/>
+        </w:rPr>
+        <w:t xml:space="preserve">.</w:t>
+      </w:r>
+    </w:p>
+  </w:footnote>
+  <w:footnote w:id="100">
+    <w:p>
+      <w:pPr>
+        <w:bidi/>
+        <w:spacing w:after="60"/>
+      </w:pPr>
+      <w:r>
+        <w:rPr>
+          <w:rStyle w:val="FootnoteReference"/>
+        </w:rPr>
+        <w:footnoteRef/>
+      </w:r>
+      <w:r>
+        <w:rPr>
+          <w:rFonts w:ascii="David" w:cs="David" w:eastAsia="David" w:hAnsi="David"/>
+          <w:sz w:val="20"/>
+          <w:szCs w:val="20"/>
+          <w:rtl/>
+        </w:rPr>
         <w:t xml:space="preserve">עניין </w:t>
       </w:r>
       <w:r>
@@ -10830,48 +11114,7 @@
           <w:szCs w:val="20"/>
           <w:rtl/>
         </w:rPr>
-        <w:t xml:space="preserve">לעיל ה"ש 28</w:t>
-      </w:r>
-      <w:r>
-        <w:rPr>
-          <w:rFonts w:ascii="David" w:cs="David" w:eastAsia="David" w:hAnsi="David"/>
-          <w:sz w:val="20"/>
-          <w:szCs w:val="20"/>
-          <w:rtl/>
-        </w:rPr>
-        <w:t xml:space="preserve">.</w:t>
-      </w:r>
-    </w:p>
-  </w:footnote>
-  <w:footnote w:id="100">
-    <w:p>
-      <w:pPr>
-        <w:bidi/>
-        <w:spacing w:after="60"/>
-      </w:pPr>
-      <w:r>
-        <w:rPr>
-          <w:rStyle w:val="FootnoteReference"/>
-        </w:rPr>
-        <w:footnoteRef/>
-      </w:r>
-      <w:r>
-        <w:rPr>
-          <w:rFonts w:ascii="David" w:cs="David" w:eastAsia="David" w:hAnsi="David"/>
-          <w:sz w:val="20"/>
-          <w:szCs w:val="20"/>
-          <w:rtl/>
-        </w:rPr>
-        <w:t xml:space="preserve">תמ"ש 18541-01-22, </w:t>
-      </w:r>
-      <w:r>
-        <w:rPr>
-          <w:rFonts w:ascii="David" w:cs="David" w:eastAsia="David" w:hAnsi="David"/>
-          <w:sz w:val="20"/>
-          <w:szCs w:val="20"/>
-          <w:rtl/>
-        </w:rPr>
-        <w:t xml:space="preserve">לעיל ה"ש 34</w:t>
+        <w:t xml:space="preserve">לעיל ה"ש 29</w:t>
       </w:r>
       <w:r>
         <w:rPr>
@@ -10885,6 +11128,47 @@
     </w:p>
   </w:footnote>
   <w:footnote w:id="101">
+    <w:p>
+      <w:pPr>
+        <w:bidi/>
+        <w:spacing w:after="60"/>
+      </w:pPr>
+      <w:r>
+        <w:rPr>
+          <w:rStyle w:val="FootnoteReference"/>
+        </w:rPr>
+        <w:footnoteRef/>
+      </w:r>
+      <w:r>
+        <w:rPr>
+          <w:rFonts w:ascii="David" w:cs="David" w:eastAsia="David" w:hAnsi="David"/>
+          <w:sz w:val="20"/>
+          <w:szCs w:val="20"/>
+          <w:rtl/>
+        </w:rPr>
+        <w:t xml:space="preserve">תמ"ש 18541-01-22, </w:t>
+      </w:r>
+      <w:r>
+        <w:rPr>
+          <w:rFonts w:ascii="David" w:cs="David" w:eastAsia="David" w:hAnsi="David"/>
+          <w:sz w:val="20"/>
+          <w:szCs w:val="20"/>
+          <w:rtl/>
+        </w:rPr>
+        <w:t xml:space="preserve">לעיל ה"ש 35</w:t>
+      </w:r>
+      <w:r>
+        <w:rPr>
+          <w:rFonts w:ascii="David" w:cs="David" w:eastAsia="David" w:hAnsi="David"/>
+          <w:sz w:val="20"/>
+          <w:szCs w:val="20"/>
+          <w:rtl/>
+        </w:rPr>
+        <w:t xml:space="preserve">.</w:t>
+      </w:r>
+    </w:p>
+  </w:footnote>
+  <w:footnote w:id="102">
     <w:p>
       <w:pPr>
         <w:bidi/>
@@ -10931,7 +11215,7 @@
           <w:szCs w:val="20"/>
           <w:rtl/>
         </w:rPr>
-        <w:t xml:space="preserve">לעיל ה"ש 68</w:t>
+        <w:t xml:space="preserve">לעיל ה"ש 69</w:t>
       </w:r>
       <w:r>
         <w:rPr>
@@ -10941,33 +11225,33 @@
           <w:rtl/>
         </w:rPr>
         <w:t xml:space="preserve">.</w:t>
-      </w:r>
-    </w:p>
-  </w:footnote>
-  <w:footnote w:id="102">
-    <w:p>
-      <w:pPr>
-        <w:bidi/>
-        <w:spacing w:after="60"/>
-      </w:pPr>
-      <w:r>
-        <w:rPr>
-          <w:rStyle w:val="FootnoteReference"/>
-        </w:rPr>
-        <w:footnoteRef/>
-      </w:r>
-      <w:r>
-        <w:rPr>
-          <w:rFonts w:ascii="David" w:cs="David" w:eastAsia="David" w:hAnsi="David"/>
-          <w:sz w:val="20"/>
-          <w:szCs w:val="20"/>
-          <w:rtl/>
-        </w:rPr>
-        <w:t xml:space="preserve">לרפורמה המצרית ראו לעיל פרק ו.2.3.</w:t>
       </w:r>
     </w:p>
   </w:footnote>
   <w:footnote w:id="103">
+    <w:p>
+      <w:pPr>
+        <w:bidi/>
+        <w:spacing w:after="60"/>
+      </w:pPr>
+      <w:r>
+        <w:rPr>
+          <w:rStyle w:val="FootnoteReference"/>
+        </w:rPr>
+        <w:footnoteRef/>
+      </w:r>
+      <w:r>
+        <w:rPr>
+          <w:rFonts w:ascii="David" w:cs="David" w:eastAsia="David" w:hAnsi="David"/>
+          <w:sz w:val="20"/>
+          <w:szCs w:val="20"/>
+          <w:rtl/>
+        </w:rPr>
+        <w:t xml:space="preserve">לרפורמה המצרית ראו לעיל פרק ו.2.3.</w:t>
+      </w:r>
+    </w:p>
+  </w:footnote>
+  <w:footnote w:id="104">
     <w:p>
       <w:pPr>
         <w:bidi/>

</xml_diff>

<commit_message>
Add Gorman & Aharonovich ch. 1 material: taxation of equitable ownership and RMI authorizations (Goldberg case)
Expanded the tax chapter with the point that even a bar-reshut authorization
on Israel Lands, renewed periodically, is a 'right in land' for tax purposes
(Goldberg v. Hadera Land Tax Director), with pinpoints to pp. 151, 153-154,
and the asymmetry observation: unregistered holders bear an owner's tax
burden without an owner's property protections.

Co-Authored-By: Claude Fable 5 <noreply@anthropic.com>
Claude-Session: https://claude.ai/code/session_01PTzmkyUzTNm9DT35momqLP
</commit_message>
<xml_diff>
--- a/seminar/סמינריון-מקרקעין-לא-רשומים.docx
+++ b/seminar/סמינריון-מקרקעין-לא-רשומים.docx
@@ -2522,7 +2522,7 @@
           <w:szCs w:val="24"/>
           <w:rtl/>
         </w:rPr>
-        <w:t xml:space="preserve">שיטת המס אף רחבה מדיני הקניין: "מכירה" לצורך חוק מיסוי מקרקעין נבחנת על פי תוכנה הכלכלי, והיא לוכדת גם הענקת זכויות אובליגטוריות וזכויות שביושר שלא נרשמו מעולם. די בהתחייבות מחייבת כדי להצמיח "יום מכירה" ולהעמיד את החבות על מכונה, אף שהקניין טרם עבר.</w:t>
+        <w:t xml:space="preserve">שיטת המס אף רחבה מדיני הקניין: "מכירה" לצורך חוק מיסוי מקרקעין נבחנת על פי תוכנה הכלכלי, והיא לוכדת גם הענקת זכויות אובליגטוריות וזכויות שביושר שלא נרשמו מעולם – מכירתה של "זכות חוזית שתאפשר בעתיד להירשם כבעלים" חייבת במס ככל מכירת בעלות. די בהתחייבות מחייבת כדי להצמיח "יום מכירה" ולהעמיד את החבות על מכונה, אף שהקניין טרם עבר.</w:t>
       </w:r>
       <w:r>
         <w:rPr>
@@ -2537,7 +2537,22 @@
           <w:szCs w:val="24"/>
           <w:rtl/>
         </w:rPr>
-        <w:t xml:space="preserve"> התוצאה המבנית מרתקת: דווקא מפני שהמס "רואה" את העסקה הבלתי רשומה, נוצר פער בין שני מרשמים – מרשם הזכויות, שבו העסקה אינה קיימת, ומרשם המס, שבו היא הייתה אמורה להיות מדווחת זה מכבר.</w:t>
+        <w:t xml:space="preserve"> רוחב יריעה זה מרחיק לכת עד כדי לכידת ההחזקות הרופפות ביותר: אף "הרשאה" במקרקעי ישראל – מעמד של בר־רשות גרידא, המתחדש מעת לעת – הוכרה כ"זכות במקרקעין" לצורכי מס, מקום שההרשאה מתחדשת בפועל באופן אוטומטי, ואפילו לא קיים במועד המכירה הסכם פורמלי תקף בין המחזיק לרשות.</w:t>
+      </w:r>
+      <w:r>
+        <w:rPr>
+          <w:rStyle w:val="FootnoteReference"/>
+        </w:rPr>
+        <w:footnoteReference w:id="56"/>
+      </w:r>
+      <w:r>
+        <w:rPr>
+          <w:rFonts w:ascii="David" w:cs="David" w:eastAsia="David" w:hAnsi="David"/>
+          <w:sz w:val="24"/>
+          <w:szCs w:val="24"/>
+          <w:rtl/>
+        </w:rPr>
+        <w:t xml:space="preserve"> התוצאה המבנית מרתקת: דווקא מפני שהמס "רואה" את העסקה ואת ההחזקה הבלתי רשומות, נוצר פער בין שני מרשמים – מרשם הזכויות, שבו העסקה אינה קיימת, ומרשם המס, שבו היא הייתה אמורה להיות מדווחת זה מכבר. פער זה אינו סימטרי: המחזיק הבלתי רשום נושא בחבויות המס של בעלים – בלא ליהנות מהגנותיו הקנייניות של בעלים.</w:t>
       </w:r>
     </w:p>
     <w:p>
@@ -2579,7 +2594,7 @@
         <w:rPr>
           <w:rStyle w:val="FootnoteReference"/>
         </w:rPr>
-        <w:footnoteReference w:id="56"/>
+        <w:footnoteReference w:id="57"/>
       </w:r>
       <w:r>
         <w:rPr>
@@ -2611,7 +2626,7 @@
         <w:rPr>
           <w:rStyle w:val="FootnoteReference"/>
         </w:rPr>
-        <w:footnoteReference w:id="57"/>
+        <w:footnoteReference w:id="58"/>
       </w:r>
       <w:r>
         <w:rPr>
@@ -2662,7 +2677,7 @@
         <w:rPr>
           <w:rStyle w:val="FootnoteReference"/>
         </w:rPr>
-        <w:footnoteReference w:id="58"/>
+        <w:footnoteReference w:id="59"/>
       </w:r>
     </w:p>
     <w:p>
@@ -2702,7 +2717,7 @@
         <w:rPr>
           <w:rStyle w:val="FootnoteReference"/>
         </w:rPr>
-        <w:footnoteReference w:id="59"/>
+        <w:footnoteReference w:id="60"/>
       </w:r>
       <w:r>
         <w:rPr>
@@ -2734,7 +2749,7 @@
         <w:rPr>
           <w:rStyle w:val="FootnoteReference"/>
         </w:rPr>
-        <w:footnoteReference w:id="60"/>
+        <w:footnoteReference w:id="61"/>
       </w:r>
       <w:r>
         <w:rPr>
@@ -2859,7 +2874,7 @@
         <w:rPr>
           <w:rStyle w:val="FootnoteReference"/>
         </w:rPr>
-        <w:footnoteReference w:id="61"/>
+        <w:footnoteReference w:id="62"/>
       </w:r>
       <w:r>
         <w:rPr>
@@ -2893,7 +2908,7 @@
         <w:rPr>
           <w:rStyle w:val="FootnoteReference"/>
         </w:rPr>
-        <w:footnoteReference w:id="62"/>
+        <w:footnoteReference w:id="63"/>
       </w:r>
       <w:r>
         <w:rPr>
@@ -2928,7 +2943,7 @@
         <w:rPr>
           <w:rStyle w:val="FootnoteReference"/>
         </w:rPr>
-        <w:footnoteReference w:id="63"/>
+        <w:footnoteReference w:id="64"/>
       </w:r>
     </w:p>
     <w:p>
@@ -2970,7 +2985,7 @@
         <w:rPr>
           <w:rStyle w:val="FootnoteReference"/>
         </w:rPr>
-        <w:footnoteReference w:id="64"/>
+        <w:footnoteReference w:id="65"/>
       </w:r>
       <w:r>
         <w:rPr>
@@ -3021,7 +3036,7 @@
         <w:rPr>
           <w:rStyle w:val="FootnoteReference"/>
         </w:rPr>
-        <w:footnoteReference w:id="65"/>
+        <w:footnoteReference w:id="66"/>
       </w:r>
       <w:r>
         <w:rPr>
@@ -3036,7 +3051,7 @@
         <w:rPr>
           <w:rStyle w:val="FootnoteReference"/>
         </w:rPr>
-        <w:footnoteReference w:id="66"/>
+        <w:footnoteReference w:id="67"/>
       </w:r>
     </w:p>
     <w:p>
@@ -3095,7 +3110,7 @@
         <w:rPr>
           <w:rStyle w:val="FootnoteReference"/>
         </w:rPr>
-        <w:footnoteReference w:id="67"/>
+        <w:footnoteReference w:id="68"/>
       </w:r>
       <w:r>
         <w:rPr>
@@ -3146,7 +3161,7 @@
         <w:rPr>
           <w:rStyle w:val="FootnoteReference"/>
         </w:rPr>
-        <w:footnoteReference w:id="68"/>
+        <w:footnoteReference w:id="69"/>
       </w:r>
       <w:r>
         <w:rPr>
@@ -3180,7 +3195,7 @@
         <w:rPr>
           <w:rStyle w:val="FootnoteReference"/>
         </w:rPr>
-        <w:footnoteReference w:id="69"/>
+        <w:footnoteReference w:id="70"/>
       </w:r>
       <w:r>
         <w:rPr>
@@ -3268,7 +3283,7 @@
         <w:rPr>
           <w:rStyle w:val="FootnoteReference"/>
         </w:rPr>
-        <w:footnoteReference w:id="70"/>
+        <w:footnoteReference w:id="71"/>
       </w:r>
       <w:r>
         <w:rPr>
@@ -3302,7 +3317,7 @@
         <w:rPr>
           <w:rStyle w:val="FootnoteReference"/>
         </w:rPr>
-        <w:footnoteReference w:id="71"/>
+        <w:footnoteReference w:id="72"/>
       </w:r>
       <w:r>
         <w:rPr>
@@ -3336,7 +3351,7 @@
         <w:rPr>
           <w:rStyle w:val="FootnoteReference"/>
         </w:rPr>
-        <w:footnoteReference w:id="72"/>
+        <w:footnoteReference w:id="73"/>
       </w:r>
       <w:r>
         <w:rPr>
@@ -3351,7 +3366,7 @@
         <w:rPr>
           <w:rStyle w:val="FootnoteReference"/>
         </w:rPr>
-        <w:footnoteReference w:id="73"/>
+        <w:footnoteReference w:id="74"/>
       </w:r>
       <w:r>
         <w:rPr>
@@ -3366,7 +3381,7 @@
         <w:rPr>
           <w:rStyle w:val="FootnoteReference"/>
         </w:rPr>
-        <w:footnoteReference w:id="74"/>
+        <w:footnoteReference w:id="75"/>
       </w:r>
     </w:p>
     <w:p>
@@ -3427,7 +3442,7 @@
         <w:rPr>
           <w:rStyle w:val="FootnoteReference"/>
         </w:rPr>
-        <w:footnoteReference w:id="75"/>
+        <w:footnoteReference w:id="76"/>
       </w:r>
       <w:r>
         <w:rPr>
@@ -3442,7 +3457,7 @@
         <w:rPr>
           <w:rStyle w:val="FootnoteReference"/>
         </w:rPr>
-        <w:footnoteReference w:id="76"/>
+        <w:footnoteReference w:id="77"/>
       </w:r>
       <w:r>
         <w:rPr>
@@ -3457,7 +3472,7 @@
         <w:rPr>
           <w:rStyle w:val="FootnoteReference"/>
         </w:rPr>
-        <w:footnoteReference w:id="77"/>
+        <w:footnoteReference w:id="78"/>
       </w:r>
     </w:p>
     <w:p>
@@ -3499,7 +3514,7 @@
         <w:rPr>
           <w:rStyle w:val="FootnoteReference"/>
         </w:rPr>
-        <w:footnoteReference w:id="78"/>
+        <w:footnoteReference w:id="79"/>
       </w:r>
       <w:r>
         <w:rPr>
@@ -3514,7 +3529,7 @@
         <w:rPr>
           <w:rStyle w:val="FootnoteReference"/>
         </w:rPr>
-        <w:footnoteReference w:id="79"/>
+        <w:footnoteReference w:id="80"/>
       </w:r>
     </w:p>
     <w:p>
@@ -3556,7 +3571,7 @@
         <w:rPr>
           <w:rStyle w:val="FootnoteReference"/>
         </w:rPr>
-        <w:footnoteReference w:id="80"/>
+        <w:footnoteReference w:id="81"/>
       </w:r>
       <w:r>
         <w:rPr>
@@ -3571,7 +3586,7 @@
         <w:rPr>
           <w:rStyle w:val="FootnoteReference"/>
         </w:rPr>
-        <w:footnoteReference w:id="81"/>
+        <w:footnoteReference w:id="82"/>
       </w:r>
       <w:r>
         <w:rPr>
@@ -3586,7 +3601,7 @@
         <w:rPr>
           <w:rStyle w:val="FootnoteReference"/>
         </w:rPr>
-        <w:footnoteReference w:id="82"/>
+        <w:footnoteReference w:id="83"/>
       </w:r>
       <w:r>
         <w:rPr>
@@ -3601,7 +3616,7 @@
         <w:rPr>
           <w:rStyle w:val="FootnoteReference"/>
         </w:rPr>
-        <w:footnoteReference w:id="83"/>
+        <w:footnoteReference w:id="84"/>
       </w:r>
     </w:p>
     <w:p>
@@ -3643,7 +3658,7 @@
         <w:rPr>
           <w:rStyle w:val="FootnoteReference"/>
         </w:rPr>
-        <w:footnoteReference w:id="84"/>
+        <w:footnoteReference w:id="85"/>
       </w:r>
       <w:r>
         <w:rPr>
@@ -3658,7 +3673,7 @@
         <w:rPr>
           <w:rStyle w:val="FootnoteReference"/>
         </w:rPr>
-        <w:footnoteReference w:id="85"/>
+        <w:footnoteReference w:id="86"/>
       </w:r>
       <w:r>
         <w:rPr>
@@ -3673,7 +3688,7 @@
         <w:rPr>
           <w:rStyle w:val="FootnoteReference"/>
         </w:rPr>
-        <w:footnoteReference w:id="86"/>
+        <w:footnoteReference w:id="87"/>
       </w:r>
       <w:r>
         <w:rPr>
@@ -3743,7 +3758,7 @@
         <w:rPr>
           <w:rStyle w:val="FootnoteReference"/>
         </w:rPr>
-        <w:footnoteReference w:id="87"/>
+        <w:footnoteReference w:id="88"/>
       </w:r>
       <w:r>
         <w:rPr>
@@ -3794,7 +3809,7 @@
         <w:rPr>
           <w:rStyle w:val="FootnoteReference"/>
         </w:rPr>
-        <w:footnoteReference w:id="88"/>
+        <w:footnoteReference w:id="89"/>
       </w:r>
       <w:r>
         <w:rPr>
@@ -3809,7 +3824,7 @@
         <w:rPr>
           <w:rStyle w:val="FootnoteReference"/>
         </w:rPr>
-        <w:footnoteReference w:id="89"/>
+        <w:footnoteReference w:id="90"/>
       </w:r>
       <w:r>
         <w:rPr>
@@ -3824,7 +3839,7 @@
         <w:rPr>
           <w:rStyle w:val="FootnoteReference"/>
         </w:rPr>
-        <w:footnoteReference w:id="90"/>
+        <w:footnoteReference w:id="91"/>
       </w:r>
     </w:p>
     <w:p>
@@ -3847,7 +3862,7 @@
         <w:rPr>
           <w:rStyle w:val="FootnoteReference"/>
         </w:rPr>
-        <w:footnoteReference w:id="91"/>
+        <w:footnoteReference w:id="92"/>
       </w:r>
     </w:p>
     <w:p>
@@ -3889,7 +3904,7 @@
         <w:rPr>
           <w:rStyle w:val="FootnoteReference"/>
         </w:rPr>
-        <w:footnoteReference w:id="92"/>
+        <w:footnoteReference w:id="93"/>
       </w:r>
       <w:r>
         <w:rPr>
@@ -3904,7 +3919,7 @@
         <w:rPr>
           <w:rStyle w:val="FootnoteReference"/>
         </w:rPr>
-        <w:footnoteReference w:id="93"/>
+        <w:footnoteReference w:id="94"/>
       </w:r>
       <w:r>
         <w:rPr>
@@ -3919,7 +3934,7 @@
         <w:rPr>
           <w:rStyle w:val="FootnoteReference"/>
         </w:rPr>
-        <w:footnoteReference w:id="94"/>
+        <w:footnoteReference w:id="95"/>
       </w:r>
       <w:r>
         <w:rPr>
@@ -3970,7 +3985,7 @@
         <w:rPr>
           <w:rStyle w:val="FootnoteReference"/>
         </w:rPr>
-        <w:footnoteReference w:id="95"/>
+        <w:footnoteReference w:id="96"/>
       </w:r>
       <w:r>
         <w:rPr>
@@ -3985,7 +4000,7 @@
         <w:rPr>
           <w:rStyle w:val="FootnoteReference"/>
         </w:rPr>
-        <w:footnoteReference w:id="96"/>
+        <w:footnoteReference w:id="97"/>
       </w:r>
       <w:r>
         <w:rPr>
@@ -4000,7 +4015,7 @@
         <w:rPr>
           <w:rStyle w:val="FootnoteReference"/>
         </w:rPr>
-        <w:footnoteReference w:id="97"/>
+        <w:footnoteReference w:id="98"/>
       </w:r>
       <w:r>
         <w:rPr>
@@ -4015,7 +4030,7 @@
         <w:rPr>
           <w:rStyle w:val="FootnoteReference"/>
         </w:rPr>
-        <w:footnoteReference w:id="98"/>
+        <w:footnoteReference w:id="99"/>
       </w:r>
       <w:r>
         <w:rPr>
@@ -4161,7 +4176,7 @@
         <w:rPr>
           <w:rStyle w:val="FootnoteReference"/>
         </w:rPr>
-        <w:footnoteReference w:id="99"/>
+        <w:footnoteReference w:id="100"/>
       </w:r>
     </w:p>
     <w:p>
@@ -4286,7 +4301,7 @@
         <w:rPr>
           <w:rStyle w:val="FootnoteReference"/>
         </w:rPr>
-        <w:footnoteReference w:id="100"/>
+        <w:footnoteReference w:id="101"/>
       </w:r>
       <w:r>
         <w:rPr>
@@ -4301,7 +4316,7 @@
         <w:rPr>
           <w:rStyle w:val="FootnoteReference"/>
         </w:rPr>
-        <w:footnoteReference w:id="101"/>
+        <w:footnoteReference w:id="102"/>
       </w:r>
       <w:r>
         <w:rPr>
@@ -4333,7 +4348,7 @@
         <w:rPr>
           <w:rStyle w:val="FootnoteReference"/>
         </w:rPr>
-        <w:footnoteReference w:id="102"/>
+        <w:footnoteReference w:id="103"/>
       </w:r>
       <w:r>
         <w:rPr>
@@ -4395,7 +4410,7 @@
         <w:rPr>
           <w:rStyle w:val="FootnoteReference"/>
         </w:rPr>
-        <w:footnoteReference w:id="103"/>
+        <w:footnoteReference w:id="104"/>
       </w:r>
     </w:p>
     <w:p>
@@ -4429,7 +4444,7 @@
         <w:rPr>
           <w:rStyle w:val="FootnoteReference"/>
         </w:rPr>
-        <w:footnoteReference w:id="104"/>
+        <w:footnoteReference w:id="105"/>
       </w:r>
     </w:p>
     <w:p>
@@ -5321,6 +5336,43 @@
           <w:rtl/>
         </w:rPr>
         <w:t xml:space="preserve"> (נבו 30.4.2015).</w:t>
+      </w:r>
+    </w:p>
+    <w:p>
+      <w:pPr>
+        <w:bidi/>
+        <w:spacing w:after="120" w:line="300"/>
+        <w:ind w:start="420" w:hanging="420"/>
+        <w:jc w:val="both"/>
+      </w:pPr>
+      <w:r>
+        <w:rPr>
+          <w:rFonts w:ascii="David" w:cs="David" w:eastAsia="David" w:hAnsi="David"/>
+          <w:sz w:val="24"/>
+          <w:szCs w:val="24"/>
+          <w:rtl/>
+        </w:rPr>
+        <w:t xml:space="preserve">ו"ע (מחוזי חי׳) 4631-12-13 </w:t>
+      </w:r>
+      <w:r>
+        <w:rPr>
+          <w:rFonts w:ascii="David" w:cs="David" w:eastAsia="David" w:hAnsi="David"/>
+          <w:i/>
+          <w:iCs/>
+          <w:sz w:val="24"/>
+          <w:szCs w:val="24"/>
+          <w:rtl/>
+        </w:rPr>
+        <w:t xml:space="preserve">גולדברג נ׳ מנהל מיסוי מקרקעין – חדרה</w:t>
+      </w:r>
+      <w:r>
+        <w:rPr>
+          <w:rFonts w:ascii="David" w:cs="David" w:eastAsia="David" w:hAnsi="David"/>
+          <w:sz w:val="24"/>
+          <w:szCs w:val="24"/>
+          <w:rtl/>
+        </w:rPr>
+        <w:t xml:space="preserve">, מיסים כט(3) ה-320 (2015).</w:t>
       </w:r>
     </w:p>
     <w:p>
@@ -9377,7 +9429,7 @@
           <w:szCs w:val="20"/>
           <w:rtl/>
         </w:rPr>
-        <w:t xml:space="preserve">להגדרות "זכות במקרקעין" ו"מכירה" ראו ס׳ 1 לחוק מיסוי מקרקעין; ולעקרון המהות הכלכלית ראו גורמן ואהרונוביץ׳, </w:t>
+        <w:t xml:space="preserve">להגדרות "זכות במקרקעין" ו"מכירה" ראו ס׳ 1 לחוק מיסוי מקרקעין; ולמיסוי מכירת בעלות שביושר ראו גורמן ואהרונוביץ׳, </w:t>
       </w:r>
       <w:r>
         <w:rPr>
@@ -9395,7 +9447,7 @@
           <w:szCs w:val="20"/>
           <w:rtl/>
         </w:rPr>
-        <w:t xml:space="preserve">, פרק ראשון.</w:t>
+        <w:t xml:space="preserve">, בעמ׳ 151.</w:t>
       </w:r>
     </w:p>
   </w:footnote>
@@ -9418,7 +9470,27 @@
           <w:szCs w:val="20"/>
           <w:rtl/>
         </w:rPr>
-        <w:t xml:space="preserve">לקנסות בגין אי-הגשת הצהרה ולהפרשי הצמדה וריבית ראו פרק אחד-עשר לחוק מיסוי מקרקעין; גורמן ואהרונוביץ׳, </w:t>
+        <w:t xml:space="preserve">ו"ע (מחוזי חי׳) 4631-12-13 </w:t>
+      </w:r>
+      <w:r>
+        <w:rPr>
+          <w:rFonts w:ascii="David" w:cs="David" w:eastAsia="David" w:hAnsi="David"/>
+          <w:i/>
+          <w:iCs/>
+          <w:sz w:val="20"/>
+          <w:szCs w:val="20"/>
+          <w:rtl/>
+        </w:rPr>
+        <w:t xml:space="preserve">גולדברג נ׳ מנהל מיסוי מקרקעין – חדרה</w:t>
+      </w:r>
+      <w:r>
+        <w:rPr>
+          <w:rFonts w:ascii="David" w:cs="David" w:eastAsia="David" w:hAnsi="David"/>
+          <w:sz w:val="20"/>
+          <w:szCs w:val="20"/>
+          <w:rtl/>
+        </w:rPr>
+        <w:t xml:space="preserve">, מיסים כט(3) ה-320 (2015); גורמן ואהרונוביץ׳, </w:t>
       </w:r>
       <w:r>
         <w:rPr>
@@ -9436,7 +9508,7 @@
           <w:szCs w:val="20"/>
           <w:rtl/>
         </w:rPr>
-        <w:t xml:space="preserve">.</w:t>
+        <w:t xml:space="preserve">, בעמ׳ 153–154.</w:t>
       </w:r>
     </w:p>
   </w:footnote>
@@ -9459,7 +9531,7 @@
           <w:szCs w:val="20"/>
           <w:rtl/>
         </w:rPr>
-        <w:t xml:space="preserve">גורמן ואהרונוביץ׳, </w:t>
+        <w:t xml:space="preserve">לקנסות בגין אי-הגשת הצהרה ולהפרשי הצמדה וריבית ראו פרק אחד-עשר לחוק מיסוי מקרקעין; גורמן ואהרונוביץ׳, </w:t>
       </w:r>
       <w:r>
         <w:rPr>
@@ -9477,7 +9549,7 @@
           <w:szCs w:val="20"/>
           <w:rtl/>
         </w:rPr>
-        <w:t xml:space="preserve">, בעמ׳ 282–284, והפסיקה הנסקרת שם.</w:t>
+        <w:t xml:space="preserve">.</w:t>
       </w:r>
     </w:p>
   </w:footnote>
@@ -9500,25 +9572,25 @@
           <w:szCs w:val="20"/>
           <w:rtl/>
         </w:rPr>
-        <w:t xml:space="preserve">להיגיון הגבייתי של הסעיף ראו גורמן ואהרונוביץ׳, </w:t>
-      </w:r>
-      <w:r>
-        <w:rPr>
-          <w:rFonts w:ascii="David" w:cs="David" w:eastAsia="David" w:hAnsi="David"/>
-          <w:sz w:val="20"/>
-          <w:szCs w:val="20"/>
-          <w:rtl/>
-        </w:rPr>
-        <w:t xml:space="preserve">לעיל ה"ש 51</w:t>
-      </w:r>
-      <w:r>
-        <w:rPr>
-          <w:rFonts w:ascii="David" w:cs="David" w:eastAsia="David" w:hAnsi="David"/>
-          <w:sz w:val="20"/>
-          <w:szCs w:val="20"/>
-          <w:rtl/>
-        </w:rPr>
-        <w:t xml:space="preserve">.</w:t>
+        <w:t xml:space="preserve">גורמן ואהרונוביץ׳, </w:t>
+      </w:r>
+      <w:r>
+        <w:rPr>
+          <w:rFonts w:ascii="David" w:cs="David" w:eastAsia="David" w:hAnsi="David"/>
+          <w:sz w:val="20"/>
+          <w:szCs w:val="20"/>
+          <w:rtl/>
+        </w:rPr>
+        <w:t xml:space="preserve">לעיל ה"ש 50</w:t>
+      </w:r>
+      <w:r>
+        <w:rPr>
+          <w:rFonts w:ascii="David" w:cs="David" w:eastAsia="David" w:hAnsi="David"/>
+          <w:sz w:val="20"/>
+          <w:szCs w:val="20"/>
+          <w:rtl/>
+        </w:rPr>
+        <w:t xml:space="preserve">, בעמ׳ 282–284, והפסיקה הנסקרת שם.</w:t>
       </w:r>
     </w:p>
   </w:footnote>
@@ -9541,24 +9613,25 @@
           <w:szCs w:val="20"/>
           <w:rtl/>
         </w:rPr>
-        <w:t xml:space="preserve">למונח "הון מת" ראו </w:t>
-      </w:r>
-      <w:r>
-        <w:rPr>
-          <w:rFonts w:ascii="Times New Roman" w:cs="Times New Roman" w:eastAsia="Times New Roman" w:hAnsi="Times New Roman"/>
-          <w:sz w:val="20"/>
-          <w:szCs w:val="20"/>
-        </w:rPr>
-        <w:t xml:space="preserve">Hernando de Soto, The Mystery of Capital: Why Capitalism Triumphs in the West and Fails Everywhere Else (2000)</w:t>
-      </w:r>
-      <w:r>
-        <w:rPr>
-          <w:rFonts w:ascii="David" w:cs="David" w:eastAsia="David" w:hAnsi="David"/>
-          <w:sz w:val="20"/>
-          <w:szCs w:val="20"/>
-          <w:rtl/>
-        </w:rPr>
-        <w:t xml:space="preserve">. דה-סוטו פיתח את הניתוח על יסוד עבודת שדה במצרים, שבה נאמד שיעור הנכסים המוחזקים בלא רישום ביותר מ-90%; ראו להלן פרק ו.2.</w:t>
+        <w:t xml:space="preserve">להיגיון הגבייתי של הסעיף ראו גורמן ואהרונוביץ׳, </w:t>
+      </w:r>
+      <w:r>
+        <w:rPr>
+          <w:rFonts w:ascii="David" w:cs="David" w:eastAsia="David" w:hAnsi="David"/>
+          <w:sz w:val="20"/>
+          <w:szCs w:val="20"/>
+          <w:rtl/>
+        </w:rPr>
+        <w:t xml:space="preserve">לעיל ה"ש 51</w:t>
+      </w:r>
+      <w:r>
+        <w:rPr>
+          <w:rFonts w:ascii="David" w:cs="David" w:eastAsia="David" w:hAnsi="David"/>
+          <w:sz w:val="20"/>
+          <w:szCs w:val="20"/>
+          <w:rtl/>
+        </w:rPr>
+        <w:t xml:space="preserve">.</w:t>
       </w:r>
     </w:p>
   </w:footnote>
@@ -9581,6 +9654,46 @@
           <w:szCs w:val="20"/>
           <w:rtl/>
         </w:rPr>
+        <w:t xml:space="preserve">למונח "הון מת" ראו </w:t>
+      </w:r>
+      <w:r>
+        <w:rPr>
+          <w:rFonts w:ascii="Times New Roman" w:cs="Times New Roman" w:eastAsia="Times New Roman" w:hAnsi="Times New Roman"/>
+          <w:sz w:val="20"/>
+          <w:szCs w:val="20"/>
+        </w:rPr>
+        <w:t xml:space="preserve">Hernando de Soto, The Mystery of Capital: Why Capitalism Triumphs in the West and Fails Everywhere Else (2000)</w:t>
+      </w:r>
+      <w:r>
+        <w:rPr>
+          <w:rFonts w:ascii="David" w:cs="David" w:eastAsia="David" w:hAnsi="David"/>
+          <w:sz w:val="20"/>
+          <w:szCs w:val="20"/>
+          <w:rtl/>
+        </w:rPr>
+        <w:t xml:space="preserve">. דה-סוטו פיתח את הניתוח על יסוד עבודת שדה במצרים, שבה נאמד שיעור הנכסים המוחזקים בלא רישום ביותר מ-90%; ראו להלן פרק ו.2.</w:t>
+      </w:r>
+    </w:p>
+  </w:footnote>
+  <w:footnote w:id="61">
+    <w:p>
+      <w:pPr>
+        <w:bidi/>
+        <w:spacing w:after="60"/>
+      </w:pPr>
+      <w:r>
+        <w:rPr>
+          <w:rStyle w:val="FootnoteReference"/>
+        </w:rPr>
+        <w:footnoteRef/>
+      </w:r>
+      <w:r>
+        <w:rPr>
+          <w:rFonts w:ascii="David" w:cs="David" w:eastAsia="David" w:hAnsi="David"/>
+          <w:sz w:val="20"/>
+          <w:szCs w:val="20"/>
+          <w:rtl/>
+        </w:rPr>
         <w:t xml:space="preserve">השוו עניין </w:t>
       </w:r>
       <w:r>
@@ -9623,7 +9736,7 @@
       </w:r>
     </w:p>
   </w:footnote>
-  <w:footnote w:id="61">
+  <w:footnote w:id="62">
     <w:p>
       <w:pPr>
         <w:bidi/>
@@ -9642,37 +9755,6 @@
           <w:szCs w:val="20"/>
         </w:rPr>
         <w:t xml:space="preserve">Lysaght v Edwards (1876) 2 Ch D 499 (Ch)</w:t>
-      </w:r>
-      <w:r>
-        <w:rPr>
-          <w:rFonts w:ascii="David" w:cs="David" w:eastAsia="David" w:hAnsi="David"/>
-          <w:sz w:val="20"/>
-          <w:szCs w:val="20"/>
-          <w:rtl/>
-        </w:rPr>
-        <w:t xml:space="preserve">.</w:t>
-      </w:r>
-    </w:p>
-  </w:footnote>
-  <w:footnote w:id="62">
-    <w:p>
-      <w:pPr>
-        <w:bidi/>
-        <w:spacing w:after="60"/>
-      </w:pPr>
-      <w:r>
-        <w:rPr>
-          <w:rStyle w:val="FootnoteReference"/>
-        </w:rPr>
-        <w:footnoteRef/>
-      </w:r>
-      <w:r>
-        <w:rPr>
-          <w:rFonts w:ascii="Times New Roman" w:cs="Times New Roman" w:eastAsia="Times New Roman" w:hAnsi="Times New Roman"/>
-          <w:sz w:val="20"/>
-          <w:szCs w:val="20"/>
-        </w:rPr>
-        <w:t xml:space="preserve">Walsh v Lonsdale (1882) 21 Ch D 9 (CA)</w:t>
       </w:r>
       <w:r>
         <w:rPr>
@@ -9699,6 +9781,37 @@
       </w:r>
       <w:r>
         <w:rPr>
+          <w:rFonts w:ascii="Times New Roman" w:cs="Times New Roman" w:eastAsia="Times New Roman" w:hAnsi="Times New Roman"/>
+          <w:sz w:val="20"/>
+          <w:szCs w:val="20"/>
+        </w:rPr>
+        <w:t xml:space="preserve">Walsh v Lonsdale (1882) 21 Ch D 9 (CA)</w:t>
+      </w:r>
+      <w:r>
+        <w:rPr>
+          <w:rFonts w:ascii="David" w:cs="David" w:eastAsia="David" w:hAnsi="David"/>
+          <w:sz w:val="20"/>
+          <w:szCs w:val="20"/>
+          <w:rtl/>
+        </w:rPr>
+        <w:t xml:space="preserve">.</w:t>
+      </w:r>
+    </w:p>
+  </w:footnote>
+  <w:footnote w:id="64">
+    <w:p>
+      <w:pPr>
+        <w:bidi/>
+        <w:spacing w:after="60"/>
+      </w:pPr>
+      <w:r>
+        <w:rPr>
+          <w:rStyle w:val="FootnoteReference"/>
+        </w:rPr>
+        <w:footnoteRef/>
+      </w:r>
+      <w:r>
+        <w:rPr>
           <w:rFonts w:ascii="David" w:cs="David" w:eastAsia="David" w:hAnsi="David"/>
           <w:sz w:val="20"/>
           <w:szCs w:val="20"/>
@@ -9746,7 +9859,7 @@
       </w:r>
     </w:p>
   </w:footnote>
-  <w:footnote w:id="64">
+  <w:footnote w:id="65">
     <w:p>
       <w:pPr>
         <w:bidi/>
@@ -9765,54 +9878,6 @@
           <w:szCs w:val="20"/>
         </w:rPr>
         <w:t xml:space="preserve">Land Registration Act 2002, s 27</w:t>
-      </w:r>
-      <w:r>
-        <w:rPr>
-          <w:rFonts w:ascii="David" w:cs="David" w:eastAsia="David" w:hAnsi="David"/>
-          <w:sz w:val="20"/>
-          <w:szCs w:val="20"/>
-          <w:rtl/>
-        </w:rPr>
-        <w:t xml:space="preserve">.</w:t>
-      </w:r>
-    </w:p>
-  </w:footnote>
-  <w:footnote w:id="65">
-    <w:p>
-      <w:pPr>
-        <w:bidi/>
-        <w:spacing w:after="60"/>
-      </w:pPr>
-      <w:r>
-        <w:rPr>
-          <w:rStyle w:val="FootnoteReference"/>
-        </w:rPr>
-        <w:footnoteRef/>
-      </w:r>
-      <w:r>
-        <w:rPr>
-          <w:rFonts w:ascii="Times New Roman" w:cs="Times New Roman" w:eastAsia="Times New Roman" w:hAnsi="Times New Roman"/>
-          <w:sz w:val="20"/>
-          <w:szCs w:val="20"/>
-        </w:rPr>
-        <w:t xml:space="preserve">Williams &amp; Glyn’s Bank Ltd v Boland [1981] AC 487 (HL)</w:t>
-      </w:r>
-      <w:r>
-        <w:rPr>
-          <w:rFonts w:ascii="David" w:cs="David" w:eastAsia="David" w:hAnsi="David"/>
-          <w:sz w:val="20"/>
-          <w:szCs w:val="20"/>
-          <w:rtl/>
-        </w:rPr>
-        <w:t xml:space="preserve">; והמשכה של ההגנה כיום ב-</w:t>
-      </w:r>
-      <w:r>
-        <w:rPr>
-          <w:rFonts w:ascii="Times New Roman" w:cs="Times New Roman" w:eastAsia="Times New Roman" w:hAnsi="Times New Roman"/>
-          <w:sz w:val="20"/>
-          <w:szCs w:val="20"/>
-        </w:rPr>
-        <w:t xml:space="preserve">Land Registration Act 2002, sch 3, para 2</w:t>
       </w:r>
       <w:r>
         <w:rPr>
@@ -9839,20 +9904,28 @@
       </w:r>
       <w:r>
         <w:rPr>
-          <w:rFonts w:ascii="David" w:cs="David" w:eastAsia="David" w:hAnsi="David"/>
-          <w:sz w:val="20"/>
-          <w:szCs w:val="20"/>
-          <w:rtl/>
-        </w:rPr>
-        <w:t xml:space="preserve">לביקורת עדכנית על מוסד הזכויות הגוברות כסדק ב"עקרון המראה" של המרשם ראו </w:t>
-      </w:r>
-      <w:r>
-        <w:rPr>
           <w:rFonts w:ascii="Times New Roman" w:cs="Times New Roman" w:eastAsia="Times New Roman" w:hAnsi="Times New Roman"/>
           <w:sz w:val="20"/>
           <w:szCs w:val="20"/>
         </w:rPr>
-        <w:t xml:space="preserve">Chris Bevan, "Overriding Interests under the Land Registration Act 2002: Time to Repair the ‘Cracked Mirror’?" [2024] Conv. 123</w:t>
+        <w:t xml:space="preserve">Williams &amp; Glyn’s Bank Ltd v Boland [1981] AC 487 (HL)</w:t>
+      </w:r>
+      <w:r>
+        <w:rPr>
+          <w:rFonts w:ascii="David" w:cs="David" w:eastAsia="David" w:hAnsi="David"/>
+          <w:sz w:val="20"/>
+          <w:szCs w:val="20"/>
+          <w:rtl/>
+        </w:rPr>
+        <w:t xml:space="preserve">; והמשכה של ההגנה כיום ב-</w:t>
+      </w:r>
+      <w:r>
+        <w:rPr>
+          <w:rFonts w:ascii="Times New Roman" w:cs="Times New Roman" w:eastAsia="Times New Roman" w:hAnsi="Times New Roman"/>
+          <w:sz w:val="20"/>
+          <w:szCs w:val="20"/>
+        </w:rPr>
+        <w:t xml:space="preserve">Land Registration Act 2002, sch 3, para 2</w:t>
       </w:r>
       <w:r>
         <w:rPr>
@@ -9879,11 +9952,20 @@
       </w:r>
       <w:r>
         <w:rPr>
+          <w:rFonts w:ascii="David" w:cs="David" w:eastAsia="David" w:hAnsi="David"/>
+          <w:sz w:val="20"/>
+          <w:szCs w:val="20"/>
+          <w:rtl/>
+        </w:rPr>
+        <w:t xml:space="preserve">לביקורת עדכנית על מוסד הזכויות הגוברות כסדק ב"עקרון המראה" של המרשם ראו </w:t>
+      </w:r>
+      <w:r>
+        <w:rPr>
           <w:rFonts w:ascii="Times New Roman" w:cs="Times New Roman" w:eastAsia="Times New Roman" w:hAnsi="Times New Roman"/>
           <w:sz w:val="20"/>
           <w:szCs w:val="20"/>
         </w:rPr>
-        <w:t xml:space="preserve">Stack v Dowden [2007] UKHL 17, [2007] 2 AC 432; Jones v Kernott [2011] UKSC 53, [2012] 1 AC 776</w:t>
+        <w:t xml:space="preserve">Chris Bevan, "Overriding Interests under the Land Registration Act 2002: Time to Repair the ‘Cracked Mirror’?" [2024] Conv. 123</w:t>
       </w:r>
       <w:r>
         <w:rPr>
@@ -9914,7 +9996,7 @@
           <w:sz w:val="20"/>
           <w:szCs w:val="20"/>
         </w:rPr>
-        <w:t xml:space="preserve">Thorner v Major [2009] UKHL 18, [2009] 1 WLR 776</w:t>
+        <w:t xml:space="preserve">Stack v Dowden [2007] UKHL 17, [2007] 2 AC 432; Jones v Kernott [2011] UKSC 53, [2012] 1 AC 776</w:t>
       </w:r>
       <w:r>
         <w:rPr>
@@ -9945,24 +10027,7 @@
           <w:sz w:val="20"/>
           <w:szCs w:val="20"/>
         </w:rPr>
-        <w:t xml:space="preserve">Guest v Guest [2022] UKSC 27, [2022] 3 WLR 911</w:t>
-      </w:r>
-      <w:r>
-        <w:rPr>
-          <w:rFonts w:ascii="David" w:cs="David" w:eastAsia="David" w:hAnsi="David"/>
-          <w:sz w:val="20"/>
-          <w:szCs w:val="20"/>
-          <w:rtl/>
-        </w:rPr>
-        <w:t xml:space="preserve">. לניתוח עדכני ראו </w:t>
-      </w:r>
-      <w:r>
-        <w:rPr>
-          <w:rFonts w:ascii="Times New Roman" w:cs="Times New Roman" w:eastAsia="Times New Roman" w:hAnsi="Times New Roman"/>
-          <w:sz w:val="20"/>
-          <w:szCs w:val="20"/>
-        </w:rPr>
-        <w:t xml:space="preserve">Alex Waghorn, "Promises in Equity and at Law: Proprietary Estoppel after Guest v Guest" (2023) 86 MLR 1504; Brian Sloan, "Proprietary Estoppel in the Supreme Court: Banquo’s Ghost?" (2023) 82 CLJ 13</w:t>
+        <w:t xml:space="preserve">Thorner v Major [2009] UKHL 18, [2009] 1 WLR 776</w:t>
       </w:r>
       <w:r>
         <w:rPr>
@@ -9993,34 +10058,33 @@
           <w:sz w:val="20"/>
           <w:szCs w:val="20"/>
         </w:rPr>
-        <w:t xml:space="preserve">Law of Property (Miscellaneous Provisions) Act 1989, ss 1–2</w:t>
-      </w:r>
-      <w:r>
-        <w:rPr>
-          <w:rFonts w:ascii="David" w:cs="David" w:eastAsia="David" w:hAnsi="David"/>
-          <w:sz w:val="20"/>
-          <w:szCs w:val="20"/>
-          <w:rtl/>
-        </w:rPr>
-        <w:t xml:space="preserve">. וראו כבר את ראבילו, </w:t>
-      </w:r>
-      <w:r>
-        <w:rPr>
-          <w:rFonts w:ascii="David" w:cs="David" w:eastAsia="David" w:hAnsi="David"/>
-          <w:sz w:val="20"/>
-          <w:szCs w:val="20"/>
-          <w:rtl/>
-        </w:rPr>
-        <w:t xml:space="preserve">לעיל ה"ש 32</w:t>
-      </w:r>
-      <w:r>
-        <w:rPr>
-          <w:rFonts w:ascii="David" w:cs="David" w:eastAsia="David" w:hAnsi="David"/>
-          <w:sz w:val="20"/>
-          <w:szCs w:val="20"/>
-          <w:rtl/>
-        </w:rPr>
-        <w:t xml:space="preserve">, המצטט את הכלל האנגלי שלפיו הבטחת מתנה גרידא אינה מעבירה בעלות וטעונה מסירה.</w:t>
+        <w:t xml:space="preserve">Guest v Guest [2022] UKSC 27, [2022] 3 WLR 911</w:t>
+      </w:r>
+      <w:r>
+        <w:rPr>
+          <w:rFonts w:ascii="David" w:cs="David" w:eastAsia="David" w:hAnsi="David"/>
+          <w:sz w:val="20"/>
+          <w:szCs w:val="20"/>
+          <w:rtl/>
+        </w:rPr>
+        <w:t xml:space="preserve">. לניתוח עדכני ראו </w:t>
+      </w:r>
+      <w:r>
+        <w:rPr>
+          <w:rFonts w:ascii="Times New Roman" w:cs="Times New Roman" w:eastAsia="Times New Roman" w:hAnsi="Times New Roman"/>
+          <w:sz w:val="20"/>
+          <w:szCs w:val="20"/>
+        </w:rPr>
+        <w:t xml:space="preserve">Alex Waghorn, "Promises in Equity and at Law: Proprietary Estoppel after Guest v Guest" (2023) 86 MLR 1504; Brian Sloan, "Proprietary Estoppel in the Supreme Court: Banquo’s Ghost?" (2023) 82 CLJ 13</w:t>
+      </w:r>
+      <w:r>
+        <w:rPr>
+          <w:rFonts w:ascii="David" w:cs="David" w:eastAsia="David" w:hAnsi="David"/>
+          <w:sz w:val="20"/>
+          <w:szCs w:val="20"/>
+          <w:rtl/>
+        </w:rPr>
+        <w:t xml:space="preserve">.</w:t>
       </w:r>
     </w:p>
   </w:footnote>
@@ -10042,16 +10106,34 @@
           <w:sz w:val="20"/>
           <w:szCs w:val="20"/>
         </w:rPr>
-        <w:t xml:space="preserve">Re Rose [1952] Ch 499 (CA)</w:t>
-      </w:r>
-      <w:r>
-        <w:rPr>
-          <w:rFonts w:ascii="David" w:cs="David" w:eastAsia="David" w:hAnsi="David"/>
-          <w:sz w:val="20"/>
-          <w:szCs w:val="20"/>
-          <w:rtl/>
-        </w:rPr>
-        <w:t xml:space="preserve">.</w:t>
+        <w:t xml:space="preserve">Law of Property (Miscellaneous Provisions) Act 1989, ss 1–2</w:t>
+      </w:r>
+      <w:r>
+        <w:rPr>
+          <w:rFonts w:ascii="David" w:cs="David" w:eastAsia="David" w:hAnsi="David"/>
+          <w:sz w:val="20"/>
+          <w:szCs w:val="20"/>
+          <w:rtl/>
+        </w:rPr>
+        <w:t xml:space="preserve">. וראו כבר את ראבילו, </w:t>
+      </w:r>
+      <w:r>
+        <w:rPr>
+          <w:rFonts w:ascii="David" w:cs="David" w:eastAsia="David" w:hAnsi="David"/>
+          <w:sz w:val="20"/>
+          <w:szCs w:val="20"/>
+          <w:rtl/>
+        </w:rPr>
+        <w:t xml:space="preserve">לעיל ה"ש 32</w:t>
+      </w:r>
+      <w:r>
+        <w:rPr>
+          <w:rFonts w:ascii="David" w:cs="David" w:eastAsia="David" w:hAnsi="David"/>
+          <w:sz w:val="20"/>
+          <w:szCs w:val="20"/>
+          <w:rtl/>
+        </w:rPr>
+        <w:t xml:space="preserve">, המצטט את הכלל האנגלי שלפיו הבטחת מתנה גרידא אינה מעבירה בעלות וטעונה מסירה.</w:t>
       </w:r>
     </w:p>
   </w:footnote>
@@ -10073,7 +10155,7 @@
           <w:sz w:val="20"/>
           <w:szCs w:val="20"/>
         </w:rPr>
-        <w:t xml:space="preserve">Pennington v Waine [2002] EWCA Civ 227, [2002] 1 WLR 2075</w:t>
+        <w:t xml:space="preserve">Re Rose [1952] Ch 499 (CA)</w:t>
       </w:r>
       <w:r>
         <w:rPr>
@@ -10104,16 +10186,16 @@
           <w:sz w:val="20"/>
           <w:szCs w:val="20"/>
         </w:rPr>
-        <w:t xml:space="preserve">Powers of Attorney Act 1971, s 4</w:t>
-      </w:r>
-      <w:r>
-        <w:rPr>
-          <w:rFonts w:ascii="David" w:cs="David" w:eastAsia="David" w:hAnsi="David"/>
-          <w:sz w:val="20"/>
-          <w:szCs w:val="20"/>
-          <w:rtl/>
-        </w:rPr>
-        <w:t xml:space="preserve">. זהו המקור ההיסטורי של ס׳ 14(ב) לחוק השליחות הישראלי.</w:t>
+        <w:t xml:space="preserve">Pennington v Waine [2002] EWCA Civ 227, [2002] 1 WLR 2075</w:t>
+      </w:r>
+      <w:r>
+        <w:rPr>
+          <w:rFonts w:ascii="David" w:cs="David" w:eastAsia="David" w:hAnsi="David"/>
+          <w:sz w:val="20"/>
+          <w:szCs w:val="20"/>
+          <w:rtl/>
+        </w:rPr>
+        <w:t xml:space="preserve">.</w:t>
       </w:r>
     </w:p>
   </w:footnote>
@@ -10131,29 +10213,20 @@
       </w:r>
       <w:r>
         <w:rPr>
-          <w:rFonts w:ascii="David" w:cs="David" w:eastAsia="David" w:hAnsi="David"/>
-          <w:sz w:val="20"/>
-          <w:szCs w:val="20"/>
-          <w:rtl/>
-        </w:rPr>
-        <w:t xml:space="preserve">לניתוח השוואתי של גורל ההתיישנות הרוכשת בשיטות הרישום המודרניות ראו </w:t>
-      </w:r>
-      <w:r>
-        <w:rPr>
           <w:rFonts w:ascii="Times New Roman" w:cs="Times New Roman" w:eastAsia="Times New Roman" w:hAnsi="Times New Roman"/>
           <w:sz w:val="20"/>
           <w:szCs w:val="20"/>
         </w:rPr>
-        <w:t xml:space="preserve">Nadav Shoked, "Who Needs Adverse Possession?," 89 Fordham L. Rev. 2639 (2021)</w:t>
-      </w:r>
-      <w:r>
-        <w:rPr>
-          <w:rFonts w:ascii="David" w:cs="David" w:eastAsia="David" w:hAnsi="David"/>
-          <w:sz w:val="20"/>
-          <w:szCs w:val="20"/>
-          <w:rtl/>
-        </w:rPr>
-        <w:t xml:space="preserve">.</w:t>
+        <w:t xml:space="preserve">Powers of Attorney Act 1971, s 4</w:t>
+      </w:r>
+      <w:r>
+        <w:rPr>
+          <w:rFonts w:ascii="David" w:cs="David" w:eastAsia="David" w:hAnsi="David"/>
+          <w:sz w:val="20"/>
+          <w:szCs w:val="20"/>
+          <w:rtl/>
+        </w:rPr>
+        <w:t xml:space="preserve">. זהו המקור ההיסטורי של ס׳ 14(ב) לחוק השליחות הישראלי.</w:t>
       </w:r>
     </w:p>
   </w:footnote>
@@ -10176,7 +10249,24 @@
           <w:szCs w:val="20"/>
           <w:rtl/>
         </w:rPr>
-        <w:t xml:space="preserve">ס׳ 418 לקוד האזרחי המצרי (חוק מס׳ 131 לשנת 1948).</w:t>
+        <w:t xml:space="preserve">לניתוח השוואתי של גורל ההתיישנות הרוכשת בשיטות הרישום המודרניות ראו </w:t>
+      </w:r>
+      <w:r>
+        <w:rPr>
+          <w:rFonts w:ascii="Times New Roman" w:cs="Times New Roman" w:eastAsia="Times New Roman" w:hAnsi="Times New Roman"/>
+          <w:sz w:val="20"/>
+          <w:szCs w:val="20"/>
+        </w:rPr>
+        <w:t xml:space="preserve">Nadav Shoked, "Who Needs Adverse Possession?," 89 Fordham L. Rev. 2639 (2021)</w:t>
+      </w:r>
+      <w:r>
+        <w:rPr>
+          <w:rFonts w:ascii="David" w:cs="David" w:eastAsia="David" w:hAnsi="David"/>
+          <w:sz w:val="20"/>
+          <w:szCs w:val="20"/>
+          <w:rtl/>
+        </w:rPr>
+        <w:t xml:space="preserve">.</w:t>
       </w:r>
     </w:p>
   </w:footnote>
@@ -10199,7 +10289,7 @@
           <w:szCs w:val="20"/>
           <w:rtl/>
         </w:rPr>
-        <w:t xml:space="preserve">ס׳ 934 לקוד האזרחי המצרי; ס׳ 9 לחוק ארגון הפומביות המקרקעית, חוק מס׳ 114 לשנת 1946. במצרים פועלות במקביל שתי שיטות רישום: רישום שטרות פרסונלי לפי חוק 114/1946, החולש על מרבית המדינה, ורישום זכויות קדסטרלי לפי חוק מס׳ 142 לשנת 1964, שתחולתו מוגבלת.</w:t>
+        <w:t xml:space="preserve">ס׳ 418 לקוד האזרחי המצרי (חוק מס׳ 131 לשנת 1948).</w:t>
       </w:r>
     </w:p>
   </w:footnote>
@@ -10217,38 +10307,12 @@
       </w:r>
       <w:r>
         <w:rPr>
-          <w:rFonts w:ascii="Times New Roman" w:cs="Times New Roman" w:eastAsia="Times New Roman" w:hAnsi="Times New Roman"/>
-          <w:sz w:val="20"/>
-          <w:szCs w:val="20"/>
-        </w:rPr>
-        <w:t xml:space="preserve">“More than 90% of Egypt’s Properties Are Unregistered: Justice Minister,” Daily News Egypt (Feb. 14, 2022); “Egypt’s Property Registration Rate Remains Below 10%…: World Bank,” Daily News Egypt (July 5, 2026)</w:t>
-      </w:r>
-      <w:r>
-        <w:rPr>
-          <w:rFonts w:ascii="David" w:cs="David" w:eastAsia="David" w:hAnsi="David"/>
-          <w:sz w:val="20"/>
-          <w:szCs w:val="20"/>
-          <w:rtl/>
-        </w:rPr>
-        <w:t xml:space="preserve">. הרנדו דה-סוטו ביסס על מצרים את מחקר "ההון המת" שלו: </w:t>
-      </w:r>
-      <w:r>
-        <w:rPr>
-          <w:rFonts w:ascii="David" w:cs="David" w:eastAsia="David" w:hAnsi="David"/>
-          <w:sz w:val="20"/>
-          <w:szCs w:val="20"/>
-          <w:rtl/>
-        </w:rPr>
-        <w:t xml:space="preserve">לעיל ה"ש 59</w:t>
-      </w:r>
-      <w:r>
-        <w:rPr>
-          <w:rFonts w:ascii="David" w:cs="David" w:eastAsia="David" w:hAnsi="David"/>
-          <w:sz w:val="20"/>
-          <w:szCs w:val="20"/>
-          <w:rtl/>
-        </w:rPr>
-        <w:t xml:space="preserve">.</w:t>
+          <w:rFonts w:ascii="David" w:cs="David" w:eastAsia="David" w:hAnsi="David"/>
+          <w:sz w:val="20"/>
+          <w:szCs w:val="20"/>
+          <w:rtl/>
+        </w:rPr>
+        <w:t xml:space="preserve">ס׳ 934 לקוד האזרחי המצרי; ס׳ 9 לחוק ארגון הפומביות המקרקעית, חוק מס׳ 114 לשנת 1946. במצרים פועלות במקביל שתי שיטות רישום: רישום שטרות פרסונלי לפי חוק 114/1946, החולש על מרבית המדינה, ורישום זכויות קדסטרלי לפי חוק מס׳ 142 לשנת 1964, שתחולתו מוגבלת.</w:t>
       </w:r>
     </w:p>
   </w:footnote>
@@ -10266,12 +10330,38 @@
       </w:r>
       <w:r>
         <w:rPr>
-          <w:rFonts w:ascii="David" w:cs="David" w:eastAsia="David" w:hAnsi="David"/>
-          <w:sz w:val="20"/>
-          <w:szCs w:val="20"/>
-          <w:rtl/>
-        </w:rPr>
-        <w:t xml:space="preserve">ס׳ 715 לקוד האזרחי המצרי. בית המשפט החוקתי העליון של מצרים שב ואישר בשנת 2021 כי ייפוי כוח כזה אינו ניתן לביטול חד-צדדי. ואולם ס׳ 714 מורה כי השליחות פוקעת במות השולח – נקודת תורפה מרכזית של הפרקטיקה, שפסיקת בית המשפט לקסאציה בעניינה אינה אחידה.</w:t>
+          <w:rFonts w:ascii="Times New Roman" w:cs="Times New Roman" w:eastAsia="Times New Roman" w:hAnsi="Times New Roman"/>
+          <w:sz w:val="20"/>
+          <w:szCs w:val="20"/>
+        </w:rPr>
+        <w:t xml:space="preserve">“More than 90% of Egypt’s Properties Are Unregistered: Justice Minister,” Daily News Egypt (Feb. 14, 2022); “Egypt’s Property Registration Rate Remains Below 10%…: World Bank,” Daily News Egypt (July 5, 2026)</w:t>
+      </w:r>
+      <w:r>
+        <w:rPr>
+          <w:rFonts w:ascii="David" w:cs="David" w:eastAsia="David" w:hAnsi="David"/>
+          <w:sz w:val="20"/>
+          <w:szCs w:val="20"/>
+          <w:rtl/>
+        </w:rPr>
+        <w:t xml:space="preserve">. הרנדו דה-סוטו ביסס על מצרים את מחקר "ההון המת" שלו: </w:t>
+      </w:r>
+      <w:r>
+        <w:rPr>
+          <w:rFonts w:ascii="David" w:cs="David" w:eastAsia="David" w:hAnsi="David"/>
+          <w:sz w:val="20"/>
+          <w:szCs w:val="20"/>
+          <w:rtl/>
+        </w:rPr>
+        <w:t xml:space="preserve">לעיל ה"ש 60</w:t>
+      </w:r>
+      <w:r>
+        <w:rPr>
+          <w:rFonts w:ascii="David" w:cs="David" w:eastAsia="David" w:hAnsi="David"/>
+          <w:sz w:val="20"/>
+          <w:szCs w:val="20"/>
+          <w:rtl/>
+        </w:rPr>
+        <w:t xml:space="preserve">.</w:t>
       </w:r>
     </w:p>
   </w:footnote>
@@ -10294,24 +10384,7 @@
           <w:szCs w:val="20"/>
           <w:rtl/>
         </w:rPr>
-        <w:t xml:space="preserve">לפסיקת בית המשפט לקסאציה המצרי על תביעות אלה ראו הסקירות שבמאגרי לשכת עורכי הדין המצרית; ולתיאור אנליטי באנגלית ראו </w:t>
-      </w:r>
-      <w:r>
-        <w:rPr>
-          <w:rFonts w:ascii="Times New Roman" w:cs="Times New Roman" w:eastAsia="Times New Roman" w:hAnsi="Times New Roman"/>
-          <w:sz w:val="20"/>
-          <w:szCs w:val="20"/>
-        </w:rPr>
-        <w:t xml:space="preserve">David Sims, "Securing Land Tenure in Egypt: Who Needs Registered Titles?" Metropolitics (June 14, 2016)</w:t>
-      </w:r>
-      <w:r>
-        <w:rPr>
-          <w:rFonts w:ascii="David" w:cs="David" w:eastAsia="David" w:hAnsi="David"/>
-          <w:sz w:val="20"/>
-          <w:szCs w:val="20"/>
-          <w:rtl/>
-        </w:rPr>
-        <w:t xml:space="preserve">.</w:t>
+        <w:t xml:space="preserve">ס׳ 715 לקוד האזרחי המצרי. בית המשפט החוקתי העליון של מצרים שב ואישר בשנת 2021 כי ייפוי כוח כזה אינו ניתן לביטול חד-צדדי. ואולם ס׳ 714 מורה כי השליחות פוקעת במות השולח – נקודת תורפה מרכזית של הפרקטיקה, שפסיקת בית המשפט לקסאציה בעניינה אינה אחידה.</w:t>
       </w:r>
     </w:p>
   </w:footnote>
@@ -10334,7 +10407,24 @@
           <w:szCs w:val="20"/>
           <w:rtl/>
         </w:rPr>
-        <w:t xml:space="preserve">ס׳ 968 לקוד האזרחי המצרי. הפרקטיקה המצרית דנה בכך תחת הכותרת "וַצְ׳ע אל-יַד" (הנחת היד) – ההחזקה בפועל כמקור קניין.</w:t>
+        <w:t xml:space="preserve">לפסיקת בית המשפט לקסאציה המצרי על תביעות אלה ראו הסקירות שבמאגרי לשכת עורכי הדין המצרית; ולתיאור אנליטי באנגלית ראו </w:t>
+      </w:r>
+      <w:r>
+        <w:rPr>
+          <w:rFonts w:ascii="Times New Roman" w:cs="Times New Roman" w:eastAsia="Times New Roman" w:hAnsi="Times New Roman"/>
+          <w:sz w:val="20"/>
+          <w:szCs w:val="20"/>
+        </w:rPr>
+        <w:t xml:space="preserve">David Sims, "Securing Land Tenure in Egypt: Who Needs Registered Titles?" Metropolitics (June 14, 2016)</w:t>
+      </w:r>
+      <w:r>
+        <w:rPr>
+          <w:rFonts w:ascii="David" w:cs="David" w:eastAsia="David" w:hAnsi="David"/>
+          <w:sz w:val="20"/>
+          <w:szCs w:val="20"/>
+          <w:rtl/>
+        </w:rPr>
+        <w:t xml:space="preserve">.</w:t>
       </w:r>
     </w:p>
   </w:footnote>
@@ -10357,7 +10447,7 @@
           <w:szCs w:val="20"/>
           <w:rtl/>
         </w:rPr>
-        <w:t xml:space="preserve">ס׳ 969 לקוד האזרחי המצרי.</w:t>
+        <w:t xml:space="preserve">ס׳ 968 לקוד האזרחי המצרי. הפרקטיקה המצרית דנה בכך תחת הכותרת "וַצְ׳ע אל-יַד" (הנחת היד) – ההחזקה בפועל כמקור קניין.</w:t>
       </w:r>
     </w:p>
   </w:footnote>
@@ -10380,7 +10470,7 @@
           <w:szCs w:val="20"/>
           <w:rtl/>
         </w:rPr>
-        <w:t xml:space="preserve">ס׳ 970 לקוד האזרחי המצרי, כפי שתוקן בחוק מס׳ 55 לשנת 1970; ולנכסי הציבור ראו גם ס׳ 87(2) לקוד.</w:t>
+        <w:t xml:space="preserve">ס׳ 969 לקוד האזרחי המצרי.</w:t>
       </w:r>
     </w:p>
   </w:footnote>
@@ -10403,42 +10493,7 @@
           <w:szCs w:val="20"/>
           <w:rtl/>
         </w:rPr>
-        <w:t xml:space="preserve">להשוואה בין גישות שיטות הרישום להתיישנות רוכשת ראו </w:t>
-      </w:r>
-      <w:r>
-        <w:rPr>
-          <w:rFonts w:ascii="Times New Roman" w:cs="Times New Roman" w:eastAsia="Times New Roman" w:hAnsi="Times New Roman"/>
-          <w:sz w:val="20"/>
-          <w:szCs w:val="20"/>
-        </w:rPr>
-        <w:t xml:space="preserve">Shoked</w:t>
-      </w:r>
-      <w:r>
-        <w:rPr>
-          <w:rFonts w:ascii="David" w:cs="David" w:eastAsia="David" w:hAnsi="David"/>
-          <w:sz w:val="20"/>
-          <w:szCs w:val="20"/>
-          <w:rtl/>
-        </w:rPr>
-        <w:t xml:space="preserve">, </w:t>
-      </w:r>
-      <w:r>
-        <w:rPr>
-          <w:rFonts w:ascii="David" w:cs="David" w:eastAsia="David" w:hAnsi="David"/>
-          <w:sz w:val="20"/>
-          <w:szCs w:val="20"/>
-          <w:rtl/>
-        </w:rPr>
-        <w:t xml:space="preserve">לעיל ה"ש 74</w:t>
-      </w:r>
-      <w:r>
-        <w:rPr>
-          <w:rFonts w:ascii="David" w:cs="David" w:eastAsia="David" w:hAnsi="David"/>
-          <w:sz w:val="20"/>
-          <w:szCs w:val="20"/>
-          <w:rtl/>
-        </w:rPr>
-        <w:t xml:space="preserve">. ודוק: בישראל נחסם מסלול זה כמעט כליל – ס׳ 159(ב) לחוק המקרקעין שלל התיישנות במקרקעין מוסדרים, וחזקתו של בן משפחה מסווגת כ"חזקה מרשות"; ראו לעיל פרק ג.6.</w:t>
+        <w:t xml:space="preserve">ס׳ 970 לקוד האזרחי המצרי, כפי שתוקן בחוק מס׳ 55 לשנת 1970; ולנכסי הציבור ראו גם ס׳ 87(2) לקוד.</w:t>
       </w:r>
     </w:p>
   </w:footnote>
@@ -10456,37 +10511,47 @@
       </w:r>
       <w:r>
         <w:rPr>
+          <w:rFonts w:ascii="David" w:cs="David" w:eastAsia="David" w:hAnsi="David"/>
+          <w:sz w:val="20"/>
+          <w:szCs w:val="20"/>
+          <w:rtl/>
+        </w:rPr>
+        <w:t xml:space="preserve">להשוואה בין גישות שיטות הרישום להתיישנות רוכשת ראו </w:t>
+      </w:r>
+      <w:r>
+        <w:rPr>
           <w:rFonts w:ascii="Times New Roman" w:cs="Times New Roman" w:eastAsia="Times New Roman" w:hAnsi="Times New Roman"/>
           <w:sz w:val="20"/>
           <w:szCs w:val="20"/>
         </w:rPr>
-        <w:t xml:space="preserve">“Sisi Orders Delaying Implementation of Controversial Real Estate Law for 2 Years,” Ahram Online (Feb. 28, 2021); “‘Unjust’: Egypt’s Property Registration Plans Face Popular Backlash,” Middle East Eye (2021)</w:t>
-      </w:r>
-      <w:r>
-        <w:rPr>
-          <w:rFonts w:ascii="David" w:cs="David" w:eastAsia="David" w:hAnsi="David"/>
-          <w:sz w:val="20"/>
-          <w:szCs w:val="20"/>
-          <w:rtl/>
-        </w:rPr>
-        <w:t xml:space="preserve">. לניתוח מדיניות ראו </w:t>
-      </w:r>
-      <w:r>
-        <w:rPr>
-          <w:rFonts w:ascii="Times New Roman" w:cs="Times New Roman" w:eastAsia="Times New Roman" w:hAnsi="Times New Roman"/>
-          <w:sz w:val="20"/>
-          <w:szCs w:val="20"/>
-        </w:rPr>
-        <w:t xml:space="preserve">“Real Estate Registration Law Amendments – Development Brief,” The Built Environment Observatory (May 2021)</w:t>
-      </w:r>
-      <w:r>
-        <w:rPr>
-          <w:rFonts w:ascii="David" w:cs="David" w:eastAsia="David" w:hAnsi="David"/>
-          <w:sz w:val="20"/>
-          <w:szCs w:val="20"/>
-          <w:rtl/>
-        </w:rPr>
-        <w:t xml:space="preserve">.</w:t>
+        <w:t xml:space="preserve">Shoked</w:t>
+      </w:r>
+      <w:r>
+        <w:rPr>
+          <w:rFonts w:ascii="David" w:cs="David" w:eastAsia="David" w:hAnsi="David"/>
+          <w:sz w:val="20"/>
+          <w:szCs w:val="20"/>
+          <w:rtl/>
+        </w:rPr>
+        <w:t xml:space="preserve">, </w:t>
+      </w:r>
+      <w:r>
+        <w:rPr>
+          <w:rFonts w:ascii="David" w:cs="David" w:eastAsia="David" w:hAnsi="David"/>
+          <w:sz w:val="20"/>
+          <w:szCs w:val="20"/>
+          <w:rtl/>
+        </w:rPr>
+        <w:t xml:space="preserve">לעיל ה"ש 75</w:t>
+      </w:r>
+      <w:r>
+        <w:rPr>
+          <w:rFonts w:ascii="David" w:cs="David" w:eastAsia="David" w:hAnsi="David"/>
+          <w:sz w:val="20"/>
+          <w:szCs w:val="20"/>
+          <w:rtl/>
+        </w:rPr>
+        <w:t xml:space="preserve">. ודוק: בישראל נחסם מסלול זה כמעט כליל – ס׳ 159(ב) לחוק המקרקעין שלל התיישנות במקרקעין מוסדרים, וחזקתו של בן משפחה מסווגת כ"חזקה מרשות"; ראו לעיל פרק ג.6.</w:t>
       </w:r>
     </w:p>
   </w:footnote>
@@ -10504,20 +10569,28 @@
       </w:r>
       <w:r>
         <w:rPr>
-          <w:rFonts w:ascii="David" w:cs="David" w:eastAsia="David" w:hAnsi="David"/>
-          <w:sz w:val="20"/>
-          <w:szCs w:val="20"/>
-          <w:rtl/>
-        </w:rPr>
-        <w:t xml:space="preserve">חוק מס׳ 9 לשנת 2022 (מצרים), המתקן את חוק מס׳ 114 לשנת 1946; ראו </w:t>
-      </w:r>
-      <w:r>
-        <w:rPr>
           <w:rFonts w:ascii="Times New Roman" w:cs="Times New Roman" w:eastAsia="Times New Roman" w:hAnsi="Times New Roman"/>
           <w:sz w:val="20"/>
           <w:szCs w:val="20"/>
         </w:rPr>
-        <w:t xml:space="preserve">Shalakany Law Office, “New Amendments to Real Estate Registration Law” (2022)</w:t>
+        <w:t xml:space="preserve">“Sisi Orders Delaying Implementation of Controversial Real Estate Law for 2 Years,” Ahram Online (Feb. 28, 2021); “‘Unjust’: Egypt’s Property Registration Plans Face Popular Backlash,” Middle East Eye (2021)</w:t>
+      </w:r>
+      <w:r>
+        <w:rPr>
+          <w:rFonts w:ascii="David" w:cs="David" w:eastAsia="David" w:hAnsi="David"/>
+          <w:sz w:val="20"/>
+          <w:szCs w:val="20"/>
+          <w:rtl/>
+        </w:rPr>
+        <w:t xml:space="preserve">. לניתוח מדיניות ראו </w:t>
+      </w:r>
+      <w:r>
+        <w:rPr>
+          <w:rFonts w:ascii="Times New Roman" w:cs="Times New Roman" w:eastAsia="Times New Roman" w:hAnsi="Times New Roman"/>
+          <w:sz w:val="20"/>
+          <w:szCs w:val="20"/>
+        </w:rPr>
+        <w:t xml:space="preserve">“Real Estate Registration Law Amendments – Development Brief,” The Built Environment Observatory (May 2021)</w:t>
       </w:r>
       <w:r>
         <w:rPr>
@@ -10549,7 +10622,24 @@
           <w:szCs w:val="20"/>
           <w:rtl/>
         </w:rPr>
-        <w:t xml:space="preserve">ס׳ 2 לחוקת מצרים (2014); ס׳ 1 לקוד האזרחי המצרי (ובו מדרג: חקיקה, מנהג, עקרונות השריעה, עקרונות הצדק); חוק הירושה המצרי, חוק מס׳ 77 לשנת 1943; ולצוואות – חוק מס׳ 71 לשנת 1946.</w:t>
+        <w:t xml:space="preserve">חוק מס׳ 9 לשנת 2022 (מצרים), המתקן את חוק מס׳ 114 לשנת 1946; ראו </w:t>
+      </w:r>
+      <w:r>
+        <w:rPr>
+          <w:rFonts w:ascii="Times New Roman" w:cs="Times New Roman" w:eastAsia="Times New Roman" w:hAnsi="Times New Roman"/>
+          <w:sz w:val="20"/>
+          <w:szCs w:val="20"/>
+        </w:rPr>
+        <w:t xml:space="preserve">Shalakany Law Office, “New Amendments to Real Estate Registration Law” (2022)</w:t>
+      </w:r>
+      <w:r>
+        <w:rPr>
+          <w:rFonts w:ascii="David" w:cs="David" w:eastAsia="David" w:hAnsi="David"/>
+          <w:sz w:val="20"/>
+          <w:szCs w:val="20"/>
+          <w:rtl/>
+        </w:rPr>
+        <w:t xml:space="preserve">.</w:t>
       </w:r>
     </w:p>
   </w:footnote>
@@ -10572,24 +10662,7 @@
           <w:szCs w:val="20"/>
           <w:rtl/>
         </w:rPr>
-        <w:t xml:space="preserve">לתרגום האנגלי המקובל ראו </w:t>
-      </w:r>
-      <w:r>
-        <w:rPr>
-          <w:rFonts w:ascii="Times New Roman" w:cs="Times New Roman" w:eastAsia="Times New Roman" w:hAnsi="Times New Roman"/>
-          <w:sz w:val="20"/>
-          <w:szCs w:val="20"/>
-        </w:rPr>
-        <w:t xml:space="preserve">C.R. Tyser, D.G. Demetriades &amp; Ismail Haqqi Effendi (trans.), The Mejelle: Being an English Translation of Majallah el-Ahkam-i-Adliya (1901)</w:t>
-      </w:r>
-      <w:r>
-        <w:rPr>
-          <w:rFonts w:ascii="David" w:cs="David" w:eastAsia="David" w:hAnsi="David"/>
-          <w:sz w:val="20"/>
-          <w:szCs w:val="20"/>
-          <w:rtl/>
-        </w:rPr>
-        <w:t xml:space="preserve">; חוק לביטול המג׳לה, התשמ"ד-1984.</w:t>
+        <w:t xml:space="preserve">ס׳ 2 לחוקת מצרים (2014); ס׳ 1 לקוד האזרחי המצרי (ובו מדרג: חקיקה, מנהג, עקרונות השריעה, עקרונות הצדק); חוק הירושה המצרי, חוק מס׳ 77 לשנת 1943; ולצוואות – חוק מס׳ 71 לשנת 1946.</w:t>
       </w:r>
     </w:p>
   </w:footnote>
@@ -10612,7 +10685,7 @@
           <w:szCs w:val="20"/>
           <w:rtl/>
         </w:rPr>
-        <w:t xml:space="preserve">ס׳ 837, 861–862 למג׳לה. לדוקטרינת ההִבָּה הקלאסית ראו </w:t>
+        <w:t xml:space="preserve">לתרגום האנגלי המקובל ראו </w:t>
       </w:r>
       <w:r>
         <w:rPr>
@@ -10620,16 +10693,16 @@
           <w:sz w:val="20"/>
           <w:szCs w:val="20"/>
         </w:rPr>
-        <w:t xml:space="preserve">Joseph Schacht, An Introduction to Islamic Law (1964); Y. Linant de Bellefonds, “Hiba,” in The Encyclopaedia of Islam (2d ed.)</w:t>
-      </w:r>
-      <w:r>
-        <w:rPr>
-          <w:rFonts w:ascii="David" w:cs="David" w:eastAsia="David" w:hAnsi="David"/>
-          <w:sz w:val="20"/>
-          <w:szCs w:val="20"/>
-          <w:rtl/>
-        </w:rPr>
-        <w:t xml:space="preserve">.</w:t>
+        <w:t xml:space="preserve">C.R. Tyser, D.G. Demetriades &amp; Ismail Haqqi Effendi (trans.), The Mejelle: Being an English Translation of Majallah el-Ahkam-i-Adliya (1901)</w:t>
+      </w:r>
+      <w:r>
+        <w:rPr>
+          <w:rFonts w:ascii="David" w:cs="David" w:eastAsia="David" w:hAnsi="David"/>
+          <w:sz w:val="20"/>
+          <w:szCs w:val="20"/>
+          <w:rtl/>
+        </w:rPr>
+        <w:t xml:space="preserve">; חוק לביטול המג׳לה, התשמ"ד-1984.</w:t>
       </w:r>
     </w:p>
   </w:footnote>
@@ -10652,7 +10725,24 @@
           <w:szCs w:val="20"/>
           <w:rtl/>
         </w:rPr>
-        <w:t xml:space="preserve">ס׳ 866 למג׳לה; וכן ס׳ 872 – מות אחד הצדדים חוסם את החזרה.</w:t>
+        <w:t xml:space="preserve">ס׳ 837, 861–862 למג׳לה. לדוקטרינת ההִבָּה הקלאסית ראו </w:t>
+      </w:r>
+      <w:r>
+        <w:rPr>
+          <w:rFonts w:ascii="Times New Roman" w:cs="Times New Roman" w:eastAsia="Times New Roman" w:hAnsi="Times New Roman"/>
+          <w:sz w:val="20"/>
+          <w:szCs w:val="20"/>
+        </w:rPr>
+        <w:t xml:space="preserve">Joseph Schacht, An Introduction to Islamic Law (1964); Y. Linant de Bellefonds, “Hiba,” in The Encyclopaedia of Islam (2d ed.)</w:t>
+      </w:r>
+      <w:r>
+        <w:rPr>
+          <w:rFonts w:ascii="David" w:cs="David" w:eastAsia="David" w:hAnsi="David"/>
+          <w:sz w:val="20"/>
+          <w:szCs w:val="20"/>
+          <w:rtl/>
+        </w:rPr>
+        <w:t xml:space="preserve">.</w:t>
       </w:r>
     </w:p>
   </w:footnote>
@@ -10675,24 +10765,7 @@
           <w:szCs w:val="20"/>
           <w:rtl/>
         </w:rPr>
-        <w:t xml:space="preserve">ס׳ 879 למג׳לה; לדיון עדכני ראו </w:t>
-      </w:r>
-      <w:r>
-        <w:rPr>
-          <w:rFonts w:ascii="Times New Roman" w:cs="Times New Roman" w:eastAsia="Times New Roman" w:hAnsi="Times New Roman"/>
-          <w:sz w:val="20"/>
-          <w:szCs w:val="20"/>
-        </w:rPr>
-        <w:t xml:space="preserve">Siti Norfatirah Abdul Rahmani &amp; Mohd Zamro Muda, “Ownership Status of Hibah Marad al-Mawt,” 34(8) al-Qanatir Int’l J. Islamic Stud. (2025)</w:t>
-      </w:r>
-      <w:r>
-        <w:rPr>
-          <w:rFonts w:ascii="David" w:cs="David" w:eastAsia="David" w:hAnsi="David"/>
-          <w:sz w:val="20"/>
-          <w:szCs w:val="20"/>
-          <w:rtl/>
-        </w:rPr>
-        <w:t xml:space="preserve">.</w:t>
+        <w:t xml:space="preserve">ס׳ 866 למג׳לה; וכן ס׳ 872 – מות אחד הצדדים חוסם את החזרה.</w:t>
       </w:r>
     </w:p>
   </w:footnote>
@@ -10715,25 +10788,7 @@
           <w:szCs w:val="20"/>
           <w:rtl/>
         </w:rPr>
-        <w:t xml:space="preserve">להוראת המעבר ראו ראבילו, </w:t>
-      </w:r>
-      <w:r>
-        <w:rPr>
-          <w:rFonts w:ascii="David" w:cs="David" w:eastAsia="David" w:hAnsi="David"/>
-          <w:sz w:val="20"/>
-          <w:szCs w:val="20"/>
-          <w:rtl/>
-        </w:rPr>
-        <w:t xml:space="preserve">לעיל ה"ש 32</w:t>
-      </w:r>
-      <w:r>
-        <w:rPr>
-          <w:rFonts w:ascii="David" w:cs="David" w:eastAsia="David" w:hAnsi="David"/>
-          <w:sz w:val="20"/>
-          <w:szCs w:val="20"/>
-          <w:rtl/>
-        </w:rPr>
-        <w:t xml:space="preserve">, בעמ׳ 333–337, המתאר את הדין ערב חוק המתנה; והשוו </w:t>
+        <w:t xml:space="preserve">ס׳ 879 למג׳לה; לדיון עדכני ראו </w:t>
       </w:r>
       <w:r>
         <w:rPr>
@@ -10741,16 +10796,16 @@
           <w:sz w:val="20"/>
           <w:szCs w:val="20"/>
         </w:rPr>
-        <w:t xml:space="preserve">L. Landau, “The Gift Law, 1968,” 4 Isr. L. Rev. 260 (1969)</w:t>
-      </w:r>
-      <w:r>
-        <w:rPr>
-          <w:rFonts w:ascii="David" w:cs="David" w:eastAsia="David" w:hAnsi="David"/>
-          <w:sz w:val="20"/>
-          <w:szCs w:val="20"/>
-          <w:rtl/>
-        </w:rPr>
-        <w:t xml:space="preserve">, על החלפת דיני ההִבָּה של המג׳לה בחוק המתנה הישראלי.</w:t>
+        <w:t xml:space="preserve">Siti Norfatirah Abdul Rahmani &amp; Mohd Zamro Muda, “Ownership Status of Hibah Marad al-Mawt,” 34(8) al-Qanatir Int’l J. Islamic Stud. (2025)</w:t>
+      </w:r>
+      <w:r>
+        <w:rPr>
+          <w:rFonts w:ascii="David" w:cs="David" w:eastAsia="David" w:hAnsi="David"/>
+          <w:sz w:val="20"/>
+          <w:szCs w:val="20"/>
+          <w:rtl/>
+        </w:rPr>
+        <w:t xml:space="preserve">.</w:t>
       </w:r>
     </w:p>
   </w:footnote>
@@ -10773,7 +10828,42 @@
           <w:szCs w:val="20"/>
           <w:rtl/>
         </w:rPr>
-        <w:t xml:space="preserve">ס׳ 1660 למג׳לה (ולתביעות בעניין יסוד הוקף – 36 שנים, ס׳ 1661).</w:t>
+        <w:t xml:space="preserve">להוראת המעבר ראו ראבילו, </w:t>
+      </w:r>
+      <w:r>
+        <w:rPr>
+          <w:rFonts w:ascii="David" w:cs="David" w:eastAsia="David" w:hAnsi="David"/>
+          <w:sz w:val="20"/>
+          <w:szCs w:val="20"/>
+          <w:rtl/>
+        </w:rPr>
+        <w:t xml:space="preserve">לעיל ה"ש 32</w:t>
+      </w:r>
+      <w:r>
+        <w:rPr>
+          <w:rFonts w:ascii="David" w:cs="David" w:eastAsia="David" w:hAnsi="David"/>
+          <w:sz w:val="20"/>
+          <w:szCs w:val="20"/>
+          <w:rtl/>
+        </w:rPr>
+        <w:t xml:space="preserve">, בעמ׳ 333–337, המתאר את הדין ערב חוק המתנה; והשוו </w:t>
+      </w:r>
+      <w:r>
+        <w:rPr>
+          <w:rFonts w:ascii="Times New Roman" w:cs="Times New Roman" w:eastAsia="Times New Roman" w:hAnsi="Times New Roman"/>
+          <w:sz w:val="20"/>
+          <w:szCs w:val="20"/>
+        </w:rPr>
+        <w:t xml:space="preserve">L. Landau, “The Gift Law, 1968,” 4 Isr. L. Rev. 260 (1969)</w:t>
+      </w:r>
+      <w:r>
+        <w:rPr>
+          <w:rFonts w:ascii="David" w:cs="David" w:eastAsia="David" w:hAnsi="David"/>
+          <w:sz w:val="20"/>
+          <w:szCs w:val="20"/>
+          <w:rtl/>
+        </w:rPr>
+        <w:t xml:space="preserve">, על החלפת דיני ההִבָּה של המג׳לה בחוק המתנה הישראלי.</w:t>
       </w:r>
     </w:p>
   </w:footnote>
@@ -10796,7 +10886,7 @@
           <w:szCs w:val="20"/>
           <w:rtl/>
         </w:rPr>
-        <w:t xml:space="preserve">ס׳ 1674 למג׳לה. ההקבלה לס׳ 2 לחוק ההתיישנות, התשי"ח-1958, שאף הוא קובע התיישנות דיונית שאינה מפקיעה את הזכות, גלויה לעין.</w:t>
+        <w:t xml:space="preserve">ס׳ 1660 למג׳לה (ולתביעות בעניין יסוד הוקף – 36 שנים, ס׳ 1661).</w:t>
       </w:r>
     </w:p>
   </w:footnote>
@@ -10819,42 +10909,7 @@
           <w:szCs w:val="20"/>
           <w:rtl/>
         </w:rPr>
-        <w:t xml:space="preserve">ס׳ 20 ו-78 לחוק הקרקעות העות׳מאני, 1858. להיסטוריה של יישום הוראות אלה בארץ ישראל ולגלגולן בפסיקה הישראלית ראו </w:t>
-      </w:r>
-      <w:r>
-        <w:rPr>
-          <w:rFonts w:ascii="Times New Roman" w:cs="Times New Roman" w:eastAsia="Times New Roman" w:hAnsi="Times New Roman"/>
-          <w:sz w:val="20"/>
-          <w:szCs w:val="20"/>
-        </w:rPr>
-        <w:t xml:space="preserve">Ahmad Amara, “Dispossession by Law: How the Israeli Judicial System Utilizes Ottoman Land Law to Expel and Dispossess the Bedouins,” J. Levantine Stud. (2015)</w:t>
-      </w:r>
-      <w:r>
-        <w:rPr>
-          <w:rFonts w:ascii="David" w:cs="David" w:eastAsia="David" w:hAnsi="David"/>
-          <w:sz w:val="20"/>
-          <w:szCs w:val="20"/>
-          <w:rtl/>
-        </w:rPr>
-        <w:t xml:space="preserve">; זנדברג, </w:t>
-      </w:r>
-      <w:r>
-        <w:rPr>
-          <w:rFonts w:ascii="David" w:cs="David" w:eastAsia="David" w:hAnsi="David"/>
-          <w:sz w:val="20"/>
-          <w:szCs w:val="20"/>
-          <w:rtl/>
-        </w:rPr>
-        <w:t xml:space="preserve">לעיל ה"ש 10</w:t>
-      </w:r>
-      <w:r>
-        <w:rPr>
-          <w:rFonts w:ascii="David" w:cs="David" w:eastAsia="David" w:hAnsi="David"/>
-          <w:sz w:val="20"/>
-          <w:szCs w:val="20"/>
-          <w:rtl/>
-        </w:rPr>
-        <w:t xml:space="preserve">.</w:t>
+        <w:t xml:space="preserve">ס׳ 1674 למג׳לה. ההקבלה לס׳ 2 לחוק ההתיישנות, התשי"ח-1958, שאף הוא קובע התיישנות דיונית שאינה מפקיעה את הזכות, גלויה לעין.</w:t>
       </w:r>
     </w:p>
   </w:footnote>
@@ -10877,7 +10932,7 @@
           <w:szCs w:val="20"/>
           <w:rtl/>
         </w:rPr>
-        <w:t xml:space="preserve">ס׳ 1521 למג׳לה. השליחות פוקעת ככלל במות השולח – כלל שהעמיד בסימן שאלה את ייפויי הכוח הוותיקים שנועדו לפעול "לאחר אריכות ימים". לניסוח מודרני של דיני הוַכַּאלָה ראו </w:t>
+        <w:t xml:space="preserve">ס׳ 20 ו-78 לחוק הקרקעות העות׳מאני, 1858. להיסטוריה של יישום הוראות אלה בארץ ישראל ולגלגולן בפסיקה הישראלית ראו </w:t>
       </w:r>
       <w:r>
         <w:rPr>
@@ -10885,7 +10940,25 @@
           <w:sz w:val="20"/>
           <w:szCs w:val="20"/>
         </w:rPr>
-        <w:t xml:space="preserve">AAOIFI, Shari’ah Standard No. 23: Agency (2015)</w:t>
+        <w:t xml:space="preserve">Ahmad Amara, “Dispossession by Law: How the Israeli Judicial System Utilizes Ottoman Land Law to Expel and Dispossess the Bedouins,” J. Levantine Stud. (2015)</w:t>
+      </w:r>
+      <w:r>
+        <w:rPr>
+          <w:rFonts w:ascii="David" w:cs="David" w:eastAsia="David" w:hAnsi="David"/>
+          <w:sz w:val="20"/>
+          <w:szCs w:val="20"/>
+          <w:rtl/>
+        </w:rPr>
+        <w:t xml:space="preserve">; זנדברג, </w:t>
+      </w:r>
+      <w:r>
+        <w:rPr>
+          <w:rFonts w:ascii="David" w:cs="David" w:eastAsia="David" w:hAnsi="David"/>
+          <w:sz w:val="20"/>
+          <w:szCs w:val="20"/>
+          <w:rtl/>
+        </w:rPr>
+        <w:t xml:space="preserve">לעיל ה"ש 10</w:t>
       </w:r>
       <w:r>
         <w:rPr>
@@ -10912,11 +10985,20 @@
       </w:r>
       <w:r>
         <w:rPr>
+          <w:rFonts w:ascii="David" w:cs="David" w:eastAsia="David" w:hAnsi="David"/>
+          <w:sz w:val="20"/>
+          <w:szCs w:val="20"/>
+          <w:rtl/>
+        </w:rPr>
+        <w:t xml:space="preserve">ס׳ 1521 למג׳לה. השליחות פוקעת ככלל במות השולח – כלל שהעמיד בסימן שאלה את ייפויי הכוח הוותיקים שנועדו לפעול "לאחר אריכות ימים". לניסוח מודרני של דיני הוַכַּאלָה ראו </w:t>
+      </w:r>
+      <w:r>
+        <w:rPr>
           <w:rFonts w:ascii="Times New Roman" w:cs="Times New Roman" w:eastAsia="Times New Roman" w:hAnsi="Times New Roman"/>
           <w:sz w:val="20"/>
           <w:szCs w:val="20"/>
         </w:rPr>
-        <w:t xml:space="preserve">N.J. Coulson, Succession in the Muslim Family (1971)</w:t>
+        <w:t xml:space="preserve">AAOIFI, Shari’ah Standard No. 23: Agency (2015)</w:t>
       </w:r>
       <w:r>
         <w:rPr>
@@ -10947,24 +11029,7 @@
           <w:sz w:val="20"/>
           <w:szCs w:val="20"/>
         </w:rPr>
-        <w:t xml:space="preserve">Annelies Moors, Women, Property and Islam: Palestinian Experiences, 1920–1990 (1995)</w:t>
-      </w:r>
-      <w:r>
-        <w:rPr>
-          <w:rFonts w:ascii="David" w:cs="David" w:eastAsia="David" w:hAnsi="David"/>
-          <w:sz w:val="20"/>
-          <w:szCs w:val="20"/>
-          <w:rtl/>
-        </w:rPr>
-        <w:t xml:space="preserve">; ולפרקטיקה בבתי הדין השרעיים בישראל ראו </w:t>
-      </w:r>
-      <w:r>
-        <w:rPr>
-          <w:rFonts w:ascii="Times New Roman" w:cs="Times New Roman" w:eastAsia="Times New Roman" w:hAnsi="Times New Roman"/>
-          <w:sz w:val="20"/>
-          <w:szCs w:val="20"/>
-        </w:rPr>
-        <w:t xml:space="preserve">Aharon Layish, Women and Islamic Law in a Non-Muslim State (1975)</w:t>
+        <w:t xml:space="preserve">N.J. Coulson, Succession in the Muslim Family (1971)</w:t>
       </w:r>
       <w:r>
         <w:rPr>
@@ -10995,25 +11060,24 @@
           <w:sz w:val="20"/>
           <w:szCs w:val="20"/>
         </w:rPr>
-        <w:t xml:space="preserve">Ruth Kark, “Consequences of the Ottoman Land Law: Agrarian and Privatization Processes in Palestine, 1858–1918,” in Societies, Social Inequalities and Marginalization 101 (R. Chand et al. eds., 2017)</w:t>
-      </w:r>
-      <w:r>
-        <w:rPr>
-          <w:rFonts w:ascii="David" w:cs="David" w:eastAsia="David" w:hAnsi="David"/>
-          <w:sz w:val="20"/>
-          <w:szCs w:val="20"/>
-          <w:rtl/>
-        </w:rPr>
-        <w:t xml:space="preserve">; נדן, </w:t>
-      </w:r>
-      <w:r>
-        <w:rPr>
-          <w:rFonts w:ascii="David" w:cs="David" w:eastAsia="David" w:hAnsi="David"/>
-          <w:sz w:val="20"/>
-          <w:szCs w:val="20"/>
-          <w:rtl/>
-        </w:rPr>
-        <w:t xml:space="preserve">לעיל ה"ש 14</w:t>
+        <w:t xml:space="preserve">Annelies Moors, Women, Property and Islam: Palestinian Experiences, 1920–1990 (1995)</w:t>
+      </w:r>
+      <w:r>
+        <w:rPr>
+          <w:rFonts w:ascii="David" w:cs="David" w:eastAsia="David" w:hAnsi="David"/>
+          <w:sz w:val="20"/>
+          <w:szCs w:val="20"/>
+          <w:rtl/>
+        </w:rPr>
+        <w:t xml:space="preserve">; ולפרקטיקה בבתי הדין השרעיים בישראל ראו </w:t>
+      </w:r>
+      <w:r>
+        <w:rPr>
+          <w:rFonts w:ascii="Times New Roman" w:cs="Times New Roman" w:eastAsia="Times New Roman" w:hAnsi="Times New Roman"/>
+          <w:sz w:val="20"/>
+          <w:szCs w:val="20"/>
+        </w:rPr>
+        <w:t xml:space="preserve">Aharon Layish, Women and Islamic Law in a Non-Muslim State (1975)</w:t>
       </w:r>
       <w:r>
         <w:rPr>
@@ -11040,20 +11104,29 @@
       </w:r>
       <w:r>
         <w:rPr>
-          <w:rFonts w:ascii="David" w:cs="David" w:eastAsia="David" w:hAnsi="David"/>
-          <w:sz w:val="20"/>
-          <w:szCs w:val="20"/>
-          <w:rtl/>
-        </w:rPr>
-        <w:t xml:space="preserve">ראו לעיל פרק ה ופרק ו.2.4; והשוו </w:t>
-      </w:r>
-      <w:r>
-        <w:rPr>
           <w:rFonts w:ascii="Times New Roman" w:cs="Times New Roman" w:eastAsia="Times New Roman" w:hAnsi="Times New Roman"/>
           <w:sz w:val="20"/>
           <w:szCs w:val="20"/>
         </w:rPr>
-        <w:t xml:space="preserve">Kareem Ibrahim &amp; Deena Khalil, “Land Titling: A Tool, not a Panacea — Insights from Egypt,” Metropolitics (Dec. 20, 2016)</w:t>
+        <w:t xml:space="preserve">Ruth Kark, “Consequences of the Ottoman Land Law: Agrarian and Privatization Processes in Palestine, 1858–1918,” in Societies, Social Inequalities and Marginalization 101 (R. Chand et al. eds., 2017)</w:t>
+      </w:r>
+      <w:r>
+        <w:rPr>
+          <w:rFonts w:ascii="David" w:cs="David" w:eastAsia="David" w:hAnsi="David"/>
+          <w:sz w:val="20"/>
+          <w:szCs w:val="20"/>
+          <w:rtl/>
+        </w:rPr>
+        <w:t xml:space="preserve">; נדן, </w:t>
+      </w:r>
+      <w:r>
+        <w:rPr>
+          <w:rFonts w:ascii="David" w:cs="David" w:eastAsia="David" w:hAnsi="David"/>
+          <w:sz w:val="20"/>
+          <w:szCs w:val="20"/>
+          <w:rtl/>
+        </w:rPr>
+        <w:t xml:space="preserve">לעיל ה"ש 14</w:t>
       </w:r>
       <w:r>
         <w:rPr>
@@ -11085,6 +11158,46 @@
           <w:szCs w:val="20"/>
           <w:rtl/>
         </w:rPr>
+        <w:t xml:space="preserve">ראו לעיל פרק ה ופרק ו.2.4; והשוו </w:t>
+      </w:r>
+      <w:r>
+        <w:rPr>
+          <w:rFonts w:ascii="Times New Roman" w:cs="Times New Roman" w:eastAsia="Times New Roman" w:hAnsi="Times New Roman"/>
+          <w:sz w:val="20"/>
+          <w:szCs w:val="20"/>
+        </w:rPr>
+        <w:t xml:space="preserve">Kareem Ibrahim &amp; Deena Khalil, “Land Titling: A Tool, not a Panacea — Insights from Egypt,” Metropolitics (Dec. 20, 2016)</w:t>
+      </w:r>
+      <w:r>
+        <w:rPr>
+          <w:rFonts w:ascii="David" w:cs="David" w:eastAsia="David" w:hAnsi="David"/>
+          <w:sz w:val="20"/>
+          <w:szCs w:val="20"/>
+          <w:rtl/>
+        </w:rPr>
+        <w:t xml:space="preserve">.</w:t>
+      </w:r>
+    </w:p>
+  </w:footnote>
+  <w:footnote w:id="101">
+    <w:p>
+      <w:pPr>
+        <w:bidi/>
+        <w:spacing w:after="60"/>
+      </w:pPr>
+      <w:r>
+        <w:rPr>
+          <w:rStyle w:val="FootnoteReference"/>
+        </w:rPr>
+        <w:footnoteRef/>
+      </w:r>
+      <w:r>
+        <w:rPr>
+          <w:rFonts w:ascii="David" w:cs="David" w:eastAsia="David" w:hAnsi="David"/>
+          <w:sz w:val="20"/>
+          <w:szCs w:val="20"/>
+          <w:rtl/>
+        </w:rPr>
         <w:t xml:space="preserve">עניין </w:t>
       </w:r>
       <w:r>
@@ -11127,7 +11240,7 @@
       </w:r>
     </w:p>
   </w:footnote>
-  <w:footnote w:id="101">
+  <w:footnote w:id="102">
     <w:p>
       <w:pPr>
         <w:bidi/>
@@ -11168,7 +11281,7 @@
       </w:r>
     </w:p>
   </w:footnote>
-  <w:footnote w:id="102">
+  <w:footnote w:id="103">
     <w:p>
       <w:pPr>
         <w:bidi/>
@@ -11215,7 +11328,7 @@
           <w:szCs w:val="20"/>
           <w:rtl/>
         </w:rPr>
-        <w:t xml:space="preserve">לעיל ה"ש 69</w:t>
+        <w:t xml:space="preserve">לעיל ה"ש 70</w:t>
       </w:r>
       <w:r>
         <w:rPr>
@@ -11225,33 +11338,33 @@
           <w:rtl/>
         </w:rPr>
         <w:t xml:space="preserve">.</w:t>
-      </w:r>
-    </w:p>
-  </w:footnote>
-  <w:footnote w:id="103">
-    <w:p>
-      <w:pPr>
-        <w:bidi/>
-        <w:spacing w:after="60"/>
-      </w:pPr>
-      <w:r>
-        <w:rPr>
-          <w:rStyle w:val="FootnoteReference"/>
-        </w:rPr>
-        <w:footnoteRef/>
-      </w:r>
-      <w:r>
-        <w:rPr>
-          <w:rFonts w:ascii="David" w:cs="David" w:eastAsia="David" w:hAnsi="David"/>
-          <w:sz w:val="20"/>
-          <w:szCs w:val="20"/>
-          <w:rtl/>
-        </w:rPr>
-        <w:t xml:space="preserve">לרפורמה המצרית ראו לעיל פרק ו.2.3.</w:t>
       </w:r>
     </w:p>
   </w:footnote>
   <w:footnote w:id="104">
+    <w:p>
+      <w:pPr>
+        <w:bidi/>
+        <w:spacing w:after="60"/>
+      </w:pPr>
+      <w:r>
+        <w:rPr>
+          <w:rStyle w:val="FootnoteReference"/>
+        </w:rPr>
+        <w:footnoteRef/>
+      </w:r>
+      <w:r>
+        <w:rPr>
+          <w:rFonts w:ascii="David" w:cs="David" w:eastAsia="David" w:hAnsi="David"/>
+          <w:sz w:val="20"/>
+          <w:szCs w:val="20"/>
+          <w:rtl/>
+        </w:rPr>
+        <w:t xml:space="preserve">לרפורמה המצרית ראו לעיל פרק ו.2.3.</w:t>
+      </w:r>
+    </w:p>
+  </w:footnote>
+  <w:footnote w:id="105">
     <w:p>
       <w:pPr>
         <w:bidi/>

</xml_diff>

<commit_message>
Rewrite the discussion chapter as continuous integrative prose
Replaced the three-subsection structure with four flowing paragraphs that
weave the doctrinal, evidentiary, fiscal and comparative findings into a
single argument: one self-feeding cycle, a two-faced assessment of the
case law, three comparative lessons, and interdependent reform directions.

Co-Authored-By: Claude Fable 5 <noreply@anthropic.com>
Claude-Session: https://claude.ai/code/session_01PTzmkyUzTNm9DT35momqLP
</commit_message>
<xml_diff>
--- a/seminar/סמינריון-מקרקעין-לא-רשומים.docx
+++ b/seminar/סמינריון-מקרקעין-לא-רשומים.docx
@@ -4200,25 +4200,6 @@
     </w:p>
     <w:p>
       <w:pPr>
-        <w:pStyle w:val="Heading2"/>
-        <w:bidi/>
-        <w:spacing w:after="180" w:before="280"/>
-      </w:pPr>
-      <w:r>
-        <w:rPr>
-          <w:rFonts w:ascii="David" w:cs="David" w:eastAsia="David" w:hAnsi="David"/>
-          <w:b/>
-          <w:bCs/>
-          <w:color w:val="000000"/>
-          <w:sz w:val="28"/>
-          <w:szCs w:val="28"/>
-          <w:rtl/>
-        </w:rPr>
-        <w:t xml:space="preserve">ז.1 חיבור הממצאים: שלוש השאלות ותשובה אחת</w:t>
-      </w:r>
-    </w:p>
-    <w:p>
-      <w:pPr>
         <w:bidi/>
         <w:spacing w:after="160" w:line="360"/>
         <w:ind w:firstLine="420"/>
@@ -4231,7 +4212,7 @@
           <w:szCs w:val="24"/>
           <w:rtl/>
         </w:rPr>
-        <w:t xml:space="preserve">שלוש שאלות המחקר, שנבחנו כל אחת בפרקה, מתבררות בדיעבד כשלושה פנים של תופעה אחת. הכלים המשפטיים והראייתיים (שאלה א; פרקים ג–ד) הם התגובה השיפוטית לחלל שיצר "מסך המרשם" (פרק א) בהיפגשו עם דפוסי הקניין של החברה הערבית (פרק ב); המשקל המוגבל־אך־ממשי של היתרי הבנייה והארנונה (שאלה ג; פרק ד) הוא תוצר של אותו חלל – בהיעדר תיעוד קנייני, התיעוד המנהלי הוא שנותר; ו"התניית הרישום" במס (שאלה ב; פרק ה) היא המנוע המבני המשמר את החלל ומזין את שתי התופעות האחרות. אין מדובר אפוא בשלוש בעיות נפרדות אלא במעגל אחד: חסם כניסה למרשם ← אי־רישום נמשך ← הסתמכות על תחליפים פרטיים ומנהליים ← סכסוך בין־דורי ← הכרעה שיפוטית בדיעבד ← פסק דין שאינו ניתן לרישום בשל החסם – וחוזר חלילה.</w:t>
+        <w:t xml:space="preserve">שלוש שאלות המחקר שהוצבו בפתח העבודה נבחנו כל אחת בפרקה, אך רק משמניחים את הממצאים זה לצד זה מתגלה כי אין מדובר בשלוש בעיות נפרדות אלא בשלושה פנים של תופעה אחת. הכלים המשפטיים והראייתיים שבהם מכריעים בתי המשפט – הזכות שביושר, ייפוי הכוח הבלתי חוזר, זעקת ההגינות והרישיון – הם התגובה השיפוטית לחלל שיצר "מסך המרשם" בהיפגשו עם דפוסי הקניין המשפחתיים של החברה הערבית; המשקל שניתן להיתרי הבנייה ולתשלומי הארנונה הוא תוצר של אותו חלל עצמו, שהרי בהיעדר תיעוד קנייני נותר רק התיעוד המנהלי; ו"התניית הרישום" במס היא המנוע המבני המשמר את החלל ומזין את שתי התופעות האחרות. נוצר מעגל שלם וסגור: חסם הכניסה למרשם מנציח את אי־הרישום; אי־הרישום דוחק את המשפחות אל תחליפים פרטיים ומנהליים; התחליפים קורסים בחילופי הדורות אל תוך סכסוך; הסכסוך מוכרע בדיעבד בכלי היושר; ואף פסק הדין שבסוף הדרך אינו ניתן לרישום, שכן החסם הפיסקלי עודנו ניצב על מכונו – והמעגל שב ומתחיל. ההשוואה לימדה שהמעגל הזה אינו ייחודי לישראל: מצרים נקלעה אליו בממדים לאומיים, אנגליה נמנעה ממנו בזכות מרשם זול ונגיש ודיני יושר מפותחים, והמשפט השרעי, שקדם למרשם, כלל לא נזקק לו. ייחודו הישראלי של המעגל הוא בכך שהוא פוגע באוכלוסייה מובחנת, בעוד הדין הכללי מתפקד היטב עבור השוק המסחרי – כשל שהוא, במונחי פרק א, חלוקתי במהותו.</w:t>
       </w:r>
     </w:p>
     <w:p>
@@ -4248,26 +4229,37 @@
           <w:szCs w:val="24"/>
           <w:rtl/>
         </w:rPr>
-        <w:t xml:space="preserve">ההשוואה (פרק ו) מיקמה את המעגל הזה בהקשר: הוא איננו ייחודי לישראל. מצרים נקלעה למעגל זהה בממדים לאומיים; אנגליה נמנעה ממנו בזכות מרשם זול ונגיש ודיני יושר מפותחים; והמשפט השרעי, שקדם למרשם, כלל לא הכיר בו כתנאי להקניה. הייחוד הישראלי הוא בכך שהמעגל פוגע באוכלוסייה מובחנת – החברה הערבית – בעוד שהדין הכללי מתפקד היטב עבור השוק המסחרי; כשל שהוא, במונחי פרק א, חלוקתי במהותו.</w:t>
-      </w:r>
-    </w:p>
-    <w:p>
-      <w:pPr>
-        <w:pStyle w:val="Heading2"/>
-        <w:bidi/>
-        <w:spacing w:after="180" w:before="280"/>
-      </w:pPr>
-      <w:r>
-        <w:rPr>
-          <w:rFonts w:ascii="David" w:cs="David" w:eastAsia="David" w:hAnsi="David"/>
-          <w:b/>
-          <w:bCs/>
-          <w:color w:val="000000"/>
-          <w:sz w:val="28"/>
-          <w:szCs w:val="28"/>
-          <w:rtl/>
-        </w:rPr>
-        <w:t xml:space="preserve">ז.2 הערכה ביקורתית: גמישות שיפוטית כתחליף למדיניות</w:t>
+        <w:t xml:space="preserve">על רקע התמונה המשולבת הזו יש להעריך את ההישג הפסיקתי, וההערכה חייבת להיות כפולת פנים. במישור המקרה הבודד לפנינו הצלחה מרשימה: הפסיקה מנעה אינספור תוצאות בלתי צודקות – מהכרה בזכותה שביושר של רוכשת שהחזיקה בדירתה חמישים שנה בלא רישום,</w:t>
+      </w:r>
+      <w:r>
+        <w:rPr>
+          <w:rStyle w:val="FootnoteReference"/>
+        </w:rPr>
+        <w:footnoteReference w:id="101"/>
+      </w:r>
+      <w:r>
+        <w:rPr>
+          <w:rFonts w:ascii="David" w:cs="David" w:eastAsia="David" w:hAnsi="David"/>
+          <w:sz w:val="24"/>
+          <w:szCs w:val="24"/>
+          <w:rtl/>
+        </w:rPr>
+        <w:t xml:space="preserve"> ועד ביטול רישום מאוחר שנעשה תוך עקיפת ייפוי כוח משפחתי מוקדם.</w:t>
+      </w:r>
+      <w:r>
+        <w:rPr>
+          <w:rStyle w:val="FootnoteReference"/>
+        </w:rPr>
+        <w:footnoteReference w:id="102"/>
+      </w:r>
+      <w:r>
+        <w:rPr>
+          <w:rFonts w:ascii="David" w:cs="David" w:eastAsia="David" w:hAnsi="David"/>
+          <w:sz w:val="24"/>
+          <w:szCs w:val="24"/>
+          <w:rtl/>
+        </w:rPr>
+        <w:t xml:space="preserve"> ואולם דווקא הצלחה נקודתית זו מסתירה כישלון מערכתי, הנגלה רק במבט אינטגרטיבי. ראשית, כל אחד מן הכלים הוא חריג שנבנה על חריג – "זעקת ההגינות" מותנית ב"מקרים מיוחדים" שאין להם הגדרה, אי־הדירותו של רישיון תלויה בשקילה בדיעבד של השקעה וציפייה, וסיווגו של ייפוי כוח כמסמך עסקה תלוי בניסוחו של נוטריון משנות השבעים – ומשטר הנשען כולו על הערכה שיפוטית בדיעבד של הגינות והסתמכות מייצר תוצאות בלתי צפויות, המשתנות מתיק לתיק. שנית, אי־הוודאות הזו אינה נייטרלית להתנהגות הצדדים: מי שסבור כי יזכה בדין אינו ממהר להתפשר, ומי שאינו יודע את מעמדו אינו יכול לתמחר אותו, כך שהגמישות שנועדה לעשות צדק מוסיפה בעצמה דלק להתדיינות. ושלישית – וזה החיבור שבין פרק ג לפרק ה, שאין להבינו אלא במשולב – הכלים כולם פועלים במישור הבין־אישי ואינם מייצרים רישום: הזוכה המושלם, שהוכיח את עסקתו וזכה להצהרה על זכויותיו, נותר עומד לפני אותו מחסום מס שהרתיע את אביו ואת סבו לפניו, ופסק דינו הופך לנכס משפחתי נוסף שאינו רשום. הפסיקה מטפלת אפוא בסימפטום – הסכסוך שהבשיל – ואין בכוחה לטפל בגורם: מבנה תמריצים המרחיק את החברה הערבית מן המרשם.</w:t>
       </w:r>
     </w:p>
     <w:p>
@@ -4284,7 +4276,22 @@
           <w:szCs w:val="24"/>
           <w:rtl/>
         </w:rPr>
-        <w:t xml:space="preserve">האם ארגז הכלים הפסיקתי הוא הצלחה? התשובה כפולה. במישור המקרה הבודד – הצלחה מרשימה: הפסיקה מנעה אינספור תוצאות בלתי צודקות, מהכרה בזכות שביושר של רוכשת בת חמישים שנה בעניין </w:t>
+        <w:t xml:space="preserve">המבט ההשוואתי מעניק לביקורת הזו גם קנה מידה וגם כיוון. מן הדין האנגלי עולה כי גמישות שיפוטית אינה חייבת להיות חסרת צורה: ההשתק הקנייני, שצמח בדיוק באותם סכסוכי משק משפחתי שאנו דנים בהם, אינו "זעקה" עמומה אלא עילה סדורה בת יסודות מוגדרים – הבטחה, הסתמכות, שינוי מצב לרעה ואי־מצפוניות שבהתכחשות – שסעדיה נדונים אף הם במסגרת שהתווה בית המשפט העליון הבריטי בפסיקה עקבית.</w:t>
+      </w:r>
+      <w:r>
+        <w:rPr>
+          <w:rStyle w:val="FootnoteReference"/>
+        </w:rPr>
+        <w:footnoteReference w:id="103"/>
+      </w:r>
+      <w:r>
+        <w:rPr>
+          <w:rFonts w:ascii="David" w:cs="David" w:eastAsia="David" w:hAnsi="David"/>
+          <w:sz w:val="24"/>
+          <w:szCs w:val="24"/>
+          <w:rtl/>
+        </w:rPr>
+        <w:t xml:space="preserve"> הלכת </w:t>
       </w:r>
       <w:r>
         <w:rPr>
@@ -4295,37 +4302,16 @@
           <w:szCs w:val="24"/>
           <w:rtl/>
         </w:rPr>
-        <w:t xml:space="preserve">צימבלר</w:t>
-      </w:r>
-      <w:r>
-        <w:rPr>
-          <w:rStyle w:val="FootnoteReference"/>
-        </w:rPr>
-        <w:footnoteReference w:id="101"/>
-      </w:r>
-      <w:r>
-        <w:rPr>
-          <w:rFonts w:ascii="David" w:cs="David" w:eastAsia="David" w:hAnsi="David"/>
-          <w:sz w:val="24"/>
-          <w:szCs w:val="24"/>
-          <w:rtl/>
-        </w:rPr>
-        <w:t xml:space="preserve"> ועד ביטול רישום מאוחר שנעשה תוך עקיפת ייפוי כוח משפחתי מוקדם.</w:t>
-      </w:r>
-      <w:r>
-        <w:rPr>
-          <w:rStyle w:val="FootnoteReference"/>
-        </w:rPr>
-        <w:footnoteReference w:id="102"/>
-      </w:r>
-      <w:r>
-        <w:rPr>
-          <w:rFonts w:ascii="David" w:cs="David" w:eastAsia="David" w:hAnsi="David"/>
-          <w:sz w:val="24"/>
-          <w:szCs w:val="24"/>
-          <w:rtl/>
-        </w:rPr>
-        <w:t xml:space="preserve"> במישור המערכתי – כישלון עקרוני, משלושה טעמים. ראשית, אי־ודאות: משטר הנשען על "זעקת ההגינות", על מבחני הסתמכות ועל שיקול דעת רחב מייצר תוצאות בלתי צפויות, המשתנות מתיק לתיק ומרתיעות הסדרה מוקדמת – שהרי מי שסבור כי יזכה בדין אינו ממהר להתפשר, ומי שאינו יודע את מעמדו אינו יכול לתמחר אותו. שנית, תלות באשם: הכלים הפסיקתיים מכוונים כולם להתנהגות – מי הסתמך, מי התכחש, מי נהג בחוסר תום לב – ולכן הם רגישים לנרטיב המשפחתי ולעיצובו בדיעבד, במקום להיאחז בעובדות מבניות הניתנות להוכחה. שלישית, וחשוב מכל: הכלים אינם מייצרים רישום. גם הזוכה המושלם נותר מחוץ לטאבו, ופסק דינו – נכס נוסף במשפחה שאינו רשום.</w:t>
+        <w:t xml:space="preserve">קלמר</w:t>
+      </w:r>
+      <w:r>
+        <w:rPr>
+          <w:rFonts w:ascii="David" w:cs="David" w:eastAsia="David" w:hAnsi="David"/>
+          <w:sz w:val="24"/>
+          <w:szCs w:val="24"/>
+          <w:rtl/>
+        </w:rPr>
+        <w:t xml:space="preserve"> הישראלית עושה, כפי שנוכחנו, את אותה מלאכה פונקציונלית – אך בלא המסגרת, ולכן בלא היכולת לבקר את הפעלתה ביקורת ערעורית אפקטיבית ובלא שהציבור יכול לכלכל צעדיו על פיה. מן הדין המצרי עולה הלקח ההפוך, והוא נוקב לא פחות: מקום שהמחוקק אינו מתקן את החסם המבני, שום תחכום של תחליפים – תַוְכּיל, תביעות אימות, ואפילו התיישנות רוכשת סטטוטורית – אינו בולם את קריסת המרשם, ותשעים אחוזי אי־רישום הם עדות לכך; ומשהבינה זאת מצרים, בחרה ברפורמת 2022 לוותר על מנוף הגבייה כדי להציל את הפנקס. ומן המשפט השרעי עולה תובנה שלישית, עמוקה משתיהן: שיטה יכולה להשתית יציבות קניינית על עובדה חברתית גלויה – התפיסה – ולא על פנקס; ובחברה שבה ההחזקה הגלויה, הידועה לכל בני החמולה, היא עדיין מוסד חברתי חי, יש בתובנה זו כדי להצדיק – לא אימוץ הדוקטרינה כלשונה, אלא – מתן משקל ראייתי ומהותי גדול בהרבה להחזקה ארוכת שנים שאין חולק עליה, ברוח סעיף 78 לחוק הקרקעות העות׳מאני, שהפך חזקה מעובדת לזכות רישום ולא להפך.</w:t>
       </w:r>
     </w:p>
     <w:p>
@@ -4342,69 +4328,7 @@
           <w:szCs w:val="24"/>
           <w:rtl/>
         </w:rPr>
-        <w:t xml:space="preserve">על רקע זה מתחדד לקח המשפט המשווה. הדין האנגלי מלמד כי אפשר לתת לגמישות השיפוטית מסגרת דוקטרינרית יציבה: ההשתק הקנייני איננו "זעקה" חסרת גבולות אלא עילה סדורה – הבטחה, הסתמכות, שינוי מצב לרעה, אי־מצפוניות – שסעדיה נדונים אף הם במסגרת שנקבעה בפסיקה עליונה עקבית.</w:t>
-      </w:r>
-      <w:r>
-        <w:rPr>
-          <w:rStyle w:val="FootnoteReference"/>
-        </w:rPr>
-        <w:footnoteReference w:id="103"/>
-      </w:r>
-      <w:r>
-        <w:rPr>
-          <w:rFonts w:ascii="David" w:cs="David" w:eastAsia="David" w:hAnsi="David"/>
-          <w:sz w:val="24"/>
-          <w:szCs w:val="24"/>
-          <w:rtl/>
-        </w:rPr>
-        <w:t xml:space="preserve"> הדין המצרי מלמד את ההפך: היכן שהמחוקק אינו מתקן את החסם המבני, אף מערכת תחליפים משוכללת (תַוְכּיל, תביעות אימות) אינה בולמת את קריסת המרשם. והמשפט השרעי מלמד כי שיטה יכולה להשתית יציבות קניינית על עובדה חברתית גלויה – התפיסה – ולא על פנקס; לקח שאין לאמצו כלשונו, אך יש בו כדי להצדיק מתן משקל ראייתי ומהותי גדול יותר להחזקה ארוכת שנים שאין חולק עליה.</w:t>
-      </w:r>
-    </w:p>
-    <w:p>
-      <w:pPr>
-        <w:pStyle w:val="Heading2"/>
-        <w:bidi/>
-        <w:spacing w:after="180" w:before="280"/>
-      </w:pPr>
-      <w:r>
-        <w:rPr>
-          <w:rFonts w:ascii="David" w:cs="David" w:eastAsia="David" w:hAnsi="David"/>
-          <w:b/>
-          <w:bCs/>
-          <w:color w:val="000000"/>
-          <w:sz w:val="28"/>
-          <w:szCs w:val="28"/>
-          <w:rtl/>
-        </w:rPr>
-        <w:t xml:space="preserve">ז.3 כיווני תיקון</w:t>
-      </w:r>
-    </w:p>
-    <w:p>
-      <w:pPr>
-        <w:bidi/>
-        <w:spacing w:after="160" w:line="360"/>
-        <w:ind w:firstLine="420"/>
-        <w:jc w:val="both"/>
-      </w:pPr>
-      <w:r>
-        <w:rPr>
-          <w:rFonts w:ascii="David" w:cs="David" w:eastAsia="David" w:hAnsi="David"/>
-          <w:b/>
-          <w:bCs/>
-          <w:sz w:val="24"/>
-          <w:szCs w:val="24"/>
-          <w:rtl/>
-        </w:rPr>
-        <w:t xml:space="preserve">במישור החקיקתי־פיסקלי: </w:t>
-      </w:r>
-      <w:r>
-        <w:rPr>
-          <w:rFonts w:ascii="David" w:cs="David" w:eastAsia="David" w:hAnsi="David"/>
-          <w:sz w:val="24"/>
-          <w:szCs w:val="24"/>
-          <w:rtl/>
-        </w:rPr>
-        <w:t xml:space="preserve">הניסיון המצרי – שבו ניתוק הרישום מתשלום מס העסקה וקיצוץ האגרות היו לב הרפורמה של 2022 – מצביע על הכיוון: הוראת שעה להסדרת עסקאות פנים־משפחתיות היסטוריות, שתכלול תקרת חבות, ויתור על קנסות וריבית (להבדיל מן הקרן), ומסלול שומה מקוצר לעסקאות שמסמכיהן אבדו. עלות הוויתור הפיסקלי נמוכה ממה שנדמה: המס ההיסטורי ממילא אינו נגבה בפועל, שכן העסקאות אינן מדווחות; ואילו התועלת – הכנסת דור שלם של נכסים למרשם ולבסיס המס העתידי – ניכרת.</w:t>
+        <w:t xml:space="preserve">משלושת הלקחים הללו נגזרים, במהלך אחד, כיווני התיקון – והם חייבים לפעול בשלושת המישורים בעת ובעונה אחת, שכן המעגל שתואר לעיל אינו ניתן לשבירה בנקודה אחת בלבד. במישור החקיקתי־פיסקלי, פריצת המעגל מתחילה בנקודה שזיהתה מצרים: הוראת שעה להסדרת עסקאות פנים־משפחתיות היסטוריות, שתכלול ויתור על קנסות וריבית (להבדיל מקרן המס), תקרת חבות ומסלול שומה מקוצר לעסקאות שמסמכיהן אבדו. עלות הוויתור נמוכה משנדמה – המס ההיסטורי ממילא אינו נגבה, שכן העסקאות אינן מדווחות – ואילו התועלת, הכנסת דור שלם של נכסים למרשם ולבסיס המס העתידי, ניכרת.</w:t>
       </w:r>
       <w:r>
         <w:rPr>
@@ -4412,33 +4336,14 @@
         </w:rPr>
         <w:footnoteReference w:id="104"/>
       </w:r>
-    </w:p>
-    <w:p>
-      <w:pPr>
-        <w:bidi/>
-        <w:spacing w:after="160" w:line="360"/>
-        <w:ind w:firstLine="420"/>
-        <w:jc w:val="both"/>
-      </w:pPr>
-      <w:r>
-        <w:rPr>
-          <w:rFonts w:ascii="David" w:cs="David" w:eastAsia="David" w:hAnsi="David"/>
-          <w:b/>
-          <w:bCs/>
-          <w:sz w:val="24"/>
-          <w:szCs w:val="24"/>
-          <w:rtl/>
-        </w:rPr>
-        <w:t xml:space="preserve">במישור המוסדי: </w:t>
-      </w:r>
-      <w:r>
-        <w:rPr>
-          <w:rFonts w:ascii="David" w:cs="David" w:eastAsia="David" w:hAnsi="David"/>
-          <w:sz w:val="24"/>
-          <w:szCs w:val="24"/>
-          <w:rtl/>
-        </w:rPr>
-        <w:t xml:space="preserve">השלמת הליכי הסדר הזכויות ביישובים הערביים שבהם לא הושלמו, הפעם בשיתוף הקהילות ובהכרה מפורשת בראיות ההחזקה והתיעוד המסורתיות – ולא בהתעלמות מהן, שהניסיון ההיסטורי מלמד כי היא שמנעה השתתפות מלכתחילה. במקביל, ראוי לשקול מסלול "רישום ראשון מוסכם" לחלוקות משפחתיות שאין עליהן מחלוקת פנימית, שיאפשר קיבוע הסכמות בעודן חיות – בטרם ייהפכו, בדור הבא, לסכסוך.</w:t>
+      <w:r>
+        <w:rPr>
+          <w:rFonts w:ascii="David" w:cs="David" w:eastAsia="David" w:hAnsi="David"/>
+          <w:sz w:val="24"/>
+          <w:szCs w:val="24"/>
+          <w:rtl/>
+        </w:rPr>
+        <w:t xml:space="preserve"> במישור המוסדי, יש להשלים את הליכי הסדר הזכויות ביישובים הערביים שבהם לא הושלמו – הפעם בשיתוף הקהילות ובהכרה מפורשת בראיות ההחזקה והתיעוד המסורתיות, שההתעלמות מהן היא שהרחיקה את הציבור מן ההליכים מלכתחילה – ולצדם לשקול מסלול "רישום ראשון מוסכם" לחלוקות משפחתיות שאין עליהן מחלוקת, שיקבע את ההסכמות בעודן חיות, בטרם ייהפכו בדור הבא לסכסוך.</w:t>
       </w:r>
       <w:r>
         <w:rPr>
@@ -4446,33 +4351,14 @@
         </w:rPr>
         <w:footnoteReference w:id="105"/>
       </w:r>
-    </w:p>
-    <w:p>
-      <w:pPr>
-        <w:bidi/>
-        <w:spacing w:after="160" w:line="360"/>
-        <w:ind w:firstLine="420"/>
-        <w:jc w:val="both"/>
-      </w:pPr>
-      <w:r>
-        <w:rPr>
-          <w:rFonts w:ascii="David" w:cs="David" w:eastAsia="David" w:hAnsi="David"/>
-          <w:b/>
-          <w:bCs/>
-          <w:sz w:val="24"/>
-          <w:szCs w:val="24"/>
-          <w:rtl/>
-        </w:rPr>
-        <w:t xml:space="preserve">במישור השיפוטי: </w:t>
-      </w:r>
-      <w:r>
-        <w:rPr>
-          <w:rFonts w:ascii="David" w:cs="David" w:eastAsia="David" w:hAnsi="David"/>
-          <w:sz w:val="24"/>
-          <w:szCs w:val="24"/>
-          <w:rtl/>
-        </w:rPr>
-        <w:t xml:space="preserve">עיגון גלוי של המדרג הראייתי שהותווה בפרק ד, והכרה מפורשת בכך שבסכסוכים אלה היעדר מסמכים ואי־דיווח היסטורי הם נורמה תרבותית ואינם אינדיקציה לחוסר אמינות. כן ראוי לשקול, ברוח הדין האנגלי, המשגה סדורה של "השתק קנייני ישראלי": מסגרת בת ארבעה יסודות – הבטחה או הסכמה משפחתית, הסתמכות, שינוי מצב, ואי־צדק בהתכחשות – שתחליף את הפנייה הבלתי ממושמעת ל"זעקת ההגינות" ותאפשר ביקורת ערעורית אפקטיבית. לבסוף, בתי המשפט לענייני משפחה – שערכאתם היא הזירה המרכזית של סכסוכים אלה – ראויים לכלים מנהליים משלימים: סמכות מפורשת להורות, אגב פסק הדין, על השלמת הרישום בכפוף להסדרת מס במתווה שייקבע, כדי שפסק הדין לא יישאר אף הוא "זכות שאינה רשומה".</w:t>
+      <w:r>
+        <w:rPr>
+          <w:rFonts w:ascii="David" w:cs="David" w:eastAsia="David" w:hAnsi="David"/>
+          <w:sz w:val="24"/>
+          <w:szCs w:val="24"/>
+          <w:rtl/>
+        </w:rPr>
+        <w:t xml:space="preserve"> ובמישור השיפוטי, ראוי לעגן בגלוי את המדרג הראייתי שהותווה בפרק ד ולהכיר בכך שהיעדר מסמכים ואי־דיווח היסטורי הם בהקשר זה נורמה תרבותית ואינם אינדיקציה לחוסר אמינות; להמשיג, ברוח הדין האנגלי, "השתק קנייני ישראלי" בן ארבעה יסודות שיחליף את הפנייה הבלתי ממושמעת לזעקת ההגינות; ולהקנות לבתי המשפט לענייני משפחה – הזירה המרכזית של סכסוכים אלה – סמכות מפורשת להורות, אגב פסק הדין, על השלמת הרישום בכפוף להסדרת המס במתווה שייקבע, כדי שפסק הדין עצמו לא יישאר זכות שאינה רשומה. שלושת המישורים תלויים זה בזה: בלא ההקלה הפיסקלית יישאר העיגון השיפוטי הצהרתי; בלא המסגור הדוקטרינרי תישאר ההקלה הפיסקלית בלתי מנוצלת בידי מי שאינו יכול להוכיח את עסקתו; ובלא השלמת ההסדר יוסיף כל דור להוריש לדור הבא סכסוך גדול משהוריש לו קודמו. רק פעולה משולבת תהפוך את הדרך אל המרשם מחומה – לגשר.</w:t>
       </w:r>
     </w:p>
     <w:p>
@@ -11305,8 +11191,6 @@
       <w:r>
         <w:rPr>
           <w:rFonts w:ascii="Times New Roman" w:cs="Times New Roman" w:eastAsia="Times New Roman" w:hAnsi="Times New Roman"/>
-          <w:i w:val="false"/>
-          <w:iCs w:val="false"/>
           <w:sz w:val="20"/>
           <w:szCs w:val="20"/>
         </w:rPr>
@@ -11360,7 +11244,7 @@
           <w:szCs w:val="20"/>
           <w:rtl/>
         </w:rPr>
-        <w:t xml:space="preserve">לרפורמה המצרית ראו לעיל פרק ו.2.3.</w:t>
+        <w:t xml:space="preserve">לרפורמה המצרית ראו לעיל פרק ו.2.4.</w:t>
       </w:r>
     </w:p>
   </w:footnote>
@@ -11383,7 +11267,7 @@
           <w:szCs w:val="20"/>
           <w:rtl/>
         </w:rPr>
-        <w:t xml:space="preserve">להצעות ברוח זו בהקשר הבדווי וההסדרי השוו יפתחאל, קדר ואמארה, וכן לוין-שנור, הנזכרים לעיל בפרק ב.</w:t>
+        <w:t xml:space="preserve">להצעות ברוח זו בהקשר ההסדרי השוו יפתחאל, קדר ואמארה, וכן לוין-שנור, הנזכרים לעיל בפרק ב.</w:t>
       </w:r>
     </w:p>
   </w:footnote>

</xml_diff>

<commit_message>
Integrate ten additional on-point decisions on unregistered land in intra-family disputes
Rewrote section on courts' practice around two poles: recognition of proven
transactions (Abu Ganima, Mashal) versus refusal to derive ownership from
custom and possession alone (G.S., V.A. v. K.A., Kabha), with the further
boundaries: no proprietary relief absent the registered owner as a party
(with resource-balancing compensation), family trust claims against
conclusive registration (Hadera), jurisdiction (Alush), and the heavy
burden against estates (Hoch, added to the evidence chapter). Fixed the
G.S. decision date to 14.4.2021 and updated the bibliography.

Co-Authored-By: Claude Fable 5 <noreply@anthropic.com>
Claude-Session: https://claude.ai/code/session_01PTzmkyUzTNm9DT35momqLP
</commit_message>
<xml_diff>
--- a/seminar/סמינריון-מקרקעין-לא-רשומים.docx
+++ b/seminar/סמינריון-מקרקעין-לא-רשומים.docx
@@ -1779,7 +1779,13 @@
           <w:szCs w:val="24"/>
           <w:rtl/>
         </w:rPr>
-        <w:t xml:space="preserve"> זהו היפוך מרשים של נקודת המוצא הרישומית: המסמך הבלתי רשום מכריע את הרישום, מכוח סעיף 9 לחוק המקרקעין ועקרון תום הלב.</w:t>
+        <w:t xml:space="preserve"> זהו היפוך מרשים של נקודת המוצא הרישומית: המסמך הבלתי רשום מכריע את הרישום, מכוח סעיף 9 לחוק המקרקעין ועקרון תום הלב. ומנגד, יש לזכור את הגבול: מקום שהדין החל מתנה את השלמת ההקניה ברישום, נפסק כי מסמך מתנה, מסירת חזקה ואף בנייה על הקרקע אינם משלימים את ההעברה, והזכויות נותרות בידי המקנה ועוברות במותו ליורשיו.</w:t>
+      </w:r>
+      <w:r>
+        <w:rPr>
+          <w:rStyle w:val="FootnoteReference"/>
+        </w:rPr>
+        <w:footnoteReference w:id="36"/>
       </w:r>
     </w:p>
     <w:p>
@@ -1802,7 +1808,7 @@
         <w:rPr>
           <w:rStyle w:val="FootnoteReference"/>
         </w:rPr>
-        <w:footnoteReference w:id="36"/>
+        <w:footnoteReference w:id="37"/>
       </w:r>
       <w:r>
         <w:rPr>
@@ -1853,7 +1859,7 @@
         <w:rPr>
           <w:rStyle w:val="FootnoteReference"/>
         </w:rPr>
-        <w:footnoteReference w:id="37"/>
+        <w:footnoteReference w:id="38"/>
       </w:r>
       <w:r>
         <w:rPr>
@@ -1868,7 +1874,7 @@
         <w:rPr>
           <w:rStyle w:val="FootnoteReference"/>
         </w:rPr>
-        <w:footnoteReference w:id="38"/>
+        <w:footnoteReference w:id="39"/>
       </w:r>
     </w:p>
     <w:p>
@@ -1891,7 +1897,7 @@
         <w:rPr>
           <w:rStyle w:val="FootnoteReference"/>
         </w:rPr>
-        <w:footnoteReference w:id="39"/>
+        <w:footnoteReference w:id="40"/>
       </w:r>
       <w:r>
         <w:rPr>
@@ -1962,7 +1968,7 @@
         <w:rPr>
           <w:rStyle w:val="FootnoteReference"/>
         </w:rPr>
-        <w:footnoteReference w:id="40"/>
+        <w:footnoteReference w:id="41"/>
       </w:r>
       <w:r>
         <w:rPr>
@@ -1977,7 +1983,7 @@
         <w:rPr>
           <w:rStyle w:val="FootnoteReference"/>
         </w:rPr>
-        <w:footnoteReference w:id="41"/>
+        <w:footnoteReference w:id="42"/>
       </w:r>
     </w:p>
     <w:p>
@@ -1996,7 +2002,7 @@
           <w:szCs w:val="28"/>
           <w:rtl/>
         </w:rPr>
-        <w:t xml:space="preserve">ג.7 בתי המשפט לענייני משפחה: המלאכה הלכה למעשה</w:t>
+        <w:t xml:space="preserve">ג.7 הפסיקה הלכה למעשה: בין הכרה בעסקה מוכחת לדחיית טענת המנהג</w:t>
       </w:r>
     </w:p>
     <w:p>
@@ -2013,22 +2019,160 @@
           <w:szCs w:val="24"/>
           <w:rtl/>
         </w:rPr>
-        <w:t xml:space="preserve">בערכאות המשפחה בצפון הארץ נפגשים כל הכלים הללו במקרים חיים. הכרעות בתי המשפט לענייני משפחה בנצרת מדגימות את המלאכה: שחזור עסקאות בנות עשרות שנים מתוך צירוף של ייפוי כוח ותיק, עדויות זקני המשפחה, וראיות שימוש והחזקה מתמשכות – תוך יישום דרישת הסיוע בתביעות נגד עיזבון וזהירות ראייתית מוקפדת.</w:t>
-      </w:r>
-      <w:r>
-        <w:rPr>
-          <w:rStyle w:val="FootnoteReference"/>
-        </w:rPr>
-        <w:footnoteReference w:id="42"/>
-      </w:r>
-      <w:r>
-        <w:rPr>
-          <w:rFonts w:ascii="David" w:cs="David" w:eastAsia="David" w:hAnsi="David"/>
-          <w:sz w:val="24"/>
-          <w:szCs w:val="24"/>
-          <w:rtl/>
-        </w:rPr>
-        <w:t xml:space="preserve"> למשקלם המדויק של היתרי הבנייה, הארנונה והמסמכים ההיסטוריים – חומר הגלם הראייתי של הכרעות אלה – יוקדש פרק ד.</w:t>
+        <w:t xml:space="preserve">בפסיקה העדכנית – בבית המשפט העליון כבערכאות המשפחה – מסתמנים שני קטבים ברורים. בקוטב האחד, נכונות מלאה להכיר בזכויות במקרקעין בלתי רשומים מקום שהעסקה עצמה הוכחה: בעניין </w:t>
+      </w:r>
+      <w:r>
+        <w:rPr>
+          <w:rFonts w:ascii="David" w:cs="David" w:eastAsia="David" w:hAnsi="David"/>
+          <w:i/>
+          <w:iCs/>
+          <w:sz w:val="24"/>
+          <w:szCs w:val="24"/>
+          <w:rtl/>
+        </w:rPr>
+        <w:t xml:space="preserve">עיזבון אבו ג׳נימה</w:t>
+      </w:r>
+      <w:r>
+        <w:rPr>
+          <w:rFonts w:ascii="David" w:cs="David" w:eastAsia="David" w:hAnsi="David"/>
+          <w:sz w:val="24"/>
+          <w:szCs w:val="24"/>
+          <w:rtl/>
+        </w:rPr>
+        <w:t xml:space="preserve"> אישר בית המשפט העליון ממצאים בדבר עסקת מכר במקרקעין בלתי רשומים שהתבססו על עדות ישירה, הודאות בעלי דין, החזקה ממושכת וראיות נסיבתיות;</w:t>
+      </w:r>
+      <w:r>
+        <w:rPr>
+          <w:rStyle w:val="FootnoteReference"/>
+        </w:rPr>
+        <w:footnoteReference w:id="43"/>
+      </w:r>
+      <w:r>
+        <w:rPr>
+          <w:rFonts w:ascii="David" w:cs="David" w:eastAsia="David" w:hAnsi="David"/>
+          <w:sz w:val="24"/>
+          <w:szCs w:val="24"/>
+          <w:rtl/>
+        </w:rPr>
+        <w:t xml:space="preserve"> ובעניין </w:t>
+      </w:r>
+      <w:r>
+        <w:rPr>
+          <w:rFonts w:ascii="David" w:cs="David" w:eastAsia="David" w:hAnsi="David"/>
+          <w:i/>
+          <w:iCs/>
+          <w:sz w:val="24"/>
+          <w:szCs w:val="24"/>
+          <w:rtl/>
+        </w:rPr>
+        <w:t xml:space="preserve">משעל</w:t>
+      </w:r>
+      <w:r>
+        <w:rPr>
+          <w:rFonts w:ascii="David" w:cs="David" w:eastAsia="David" w:hAnsi="David"/>
+          <w:sz w:val="24"/>
+          <w:szCs w:val="24"/>
+          <w:rtl/>
+        </w:rPr>
+        <w:t xml:space="preserve"> התקבלה תביעה הצהרתית של בני משפחה תוך הדגשה כי בהיעדר רישום יש לבחון את החלוקה ההסכמית ואת הראיות שבין הצדדים, בלא להטיל על הטוען לזכות נטל שאין הדין מטיל עליו.</w:t>
+      </w:r>
+      <w:r>
+        <w:rPr>
+          <w:rStyle w:val="FootnoteReference"/>
+        </w:rPr>
+        <w:footnoteReference w:id="44"/>
+      </w:r>
+      <w:r>
+        <w:rPr>
+          <w:rFonts w:ascii="David" w:cs="David" w:eastAsia="David" w:hAnsi="David"/>
+          <w:sz w:val="24"/>
+          <w:szCs w:val="24"/>
+          <w:rtl/>
+        </w:rPr>
+        <w:t xml:space="preserve"> בקוטב הנגדי, סירוב עקבי להפוך מנהג והחזקה כשלעצמם לבעלות: בית המשפט לענייני משפחה בנצרת דחה במפורש טענה להקניית בעלות מכוח "מנהג במגזר הערבי" והחזקה ממושכת, בקבעו כי הסכמות בעל־פה ומנהג אינם גוברים על הדין הישראלי ואינם מצדיקים הצהרת בעלות בלא תשתית משפטית וראייתית;</w:t>
+      </w:r>
+      <w:r>
+        <w:rPr>
+          <w:rStyle w:val="FootnoteReference"/>
+        </w:rPr>
+        <w:footnoteReference w:id="45"/>
+      </w:r>
+      <w:r>
+        <w:rPr>
+          <w:rFonts w:ascii="David" w:cs="David" w:eastAsia="David" w:hAnsi="David"/>
+          <w:sz w:val="24"/>
+          <w:szCs w:val="24"/>
+          <w:rtl/>
+        </w:rPr>
+        <w:t xml:space="preserve"> ובאותה רוח נפסק כי כלה שהתגוררה שנים בדירת חמהּ מכוח רשות שימוש אינה רוכשת בעלות מכוח המגורים או המנהג המשפחתי, וניתן להורות על סילוק ידה בכפוף לפיצוי על השקעות שהוכחו.</w:t>
+      </w:r>
+      <w:r>
+        <w:rPr>
+          <w:rStyle w:val="FootnoteReference"/>
+        </w:rPr>
+        <w:footnoteReference w:id="46"/>
+      </w:r>
+    </w:p>
+    <w:p>
+      <w:pPr>
+        <w:bidi/>
+        <w:spacing w:after="160" w:line="360"/>
+        <w:ind w:firstLine="420"/>
+        <w:jc w:val="both"/>
+      </w:pPr>
+      <w:r>
+        <w:rPr>
+          <w:rFonts w:ascii="David" w:cs="David" w:eastAsia="David" w:hAnsi="David"/>
+          <w:sz w:val="24"/>
+          <w:szCs w:val="24"/>
+          <w:rtl/>
+        </w:rPr>
+        <w:t xml:space="preserve">בין הקטבים משורטטים גבולות דיוניים ומהותיים נוספים. תביעה קניינית לא תוכרע בהיעדר בעל הזכות הרשום: כאשר דירת המגורים רשומה על שם אבי הבעל, אין האישה יכולה לזכות בסעד קנייני בהליך שבין בני הזוג בלבד – אך בית המשפט הכיר באפשרות לפצותה כספית, במסגרת איזון המשאבים, על אובדן זכות דיור שהתבססה במהלך הנישואין.</w:t>
+      </w:r>
+      <w:r>
+        <w:rPr>
+          <w:rStyle w:val="FootnoteReference"/>
+        </w:rPr>
+        <w:footnoteReference w:id="47"/>
+      </w:r>
+      <w:r>
+        <w:rPr>
+          <w:rFonts w:ascii="David" w:cs="David" w:eastAsia="David" w:hAnsi="David"/>
+          <w:sz w:val="24"/>
+          <w:szCs w:val="24"/>
+          <w:rtl/>
+        </w:rPr>
+        <w:t xml:space="preserve"> במקרקעין מוסדרים נותר הרישום ראיה חותכת שסתירתה מחייבת נטל כבד, אך ביחסים משפחתיים נכונים בתי המשפט לבחון טענת נאמנות או הסכמה פנימית אף בהיעדר מסמך בכתב, כשהראיות מלמדות על אומד דעת הצדדים;</w:t>
+      </w:r>
+      <w:r>
+        <w:rPr>
+          <w:rStyle w:val="FootnoteReference"/>
+        </w:rPr>
+        <w:footnoteReference w:id="48"/>
+      </w:r>
+      <w:r>
+        <w:rPr>
+          <w:rFonts w:ascii="David" w:cs="David" w:eastAsia="David" w:hAnsi="David"/>
+          <w:sz w:val="24"/>
+          <w:szCs w:val="24"/>
+          <w:rtl/>
+        </w:rPr>
+        <w:t xml:space="preserve"> וההבחנה בין זכות קניינית לזכות חוזית גרידא נושאת גם נפקות דיונית, לעניין סיווג התביעה וסמכות הערכאות.</w:t>
+      </w:r>
+      <w:r>
+        <w:rPr>
+          <w:rStyle w:val="FootnoteReference"/>
+        </w:rPr>
+        <w:footnoteReference w:id="49"/>
+      </w:r>
+      <w:r>
+        <w:rPr>
+          <w:rFonts w:ascii="David" w:cs="David" w:eastAsia="David" w:hAnsi="David"/>
+          <w:sz w:val="24"/>
+          <w:szCs w:val="24"/>
+          <w:rtl/>
+        </w:rPr>
+        <w:t xml:space="preserve"> העולה מן המכלול: הפסיקה אינה מכשירה "בעלות מכוח מנהג", אך היא מכשירה עסקה מוכחת – ותהא בלתי רשומה ובלתי מדווחת – ובכך היא מציבה את מרכז הכובד בזירה הראייתית. למשקלם המדויק של היתרי הבנייה, הארנונה והמסמכים ההיסטוריים – חומר הגלם של הכרעות אלה – יוקדש פרק ד.</w:t>
       </w:r>
     </w:p>
     <w:p>
@@ -2070,7 +2214,7 @@
         <w:rPr>
           <w:rStyle w:val="FootnoteReference"/>
         </w:rPr>
-        <w:footnoteReference w:id="43"/>
+        <w:footnoteReference w:id="50"/>
       </w:r>
     </w:p>
     <w:p>
@@ -2148,7 +2292,7 @@
         <w:rPr>
           <w:rStyle w:val="FootnoteReference"/>
         </w:rPr>
-        <w:footnoteReference w:id="44"/>
+        <w:footnoteReference w:id="51"/>
       </w:r>
       <w:r>
         <w:rPr>
@@ -2180,7 +2324,7 @@
         <w:rPr>
           <w:rStyle w:val="FootnoteReference"/>
         </w:rPr>
-        <w:footnoteReference w:id="45"/>
+        <w:footnoteReference w:id="52"/>
       </w:r>
     </w:p>
     <w:p>
@@ -2222,7 +2366,7 @@
         <w:rPr>
           <w:rStyle w:val="FootnoteReference"/>
         </w:rPr>
-        <w:footnoteReference w:id="46"/>
+        <w:footnoteReference w:id="53"/>
       </w:r>
       <w:r>
         <w:rPr>
@@ -2273,7 +2417,7 @@
         <w:rPr>
           <w:rStyle w:val="FootnoteReference"/>
         </w:rPr>
-        <w:footnoteReference w:id="47"/>
+        <w:footnoteReference w:id="54"/>
       </w:r>
       <w:r>
         <w:rPr>
@@ -2324,7 +2468,7 @@
         <w:rPr>
           <w:rStyle w:val="FootnoteReference"/>
         </w:rPr>
-        <w:footnoteReference w:id="48"/>
+        <w:footnoteReference w:id="55"/>
       </w:r>
       <w:r>
         <w:rPr>
@@ -2375,7 +2519,7 @@
         <w:rPr>
           <w:rStyle w:val="FootnoteReference"/>
         </w:rPr>
-        <w:footnoteReference w:id="49"/>
+        <w:footnoteReference w:id="56"/>
       </w:r>
       <w:r>
         <w:rPr>
@@ -2445,7 +2589,7 @@
         <w:rPr>
           <w:rStyle w:val="FootnoteReference"/>
         </w:rPr>
-        <w:footnoteReference w:id="50"/>
+        <w:footnoteReference w:id="57"/>
       </w:r>
       <w:r>
         <w:rPr>
@@ -2460,7 +2604,7 @@
         <w:rPr>
           <w:rStyle w:val="FootnoteReference"/>
         </w:rPr>
-        <w:footnoteReference w:id="51"/>
+        <w:footnoteReference w:id="58"/>
       </w:r>
       <w:r>
         <w:rPr>
@@ -2475,7 +2619,7 @@
         <w:rPr>
           <w:rStyle w:val="FootnoteReference"/>
         </w:rPr>
-        <w:footnoteReference w:id="52"/>
+        <w:footnoteReference w:id="59"/>
       </w:r>
       <w:r>
         <w:rPr>
@@ -2490,7 +2634,7 @@
         <w:rPr>
           <w:rStyle w:val="FootnoteReference"/>
         </w:rPr>
-        <w:footnoteReference w:id="53"/>
+        <w:footnoteReference w:id="60"/>
       </w:r>
       <w:r>
         <w:rPr>
@@ -2505,7 +2649,7 @@
         <w:rPr>
           <w:rStyle w:val="FootnoteReference"/>
         </w:rPr>
-        <w:footnoteReference w:id="54"/>
+        <w:footnoteReference w:id="61"/>
       </w:r>
     </w:p>
     <w:p>
@@ -2528,7 +2672,7 @@
         <w:rPr>
           <w:rStyle w:val="FootnoteReference"/>
         </w:rPr>
-        <w:footnoteReference w:id="55"/>
+        <w:footnoteReference w:id="62"/>
       </w:r>
       <w:r>
         <w:rPr>
@@ -2543,7 +2687,7 @@
         <w:rPr>
           <w:rStyle w:val="FootnoteReference"/>
         </w:rPr>
-        <w:footnoteReference w:id="56"/>
+        <w:footnoteReference w:id="63"/>
       </w:r>
       <w:r>
         <w:rPr>
@@ -2594,7 +2738,7 @@
         <w:rPr>
           <w:rStyle w:val="FootnoteReference"/>
         </w:rPr>
-        <w:footnoteReference w:id="57"/>
+        <w:footnoteReference w:id="64"/>
       </w:r>
       <w:r>
         <w:rPr>
@@ -2626,7 +2770,7 @@
         <w:rPr>
           <w:rStyle w:val="FootnoteReference"/>
         </w:rPr>
-        <w:footnoteReference w:id="58"/>
+        <w:footnoteReference w:id="65"/>
       </w:r>
       <w:r>
         <w:rPr>
@@ -2677,7 +2821,7 @@
         <w:rPr>
           <w:rStyle w:val="FootnoteReference"/>
         </w:rPr>
-        <w:footnoteReference w:id="59"/>
+        <w:footnoteReference w:id="66"/>
       </w:r>
     </w:p>
     <w:p>
@@ -2717,7 +2861,7 @@
         <w:rPr>
           <w:rStyle w:val="FootnoteReference"/>
         </w:rPr>
-        <w:footnoteReference w:id="60"/>
+        <w:footnoteReference w:id="67"/>
       </w:r>
       <w:r>
         <w:rPr>
@@ -2749,7 +2893,7 @@
         <w:rPr>
           <w:rStyle w:val="FootnoteReference"/>
         </w:rPr>
-        <w:footnoteReference w:id="61"/>
+        <w:footnoteReference w:id="68"/>
       </w:r>
       <w:r>
         <w:rPr>
@@ -2874,7 +3018,7 @@
         <w:rPr>
           <w:rStyle w:val="FootnoteReference"/>
         </w:rPr>
-        <w:footnoteReference w:id="62"/>
+        <w:footnoteReference w:id="69"/>
       </w:r>
       <w:r>
         <w:rPr>
@@ -2908,7 +3052,7 @@
         <w:rPr>
           <w:rStyle w:val="FootnoteReference"/>
         </w:rPr>
-        <w:footnoteReference w:id="63"/>
+        <w:footnoteReference w:id="70"/>
       </w:r>
       <w:r>
         <w:rPr>
@@ -2943,7 +3087,7 @@
         <w:rPr>
           <w:rStyle w:val="FootnoteReference"/>
         </w:rPr>
-        <w:footnoteReference w:id="64"/>
+        <w:footnoteReference w:id="71"/>
       </w:r>
     </w:p>
     <w:p>
@@ -2985,7 +3129,7 @@
         <w:rPr>
           <w:rStyle w:val="FootnoteReference"/>
         </w:rPr>
-        <w:footnoteReference w:id="65"/>
+        <w:footnoteReference w:id="72"/>
       </w:r>
       <w:r>
         <w:rPr>
@@ -3036,7 +3180,7 @@
         <w:rPr>
           <w:rStyle w:val="FootnoteReference"/>
         </w:rPr>
-        <w:footnoteReference w:id="66"/>
+        <w:footnoteReference w:id="73"/>
       </w:r>
       <w:r>
         <w:rPr>
@@ -3051,7 +3195,7 @@
         <w:rPr>
           <w:rStyle w:val="FootnoteReference"/>
         </w:rPr>
-        <w:footnoteReference w:id="67"/>
+        <w:footnoteReference w:id="74"/>
       </w:r>
     </w:p>
     <w:p>
@@ -3110,7 +3254,7 @@
         <w:rPr>
           <w:rStyle w:val="FootnoteReference"/>
         </w:rPr>
-        <w:footnoteReference w:id="68"/>
+        <w:footnoteReference w:id="75"/>
       </w:r>
       <w:r>
         <w:rPr>
@@ -3161,7 +3305,7 @@
         <w:rPr>
           <w:rStyle w:val="FootnoteReference"/>
         </w:rPr>
-        <w:footnoteReference w:id="69"/>
+        <w:footnoteReference w:id="76"/>
       </w:r>
       <w:r>
         <w:rPr>
@@ -3195,7 +3339,7 @@
         <w:rPr>
           <w:rStyle w:val="FootnoteReference"/>
         </w:rPr>
-        <w:footnoteReference w:id="70"/>
+        <w:footnoteReference w:id="77"/>
       </w:r>
       <w:r>
         <w:rPr>
@@ -3283,7 +3427,7 @@
         <w:rPr>
           <w:rStyle w:val="FootnoteReference"/>
         </w:rPr>
-        <w:footnoteReference w:id="71"/>
+        <w:footnoteReference w:id="78"/>
       </w:r>
       <w:r>
         <w:rPr>
@@ -3317,7 +3461,7 @@
         <w:rPr>
           <w:rStyle w:val="FootnoteReference"/>
         </w:rPr>
-        <w:footnoteReference w:id="72"/>
+        <w:footnoteReference w:id="79"/>
       </w:r>
       <w:r>
         <w:rPr>
@@ -3351,7 +3495,7 @@
         <w:rPr>
           <w:rStyle w:val="FootnoteReference"/>
         </w:rPr>
-        <w:footnoteReference w:id="73"/>
+        <w:footnoteReference w:id="80"/>
       </w:r>
       <w:r>
         <w:rPr>
@@ -3366,7 +3510,7 @@
         <w:rPr>
           <w:rStyle w:val="FootnoteReference"/>
         </w:rPr>
-        <w:footnoteReference w:id="74"/>
+        <w:footnoteReference w:id="81"/>
       </w:r>
       <w:r>
         <w:rPr>
@@ -3381,7 +3525,7 @@
         <w:rPr>
           <w:rStyle w:val="FootnoteReference"/>
         </w:rPr>
-        <w:footnoteReference w:id="75"/>
+        <w:footnoteReference w:id="82"/>
       </w:r>
     </w:p>
     <w:p>
@@ -3442,7 +3586,7 @@
         <w:rPr>
           <w:rStyle w:val="FootnoteReference"/>
         </w:rPr>
-        <w:footnoteReference w:id="76"/>
+        <w:footnoteReference w:id="83"/>
       </w:r>
       <w:r>
         <w:rPr>
@@ -3457,7 +3601,7 @@
         <w:rPr>
           <w:rStyle w:val="FootnoteReference"/>
         </w:rPr>
-        <w:footnoteReference w:id="77"/>
+        <w:footnoteReference w:id="84"/>
       </w:r>
       <w:r>
         <w:rPr>
@@ -3472,7 +3616,7 @@
         <w:rPr>
           <w:rStyle w:val="FootnoteReference"/>
         </w:rPr>
-        <w:footnoteReference w:id="78"/>
+        <w:footnoteReference w:id="85"/>
       </w:r>
     </w:p>
     <w:p>
@@ -3514,7 +3658,7 @@
         <w:rPr>
           <w:rStyle w:val="FootnoteReference"/>
         </w:rPr>
-        <w:footnoteReference w:id="79"/>
+        <w:footnoteReference w:id="86"/>
       </w:r>
       <w:r>
         <w:rPr>
@@ -3529,7 +3673,7 @@
         <w:rPr>
           <w:rStyle w:val="FootnoteReference"/>
         </w:rPr>
-        <w:footnoteReference w:id="80"/>
+        <w:footnoteReference w:id="87"/>
       </w:r>
     </w:p>
     <w:p>
@@ -3571,7 +3715,7 @@
         <w:rPr>
           <w:rStyle w:val="FootnoteReference"/>
         </w:rPr>
-        <w:footnoteReference w:id="81"/>
+        <w:footnoteReference w:id="88"/>
       </w:r>
       <w:r>
         <w:rPr>
@@ -3586,7 +3730,7 @@
         <w:rPr>
           <w:rStyle w:val="FootnoteReference"/>
         </w:rPr>
-        <w:footnoteReference w:id="82"/>
+        <w:footnoteReference w:id="89"/>
       </w:r>
       <w:r>
         <w:rPr>
@@ -3601,7 +3745,7 @@
         <w:rPr>
           <w:rStyle w:val="FootnoteReference"/>
         </w:rPr>
-        <w:footnoteReference w:id="83"/>
+        <w:footnoteReference w:id="90"/>
       </w:r>
       <w:r>
         <w:rPr>
@@ -3616,7 +3760,7 @@
         <w:rPr>
           <w:rStyle w:val="FootnoteReference"/>
         </w:rPr>
-        <w:footnoteReference w:id="84"/>
+        <w:footnoteReference w:id="91"/>
       </w:r>
     </w:p>
     <w:p>
@@ -3658,7 +3802,7 @@
         <w:rPr>
           <w:rStyle w:val="FootnoteReference"/>
         </w:rPr>
-        <w:footnoteReference w:id="85"/>
+        <w:footnoteReference w:id="92"/>
       </w:r>
       <w:r>
         <w:rPr>
@@ -3673,7 +3817,7 @@
         <w:rPr>
           <w:rStyle w:val="FootnoteReference"/>
         </w:rPr>
-        <w:footnoteReference w:id="86"/>
+        <w:footnoteReference w:id="93"/>
       </w:r>
       <w:r>
         <w:rPr>
@@ -3688,7 +3832,7 @@
         <w:rPr>
           <w:rStyle w:val="FootnoteReference"/>
         </w:rPr>
-        <w:footnoteReference w:id="87"/>
+        <w:footnoteReference w:id="94"/>
       </w:r>
       <w:r>
         <w:rPr>
@@ -3758,7 +3902,7 @@
         <w:rPr>
           <w:rStyle w:val="FootnoteReference"/>
         </w:rPr>
-        <w:footnoteReference w:id="88"/>
+        <w:footnoteReference w:id="95"/>
       </w:r>
       <w:r>
         <w:rPr>
@@ -3809,7 +3953,7 @@
         <w:rPr>
           <w:rStyle w:val="FootnoteReference"/>
         </w:rPr>
-        <w:footnoteReference w:id="89"/>
+        <w:footnoteReference w:id="96"/>
       </w:r>
       <w:r>
         <w:rPr>
@@ -3824,7 +3968,7 @@
         <w:rPr>
           <w:rStyle w:val="FootnoteReference"/>
         </w:rPr>
-        <w:footnoteReference w:id="90"/>
+        <w:footnoteReference w:id="97"/>
       </w:r>
       <w:r>
         <w:rPr>
@@ -3839,7 +3983,7 @@
         <w:rPr>
           <w:rStyle w:val="FootnoteReference"/>
         </w:rPr>
-        <w:footnoteReference w:id="91"/>
+        <w:footnoteReference w:id="98"/>
       </w:r>
     </w:p>
     <w:p>
@@ -3862,7 +4006,7 @@
         <w:rPr>
           <w:rStyle w:val="FootnoteReference"/>
         </w:rPr>
-        <w:footnoteReference w:id="92"/>
+        <w:footnoteReference w:id="99"/>
       </w:r>
     </w:p>
     <w:p>
@@ -3904,7 +4048,7 @@
         <w:rPr>
           <w:rStyle w:val="FootnoteReference"/>
         </w:rPr>
-        <w:footnoteReference w:id="93"/>
+        <w:footnoteReference w:id="100"/>
       </w:r>
       <w:r>
         <w:rPr>
@@ -3919,7 +4063,7 @@
         <w:rPr>
           <w:rStyle w:val="FootnoteReference"/>
         </w:rPr>
-        <w:footnoteReference w:id="94"/>
+        <w:footnoteReference w:id="101"/>
       </w:r>
       <w:r>
         <w:rPr>
@@ -3934,7 +4078,7 @@
         <w:rPr>
           <w:rStyle w:val="FootnoteReference"/>
         </w:rPr>
-        <w:footnoteReference w:id="95"/>
+        <w:footnoteReference w:id="102"/>
       </w:r>
       <w:r>
         <w:rPr>
@@ -3985,7 +4129,7 @@
         <w:rPr>
           <w:rStyle w:val="FootnoteReference"/>
         </w:rPr>
-        <w:footnoteReference w:id="96"/>
+        <w:footnoteReference w:id="103"/>
       </w:r>
       <w:r>
         <w:rPr>
@@ -4000,7 +4144,7 @@
         <w:rPr>
           <w:rStyle w:val="FootnoteReference"/>
         </w:rPr>
-        <w:footnoteReference w:id="97"/>
+        <w:footnoteReference w:id="104"/>
       </w:r>
       <w:r>
         <w:rPr>
@@ -4015,7 +4159,7 @@
         <w:rPr>
           <w:rStyle w:val="FootnoteReference"/>
         </w:rPr>
-        <w:footnoteReference w:id="98"/>
+        <w:footnoteReference w:id="105"/>
       </w:r>
       <w:r>
         <w:rPr>
@@ -4030,7 +4174,7 @@
         <w:rPr>
           <w:rStyle w:val="FootnoteReference"/>
         </w:rPr>
-        <w:footnoteReference w:id="99"/>
+        <w:footnoteReference w:id="106"/>
       </w:r>
       <w:r>
         <w:rPr>
@@ -4176,7 +4320,7 @@
         <w:rPr>
           <w:rStyle w:val="FootnoteReference"/>
         </w:rPr>
-        <w:footnoteReference w:id="100"/>
+        <w:footnoteReference w:id="107"/>
       </w:r>
     </w:p>
     <w:p>
@@ -4235,7 +4379,7 @@
         <w:rPr>
           <w:rStyle w:val="FootnoteReference"/>
         </w:rPr>
-        <w:footnoteReference w:id="101"/>
+        <w:footnoteReference w:id="108"/>
       </w:r>
       <w:r>
         <w:rPr>
@@ -4250,7 +4394,7 @@
         <w:rPr>
           <w:rStyle w:val="FootnoteReference"/>
         </w:rPr>
-        <w:footnoteReference w:id="102"/>
+        <w:footnoteReference w:id="109"/>
       </w:r>
       <w:r>
         <w:rPr>
@@ -4282,7 +4426,7 @@
         <w:rPr>
           <w:rStyle w:val="FootnoteReference"/>
         </w:rPr>
-        <w:footnoteReference w:id="103"/>
+        <w:footnoteReference w:id="110"/>
       </w:r>
       <w:r>
         <w:rPr>
@@ -4334,7 +4478,7 @@
         <w:rPr>
           <w:rStyle w:val="FootnoteReference"/>
         </w:rPr>
-        <w:footnoteReference w:id="104"/>
+        <w:footnoteReference w:id="111"/>
       </w:r>
       <w:r>
         <w:rPr>
@@ -4349,7 +4493,7 @@
         <w:rPr>
           <w:rStyle w:val="FootnoteReference"/>
         </w:rPr>
-        <w:footnoteReference w:id="105"/>
+        <w:footnoteReference w:id="112"/>
       </w:r>
       <w:r>
         <w:rPr>
@@ -5191,6 +5335,43 @@
           <w:szCs w:val="24"/>
           <w:rtl/>
         </w:rPr>
+        <w:t xml:space="preserve">ע"א 6588/12 </w:t>
+      </w:r>
+      <w:r>
+        <w:rPr>
+          <w:rFonts w:ascii="David" w:cs="David" w:eastAsia="David" w:hAnsi="David"/>
+          <w:i/>
+          <w:iCs/>
+          <w:sz w:val="24"/>
+          <w:szCs w:val="24"/>
+          <w:rtl/>
+        </w:rPr>
+        <w:t xml:space="preserve">כבהה נ׳ כבהה</w:t>
+      </w:r>
+      <w:r>
+        <w:rPr>
+          <w:rFonts w:ascii="David" w:cs="David" w:eastAsia="David" w:hAnsi="David"/>
+          <w:sz w:val="24"/>
+          <w:szCs w:val="24"/>
+          <w:rtl/>
+        </w:rPr>
+        <w:t xml:space="preserve"> (נבו 24.12.2014).</w:t>
+      </w:r>
+    </w:p>
+    <w:p>
+      <w:pPr>
+        <w:bidi/>
+        <w:spacing w:after="120" w:line="300"/>
+        <w:ind w:start="420" w:hanging="420"/>
+        <w:jc w:val="both"/>
+      </w:pPr>
+      <w:r>
+        <w:rPr>
+          <w:rFonts w:ascii="David" w:cs="David" w:eastAsia="David" w:hAnsi="David"/>
+          <w:sz w:val="24"/>
+          <w:szCs w:val="24"/>
+          <w:rtl/>
+        </w:rPr>
         <w:t xml:space="preserve">רע"א 7060/12 </w:t>
       </w:r>
       <w:r>
@@ -5238,7 +5419,7 @@
           <w:szCs w:val="24"/>
           <w:rtl/>
         </w:rPr>
-        <w:t xml:space="preserve">ו"ע (מחוזי חי׳) 4631-12-13 </w:t>
+        <w:t xml:space="preserve">רע"א 4890/15 </w:t>
       </w:r>
       <w:r>
         <w:rPr>
@@ -5249,16 +5430,16 @@
           <w:szCs w:val="24"/>
           <w:rtl/>
         </w:rPr>
-        <w:t xml:space="preserve">גולדברג נ׳ מנהל מיסוי מקרקעין – חדרה</w:t>
-      </w:r>
-      <w:r>
-        <w:rPr>
-          <w:rFonts w:ascii="David" w:cs="David" w:eastAsia="David" w:hAnsi="David"/>
-          <w:sz w:val="24"/>
-          <w:szCs w:val="24"/>
-          <w:rtl/>
-        </w:rPr>
-        <w:t xml:space="preserve">, מיסים כט(3) ה-320 (2015).</w:t>
+        <w:t xml:space="preserve">אלוש נ׳ עיריית טבריה</w:t>
+      </w:r>
+      <w:r>
+        <w:rPr>
+          <w:rFonts w:ascii="David" w:cs="David" w:eastAsia="David" w:hAnsi="David"/>
+          <w:sz w:val="24"/>
+          <w:szCs w:val="24"/>
+          <w:rtl/>
+        </w:rPr>
+        <w:t xml:space="preserve"> (נבו 31.12.2015).</w:t>
       </w:r>
     </w:p>
     <w:p>
@@ -5275,7 +5456,7 @@
           <w:szCs w:val="24"/>
           <w:rtl/>
         </w:rPr>
-        <w:t xml:space="preserve">ע"א 483/16 </w:t>
+        <w:t xml:space="preserve">ו"ע (מחוזי חי׳) 4631-12-13 </w:t>
       </w:r>
       <w:r>
         <w:rPr>
@@ -5286,16 +5467,16 @@
           <w:szCs w:val="24"/>
           <w:rtl/>
         </w:rPr>
-        <w:t xml:space="preserve">יהודאי נ׳ חלמיש – חברה ממשלתית-עירונית לדיור, לשיקום ולהתחדשות שכונות בתל-אביב בע"מ</w:t>
-      </w:r>
-      <w:r>
-        <w:rPr>
-          <w:rFonts w:ascii="David" w:cs="David" w:eastAsia="David" w:hAnsi="David"/>
-          <w:sz w:val="24"/>
-          <w:szCs w:val="24"/>
-          <w:rtl/>
-        </w:rPr>
-        <w:t xml:space="preserve"> (נבו 3.10.2017).</w:t>
+        <w:t xml:space="preserve">גולדברג נ׳ מנהל מיסוי מקרקעין – חדרה</w:t>
+      </w:r>
+      <w:r>
+        <w:rPr>
+          <w:rFonts w:ascii="David" w:cs="David" w:eastAsia="David" w:hAnsi="David"/>
+          <w:sz w:val="24"/>
+          <w:szCs w:val="24"/>
+          <w:rtl/>
+        </w:rPr>
+        <w:t xml:space="preserve">, מיסים כט(3) ה-320 (2015).</w:t>
       </w:r>
     </w:p>
     <w:p>
@@ -5312,7 +5493,7 @@
           <w:szCs w:val="24"/>
           <w:rtl/>
         </w:rPr>
-        <w:t xml:space="preserve">ע"א 3274/18 </w:t>
+        <w:t xml:space="preserve">ע"א 483/16 </w:t>
       </w:r>
       <w:r>
         <w:rPr>
@@ -5323,16 +5504,16 @@
           <w:szCs w:val="24"/>
           <w:rtl/>
         </w:rPr>
-        <w:t xml:space="preserve">אבו אסמעיל נ׳ סלימאן</w:t>
-      </w:r>
-      <w:r>
-        <w:rPr>
-          <w:rFonts w:ascii="David" w:cs="David" w:eastAsia="David" w:hAnsi="David"/>
-          <w:sz w:val="24"/>
-          <w:szCs w:val="24"/>
-          <w:rtl/>
-        </w:rPr>
-        <w:t xml:space="preserve"> (נבו 28.7.2020).</w:t>
+        <w:t xml:space="preserve">יהודאי נ׳ חלמיש – חברה ממשלתית-עירונית לדיור, לשיקום ולהתחדשות שכונות בתל-אביב בע"מ</w:t>
+      </w:r>
+      <w:r>
+        <w:rPr>
+          <w:rFonts w:ascii="David" w:cs="David" w:eastAsia="David" w:hAnsi="David"/>
+          <w:sz w:val="24"/>
+          <w:szCs w:val="24"/>
+          <w:rtl/>
+        </w:rPr>
+        <w:t xml:space="preserve"> (נבו 3.10.2017).</w:t>
       </w:r>
     </w:p>
     <w:p>
@@ -5349,7 +5530,7 @@
           <w:szCs w:val="24"/>
           <w:rtl/>
         </w:rPr>
-        <w:t xml:space="preserve">בע"מ 2311/22 </w:t>
+        <w:t xml:space="preserve">בע"מ 7496/19 </w:t>
       </w:r>
       <w:r>
         <w:rPr>
@@ -5369,7 +5550,7 @@
           <w:szCs w:val="24"/>
           <w:rtl/>
         </w:rPr>
-        <w:t xml:space="preserve"> (נבו 13.4.2022).</w:t>
+        <w:t xml:space="preserve"> (נבו 30.12.2019).</w:t>
       </w:r>
     </w:p>
     <w:p>
@@ -5386,7 +5567,7 @@
           <w:szCs w:val="24"/>
           <w:rtl/>
         </w:rPr>
-        <w:t xml:space="preserve">ת"א (מחוזי חי׳) 64669-10-18 </w:t>
+        <w:t xml:space="preserve">ע"א 749/18 </w:t>
       </w:r>
       <w:r>
         <w:rPr>
@@ -5397,16 +5578,16 @@
           <w:szCs w:val="24"/>
           <w:rtl/>
         </w:rPr>
-        <w:t xml:space="preserve">בדארנה נ׳ בדארנה</w:t>
-      </w:r>
-      <w:r>
-        <w:rPr>
-          <w:rFonts w:ascii="David" w:cs="David" w:eastAsia="David" w:hAnsi="David"/>
-          <w:sz w:val="24"/>
-          <w:szCs w:val="24"/>
-          <w:rtl/>
-        </w:rPr>
-        <w:t xml:space="preserve"> (נבו 9.1.2022).</w:t>
+        <w:t xml:space="preserve">עיזבון אבו ג׳נימה נ׳ עיזבון אבו ג׳נימה</w:t>
+      </w:r>
+      <w:r>
+        <w:rPr>
+          <w:rFonts w:ascii="David" w:cs="David" w:eastAsia="David" w:hAnsi="David"/>
+          <w:sz w:val="24"/>
+          <w:szCs w:val="24"/>
+          <w:rtl/>
+        </w:rPr>
+        <w:t xml:space="preserve"> (נבו 26.7.2020).</w:t>
       </w:r>
     </w:p>
     <w:p>
@@ -5423,7 +5604,7 @@
           <w:szCs w:val="24"/>
           <w:rtl/>
         </w:rPr>
-        <w:t xml:space="preserve">עמ"ש (מחוזי מר׳) 52601-10-23 </w:t>
+        <w:t xml:space="preserve">ע"א 3274/18 </w:t>
       </w:r>
       <w:r>
         <w:rPr>
@@ -5434,16 +5615,16 @@
           <w:szCs w:val="24"/>
           <w:rtl/>
         </w:rPr>
-        <w:t xml:space="preserve">א.א. נ׳ אר.א</w:t>
-      </w:r>
-      <w:r>
-        <w:rPr>
-          <w:rFonts w:ascii="David" w:cs="David" w:eastAsia="David" w:hAnsi="David"/>
-          <w:sz w:val="24"/>
-          <w:szCs w:val="24"/>
-          <w:rtl/>
-        </w:rPr>
-        <w:t xml:space="preserve"> (נבו 1.11.2024).</w:t>
+        <w:t xml:space="preserve">אבו אסמעיל נ׳ סלימאן</w:t>
+      </w:r>
+      <w:r>
+        <w:rPr>
+          <w:rFonts w:ascii="David" w:cs="David" w:eastAsia="David" w:hAnsi="David"/>
+          <w:sz w:val="24"/>
+          <w:szCs w:val="24"/>
+          <w:rtl/>
+        </w:rPr>
+        <w:t xml:space="preserve"> (נבו 28.7.2020).</w:t>
       </w:r>
     </w:p>
     <w:p>
@@ -5460,7 +5641,7 @@
           <w:szCs w:val="24"/>
           <w:rtl/>
         </w:rPr>
-        <w:t xml:space="preserve">ת"א (שלום נצ׳) 19781-06-18 </w:t>
+        <w:t xml:space="preserve">ע"א 4116/20 </w:t>
       </w:r>
       <w:r>
         <w:rPr>
@@ -5471,16 +5652,16 @@
           <w:szCs w:val="24"/>
           <w:rtl/>
         </w:rPr>
-        <w:t xml:space="preserve">אבו ליל נ׳ פאהום</w:t>
-      </w:r>
-      <w:r>
-        <w:rPr>
-          <w:rFonts w:ascii="David" w:cs="David" w:eastAsia="David" w:hAnsi="David"/>
-          <w:sz w:val="24"/>
-          <w:szCs w:val="24"/>
-          <w:rtl/>
-        </w:rPr>
-        <w:t xml:space="preserve"> (נבו 18.10.2023).</w:t>
+        <w:t xml:space="preserve">הוך נ׳ בריכטא</w:t>
+      </w:r>
+      <w:r>
+        <w:rPr>
+          <w:rFonts w:ascii="David" w:cs="David" w:eastAsia="David" w:hAnsi="David"/>
+          <w:sz w:val="24"/>
+          <w:szCs w:val="24"/>
+          <w:rtl/>
+        </w:rPr>
+        <w:t xml:space="preserve"> (נבו 17.9.2020).</w:t>
       </w:r>
     </w:p>
     <w:p>
@@ -5497,7 +5678,7 @@
           <w:szCs w:val="24"/>
           <w:rtl/>
         </w:rPr>
-        <w:t xml:space="preserve">תמ"ש (משפחה ת"א) 18541-01-22 </w:t>
+        <w:t xml:space="preserve">ע"א 2693/19 </w:t>
       </w:r>
       <w:r>
         <w:rPr>
@@ -5508,16 +5689,16 @@
           <w:szCs w:val="24"/>
           <w:rtl/>
         </w:rPr>
-        <w:t xml:space="preserve">פלונים נ׳ אלמונים</w:t>
-      </w:r>
-      <w:r>
-        <w:rPr>
-          <w:rFonts w:ascii="David" w:cs="David" w:eastAsia="David" w:hAnsi="David"/>
-          <w:sz w:val="24"/>
-          <w:szCs w:val="24"/>
-          <w:rtl/>
-        </w:rPr>
-        <w:t xml:space="preserve"> (נבו 15.1.2023).</w:t>
+        <w:t xml:space="preserve">משעל נ׳ כמאל</w:t>
+      </w:r>
+      <w:r>
+        <w:rPr>
+          <w:rFonts w:ascii="David" w:cs="David" w:eastAsia="David" w:hAnsi="David"/>
+          <w:sz w:val="24"/>
+          <w:szCs w:val="24"/>
+          <w:rtl/>
+        </w:rPr>
+        <w:t xml:space="preserve"> (נבו 22.9.2020).</w:t>
       </w:r>
     </w:p>
     <w:p>
@@ -5534,7 +5715,7 @@
           <w:szCs w:val="24"/>
           <w:rtl/>
         </w:rPr>
-        <w:t xml:space="preserve">תלה"מ (משפחה נצ׳) 60777-07-20 </w:t>
+        <w:t xml:space="preserve">בע"מ 2311/22 </w:t>
       </w:r>
       <w:r>
         <w:rPr>
@@ -5545,16 +5726,16 @@
           <w:szCs w:val="24"/>
           <w:rtl/>
         </w:rPr>
-        <w:t xml:space="preserve">ג.ס נ׳ מ.ד</w:t>
-      </w:r>
-      <w:r>
-        <w:rPr>
-          <w:rFonts w:ascii="David" w:cs="David" w:eastAsia="David" w:hAnsi="David"/>
-          <w:sz w:val="24"/>
-          <w:szCs w:val="24"/>
-          <w:rtl/>
-        </w:rPr>
-        <w:t xml:space="preserve"> (נבו 2021).</w:t>
+        <w:t xml:space="preserve">פלוני נ׳ פלוני</w:t>
+      </w:r>
+      <w:r>
+        <w:rPr>
+          <w:rFonts w:ascii="David" w:cs="David" w:eastAsia="David" w:hAnsi="David"/>
+          <w:sz w:val="24"/>
+          <w:szCs w:val="24"/>
+          <w:rtl/>
+        </w:rPr>
+        <w:t xml:space="preserve"> (נבו 13.4.2022).</w:t>
       </w:r>
     </w:p>
     <w:p>
@@ -5571,7 +5752,7 @@
           <w:szCs w:val="24"/>
           <w:rtl/>
         </w:rPr>
-        <w:t xml:space="preserve">תמ"ש (משפחה נצ׳) 4821-07 </w:t>
+        <w:t xml:space="preserve">ת"א (מחוזי חי׳) 64669-10-18 </w:t>
       </w:r>
       <w:r>
         <w:rPr>
@@ -5582,6 +5763,191 @@
           <w:szCs w:val="24"/>
           <w:rtl/>
         </w:rPr>
+        <w:t xml:space="preserve">בדארנה נ׳ בדארנה</w:t>
+      </w:r>
+      <w:r>
+        <w:rPr>
+          <w:rFonts w:ascii="David" w:cs="David" w:eastAsia="David" w:hAnsi="David"/>
+          <w:sz w:val="24"/>
+          <w:szCs w:val="24"/>
+          <w:rtl/>
+        </w:rPr>
+        <w:t xml:space="preserve"> (נבו 9.1.2022).</w:t>
+      </w:r>
+    </w:p>
+    <w:p>
+      <w:pPr>
+        <w:bidi/>
+        <w:spacing w:after="120" w:line="300"/>
+        <w:ind w:start="420" w:hanging="420"/>
+        <w:jc w:val="both"/>
+      </w:pPr>
+      <w:r>
+        <w:rPr>
+          <w:rFonts w:ascii="David" w:cs="David" w:eastAsia="David" w:hAnsi="David"/>
+          <w:sz w:val="24"/>
+          <w:szCs w:val="24"/>
+          <w:rtl/>
+        </w:rPr>
+        <w:t xml:space="preserve">עמ"ש (מחוזי מר׳) 52601-10-23 </w:t>
+      </w:r>
+      <w:r>
+        <w:rPr>
+          <w:rFonts w:ascii="David" w:cs="David" w:eastAsia="David" w:hAnsi="David"/>
+          <w:i/>
+          <w:iCs/>
+          <w:sz w:val="24"/>
+          <w:szCs w:val="24"/>
+          <w:rtl/>
+        </w:rPr>
+        <w:t xml:space="preserve">א.א. נ׳ אר.א</w:t>
+      </w:r>
+      <w:r>
+        <w:rPr>
+          <w:rFonts w:ascii="David" w:cs="David" w:eastAsia="David" w:hAnsi="David"/>
+          <w:sz w:val="24"/>
+          <w:szCs w:val="24"/>
+          <w:rtl/>
+        </w:rPr>
+        <w:t xml:space="preserve"> (נבו 1.11.2024).</w:t>
+      </w:r>
+    </w:p>
+    <w:p>
+      <w:pPr>
+        <w:bidi/>
+        <w:spacing w:after="120" w:line="300"/>
+        <w:ind w:start="420" w:hanging="420"/>
+        <w:jc w:val="both"/>
+      </w:pPr>
+      <w:r>
+        <w:rPr>
+          <w:rFonts w:ascii="David" w:cs="David" w:eastAsia="David" w:hAnsi="David"/>
+          <w:sz w:val="24"/>
+          <w:szCs w:val="24"/>
+          <w:rtl/>
+        </w:rPr>
+        <w:t xml:space="preserve">ת"א (שלום נצ׳) 19781-06-18 </w:t>
+      </w:r>
+      <w:r>
+        <w:rPr>
+          <w:rFonts w:ascii="David" w:cs="David" w:eastAsia="David" w:hAnsi="David"/>
+          <w:i/>
+          <w:iCs/>
+          <w:sz w:val="24"/>
+          <w:szCs w:val="24"/>
+          <w:rtl/>
+        </w:rPr>
+        <w:t xml:space="preserve">אבו ליל נ׳ פאהום</w:t>
+      </w:r>
+      <w:r>
+        <w:rPr>
+          <w:rFonts w:ascii="David" w:cs="David" w:eastAsia="David" w:hAnsi="David"/>
+          <w:sz w:val="24"/>
+          <w:szCs w:val="24"/>
+          <w:rtl/>
+        </w:rPr>
+        <w:t xml:space="preserve"> (נבו 18.10.2023).</w:t>
+      </w:r>
+    </w:p>
+    <w:p>
+      <w:pPr>
+        <w:bidi/>
+        <w:spacing w:after="120" w:line="300"/>
+        <w:ind w:start="420" w:hanging="420"/>
+        <w:jc w:val="both"/>
+      </w:pPr>
+      <w:r>
+        <w:rPr>
+          <w:rFonts w:ascii="David" w:cs="David" w:eastAsia="David" w:hAnsi="David"/>
+          <w:sz w:val="24"/>
+          <w:szCs w:val="24"/>
+          <w:rtl/>
+        </w:rPr>
+        <w:t xml:space="preserve">תמ"ש (משפחה ת"א) 18541-01-22 </w:t>
+      </w:r>
+      <w:r>
+        <w:rPr>
+          <w:rFonts w:ascii="David" w:cs="David" w:eastAsia="David" w:hAnsi="David"/>
+          <w:i/>
+          <w:iCs/>
+          <w:sz w:val="24"/>
+          <w:szCs w:val="24"/>
+          <w:rtl/>
+        </w:rPr>
+        <w:t xml:space="preserve">פלונים נ׳ אלמונים</w:t>
+      </w:r>
+      <w:r>
+        <w:rPr>
+          <w:rFonts w:ascii="David" w:cs="David" w:eastAsia="David" w:hAnsi="David"/>
+          <w:sz w:val="24"/>
+          <w:szCs w:val="24"/>
+          <w:rtl/>
+        </w:rPr>
+        <w:t xml:space="preserve"> (נבו 15.1.2023).</w:t>
+      </w:r>
+    </w:p>
+    <w:p>
+      <w:pPr>
+        <w:bidi/>
+        <w:spacing w:after="120" w:line="300"/>
+        <w:ind w:start="420" w:hanging="420"/>
+        <w:jc w:val="both"/>
+      </w:pPr>
+      <w:r>
+        <w:rPr>
+          <w:rFonts w:ascii="David" w:cs="David" w:eastAsia="David" w:hAnsi="David"/>
+          <w:sz w:val="24"/>
+          <w:szCs w:val="24"/>
+          <w:rtl/>
+        </w:rPr>
+        <w:t xml:space="preserve">תלה"מ (משפחה נצ׳) 60777-07-20 </w:t>
+      </w:r>
+      <w:r>
+        <w:rPr>
+          <w:rFonts w:ascii="David" w:cs="David" w:eastAsia="David" w:hAnsi="David"/>
+          <w:i/>
+          <w:iCs/>
+          <w:sz w:val="24"/>
+          <w:szCs w:val="24"/>
+          <w:rtl/>
+        </w:rPr>
+        <w:t xml:space="preserve">ג.ס נ׳ מ.ד</w:t>
+      </w:r>
+      <w:r>
+        <w:rPr>
+          <w:rFonts w:ascii="David" w:cs="David" w:eastAsia="David" w:hAnsi="David"/>
+          <w:sz w:val="24"/>
+          <w:szCs w:val="24"/>
+          <w:rtl/>
+        </w:rPr>
+        <w:t xml:space="preserve"> (נבו 14.4.2021).</w:t>
+      </w:r>
+    </w:p>
+    <w:p>
+      <w:pPr>
+        <w:bidi/>
+        <w:spacing w:after="120" w:line="300"/>
+        <w:ind w:start="420" w:hanging="420"/>
+        <w:jc w:val="both"/>
+      </w:pPr>
+      <w:r>
+        <w:rPr>
+          <w:rFonts w:ascii="David" w:cs="David" w:eastAsia="David" w:hAnsi="David"/>
+          <w:sz w:val="24"/>
+          <w:szCs w:val="24"/>
+          <w:rtl/>
+        </w:rPr>
+        <w:t xml:space="preserve">תמ"ש (משפחה נצ׳) 4821-07 </w:t>
+      </w:r>
+      <w:r>
+        <w:rPr>
+          <w:rFonts w:ascii="David" w:cs="David" w:eastAsia="David" w:hAnsi="David"/>
+          <w:i/>
+          <w:iCs/>
+          <w:sz w:val="24"/>
+          <w:szCs w:val="24"/>
+          <w:rtl/>
+        </w:rPr>
         <w:t xml:space="preserve">ס.ע.ז נ׳ ע.ע.ז</w:t>
       </w:r>
       <w:r>
@@ -5592,6 +5958,117 @@
           <w:rtl/>
         </w:rPr>
         <w:t xml:space="preserve"> (נבו 2012).</w:t>
+      </w:r>
+    </w:p>
+    <w:p>
+      <w:pPr>
+        <w:bidi/>
+        <w:spacing w:after="120" w:line="300"/>
+        <w:ind w:start="420" w:hanging="420"/>
+        <w:jc w:val="both"/>
+      </w:pPr>
+      <w:r>
+        <w:rPr>
+          <w:rFonts w:ascii="David" w:cs="David" w:eastAsia="David" w:hAnsi="David"/>
+          <w:sz w:val="24"/>
+          <w:szCs w:val="24"/>
+          <w:rtl/>
+        </w:rPr>
+        <w:t xml:space="preserve">תמ"ש (משפחה נצ׳) 27669-01-17 </w:t>
+      </w:r>
+      <w:r>
+        <w:rPr>
+          <w:rFonts w:ascii="David" w:cs="David" w:eastAsia="David" w:hAnsi="David"/>
+          <w:i/>
+          <w:iCs/>
+          <w:sz w:val="24"/>
+          <w:szCs w:val="24"/>
+          <w:rtl/>
+        </w:rPr>
+        <w:t xml:space="preserve">ו.ע נ׳ כ.ע</w:t>
+      </w:r>
+      <w:r>
+        <w:rPr>
+          <w:rFonts w:ascii="David" w:cs="David" w:eastAsia="David" w:hAnsi="David"/>
+          <w:sz w:val="24"/>
+          <w:szCs w:val="24"/>
+          <w:rtl/>
+        </w:rPr>
+        <w:t xml:space="preserve"> (נבו 22.4.2018).</w:t>
+      </w:r>
+    </w:p>
+    <w:p>
+      <w:pPr>
+        <w:bidi/>
+        <w:spacing w:after="120" w:line="300"/>
+        <w:ind w:start="420" w:hanging="420"/>
+        <w:jc w:val="both"/>
+      </w:pPr>
+      <w:r>
+        <w:rPr>
+          <w:rFonts w:ascii="David" w:cs="David" w:eastAsia="David" w:hAnsi="David"/>
+          <w:sz w:val="24"/>
+          <w:szCs w:val="24"/>
+          <w:rtl/>
+        </w:rPr>
+        <w:t xml:space="preserve">תלה"מ (משפחה נצ׳) 39735-12-19 </w:t>
+      </w:r>
+      <w:r>
+        <w:rPr>
+          <w:rFonts w:ascii="David" w:cs="David" w:eastAsia="David" w:hAnsi="David"/>
+          <w:i/>
+          <w:iCs/>
+          <w:sz w:val="24"/>
+          <w:szCs w:val="24"/>
+          <w:rtl/>
+        </w:rPr>
+        <w:t xml:space="preserve">פלונית נ׳ פלוני</w:t>
+      </w:r>
+      <w:r>
+        <w:rPr>
+          <w:rFonts w:ascii="David" w:cs="David" w:eastAsia="David" w:hAnsi="David"/>
+          <w:sz w:val="24"/>
+          <w:szCs w:val="24"/>
+          <w:rtl/>
+        </w:rPr>
+        <w:t xml:space="preserve"> (נבו 14.10.2022).</w:t>
+      </w:r>
+    </w:p>
+    <w:p>
+      <w:pPr>
+        <w:bidi/>
+        <w:spacing w:after="120" w:line="300"/>
+        <w:ind w:start="420" w:hanging="420"/>
+        <w:jc w:val="both"/>
+      </w:pPr>
+      <w:r>
+        <w:rPr>
+          <w:rFonts w:ascii="David" w:cs="David" w:eastAsia="David" w:hAnsi="David"/>
+          <w:sz w:val="24"/>
+          <w:szCs w:val="24"/>
+          <w:rtl/>
+        </w:rPr>
+        <w:t xml:space="preserve">תמ"ש (משפחה חד׳) 44358-11-19 </w:t>
+      </w:r>
+      <w:r>
+        <w:rPr>
+          <w:rFonts w:ascii="David" w:cs="David" w:eastAsia="David" w:hAnsi="David"/>
+          <w:i/>
+          <w:iCs/>
+          <w:sz w:val="24"/>
+          <w:szCs w:val="24"/>
+          <w:rtl/>
+        </w:rPr>
+        <w:t xml:space="preserve">אלמונית נ׳ פלונית</w:t>
+      </w:r>
+      <w:r>
+        <w:rPr>
+          <w:rFonts w:ascii="David" w:cs="David" w:eastAsia="David" w:hAnsi="David"/>
+          <w:sz w:val="24"/>
+          <w:szCs w:val="24"/>
+          <w:rtl/>
+        </w:rPr>
+        <w:t xml:space="preserve"> (נבו 7.5.2023).</w:t>
       </w:r>
     </w:p>
     <w:p>
@@ -8390,25 +8867,27 @@
           <w:szCs w:val="20"/>
           <w:rtl/>
         </w:rPr>
-        <w:t xml:space="preserve">ראבילו, </w:t>
-      </w:r>
-      <w:r>
-        <w:rPr>
-          <w:rFonts w:ascii="David" w:cs="David" w:eastAsia="David" w:hAnsi="David"/>
-          <w:sz w:val="20"/>
-          <w:szCs w:val="20"/>
-          <w:rtl/>
-        </w:rPr>
-        <w:t xml:space="preserve">לעיל ה"ש 32</w:t>
-      </w:r>
-      <w:r>
-        <w:rPr>
-          <w:rFonts w:ascii="David" w:cs="David" w:eastAsia="David" w:hAnsi="David"/>
-          <w:sz w:val="20"/>
-          <w:szCs w:val="20"/>
-          <w:rtl/>
-        </w:rPr>
-        <w:t xml:space="preserve">, בעמ׳ 333–337; להשלמת מתנה בקבלת החזקה ראו גם להלן פרק ו.3 לעניין דרישת הקַבְּץ׳ (התפיסה) במשפט השרעי.</w:t>
+        <w:t xml:space="preserve">ע"א 6588/12 </w:t>
+      </w:r>
+      <w:r>
+        <w:rPr>
+          <w:rFonts w:ascii="David" w:cs="David" w:eastAsia="David" w:hAnsi="David"/>
+          <w:i/>
+          <w:iCs/>
+          <w:sz w:val="20"/>
+          <w:szCs w:val="20"/>
+          <w:rtl/>
+        </w:rPr>
+        <w:t xml:space="preserve">כבהה נ׳ כבהה</w:t>
+      </w:r>
+      <w:r>
+        <w:rPr>
+          <w:rFonts w:ascii="David" w:cs="David" w:eastAsia="David" w:hAnsi="David"/>
+          <w:sz w:val="20"/>
+          <w:szCs w:val="20"/>
+          <w:rtl/>
+        </w:rPr>
+        <w:t xml:space="preserve"> (נבו 24.12.2014).</w:t>
       </w:r>
     </w:p>
   </w:footnote>
@@ -8431,7 +8910,25 @@
           <w:szCs w:val="20"/>
           <w:rtl/>
         </w:rPr>
-        <w:t xml:space="preserve">נינה זלצמן "רישיון במקרקעין" הפרקליט מב 24 (תשנ"ה).</w:t>
+        <w:t xml:space="preserve">ראבילו, </w:t>
+      </w:r>
+      <w:r>
+        <w:rPr>
+          <w:rFonts w:ascii="David" w:cs="David" w:eastAsia="David" w:hAnsi="David"/>
+          <w:sz w:val="20"/>
+          <w:szCs w:val="20"/>
+          <w:rtl/>
+        </w:rPr>
+        <w:t xml:space="preserve">לעיל ה"ש 32</w:t>
+      </w:r>
+      <w:r>
+        <w:rPr>
+          <w:rFonts w:ascii="David" w:cs="David" w:eastAsia="David" w:hAnsi="David"/>
+          <w:sz w:val="20"/>
+          <w:szCs w:val="20"/>
+          <w:rtl/>
+        </w:rPr>
+        <w:t xml:space="preserve">, בעמ׳ 333–337; להשלמת מתנה בקבלת החזקה ראו גם להלן פרק ו.3 לעניין דרישת הקַבְּץ׳ (התפיסה) במשפט השרעי.</w:t>
       </w:r>
     </w:p>
   </w:footnote>
@@ -8454,6 +8951,29 @@
           <w:szCs w:val="20"/>
           <w:rtl/>
         </w:rPr>
+        <w:t xml:space="preserve">נינה זלצמן "רישיון במקרקעין" הפרקליט מב 24 (תשנ"ה).</w:t>
+      </w:r>
+    </w:p>
+  </w:footnote>
+  <w:footnote w:id="39">
+    <w:p>
+      <w:pPr>
+        <w:bidi/>
+        <w:spacing w:after="60"/>
+      </w:pPr>
+      <w:r>
+        <w:rPr>
+          <w:rStyle w:val="FootnoteReference"/>
+        </w:rPr>
+        <w:footnoteRef/>
+      </w:r>
+      <w:r>
+        <w:rPr>
+          <w:rFonts w:ascii="David" w:cs="David" w:eastAsia="David" w:hAnsi="David"/>
+          <w:sz w:val="20"/>
+          <w:szCs w:val="20"/>
+          <w:rtl/>
+        </w:rPr>
         <w:t xml:space="preserve">ע"א 463/79 </w:t>
       </w:r>
       <w:r>
@@ -8498,7 +9018,7 @@
       </w:r>
     </w:p>
   </w:footnote>
-  <w:footnote w:id="39">
+  <w:footnote w:id="40">
     <w:p>
       <w:pPr>
         <w:bidi/>
@@ -8561,7 +9081,7 @@
       </w:r>
     </w:p>
   </w:footnote>
-  <w:footnote w:id="40">
+  <w:footnote w:id="41">
     <w:p>
       <w:pPr>
         <w:bidi/>
@@ -8624,7 +9144,7 @@
       </w:r>
     </w:p>
   </w:footnote>
-  <w:footnote w:id="41">
+  <w:footnote w:id="42">
     <w:p>
       <w:pPr>
         <w:bidi/>
@@ -8652,7 +9172,7 @@
           <w:szCs w:val="20"/>
           <w:rtl/>
         </w:rPr>
-        <w:t xml:space="preserve">לעיל ה"ש 40</w:t>
+        <w:t xml:space="preserve">לעיל ה"ש 41</w:t>
       </w:r>
       <w:r>
         <w:rPr>
@@ -8670,7 +9190,7 @@
           <w:szCs w:val="20"/>
           <w:rtl/>
         </w:rPr>
-        <w:t xml:space="preserve">לעיל ה"ש 37</w:t>
+        <w:t xml:space="preserve">לעיל ה"ש 38</w:t>
       </w:r>
       <w:r>
         <w:rPr>
@@ -8683,7 +9203,7 @@
       </w:r>
     </w:p>
   </w:footnote>
-  <w:footnote w:id="42">
+  <w:footnote w:id="43">
     <w:p>
       <w:pPr>
         <w:bidi/>
@@ -8702,7 +9222,7 @@
           <w:szCs w:val="20"/>
           <w:rtl/>
         </w:rPr>
-        <w:t xml:space="preserve">ראו למשל תלה"מ (משפחה נצ׳) 60777-07-20 </w:t>
+        <w:t xml:space="preserve">ע"א 749/18 </w:t>
       </w:r>
       <w:r>
         <w:rPr>
@@ -8713,16 +9233,39 @@
           <w:szCs w:val="20"/>
           <w:rtl/>
         </w:rPr>
-        <w:t xml:space="preserve">ג.ס נ׳ מ.ד</w:t>
-      </w:r>
-      <w:r>
-        <w:rPr>
-          <w:rFonts w:ascii="David" w:cs="David" w:eastAsia="David" w:hAnsi="David"/>
-          <w:sz w:val="20"/>
-          <w:szCs w:val="20"/>
-          <w:rtl/>
-        </w:rPr>
-        <w:t xml:space="preserve"> (נבו 2021); תמ"ש (משפחה נצ׳) 4821-07 </w:t>
+        <w:t xml:space="preserve">עיזבון אבו ג׳נימה נ׳ עיזבון אבו ג׳נימה</w:t>
+      </w:r>
+      <w:r>
+        <w:rPr>
+          <w:rFonts w:ascii="David" w:cs="David" w:eastAsia="David" w:hAnsi="David"/>
+          <w:sz w:val="20"/>
+          <w:szCs w:val="20"/>
+          <w:rtl/>
+        </w:rPr>
+        <w:t xml:space="preserve"> (נבו 26.7.2020).</w:t>
+      </w:r>
+    </w:p>
+  </w:footnote>
+  <w:footnote w:id="44">
+    <w:p>
+      <w:pPr>
+        <w:bidi/>
+        <w:spacing w:after="60"/>
+      </w:pPr>
+      <w:r>
+        <w:rPr>
+          <w:rStyle w:val="FootnoteReference"/>
+        </w:rPr>
+        <w:footnoteRef/>
+      </w:r>
+      <w:r>
+        <w:rPr>
+          <w:rFonts w:ascii="David" w:cs="David" w:eastAsia="David" w:hAnsi="David"/>
+          <w:sz w:val="20"/>
+          <w:szCs w:val="20"/>
+          <w:rtl/>
+        </w:rPr>
+        <w:t xml:space="preserve">ע"א 2693/19 </w:t>
       </w:r>
       <w:r>
         <w:rPr>
@@ -8733,16 +9276,16 @@
           <w:szCs w:val="20"/>
           <w:rtl/>
         </w:rPr>
-        <w:t xml:space="preserve">ס.ע.ז נ׳ ע.ע.ז</w:t>
-      </w:r>
-      <w:r>
-        <w:rPr>
-          <w:rFonts w:ascii="David" w:cs="David" w:eastAsia="David" w:hAnsi="David"/>
-          <w:sz w:val="20"/>
-          <w:szCs w:val="20"/>
-          <w:rtl/>
-        </w:rPr>
-        <w:t xml:space="preserve"> (נבו 2012); עניין </w:t>
+        <w:t xml:space="preserve">משעל נ׳ כמאל</w:t>
+      </w:r>
+      <w:r>
+        <w:rPr>
+          <w:rFonts w:ascii="David" w:cs="David" w:eastAsia="David" w:hAnsi="David"/>
+          <w:sz w:val="20"/>
+          <w:szCs w:val="20"/>
+          <w:rtl/>
+        </w:rPr>
+        <w:t xml:space="preserve"> (נבו 22.9.2020); וראו גם בע"מ 7496/19 </w:t>
       </w:r>
       <w:r>
         <w:rPr>
@@ -8753,116 +9296,16 @@
           <w:szCs w:val="20"/>
           <w:rtl/>
         </w:rPr>
-        <w:t xml:space="preserve">אבו ליל</w:t>
-      </w:r>
-      <w:r>
-        <w:rPr>
-          <w:rFonts w:ascii="David" w:cs="David" w:eastAsia="David" w:hAnsi="David"/>
-          <w:sz w:val="20"/>
-          <w:szCs w:val="20"/>
-          <w:rtl/>
-        </w:rPr>
-        <w:t xml:space="preserve">, </w:t>
-      </w:r>
-      <w:r>
-        <w:rPr>
-          <w:rFonts w:ascii="David" w:cs="David" w:eastAsia="David" w:hAnsi="David"/>
-          <w:sz w:val="20"/>
-          <w:szCs w:val="20"/>
-          <w:rtl/>
-        </w:rPr>
-        <w:t xml:space="preserve">לעיל ה"ש 27</w:t>
-      </w:r>
-      <w:r>
-        <w:rPr>
-          <w:rFonts w:ascii="David" w:cs="David" w:eastAsia="David" w:hAnsi="David"/>
-          <w:sz w:val="20"/>
-          <w:szCs w:val="20"/>
-          <w:rtl/>
-        </w:rPr>
-        <w:t xml:space="preserve">.</w:t>
-      </w:r>
-    </w:p>
-  </w:footnote>
-  <w:footnote w:id="43">
-    <w:p>
-      <w:pPr>
-        <w:bidi/>
-        <w:spacing w:after="60"/>
-      </w:pPr>
-      <w:r>
-        <w:rPr>
-          <w:rStyle w:val="FootnoteReference"/>
-        </w:rPr>
-        <w:footnoteRef/>
-      </w:r>
-      <w:r>
-        <w:rPr>
-          <w:rFonts w:ascii="David" w:cs="David" w:eastAsia="David" w:hAnsi="David"/>
-          <w:sz w:val="20"/>
-          <w:szCs w:val="20"/>
-          <w:rtl/>
-        </w:rPr>
-        <w:t xml:space="preserve">לביקורת עקרונית על אי-הוודאות הנובעת משסתומי יושר ותום לב בדיני הקניין השוו רייכמן, </w:t>
-      </w:r>
-      <w:r>
-        <w:rPr>
-          <w:rFonts w:ascii="David" w:cs="David" w:eastAsia="David" w:hAnsi="David"/>
-          <w:sz w:val="20"/>
-          <w:szCs w:val="20"/>
-          <w:rtl/>
-        </w:rPr>
-        <w:t xml:space="preserve">לעיל ה"ש 9</w:t>
-      </w:r>
-      <w:r>
-        <w:rPr>
-          <w:rFonts w:ascii="David" w:cs="David" w:eastAsia="David" w:hAnsi="David"/>
-          <w:sz w:val="20"/>
-          <w:szCs w:val="20"/>
-          <w:rtl/>
-        </w:rPr>
-        <w:t xml:space="preserve">, בעמ׳ 297 ואילך; וכהן, </w:t>
-      </w:r>
-      <w:r>
-        <w:rPr>
-          <w:rFonts w:ascii="David" w:cs="David" w:eastAsia="David" w:hAnsi="David"/>
-          <w:sz w:val="20"/>
-          <w:szCs w:val="20"/>
-          <w:rtl/>
-        </w:rPr>
-        <w:t xml:space="preserve">לעיל ה"ש 31</w:t>
-      </w:r>
-      <w:r>
-        <w:rPr>
-          <w:rFonts w:ascii="David" w:cs="David" w:eastAsia="David" w:hAnsi="David"/>
-          <w:sz w:val="20"/>
-          <w:szCs w:val="20"/>
-          <w:rtl/>
-        </w:rPr>
-        <w:t xml:space="preserve">.</w:t>
-      </w:r>
-    </w:p>
-  </w:footnote>
-  <w:footnote w:id="44">
-    <w:p>
-      <w:pPr>
-        <w:bidi/>
-        <w:spacing w:after="60"/>
-      </w:pPr>
-      <w:r>
-        <w:rPr>
-          <w:rStyle w:val="FootnoteReference"/>
-        </w:rPr>
-        <w:footnoteRef/>
-      </w:r>
-      <w:r>
-        <w:rPr>
-          <w:rFonts w:ascii="David" w:cs="David" w:eastAsia="David" w:hAnsi="David"/>
-          <w:sz w:val="20"/>
-          <w:szCs w:val="20"/>
-          <w:rtl/>
-        </w:rPr>
-        <w:t xml:space="preserve">תק׳ 36–38 לתקנות התכנון והבניה (רישוי בניה), התשע"ו-2016; וקודם לכן תק׳ 2א לתקנות התכנון והבניה (בקשה להיתר, תנאיו ואגרות), התש"ל-1970. ההלכה חזרה והדגישה כי מוסדות התכנון אינם מכריעים בסכסוכי קניין.</w:t>
+        <w:t xml:space="preserve">פלוני נ׳ פלוני</w:t>
+      </w:r>
+      <w:r>
+        <w:rPr>
+          <w:rFonts w:ascii="David" w:cs="David" w:eastAsia="David" w:hAnsi="David"/>
+          <w:sz w:val="20"/>
+          <w:szCs w:val="20"/>
+          <w:rtl/>
+        </w:rPr>
+        <w:t xml:space="preserve"> (נבו 30.12.2019).</w:t>
       </w:r>
     </w:p>
   </w:footnote>
@@ -8885,25 +9328,7 @@
           <w:szCs w:val="20"/>
           <w:rtl/>
         </w:rPr>
-        <w:t xml:space="preserve">ראו פסיקת ערכאות המשפחה שנסקרה לעיל, </w:t>
-      </w:r>
-      <w:r>
-        <w:rPr>
-          <w:rFonts w:ascii="David" w:cs="David" w:eastAsia="David" w:hAnsi="David"/>
-          <w:sz w:val="20"/>
-          <w:szCs w:val="20"/>
-          <w:rtl/>
-        </w:rPr>
-        <w:t xml:space="preserve">לעיל ה"ש 42</w:t>
-      </w:r>
-      <w:r>
-        <w:rPr>
-          <w:rFonts w:ascii="David" w:cs="David" w:eastAsia="David" w:hAnsi="David"/>
-          <w:sz w:val="20"/>
-          <w:szCs w:val="20"/>
-          <w:rtl/>
-        </w:rPr>
-        <w:t xml:space="preserve">; ולמשקל ההשקעה והבנייה בהסכמה ראו עניין </w:t>
+        <w:t xml:space="preserve">תלה"מ (משפחה נצ׳) 60777-07-20 </w:t>
       </w:r>
       <w:r>
         <w:rPr>
@@ -8914,7 +9339,47 @@
           <w:szCs w:val="20"/>
           <w:rtl/>
         </w:rPr>
-        <w:t xml:space="preserve">ג׳בראן</w:t>
+        <w:t xml:space="preserve">ג.ס נ׳ מ.ד</w:t>
+      </w:r>
+      <w:r>
+        <w:rPr>
+          <w:rFonts w:ascii="David" w:cs="David" w:eastAsia="David" w:hAnsi="David"/>
+          <w:sz w:val="20"/>
+          <w:szCs w:val="20"/>
+          <w:rtl/>
+        </w:rPr>
+        <w:t xml:space="preserve"> (נבו 14.4.2021); וראו גם תמ"ש (משפחה נצ׳) 4821-07 </w:t>
+      </w:r>
+      <w:r>
+        <w:rPr>
+          <w:rFonts w:ascii="David" w:cs="David" w:eastAsia="David" w:hAnsi="David"/>
+          <w:i/>
+          <w:iCs/>
+          <w:sz w:val="20"/>
+          <w:szCs w:val="20"/>
+          <w:rtl/>
+        </w:rPr>
+        <w:t xml:space="preserve">ס.ע.ז נ׳ ע.ע.ז</w:t>
+      </w:r>
+      <w:r>
+        <w:rPr>
+          <w:rFonts w:ascii="David" w:cs="David" w:eastAsia="David" w:hAnsi="David"/>
+          <w:sz w:val="20"/>
+          <w:szCs w:val="20"/>
+          <w:rtl/>
+        </w:rPr>
+        <w:t xml:space="preserve"> (נבו 2012); עניין </w:t>
+      </w:r>
+      <w:r>
+        <w:rPr>
+          <w:rFonts w:ascii="David" w:cs="David" w:eastAsia="David" w:hAnsi="David"/>
+          <w:i/>
+          <w:iCs/>
+          <w:sz w:val="20"/>
+          <w:szCs w:val="20"/>
+          <w:rtl/>
+        </w:rPr>
+        <w:t xml:space="preserve">אבו ליל</w:t>
       </w:r>
       <w:r>
         <w:rPr>
@@ -8932,7 +9397,7 @@
           <w:szCs w:val="20"/>
           <w:rtl/>
         </w:rPr>
-        <w:t xml:space="preserve">לעיל ה"ש 38</w:t>
+        <w:t xml:space="preserve">לעיל ה"ש 27</w:t>
       </w:r>
       <w:r>
         <w:rPr>
@@ -8964,7 +9429,27 @@
           <w:szCs w:val="20"/>
           <w:rtl/>
         </w:rPr>
-        <w:t xml:space="preserve">ס׳ 269 ו-326 לפקודת העיריות [נוסח חדש]. שוכר, בר-רשות ואף פולש עשויים להירשם כמחזיקים לצורכי ארנונה.</w:t>
+        <w:t xml:space="preserve">תמ"ש (משפחה נצ׳) 27669-01-17 </w:t>
+      </w:r>
+      <w:r>
+        <w:rPr>
+          <w:rFonts w:ascii="David" w:cs="David" w:eastAsia="David" w:hAnsi="David"/>
+          <w:i/>
+          <w:iCs/>
+          <w:sz w:val="20"/>
+          <w:szCs w:val="20"/>
+          <w:rtl/>
+        </w:rPr>
+        <w:t xml:space="preserve">ו.ע נ׳ כ.ע</w:t>
+      </w:r>
+      <w:r>
+        <w:rPr>
+          <w:rFonts w:ascii="David" w:cs="David" w:eastAsia="David" w:hAnsi="David"/>
+          <w:sz w:val="20"/>
+          <w:szCs w:val="20"/>
+          <w:rtl/>
+        </w:rPr>
+        <w:t xml:space="preserve"> (נבו 22.4.2018).</w:t>
       </w:r>
     </w:p>
   </w:footnote>
@@ -8987,7 +9472,7 @@
           <w:szCs w:val="20"/>
           <w:rtl/>
         </w:rPr>
-        <w:t xml:space="preserve">ראו עניין </w:t>
+        <w:t xml:space="preserve">תלה"מ (משפחה נצ׳) 39735-12-19 </w:t>
       </w:r>
       <w:r>
         <w:rPr>
@@ -8998,34 +9483,39 @@
           <w:szCs w:val="20"/>
           <w:rtl/>
         </w:rPr>
-        <w:t xml:space="preserve">נאטור</w:t>
-      </w:r>
-      <w:r>
-        <w:rPr>
-          <w:rFonts w:ascii="David" w:cs="David" w:eastAsia="David" w:hAnsi="David"/>
-          <w:sz w:val="20"/>
-          <w:szCs w:val="20"/>
-          <w:rtl/>
-        </w:rPr>
-        <w:t xml:space="preserve">, </w:t>
-      </w:r>
-      <w:r>
-        <w:rPr>
-          <w:rFonts w:ascii="David" w:cs="David" w:eastAsia="David" w:hAnsi="David"/>
-          <w:sz w:val="20"/>
-          <w:szCs w:val="20"/>
-          <w:rtl/>
-        </w:rPr>
-        <w:t xml:space="preserve">לעיל ה"ש 24</w:t>
-      </w:r>
-      <w:r>
-        <w:rPr>
-          <w:rFonts w:ascii="David" w:cs="David" w:eastAsia="David" w:hAnsi="David"/>
-          <w:sz w:val="20"/>
-          <w:szCs w:val="20"/>
-          <w:rtl/>
-        </w:rPr>
-        <w:t xml:space="preserve">; עניין </w:t>
+        <w:t xml:space="preserve">פלונית נ׳ פלוני</w:t>
+      </w:r>
+      <w:r>
+        <w:rPr>
+          <w:rFonts w:ascii="David" w:cs="David" w:eastAsia="David" w:hAnsi="David"/>
+          <w:sz w:val="20"/>
+          <w:szCs w:val="20"/>
+          <w:rtl/>
+        </w:rPr>
+        <w:t xml:space="preserve"> (נבו 14.10.2022).</w:t>
+      </w:r>
+    </w:p>
+  </w:footnote>
+  <w:footnote w:id="48">
+    <w:p>
+      <w:pPr>
+        <w:bidi/>
+        <w:spacing w:after="60"/>
+      </w:pPr>
+      <w:r>
+        <w:rPr>
+          <w:rStyle w:val="FootnoteReference"/>
+        </w:rPr>
+        <w:footnoteRef/>
+      </w:r>
+      <w:r>
+        <w:rPr>
+          <w:rFonts w:ascii="David" w:cs="David" w:eastAsia="David" w:hAnsi="David"/>
+          <w:sz w:val="20"/>
+          <w:szCs w:val="20"/>
+          <w:rtl/>
+        </w:rPr>
+        <w:t xml:space="preserve">תמ"ש (משפחה חד׳) 44358-11-19 </w:t>
       </w:r>
       <w:r>
         <w:rPr>
@@ -9036,61 +9526,389 @@
           <w:szCs w:val="20"/>
           <w:rtl/>
         </w:rPr>
-        <w:t xml:space="preserve">אבו ליל</w:t>
-      </w:r>
-      <w:r>
-        <w:rPr>
-          <w:rFonts w:ascii="David" w:cs="David" w:eastAsia="David" w:hAnsi="David"/>
-          <w:sz w:val="20"/>
-          <w:szCs w:val="20"/>
-          <w:rtl/>
-        </w:rPr>
-        <w:t xml:space="preserve">, </w:t>
-      </w:r>
-      <w:r>
-        <w:rPr>
-          <w:rFonts w:ascii="David" w:cs="David" w:eastAsia="David" w:hAnsi="David"/>
-          <w:sz w:val="20"/>
-          <w:szCs w:val="20"/>
-          <w:rtl/>
-        </w:rPr>
-        <w:t xml:space="preserve">לעיל ה"ש 27</w:t>
-      </w:r>
-      <w:r>
-        <w:rPr>
-          <w:rFonts w:ascii="David" w:cs="David" w:eastAsia="David" w:hAnsi="David"/>
-          <w:sz w:val="20"/>
-          <w:szCs w:val="20"/>
-          <w:rtl/>
-        </w:rPr>
-        <w:t xml:space="preserve">.</w:t>
-      </w:r>
-    </w:p>
-  </w:footnote>
-  <w:footnote w:id="48">
-    <w:p>
-      <w:pPr>
-        <w:bidi/>
-        <w:spacing w:after="60"/>
-      </w:pPr>
-      <w:r>
-        <w:rPr>
-          <w:rStyle w:val="FootnoteReference"/>
-        </w:rPr>
-        <w:footnoteRef/>
-      </w:r>
-      <w:r>
-        <w:rPr>
-          <w:rFonts w:ascii="David" w:cs="David" w:eastAsia="David" w:hAnsi="David"/>
-          <w:sz w:val="20"/>
-          <w:szCs w:val="20"/>
-          <w:rtl/>
-        </w:rPr>
-        <w:t xml:space="preserve">ס׳ 54(4) לפקודת הראיות [נוסח חדש], התשל"א-1971.</w:t>
+        <w:t xml:space="preserve">אלמונית נ׳ פלונית</w:t>
+      </w:r>
+      <w:r>
+        <w:rPr>
+          <w:rFonts w:ascii="David" w:cs="David" w:eastAsia="David" w:hAnsi="David"/>
+          <w:sz w:val="20"/>
+          <w:szCs w:val="20"/>
+          <w:rtl/>
+        </w:rPr>
+        <w:t xml:space="preserve"> (נבו 7.5.2023).</w:t>
       </w:r>
     </w:p>
   </w:footnote>
   <w:footnote w:id="49">
+    <w:p>
+      <w:pPr>
+        <w:bidi/>
+        <w:spacing w:after="60"/>
+      </w:pPr>
+      <w:r>
+        <w:rPr>
+          <w:rStyle w:val="FootnoteReference"/>
+        </w:rPr>
+        <w:footnoteRef/>
+      </w:r>
+      <w:r>
+        <w:rPr>
+          <w:rFonts w:ascii="David" w:cs="David" w:eastAsia="David" w:hAnsi="David"/>
+          <w:sz w:val="20"/>
+          <w:szCs w:val="20"/>
+          <w:rtl/>
+        </w:rPr>
+        <w:t xml:space="preserve">רע"א 4890/15 </w:t>
+      </w:r>
+      <w:r>
+        <w:rPr>
+          <w:rFonts w:ascii="David" w:cs="David" w:eastAsia="David" w:hAnsi="David"/>
+          <w:i/>
+          <w:iCs/>
+          <w:sz w:val="20"/>
+          <w:szCs w:val="20"/>
+          <w:rtl/>
+        </w:rPr>
+        <w:t xml:space="preserve">אלוש נ׳ עיריית טבריה</w:t>
+      </w:r>
+      <w:r>
+        <w:rPr>
+          <w:rFonts w:ascii="David" w:cs="David" w:eastAsia="David" w:hAnsi="David"/>
+          <w:sz w:val="20"/>
+          <w:szCs w:val="20"/>
+          <w:rtl/>
+        </w:rPr>
+        <w:t xml:space="preserve"> (נבו 31.12.2015).</w:t>
+      </w:r>
+    </w:p>
+  </w:footnote>
+  <w:footnote w:id="50">
+    <w:p>
+      <w:pPr>
+        <w:bidi/>
+        <w:spacing w:after="60"/>
+      </w:pPr>
+      <w:r>
+        <w:rPr>
+          <w:rStyle w:val="FootnoteReference"/>
+        </w:rPr>
+        <w:footnoteRef/>
+      </w:r>
+      <w:r>
+        <w:rPr>
+          <w:rFonts w:ascii="David" w:cs="David" w:eastAsia="David" w:hAnsi="David"/>
+          <w:sz w:val="20"/>
+          <w:szCs w:val="20"/>
+          <w:rtl/>
+        </w:rPr>
+        <w:t xml:space="preserve">לביקורת עקרונית על אי-הוודאות הנובעת משסתומי יושר ותום לב בדיני הקניין השוו רייכמן, </w:t>
+      </w:r>
+      <w:r>
+        <w:rPr>
+          <w:rFonts w:ascii="David" w:cs="David" w:eastAsia="David" w:hAnsi="David"/>
+          <w:sz w:val="20"/>
+          <w:szCs w:val="20"/>
+          <w:rtl/>
+        </w:rPr>
+        <w:t xml:space="preserve">לעיל ה"ש 9</w:t>
+      </w:r>
+      <w:r>
+        <w:rPr>
+          <w:rFonts w:ascii="David" w:cs="David" w:eastAsia="David" w:hAnsi="David"/>
+          <w:sz w:val="20"/>
+          <w:szCs w:val="20"/>
+          <w:rtl/>
+        </w:rPr>
+        <w:t xml:space="preserve">, בעמ׳ 297 ואילך; וכהן, </w:t>
+      </w:r>
+      <w:r>
+        <w:rPr>
+          <w:rFonts w:ascii="David" w:cs="David" w:eastAsia="David" w:hAnsi="David"/>
+          <w:sz w:val="20"/>
+          <w:szCs w:val="20"/>
+          <w:rtl/>
+        </w:rPr>
+        <w:t xml:space="preserve">לעיל ה"ש 31</w:t>
+      </w:r>
+      <w:r>
+        <w:rPr>
+          <w:rFonts w:ascii="David" w:cs="David" w:eastAsia="David" w:hAnsi="David"/>
+          <w:sz w:val="20"/>
+          <w:szCs w:val="20"/>
+          <w:rtl/>
+        </w:rPr>
+        <w:t xml:space="preserve">.</w:t>
+      </w:r>
+    </w:p>
+  </w:footnote>
+  <w:footnote w:id="51">
+    <w:p>
+      <w:pPr>
+        <w:bidi/>
+        <w:spacing w:after="60"/>
+      </w:pPr>
+      <w:r>
+        <w:rPr>
+          <w:rStyle w:val="FootnoteReference"/>
+        </w:rPr>
+        <w:footnoteRef/>
+      </w:r>
+      <w:r>
+        <w:rPr>
+          <w:rFonts w:ascii="David" w:cs="David" w:eastAsia="David" w:hAnsi="David"/>
+          <w:sz w:val="20"/>
+          <w:szCs w:val="20"/>
+          <w:rtl/>
+        </w:rPr>
+        <w:t xml:space="preserve">תק׳ 36–38 לתקנות התכנון והבניה (רישוי בניה), התשע"ו-2016; וקודם לכן תק׳ 2א לתקנות התכנון והבניה (בקשה להיתר, תנאיו ואגרות), התש"ל-1970. ההלכה חזרה והדגישה כי מוסדות התכנון אינם מכריעים בסכסוכי קניין.</w:t>
+      </w:r>
+    </w:p>
+  </w:footnote>
+  <w:footnote w:id="52">
+    <w:p>
+      <w:pPr>
+        <w:bidi/>
+        <w:spacing w:after="60"/>
+      </w:pPr>
+      <w:r>
+        <w:rPr>
+          <w:rStyle w:val="FootnoteReference"/>
+        </w:rPr>
+        <w:footnoteRef/>
+      </w:r>
+      <w:r>
+        <w:rPr>
+          <w:rFonts w:ascii="David" w:cs="David" w:eastAsia="David" w:hAnsi="David"/>
+          <w:sz w:val="20"/>
+          <w:szCs w:val="20"/>
+          <w:rtl/>
+        </w:rPr>
+        <w:t xml:space="preserve">ראו פסיקת ערכאות המשפחה שנסקרה לעיל, </w:t>
+      </w:r>
+      <w:r>
+        <w:rPr>
+          <w:rFonts w:ascii="David" w:cs="David" w:eastAsia="David" w:hAnsi="David"/>
+          <w:sz w:val="20"/>
+          <w:szCs w:val="20"/>
+          <w:rtl/>
+        </w:rPr>
+        <w:t xml:space="preserve">לעיל ה"ש 45</w:t>
+      </w:r>
+      <w:r>
+        <w:rPr>
+          <w:rFonts w:ascii="David" w:cs="David" w:eastAsia="David" w:hAnsi="David"/>
+          <w:sz w:val="20"/>
+          <w:szCs w:val="20"/>
+          <w:rtl/>
+        </w:rPr>
+        <w:t xml:space="preserve">; ולמשקל ההשקעה והבנייה בהסכמה ראו עניין </w:t>
+      </w:r>
+      <w:r>
+        <w:rPr>
+          <w:rFonts w:ascii="David" w:cs="David" w:eastAsia="David" w:hAnsi="David"/>
+          <w:i/>
+          <w:iCs/>
+          <w:sz w:val="20"/>
+          <w:szCs w:val="20"/>
+          <w:rtl/>
+        </w:rPr>
+        <w:t xml:space="preserve">ג׳בראן</w:t>
+      </w:r>
+      <w:r>
+        <w:rPr>
+          <w:rFonts w:ascii="David" w:cs="David" w:eastAsia="David" w:hAnsi="David"/>
+          <w:sz w:val="20"/>
+          <w:szCs w:val="20"/>
+          <w:rtl/>
+        </w:rPr>
+        <w:t xml:space="preserve">, </w:t>
+      </w:r>
+      <w:r>
+        <w:rPr>
+          <w:rFonts w:ascii="David" w:cs="David" w:eastAsia="David" w:hAnsi="David"/>
+          <w:sz w:val="20"/>
+          <w:szCs w:val="20"/>
+          <w:rtl/>
+        </w:rPr>
+        <w:t xml:space="preserve">לעיל ה"ש 39</w:t>
+      </w:r>
+      <w:r>
+        <w:rPr>
+          <w:rFonts w:ascii="David" w:cs="David" w:eastAsia="David" w:hAnsi="David"/>
+          <w:sz w:val="20"/>
+          <w:szCs w:val="20"/>
+          <w:rtl/>
+        </w:rPr>
+        <w:t xml:space="preserve">.</w:t>
+      </w:r>
+    </w:p>
+  </w:footnote>
+  <w:footnote w:id="53">
+    <w:p>
+      <w:pPr>
+        <w:bidi/>
+        <w:spacing w:after="60"/>
+      </w:pPr>
+      <w:r>
+        <w:rPr>
+          <w:rStyle w:val="FootnoteReference"/>
+        </w:rPr>
+        <w:footnoteRef/>
+      </w:r>
+      <w:r>
+        <w:rPr>
+          <w:rFonts w:ascii="David" w:cs="David" w:eastAsia="David" w:hAnsi="David"/>
+          <w:sz w:val="20"/>
+          <w:szCs w:val="20"/>
+          <w:rtl/>
+        </w:rPr>
+        <w:t xml:space="preserve">ס׳ 269 ו-326 לפקודת העיריות [נוסח חדש]. שוכר, בר-רשות ואף פולש עשויים להירשם כמחזיקים לצורכי ארנונה.</w:t>
+      </w:r>
+    </w:p>
+  </w:footnote>
+  <w:footnote w:id="54">
+    <w:p>
+      <w:pPr>
+        <w:bidi/>
+        <w:spacing w:after="60"/>
+      </w:pPr>
+      <w:r>
+        <w:rPr>
+          <w:rStyle w:val="FootnoteReference"/>
+        </w:rPr>
+        <w:footnoteRef/>
+      </w:r>
+      <w:r>
+        <w:rPr>
+          <w:rFonts w:ascii="David" w:cs="David" w:eastAsia="David" w:hAnsi="David"/>
+          <w:sz w:val="20"/>
+          <w:szCs w:val="20"/>
+          <w:rtl/>
+        </w:rPr>
+        <w:t xml:space="preserve">ראו עניין </w:t>
+      </w:r>
+      <w:r>
+        <w:rPr>
+          <w:rFonts w:ascii="David" w:cs="David" w:eastAsia="David" w:hAnsi="David"/>
+          <w:i/>
+          <w:iCs/>
+          <w:sz w:val="20"/>
+          <w:szCs w:val="20"/>
+          <w:rtl/>
+        </w:rPr>
+        <w:t xml:space="preserve">נאטור</w:t>
+      </w:r>
+      <w:r>
+        <w:rPr>
+          <w:rFonts w:ascii="David" w:cs="David" w:eastAsia="David" w:hAnsi="David"/>
+          <w:sz w:val="20"/>
+          <w:szCs w:val="20"/>
+          <w:rtl/>
+        </w:rPr>
+        <w:t xml:space="preserve">, </w:t>
+      </w:r>
+      <w:r>
+        <w:rPr>
+          <w:rFonts w:ascii="David" w:cs="David" w:eastAsia="David" w:hAnsi="David"/>
+          <w:sz w:val="20"/>
+          <w:szCs w:val="20"/>
+          <w:rtl/>
+        </w:rPr>
+        <w:t xml:space="preserve">לעיל ה"ש 24</w:t>
+      </w:r>
+      <w:r>
+        <w:rPr>
+          <w:rFonts w:ascii="David" w:cs="David" w:eastAsia="David" w:hAnsi="David"/>
+          <w:sz w:val="20"/>
+          <w:szCs w:val="20"/>
+          <w:rtl/>
+        </w:rPr>
+        <w:t xml:space="preserve">; עניין </w:t>
+      </w:r>
+      <w:r>
+        <w:rPr>
+          <w:rFonts w:ascii="David" w:cs="David" w:eastAsia="David" w:hAnsi="David"/>
+          <w:i/>
+          <w:iCs/>
+          <w:sz w:val="20"/>
+          <w:szCs w:val="20"/>
+          <w:rtl/>
+        </w:rPr>
+        <w:t xml:space="preserve">אבו ליל</w:t>
+      </w:r>
+      <w:r>
+        <w:rPr>
+          <w:rFonts w:ascii="David" w:cs="David" w:eastAsia="David" w:hAnsi="David"/>
+          <w:sz w:val="20"/>
+          <w:szCs w:val="20"/>
+          <w:rtl/>
+        </w:rPr>
+        <w:t xml:space="preserve">, </w:t>
+      </w:r>
+      <w:r>
+        <w:rPr>
+          <w:rFonts w:ascii="David" w:cs="David" w:eastAsia="David" w:hAnsi="David"/>
+          <w:sz w:val="20"/>
+          <w:szCs w:val="20"/>
+          <w:rtl/>
+        </w:rPr>
+        <w:t xml:space="preserve">לעיל ה"ש 27</w:t>
+      </w:r>
+      <w:r>
+        <w:rPr>
+          <w:rFonts w:ascii="David" w:cs="David" w:eastAsia="David" w:hAnsi="David"/>
+          <w:sz w:val="20"/>
+          <w:szCs w:val="20"/>
+          <w:rtl/>
+        </w:rPr>
+        <w:t xml:space="preserve">.</w:t>
+      </w:r>
+    </w:p>
+  </w:footnote>
+  <w:footnote w:id="55">
+    <w:p>
+      <w:pPr>
+        <w:bidi/>
+        <w:spacing w:after="60"/>
+      </w:pPr>
+      <w:r>
+        <w:rPr>
+          <w:rStyle w:val="FootnoteReference"/>
+        </w:rPr>
+        <w:footnoteRef/>
+      </w:r>
+      <w:r>
+        <w:rPr>
+          <w:rFonts w:ascii="David" w:cs="David" w:eastAsia="David" w:hAnsi="David"/>
+          <w:sz w:val="20"/>
+          <w:szCs w:val="20"/>
+          <w:rtl/>
+        </w:rPr>
+        <w:t xml:space="preserve">ס׳ 54(4) לפקודת הראיות [נוסח חדש], התשל"א-1971. ליישום מובהק ראו ע"א 4116/20 </w:t>
+      </w:r>
+      <w:r>
+        <w:rPr>
+          <w:rFonts w:ascii="David" w:cs="David" w:eastAsia="David" w:hAnsi="David"/>
+          <w:i/>
+          <w:iCs/>
+          <w:sz w:val="20"/>
+          <w:szCs w:val="20"/>
+          <w:rtl/>
+        </w:rPr>
+        <w:t xml:space="preserve">הוך נ׳ בריכטא</w:t>
+      </w:r>
+      <w:r>
+        <w:rPr>
+          <w:rFonts w:ascii="David" w:cs="David" w:eastAsia="David" w:hAnsi="David"/>
+          <w:sz w:val="20"/>
+          <w:szCs w:val="20"/>
+          <w:rtl/>
+        </w:rPr>
+        <w:t xml:space="preserve"> (נבו 17.9.2020), שבו נדחתה תביעה משפחתית להעברת זכויות מכוח מתנה נטענת נוכח השיהוי, היעדר הרישום, שינויי הגרסה ואי-עמידה בנטל השכנוע הכבד הנדרש נגד עיזבון.</w:t>
+      </w:r>
+    </w:p>
+  </w:footnote>
+  <w:footnote w:id="56">
     <w:p>
       <w:pPr>
         <w:bidi/>
@@ -9143,7 +9961,7 @@
       </w:r>
     </w:p>
   </w:footnote>
-  <w:footnote w:id="50">
+  <w:footnote w:id="57">
     <w:p>
       <w:pPr>
         <w:bidi/>
@@ -9186,7 +10004,7 @@
       </w:r>
     </w:p>
   </w:footnote>
-  <w:footnote w:id="51">
+  <w:footnote w:id="58">
     <w:p>
       <w:pPr>
         <w:bidi/>
@@ -9214,7 +10032,7 @@
           <w:szCs w:val="20"/>
           <w:rtl/>
         </w:rPr>
-        <w:t xml:space="preserve">לעיל ה"ש 50</w:t>
+        <w:t xml:space="preserve">לעיל ה"ש 57</w:t>
       </w:r>
       <w:r>
         <w:rPr>
@@ -9227,7 +10045,7 @@
       </w:r>
     </w:p>
   </w:footnote>
-  <w:footnote w:id="52">
+  <w:footnote w:id="59">
     <w:p>
       <w:pPr>
         <w:bidi/>
@@ -9250,7 +10068,7 @@
       </w:r>
     </w:p>
   </w:footnote>
-  <w:footnote w:id="53">
+  <w:footnote w:id="60">
     <w:p>
       <w:pPr>
         <w:bidi/>
@@ -9273,7 +10091,7 @@
       </w:r>
     </w:p>
   </w:footnote>
-  <w:footnote w:id="54">
+  <w:footnote w:id="61">
     <w:p>
       <w:pPr>
         <w:bidi/>
@@ -9296,7 +10114,7 @@
       </w:r>
     </w:p>
   </w:footnote>
-  <w:footnote w:id="55">
+  <w:footnote w:id="62">
     <w:p>
       <w:pPr>
         <w:bidi/>
@@ -9324,7 +10142,7 @@
           <w:szCs w:val="20"/>
           <w:rtl/>
         </w:rPr>
-        <w:t xml:space="preserve">לעיל ה"ש 50</w:t>
+        <w:t xml:space="preserve">לעיל ה"ש 57</w:t>
       </w:r>
       <w:r>
         <w:rPr>
@@ -9337,7 +10155,7 @@
       </w:r>
     </w:p>
   </w:footnote>
-  <w:footnote w:id="56">
+  <w:footnote w:id="63">
     <w:p>
       <w:pPr>
         <w:bidi/>
@@ -9385,7 +10203,7 @@
           <w:szCs w:val="20"/>
           <w:rtl/>
         </w:rPr>
-        <w:t xml:space="preserve">לעיל ה"ש 50</w:t>
+        <w:t xml:space="preserve">לעיל ה"ש 57</w:t>
       </w:r>
       <w:r>
         <w:rPr>
@@ -9398,7 +10216,7 @@
       </w:r>
     </w:p>
   </w:footnote>
-  <w:footnote w:id="57">
+  <w:footnote w:id="64">
     <w:p>
       <w:pPr>
         <w:bidi/>
@@ -9426,7 +10244,7 @@
           <w:szCs w:val="20"/>
           <w:rtl/>
         </w:rPr>
-        <w:t xml:space="preserve">לעיל ה"ש 50</w:t>
+        <w:t xml:space="preserve">לעיל ה"ש 57</w:t>
       </w:r>
       <w:r>
         <w:rPr>
@@ -9439,7 +10257,7 @@
       </w:r>
     </w:p>
   </w:footnote>
-  <w:footnote w:id="58">
+  <w:footnote w:id="65">
     <w:p>
       <w:pPr>
         <w:bidi/>
@@ -9467,7 +10285,7 @@
           <w:szCs w:val="20"/>
           <w:rtl/>
         </w:rPr>
-        <w:t xml:space="preserve">לעיל ה"ש 50</w:t>
+        <w:t xml:space="preserve">לעיל ה"ש 57</w:t>
       </w:r>
       <w:r>
         <w:rPr>
@@ -9480,7 +10298,7 @@
       </w:r>
     </w:p>
   </w:footnote>
-  <w:footnote w:id="59">
+  <w:footnote w:id="66">
     <w:p>
       <w:pPr>
         <w:bidi/>
@@ -9508,7 +10326,7 @@
           <w:szCs w:val="20"/>
           <w:rtl/>
         </w:rPr>
-        <w:t xml:space="preserve">לעיל ה"ש 51</w:t>
+        <w:t xml:space="preserve">לעיל ה"ש 58</w:t>
       </w:r>
       <w:r>
         <w:rPr>
@@ -9521,7 +10339,7 @@
       </w:r>
     </w:p>
   </w:footnote>
-  <w:footnote w:id="60">
+  <w:footnote w:id="67">
     <w:p>
       <w:pPr>
         <w:bidi/>
@@ -9561,7 +10379,7 @@
       </w:r>
     </w:p>
   </w:footnote>
-  <w:footnote w:id="61">
+  <w:footnote w:id="68">
     <w:p>
       <w:pPr>
         <w:bidi/>
@@ -9622,7 +10440,7 @@
       </w:r>
     </w:p>
   </w:footnote>
-  <w:footnote w:id="62">
+  <w:footnote w:id="69">
     <w:p>
       <w:pPr>
         <w:bidi/>
@@ -9653,7 +10471,7 @@
       </w:r>
     </w:p>
   </w:footnote>
-  <w:footnote w:id="63">
+  <w:footnote w:id="70">
     <w:p>
       <w:pPr>
         <w:bidi/>
@@ -9684,7 +10502,7 @@
       </w:r>
     </w:p>
   </w:footnote>
-  <w:footnote w:id="64">
+  <w:footnote w:id="71">
     <w:p>
       <w:pPr>
         <w:bidi/>
@@ -9745,7 +10563,7 @@
       </w:r>
     </w:p>
   </w:footnote>
-  <w:footnote w:id="65">
+  <w:footnote w:id="72">
     <w:p>
       <w:pPr>
         <w:bidi/>
@@ -9764,284 +10582,6 @@
           <w:szCs w:val="20"/>
         </w:rPr>
         <w:t xml:space="preserve">Land Registration Act 2002, s 27</w:t>
-      </w:r>
-      <w:r>
-        <w:rPr>
-          <w:rFonts w:ascii="David" w:cs="David" w:eastAsia="David" w:hAnsi="David"/>
-          <w:sz w:val="20"/>
-          <w:szCs w:val="20"/>
-          <w:rtl/>
-        </w:rPr>
-        <w:t xml:space="preserve">.</w:t>
-      </w:r>
-    </w:p>
-  </w:footnote>
-  <w:footnote w:id="66">
-    <w:p>
-      <w:pPr>
-        <w:bidi/>
-        <w:spacing w:after="60"/>
-      </w:pPr>
-      <w:r>
-        <w:rPr>
-          <w:rStyle w:val="FootnoteReference"/>
-        </w:rPr>
-        <w:footnoteRef/>
-      </w:r>
-      <w:r>
-        <w:rPr>
-          <w:rFonts w:ascii="Times New Roman" w:cs="Times New Roman" w:eastAsia="Times New Roman" w:hAnsi="Times New Roman"/>
-          <w:sz w:val="20"/>
-          <w:szCs w:val="20"/>
-        </w:rPr>
-        <w:t xml:space="preserve">Williams &amp; Glyn’s Bank Ltd v Boland [1981] AC 487 (HL)</w:t>
-      </w:r>
-      <w:r>
-        <w:rPr>
-          <w:rFonts w:ascii="David" w:cs="David" w:eastAsia="David" w:hAnsi="David"/>
-          <w:sz w:val="20"/>
-          <w:szCs w:val="20"/>
-          <w:rtl/>
-        </w:rPr>
-        <w:t xml:space="preserve">; והמשכה של ההגנה כיום ב-</w:t>
-      </w:r>
-      <w:r>
-        <w:rPr>
-          <w:rFonts w:ascii="Times New Roman" w:cs="Times New Roman" w:eastAsia="Times New Roman" w:hAnsi="Times New Roman"/>
-          <w:sz w:val="20"/>
-          <w:szCs w:val="20"/>
-        </w:rPr>
-        <w:t xml:space="preserve">Land Registration Act 2002, sch 3, para 2</w:t>
-      </w:r>
-      <w:r>
-        <w:rPr>
-          <w:rFonts w:ascii="David" w:cs="David" w:eastAsia="David" w:hAnsi="David"/>
-          <w:sz w:val="20"/>
-          <w:szCs w:val="20"/>
-          <w:rtl/>
-        </w:rPr>
-        <w:t xml:space="preserve">.</w:t>
-      </w:r>
-    </w:p>
-  </w:footnote>
-  <w:footnote w:id="67">
-    <w:p>
-      <w:pPr>
-        <w:bidi/>
-        <w:spacing w:after="60"/>
-      </w:pPr>
-      <w:r>
-        <w:rPr>
-          <w:rStyle w:val="FootnoteReference"/>
-        </w:rPr>
-        <w:footnoteRef/>
-      </w:r>
-      <w:r>
-        <w:rPr>
-          <w:rFonts w:ascii="David" w:cs="David" w:eastAsia="David" w:hAnsi="David"/>
-          <w:sz w:val="20"/>
-          <w:szCs w:val="20"/>
-          <w:rtl/>
-        </w:rPr>
-        <w:t xml:space="preserve">לביקורת עדכנית על מוסד הזכויות הגוברות כסדק ב"עקרון המראה" של המרשם ראו </w:t>
-      </w:r>
-      <w:r>
-        <w:rPr>
-          <w:rFonts w:ascii="Times New Roman" w:cs="Times New Roman" w:eastAsia="Times New Roman" w:hAnsi="Times New Roman"/>
-          <w:sz w:val="20"/>
-          <w:szCs w:val="20"/>
-        </w:rPr>
-        <w:t xml:space="preserve">Chris Bevan, "Overriding Interests under the Land Registration Act 2002: Time to Repair the ‘Cracked Mirror’?" [2024] Conv. 123</w:t>
-      </w:r>
-      <w:r>
-        <w:rPr>
-          <w:rFonts w:ascii="David" w:cs="David" w:eastAsia="David" w:hAnsi="David"/>
-          <w:sz w:val="20"/>
-          <w:szCs w:val="20"/>
-          <w:rtl/>
-        </w:rPr>
-        <w:t xml:space="preserve">.</w:t>
-      </w:r>
-    </w:p>
-  </w:footnote>
-  <w:footnote w:id="68">
-    <w:p>
-      <w:pPr>
-        <w:bidi/>
-        <w:spacing w:after="60"/>
-      </w:pPr>
-      <w:r>
-        <w:rPr>
-          <w:rStyle w:val="FootnoteReference"/>
-        </w:rPr>
-        <w:footnoteRef/>
-      </w:r>
-      <w:r>
-        <w:rPr>
-          <w:rFonts w:ascii="Times New Roman" w:cs="Times New Roman" w:eastAsia="Times New Roman" w:hAnsi="Times New Roman"/>
-          <w:sz w:val="20"/>
-          <w:szCs w:val="20"/>
-        </w:rPr>
-        <w:t xml:space="preserve">Stack v Dowden [2007] UKHL 17, [2007] 2 AC 432; Jones v Kernott [2011] UKSC 53, [2012] 1 AC 776</w:t>
-      </w:r>
-      <w:r>
-        <w:rPr>
-          <w:rFonts w:ascii="David" w:cs="David" w:eastAsia="David" w:hAnsi="David"/>
-          <w:sz w:val="20"/>
-          <w:szCs w:val="20"/>
-          <w:rtl/>
-        </w:rPr>
-        <w:t xml:space="preserve">.</w:t>
-      </w:r>
-    </w:p>
-  </w:footnote>
-  <w:footnote w:id="69">
-    <w:p>
-      <w:pPr>
-        <w:bidi/>
-        <w:spacing w:after="60"/>
-      </w:pPr>
-      <w:r>
-        <w:rPr>
-          <w:rStyle w:val="FootnoteReference"/>
-        </w:rPr>
-        <w:footnoteRef/>
-      </w:r>
-      <w:r>
-        <w:rPr>
-          <w:rFonts w:ascii="Times New Roman" w:cs="Times New Roman" w:eastAsia="Times New Roman" w:hAnsi="Times New Roman"/>
-          <w:sz w:val="20"/>
-          <w:szCs w:val="20"/>
-        </w:rPr>
-        <w:t xml:space="preserve">Thorner v Major [2009] UKHL 18, [2009] 1 WLR 776</w:t>
-      </w:r>
-      <w:r>
-        <w:rPr>
-          <w:rFonts w:ascii="David" w:cs="David" w:eastAsia="David" w:hAnsi="David"/>
-          <w:sz w:val="20"/>
-          <w:szCs w:val="20"/>
-          <w:rtl/>
-        </w:rPr>
-        <w:t xml:space="preserve">.</w:t>
-      </w:r>
-    </w:p>
-  </w:footnote>
-  <w:footnote w:id="70">
-    <w:p>
-      <w:pPr>
-        <w:bidi/>
-        <w:spacing w:after="60"/>
-      </w:pPr>
-      <w:r>
-        <w:rPr>
-          <w:rStyle w:val="FootnoteReference"/>
-        </w:rPr>
-        <w:footnoteRef/>
-      </w:r>
-      <w:r>
-        <w:rPr>
-          <w:rFonts w:ascii="Times New Roman" w:cs="Times New Roman" w:eastAsia="Times New Roman" w:hAnsi="Times New Roman"/>
-          <w:sz w:val="20"/>
-          <w:szCs w:val="20"/>
-        </w:rPr>
-        <w:t xml:space="preserve">Guest v Guest [2022] UKSC 27, [2022] 3 WLR 911</w:t>
-      </w:r>
-      <w:r>
-        <w:rPr>
-          <w:rFonts w:ascii="David" w:cs="David" w:eastAsia="David" w:hAnsi="David"/>
-          <w:sz w:val="20"/>
-          <w:szCs w:val="20"/>
-          <w:rtl/>
-        </w:rPr>
-        <w:t xml:space="preserve">. לניתוח עדכני ראו </w:t>
-      </w:r>
-      <w:r>
-        <w:rPr>
-          <w:rFonts w:ascii="Times New Roman" w:cs="Times New Roman" w:eastAsia="Times New Roman" w:hAnsi="Times New Roman"/>
-          <w:sz w:val="20"/>
-          <w:szCs w:val="20"/>
-        </w:rPr>
-        <w:t xml:space="preserve">Alex Waghorn, "Promises in Equity and at Law: Proprietary Estoppel after Guest v Guest" (2023) 86 MLR 1504; Brian Sloan, "Proprietary Estoppel in the Supreme Court: Banquo’s Ghost?" (2023) 82 CLJ 13</w:t>
-      </w:r>
-      <w:r>
-        <w:rPr>
-          <w:rFonts w:ascii="David" w:cs="David" w:eastAsia="David" w:hAnsi="David"/>
-          <w:sz w:val="20"/>
-          <w:szCs w:val="20"/>
-          <w:rtl/>
-        </w:rPr>
-        <w:t xml:space="preserve">.</w:t>
-      </w:r>
-    </w:p>
-  </w:footnote>
-  <w:footnote w:id="71">
-    <w:p>
-      <w:pPr>
-        <w:bidi/>
-        <w:spacing w:after="60"/>
-      </w:pPr>
-      <w:r>
-        <w:rPr>
-          <w:rStyle w:val="FootnoteReference"/>
-        </w:rPr>
-        <w:footnoteRef/>
-      </w:r>
-      <w:r>
-        <w:rPr>
-          <w:rFonts w:ascii="Times New Roman" w:cs="Times New Roman" w:eastAsia="Times New Roman" w:hAnsi="Times New Roman"/>
-          <w:sz w:val="20"/>
-          <w:szCs w:val="20"/>
-        </w:rPr>
-        <w:t xml:space="preserve">Law of Property (Miscellaneous Provisions) Act 1989, ss 1–2</w:t>
-      </w:r>
-      <w:r>
-        <w:rPr>
-          <w:rFonts w:ascii="David" w:cs="David" w:eastAsia="David" w:hAnsi="David"/>
-          <w:sz w:val="20"/>
-          <w:szCs w:val="20"/>
-          <w:rtl/>
-        </w:rPr>
-        <w:t xml:space="preserve">. וראו כבר את ראבילו, </w:t>
-      </w:r>
-      <w:r>
-        <w:rPr>
-          <w:rFonts w:ascii="David" w:cs="David" w:eastAsia="David" w:hAnsi="David"/>
-          <w:sz w:val="20"/>
-          <w:szCs w:val="20"/>
-          <w:rtl/>
-        </w:rPr>
-        <w:t xml:space="preserve">לעיל ה"ש 32</w:t>
-      </w:r>
-      <w:r>
-        <w:rPr>
-          <w:rFonts w:ascii="David" w:cs="David" w:eastAsia="David" w:hAnsi="David"/>
-          <w:sz w:val="20"/>
-          <w:szCs w:val="20"/>
-          <w:rtl/>
-        </w:rPr>
-        <w:t xml:space="preserve">, המצטט את הכלל האנגלי שלפיו הבטחת מתנה גרידא אינה מעבירה בעלות וטעונה מסירה.</w:t>
-      </w:r>
-    </w:p>
-  </w:footnote>
-  <w:footnote w:id="72">
-    <w:p>
-      <w:pPr>
-        <w:bidi/>
-        <w:spacing w:after="60"/>
-      </w:pPr>
-      <w:r>
-        <w:rPr>
-          <w:rStyle w:val="FootnoteReference"/>
-        </w:rPr>
-        <w:footnoteRef/>
-      </w:r>
-      <w:r>
-        <w:rPr>
-          <w:rFonts w:ascii="Times New Roman" w:cs="Times New Roman" w:eastAsia="Times New Roman" w:hAnsi="Times New Roman"/>
-          <w:sz w:val="20"/>
-          <w:szCs w:val="20"/>
-        </w:rPr>
-        <w:t xml:space="preserve">Re Rose [1952] Ch 499 (CA)</w:t>
       </w:r>
       <w:r>
         <w:rPr>
@@ -10072,7 +10612,24 @@
           <w:sz w:val="20"/>
           <w:szCs w:val="20"/>
         </w:rPr>
-        <w:t xml:space="preserve">Pennington v Waine [2002] EWCA Civ 227, [2002] 1 WLR 2075</w:t>
+        <w:t xml:space="preserve">Williams &amp; Glyn’s Bank Ltd v Boland [1981] AC 487 (HL)</w:t>
+      </w:r>
+      <w:r>
+        <w:rPr>
+          <w:rFonts w:ascii="David" w:cs="David" w:eastAsia="David" w:hAnsi="David"/>
+          <w:sz w:val="20"/>
+          <w:szCs w:val="20"/>
+          <w:rtl/>
+        </w:rPr>
+        <w:t xml:space="preserve">; והמשכה של ההגנה כיום ב-</w:t>
+      </w:r>
+      <w:r>
+        <w:rPr>
+          <w:rFonts w:ascii="Times New Roman" w:cs="Times New Roman" w:eastAsia="Times New Roman" w:hAnsi="Times New Roman"/>
+          <w:sz w:val="20"/>
+          <w:szCs w:val="20"/>
+        </w:rPr>
+        <w:t xml:space="preserve">Land Registration Act 2002, sch 3, para 2</w:t>
       </w:r>
       <w:r>
         <w:rPr>
@@ -10099,20 +10656,29 @@
       </w:r>
       <w:r>
         <w:rPr>
+          <w:rFonts w:ascii="David" w:cs="David" w:eastAsia="David" w:hAnsi="David"/>
+          <w:sz w:val="20"/>
+          <w:szCs w:val="20"/>
+          <w:rtl/>
+        </w:rPr>
+        <w:t xml:space="preserve">לביקורת עדכנית על מוסד הזכויות הגוברות כסדק ב"עקרון המראה" של המרשם ראו </w:t>
+      </w:r>
+      <w:r>
+        <w:rPr>
           <w:rFonts w:ascii="Times New Roman" w:cs="Times New Roman" w:eastAsia="Times New Roman" w:hAnsi="Times New Roman"/>
           <w:sz w:val="20"/>
           <w:szCs w:val="20"/>
         </w:rPr>
-        <w:t xml:space="preserve">Powers of Attorney Act 1971, s 4</w:t>
-      </w:r>
-      <w:r>
-        <w:rPr>
-          <w:rFonts w:ascii="David" w:cs="David" w:eastAsia="David" w:hAnsi="David"/>
-          <w:sz w:val="20"/>
-          <w:szCs w:val="20"/>
-          <w:rtl/>
-        </w:rPr>
-        <w:t xml:space="preserve">. זהו המקור ההיסטורי של ס׳ 14(ב) לחוק השליחות הישראלי.</w:t>
+        <w:t xml:space="preserve">Chris Bevan, "Overriding Interests under the Land Registration Act 2002: Time to Repair the ‘Cracked Mirror’?" [2024] Conv. 123</w:t>
+      </w:r>
+      <w:r>
+        <w:rPr>
+          <w:rFonts w:ascii="David" w:cs="David" w:eastAsia="David" w:hAnsi="David"/>
+          <w:sz w:val="20"/>
+          <w:szCs w:val="20"/>
+          <w:rtl/>
+        </w:rPr>
+        <w:t xml:space="preserve">.</w:t>
       </w:r>
     </w:p>
   </w:footnote>
@@ -10130,20 +10696,11 @@
       </w:r>
       <w:r>
         <w:rPr>
-          <w:rFonts w:ascii="David" w:cs="David" w:eastAsia="David" w:hAnsi="David"/>
-          <w:sz w:val="20"/>
-          <w:szCs w:val="20"/>
-          <w:rtl/>
-        </w:rPr>
-        <w:t xml:space="preserve">לניתוח השוואתי של גורל ההתיישנות הרוכשת בשיטות הרישום המודרניות ראו </w:t>
-      </w:r>
-      <w:r>
-        <w:rPr>
           <w:rFonts w:ascii="Times New Roman" w:cs="Times New Roman" w:eastAsia="Times New Roman" w:hAnsi="Times New Roman"/>
           <w:sz w:val="20"/>
           <w:szCs w:val="20"/>
         </w:rPr>
-        <w:t xml:space="preserve">Nadav Shoked, "Who Needs Adverse Possession?," 89 Fordham L. Rev. 2639 (2021)</w:t>
+        <w:t xml:space="preserve">Stack v Dowden [2007] UKHL 17, [2007] 2 AC 432; Jones v Kernott [2011] UKSC 53, [2012] 1 AC 776</w:t>
       </w:r>
       <w:r>
         <w:rPr>
@@ -10170,12 +10727,20 @@
       </w:r>
       <w:r>
         <w:rPr>
-          <w:rFonts w:ascii="David" w:cs="David" w:eastAsia="David" w:hAnsi="David"/>
-          <w:sz w:val="20"/>
-          <w:szCs w:val="20"/>
-          <w:rtl/>
-        </w:rPr>
-        <w:t xml:space="preserve">ס׳ 418 לקוד האזרחי המצרי (חוק מס׳ 131 לשנת 1948).</w:t>
+          <w:rFonts w:ascii="Times New Roman" w:cs="Times New Roman" w:eastAsia="Times New Roman" w:hAnsi="Times New Roman"/>
+          <w:sz w:val="20"/>
+          <w:szCs w:val="20"/>
+        </w:rPr>
+        <w:t xml:space="preserve">Thorner v Major [2009] UKHL 18, [2009] 1 WLR 776</w:t>
+      </w:r>
+      <w:r>
+        <w:rPr>
+          <w:rFonts w:ascii="David" w:cs="David" w:eastAsia="David" w:hAnsi="David"/>
+          <w:sz w:val="20"/>
+          <w:szCs w:val="20"/>
+          <w:rtl/>
+        </w:rPr>
+        <w:t xml:space="preserve">.</w:t>
       </w:r>
     </w:p>
   </w:footnote>
@@ -10193,12 +10758,37 @@
       </w:r>
       <w:r>
         <w:rPr>
-          <w:rFonts w:ascii="David" w:cs="David" w:eastAsia="David" w:hAnsi="David"/>
-          <w:sz w:val="20"/>
-          <w:szCs w:val="20"/>
-          <w:rtl/>
-        </w:rPr>
-        <w:t xml:space="preserve">ס׳ 934 לקוד האזרחי המצרי; ס׳ 9 לחוק ארגון הפומביות המקרקעית, חוק מס׳ 114 לשנת 1946. במצרים פועלות במקביל שתי שיטות רישום: רישום שטרות פרסונלי לפי חוק 114/1946, החולש על מרבית המדינה, ורישום זכויות קדסטרלי לפי חוק מס׳ 142 לשנת 1964, שתחולתו מוגבלת.</w:t>
+          <w:rFonts w:ascii="Times New Roman" w:cs="Times New Roman" w:eastAsia="Times New Roman" w:hAnsi="Times New Roman"/>
+          <w:sz w:val="20"/>
+          <w:szCs w:val="20"/>
+        </w:rPr>
+        <w:t xml:space="preserve">Guest v Guest [2022] UKSC 27, [2022] 3 WLR 911</w:t>
+      </w:r>
+      <w:r>
+        <w:rPr>
+          <w:rFonts w:ascii="David" w:cs="David" w:eastAsia="David" w:hAnsi="David"/>
+          <w:sz w:val="20"/>
+          <w:szCs w:val="20"/>
+          <w:rtl/>
+        </w:rPr>
+        <w:t xml:space="preserve">. לניתוח עדכני ראו </w:t>
+      </w:r>
+      <w:r>
+        <w:rPr>
+          <w:rFonts w:ascii="Times New Roman" w:cs="Times New Roman" w:eastAsia="Times New Roman" w:hAnsi="Times New Roman"/>
+          <w:sz w:val="20"/>
+          <w:szCs w:val="20"/>
+        </w:rPr>
+        <w:t xml:space="preserve">Alex Waghorn, "Promises in Equity and at Law: Proprietary Estoppel after Guest v Guest" (2023) 86 MLR 1504; Brian Sloan, "Proprietary Estoppel in the Supreme Court: Banquo’s Ghost?" (2023) 82 CLJ 13</w:t>
+      </w:r>
+      <w:r>
+        <w:rPr>
+          <w:rFonts w:ascii="David" w:cs="David" w:eastAsia="David" w:hAnsi="David"/>
+          <w:sz w:val="20"/>
+          <w:szCs w:val="20"/>
+          <w:rtl/>
+        </w:rPr>
+        <w:t xml:space="preserve">.</w:t>
       </w:r>
     </w:p>
   </w:footnote>
@@ -10220,34 +10810,34 @@
           <w:sz w:val="20"/>
           <w:szCs w:val="20"/>
         </w:rPr>
-        <w:t xml:space="preserve">“More than 90% of Egypt’s Properties Are Unregistered: Justice Minister,” Daily News Egypt (Feb. 14, 2022); “Egypt’s Property Registration Rate Remains Below 10%…: World Bank,” Daily News Egypt (July 5, 2026)</w:t>
-      </w:r>
-      <w:r>
-        <w:rPr>
-          <w:rFonts w:ascii="David" w:cs="David" w:eastAsia="David" w:hAnsi="David"/>
-          <w:sz w:val="20"/>
-          <w:szCs w:val="20"/>
-          <w:rtl/>
-        </w:rPr>
-        <w:t xml:space="preserve">. הרנדו דה-סוטו ביסס על מצרים את מחקר "ההון המת" שלו: </w:t>
-      </w:r>
-      <w:r>
-        <w:rPr>
-          <w:rFonts w:ascii="David" w:cs="David" w:eastAsia="David" w:hAnsi="David"/>
-          <w:sz w:val="20"/>
-          <w:szCs w:val="20"/>
-          <w:rtl/>
-        </w:rPr>
-        <w:t xml:space="preserve">לעיל ה"ש 60</w:t>
-      </w:r>
-      <w:r>
-        <w:rPr>
-          <w:rFonts w:ascii="David" w:cs="David" w:eastAsia="David" w:hAnsi="David"/>
-          <w:sz w:val="20"/>
-          <w:szCs w:val="20"/>
-          <w:rtl/>
-        </w:rPr>
-        <w:t xml:space="preserve">.</w:t>
+        <w:t xml:space="preserve">Law of Property (Miscellaneous Provisions) Act 1989, ss 1–2</w:t>
+      </w:r>
+      <w:r>
+        <w:rPr>
+          <w:rFonts w:ascii="David" w:cs="David" w:eastAsia="David" w:hAnsi="David"/>
+          <w:sz w:val="20"/>
+          <w:szCs w:val="20"/>
+          <w:rtl/>
+        </w:rPr>
+        <w:t xml:space="preserve">. וראו כבר את ראבילו, </w:t>
+      </w:r>
+      <w:r>
+        <w:rPr>
+          <w:rFonts w:ascii="David" w:cs="David" w:eastAsia="David" w:hAnsi="David"/>
+          <w:sz w:val="20"/>
+          <w:szCs w:val="20"/>
+          <w:rtl/>
+        </w:rPr>
+        <w:t xml:space="preserve">לעיל ה"ש 32</w:t>
+      </w:r>
+      <w:r>
+        <w:rPr>
+          <w:rFonts w:ascii="David" w:cs="David" w:eastAsia="David" w:hAnsi="David"/>
+          <w:sz w:val="20"/>
+          <w:szCs w:val="20"/>
+          <w:rtl/>
+        </w:rPr>
+        <w:t xml:space="preserve">, המצטט את הכלל האנגלי שלפיו הבטחת מתנה גרידא אינה מעבירה בעלות וטעונה מסירה.</w:t>
       </w:r>
     </w:p>
   </w:footnote>
@@ -10265,12 +10855,20 @@
       </w:r>
       <w:r>
         <w:rPr>
-          <w:rFonts w:ascii="David" w:cs="David" w:eastAsia="David" w:hAnsi="David"/>
-          <w:sz w:val="20"/>
-          <w:szCs w:val="20"/>
-          <w:rtl/>
-        </w:rPr>
-        <w:t xml:space="preserve">ס׳ 715 לקוד האזרחי המצרי. בית המשפט החוקתי העליון של מצרים שב ואישר בשנת 2021 כי ייפוי כוח כזה אינו ניתן לביטול חד-צדדי. ואולם ס׳ 714 מורה כי השליחות פוקעת במות השולח – נקודת תורפה מרכזית של הפרקטיקה, שפסיקת בית המשפט לקסאציה בעניינה אינה אחידה.</w:t>
+          <w:rFonts w:ascii="Times New Roman" w:cs="Times New Roman" w:eastAsia="Times New Roman" w:hAnsi="Times New Roman"/>
+          <w:sz w:val="20"/>
+          <w:szCs w:val="20"/>
+        </w:rPr>
+        <w:t xml:space="preserve">Re Rose [1952] Ch 499 (CA)</w:t>
+      </w:r>
+      <w:r>
+        <w:rPr>
+          <w:rFonts w:ascii="David" w:cs="David" w:eastAsia="David" w:hAnsi="David"/>
+          <w:sz w:val="20"/>
+          <w:szCs w:val="20"/>
+          <w:rtl/>
+        </w:rPr>
+        <w:t xml:space="preserve">.</w:t>
       </w:r>
     </w:p>
   </w:footnote>
@@ -10288,20 +10886,11 @@
       </w:r>
       <w:r>
         <w:rPr>
-          <w:rFonts w:ascii="David" w:cs="David" w:eastAsia="David" w:hAnsi="David"/>
-          <w:sz w:val="20"/>
-          <w:szCs w:val="20"/>
-          <w:rtl/>
-        </w:rPr>
-        <w:t xml:space="preserve">לפסיקת בית המשפט לקסאציה המצרי על תביעות אלה ראו הסקירות שבמאגרי לשכת עורכי הדין המצרית; ולתיאור אנליטי באנגלית ראו </w:t>
-      </w:r>
-      <w:r>
-        <w:rPr>
           <w:rFonts w:ascii="Times New Roman" w:cs="Times New Roman" w:eastAsia="Times New Roman" w:hAnsi="Times New Roman"/>
           <w:sz w:val="20"/>
           <w:szCs w:val="20"/>
         </w:rPr>
-        <w:t xml:space="preserve">David Sims, "Securing Land Tenure in Egypt: Who Needs Registered Titles?" Metropolitics (June 14, 2016)</w:t>
+        <w:t xml:space="preserve">Pennington v Waine [2002] EWCA Civ 227, [2002] 1 WLR 2075</w:t>
       </w:r>
       <w:r>
         <w:rPr>
@@ -10328,12 +10917,20 @@
       </w:r>
       <w:r>
         <w:rPr>
-          <w:rFonts w:ascii="David" w:cs="David" w:eastAsia="David" w:hAnsi="David"/>
-          <w:sz w:val="20"/>
-          <w:szCs w:val="20"/>
-          <w:rtl/>
-        </w:rPr>
-        <w:t xml:space="preserve">ס׳ 968 לקוד האזרחי המצרי. הפרקטיקה המצרית דנה בכך תחת הכותרת "וַצְ׳ע אל-יַד" (הנחת היד) – ההחזקה בפועל כמקור קניין.</w:t>
+          <w:rFonts w:ascii="Times New Roman" w:cs="Times New Roman" w:eastAsia="Times New Roman" w:hAnsi="Times New Roman"/>
+          <w:sz w:val="20"/>
+          <w:szCs w:val="20"/>
+        </w:rPr>
+        <w:t xml:space="preserve">Powers of Attorney Act 1971, s 4</w:t>
+      </w:r>
+      <w:r>
+        <w:rPr>
+          <w:rFonts w:ascii="David" w:cs="David" w:eastAsia="David" w:hAnsi="David"/>
+          <w:sz w:val="20"/>
+          <w:szCs w:val="20"/>
+          <w:rtl/>
+        </w:rPr>
+        <w:t xml:space="preserve">. זהו המקור ההיסטורי של ס׳ 14(ב) לחוק השליחות הישראלי.</w:t>
       </w:r>
     </w:p>
   </w:footnote>
@@ -10356,7 +10953,24 @@
           <w:szCs w:val="20"/>
           <w:rtl/>
         </w:rPr>
-        <w:t xml:space="preserve">ס׳ 969 לקוד האזרחי המצרי.</w:t>
+        <w:t xml:space="preserve">לניתוח השוואתי של גורל ההתיישנות הרוכשת בשיטות הרישום המודרניות ראו </w:t>
+      </w:r>
+      <w:r>
+        <w:rPr>
+          <w:rFonts w:ascii="Times New Roman" w:cs="Times New Roman" w:eastAsia="Times New Roman" w:hAnsi="Times New Roman"/>
+          <w:sz w:val="20"/>
+          <w:szCs w:val="20"/>
+        </w:rPr>
+        <w:t xml:space="preserve">Nadav Shoked, "Who Needs Adverse Possession?," 89 Fordham L. Rev. 2639 (2021)</w:t>
+      </w:r>
+      <w:r>
+        <w:rPr>
+          <w:rFonts w:ascii="David" w:cs="David" w:eastAsia="David" w:hAnsi="David"/>
+          <w:sz w:val="20"/>
+          <w:szCs w:val="20"/>
+          <w:rtl/>
+        </w:rPr>
+        <w:t xml:space="preserve">.</w:t>
       </w:r>
     </w:p>
   </w:footnote>
@@ -10379,7 +10993,7 @@
           <w:szCs w:val="20"/>
           <w:rtl/>
         </w:rPr>
-        <w:t xml:space="preserve">ס׳ 970 לקוד האזרחי המצרי, כפי שתוקן בחוק מס׳ 55 לשנת 1970; ולנכסי הציבור ראו גם ס׳ 87(2) לקוד.</w:t>
+        <w:t xml:space="preserve">ס׳ 418 לקוד האזרחי המצרי (חוק מס׳ 131 לשנת 1948).</w:t>
       </w:r>
     </w:p>
   </w:footnote>
@@ -10402,42 +11016,7 @@
           <w:szCs w:val="20"/>
           <w:rtl/>
         </w:rPr>
-        <w:t xml:space="preserve">להשוואה בין גישות שיטות הרישום להתיישנות רוכשת ראו </w:t>
-      </w:r>
-      <w:r>
-        <w:rPr>
-          <w:rFonts w:ascii="Times New Roman" w:cs="Times New Roman" w:eastAsia="Times New Roman" w:hAnsi="Times New Roman"/>
-          <w:sz w:val="20"/>
-          <w:szCs w:val="20"/>
-        </w:rPr>
-        <w:t xml:space="preserve">Shoked</w:t>
-      </w:r>
-      <w:r>
-        <w:rPr>
-          <w:rFonts w:ascii="David" w:cs="David" w:eastAsia="David" w:hAnsi="David"/>
-          <w:sz w:val="20"/>
-          <w:szCs w:val="20"/>
-          <w:rtl/>
-        </w:rPr>
-        <w:t xml:space="preserve">, </w:t>
-      </w:r>
-      <w:r>
-        <w:rPr>
-          <w:rFonts w:ascii="David" w:cs="David" w:eastAsia="David" w:hAnsi="David"/>
-          <w:sz w:val="20"/>
-          <w:szCs w:val="20"/>
-          <w:rtl/>
-        </w:rPr>
-        <w:t xml:space="preserve">לעיל ה"ש 75</w:t>
-      </w:r>
-      <w:r>
-        <w:rPr>
-          <w:rFonts w:ascii="David" w:cs="David" w:eastAsia="David" w:hAnsi="David"/>
-          <w:sz w:val="20"/>
-          <w:szCs w:val="20"/>
-          <w:rtl/>
-        </w:rPr>
-        <w:t xml:space="preserve">. ודוק: בישראל נחסם מסלול זה כמעט כליל – ס׳ 159(ב) לחוק המקרקעין שלל התיישנות במקרקעין מוסדרים, וחזקתו של בן משפחה מסווגת כ"חזקה מרשות"; ראו לעיל פרק ג.6.</w:t>
+        <w:t xml:space="preserve">ס׳ 934 לקוד האזרחי המצרי; ס׳ 9 לחוק ארגון הפומביות המקרקעית, חוק מס׳ 114 לשנת 1946. במצרים פועלות במקביל שתי שיטות רישום: רישום שטרות פרסונלי לפי חוק 114/1946, החולש על מרבית המדינה, ורישום זכויות קדסטרלי לפי חוק מס׳ 142 לשנת 1964, שתחולתו מוגבלת.</w:t>
       </w:r>
     </w:p>
   </w:footnote>
@@ -10459,24 +11038,25 @@
           <w:sz w:val="20"/>
           <w:szCs w:val="20"/>
         </w:rPr>
-        <w:t xml:space="preserve">“Sisi Orders Delaying Implementation of Controversial Real Estate Law for 2 Years,” Ahram Online (Feb. 28, 2021); “‘Unjust’: Egypt’s Property Registration Plans Face Popular Backlash,” Middle East Eye (2021)</w:t>
-      </w:r>
-      <w:r>
-        <w:rPr>
-          <w:rFonts w:ascii="David" w:cs="David" w:eastAsia="David" w:hAnsi="David"/>
-          <w:sz w:val="20"/>
-          <w:szCs w:val="20"/>
-          <w:rtl/>
-        </w:rPr>
-        <w:t xml:space="preserve">. לניתוח מדיניות ראו </w:t>
-      </w:r>
-      <w:r>
-        <w:rPr>
-          <w:rFonts w:ascii="Times New Roman" w:cs="Times New Roman" w:eastAsia="Times New Roman" w:hAnsi="Times New Roman"/>
-          <w:sz w:val="20"/>
-          <w:szCs w:val="20"/>
-        </w:rPr>
-        <w:t xml:space="preserve">“Real Estate Registration Law Amendments – Development Brief,” The Built Environment Observatory (May 2021)</w:t>
+        <w:t xml:space="preserve">“More than 90% of Egypt’s Properties Are Unregistered: Justice Minister,” Daily News Egypt (Feb. 14, 2022); “Egypt’s Property Registration Rate Remains Below 10%…: World Bank,” Daily News Egypt (July 5, 2026)</w:t>
+      </w:r>
+      <w:r>
+        <w:rPr>
+          <w:rFonts w:ascii="David" w:cs="David" w:eastAsia="David" w:hAnsi="David"/>
+          <w:sz w:val="20"/>
+          <w:szCs w:val="20"/>
+          <w:rtl/>
+        </w:rPr>
+        <w:t xml:space="preserve">. הרנדו דה-סוטו ביסס על מצרים את מחקר "ההון המת" שלו: </w:t>
+      </w:r>
+      <w:r>
+        <w:rPr>
+          <w:rFonts w:ascii="David" w:cs="David" w:eastAsia="David" w:hAnsi="David"/>
+          <w:sz w:val="20"/>
+          <w:szCs w:val="20"/>
+          <w:rtl/>
+        </w:rPr>
+        <w:t xml:space="preserve">לעיל ה"ש 67</w:t>
       </w:r>
       <w:r>
         <w:rPr>
@@ -10508,24 +11088,7 @@
           <w:szCs w:val="20"/>
           <w:rtl/>
         </w:rPr>
-        <w:t xml:space="preserve">חוק מס׳ 9 לשנת 2022 (מצרים), המתקן את חוק מס׳ 114 לשנת 1946; ראו </w:t>
-      </w:r>
-      <w:r>
-        <w:rPr>
-          <w:rFonts w:ascii="Times New Roman" w:cs="Times New Roman" w:eastAsia="Times New Roman" w:hAnsi="Times New Roman"/>
-          <w:sz w:val="20"/>
-          <w:szCs w:val="20"/>
-        </w:rPr>
-        <w:t xml:space="preserve">Shalakany Law Office, “New Amendments to Real Estate Registration Law” (2022)</w:t>
-      </w:r>
-      <w:r>
-        <w:rPr>
-          <w:rFonts w:ascii="David" w:cs="David" w:eastAsia="David" w:hAnsi="David"/>
-          <w:sz w:val="20"/>
-          <w:szCs w:val="20"/>
-          <w:rtl/>
-        </w:rPr>
-        <w:t xml:space="preserve">.</w:t>
+        <w:t xml:space="preserve">ס׳ 715 לקוד האזרחי המצרי. בית המשפט החוקתי העליון של מצרים שב ואישר בשנת 2021 כי ייפוי כוח כזה אינו ניתן לביטול חד-צדדי. ואולם ס׳ 714 מורה כי השליחות פוקעת במות השולח – נקודת תורפה מרכזית של הפרקטיקה, שפסיקת בית המשפט לקסאציה בעניינה אינה אחידה.</w:t>
       </w:r>
     </w:p>
   </w:footnote>
@@ -10548,7 +11111,24 @@
           <w:szCs w:val="20"/>
           <w:rtl/>
         </w:rPr>
-        <w:t xml:space="preserve">ס׳ 2 לחוקת מצרים (2014); ס׳ 1 לקוד האזרחי המצרי (ובו מדרג: חקיקה, מנהג, עקרונות השריעה, עקרונות הצדק); חוק הירושה המצרי, חוק מס׳ 77 לשנת 1943; ולצוואות – חוק מס׳ 71 לשנת 1946.</w:t>
+        <w:t xml:space="preserve">לפסיקת בית המשפט לקסאציה המצרי על תביעות אלה ראו הסקירות שבמאגרי לשכת עורכי הדין המצרית; ולתיאור אנליטי באנגלית ראו </w:t>
+      </w:r>
+      <w:r>
+        <w:rPr>
+          <w:rFonts w:ascii="Times New Roman" w:cs="Times New Roman" w:eastAsia="Times New Roman" w:hAnsi="Times New Roman"/>
+          <w:sz w:val="20"/>
+          <w:szCs w:val="20"/>
+        </w:rPr>
+        <w:t xml:space="preserve">David Sims, "Securing Land Tenure in Egypt: Who Needs Registered Titles?" Metropolitics (June 14, 2016)</w:t>
+      </w:r>
+      <w:r>
+        <w:rPr>
+          <w:rFonts w:ascii="David" w:cs="David" w:eastAsia="David" w:hAnsi="David"/>
+          <w:sz w:val="20"/>
+          <w:szCs w:val="20"/>
+          <w:rtl/>
+        </w:rPr>
+        <w:t xml:space="preserve">.</w:t>
       </w:r>
     </w:p>
   </w:footnote>
@@ -10571,24 +11151,7 @@
           <w:szCs w:val="20"/>
           <w:rtl/>
         </w:rPr>
-        <w:t xml:space="preserve">לתרגום האנגלי המקובל ראו </w:t>
-      </w:r>
-      <w:r>
-        <w:rPr>
-          <w:rFonts w:ascii="Times New Roman" w:cs="Times New Roman" w:eastAsia="Times New Roman" w:hAnsi="Times New Roman"/>
-          <w:sz w:val="20"/>
-          <w:szCs w:val="20"/>
-        </w:rPr>
-        <w:t xml:space="preserve">C.R. Tyser, D.G. Demetriades &amp; Ismail Haqqi Effendi (trans.), The Mejelle: Being an English Translation of Majallah el-Ahkam-i-Adliya (1901)</w:t>
-      </w:r>
-      <w:r>
-        <w:rPr>
-          <w:rFonts w:ascii="David" w:cs="David" w:eastAsia="David" w:hAnsi="David"/>
-          <w:sz w:val="20"/>
-          <w:szCs w:val="20"/>
-          <w:rtl/>
-        </w:rPr>
-        <w:t xml:space="preserve">; חוק לביטול המג׳לה, התשמ"ד-1984.</w:t>
+        <w:t xml:space="preserve">ס׳ 968 לקוד האזרחי המצרי. הפרקטיקה המצרית דנה בכך תחת הכותרת "וַצְ׳ע אל-יַד" (הנחת היד) – ההחזקה בפועל כמקור קניין.</w:t>
       </w:r>
     </w:p>
   </w:footnote>
@@ -10611,24 +11174,7 @@
           <w:szCs w:val="20"/>
           <w:rtl/>
         </w:rPr>
-        <w:t xml:space="preserve">ס׳ 837, 861–862 למג׳לה. לדוקטרינת ההִבָּה הקלאסית ראו </w:t>
-      </w:r>
-      <w:r>
-        <w:rPr>
-          <w:rFonts w:ascii="Times New Roman" w:cs="Times New Roman" w:eastAsia="Times New Roman" w:hAnsi="Times New Roman"/>
-          <w:sz w:val="20"/>
-          <w:szCs w:val="20"/>
-        </w:rPr>
-        <w:t xml:space="preserve">Joseph Schacht, An Introduction to Islamic Law (1964); Y. Linant de Bellefonds, “Hiba,” in The Encyclopaedia of Islam (2d ed.)</w:t>
-      </w:r>
-      <w:r>
-        <w:rPr>
-          <w:rFonts w:ascii="David" w:cs="David" w:eastAsia="David" w:hAnsi="David"/>
-          <w:sz w:val="20"/>
-          <w:szCs w:val="20"/>
-          <w:rtl/>
-        </w:rPr>
-        <w:t xml:space="preserve">.</w:t>
+        <w:t xml:space="preserve">ס׳ 969 לקוד האזרחי המצרי.</w:t>
       </w:r>
     </w:p>
   </w:footnote>
@@ -10651,7 +11197,7 @@
           <w:szCs w:val="20"/>
           <w:rtl/>
         </w:rPr>
-        <w:t xml:space="preserve">ס׳ 866 למג׳לה; וכן ס׳ 872 – מות אחד הצדדים חוסם את החזרה.</w:t>
+        <w:t xml:space="preserve">ס׳ 970 לקוד האזרחי המצרי, כפי שתוקן בחוק מס׳ 55 לשנת 1970; ולנכסי הציבור ראו גם ס׳ 87(2) לקוד.</w:t>
       </w:r>
     </w:p>
   </w:footnote>
@@ -10674,7 +11220,7 @@
           <w:szCs w:val="20"/>
           <w:rtl/>
         </w:rPr>
-        <w:t xml:space="preserve">ס׳ 879 למג׳לה; לדיון עדכני ראו </w:t>
+        <w:t xml:space="preserve">להשוואה בין גישות שיטות הרישום להתיישנות רוכשת ראו </w:t>
       </w:r>
       <w:r>
         <w:rPr>
@@ -10682,16 +11228,34 @@
           <w:sz w:val="20"/>
           <w:szCs w:val="20"/>
         </w:rPr>
-        <w:t xml:space="preserve">Siti Norfatirah Abdul Rahmani &amp; Mohd Zamro Muda, “Ownership Status of Hibah Marad al-Mawt,” 34(8) al-Qanatir Int’l J. Islamic Stud. (2025)</w:t>
-      </w:r>
-      <w:r>
-        <w:rPr>
-          <w:rFonts w:ascii="David" w:cs="David" w:eastAsia="David" w:hAnsi="David"/>
-          <w:sz w:val="20"/>
-          <w:szCs w:val="20"/>
-          <w:rtl/>
-        </w:rPr>
-        <w:t xml:space="preserve">.</w:t>
+        <w:t xml:space="preserve">Shoked</w:t>
+      </w:r>
+      <w:r>
+        <w:rPr>
+          <w:rFonts w:ascii="David" w:cs="David" w:eastAsia="David" w:hAnsi="David"/>
+          <w:sz w:val="20"/>
+          <w:szCs w:val="20"/>
+          <w:rtl/>
+        </w:rPr>
+        <w:t xml:space="preserve">, </w:t>
+      </w:r>
+      <w:r>
+        <w:rPr>
+          <w:rFonts w:ascii="David" w:cs="David" w:eastAsia="David" w:hAnsi="David"/>
+          <w:sz w:val="20"/>
+          <w:szCs w:val="20"/>
+          <w:rtl/>
+        </w:rPr>
+        <w:t xml:space="preserve">לעיל ה"ש 82</w:t>
+      </w:r>
+      <w:r>
+        <w:rPr>
+          <w:rFonts w:ascii="David" w:cs="David" w:eastAsia="David" w:hAnsi="David"/>
+          <w:sz w:val="20"/>
+          <w:szCs w:val="20"/>
+          <w:rtl/>
+        </w:rPr>
+        <w:t xml:space="preserve">. ודוק: בישראל נחסם מסלול זה כמעט כליל – ס׳ 159(ב) לחוק המקרקעין שלל התיישנות במקרקעין מוסדרים, וחזקתו של בן משפחה מסווגת כ"חזקה מרשות"; ראו לעיל פרק ג.6.</w:t>
       </w:r>
     </w:p>
   </w:footnote>
@@ -10709,47 +11273,37 @@
       </w:r>
       <w:r>
         <w:rPr>
-          <w:rFonts w:ascii="David" w:cs="David" w:eastAsia="David" w:hAnsi="David"/>
-          <w:sz w:val="20"/>
-          <w:szCs w:val="20"/>
-          <w:rtl/>
-        </w:rPr>
-        <w:t xml:space="preserve">להוראת המעבר ראו ראבילו, </w:t>
-      </w:r>
-      <w:r>
-        <w:rPr>
-          <w:rFonts w:ascii="David" w:cs="David" w:eastAsia="David" w:hAnsi="David"/>
-          <w:sz w:val="20"/>
-          <w:szCs w:val="20"/>
-          <w:rtl/>
-        </w:rPr>
-        <w:t xml:space="preserve">לעיל ה"ש 32</w:t>
-      </w:r>
-      <w:r>
-        <w:rPr>
-          <w:rFonts w:ascii="David" w:cs="David" w:eastAsia="David" w:hAnsi="David"/>
-          <w:sz w:val="20"/>
-          <w:szCs w:val="20"/>
-          <w:rtl/>
-        </w:rPr>
-        <w:t xml:space="preserve">, בעמ׳ 333–337, המתאר את הדין ערב חוק המתנה; והשוו </w:t>
-      </w:r>
-      <w:r>
-        <w:rPr>
           <w:rFonts w:ascii="Times New Roman" w:cs="Times New Roman" w:eastAsia="Times New Roman" w:hAnsi="Times New Roman"/>
           <w:sz w:val="20"/>
           <w:szCs w:val="20"/>
         </w:rPr>
-        <w:t xml:space="preserve">L. Landau, “The Gift Law, 1968,” 4 Isr. L. Rev. 260 (1969)</w:t>
-      </w:r>
-      <w:r>
-        <w:rPr>
-          <w:rFonts w:ascii="David" w:cs="David" w:eastAsia="David" w:hAnsi="David"/>
-          <w:sz w:val="20"/>
-          <w:szCs w:val="20"/>
-          <w:rtl/>
-        </w:rPr>
-        <w:t xml:space="preserve">, על החלפת דיני ההִבָּה של המג׳לה בחוק המתנה הישראלי.</w:t>
+        <w:t xml:space="preserve">“Sisi Orders Delaying Implementation of Controversial Real Estate Law for 2 Years,” Ahram Online (Feb. 28, 2021); “‘Unjust’: Egypt’s Property Registration Plans Face Popular Backlash,” Middle East Eye (2021)</w:t>
+      </w:r>
+      <w:r>
+        <w:rPr>
+          <w:rFonts w:ascii="David" w:cs="David" w:eastAsia="David" w:hAnsi="David"/>
+          <w:sz w:val="20"/>
+          <w:szCs w:val="20"/>
+          <w:rtl/>
+        </w:rPr>
+        <w:t xml:space="preserve">. לניתוח מדיניות ראו </w:t>
+      </w:r>
+      <w:r>
+        <w:rPr>
+          <w:rFonts w:ascii="Times New Roman" w:cs="Times New Roman" w:eastAsia="Times New Roman" w:hAnsi="Times New Roman"/>
+          <w:sz w:val="20"/>
+          <w:szCs w:val="20"/>
+        </w:rPr>
+        <w:t xml:space="preserve">“Real Estate Registration Law Amendments – Development Brief,” The Built Environment Observatory (May 2021)</w:t>
+      </w:r>
+      <w:r>
+        <w:rPr>
+          <w:rFonts w:ascii="David" w:cs="David" w:eastAsia="David" w:hAnsi="David"/>
+          <w:sz w:val="20"/>
+          <w:szCs w:val="20"/>
+          <w:rtl/>
+        </w:rPr>
+        <w:t xml:space="preserve">.</w:t>
       </w:r>
     </w:p>
   </w:footnote>
@@ -10772,7 +11326,24 @@
           <w:szCs w:val="20"/>
           <w:rtl/>
         </w:rPr>
-        <w:t xml:space="preserve">ס׳ 1660 למג׳לה (ולתביעות בעניין יסוד הוקף – 36 שנים, ס׳ 1661).</w:t>
+        <w:t xml:space="preserve">חוק מס׳ 9 לשנת 2022 (מצרים), המתקן את חוק מס׳ 114 לשנת 1946; ראו </w:t>
+      </w:r>
+      <w:r>
+        <w:rPr>
+          <w:rFonts w:ascii="Times New Roman" w:cs="Times New Roman" w:eastAsia="Times New Roman" w:hAnsi="Times New Roman"/>
+          <w:sz w:val="20"/>
+          <w:szCs w:val="20"/>
+        </w:rPr>
+        <w:t xml:space="preserve">Shalakany Law Office, “New Amendments to Real Estate Registration Law” (2022)</w:t>
+      </w:r>
+      <w:r>
+        <w:rPr>
+          <w:rFonts w:ascii="David" w:cs="David" w:eastAsia="David" w:hAnsi="David"/>
+          <w:sz w:val="20"/>
+          <w:szCs w:val="20"/>
+          <w:rtl/>
+        </w:rPr>
+        <w:t xml:space="preserve">.</w:t>
       </w:r>
     </w:p>
   </w:footnote>
@@ -10795,7 +11366,7 @@
           <w:szCs w:val="20"/>
           <w:rtl/>
         </w:rPr>
-        <w:t xml:space="preserve">ס׳ 1674 למג׳לה. ההקבלה לס׳ 2 לחוק ההתיישנות, התשי"ח-1958, שאף הוא קובע התיישנות דיונית שאינה מפקיעה את הזכות, גלויה לעין.</w:t>
+        <w:t xml:space="preserve">ס׳ 2 לחוקת מצרים (2014); ס׳ 1 לקוד האזרחי המצרי (ובו מדרג: חקיקה, מנהג, עקרונות השריעה, עקרונות הצדק); חוק הירושה המצרי, חוק מס׳ 77 לשנת 1943; ולצוואות – חוק מס׳ 71 לשנת 1946.</w:t>
       </w:r>
     </w:p>
   </w:footnote>
@@ -10818,7 +11389,7 @@
           <w:szCs w:val="20"/>
           <w:rtl/>
         </w:rPr>
-        <w:t xml:space="preserve">ס׳ 20 ו-78 לחוק הקרקעות העות׳מאני, 1858. להיסטוריה של יישום הוראות אלה בארץ ישראל ולגלגולן בפסיקה הישראלית ראו </w:t>
+        <w:t xml:space="preserve">לתרגום האנגלי המקובל ראו </w:t>
       </w:r>
       <w:r>
         <w:rPr>
@@ -10826,34 +11397,16 @@
           <w:sz w:val="20"/>
           <w:szCs w:val="20"/>
         </w:rPr>
-        <w:t xml:space="preserve">Ahmad Amara, “Dispossession by Law: How the Israeli Judicial System Utilizes Ottoman Land Law to Expel and Dispossess the Bedouins,” J. Levantine Stud. (2015)</w:t>
-      </w:r>
-      <w:r>
-        <w:rPr>
-          <w:rFonts w:ascii="David" w:cs="David" w:eastAsia="David" w:hAnsi="David"/>
-          <w:sz w:val="20"/>
-          <w:szCs w:val="20"/>
-          <w:rtl/>
-        </w:rPr>
-        <w:t xml:space="preserve">; זנדברג, </w:t>
-      </w:r>
-      <w:r>
-        <w:rPr>
-          <w:rFonts w:ascii="David" w:cs="David" w:eastAsia="David" w:hAnsi="David"/>
-          <w:sz w:val="20"/>
-          <w:szCs w:val="20"/>
-          <w:rtl/>
-        </w:rPr>
-        <w:t xml:space="preserve">לעיל ה"ש 10</w:t>
-      </w:r>
-      <w:r>
-        <w:rPr>
-          <w:rFonts w:ascii="David" w:cs="David" w:eastAsia="David" w:hAnsi="David"/>
-          <w:sz w:val="20"/>
-          <w:szCs w:val="20"/>
-          <w:rtl/>
-        </w:rPr>
-        <w:t xml:space="preserve">.</w:t>
+        <w:t xml:space="preserve">C.R. Tyser, D.G. Demetriades &amp; Ismail Haqqi Effendi (trans.), The Mejelle: Being an English Translation of Majallah el-Ahkam-i-Adliya (1901)</w:t>
+      </w:r>
+      <w:r>
+        <w:rPr>
+          <w:rFonts w:ascii="David" w:cs="David" w:eastAsia="David" w:hAnsi="David"/>
+          <w:sz w:val="20"/>
+          <w:szCs w:val="20"/>
+          <w:rtl/>
+        </w:rPr>
+        <w:t xml:space="preserve">; חוק לביטול המג׳לה, התשמ"ד-1984.</w:t>
       </w:r>
     </w:p>
   </w:footnote>
@@ -10876,7 +11429,7 @@
           <w:szCs w:val="20"/>
           <w:rtl/>
         </w:rPr>
-        <w:t xml:space="preserve">ס׳ 1521 למג׳לה. השליחות פוקעת ככלל במות השולח – כלל שהעמיד בסימן שאלה את ייפויי הכוח הוותיקים שנועדו לפעול "לאחר אריכות ימים". לניסוח מודרני של דיני הוַכַּאלָה ראו </w:t>
+        <w:t xml:space="preserve">ס׳ 837, 861–862 למג׳לה. לדוקטרינת ההִבָּה הקלאסית ראו </w:t>
       </w:r>
       <w:r>
         <w:rPr>
@@ -10884,7 +11437,7 @@
           <w:sz w:val="20"/>
           <w:szCs w:val="20"/>
         </w:rPr>
-        <w:t xml:space="preserve">AAOIFI, Shari’ah Standard No. 23: Agency (2015)</w:t>
+        <w:t xml:space="preserve">Joseph Schacht, An Introduction to Islamic Law (1964); Y. Linant de Bellefonds, “Hiba,” in The Encyclopaedia of Islam (2d ed.)</w:t>
       </w:r>
       <w:r>
         <w:rPr>
@@ -10911,20 +11464,12 @@
       </w:r>
       <w:r>
         <w:rPr>
-          <w:rFonts w:ascii="Times New Roman" w:cs="Times New Roman" w:eastAsia="Times New Roman" w:hAnsi="Times New Roman"/>
-          <w:sz w:val="20"/>
-          <w:szCs w:val="20"/>
-        </w:rPr>
-        <w:t xml:space="preserve">N.J. Coulson, Succession in the Muslim Family (1971)</w:t>
-      </w:r>
-      <w:r>
-        <w:rPr>
-          <w:rFonts w:ascii="David" w:cs="David" w:eastAsia="David" w:hAnsi="David"/>
-          <w:sz w:val="20"/>
-          <w:szCs w:val="20"/>
-          <w:rtl/>
-        </w:rPr>
-        <w:t xml:space="preserve">.</w:t>
+          <w:rFonts w:ascii="David" w:cs="David" w:eastAsia="David" w:hAnsi="David"/>
+          <w:sz w:val="20"/>
+          <w:szCs w:val="20"/>
+          <w:rtl/>
+        </w:rPr>
+        <w:t xml:space="preserve">ס׳ 866 למג׳לה; וכן ס׳ 872 – מות אחד הצדדים חוסם את החזרה.</w:t>
       </w:r>
     </w:p>
   </w:footnote>
@@ -10942,28 +11487,20 @@
       </w:r>
       <w:r>
         <w:rPr>
+          <w:rFonts w:ascii="David" w:cs="David" w:eastAsia="David" w:hAnsi="David"/>
+          <w:sz w:val="20"/>
+          <w:szCs w:val="20"/>
+          <w:rtl/>
+        </w:rPr>
+        <w:t xml:space="preserve">ס׳ 879 למג׳לה; לדיון עדכני ראו </w:t>
+      </w:r>
+      <w:r>
+        <w:rPr>
           <w:rFonts w:ascii="Times New Roman" w:cs="Times New Roman" w:eastAsia="Times New Roman" w:hAnsi="Times New Roman"/>
           <w:sz w:val="20"/>
           <w:szCs w:val="20"/>
         </w:rPr>
-        <w:t xml:space="preserve">Annelies Moors, Women, Property and Islam: Palestinian Experiences, 1920–1990 (1995)</w:t>
-      </w:r>
-      <w:r>
-        <w:rPr>
-          <w:rFonts w:ascii="David" w:cs="David" w:eastAsia="David" w:hAnsi="David"/>
-          <w:sz w:val="20"/>
-          <w:szCs w:val="20"/>
-          <w:rtl/>
-        </w:rPr>
-        <w:t xml:space="preserve">; ולפרקטיקה בבתי הדין השרעיים בישראל ראו </w:t>
-      </w:r>
-      <w:r>
-        <w:rPr>
-          <w:rFonts w:ascii="Times New Roman" w:cs="Times New Roman" w:eastAsia="Times New Roman" w:hAnsi="Times New Roman"/>
-          <w:sz w:val="20"/>
-          <w:szCs w:val="20"/>
-        </w:rPr>
-        <w:t xml:space="preserve">Aharon Layish, Women and Islamic Law in a Non-Muslim State (1975)</w:t>
+        <w:t xml:space="preserve">Siti Norfatirah Abdul Rahmani &amp; Mohd Zamro Muda, “Ownership Status of Hibah Marad al-Mawt,” 34(8) al-Qanatir Int’l J. Islamic Stud. (2025)</w:t>
       </w:r>
       <w:r>
         <w:rPr>
@@ -10990,38 +11527,47 @@
       </w:r>
       <w:r>
         <w:rPr>
+          <w:rFonts w:ascii="David" w:cs="David" w:eastAsia="David" w:hAnsi="David"/>
+          <w:sz w:val="20"/>
+          <w:szCs w:val="20"/>
+          <w:rtl/>
+        </w:rPr>
+        <w:t xml:space="preserve">להוראת המעבר ראו ראבילו, </w:t>
+      </w:r>
+      <w:r>
+        <w:rPr>
+          <w:rFonts w:ascii="David" w:cs="David" w:eastAsia="David" w:hAnsi="David"/>
+          <w:sz w:val="20"/>
+          <w:szCs w:val="20"/>
+          <w:rtl/>
+        </w:rPr>
+        <w:t xml:space="preserve">לעיל ה"ש 32</w:t>
+      </w:r>
+      <w:r>
+        <w:rPr>
+          <w:rFonts w:ascii="David" w:cs="David" w:eastAsia="David" w:hAnsi="David"/>
+          <w:sz w:val="20"/>
+          <w:szCs w:val="20"/>
+          <w:rtl/>
+        </w:rPr>
+        <w:t xml:space="preserve">, בעמ׳ 333–337, המתאר את הדין ערב חוק המתנה; והשוו </w:t>
+      </w:r>
+      <w:r>
+        <w:rPr>
           <w:rFonts w:ascii="Times New Roman" w:cs="Times New Roman" w:eastAsia="Times New Roman" w:hAnsi="Times New Roman"/>
           <w:sz w:val="20"/>
           <w:szCs w:val="20"/>
         </w:rPr>
-        <w:t xml:space="preserve">Ruth Kark, “Consequences of the Ottoman Land Law: Agrarian and Privatization Processes in Palestine, 1858–1918,” in Societies, Social Inequalities and Marginalization 101 (R. Chand et al. eds., 2017)</w:t>
-      </w:r>
-      <w:r>
-        <w:rPr>
-          <w:rFonts w:ascii="David" w:cs="David" w:eastAsia="David" w:hAnsi="David"/>
-          <w:sz w:val="20"/>
-          <w:szCs w:val="20"/>
-          <w:rtl/>
-        </w:rPr>
-        <w:t xml:space="preserve">; נדן, </w:t>
-      </w:r>
-      <w:r>
-        <w:rPr>
-          <w:rFonts w:ascii="David" w:cs="David" w:eastAsia="David" w:hAnsi="David"/>
-          <w:sz w:val="20"/>
-          <w:szCs w:val="20"/>
-          <w:rtl/>
-        </w:rPr>
-        <w:t xml:space="preserve">לעיל ה"ש 14</w:t>
-      </w:r>
-      <w:r>
-        <w:rPr>
-          <w:rFonts w:ascii="David" w:cs="David" w:eastAsia="David" w:hAnsi="David"/>
-          <w:sz w:val="20"/>
-          <w:szCs w:val="20"/>
-          <w:rtl/>
-        </w:rPr>
-        <w:t xml:space="preserve">.</w:t>
+        <w:t xml:space="preserve">L. Landau, “The Gift Law, 1968,” 4 Isr. L. Rev. 260 (1969)</w:t>
+      </w:r>
+      <w:r>
+        <w:rPr>
+          <w:rFonts w:ascii="David" w:cs="David" w:eastAsia="David" w:hAnsi="David"/>
+          <w:sz w:val="20"/>
+          <w:szCs w:val="20"/>
+          <w:rtl/>
+        </w:rPr>
+        <w:t xml:space="preserve">, על החלפת דיני ההִבָּה של המג׳לה בחוק המתנה הישראלי.</w:t>
       </w:r>
     </w:p>
   </w:footnote>
@@ -11044,24 +11590,7 @@
           <w:szCs w:val="20"/>
           <w:rtl/>
         </w:rPr>
-        <w:t xml:space="preserve">ראו לעיל פרק ה ופרק ו.2.4; והשוו </w:t>
-      </w:r>
-      <w:r>
-        <w:rPr>
-          <w:rFonts w:ascii="Times New Roman" w:cs="Times New Roman" w:eastAsia="Times New Roman" w:hAnsi="Times New Roman"/>
-          <w:sz w:val="20"/>
-          <w:szCs w:val="20"/>
-        </w:rPr>
-        <w:t xml:space="preserve">Kareem Ibrahim &amp; Deena Khalil, “Land Titling: A Tool, not a Panacea — Insights from Egypt,” Metropolitics (Dec. 20, 2016)</w:t>
-      </w:r>
-      <w:r>
-        <w:rPr>
-          <w:rFonts w:ascii="David" w:cs="David" w:eastAsia="David" w:hAnsi="David"/>
-          <w:sz w:val="20"/>
-          <w:szCs w:val="20"/>
-          <w:rtl/>
-        </w:rPr>
-        <w:t xml:space="preserve">.</w:t>
+        <w:t xml:space="preserve">ס׳ 1660 למג׳לה (ולתביעות בעניין יסוד הוקף – 36 שנים, ס׳ 1661).</w:t>
       </w:r>
     </w:p>
   </w:footnote>
@@ -11084,6 +11613,295 @@
           <w:szCs w:val="20"/>
           <w:rtl/>
         </w:rPr>
+        <w:t xml:space="preserve">ס׳ 1674 למג׳לה. ההקבלה לס׳ 2 לחוק ההתיישנות, התשי"ח-1958, שאף הוא קובע התיישנות דיונית שאינה מפקיעה את הזכות, גלויה לעין.</w:t>
+      </w:r>
+    </w:p>
+  </w:footnote>
+  <w:footnote w:id="102">
+    <w:p>
+      <w:pPr>
+        <w:bidi/>
+        <w:spacing w:after="60"/>
+      </w:pPr>
+      <w:r>
+        <w:rPr>
+          <w:rStyle w:val="FootnoteReference"/>
+        </w:rPr>
+        <w:footnoteRef/>
+      </w:r>
+      <w:r>
+        <w:rPr>
+          <w:rFonts w:ascii="David" w:cs="David" w:eastAsia="David" w:hAnsi="David"/>
+          <w:sz w:val="20"/>
+          <w:szCs w:val="20"/>
+          <w:rtl/>
+        </w:rPr>
+        <w:t xml:space="preserve">ס׳ 20 ו-78 לחוק הקרקעות העות׳מאני, 1858. להיסטוריה של יישום הוראות אלה בארץ ישראל ולגלגולן בפסיקה הישראלית ראו </w:t>
+      </w:r>
+      <w:r>
+        <w:rPr>
+          <w:rFonts w:ascii="Times New Roman" w:cs="Times New Roman" w:eastAsia="Times New Roman" w:hAnsi="Times New Roman"/>
+          <w:sz w:val="20"/>
+          <w:szCs w:val="20"/>
+        </w:rPr>
+        <w:t xml:space="preserve">Ahmad Amara, “Dispossession by Law: How the Israeli Judicial System Utilizes Ottoman Land Law to Expel and Dispossess the Bedouins,” J. Levantine Stud. (2015)</w:t>
+      </w:r>
+      <w:r>
+        <w:rPr>
+          <w:rFonts w:ascii="David" w:cs="David" w:eastAsia="David" w:hAnsi="David"/>
+          <w:sz w:val="20"/>
+          <w:szCs w:val="20"/>
+          <w:rtl/>
+        </w:rPr>
+        <w:t xml:space="preserve">; זנדברג, </w:t>
+      </w:r>
+      <w:r>
+        <w:rPr>
+          <w:rFonts w:ascii="David" w:cs="David" w:eastAsia="David" w:hAnsi="David"/>
+          <w:sz w:val="20"/>
+          <w:szCs w:val="20"/>
+          <w:rtl/>
+        </w:rPr>
+        <w:t xml:space="preserve">לעיל ה"ש 10</w:t>
+      </w:r>
+      <w:r>
+        <w:rPr>
+          <w:rFonts w:ascii="David" w:cs="David" w:eastAsia="David" w:hAnsi="David"/>
+          <w:sz w:val="20"/>
+          <w:szCs w:val="20"/>
+          <w:rtl/>
+        </w:rPr>
+        <w:t xml:space="preserve">.</w:t>
+      </w:r>
+    </w:p>
+  </w:footnote>
+  <w:footnote w:id="103">
+    <w:p>
+      <w:pPr>
+        <w:bidi/>
+        <w:spacing w:after="60"/>
+      </w:pPr>
+      <w:r>
+        <w:rPr>
+          <w:rStyle w:val="FootnoteReference"/>
+        </w:rPr>
+        <w:footnoteRef/>
+      </w:r>
+      <w:r>
+        <w:rPr>
+          <w:rFonts w:ascii="David" w:cs="David" w:eastAsia="David" w:hAnsi="David"/>
+          <w:sz w:val="20"/>
+          <w:szCs w:val="20"/>
+          <w:rtl/>
+        </w:rPr>
+        <w:t xml:space="preserve">ס׳ 1521 למג׳לה. השליחות פוקעת ככלל במות השולח – כלל שהעמיד בסימן שאלה את ייפויי הכוח הוותיקים שנועדו לפעול "לאחר אריכות ימים". לניסוח מודרני של דיני הוַכַּאלָה ראו </w:t>
+      </w:r>
+      <w:r>
+        <w:rPr>
+          <w:rFonts w:ascii="Times New Roman" w:cs="Times New Roman" w:eastAsia="Times New Roman" w:hAnsi="Times New Roman"/>
+          <w:sz w:val="20"/>
+          <w:szCs w:val="20"/>
+        </w:rPr>
+        <w:t xml:space="preserve">AAOIFI, Shari’ah Standard No. 23: Agency (2015)</w:t>
+      </w:r>
+      <w:r>
+        <w:rPr>
+          <w:rFonts w:ascii="David" w:cs="David" w:eastAsia="David" w:hAnsi="David"/>
+          <w:sz w:val="20"/>
+          <w:szCs w:val="20"/>
+          <w:rtl/>
+        </w:rPr>
+        <w:t xml:space="preserve">.</w:t>
+      </w:r>
+    </w:p>
+  </w:footnote>
+  <w:footnote w:id="104">
+    <w:p>
+      <w:pPr>
+        <w:bidi/>
+        <w:spacing w:after="60"/>
+      </w:pPr>
+      <w:r>
+        <w:rPr>
+          <w:rStyle w:val="FootnoteReference"/>
+        </w:rPr>
+        <w:footnoteRef/>
+      </w:r>
+      <w:r>
+        <w:rPr>
+          <w:rFonts w:ascii="Times New Roman" w:cs="Times New Roman" w:eastAsia="Times New Roman" w:hAnsi="Times New Roman"/>
+          <w:sz w:val="20"/>
+          <w:szCs w:val="20"/>
+        </w:rPr>
+        <w:t xml:space="preserve">N.J. Coulson, Succession in the Muslim Family (1971)</w:t>
+      </w:r>
+      <w:r>
+        <w:rPr>
+          <w:rFonts w:ascii="David" w:cs="David" w:eastAsia="David" w:hAnsi="David"/>
+          <w:sz w:val="20"/>
+          <w:szCs w:val="20"/>
+          <w:rtl/>
+        </w:rPr>
+        <w:t xml:space="preserve">.</w:t>
+      </w:r>
+    </w:p>
+  </w:footnote>
+  <w:footnote w:id="105">
+    <w:p>
+      <w:pPr>
+        <w:bidi/>
+        <w:spacing w:after="60"/>
+      </w:pPr>
+      <w:r>
+        <w:rPr>
+          <w:rStyle w:val="FootnoteReference"/>
+        </w:rPr>
+        <w:footnoteRef/>
+      </w:r>
+      <w:r>
+        <w:rPr>
+          <w:rFonts w:ascii="Times New Roman" w:cs="Times New Roman" w:eastAsia="Times New Roman" w:hAnsi="Times New Roman"/>
+          <w:sz w:val="20"/>
+          <w:szCs w:val="20"/>
+        </w:rPr>
+        <w:t xml:space="preserve">Annelies Moors, Women, Property and Islam: Palestinian Experiences, 1920–1990 (1995)</w:t>
+      </w:r>
+      <w:r>
+        <w:rPr>
+          <w:rFonts w:ascii="David" w:cs="David" w:eastAsia="David" w:hAnsi="David"/>
+          <w:sz w:val="20"/>
+          <w:szCs w:val="20"/>
+          <w:rtl/>
+        </w:rPr>
+        <w:t xml:space="preserve">; ולפרקטיקה בבתי הדין השרעיים בישראל ראו </w:t>
+      </w:r>
+      <w:r>
+        <w:rPr>
+          <w:rFonts w:ascii="Times New Roman" w:cs="Times New Roman" w:eastAsia="Times New Roman" w:hAnsi="Times New Roman"/>
+          <w:sz w:val="20"/>
+          <w:szCs w:val="20"/>
+        </w:rPr>
+        <w:t xml:space="preserve">Aharon Layish, Women and Islamic Law in a Non-Muslim State (1975)</w:t>
+      </w:r>
+      <w:r>
+        <w:rPr>
+          <w:rFonts w:ascii="David" w:cs="David" w:eastAsia="David" w:hAnsi="David"/>
+          <w:sz w:val="20"/>
+          <w:szCs w:val="20"/>
+          <w:rtl/>
+        </w:rPr>
+        <w:t xml:space="preserve">.</w:t>
+      </w:r>
+    </w:p>
+  </w:footnote>
+  <w:footnote w:id="106">
+    <w:p>
+      <w:pPr>
+        <w:bidi/>
+        <w:spacing w:after="60"/>
+      </w:pPr>
+      <w:r>
+        <w:rPr>
+          <w:rStyle w:val="FootnoteReference"/>
+        </w:rPr>
+        <w:footnoteRef/>
+      </w:r>
+      <w:r>
+        <w:rPr>
+          <w:rFonts w:ascii="Times New Roman" w:cs="Times New Roman" w:eastAsia="Times New Roman" w:hAnsi="Times New Roman"/>
+          <w:sz w:val="20"/>
+          <w:szCs w:val="20"/>
+        </w:rPr>
+        <w:t xml:space="preserve">Ruth Kark, “Consequences of the Ottoman Land Law: Agrarian and Privatization Processes in Palestine, 1858–1918,” in Societies, Social Inequalities and Marginalization 101 (R. Chand et al. eds., 2017)</w:t>
+      </w:r>
+      <w:r>
+        <w:rPr>
+          <w:rFonts w:ascii="David" w:cs="David" w:eastAsia="David" w:hAnsi="David"/>
+          <w:sz w:val="20"/>
+          <w:szCs w:val="20"/>
+          <w:rtl/>
+        </w:rPr>
+        <w:t xml:space="preserve">; נדן, </w:t>
+      </w:r>
+      <w:r>
+        <w:rPr>
+          <w:rFonts w:ascii="David" w:cs="David" w:eastAsia="David" w:hAnsi="David"/>
+          <w:sz w:val="20"/>
+          <w:szCs w:val="20"/>
+          <w:rtl/>
+        </w:rPr>
+        <w:t xml:space="preserve">לעיל ה"ש 14</w:t>
+      </w:r>
+      <w:r>
+        <w:rPr>
+          <w:rFonts w:ascii="David" w:cs="David" w:eastAsia="David" w:hAnsi="David"/>
+          <w:sz w:val="20"/>
+          <w:szCs w:val="20"/>
+          <w:rtl/>
+        </w:rPr>
+        <w:t xml:space="preserve">.</w:t>
+      </w:r>
+    </w:p>
+  </w:footnote>
+  <w:footnote w:id="107">
+    <w:p>
+      <w:pPr>
+        <w:bidi/>
+        <w:spacing w:after="60"/>
+      </w:pPr>
+      <w:r>
+        <w:rPr>
+          <w:rStyle w:val="FootnoteReference"/>
+        </w:rPr>
+        <w:footnoteRef/>
+      </w:r>
+      <w:r>
+        <w:rPr>
+          <w:rFonts w:ascii="David" w:cs="David" w:eastAsia="David" w:hAnsi="David"/>
+          <w:sz w:val="20"/>
+          <w:szCs w:val="20"/>
+          <w:rtl/>
+        </w:rPr>
+        <w:t xml:space="preserve">ראו לעיל פרק ה ופרק ו.2.4; והשוו </w:t>
+      </w:r>
+      <w:r>
+        <w:rPr>
+          <w:rFonts w:ascii="Times New Roman" w:cs="Times New Roman" w:eastAsia="Times New Roman" w:hAnsi="Times New Roman"/>
+          <w:sz w:val="20"/>
+          <w:szCs w:val="20"/>
+        </w:rPr>
+        <w:t xml:space="preserve">Kareem Ibrahim &amp; Deena Khalil, “Land Titling: A Tool, not a Panacea — Insights from Egypt,” Metropolitics (Dec. 20, 2016)</w:t>
+      </w:r>
+      <w:r>
+        <w:rPr>
+          <w:rFonts w:ascii="David" w:cs="David" w:eastAsia="David" w:hAnsi="David"/>
+          <w:sz w:val="20"/>
+          <w:szCs w:val="20"/>
+          <w:rtl/>
+        </w:rPr>
+        <w:t xml:space="preserve">.</w:t>
+      </w:r>
+    </w:p>
+  </w:footnote>
+  <w:footnote w:id="108">
+    <w:p>
+      <w:pPr>
+        <w:bidi/>
+        <w:spacing w:after="60"/>
+      </w:pPr>
+      <w:r>
+        <w:rPr>
+          <w:rStyle w:val="FootnoteReference"/>
+        </w:rPr>
+        <w:footnoteRef/>
+      </w:r>
+      <w:r>
+        <w:rPr>
+          <w:rFonts w:ascii="David" w:cs="David" w:eastAsia="David" w:hAnsi="David"/>
+          <w:sz w:val="20"/>
+          <w:szCs w:val="20"/>
+          <w:rtl/>
+        </w:rPr>
         <w:t xml:space="preserve">עניין </w:t>
       </w:r>
       <w:r>
@@ -11126,7 +11944,7 @@
       </w:r>
     </w:p>
   </w:footnote>
-  <w:footnote w:id="102">
+  <w:footnote w:id="109">
     <w:p>
       <w:pPr>
         <w:bidi/>
@@ -11167,7 +11985,7 @@
       </w:r>
     </w:p>
   </w:footnote>
-  <w:footnote w:id="103">
+  <w:footnote w:id="110">
     <w:p>
       <w:pPr>
         <w:bidi/>
@@ -11212,7 +12030,7 @@
           <w:szCs w:val="20"/>
           <w:rtl/>
         </w:rPr>
-        <w:t xml:space="preserve">לעיל ה"ש 70</w:t>
+        <w:t xml:space="preserve">לעיל ה"ש 77</w:t>
       </w:r>
       <w:r>
         <w:rPr>
@@ -11225,7 +12043,7 @@
       </w:r>
     </w:p>
   </w:footnote>
-  <w:footnote w:id="104">
+  <w:footnote w:id="111">
     <w:p>
       <w:pPr>
         <w:bidi/>
@@ -11248,7 +12066,7 @@
       </w:r>
     </w:p>
   </w:footnote>
-  <w:footnote w:id="105">
+  <w:footnote w:id="112">
     <w:p>
       <w:pPr>
         <w:bidi/>

</xml_diff>

<commit_message>
Add the Mashal block quotation from the judgment text
Embedded the Supreme Court's articulation that in registered land the
registry is 'always the starting point and usually also the end point'
of any land dispute, unlike unregistered land, as an indented quotation
in section C.7 with a pinpoint citation, and tied it to the thesis.

Co-Authored-By: Claude Fable 5 <noreply@anthropic.com>
Claude-Session: https://claude.ai/code/session_01PTzmkyUzTNm9DT35momqLP
</commit_message>
<xml_diff>
--- a/seminar/סמינריון-מקרקעין-לא-רשומים.docx
+++ b/seminar/סמינריון-מקרקעין-לא-רשומים.docx
@@ -2089,28 +2089,30 @@
           <w:szCs w:val="24"/>
           <w:rtl/>
         </w:rPr>
-        <w:t xml:space="preserve"> בקוטב הנגדי, סירוב עקבי להפוך מנהג והחזקה כשלעצמם לבעלות: בית המשפט לענייני משפחה בנצרת דחה במפורש טענה להקניית בעלות מכוח "מנהג במגזר הערבי" והחזקה ממושכת, בקבעו כי הסכמות בעל־פה ומנהג אינם גוברים על הדין הישראלי ואינם מצדיקים הצהרת בעלות בלא תשתית משפטית וראייתית;</w:t>
+        <w:t xml:space="preserve"> את מהות האתגר היטיב בית המשפט העליון לנסח באותה פרשה:</w:t>
+      </w:r>
+    </w:p>
+    <w:p>
+      <w:pPr>
+        <w:bidi/>
+        <w:spacing w:after="160" w:before="120" w:line="300"/>
+        <w:ind w:start="720" w:end="720"/>
+        <w:jc w:val="both"/>
+      </w:pPr>
+      <w:r>
+        <w:rPr>
+          <w:rFonts w:ascii="David" w:cs="David" w:eastAsia="David" w:hAnsi="David"/>
+          <w:sz w:val="22"/>
+          <w:szCs w:val="22"/>
+          <w:rtl/>
+        </w:rPr>
+        <w:t xml:space="preserve">"מדובר בהליך שאיננו שגרתי... ייחודו בכך שהוא נוגע לתביעת זכויות במקרקעין בלתי רשומים, שמטבע הדברים לא ניתן להכריע בה באמצעות הכלים ובהתאם לכללים הרגילים החלים ביחס למקרקעין רשומים. (כידוע, במקרקעין רשומים, אפילו בלתי מוסדרים, הרישום במרשם המקרקעין מהווה לעולם את נקודת המוצא, ולרוב גם את נקודת הסיום, של הדיון בכל סכסוך שעניינו תביעת זכות במקרקעין. לא כך כשמדובר במקרקעין בלתי רשומים)".</w:t>
       </w:r>
       <w:r>
         <w:rPr>
           <w:rStyle w:val="FootnoteReference"/>
         </w:rPr>
         <w:footnoteReference w:id="45"/>
-      </w:r>
-      <w:r>
-        <w:rPr>
-          <w:rFonts w:ascii="David" w:cs="David" w:eastAsia="David" w:hAnsi="David"/>
-          <w:sz w:val="24"/>
-          <w:szCs w:val="24"/>
-          <w:rtl/>
-        </w:rPr>
-        <w:t xml:space="preserve"> ובאותה רוח נפסק כי כלה שהתגוררה שנים בדירת חמהּ מכוח רשות שימוש אינה רוכשת בעלות מכוח המגורים או המנהג המשפחתי, וניתן להורות על סילוק ידה בכפוף לפיצוי על השקעות שהוכחו.</w:t>
-      </w:r>
-      <w:r>
-        <w:rPr>
-          <w:rStyle w:val="FootnoteReference"/>
-        </w:rPr>
-        <w:footnoteReference w:id="46"/>
       </w:r>
     </w:p>
     <w:p>
@@ -2127,13 +2129,51 @@
           <w:szCs w:val="24"/>
           <w:rtl/>
         </w:rPr>
+        <w:t xml:space="preserve">דברים אלה – שנאמרו אגב סכסוך בין ענפי משפחה אחת על מקרקעין בלתי רשומים – הם תמצית עניינה של עבודה זו: מקום שהמרשם אינו יכול לשמש נקודת מוצא ונקודת סיום, נדרש בית המשפט לבנות את ההכרעה מחומרים אחרים. ובקוטב הנגדי, סירוב עקבי להפוך מנהג והחזקה כשלעצמם לבעלות: בית המשפט לענייני משפחה בנצרת דחה במפורש טענה להקניית בעלות מכוח "מנהג במגזר הערבי" והחזקה ממושכת, בקבעו כי הסכמות בעל־פה ומנהג אינם גוברים על הדין הישראלי ואינם מצדיקים הצהרת בעלות בלא תשתית משפטית וראייתית;</w:t>
+      </w:r>
+      <w:r>
+        <w:rPr>
+          <w:rStyle w:val="FootnoteReference"/>
+        </w:rPr>
+        <w:footnoteReference w:id="46"/>
+      </w:r>
+      <w:r>
+        <w:rPr>
+          <w:rFonts w:ascii="David" w:cs="David" w:eastAsia="David" w:hAnsi="David"/>
+          <w:sz w:val="24"/>
+          <w:szCs w:val="24"/>
+          <w:rtl/>
+        </w:rPr>
+        <w:t xml:space="preserve"> ובאותה רוח נפסק כי כלה שהתגוררה שנים בדירת חמהּ מכוח רשות שימוש אינה רוכשת בעלות מכוח המגורים או המנהג המשפחתי, וניתן להורות על סילוק ידה בכפוף לפיצוי על השקעות שהוכחו.</w:t>
+      </w:r>
+      <w:r>
+        <w:rPr>
+          <w:rStyle w:val="FootnoteReference"/>
+        </w:rPr>
+        <w:footnoteReference w:id="47"/>
+      </w:r>
+    </w:p>
+    <w:p>
+      <w:pPr>
+        <w:bidi/>
+        <w:spacing w:after="160" w:line="360"/>
+        <w:ind w:firstLine="420"/>
+        <w:jc w:val="both"/>
+      </w:pPr>
+      <w:r>
+        <w:rPr>
+          <w:rFonts w:ascii="David" w:cs="David" w:eastAsia="David" w:hAnsi="David"/>
+          <w:sz w:val="24"/>
+          <w:szCs w:val="24"/>
+          <w:rtl/>
+        </w:rPr>
         <w:t xml:space="preserve">בין הקטבים משורטטים גבולות דיוניים ומהותיים נוספים. תביעה קניינית לא תוכרע בהיעדר בעל הזכות הרשום: כאשר דירת המגורים רשומה על שם אבי הבעל, אין האישה יכולה לזכות בסעד קנייני בהליך שבין בני הזוג בלבד – אך בית המשפט הכיר באפשרות לפצותה כספית, במסגרת איזון המשאבים, על אובדן זכות דיור שהתבססה במהלך הנישואין.</w:t>
       </w:r>
       <w:r>
         <w:rPr>
           <w:rStyle w:val="FootnoteReference"/>
         </w:rPr>
-        <w:footnoteReference w:id="47"/>
+        <w:footnoteReference w:id="48"/>
       </w:r>
       <w:r>
         <w:rPr>
@@ -2148,7 +2188,7 @@
         <w:rPr>
           <w:rStyle w:val="FootnoteReference"/>
         </w:rPr>
-        <w:footnoteReference w:id="48"/>
+        <w:footnoteReference w:id="49"/>
       </w:r>
       <w:r>
         <w:rPr>
@@ -2163,7 +2203,7 @@
         <w:rPr>
           <w:rStyle w:val="FootnoteReference"/>
         </w:rPr>
-        <w:footnoteReference w:id="49"/>
+        <w:footnoteReference w:id="50"/>
       </w:r>
       <w:r>
         <w:rPr>
@@ -2214,7 +2254,7 @@
         <w:rPr>
           <w:rStyle w:val="FootnoteReference"/>
         </w:rPr>
-        <w:footnoteReference w:id="50"/>
+        <w:footnoteReference w:id="51"/>
       </w:r>
     </w:p>
     <w:p>
@@ -2292,7 +2332,7 @@
         <w:rPr>
           <w:rStyle w:val="FootnoteReference"/>
         </w:rPr>
-        <w:footnoteReference w:id="51"/>
+        <w:footnoteReference w:id="52"/>
       </w:r>
       <w:r>
         <w:rPr>
@@ -2324,7 +2364,7 @@
         <w:rPr>
           <w:rStyle w:val="FootnoteReference"/>
         </w:rPr>
-        <w:footnoteReference w:id="52"/>
+        <w:footnoteReference w:id="53"/>
       </w:r>
     </w:p>
     <w:p>
@@ -2366,7 +2406,7 @@
         <w:rPr>
           <w:rStyle w:val="FootnoteReference"/>
         </w:rPr>
-        <w:footnoteReference w:id="53"/>
+        <w:footnoteReference w:id="54"/>
       </w:r>
       <w:r>
         <w:rPr>
@@ -2417,7 +2457,7 @@
         <w:rPr>
           <w:rStyle w:val="FootnoteReference"/>
         </w:rPr>
-        <w:footnoteReference w:id="54"/>
+        <w:footnoteReference w:id="55"/>
       </w:r>
       <w:r>
         <w:rPr>
@@ -2468,7 +2508,7 @@
         <w:rPr>
           <w:rStyle w:val="FootnoteReference"/>
         </w:rPr>
-        <w:footnoteReference w:id="55"/>
+        <w:footnoteReference w:id="56"/>
       </w:r>
       <w:r>
         <w:rPr>
@@ -2519,7 +2559,7 @@
         <w:rPr>
           <w:rStyle w:val="FootnoteReference"/>
         </w:rPr>
-        <w:footnoteReference w:id="56"/>
+        <w:footnoteReference w:id="57"/>
       </w:r>
       <w:r>
         <w:rPr>
@@ -2589,7 +2629,7 @@
         <w:rPr>
           <w:rStyle w:val="FootnoteReference"/>
         </w:rPr>
-        <w:footnoteReference w:id="57"/>
+        <w:footnoteReference w:id="58"/>
       </w:r>
       <w:r>
         <w:rPr>
@@ -2604,7 +2644,7 @@
         <w:rPr>
           <w:rStyle w:val="FootnoteReference"/>
         </w:rPr>
-        <w:footnoteReference w:id="58"/>
+        <w:footnoteReference w:id="59"/>
       </w:r>
       <w:r>
         <w:rPr>
@@ -2619,7 +2659,7 @@
         <w:rPr>
           <w:rStyle w:val="FootnoteReference"/>
         </w:rPr>
-        <w:footnoteReference w:id="59"/>
+        <w:footnoteReference w:id="60"/>
       </w:r>
       <w:r>
         <w:rPr>
@@ -2634,7 +2674,7 @@
         <w:rPr>
           <w:rStyle w:val="FootnoteReference"/>
         </w:rPr>
-        <w:footnoteReference w:id="60"/>
+        <w:footnoteReference w:id="61"/>
       </w:r>
       <w:r>
         <w:rPr>
@@ -2649,7 +2689,7 @@
         <w:rPr>
           <w:rStyle w:val="FootnoteReference"/>
         </w:rPr>
-        <w:footnoteReference w:id="61"/>
+        <w:footnoteReference w:id="62"/>
       </w:r>
     </w:p>
     <w:p>
@@ -2672,7 +2712,7 @@
         <w:rPr>
           <w:rStyle w:val="FootnoteReference"/>
         </w:rPr>
-        <w:footnoteReference w:id="62"/>
+        <w:footnoteReference w:id="63"/>
       </w:r>
       <w:r>
         <w:rPr>
@@ -2687,7 +2727,7 @@
         <w:rPr>
           <w:rStyle w:val="FootnoteReference"/>
         </w:rPr>
-        <w:footnoteReference w:id="63"/>
+        <w:footnoteReference w:id="64"/>
       </w:r>
       <w:r>
         <w:rPr>
@@ -2738,7 +2778,7 @@
         <w:rPr>
           <w:rStyle w:val="FootnoteReference"/>
         </w:rPr>
-        <w:footnoteReference w:id="64"/>
+        <w:footnoteReference w:id="65"/>
       </w:r>
       <w:r>
         <w:rPr>
@@ -2770,7 +2810,7 @@
         <w:rPr>
           <w:rStyle w:val="FootnoteReference"/>
         </w:rPr>
-        <w:footnoteReference w:id="65"/>
+        <w:footnoteReference w:id="66"/>
       </w:r>
       <w:r>
         <w:rPr>
@@ -2821,7 +2861,7 @@
         <w:rPr>
           <w:rStyle w:val="FootnoteReference"/>
         </w:rPr>
-        <w:footnoteReference w:id="66"/>
+        <w:footnoteReference w:id="67"/>
       </w:r>
     </w:p>
     <w:p>
@@ -2861,7 +2901,7 @@
         <w:rPr>
           <w:rStyle w:val="FootnoteReference"/>
         </w:rPr>
-        <w:footnoteReference w:id="67"/>
+        <w:footnoteReference w:id="68"/>
       </w:r>
       <w:r>
         <w:rPr>
@@ -2893,7 +2933,7 @@
         <w:rPr>
           <w:rStyle w:val="FootnoteReference"/>
         </w:rPr>
-        <w:footnoteReference w:id="68"/>
+        <w:footnoteReference w:id="69"/>
       </w:r>
       <w:r>
         <w:rPr>
@@ -3018,7 +3058,7 @@
         <w:rPr>
           <w:rStyle w:val="FootnoteReference"/>
         </w:rPr>
-        <w:footnoteReference w:id="69"/>
+        <w:footnoteReference w:id="70"/>
       </w:r>
       <w:r>
         <w:rPr>
@@ -3052,7 +3092,7 @@
         <w:rPr>
           <w:rStyle w:val="FootnoteReference"/>
         </w:rPr>
-        <w:footnoteReference w:id="70"/>
+        <w:footnoteReference w:id="71"/>
       </w:r>
       <w:r>
         <w:rPr>
@@ -3087,7 +3127,7 @@
         <w:rPr>
           <w:rStyle w:val="FootnoteReference"/>
         </w:rPr>
-        <w:footnoteReference w:id="71"/>
+        <w:footnoteReference w:id="72"/>
       </w:r>
     </w:p>
     <w:p>
@@ -3129,7 +3169,7 @@
         <w:rPr>
           <w:rStyle w:val="FootnoteReference"/>
         </w:rPr>
-        <w:footnoteReference w:id="72"/>
+        <w:footnoteReference w:id="73"/>
       </w:r>
       <w:r>
         <w:rPr>
@@ -3180,7 +3220,7 @@
         <w:rPr>
           <w:rStyle w:val="FootnoteReference"/>
         </w:rPr>
-        <w:footnoteReference w:id="73"/>
+        <w:footnoteReference w:id="74"/>
       </w:r>
       <w:r>
         <w:rPr>
@@ -3195,7 +3235,7 @@
         <w:rPr>
           <w:rStyle w:val="FootnoteReference"/>
         </w:rPr>
-        <w:footnoteReference w:id="74"/>
+        <w:footnoteReference w:id="75"/>
       </w:r>
     </w:p>
     <w:p>
@@ -3254,7 +3294,7 @@
         <w:rPr>
           <w:rStyle w:val="FootnoteReference"/>
         </w:rPr>
-        <w:footnoteReference w:id="75"/>
+        <w:footnoteReference w:id="76"/>
       </w:r>
       <w:r>
         <w:rPr>
@@ -3305,7 +3345,7 @@
         <w:rPr>
           <w:rStyle w:val="FootnoteReference"/>
         </w:rPr>
-        <w:footnoteReference w:id="76"/>
+        <w:footnoteReference w:id="77"/>
       </w:r>
       <w:r>
         <w:rPr>
@@ -3339,7 +3379,7 @@
         <w:rPr>
           <w:rStyle w:val="FootnoteReference"/>
         </w:rPr>
-        <w:footnoteReference w:id="77"/>
+        <w:footnoteReference w:id="78"/>
       </w:r>
       <w:r>
         <w:rPr>
@@ -3427,7 +3467,7 @@
         <w:rPr>
           <w:rStyle w:val="FootnoteReference"/>
         </w:rPr>
-        <w:footnoteReference w:id="78"/>
+        <w:footnoteReference w:id="79"/>
       </w:r>
       <w:r>
         <w:rPr>
@@ -3461,7 +3501,7 @@
         <w:rPr>
           <w:rStyle w:val="FootnoteReference"/>
         </w:rPr>
-        <w:footnoteReference w:id="79"/>
+        <w:footnoteReference w:id="80"/>
       </w:r>
       <w:r>
         <w:rPr>
@@ -3495,7 +3535,7 @@
         <w:rPr>
           <w:rStyle w:val="FootnoteReference"/>
         </w:rPr>
-        <w:footnoteReference w:id="80"/>
+        <w:footnoteReference w:id="81"/>
       </w:r>
       <w:r>
         <w:rPr>
@@ -3510,7 +3550,7 @@
         <w:rPr>
           <w:rStyle w:val="FootnoteReference"/>
         </w:rPr>
-        <w:footnoteReference w:id="81"/>
+        <w:footnoteReference w:id="82"/>
       </w:r>
       <w:r>
         <w:rPr>
@@ -3525,7 +3565,7 @@
         <w:rPr>
           <w:rStyle w:val="FootnoteReference"/>
         </w:rPr>
-        <w:footnoteReference w:id="82"/>
+        <w:footnoteReference w:id="83"/>
       </w:r>
     </w:p>
     <w:p>
@@ -3586,7 +3626,7 @@
         <w:rPr>
           <w:rStyle w:val="FootnoteReference"/>
         </w:rPr>
-        <w:footnoteReference w:id="83"/>
+        <w:footnoteReference w:id="84"/>
       </w:r>
       <w:r>
         <w:rPr>
@@ -3601,7 +3641,7 @@
         <w:rPr>
           <w:rStyle w:val="FootnoteReference"/>
         </w:rPr>
-        <w:footnoteReference w:id="84"/>
+        <w:footnoteReference w:id="85"/>
       </w:r>
       <w:r>
         <w:rPr>
@@ -3616,7 +3656,7 @@
         <w:rPr>
           <w:rStyle w:val="FootnoteReference"/>
         </w:rPr>
-        <w:footnoteReference w:id="85"/>
+        <w:footnoteReference w:id="86"/>
       </w:r>
     </w:p>
     <w:p>
@@ -3658,7 +3698,7 @@
         <w:rPr>
           <w:rStyle w:val="FootnoteReference"/>
         </w:rPr>
-        <w:footnoteReference w:id="86"/>
+        <w:footnoteReference w:id="87"/>
       </w:r>
       <w:r>
         <w:rPr>
@@ -3673,7 +3713,7 @@
         <w:rPr>
           <w:rStyle w:val="FootnoteReference"/>
         </w:rPr>
-        <w:footnoteReference w:id="87"/>
+        <w:footnoteReference w:id="88"/>
       </w:r>
     </w:p>
     <w:p>
@@ -3715,7 +3755,7 @@
         <w:rPr>
           <w:rStyle w:val="FootnoteReference"/>
         </w:rPr>
-        <w:footnoteReference w:id="88"/>
+        <w:footnoteReference w:id="89"/>
       </w:r>
       <w:r>
         <w:rPr>
@@ -3730,7 +3770,7 @@
         <w:rPr>
           <w:rStyle w:val="FootnoteReference"/>
         </w:rPr>
-        <w:footnoteReference w:id="89"/>
+        <w:footnoteReference w:id="90"/>
       </w:r>
       <w:r>
         <w:rPr>
@@ -3745,7 +3785,7 @@
         <w:rPr>
           <w:rStyle w:val="FootnoteReference"/>
         </w:rPr>
-        <w:footnoteReference w:id="90"/>
+        <w:footnoteReference w:id="91"/>
       </w:r>
       <w:r>
         <w:rPr>
@@ -3760,7 +3800,7 @@
         <w:rPr>
           <w:rStyle w:val="FootnoteReference"/>
         </w:rPr>
-        <w:footnoteReference w:id="91"/>
+        <w:footnoteReference w:id="92"/>
       </w:r>
     </w:p>
     <w:p>
@@ -3802,7 +3842,7 @@
         <w:rPr>
           <w:rStyle w:val="FootnoteReference"/>
         </w:rPr>
-        <w:footnoteReference w:id="92"/>
+        <w:footnoteReference w:id="93"/>
       </w:r>
       <w:r>
         <w:rPr>
@@ -3817,7 +3857,7 @@
         <w:rPr>
           <w:rStyle w:val="FootnoteReference"/>
         </w:rPr>
-        <w:footnoteReference w:id="93"/>
+        <w:footnoteReference w:id="94"/>
       </w:r>
       <w:r>
         <w:rPr>
@@ -3832,7 +3872,7 @@
         <w:rPr>
           <w:rStyle w:val="FootnoteReference"/>
         </w:rPr>
-        <w:footnoteReference w:id="94"/>
+        <w:footnoteReference w:id="95"/>
       </w:r>
       <w:r>
         <w:rPr>
@@ -3902,7 +3942,7 @@
         <w:rPr>
           <w:rStyle w:val="FootnoteReference"/>
         </w:rPr>
-        <w:footnoteReference w:id="95"/>
+        <w:footnoteReference w:id="96"/>
       </w:r>
       <w:r>
         <w:rPr>
@@ -3953,7 +3993,7 @@
         <w:rPr>
           <w:rStyle w:val="FootnoteReference"/>
         </w:rPr>
-        <w:footnoteReference w:id="96"/>
+        <w:footnoteReference w:id="97"/>
       </w:r>
       <w:r>
         <w:rPr>
@@ -3968,7 +4008,7 @@
         <w:rPr>
           <w:rStyle w:val="FootnoteReference"/>
         </w:rPr>
-        <w:footnoteReference w:id="97"/>
+        <w:footnoteReference w:id="98"/>
       </w:r>
       <w:r>
         <w:rPr>
@@ -3983,7 +4023,7 @@
         <w:rPr>
           <w:rStyle w:val="FootnoteReference"/>
         </w:rPr>
-        <w:footnoteReference w:id="98"/>
+        <w:footnoteReference w:id="99"/>
       </w:r>
     </w:p>
     <w:p>
@@ -4006,7 +4046,7 @@
         <w:rPr>
           <w:rStyle w:val="FootnoteReference"/>
         </w:rPr>
-        <w:footnoteReference w:id="99"/>
+        <w:footnoteReference w:id="100"/>
       </w:r>
     </w:p>
     <w:p>
@@ -4048,7 +4088,7 @@
         <w:rPr>
           <w:rStyle w:val="FootnoteReference"/>
         </w:rPr>
-        <w:footnoteReference w:id="100"/>
+        <w:footnoteReference w:id="101"/>
       </w:r>
       <w:r>
         <w:rPr>
@@ -4063,7 +4103,7 @@
         <w:rPr>
           <w:rStyle w:val="FootnoteReference"/>
         </w:rPr>
-        <w:footnoteReference w:id="101"/>
+        <w:footnoteReference w:id="102"/>
       </w:r>
       <w:r>
         <w:rPr>
@@ -4078,7 +4118,7 @@
         <w:rPr>
           <w:rStyle w:val="FootnoteReference"/>
         </w:rPr>
-        <w:footnoteReference w:id="102"/>
+        <w:footnoteReference w:id="103"/>
       </w:r>
       <w:r>
         <w:rPr>
@@ -4129,7 +4169,7 @@
         <w:rPr>
           <w:rStyle w:val="FootnoteReference"/>
         </w:rPr>
-        <w:footnoteReference w:id="103"/>
+        <w:footnoteReference w:id="104"/>
       </w:r>
       <w:r>
         <w:rPr>
@@ -4144,7 +4184,7 @@
         <w:rPr>
           <w:rStyle w:val="FootnoteReference"/>
         </w:rPr>
-        <w:footnoteReference w:id="104"/>
+        <w:footnoteReference w:id="105"/>
       </w:r>
       <w:r>
         <w:rPr>
@@ -4159,7 +4199,7 @@
         <w:rPr>
           <w:rStyle w:val="FootnoteReference"/>
         </w:rPr>
-        <w:footnoteReference w:id="105"/>
+        <w:footnoteReference w:id="106"/>
       </w:r>
       <w:r>
         <w:rPr>
@@ -4174,7 +4214,7 @@
         <w:rPr>
           <w:rStyle w:val="FootnoteReference"/>
         </w:rPr>
-        <w:footnoteReference w:id="106"/>
+        <w:footnoteReference w:id="107"/>
       </w:r>
       <w:r>
         <w:rPr>
@@ -4320,7 +4360,7 @@
         <w:rPr>
           <w:rStyle w:val="FootnoteReference"/>
         </w:rPr>
-        <w:footnoteReference w:id="107"/>
+        <w:footnoteReference w:id="108"/>
       </w:r>
     </w:p>
     <w:p>
@@ -4379,7 +4419,7 @@
         <w:rPr>
           <w:rStyle w:val="FootnoteReference"/>
         </w:rPr>
-        <w:footnoteReference w:id="108"/>
+        <w:footnoteReference w:id="109"/>
       </w:r>
       <w:r>
         <w:rPr>
@@ -4394,7 +4434,7 @@
         <w:rPr>
           <w:rStyle w:val="FootnoteReference"/>
         </w:rPr>
-        <w:footnoteReference w:id="109"/>
+        <w:footnoteReference w:id="110"/>
       </w:r>
       <w:r>
         <w:rPr>
@@ -4426,7 +4466,7 @@
         <w:rPr>
           <w:rStyle w:val="FootnoteReference"/>
         </w:rPr>
-        <w:footnoteReference w:id="110"/>
+        <w:footnoteReference w:id="111"/>
       </w:r>
       <w:r>
         <w:rPr>
@@ -4478,7 +4518,7 @@
         <w:rPr>
           <w:rStyle w:val="FootnoteReference"/>
         </w:rPr>
-        <w:footnoteReference w:id="111"/>
+        <w:footnoteReference w:id="112"/>
       </w:r>
       <w:r>
         <w:rPr>
@@ -4493,7 +4533,7 @@
         <w:rPr>
           <w:rStyle w:val="FootnoteReference"/>
         </w:rPr>
-        <w:footnoteReference w:id="112"/>
+        <w:footnoteReference w:id="113"/>
       </w:r>
       <w:r>
         <w:rPr>
@@ -9285,7 +9325,7 @@
           <w:szCs w:val="20"/>
           <w:rtl/>
         </w:rPr>
-        <w:t xml:space="preserve"> (נבו 22.9.2020); וראו גם בע"מ 7496/19 </w:t>
+        <w:t xml:space="preserve"> (נבו 22.9.2020) (להלן: עניין </w:t>
       </w:r>
       <w:r>
         <w:rPr>
@@ -9296,6 +9336,26 @@
           <w:szCs w:val="20"/>
           <w:rtl/>
         </w:rPr>
+        <w:t xml:space="preserve">משעל</w:t>
+      </w:r>
+      <w:r>
+        <w:rPr>
+          <w:rFonts w:ascii="David" w:cs="David" w:eastAsia="David" w:hAnsi="David"/>
+          <w:sz w:val="20"/>
+          <w:szCs w:val="20"/>
+          <w:rtl/>
+        </w:rPr>
+        <w:t xml:space="preserve">); וראו גם בע"מ 7496/19 </w:t>
+      </w:r>
+      <w:r>
+        <w:rPr>
+          <w:rFonts w:ascii="David" w:cs="David" w:eastAsia="David" w:hAnsi="David"/>
+          <w:i/>
+          <w:iCs/>
+          <w:sz w:val="20"/>
+          <w:szCs w:val="20"/>
+          <w:rtl/>
+        </w:rPr>
         <w:t xml:space="preserve">פלוני נ׳ פלוני</w:t>
       </w:r>
       <w:r>
@@ -9328,7 +9388,7 @@
           <w:szCs w:val="20"/>
           <w:rtl/>
         </w:rPr>
-        <w:t xml:space="preserve">תלה"מ (משפחה נצ׳) 60777-07-20 </w:t>
+        <w:t xml:space="preserve">עניין </w:t>
       </w:r>
       <w:r>
         <w:rPr>
@@ -9339,16 +9399,57 @@
           <w:szCs w:val="20"/>
           <w:rtl/>
         </w:rPr>
-        <w:t xml:space="preserve">ג.ס נ׳ מ.ד</w:t>
-      </w:r>
-      <w:r>
-        <w:rPr>
-          <w:rFonts w:ascii="David" w:cs="David" w:eastAsia="David" w:hAnsi="David"/>
-          <w:sz w:val="20"/>
-          <w:szCs w:val="20"/>
-          <w:rtl/>
-        </w:rPr>
-        <w:t xml:space="preserve"> (נבו 14.4.2021); וראו גם תמ"ש (משפחה נצ׳) 4821-07 </w:t>
+        <w:t xml:space="preserve">משעל</w:t>
+      </w:r>
+      <w:r>
+        <w:rPr>
+          <w:rFonts w:ascii="David" w:cs="David" w:eastAsia="David" w:hAnsi="David"/>
+          <w:sz w:val="20"/>
+          <w:szCs w:val="20"/>
+          <w:rtl/>
+        </w:rPr>
+        <w:t xml:space="preserve">, </w:t>
+      </w:r>
+      <w:r>
+        <w:rPr>
+          <w:rFonts w:ascii="David" w:cs="David" w:eastAsia="David" w:hAnsi="David"/>
+          <w:sz w:val="20"/>
+          <w:szCs w:val="20"/>
+          <w:rtl/>
+        </w:rPr>
+        <w:t xml:space="preserve">לעיל ה"ש 44</w:t>
+      </w:r>
+      <w:r>
+        <w:rPr>
+          <w:rFonts w:ascii="David" w:cs="David" w:eastAsia="David" w:hAnsi="David"/>
+          <w:sz w:val="20"/>
+          <w:szCs w:val="20"/>
+          <w:rtl/>
+        </w:rPr>
+        <w:t xml:space="preserve">, בעמ׳ 3–4 לפסק הדין.</w:t>
+      </w:r>
+    </w:p>
+  </w:footnote>
+  <w:footnote w:id="46">
+    <w:p>
+      <w:pPr>
+        <w:bidi/>
+        <w:spacing w:after="60"/>
+      </w:pPr>
+      <w:r>
+        <w:rPr>
+          <w:rStyle w:val="FootnoteReference"/>
+        </w:rPr>
+        <w:footnoteRef/>
+      </w:r>
+      <w:r>
+        <w:rPr>
+          <w:rFonts w:ascii="David" w:cs="David" w:eastAsia="David" w:hAnsi="David"/>
+          <w:sz w:val="20"/>
+          <w:szCs w:val="20"/>
+          <w:rtl/>
+        </w:rPr>
+        <w:t xml:space="preserve">תלה"מ (משפחה נצ׳) 60777-07-20 </w:t>
       </w:r>
       <w:r>
         <w:rPr>
@@ -9359,16 +9460,16 @@
           <w:szCs w:val="20"/>
           <w:rtl/>
         </w:rPr>
-        <w:t xml:space="preserve">ס.ע.ז נ׳ ע.ע.ז</w:t>
-      </w:r>
-      <w:r>
-        <w:rPr>
-          <w:rFonts w:ascii="David" w:cs="David" w:eastAsia="David" w:hAnsi="David"/>
-          <w:sz w:val="20"/>
-          <w:szCs w:val="20"/>
-          <w:rtl/>
-        </w:rPr>
-        <w:t xml:space="preserve"> (נבו 2012); עניין </w:t>
+        <w:t xml:space="preserve">ג.ס נ׳ מ.ד</w:t>
+      </w:r>
+      <w:r>
+        <w:rPr>
+          <w:rFonts w:ascii="David" w:cs="David" w:eastAsia="David" w:hAnsi="David"/>
+          <w:sz w:val="20"/>
+          <w:szCs w:val="20"/>
+          <w:rtl/>
+        </w:rPr>
+        <w:t xml:space="preserve"> (נבו 14.4.2021); וראו גם תמ"ש (משפחה נצ׳) 4821-07 </w:t>
       </w:r>
       <w:r>
         <w:rPr>
@@ -9379,57 +9480,16 @@
           <w:szCs w:val="20"/>
           <w:rtl/>
         </w:rPr>
-        <w:t xml:space="preserve">אבו ליל</w:t>
-      </w:r>
-      <w:r>
-        <w:rPr>
-          <w:rFonts w:ascii="David" w:cs="David" w:eastAsia="David" w:hAnsi="David"/>
-          <w:sz w:val="20"/>
-          <w:szCs w:val="20"/>
-          <w:rtl/>
-        </w:rPr>
-        <w:t xml:space="preserve">, </w:t>
-      </w:r>
-      <w:r>
-        <w:rPr>
-          <w:rFonts w:ascii="David" w:cs="David" w:eastAsia="David" w:hAnsi="David"/>
-          <w:sz w:val="20"/>
-          <w:szCs w:val="20"/>
-          <w:rtl/>
-        </w:rPr>
-        <w:t xml:space="preserve">לעיל ה"ש 27</w:t>
-      </w:r>
-      <w:r>
-        <w:rPr>
-          <w:rFonts w:ascii="David" w:cs="David" w:eastAsia="David" w:hAnsi="David"/>
-          <w:sz w:val="20"/>
-          <w:szCs w:val="20"/>
-          <w:rtl/>
-        </w:rPr>
-        <w:t xml:space="preserve">.</w:t>
-      </w:r>
-    </w:p>
-  </w:footnote>
-  <w:footnote w:id="46">
-    <w:p>
-      <w:pPr>
-        <w:bidi/>
-        <w:spacing w:after="60"/>
-      </w:pPr>
-      <w:r>
-        <w:rPr>
-          <w:rStyle w:val="FootnoteReference"/>
-        </w:rPr>
-        <w:footnoteRef/>
-      </w:r>
-      <w:r>
-        <w:rPr>
-          <w:rFonts w:ascii="David" w:cs="David" w:eastAsia="David" w:hAnsi="David"/>
-          <w:sz w:val="20"/>
-          <w:szCs w:val="20"/>
-          <w:rtl/>
-        </w:rPr>
-        <w:t xml:space="preserve">תמ"ש (משפחה נצ׳) 27669-01-17 </w:t>
+        <w:t xml:space="preserve">ס.ע.ז נ׳ ע.ע.ז</w:t>
+      </w:r>
+      <w:r>
+        <w:rPr>
+          <w:rFonts w:ascii="David" w:cs="David" w:eastAsia="David" w:hAnsi="David"/>
+          <w:sz w:val="20"/>
+          <w:szCs w:val="20"/>
+          <w:rtl/>
+        </w:rPr>
+        <w:t xml:space="preserve"> (נבו 2012); עניין </w:t>
       </w:r>
       <w:r>
         <w:rPr>
@@ -9440,16 +9500,34 @@
           <w:szCs w:val="20"/>
           <w:rtl/>
         </w:rPr>
-        <w:t xml:space="preserve">ו.ע נ׳ כ.ע</w:t>
-      </w:r>
-      <w:r>
-        <w:rPr>
-          <w:rFonts w:ascii="David" w:cs="David" w:eastAsia="David" w:hAnsi="David"/>
-          <w:sz w:val="20"/>
-          <w:szCs w:val="20"/>
-          <w:rtl/>
-        </w:rPr>
-        <w:t xml:space="preserve"> (נבו 22.4.2018).</w:t>
+        <w:t xml:space="preserve">אבו ליל</w:t>
+      </w:r>
+      <w:r>
+        <w:rPr>
+          <w:rFonts w:ascii="David" w:cs="David" w:eastAsia="David" w:hAnsi="David"/>
+          <w:sz w:val="20"/>
+          <w:szCs w:val="20"/>
+          <w:rtl/>
+        </w:rPr>
+        <w:t xml:space="preserve">, </w:t>
+      </w:r>
+      <w:r>
+        <w:rPr>
+          <w:rFonts w:ascii="David" w:cs="David" w:eastAsia="David" w:hAnsi="David"/>
+          <w:sz w:val="20"/>
+          <w:szCs w:val="20"/>
+          <w:rtl/>
+        </w:rPr>
+        <w:t xml:space="preserve">לעיל ה"ש 27</w:t>
+      </w:r>
+      <w:r>
+        <w:rPr>
+          <w:rFonts w:ascii="David" w:cs="David" w:eastAsia="David" w:hAnsi="David"/>
+          <w:sz w:val="20"/>
+          <w:szCs w:val="20"/>
+          <w:rtl/>
+        </w:rPr>
+        <w:t xml:space="preserve">.</w:t>
       </w:r>
     </w:p>
   </w:footnote>
@@ -9472,7 +9550,7 @@
           <w:szCs w:val="20"/>
           <w:rtl/>
         </w:rPr>
-        <w:t xml:space="preserve">תלה"מ (משפחה נצ׳) 39735-12-19 </w:t>
+        <w:t xml:space="preserve">תמ"ש (משפחה נצ׳) 27669-01-17 </w:t>
       </w:r>
       <w:r>
         <w:rPr>
@@ -9483,16 +9561,16 @@
           <w:szCs w:val="20"/>
           <w:rtl/>
         </w:rPr>
-        <w:t xml:space="preserve">פלונית נ׳ פלוני</w:t>
-      </w:r>
-      <w:r>
-        <w:rPr>
-          <w:rFonts w:ascii="David" w:cs="David" w:eastAsia="David" w:hAnsi="David"/>
-          <w:sz w:val="20"/>
-          <w:szCs w:val="20"/>
-          <w:rtl/>
-        </w:rPr>
-        <w:t xml:space="preserve"> (נבו 14.10.2022).</w:t>
+        <w:t xml:space="preserve">ו.ע נ׳ כ.ע</w:t>
+      </w:r>
+      <w:r>
+        <w:rPr>
+          <w:rFonts w:ascii="David" w:cs="David" w:eastAsia="David" w:hAnsi="David"/>
+          <w:sz w:val="20"/>
+          <w:szCs w:val="20"/>
+          <w:rtl/>
+        </w:rPr>
+        <w:t xml:space="preserve"> (נבו 22.4.2018).</w:t>
       </w:r>
     </w:p>
   </w:footnote>
@@ -9515,7 +9593,7 @@
           <w:szCs w:val="20"/>
           <w:rtl/>
         </w:rPr>
-        <w:t xml:space="preserve">תמ"ש (משפחה חד׳) 44358-11-19 </w:t>
+        <w:t xml:space="preserve">תלה"מ (משפחה נצ׳) 39735-12-19 </w:t>
       </w:r>
       <w:r>
         <w:rPr>
@@ -9526,16 +9604,16 @@
           <w:szCs w:val="20"/>
           <w:rtl/>
         </w:rPr>
-        <w:t xml:space="preserve">אלמונית נ׳ פלונית</w:t>
-      </w:r>
-      <w:r>
-        <w:rPr>
-          <w:rFonts w:ascii="David" w:cs="David" w:eastAsia="David" w:hAnsi="David"/>
-          <w:sz w:val="20"/>
-          <w:szCs w:val="20"/>
-          <w:rtl/>
-        </w:rPr>
-        <w:t xml:space="preserve"> (נבו 7.5.2023).</w:t>
+        <w:t xml:space="preserve">פלונית נ׳ פלוני</w:t>
+      </w:r>
+      <w:r>
+        <w:rPr>
+          <w:rFonts w:ascii="David" w:cs="David" w:eastAsia="David" w:hAnsi="David"/>
+          <w:sz w:val="20"/>
+          <w:szCs w:val="20"/>
+          <w:rtl/>
+        </w:rPr>
+        <w:t xml:space="preserve"> (נבו 14.10.2022).</w:t>
       </w:r>
     </w:p>
   </w:footnote>
@@ -9558,7 +9636,7 @@
           <w:szCs w:val="20"/>
           <w:rtl/>
         </w:rPr>
-        <w:t xml:space="preserve">רע"א 4890/15 </w:t>
+        <w:t xml:space="preserve">תמ"ש (משפחה חד׳) 44358-11-19 </w:t>
       </w:r>
       <w:r>
         <w:rPr>
@@ -9569,16 +9647,16 @@
           <w:szCs w:val="20"/>
           <w:rtl/>
         </w:rPr>
-        <w:t xml:space="preserve">אלוש נ׳ עיריית טבריה</w:t>
-      </w:r>
-      <w:r>
-        <w:rPr>
-          <w:rFonts w:ascii="David" w:cs="David" w:eastAsia="David" w:hAnsi="David"/>
-          <w:sz w:val="20"/>
-          <w:szCs w:val="20"/>
-          <w:rtl/>
-        </w:rPr>
-        <w:t xml:space="preserve"> (נבו 31.12.2015).</w:t>
+        <w:t xml:space="preserve">אלמונית נ׳ פלונית</w:t>
+      </w:r>
+      <w:r>
+        <w:rPr>
+          <w:rFonts w:ascii="David" w:cs="David" w:eastAsia="David" w:hAnsi="David"/>
+          <w:sz w:val="20"/>
+          <w:szCs w:val="20"/>
+          <w:rtl/>
+        </w:rPr>
+        <w:t xml:space="preserve"> (נבו 7.5.2023).</w:t>
       </w:r>
     </w:p>
   </w:footnote>
@@ -9601,43 +9679,27 @@
           <w:szCs w:val="20"/>
           <w:rtl/>
         </w:rPr>
-        <w:t xml:space="preserve">לביקורת עקרונית על אי-הוודאות הנובעת משסתומי יושר ותום לב בדיני הקניין השוו רייכמן, </w:t>
-      </w:r>
-      <w:r>
-        <w:rPr>
-          <w:rFonts w:ascii="David" w:cs="David" w:eastAsia="David" w:hAnsi="David"/>
-          <w:sz w:val="20"/>
-          <w:szCs w:val="20"/>
-          <w:rtl/>
-        </w:rPr>
-        <w:t xml:space="preserve">לעיל ה"ש 9</w:t>
-      </w:r>
-      <w:r>
-        <w:rPr>
-          <w:rFonts w:ascii="David" w:cs="David" w:eastAsia="David" w:hAnsi="David"/>
-          <w:sz w:val="20"/>
-          <w:szCs w:val="20"/>
-          <w:rtl/>
-        </w:rPr>
-        <w:t xml:space="preserve">, בעמ׳ 297 ואילך; וכהן, </w:t>
-      </w:r>
-      <w:r>
-        <w:rPr>
-          <w:rFonts w:ascii="David" w:cs="David" w:eastAsia="David" w:hAnsi="David"/>
-          <w:sz w:val="20"/>
-          <w:szCs w:val="20"/>
-          <w:rtl/>
-        </w:rPr>
-        <w:t xml:space="preserve">לעיל ה"ש 31</w:t>
-      </w:r>
-      <w:r>
-        <w:rPr>
-          <w:rFonts w:ascii="David" w:cs="David" w:eastAsia="David" w:hAnsi="David"/>
-          <w:sz w:val="20"/>
-          <w:szCs w:val="20"/>
-          <w:rtl/>
-        </w:rPr>
-        <w:t xml:space="preserve">.</w:t>
+        <w:t xml:space="preserve">רע"א 4890/15 </w:t>
+      </w:r>
+      <w:r>
+        <w:rPr>
+          <w:rFonts w:ascii="David" w:cs="David" w:eastAsia="David" w:hAnsi="David"/>
+          <w:i/>
+          <w:iCs/>
+          <w:sz w:val="20"/>
+          <w:szCs w:val="20"/>
+          <w:rtl/>
+        </w:rPr>
+        <w:t xml:space="preserve">אלוש נ׳ עיריית טבריה</w:t>
+      </w:r>
+      <w:r>
+        <w:rPr>
+          <w:rFonts w:ascii="David" w:cs="David" w:eastAsia="David" w:hAnsi="David"/>
+          <w:sz w:val="20"/>
+          <w:szCs w:val="20"/>
+          <w:rtl/>
+        </w:rPr>
+        <w:t xml:space="preserve"> (נבו 31.12.2015).</w:t>
       </w:r>
     </w:p>
   </w:footnote>
@@ -9660,7 +9722,43 @@
           <w:szCs w:val="20"/>
           <w:rtl/>
         </w:rPr>
-        <w:t xml:space="preserve">תק׳ 36–38 לתקנות התכנון והבניה (רישוי בניה), התשע"ו-2016; וקודם לכן תק׳ 2א לתקנות התכנון והבניה (בקשה להיתר, תנאיו ואגרות), התש"ל-1970. ההלכה חזרה והדגישה כי מוסדות התכנון אינם מכריעים בסכסוכי קניין.</w:t>
+        <w:t xml:space="preserve">לביקורת עקרונית על אי-הוודאות הנובעת משסתומי יושר ותום לב בדיני הקניין השוו רייכמן, </w:t>
+      </w:r>
+      <w:r>
+        <w:rPr>
+          <w:rFonts w:ascii="David" w:cs="David" w:eastAsia="David" w:hAnsi="David"/>
+          <w:sz w:val="20"/>
+          <w:szCs w:val="20"/>
+          <w:rtl/>
+        </w:rPr>
+        <w:t xml:space="preserve">לעיל ה"ש 9</w:t>
+      </w:r>
+      <w:r>
+        <w:rPr>
+          <w:rFonts w:ascii="David" w:cs="David" w:eastAsia="David" w:hAnsi="David"/>
+          <w:sz w:val="20"/>
+          <w:szCs w:val="20"/>
+          <w:rtl/>
+        </w:rPr>
+        <w:t xml:space="preserve">, בעמ׳ 297 ואילך; וכהן, </w:t>
+      </w:r>
+      <w:r>
+        <w:rPr>
+          <w:rFonts w:ascii="David" w:cs="David" w:eastAsia="David" w:hAnsi="David"/>
+          <w:sz w:val="20"/>
+          <w:szCs w:val="20"/>
+          <w:rtl/>
+        </w:rPr>
+        <w:t xml:space="preserve">לעיל ה"ש 31</w:t>
+      </w:r>
+      <w:r>
+        <w:rPr>
+          <w:rFonts w:ascii="David" w:cs="David" w:eastAsia="David" w:hAnsi="David"/>
+          <w:sz w:val="20"/>
+          <w:szCs w:val="20"/>
+          <w:rtl/>
+        </w:rPr>
+        <w:t xml:space="preserve">.</w:t>
       </w:r>
     </w:p>
   </w:footnote>
@@ -9683,6 +9781,29 @@
           <w:szCs w:val="20"/>
           <w:rtl/>
         </w:rPr>
+        <w:t xml:space="preserve">תק׳ 36–38 לתקנות התכנון והבניה (רישוי בניה), התשע"ו-2016; וקודם לכן תק׳ 2א לתקנות התכנון והבניה (בקשה להיתר, תנאיו ואגרות), התש"ל-1970. ההלכה חזרה והדגישה כי מוסדות התכנון אינם מכריעים בסכסוכי קניין.</w:t>
+      </w:r>
+    </w:p>
+  </w:footnote>
+  <w:footnote w:id="53">
+    <w:p>
+      <w:pPr>
+        <w:bidi/>
+        <w:spacing w:after="60"/>
+      </w:pPr>
+      <w:r>
+        <w:rPr>
+          <w:rStyle w:val="FootnoteReference"/>
+        </w:rPr>
+        <w:footnoteRef/>
+      </w:r>
+      <w:r>
+        <w:rPr>
+          <w:rFonts w:ascii="David" w:cs="David" w:eastAsia="David" w:hAnsi="David"/>
+          <w:sz w:val="20"/>
+          <w:szCs w:val="20"/>
+          <w:rtl/>
+        </w:rPr>
         <w:t xml:space="preserve">ראו פסיקת ערכאות המשפחה שנסקרה לעיל, </w:t>
       </w:r>
       <w:r>
@@ -9692,7 +9813,7 @@
           <w:szCs w:val="20"/>
           <w:rtl/>
         </w:rPr>
-        <w:t xml:space="preserve">לעיל ה"ש 45</w:t>
+        <w:t xml:space="preserve">לעיל ה"ש 46</w:t>
       </w:r>
       <w:r>
         <w:rPr>
@@ -9743,7 +9864,7 @@
       </w:r>
     </w:p>
   </w:footnote>
-  <w:footnote w:id="53">
+  <w:footnote w:id="54">
     <w:p>
       <w:pPr>
         <w:bidi/>
@@ -9766,7 +9887,7 @@
       </w:r>
     </w:p>
   </w:footnote>
-  <w:footnote w:id="54">
+  <w:footnote w:id="55">
     <w:p>
       <w:pPr>
         <w:bidi/>
@@ -9865,7 +9986,7 @@
       </w:r>
     </w:p>
   </w:footnote>
-  <w:footnote w:id="55">
+  <w:footnote w:id="56">
     <w:p>
       <w:pPr>
         <w:bidi/>
@@ -9908,7 +10029,7 @@
       </w:r>
     </w:p>
   </w:footnote>
-  <w:footnote w:id="56">
+  <w:footnote w:id="57">
     <w:p>
       <w:pPr>
         <w:bidi/>
@@ -9961,7 +10082,7 @@
       </w:r>
     </w:p>
   </w:footnote>
-  <w:footnote w:id="57">
+  <w:footnote w:id="58">
     <w:p>
       <w:pPr>
         <w:bidi/>
@@ -10004,7 +10125,7 @@
       </w:r>
     </w:p>
   </w:footnote>
-  <w:footnote w:id="58">
+  <w:footnote w:id="59">
     <w:p>
       <w:pPr>
         <w:bidi/>
@@ -10032,7 +10153,7 @@
           <w:szCs w:val="20"/>
           <w:rtl/>
         </w:rPr>
-        <w:t xml:space="preserve">לעיל ה"ש 57</w:t>
+        <w:t xml:space="preserve">לעיל ה"ש 58</w:t>
       </w:r>
       <w:r>
         <w:rPr>
@@ -10042,29 +10163,6 @@
           <w:rtl/>
         </w:rPr>
         <w:t xml:space="preserve">, בעמ׳ 282.</w:t>
-      </w:r>
-    </w:p>
-  </w:footnote>
-  <w:footnote w:id="59">
-    <w:p>
-      <w:pPr>
-        <w:bidi/>
-        <w:spacing w:after="60"/>
-      </w:pPr>
-      <w:r>
-        <w:rPr>
-          <w:rStyle w:val="FootnoteReference"/>
-        </w:rPr>
-        <w:footnoteRef/>
-      </w:r>
-      <w:r>
-        <w:rPr>
-          <w:rFonts w:ascii="David" w:cs="David" w:eastAsia="David" w:hAnsi="David"/>
-          <w:sz w:val="20"/>
-          <w:szCs w:val="20"/>
-          <w:rtl/>
-        </w:rPr>
-        <w:t xml:space="preserve">ס׳ 16(ב) לחוק מיסוי מקרקעין. המחוקק זיהה כבר בשנות השישים את ייפוי הכוח כמסלול עוקף-דיווח, וביקש ללכוד גם אותו ברשת ההצהרה.</w:t>
       </w:r>
     </w:p>
   </w:footnote>
@@ -10087,7 +10185,7 @@
           <w:szCs w:val="20"/>
           <w:rtl/>
         </w:rPr>
-        <w:t xml:space="preserve">ס׳ 73 לחוק מיסוי מקרקעין.</w:t>
+        <w:t xml:space="preserve">ס׳ 16(ב) לחוק מיסוי מקרקעין. המחוקק זיהה כבר בשנות השישים את ייפוי הכוח כמסלול עוקף-דיווח, וביקש ללכוד גם אותו ברשת ההצהרה.</w:t>
       </w:r>
     </w:p>
   </w:footnote>
@@ -10110,7 +10208,7 @@
           <w:szCs w:val="20"/>
           <w:rtl/>
         </w:rPr>
-        <w:t xml:space="preserve">ס׳ 324(א) לפקודת העיריות [נוסח חדש]; ולעניין היטל השבחה – ס׳ 10 לתוספת השלישית לחוק התכנון והבנייה, התשכ"ה-1965.</w:t>
+        <w:t xml:space="preserve">ס׳ 73 לחוק מיסוי מקרקעין.</w:t>
       </w:r>
     </w:p>
   </w:footnote>
@@ -10133,25 +10231,7 @@
           <w:szCs w:val="20"/>
           <w:rtl/>
         </w:rPr>
-        <w:t xml:space="preserve">להגדרות "זכות במקרקעין" ו"מכירה" ראו ס׳ 1 לחוק מיסוי מקרקעין; ולמיסוי מכירת בעלות שביושר ראו גורמן ואהרונוביץ׳, </w:t>
-      </w:r>
-      <w:r>
-        <w:rPr>
-          <w:rFonts w:ascii="David" w:cs="David" w:eastAsia="David" w:hAnsi="David"/>
-          <w:sz w:val="20"/>
-          <w:szCs w:val="20"/>
-          <w:rtl/>
-        </w:rPr>
-        <w:t xml:space="preserve">לעיל ה"ש 57</w:t>
-      </w:r>
-      <w:r>
-        <w:rPr>
-          <w:rFonts w:ascii="David" w:cs="David" w:eastAsia="David" w:hAnsi="David"/>
-          <w:sz w:val="20"/>
-          <w:szCs w:val="20"/>
-          <w:rtl/>
-        </w:rPr>
-        <w:t xml:space="preserve">, בעמ׳ 151.</w:t>
+        <w:t xml:space="preserve">ס׳ 324(א) לפקודת העיריות [נוסח חדש]; ולעניין היטל השבחה – ס׳ 10 לתוספת השלישית לחוק התכנון והבנייה, התשכ"ה-1965.</w:t>
       </w:r>
     </w:p>
   </w:footnote>
@@ -10174,6 +10254,47 @@
           <w:szCs w:val="20"/>
           <w:rtl/>
         </w:rPr>
+        <w:t xml:space="preserve">להגדרות "זכות במקרקעין" ו"מכירה" ראו ס׳ 1 לחוק מיסוי מקרקעין; ולמיסוי מכירת בעלות שביושר ראו גורמן ואהרונוביץ׳, </w:t>
+      </w:r>
+      <w:r>
+        <w:rPr>
+          <w:rFonts w:ascii="David" w:cs="David" w:eastAsia="David" w:hAnsi="David"/>
+          <w:sz w:val="20"/>
+          <w:szCs w:val="20"/>
+          <w:rtl/>
+        </w:rPr>
+        <w:t xml:space="preserve">לעיל ה"ש 58</w:t>
+      </w:r>
+      <w:r>
+        <w:rPr>
+          <w:rFonts w:ascii="David" w:cs="David" w:eastAsia="David" w:hAnsi="David"/>
+          <w:sz w:val="20"/>
+          <w:szCs w:val="20"/>
+          <w:rtl/>
+        </w:rPr>
+        <w:t xml:space="preserve">, בעמ׳ 151.</w:t>
+      </w:r>
+    </w:p>
+  </w:footnote>
+  <w:footnote w:id="64">
+    <w:p>
+      <w:pPr>
+        <w:bidi/>
+        <w:spacing w:after="60"/>
+      </w:pPr>
+      <w:r>
+        <w:rPr>
+          <w:rStyle w:val="FootnoteReference"/>
+        </w:rPr>
+        <w:footnoteRef/>
+      </w:r>
+      <w:r>
+        <w:rPr>
+          <w:rFonts w:ascii="David" w:cs="David" w:eastAsia="David" w:hAnsi="David"/>
+          <w:sz w:val="20"/>
+          <w:szCs w:val="20"/>
+          <w:rtl/>
+        </w:rPr>
         <w:t xml:space="preserve">ו"ע (מחוזי חי׳) 4631-12-13 </w:t>
       </w:r>
       <w:r>
@@ -10203,7 +10324,7 @@
           <w:szCs w:val="20"/>
           <w:rtl/>
         </w:rPr>
-        <w:t xml:space="preserve">לעיל ה"ש 57</w:t>
+        <w:t xml:space="preserve">לעיל ה"ש 58</w:t>
       </w:r>
       <w:r>
         <w:rPr>
@@ -10213,47 +10334,6 @@
           <w:rtl/>
         </w:rPr>
         <w:t xml:space="preserve">, בעמ׳ 153–154.</w:t>
-      </w:r>
-    </w:p>
-  </w:footnote>
-  <w:footnote w:id="64">
-    <w:p>
-      <w:pPr>
-        <w:bidi/>
-        <w:spacing w:after="60"/>
-      </w:pPr>
-      <w:r>
-        <w:rPr>
-          <w:rStyle w:val="FootnoteReference"/>
-        </w:rPr>
-        <w:footnoteRef/>
-      </w:r>
-      <w:r>
-        <w:rPr>
-          <w:rFonts w:ascii="David" w:cs="David" w:eastAsia="David" w:hAnsi="David"/>
-          <w:sz w:val="20"/>
-          <w:szCs w:val="20"/>
-          <w:rtl/>
-        </w:rPr>
-        <w:t xml:space="preserve">לקנסות בגין אי-הגשת הצהרה ולהפרשי הצמדה וריבית ראו פרק אחד-עשר לחוק מיסוי מקרקעין; גורמן ואהרונוביץ׳, </w:t>
-      </w:r>
-      <w:r>
-        <w:rPr>
-          <w:rFonts w:ascii="David" w:cs="David" w:eastAsia="David" w:hAnsi="David"/>
-          <w:sz w:val="20"/>
-          <w:szCs w:val="20"/>
-          <w:rtl/>
-        </w:rPr>
-        <w:t xml:space="preserve">לעיל ה"ש 57</w:t>
-      </w:r>
-      <w:r>
-        <w:rPr>
-          <w:rFonts w:ascii="David" w:cs="David" w:eastAsia="David" w:hAnsi="David"/>
-          <w:sz w:val="20"/>
-          <w:szCs w:val="20"/>
-          <w:rtl/>
-        </w:rPr>
-        <w:t xml:space="preserve">.</w:t>
       </w:r>
     </w:p>
   </w:footnote>
@@ -10276,25 +10356,25 @@
           <w:szCs w:val="20"/>
           <w:rtl/>
         </w:rPr>
-        <w:t xml:space="preserve">גורמן ואהרונוביץ׳, </w:t>
-      </w:r>
-      <w:r>
-        <w:rPr>
-          <w:rFonts w:ascii="David" w:cs="David" w:eastAsia="David" w:hAnsi="David"/>
-          <w:sz w:val="20"/>
-          <w:szCs w:val="20"/>
-          <w:rtl/>
-        </w:rPr>
-        <w:t xml:space="preserve">לעיל ה"ש 57</w:t>
-      </w:r>
-      <w:r>
-        <w:rPr>
-          <w:rFonts w:ascii="David" w:cs="David" w:eastAsia="David" w:hAnsi="David"/>
-          <w:sz w:val="20"/>
-          <w:szCs w:val="20"/>
-          <w:rtl/>
-        </w:rPr>
-        <w:t xml:space="preserve">, בעמ׳ 282–284, והפסיקה הנסקרת שם.</w:t>
+        <w:t xml:space="preserve">לקנסות בגין אי-הגשת הצהרה ולהפרשי הצמדה וריבית ראו פרק אחד-עשר לחוק מיסוי מקרקעין; גורמן ואהרונוביץ׳, </w:t>
+      </w:r>
+      <w:r>
+        <w:rPr>
+          <w:rFonts w:ascii="David" w:cs="David" w:eastAsia="David" w:hAnsi="David"/>
+          <w:sz w:val="20"/>
+          <w:szCs w:val="20"/>
+          <w:rtl/>
+        </w:rPr>
+        <w:t xml:space="preserve">לעיל ה"ש 58</w:t>
+      </w:r>
+      <w:r>
+        <w:rPr>
+          <w:rFonts w:ascii="David" w:cs="David" w:eastAsia="David" w:hAnsi="David"/>
+          <w:sz w:val="20"/>
+          <w:szCs w:val="20"/>
+          <w:rtl/>
+        </w:rPr>
+        <w:t xml:space="preserve">.</w:t>
       </w:r>
     </w:p>
   </w:footnote>
@@ -10317,7 +10397,7 @@
           <w:szCs w:val="20"/>
           <w:rtl/>
         </w:rPr>
-        <w:t xml:space="preserve">להיגיון הגבייתי של הסעיף ראו גורמן ואהרונוביץ׳, </w:t>
+        <w:t xml:space="preserve">גורמן ואהרונוביץ׳, </w:t>
       </w:r>
       <w:r>
         <w:rPr>
@@ -10335,7 +10415,7 @@
           <w:szCs w:val="20"/>
           <w:rtl/>
         </w:rPr>
-        <w:t xml:space="preserve">.</w:t>
+        <w:t xml:space="preserve">, בעמ׳ 282–284, והפסיקה הנסקרת שם.</w:t>
       </w:r>
     </w:p>
   </w:footnote>
@@ -10358,24 +10438,25 @@
           <w:szCs w:val="20"/>
           <w:rtl/>
         </w:rPr>
-        <w:t xml:space="preserve">למונח "הון מת" ראו </w:t>
-      </w:r>
-      <w:r>
-        <w:rPr>
-          <w:rFonts w:ascii="Times New Roman" w:cs="Times New Roman" w:eastAsia="Times New Roman" w:hAnsi="Times New Roman"/>
-          <w:sz w:val="20"/>
-          <w:szCs w:val="20"/>
-        </w:rPr>
-        <w:t xml:space="preserve">Hernando de Soto, The Mystery of Capital: Why Capitalism Triumphs in the West and Fails Everywhere Else (2000)</w:t>
-      </w:r>
-      <w:r>
-        <w:rPr>
-          <w:rFonts w:ascii="David" w:cs="David" w:eastAsia="David" w:hAnsi="David"/>
-          <w:sz w:val="20"/>
-          <w:szCs w:val="20"/>
-          <w:rtl/>
-        </w:rPr>
-        <w:t xml:space="preserve">. דה-סוטו פיתח את הניתוח על יסוד עבודת שדה במצרים, שבה נאמד שיעור הנכסים המוחזקים בלא רישום ביותר מ-90%; ראו להלן פרק ו.2.</w:t>
+        <w:t xml:space="preserve">להיגיון הגבייתי של הסעיף ראו גורמן ואהרונוביץ׳, </w:t>
+      </w:r>
+      <w:r>
+        <w:rPr>
+          <w:rFonts w:ascii="David" w:cs="David" w:eastAsia="David" w:hAnsi="David"/>
+          <w:sz w:val="20"/>
+          <w:szCs w:val="20"/>
+          <w:rtl/>
+        </w:rPr>
+        <w:t xml:space="preserve">לעיל ה"ש 59</w:t>
+      </w:r>
+      <w:r>
+        <w:rPr>
+          <w:rFonts w:ascii="David" w:cs="David" w:eastAsia="David" w:hAnsi="David"/>
+          <w:sz w:val="20"/>
+          <w:szCs w:val="20"/>
+          <w:rtl/>
+        </w:rPr>
+        <w:t xml:space="preserve">.</w:t>
       </w:r>
     </w:p>
   </w:footnote>
@@ -10398,6 +10479,46 @@
           <w:szCs w:val="20"/>
           <w:rtl/>
         </w:rPr>
+        <w:t xml:space="preserve">למונח "הון מת" ראו </w:t>
+      </w:r>
+      <w:r>
+        <w:rPr>
+          <w:rFonts w:ascii="Times New Roman" w:cs="Times New Roman" w:eastAsia="Times New Roman" w:hAnsi="Times New Roman"/>
+          <w:sz w:val="20"/>
+          <w:szCs w:val="20"/>
+        </w:rPr>
+        <w:t xml:space="preserve">Hernando de Soto, The Mystery of Capital: Why Capitalism Triumphs in the West and Fails Everywhere Else (2000)</w:t>
+      </w:r>
+      <w:r>
+        <w:rPr>
+          <w:rFonts w:ascii="David" w:cs="David" w:eastAsia="David" w:hAnsi="David"/>
+          <w:sz w:val="20"/>
+          <w:szCs w:val="20"/>
+          <w:rtl/>
+        </w:rPr>
+        <w:t xml:space="preserve">. דה-סוטו פיתח את הניתוח על יסוד עבודת שדה במצרים, שבה נאמד שיעור הנכסים המוחזקים בלא רישום ביותר מ-90%; ראו להלן פרק ו.2.</w:t>
+      </w:r>
+    </w:p>
+  </w:footnote>
+  <w:footnote w:id="69">
+    <w:p>
+      <w:pPr>
+        <w:bidi/>
+        <w:spacing w:after="60"/>
+      </w:pPr>
+      <w:r>
+        <w:rPr>
+          <w:rStyle w:val="FootnoteReference"/>
+        </w:rPr>
+        <w:footnoteRef/>
+      </w:r>
+      <w:r>
+        <w:rPr>
+          <w:rFonts w:ascii="David" w:cs="David" w:eastAsia="David" w:hAnsi="David"/>
+          <w:sz w:val="20"/>
+          <w:szCs w:val="20"/>
+          <w:rtl/>
+        </w:rPr>
         <w:t xml:space="preserve">השוו עניין </w:t>
       </w:r>
       <w:r>
@@ -10440,7 +10561,7 @@
       </w:r>
     </w:p>
   </w:footnote>
-  <w:footnote w:id="69">
+  <w:footnote w:id="70">
     <w:p>
       <w:pPr>
         <w:bidi/>
@@ -10459,37 +10580,6 @@
           <w:szCs w:val="20"/>
         </w:rPr>
         <w:t xml:space="preserve">Lysaght v Edwards (1876) 2 Ch D 499 (Ch)</w:t>
-      </w:r>
-      <w:r>
-        <w:rPr>
-          <w:rFonts w:ascii="David" w:cs="David" w:eastAsia="David" w:hAnsi="David"/>
-          <w:sz w:val="20"/>
-          <w:szCs w:val="20"/>
-          <w:rtl/>
-        </w:rPr>
-        <w:t xml:space="preserve">.</w:t>
-      </w:r>
-    </w:p>
-  </w:footnote>
-  <w:footnote w:id="70">
-    <w:p>
-      <w:pPr>
-        <w:bidi/>
-        <w:spacing w:after="60"/>
-      </w:pPr>
-      <w:r>
-        <w:rPr>
-          <w:rStyle w:val="FootnoteReference"/>
-        </w:rPr>
-        <w:footnoteRef/>
-      </w:r>
-      <w:r>
-        <w:rPr>
-          <w:rFonts w:ascii="Times New Roman" w:cs="Times New Roman" w:eastAsia="Times New Roman" w:hAnsi="Times New Roman"/>
-          <w:sz w:val="20"/>
-          <w:szCs w:val="20"/>
-        </w:rPr>
-        <w:t xml:space="preserve">Walsh v Lonsdale (1882) 21 Ch D 9 (CA)</w:t>
       </w:r>
       <w:r>
         <w:rPr>
@@ -10516,6 +10606,37 @@
       </w:r>
       <w:r>
         <w:rPr>
+          <w:rFonts w:ascii="Times New Roman" w:cs="Times New Roman" w:eastAsia="Times New Roman" w:hAnsi="Times New Roman"/>
+          <w:sz w:val="20"/>
+          <w:szCs w:val="20"/>
+        </w:rPr>
+        <w:t xml:space="preserve">Walsh v Lonsdale (1882) 21 Ch D 9 (CA)</w:t>
+      </w:r>
+      <w:r>
+        <w:rPr>
+          <w:rFonts w:ascii="David" w:cs="David" w:eastAsia="David" w:hAnsi="David"/>
+          <w:sz w:val="20"/>
+          <w:szCs w:val="20"/>
+          <w:rtl/>
+        </w:rPr>
+        <w:t xml:space="preserve">.</w:t>
+      </w:r>
+    </w:p>
+  </w:footnote>
+  <w:footnote w:id="72">
+    <w:p>
+      <w:pPr>
+        <w:bidi/>
+        <w:spacing w:after="60"/>
+      </w:pPr>
+      <w:r>
+        <w:rPr>
+          <w:rStyle w:val="FootnoteReference"/>
+        </w:rPr>
+        <w:footnoteRef/>
+      </w:r>
+      <w:r>
+        <w:rPr>
           <w:rFonts w:ascii="David" w:cs="David" w:eastAsia="David" w:hAnsi="David"/>
           <w:sz w:val="20"/>
           <w:szCs w:val="20"/>
@@ -10563,7 +10684,7 @@
       </w:r>
     </w:p>
   </w:footnote>
-  <w:footnote w:id="72">
+  <w:footnote w:id="73">
     <w:p>
       <w:pPr>
         <w:bidi/>
@@ -10582,54 +10703,6 @@
           <w:szCs w:val="20"/>
         </w:rPr>
         <w:t xml:space="preserve">Land Registration Act 2002, s 27</w:t>
-      </w:r>
-      <w:r>
-        <w:rPr>
-          <w:rFonts w:ascii="David" w:cs="David" w:eastAsia="David" w:hAnsi="David"/>
-          <w:sz w:val="20"/>
-          <w:szCs w:val="20"/>
-          <w:rtl/>
-        </w:rPr>
-        <w:t xml:space="preserve">.</w:t>
-      </w:r>
-    </w:p>
-  </w:footnote>
-  <w:footnote w:id="73">
-    <w:p>
-      <w:pPr>
-        <w:bidi/>
-        <w:spacing w:after="60"/>
-      </w:pPr>
-      <w:r>
-        <w:rPr>
-          <w:rStyle w:val="FootnoteReference"/>
-        </w:rPr>
-        <w:footnoteRef/>
-      </w:r>
-      <w:r>
-        <w:rPr>
-          <w:rFonts w:ascii="Times New Roman" w:cs="Times New Roman" w:eastAsia="Times New Roman" w:hAnsi="Times New Roman"/>
-          <w:sz w:val="20"/>
-          <w:szCs w:val="20"/>
-        </w:rPr>
-        <w:t xml:space="preserve">Williams &amp; Glyn’s Bank Ltd v Boland [1981] AC 487 (HL)</w:t>
-      </w:r>
-      <w:r>
-        <w:rPr>
-          <w:rFonts w:ascii="David" w:cs="David" w:eastAsia="David" w:hAnsi="David"/>
-          <w:sz w:val="20"/>
-          <w:szCs w:val="20"/>
-          <w:rtl/>
-        </w:rPr>
-        <w:t xml:space="preserve">; והמשכה של ההגנה כיום ב-</w:t>
-      </w:r>
-      <w:r>
-        <w:rPr>
-          <w:rFonts w:ascii="Times New Roman" w:cs="Times New Roman" w:eastAsia="Times New Roman" w:hAnsi="Times New Roman"/>
-          <w:sz w:val="20"/>
-          <w:szCs w:val="20"/>
-        </w:rPr>
-        <w:t xml:space="preserve">Land Registration Act 2002, sch 3, para 2</w:t>
       </w:r>
       <w:r>
         <w:rPr>
@@ -10656,20 +10729,28 @@
       </w:r>
       <w:r>
         <w:rPr>
-          <w:rFonts w:ascii="David" w:cs="David" w:eastAsia="David" w:hAnsi="David"/>
-          <w:sz w:val="20"/>
-          <w:szCs w:val="20"/>
-          <w:rtl/>
-        </w:rPr>
-        <w:t xml:space="preserve">לביקורת עדכנית על מוסד הזכויות הגוברות כסדק ב"עקרון המראה" של המרשם ראו </w:t>
-      </w:r>
-      <w:r>
-        <w:rPr>
           <w:rFonts w:ascii="Times New Roman" w:cs="Times New Roman" w:eastAsia="Times New Roman" w:hAnsi="Times New Roman"/>
           <w:sz w:val="20"/>
           <w:szCs w:val="20"/>
         </w:rPr>
-        <w:t xml:space="preserve">Chris Bevan, "Overriding Interests under the Land Registration Act 2002: Time to Repair the ‘Cracked Mirror’?" [2024] Conv. 123</w:t>
+        <w:t xml:space="preserve">Williams &amp; Glyn’s Bank Ltd v Boland [1981] AC 487 (HL)</w:t>
+      </w:r>
+      <w:r>
+        <w:rPr>
+          <w:rFonts w:ascii="David" w:cs="David" w:eastAsia="David" w:hAnsi="David"/>
+          <w:sz w:val="20"/>
+          <w:szCs w:val="20"/>
+          <w:rtl/>
+        </w:rPr>
+        <w:t xml:space="preserve">; והמשכה של ההגנה כיום ב-</w:t>
+      </w:r>
+      <w:r>
+        <w:rPr>
+          <w:rFonts w:ascii="Times New Roman" w:cs="Times New Roman" w:eastAsia="Times New Roman" w:hAnsi="Times New Roman"/>
+          <w:sz w:val="20"/>
+          <w:szCs w:val="20"/>
+        </w:rPr>
+        <w:t xml:space="preserve">Land Registration Act 2002, sch 3, para 2</w:t>
       </w:r>
       <w:r>
         <w:rPr>
@@ -10696,11 +10777,20 @@
       </w:r>
       <w:r>
         <w:rPr>
+          <w:rFonts w:ascii="David" w:cs="David" w:eastAsia="David" w:hAnsi="David"/>
+          <w:sz w:val="20"/>
+          <w:szCs w:val="20"/>
+          <w:rtl/>
+        </w:rPr>
+        <w:t xml:space="preserve">לביקורת עדכנית על מוסד הזכויות הגוברות כסדק ב"עקרון המראה" של המרשם ראו </w:t>
+      </w:r>
+      <w:r>
+        <w:rPr>
           <w:rFonts w:ascii="Times New Roman" w:cs="Times New Roman" w:eastAsia="Times New Roman" w:hAnsi="Times New Roman"/>
           <w:sz w:val="20"/>
           <w:szCs w:val="20"/>
         </w:rPr>
-        <w:t xml:space="preserve">Stack v Dowden [2007] UKHL 17, [2007] 2 AC 432; Jones v Kernott [2011] UKSC 53, [2012] 1 AC 776</w:t>
+        <w:t xml:space="preserve">Chris Bevan, "Overriding Interests under the Land Registration Act 2002: Time to Repair the ‘Cracked Mirror’?" [2024] Conv. 123</w:t>
       </w:r>
       <w:r>
         <w:rPr>
@@ -10731,7 +10821,7 @@
           <w:sz w:val="20"/>
           <w:szCs w:val="20"/>
         </w:rPr>
-        <w:t xml:space="preserve">Thorner v Major [2009] UKHL 18, [2009] 1 WLR 776</w:t>
+        <w:t xml:space="preserve">Stack v Dowden [2007] UKHL 17, [2007] 2 AC 432; Jones v Kernott [2011] UKSC 53, [2012] 1 AC 776</w:t>
       </w:r>
       <w:r>
         <w:rPr>
@@ -10762,24 +10852,7 @@
           <w:sz w:val="20"/>
           <w:szCs w:val="20"/>
         </w:rPr>
-        <w:t xml:space="preserve">Guest v Guest [2022] UKSC 27, [2022] 3 WLR 911</w:t>
-      </w:r>
-      <w:r>
-        <w:rPr>
-          <w:rFonts w:ascii="David" w:cs="David" w:eastAsia="David" w:hAnsi="David"/>
-          <w:sz w:val="20"/>
-          <w:szCs w:val="20"/>
-          <w:rtl/>
-        </w:rPr>
-        <w:t xml:space="preserve">. לניתוח עדכני ראו </w:t>
-      </w:r>
-      <w:r>
-        <w:rPr>
-          <w:rFonts w:ascii="Times New Roman" w:cs="Times New Roman" w:eastAsia="Times New Roman" w:hAnsi="Times New Roman"/>
-          <w:sz w:val="20"/>
-          <w:szCs w:val="20"/>
-        </w:rPr>
-        <w:t xml:space="preserve">Alex Waghorn, "Promises in Equity and at Law: Proprietary Estoppel after Guest v Guest" (2023) 86 MLR 1504; Brian Sloan, "Proprietary Estoppel in the Supreme Court: Banquo’s Ghost?" (2023) 82 CLJ 13</w:t>
+        <w:t xml:space="preserve">Thorner v Major [2009] UKHL 18, [2009] 1 WLR 776</w:t>
       </w:r>
       <w:r>
         <w:rPr>
@@ -10810,34 +10883,33 @@
           <w:sz w:val="20"/>
           <w:szCs w:val="20"/>
         </w:rPr>
-        <w:t xml:space="preserve">Law of Property (Miscellaneous Provisions) Act 1989, ss 1–2</w:t>
-      </w:r>
-      <w:r>
-        <w:rPr>
-          <w:rFonts w:ascii="David" w:cs="David" w:eastAsia="David" w:hAnsi="David"/>
-          <w:sz w:val="20"/>
-          <w:szCs w:val="20"/>
-          <w:rtl/>
-        </w:rPr>
-        <w:t xml:space="preserve">. וראו כבר את ראבילו, </w:t>
-      </w:r>
-      <w:r>
-        <w:rPr>
-          <w:rFonts w:ascii="David" w:cs="David" w:eastAsia="David" w:hAnsi="David"/>
-          <w:sz w:val="20"/>
-          <w:szCs w:val="20"/>
-          <w:rtl/>
-        </w:rPr>
-        <w:t xml:space="preserve">לעיל ה"ש 32</w:t>
-      </w:r>
-      <w:r>
-        <w:rPr>
-          <w:rFonts w:ascii="David" w:cs="David" w:eastAsia="David" w:hAnsi="David"/>
-          <w:sz w:val="20"/>
-          <w:szCs w:val="20"/>
-          <w:rtl/>
-        </w:rPr>
-        <w:t xml:space="preserve">, המצטט את הכלל האנגלי שלפיו הבטחת מתנה גרידא אינה מעבירה בעלות וטעונה מסירה.</w:t>
+        <w:t xml:space="preserve">Guest v Guest [2022] UKSC 27, [2022] 3 WLR 911</w:t>
+      </w:r>
+      <w:r>
+        <w:rPr>
+          <w:rFonts w:ascii="David" w:cs="David" w:eastAsia="David" w:hAnsi="David"/>
+          <w:sz w:val="20"/>
+          <w:szCs w:val="20"/>
+          <w:rtl/>
+        </w:rPr>
+        <w:t xml:space="preserve">. לניתוח עדכני ראו </w:t>
+      </w:r>
+      <w:r>
+        <w:rPr>
+          <w:rFonts w:ascii="Times New Roman" w:cs="Times New Roman" w:eastAsia="Times New Roman" w:hAnsi="Times New Roman"/>
+          <w:sz w:val="20"/>
+          <w:szCs w:val="20"/>
+        </w:rPr>
+        <w:t xml:space="preserve">Alex Waghorn, "Promises in Equity and at Law: Proprietary Estoppel after Guest v Guest" (2023) 86 MLR 1504; Brian Sloan, "Proprietary Estoppel in the Supreme Court: Banquo’s Ghost?" (2023) 82 CLJ 13</w:t>
+      </w:r>
+      <w:r>
+        <w:rPr>
+          <w:rFonts w:ascii="David" w:cs="David" w:eastAsia="David" w:hAnsi="David"/>
+          <w:sz w:val="20"/>
+          <w:szCs w:val="20"/>
+          <w:rtl/>
+        </w:rPr>
+        <w:t xml:space="preserve">.</w:t>
       </w:r>
     </w:p>
   </w:footnote>
@@ -10859,16 +10931,34 @@
           <w:sz w:val="20"/>
           <w:szCs w:val="20"/>
         </w:rPr>
-        <w:t xml:space="preserve">Re Rose [1952] Ch 499 (CA)</w:t>
-      </w:r>
-      <w:r>
-        <w:rPr>
-          <w:rFonts w:ascii="David" w:cs="David" w:eastAsia="David" w:hAnsi="David"/>
-          <w:sz w:val="20"/>
-          <w:szCs w:val="20"/>
-          <w:rtl/>
-        </w:rPr>
-        <w:t xml:space="preserve">.</w:t>
+        <w:t xml:space="preserve">Law of Property (Miscellaneous Provisions) Act 1989, ss 1–2</w:t>
+      </w:r>
+      <w:r>
+        <w:rPr>
+          <w:rFonts w:ascii="David" w:cs="David" w:eastAsia="David" w:hAnsi="David"/>
+          <w:sz w:val="20"/>
+          <w:szCs w:val="20"/>
+          <w:rtl/>
+        </w:rPr>
+        <w:t xml:space="preserve">. וראו כבר את ראבילו, </w:t>
+      </w:r>
+      <w:r>
+        <w:rPr>
+          <w:rFonts w:ascii="David" w:cs="David" w:eastAsia="David" w:hAnsi="David"/>
+          <w:sz w:val="20"/>
+          <w:szCs w:val="20"/>
+          <w:rtl/>
+        </w:rPr>
+        <w:t xml:space="preserve">לעיל ה"ש 32</w:t>
+      </w:r>
+      <w:r>
+        <w:rPr>
+          <w:rFonts w:ascii="David" w:cs="David" w:eastAsia="David" w:hAnsi="David"/>
+          <w:sz w:val="20"/>
+          <w:szCs w:val="20"/>
+          <w:rtl/>
+        </w:rPr>
+        <w:t xml:space="preserve">, המצטט את הכלל האנגלי שלפיו הבטחת מתנה גרידא אינה מעבירה בעלות וטעונה מסירה.</w:t>
       </w:r>
     </w:p>
   </w:footnote>
@@ -10890,7 +10980,7 @@
           <w:sz w:val="20"/>
           <w:szCs w:val="20"/>
         </w:rPr>
-        <w:t xml:space="preserve">Pennington v Waine [2002] EWCA Civ 227, [2002] 1 WLR 2075</w:t>
+        <w:t xml:space="preserve">Re Rose [1952] Ch 499 (CA)</w:t>
       </w:r>
       <w:r>
         <w:rPr>
@@ -10921,16 +11011,16 @@
           <w:sz w:val="20"/>
           <w:szCs w:val="20"/>
         </w:rPr>
-        <w:t xml:space="preserve">Powers of Attorney Act 1971, s 4</w:t>
-      </w:r>
-      <w:r>
-        <w:rPr>
-          <w:rFonts w:ascii="David" w:cs="David" w:eastAsia="David" w:hAnsi="David"/>
-          <w:sz w:val="20"/>
-          <w:szCs w:val="20"/>
-          <w:rtl/>
-        </w:rPr>
-        <w:t xml:space="preserve">. זהו המקור ההיסטורי של ס׳ 14(ב) לחוק השליחות הישראלי.</w:t>
+        <w:t xml:space="preserve">Pennington v Waine [2002] EWCA Civ 227, [2002] 1 WLR 2075</w:t>
+      </w:r>
+      <w:r>
+        <w:rPr>
+          <w:rFonts w:ascii="David" w:cs="David" w:eastAsia="David" w:hAnsi="David"/>
+          <w:sz w:val="20"/>
+          <w:szCs w:val="20"/>
+          <w:rtl/>
+        </w:rPr>
+        <w:t xml:space="preserve">.</w:t>
       </w:r>
     </w:p>
   </w:footnote>
@@ -10948,29 +11038,20 @@
       </w:r>
       <w:r>
         <w:rPr>
-          <w:rFonts w:ascii="David" w:cs="David" w:eastAsia="David" w:hAnsi="David"/>
-          <w:sz w:val="20"/>
-          <w:szCs w:val="20"/>
-          <w:rtl/>
-        </w:rPr>
-        <w:t xml:space="preserve">לניתוח השוואתי של גורל ההתיישנות הרוכשת בשיטות הרישום המודרניות ראו </w:t>
-      </w:r>
-      <w:r>
-        <w:rPr>
           <w:rFonts w:ascii="Times New Roman" w:cs="Times New Roman" w:eastAsia="Times New Roman" w:hAnsi="Times New Roman"/>
           <w:sz w:val="20"/>
           <w:szCs w:val="20"/>
         </w:rPr>
-        <w:t xml:space="preserve">Nadav Shoked, "Who Needs Adverse Possession?," 89 Fordham L. Rev. 2639 (2021)</w:t>
-      </w:r>
-      <w:r>
-        <w:rPr>
-          <w:rFonts w:ascii="David" w:cs="David" w:eastAsia="David" w:hAnsi="David"/>
-          <w:sz w:val="20"/>
-          <w:szCs w:val="20"/>
-          <w:rtl/>
-        </w:rPr>
-        <w:t xml:space="preserve">.</w:t>
+        <w:t xml:space="preserve">Powers of Attorney Act 1971, s 4</w:t>
+      </w:r>
+      <w:r>
+        <w:rPr>
+          <w:rFonts w:ascii="David" w:cs="David" w:eastAsia="David" w:hAnsi="David"/>
+          <w:sz w:val="20"/>
+          <w:szCs w:val="20"/>
+          <w:rtl/>
+        </w:rPr>
+        <w:t xml:space="preserve">. זהו המקור ההיסטורי של ס׳ 14(ב) לחוק השליחות הישראלי.</w:t>
       </w:r>
     </w:p>
   </w:footnote>
@@ -10993,7 +11074,24 @@
           <w:szCs w:val="20"/>
           <w:rtl/>
         </w:rPr>
-        <w:t xml:space="preserve">ס׳ 418 לקוד האזרחי המצרי (חוק מס׳ 131 לשנת 1948).</w:t>
+        <w:t xml:space="preserve">לניתוח השוואתי של גורל ההתיישנות הרוכשת בשיטות הרישום המודרניות ראו </w:t>
+      </w:r>
+      <w:r>
+        <w:rPr>
+          <w:rFonts w:ascii="Times New Roman" w:cs="Times New Roman" w:eastAsia="Times New Roman" w:hAnsi="Times New Roman"/>
+          <w:sz w:val="20"/>
+          <w:szCs w:val="20"/>
+        </w:rPr>
+        <w:t xml:space="preserve">Nadav Shoked, "Who Needs Adverse Possession?," 89 Fordham L. Rev. 2639 (2021)</w:t>
+      </w:r>
+      <w:r>
+        <w:rPr>
+          <w:rFonts w:ascii="David" w:cs="David" w:eastAsia="David" w:hAnsi="David"/>
+          <w:sz w:val="20"/>
+          <w:szCs w:val="20"/>
+          <w:rtl/>
+        </w:rPr>
+        <w:t xml:space="preserve">.</w:t>
       </w:r>
     </w:p>
   </w:footnote>
@@ -11016,7 +11114,7 @@
           <w:szCs w:val="20"/>
           <w:rtl/>
         </w:rPr>
-        <w:t xml:space="preserve">ס׳ 934 לקוד האזרחי המצרי; ס׳ 9 לחוק ארגון הפומביות המקרקעית, חוק מס׳ 114 לשנת 1946. במצרים פועלות במקביל שתי שיטות רישום: רישום שטרות פרסונלי לפי חוק 114/1946, החולש על מרבית המדינה, ורישום זכויות קדסטרלי לפי חוק מס׳ 142 לשנת 1964, שתחולתו מוגבלת.</w:t>
+        <w:t xml:space="preserve">ס׳ 418 לקוד האזרחי המצרי (חוק מס׳ 131 לשנת 1948).</w:t>
       </w:r>
     </w:p>
   </w:footnote>
@@ -11034,38 +11132,12 @@
       </w:r>
       <w:r>
         <w:rPr>
-          <w:rFonts w:ascii="Times New Roman" w:cs="Times New Roman" w:eastAsia="Times New Roman" w:hAnsi="Times New Roman"/>
-          <w:sz w:val="20"/>
-          <w:szCs w:val="20"/>
-        </w:rPr>
-        <w:t xml:space="preserve">“More than 90% of Egypt’s Properties Are Unregistered: Justice Minister,” Daily News Egypt (Feb. 14, 2022); “Egypt’s Property Registration Rate Remains Below 10%…: World Bank,” Daily News Egypt (July 5, 2026)</w:t>
-      </w:r>
-      <w:r>
-        <w:rPr>
-          <w:rFonts w:ascii="David" w:cs="David" w:eastAsia="David" w:hAnsi="David"/>
-          <w:sz w:val="20"/>
-          <w:szCs w:val="20"/>
-          <w:rtl/>
-        </w:rPr>
-        <w:t xml:space="preserve">. הרנדו דה-סוטו ביסס על מצרים את מחקר "ההון המת" שלו: </w:t>
-      </w:r>
-      <w:r>
-        <w:rPr>
-          <w:rFonts w:ascii="David" w:cs="David" w:eastAsia="David" w:hAnsi="David"/>
-          <w:sz w:val="20"/>
-          <w:szCs w:val="20"/>
-          <w:rtl/>
-        </w:rPr>
-        <w:t xml:space="preserve">לעיל ה"ש 67</w:t>
-      </w:r>
-      <w:r>
-        <w:rPr>
-          <w:rFonts w:ascii="David" w:cs="David" w:eastAsia="David" w:hAnsi="David"/>
-          <w:sz w:val="20"/>
-          <w:szCs w:val="20"/>
-          <w:rtl/>
-        </w:rPr>
-        <w:t xml:space="preserve">.</w:t>
+          <w:rFonts w:ascii="David" w:cs="David" w:eastAsia="David" w:hAnsi="David"/>
+          <w:sz w:val="20"/>
+          <w:szCs w:val="20"/>
+          <w:rtl/>
+        </w:rPr>
+        <w:t xml:space="preserve">ס׳ 934 לקוד האזרחי המצרי; ס׳ 9 לחוק ארגון הפומביות המקרקעית, חוק מס׳ 114 לשנת 1946. במצרים פועלות במקביל שתי שיטות רישום: רישום שטרות פרסונלי לפי חוק 114/1946, החולש על מרבית המדינה, ורישום זכויות קדסטרלי לפי חוק מס׳ 142 לשנת 1964, שתחולתו מוגבלת.</w:t>
       </w:r>
     </w:p>
   </w:footnote>
@@ -11083,12 +11155,38 @@
       </w:r>
       <w:r>
         <w:rPr>
-          <w:rFonts w:ascii="David" w:cs="David" w:eastAsia="David" w:hAnsi="David"/>
-          <w:sz w:val="20"/>
-          <w:szCs w:val="20"/>
-          <w:rtl/>
-        </w:rPr>
-        <w:t xml:space="preserve">ס׳ 715 לקוד האזרחי המצרי. בית המשפט החוקתי העליון של מצרים שב ואישר בשנת 2021 כי ייפוי כוח כזה אינו ניתן לביטול חד-צדדי. ואולם ס׳ 714 מורה כי השליחות פוקעת במות השולח – נקודת תורפה מרכזית של הפרקטיקה, שפסיקת בית המשפט לקסאציה בעניינה אינה אחידה.</w:t>
+          <w:rFonts w:ascii="Times New Roman" w:cs="Times New Roman" w:eastAsia="Times New Roman" w:hAnsi="Times New Roman"/>
+          <w:sz w:val="20"/>
+          <w:szCs w:val="20"/>
+        </w:rPr>
+        <w:t xml:space="preserve">“More than 90% of Egypt’s Properties Are Unregistered: Justice Minister,” Daily News Egypt (Feb. 14, 2022); “Egypt’s Property Registration Rate Remains Below 10%…: World Bank,” Daily News Egypt (July 5, 2026)</w:t>
+      </w:r>
+      <w:r>
+        <w:rPr>
+          <w:rFonts w:ascii="David" w:cs="David" w:eastAsia="David" w:hAnsi="David"/>
+          <w:sz w:val="20"/>
+          <w:szCs w:val="20"/>
+          <w:rtl/>
+        </w:rPr>
+        <w:t xml:space="preserve">. הרנדו דה-סוטו ביסס על מצרים את מחקר "ההון המת" שלו: </w:t>
+      </w:r>
+      <w:r>
+        <w:rPr>
+          <w:rFonts w:ascii="David" w:cs="David" w:eastAsia="David" w:hAnsi="David"/>
+          <w:sz w:val="20"/>
+          <w:szCs w:val="20"/>
+          <w:rtl/>
+        </w:rPr>
+        <w:t xml:space="preserve">לעיל ה"ש 68</w:t>
+      </w:r>
+      <w:r>
+        <w:rPr>
+          <w:rFonts w:ascii="David" w:cs="David" w:eastAsia="David" w:hAnsi="David"/>
+          <w:sz w:val="20"/>
+          <w:szCs w:val="20"/>
+          <w:rtl/>
+        </w:rPr>
+        <w:t xml:space="preserve">.</w:t>
       </w:r>
     </w:p>
   </w:footnote>
@@ -11111,24 +11209,7 @@
           <w:szCs w:val="20"/>
           <w:rtl/>
         </w:rPr>
-        <w:t xml:space="preserve">לפסיקת בית המשפט לקסאציה המצרי על תביעות אלה ראו הסקירות שבמאגרי לשכת עורכי הדין המצרית; ולתיאור אנליטי באנגלית ראו </w:t>
-      </w:r>
-      <w:r>
-        <w:rPr>
-          <w:rFonts w:ascii="Times New Roman" w:cs="Times New Roman" w:eastAsia="Times New Roman" w:hAnsi="Times New Roman"/>
-          <w:sz w:val="20"/>
-          <w:szCs w:val="20"/>
-        </w:rPr>
-        <w:t xml:space="preserve">David Sims, "Securing Land Tenure in Egypt: Who Needs Registered Titles?" Metropolitics (June 14, 2016)</w:t>
-      </w:r>
-      <w:r>
-        <w:rPr>
-          <w:rFonts w:ascii="David" w:cs="David" w:eastAsia="David" w:hAnsi="David"/>
-          <w:sz w:val="20"/>
-          <w:szCs w:val="20"/>
-          <w:rtl/>
-        </w:rPr>
-        <w:t xml:space="preserve">.</w:t>
+        <w:t xml:space="preserve">ס׳ 715 לקוד האזרחי המצרי. בית המשפט החוקתי העליון של מצרים שב ואישר בשנת 2021 כי ייפוי כוח כזה אינו ניתן לביטול חד-צדדי. ואולם ס׳ 714 מורה כי השליחות פוקעת במות השולח – נקודת תורפה מרכזית של הפרקטיקה, שפסיקת בית המשפט לקסאציה בעניינה אינה אחידה.</w:t>
       </w:r>
     </w:p>
   </w:footnote>
@@ -11151,7 +11232,24 @@
           <w:szCs w:val="20"/>
           <w:rtl/>
         </w:rPr>
-        <w:t xml:space="preserve">ס׳ 968 לקוד האזרחי המצרי. הפרקטיקה המצרית דנה בכך תחת הכותרת "וַצְ׳ע אל-יַד" (הנחת היד) – ההחזקה בפועל כמקור קניין.</w:t>
+        <w:t xml:space="preserve">לפסיקת בית המשפט לקסאציה המצרי על תביעות אלה ראו הסקירות שבמאגרי לשכת עורכי הדין המצרית; ולתיאור אנליטי באנגלית ראו </w:t>
+      </w:r>
+      <w:r>
+        <w:rPr>
+          <w:rFonts w:ascii="Times New Roman" w:cs="Times New Roman" w:eastAsia="Times New Roman" w:hAnsi="Times New Roman"/>
+          <w:sz w:val="20"/>
+          <w:szCs w:val="20"/>
+        </w:rPr>
+        <w:t xml:space="preserve">David Sims, "Securing Land Tenure in Egypt: Who Needs Registered Titles?" Metropolitics (June 14, 2016)</w:t>
+      </w:r>
+      <w:r>
+        <w:rPr>
+          <w:rFonts w:ascii="David" w:cs="David" w:eastAsia="David" w:hAnsi="David"/>
+          <w:sz w:val="20"/>
+          <w:szCs w:val="20"/>
+          <w:rtl/>
+        </w:rPr>
+        <w:t xml:space="preserve">.</w:t>
       </w:r>
     </w:p>
   </w:footnote>
@@ -11174,7 +11272,7 @@
           <w:szCs w:val="20"/>
           <w:rtl/>
         </w:rPr>
-        <w:t xml:space="preserve">ס׳ 969 לקוד האזרחי המצרי.</w:t>
+        <w:t xml:space="preserve">ס׳ 968 לקוד האזרחי המצרי. הפרקטיקה המצרית דנה בכך תחת הכותרת "וַצְ׳ע אל-יַד" (הנחת היד) – ההחזקה בפועל כמקור קניין.</w:t>
       </w:r>
     </w:p>
   </w:footnote>
@@ -11197,7 +11295,7 @@
           <w:szCs w:val="20"/>
           <w:rtl/>
         </w:rPr>
-        <w:t xml:space="preserve">ס׳ 970 לקוד האזרחי המצרי, כפי שתוקן בחוק מס׳ 55 לשנת 1970; ולנכסי הציבור ראו גם ס׳ 87(2) לקוד.</w:t>
+        <w:t xml:space="preserve">ס׳ 969 לקוד האזרחי המצרי.</w:t>
       </w:r>
     </w:p>
   </w:footnote>
@@ -11220,42 +11318,7 @@
           <w:szCs w:val="20"/>
           <w:rtl/>
         </w:rPr>
-        <w:t xml:space="preserve">להשוואה בין גישות שיטות הרישום להתיישנות רוכשת ראו </w:t>
-      </w:r>
-      <w:r>
-        <w:rPr>
-          <w:rFonts w:ascii="Times New Roman" w:cs="Times New Roman" w:eastAsia="Times New Roman" w:hAnsi="Times New Roman"/>
-          <w:sz w:val="20"/>
-          <w:szCs w:val="20"/>
-        </w:rPr>
-        <w:t xml:space="preserve">Shoked</w:t>
-      </w:r>
-      <w:r>
-        <w:rPr>
-          <w:rFonts w:ascii="David" w:cs="David" w:eastAsia="David" w:hAnsi="David"/>
-          <w:sz w:val="20"/>
-          <w:szCs w:val="20"/>
-          <w:rtl/>
-        </w:rPr>
-        <w:t xml:space="preserve">, </w:t>
-      </w:r>
-      <w:r>
-        <w:rPr>
-          <w:rFonts w:ascii="David" w:cs="David" w:eastAsia="David" w:hAnsi="David"/>
-          <w:sz w:val="20"/>
-          <w:szCs w:val="20"/>
-          <w:rtl/>
-        </w:rPr>
-        <w:t xml:space="preserve">לעיל ה"ש 82</w:t>
-      </w:r>
-      <w:r>
-        <w:rPr>
-          <w:rFonts w:ascii="David" w:cs="David" w:eastAsia="David" w:hAnsi="David"/>
-          <w:sz w:val="20"/>
-          <w:szCs w:val="20"/>
-          <w:rtl/>
-        </w:rPr>
-        <w:t xml:space="preserve">. ודוק: בישראל נחסם מסלול זה כמעט כליל – ס׳ 159(ב) לחוק המקרקעין שלל התיישנות במקרקעין מוסדרים, וחזקתו של בן משפחה מסווגת כ"חזקה מרשות"; ראו לעיל פרק ג.6.</w:t>
+        <w:t xml:space="preserve">ס׳ 970 לקוד האזרחי המצרי, כפי שתוקן בחוק מס׳ 55 לשנת 1970; ולנכסי הציבור ראו גם ס׳ 87(2) לקוד.</w:t>
       </w:r>
     </w:p>
   </w:footnote>
@@ -11273,37 +11336,47 @@
       </w:r>
       <w:r>
         <w:rPr>
+          <w:rFonts w:ascii="David" w:cs="David" w:eastAsia="David" w:hAnsi="David"/>
+          <w:sz w:val="20"/>
+          <w:szCs w:val="20"/>
+          <w:rtl/>
+        </w:rPr>
+        <w:t xml:space="preserve">להשוואה בין גישות שיטות הרישום להתיישנות רוכשת ראו </w:t>
+      </w:r>
+      <w:r>
+        <w:rPr>
           <w:rFonts w:ascii="Times New Roman" w:cs="Times New Roman" w:eastAsia="Times New Roman" w:hAnsi="Times New Roman"/>
           <w:sz w:val="20"/>
           <w:szCs w:val="20"/>
         </w:rPr>
-        <w:t xml:space="preserve">“Sisi Orders Delaying Implementation of Controversial Real Estate Law for 2 Years,” Ahram Online (Feb. 28, 2021); “‘Unjust’: Egypt’s Property Registration Plans Face Popular Backlash,” Middle East Eye (2021)</w:t>
-      </w:r>
-      <w:r>
-        <w:rPr>
-          <w:rFonts w:ascii="David" w:cs="David" w:eastAsia="David" w:hAnsi="David"/>
-          <w:sz w:val="20"/>
-          <w:szCs w:val="20"/>
-          <w:rtl/>
-        </w:rPr>
-        <w:t xml:space="preserve">. לניתוח מדיניות ראו </w:t>
-      </w:r>
-      <w:r>
-        <w:rPr>
-          <w:rFonts w:ascii="Times New Roman" w:cs="Times New Roman" w:eastAsia="Times New Roman" w:hAnsi="Times New Roman"/>
-          <w:sz w:val="20"/>
-          <w:szCs w:val="20"/>
-        </w:rPr>
-        <w:t xml:space="preserve">“Real Estate Registration Law Amendments – Development Brief,” The Built Environment Observatory (May 2021)</w:t>
-      </w:r>
-      <w:r>
-        <w:rPr>
-          <w:rFonts w:ascii="David" w:cs="David" w:eastAsia="David" w:hAnsi="David"/>
-          <w:sz w:val="20"/>
-          <w:szCs w:val="20"/>
-          <w:rtl/>
-        </w:rPr>
-        <w:t xml:space="preserve">.</w:t>
+        <w:t xml:space="preserve">Shoked</w:t>
+      </w:r>
+      <w:r>
+        <w:rPr>
+          <w:rFonts w:ascii="David" w:cs="David" w:eastAsia="David" w:hAnsi="David"/>
+          <w:sz w:val="20"/>
+          <w:szCs w:val="20"/>
+          <w:rtl/>
+        </w:rPr>
+        <w:t xml:space="preserve">, </w:t>
+      </w:r>
+      <w:r>
+        <w:rPr>
+          <w:rFonts w:ascii="David" w:cs="David" w:eastAsia="David" w:hAnsi="David"/>
+          <w:sz w:val="20"/>
+          <w:szCs w:val="20"/>
+          <w:rtl/>
+        </w:rPr>
+        <w:t xml:space="preserve">לעיל ה"ש 83</w:t>
+      </w:r>
+      <w:r>
+        <w:rPr>
+          <w:rFonts w:ascii="David" w:cs="David" w:eastAsia="David" w:hAnsi="David"/>
+          <w:sz w:val="20"/>
+          <w:szCs w:val="20"/>
+          <w:rtl/>
+        </w:rPr>
+        <w:t xml:space="preserve">. ודוק: בישראל נחסם מסלול זה כמעט כליל – ס׳ 159(ב) לחוק המקרקעין שלל התיישנות במקרקעין מוסדרים, וחזקתו של בן משפחה מסווגת כ"חזקה מרשות"; ראו לעיל פרק ג.6.</w:t>
       </w:r>
     </w:p>
   </w:footnote>
@@ -11321,20 +11394,28 @@
       </w:r>
       <w:r>
         <w:rPr>
-          <w:rFonts w:ascii="David" w:cs="David" w:eastAsia="David" w:hAnsi="David"/>
-          <w:sz w:val="20"/>
-          <w:szCs w:val="20"/>
-          <w:rtl/>
-        </w:rPr>
-        <w:t xml:space="preserve">חוק מס׳ 9 לשנת 2022 (מצרים), המתקן את חוק מס׳ 114 לשנת 1946; ראו </w:t>
-      </w:r>
-      <w:r>
-        <w:rPr>
           <w:rFonts w:ascii="Times New Roman" w:cs="Times New Roman" w:eastAsia="Times New Roman" w:hAnsi="Times New Roman"/>
           <w:sz w:val="20"/>
           <w:szCs w:val="20"/>
         </w:rPr>
-        <w:t xml:space="preserve">Shalakany Law Office, “New Amendments to Real Estate Registration Law” (2022)</w:t>
+        <w:t xml:space="preserve">“Sisi Orders Delaying Implementation of Controversial Real Estate Law for 2 Years,” Ahram Online (Feb. 28, 2021); “‘Unjust’: Egypt’s Property Registration Plans Face Popular Backlash,” Middle East Eye (2021)</w:t>
+      </w:r>
+      <w:r>
+        <w:rPr>
+          <w:rFonts w:ascii="David" w:cs="David" w:eastAsia="David" w:hAnsi="David"/>
+          <w:sz w:val="20"/>
+          <w:szCs w:val="20"/>
+          <w:rtl/>
+        </w:rPr>
+        <w:t xml:space="preserve">. לניתוח מדיניות ראו </w:t>
+      </w:r>
+      <w:r>
+        <w:rPr>
+          <w:rFonts w:ascii="Times New Roman" w:cs="Times New Roman" w:eastAsia="Times New Roman" w:hAnsi="Times New Roman"/>
+          <w:sz w:val="20"/>
+          <w:szCs w:val="20"/>
+        </w:rPr>
+        <w:t xml:space="preserve">“Real Estate Registration Law Amendments – Development Brief,” The Built Environment Observatory (May 2021)</w:t>
       </w:r>
       <w:r>
         <w:rPr>
@@ -11366,7 +11447,24 @@
           <w:szCs w:val="20"/>
           <w:rtl/>
         </w:rPr>
-        <w:t xml:space="preserve">ס׳ 2 לחוקת מצרים (2014); ס׳ 1 לקוד האזרחי המצרי (ובו מדרג: חקיקה, מנהג, עקרונות השריעה, עקרונות הצדק); חוק הירושה המצרי, חוק מס׳ 77 לשנת 1943; ולצוואות – חוק מס׳ 71 לשנת 1946.</w:t>
+        <w:t xml:space="preserve">חוק מס׳ 9 לשנת 2022 (מצרים), המתקן את חוק מס׳ 114 לשנת 1946; ראו </w:t>
+      </w:r>
+      <w:r>
+        <w:rPr>
+          <w:rFonts w:ascii="Times New Roman" w:cs="Times New Roman" w:eastAsia="Times New Roman" w:hAnsi="Times New Roman"/>
+          <w:sz w:val="20"/>
+          <w:szCs w:val="20"/>
+        </w:rPr>
+        <w:t xml:space="preserve">Shalakany Law Office, “New Amendments to Real Estate Registration Law” (2022)</w:t>
+      </w:r>
+      <w:r>
+        <w:rPr>
+          <w:rFonts w:ascii="David" w:cs="David" w:eastAsia="David" w:hAnsi="David"/>
+          <w:sz w:val="20"/>
+          <w:szCs w:val="20"/>
+          <w:rtl/>
+        </w:rPr>
+        <w:t xml:space="preserve">.</w:t>
       </w:r>
     </w:p>
   </w:footnote>
@@ -11389,24 +11487,7 @@
           <w:szCs w:val="20"/>
           <w:rtl/>
         </w:rPr>
-        <w:t xml:space="preserve">לתרגום האנגלי המקובל ראו </w:t>
-      </w:r>
-      <w:r>
-        <w:rPr>
-          <w:rFonts w:ascii="Times New Roman" w:cs="Times New Roman" w:eastAsia="Times New Roman" w:hAnsi="Times New Roman"/>
-          <w:sz w:val="20"/>
-          <w:szCs w:val="20"/>
-        </w:rPr>
-        <w:t xml:space="preserve">C.R. Tyser, D.G. Demetriades &amp; Ismail Haqqi Effendi (trans.), The Mejelle: Being an English Translation of Majallah el-Ahkam-i-Adliya (1901)</w:t>
-      </w:r>
-      <w:r>
-        <w:rPr>
-          <w:rFonts w:ascii="David" w:cs="David" w:eastAsia="David" w:hAnsi="David"/>
-          <w:sz w:val="20"/>
-          <w:szCs w:val="20"/>
-          <w:rtl/>
-        </w:rPr>
-        <w:t xml:space="preserve">; חוק לביטול המג׳לה, התשמ"ד-1984.</w:t>
+        <w:t xml:space="preserve">ס׳ 2 לחוקת מצרים (2014); ס׳ 1 לקוד האזרחי המצרי (ובו מדרג: חקיקה, מנהג, עקרונות השריעה, עקרונות הצדק); חוק הירושה המצרי, חוק מס׳ 77 לשנת 1943; ולצוואות – חוק מס׳ 71 לשנת 1946.</w:t>
       </w:r>
     </w:p>
   </w:footnote>
@@ -11429,7 +11510,7 @@
           <w:szCs w:val="20"/>
           <w:rtl/>
         </w:rPr>
-        <w:t xml:space="preserve">ס׳ 837, 861–862 למג׳לה. לדוקטרינת ההִבָּה הקלאסית ראו </w:t>
+        <w:t xml:space="preserve">לתרגום האנגלי המקובל ראו </w:t>
       </w:r>
       <w:r>
         <w:rPr>
@@ -11437,16 +11518,16 @@
           <w:sz w:val="20"/>
           <w:szCs w:val="20"/>
         </w:rPr>
-        <w:t xml:space="preserve">Joseph Schacht, An Introduction to Islamic Law (1964); Y. Linant de Bellefonds, “Hiba,” in The Encyclopaedia of Islam (2d ed.)</w:t>
-      </w:r>
-      <w:r>
-        <w:rPr>
-          <w:rFonts w:ascii="David" w:cs="David" w:eastAsia="David" w:hAnsi="David"/>
-          <w:sz w:val="20"/>
-          <w:szCs w:val="20"/>
-          <w:rtl/>
-        </w:rPr>
-        <w:t xml:space="preserve">.</w:t>
+        <w:t xml:space="preserve">C.R. Tyser, D.G. Demetriades &amp; Ismail Haqqi Effendi (trans.), The Mejelle: Being an English Translation of Majallah el-Ahkam-i-Adliya (1901)</w:t>
+      </w:r>
+      <w:r>
+        <w:rPr>
+          <w:rFonts w:ascii="David" w:cs="David" w:eastAsia="David" w:hAnsi="David"/>
+          <w:sz w:val="20"/>
+          <w:szCs w:val="20"/>
+          <w:rtl/>
+        </w:rPr>
+        <w:t xml:space="preserve">; חוק לביטול המג׳לה, התשמ"ד-1984.</w:t>
       </w:r>
     </w:p>
   </w:footnote>
@@ -11469,7 +11550,24 @@
           <w:szCs w:val="20"/>
           <w:rtl/>
         </w:rPr>
-        <w:t xml:space="preserve">ס׳ 866 למג׳לה; וכן ס׳ 872 – מות אחד הצדדים חוסם את החזרה.</w:t>
+        <w:t xml:space="preserve">ס׳ 837, 861–862 למג׳לה. לדוקטרינת ההִבָּה הקלאסית ראו </w:t>
+      </w:r>
+      <w:r>
+        <w:rPr>
+          <w:rFonts w:ascii="Times New Roman" w:cs="Times New Roman" w:eastAsia="Times New Roman" w:hAnsi="Times New Roman"/>
+          <w:sz w:val="20"/>
+          <w:szCs w:val="20"/>
+        </w:rPr>
+        <w:t xml:space="preserve">Joseph Schacht, An Introduction to Islamic Law (1964); Y. Linant de Bellefonds, “Hiba,” in The Encyclopaedia of Islam (2d ed.)</w:t>
+      </w:r>
+      <w:r>
+        <w:rPr>
+          <w:rFonts w:ascii="David" w:cs="David" w:eastAsia="David" w:hAnsi="David"/>
+          <w:sz w:val="20"/>
+          <w:szCs w:val="20"/>
+          <w:rtl/>
+        </w:rPr>
+        <w:t xml:space="preserve">.</w:t>
       </w:r>
     </w:p>
   </w:footnote>
@@ -11492,24 +11590,7 @@
           <w:szCs w:val="20"/>
           <w:rtl/>
         </w:rPr>
-        <w:t xml:space="preserve">ס׳ 879 למג׳לה; לדיון עדכני ראו </w:t>
-      </w:r>
-      <w:r>
-        <w:rPr>
-          <w:rFonts w:ascii="Times New Roman" w:cs="Times New Roman" w:eastAsia="Times New Roman" w:hAnsi="Times New Roman"/>
-          <w:sz w:val="20"/>
-          <w:szCs w:val="20"/>
-        </w:rPr>
-        <w:t xml:space="preserve">Siti Norfatirah Abdul Rahmani &amp; Mohd Zamro Muda, “Ownership Status of Hibah Marad al-Mawt,” 34(8) al-Qanatir Int’l J. Islamic Stud. (2025)</w:t>
-      </w:r>
-      <w:r>
-        <w:rPr>
-          <w:rFonts w:ascii="David" w:cs="David" w:eastAsia="David" w:hAnsi="David"/>
-          <w:sz w:val="20"/>
-          <w:szCs w:val="20"/>
-          <w:rtl/>
-        </w:rPr>
-        <w:t xml:space="preserve">.</w:t>
+        <w:t xml:space="preserve">ס׳ 866 למג׳לה; וכן ס׳ 872 – מות אחד הצדדים חוסם את החזרה.</w:t>
       </w:r>
     </w:p>
   </w:footnote>
@@ -11532,25 +11613,7 @@
           <w:szCs w:val="20"/>
           <w:rtl/>
         </w:rPr>
-        <w:t xml:space="preserve">להוראת המעבר ראו ראבילו, </w:t>
-      </w:r>
-      <w:r>
-        <w:rPr>
-          <w:rFonts w:ascii="David" w:cs="David" w:eastAsia="David" w:hAnsi="David"/>
-          <w:sz w:val="20"/>
-          <w:szCs w:val="20"/>
-          <w:rtl/>
-        </w:rPr>
-        <w:t xml:space="preserve">לעיל ה"ש 32</w:t>
-      </w:r>
-      <w:r>
-        <w:rPr>
-          <w:rFonts w:ascii="David" w:cs="David" w:eastAsia="David" w:hAnsi="David"/>
-          <w:sz w:val="20"/>
-          <w:szCs w:val="20"/>
-          <w:rtl/>
-        </w:rPr>
-        <w:t xml:space="preserve">, בעמ׳ 333–337, המתאר את הדין ערב חוק המתנה; והשוו </w:t>
+        <w:t xml:space="preserve">ס׳ 879 למג׳לה; לדיון עדכני ראו </w:t>
       </w:r>
       <w:r>
         <w:rPr>
@@ -11558,16 +11621,16 @@
           <w:sz w:val="20"/>
           <w:szCs w:val="20"/>
         </w:rPr>
-        <w:t xml:space="preserve">L. Landau, “The Gift Law, 1968,” 4 Isr. L. Rev. 260 (1969)</w:t>
-      </w:r>
-      <w:r>
-        <w:rPr>
-          <w:rFonts w:ascii="David" w:cs="David" w:eastAsia="David" w:hAnsi="David"/>
-          <w:sz w:val="20"/>
-          <w:szCs w:val="20"/>
-          <w:rtl/>
-        </w:rPr>
-        <w:t xml:space="preserve">, על החלפת דיני ההִבָּה של המג׳לה בחוק המתנה הישראלי.</w:t>
+        <w:t xml:space="preserve">Siti Norfatirah Abdul Rahmani &amp; Mohd Zamro Muda, “Ownership Status of Hibah Marad al-Mawt,” 34(8) al-Qanatir Int’l J. Islamic Stud. (2025)</w:t>
+      </w:r>
+      <w:r>
+        <w:rPr>
+          <w:rFonts w:ascii="David" w:cs="David" w:eastAsia="David" w:hAnsi="David"/>
+          <w:sz w:val="20"/>
+          <w:szCs w:val="20"/>
+          <w:rtl/>
+        </w:rPr>
+        <w:t xml:space="preserve">.</w:t>
       </w:r>
     </w:p>
   </w:footnote>
@@ -11590,7 +11653,42 @@
           <w:szCs w:val="20"/>
           <w:rtl/>
         </w:rPr>
-        <w:t xml:space="preserve">ס׳ 1660 למג׳לה (ולתביעות בעניין יסוד הוקף – 36 שנים, ס׳ 1661).</w:t>
+        <w:t xml:space="preserve">להוראת המעבר ראו ראבילו, </w:t>
+      </w:r>
+      <w:r>
+        <w:rPr>
+          <w:rFonts w:ascii="David" w:cs="David" w:eastAsia="David" w:hAnsi="David"/>
+          <w:sz w:val="20"/>
+          <w:szCs w:val="20"/>
+          <w:rtl/>
+        </w:rPr>
+        <w:t xml:space="preserve">לעיל ה"ש 32</w:t>
+      </w:r>
+      <w:r>
+        <w:rPr>
+          <w:rFonts w:ascii="David" w:cs="David" w:eastAsia="David" w:hAnsi="David"/>
+          <w:sz w:val="20"/>
+          <w:szCs w:val="20"/>
+          <w:rtl/>
+        </w:rPr>
+        <w:t xml:space="preserve">, בעמ׳ 333–337, המתאר את הדין ערב חוק המתנה; והשוו </w:t>
+      </w:r>
+      <w:r>
+        <w:rPr>
+          <w:rFonts w:ascii="Times New Roman" w:cs="Times New Roman" w:eastAsia="Times New Roman" w:hAnsi="Times New Roman"/>
+          <w:sz w:val="20"/>
+          <w:szCs w:val="20"/>
+        </w:rPr>
+        <w:t xml:space="preserve">L. Landau, “The Gift Law, 1968,” 4 Isr. L. Rev. 260 (1969)</w:t>
+      </w:r>
+      <w:r>
+        <w:rPr>
+          <w:rFonts w:ascii="David" w:cs="David" w:eastAsia="David" w:hAnsi="David"/>
+          <w:sz w:val="20"/>
+          <w:szCs w:val="20"/>
+          <w:rtl/>
+        </w:rPr>
+        <w:t xml:space="preserve">, על החלפת דיני ההִבָּה של המג׳לה בחוק המתנה הישראלי.</w:t>
       </w:r>
     </w:p>
   </w:footnote>
@@ -11613,7 +11711,7 @@
           <w:szCs w:val="20"/>
           <w:rtl/>
         </w:rPr>
-        <w:t xml:space="preserve">ס׳ 1674 למג׳לה. ההקבלה לס׳ 2 לחוק ההתיישנות, התשי"ח-1958, שאף הוא קובע התיישנות דיונית שאינה מפקיעה את הזכות, גלויה לעין.</w:t>
+        <w:t xml:space="preserve">ס׳ 1660 למג׳לה (ולתביעות בעניין יסוד הוקף – 36 שנים, ס׳ 1661).</w:t>
       </w:r>
     </w:p>
   </w:footnote>
@@ -11636,42 +11734,7 @@
           <w:szCs w:val="20"/>
           <w:rtl/>
         </w:rPr>
-        <w:t xml:space="preserve">ס׳ 20 ו-78 לחוק הקרקעות העות׳מאני, 1858. להיסטוריה של יישום הוראות אלה בארץ ישראל ולגלגולן בפסיקה הישראלית ראו </w:t>
-      </w:r>
-      <w:r>
-        <w:rPr>
-          <w:rFonts w:ascii="Times New Roman" w:cs="Times New Roman" w:eastAsia="Times New Roman" w:hAnsi="Times New Roman"/>
-          <w:sz w:val="20"/>
-          <w:szCs w:val="20"/>
-        </w:rPr>
-        <w:t xml:space="preserve">Ahmad Amara, “Dispossession by Law: How the Israeli Judicial System Utilizes Ottoman Land Law to Expel and Dispossess the Bedouins,” J. Levantine Stud. (2015)</w:t>
-      </w:r>
-      <w:r>
-        <w:rPr>
-          <w:rFonts w:ascii="David" w:cs="David" w:eastAsia="David" w:hAnsi="David"/>
-          <w:sz w:val="20"/>
-          <w:szCs w:val="20"/>
-          <w:rtl/>
-        </w:rPr>
-        <w:t xml:space="preserve">; זנדברג, </w:t>
-      </w:r>
-      <w:r>
-        <w:rPr>
-          <w:rFonts w:ascii="David" w:cs="David" w:eastAsia="David" w:hAnsi="David"/>
-          <w:sz w:val="20"/>
-          <w:szCs w:val="20"/>
-          <w:rtl/>
-        </w:rPr>
-        <w:t xml:space="preserve">לעיל ה"ש 10</w:t>
-      </w:r>
-      <w:r>
-        <w:rPr>
-          <w:rFonts w:ascii="David" w:cs="David" w:eastAsia="David" w:hAnsi="David"/>
-          <w:sz w:val="20"/>
-          <w:szCs w:val="20"/>
-          <w:rtl/>
-        </w:rPr>
-        <w:t xml:space="preserve">.</w:t>
+        <w:t xml:space="preserve">ס׳ 1674 למג׳לה. ההקבלה לס׳ 2 לחוק ההתיישנות, התשי"ח-1958, שאף הוא קובע התיישנות דיונית שאינה מפקיעה את הזכות, גלויה לעין.</w:t>
       </w:r>
     </w:p>
   </w:footnote>
@@ -11694,7 +11757,7 @@
           <w:szCs w:val="20"/>
           <w:rtl/>
         </w:rPr>
-        <w:t xml:space="preserve">ס׳ 1521 למג׳לה. השליחות פוקעת ככלל במות השולח – כלל שהעמיד בסימן שאלה את ייפויי הכוח הוותיקים שנועדו לפעול "לאחר אריכות ימים". לניסוח מודרני של דיני הוַכַּאלָה ראו </w:t>
+        <w:t xml:space="preserve">ס׳ 20 ו-78 לחוק הקרקעות העות׳מאני, 1858. להיסטוריה של יישום הוראות אלה בארץ ישראל ולגלגולן בפסיקה הישראלית ראו </w:t>
       </w:r>
       <w:r>
         <w:rPr>
@@ -11702,7 +11765,25 @@
           <w:sz w:val="20"/>
           <w:szCs w:val="20"/>
         </w:rPr>
-        <w:t xml:space="preserve">AAOIFI, Shari’ah Standard No. 23: Agency (2015)</w:t>
+        <w:t xml:space="preserve">Ahmad Amara, “Dispossession by Law: How the Israeli Judicial System Utilizes Ottoman Land Law to Expel and Dispossess the Bedouins,” J. Levantine Stud. (2015)</w:t>
+      </w:r>
+      <w:r>
+        <w:rPr>
+          <w:rFonts w:ascii="David" w:cs="David" w:eastAsia="David" w:hAnsi="David"/>
+          <w:sz w:val="20"/>
+          <w:szCs w:val="20"/>
+          <w:rtl/>
+        </w:rPr>
+        <w:t xml:space="preserve">; זנדברג, </w:t>
+      </w:r>
+      <w:r>
+        <w:rPr>
+          <w:rFonts w:ascii="David" w:cs="David" w:eastAsia="David" w:hAnsi="David"/>
+          <w:sz w:val="20"/>
+          <w:szCs w:val="20"/>
+          <w:rtl/>
+        </w:rPr>
+        <w:t xml:space="preserve">לעיל ה"ש 10</w:t>
       </w:r>
       <w:r>
         <w:rPr>
@@ -11729,11 +11810,20 @@
       </w:r>
       <w:r>
         <w:rPr>
+          <w:rFonts w:ascii="David" w:cs="David" w:eastAsia="David" w:hAnsi="David"/>
+          <w:sz w:val="20"/>
+          <w:szCs w:val="20"/>
+          <w:rtl/>
+        </w:rPr>
+        <w:t xml:space="preserve">ס׳ 1521 למג׳לה. השליחות פוקעת ככלל במות השולח – כלל שהעמיד בסימן שאלה את ייפויי הכוח הוותיקים שנועדו לפעול "לאחר אריכות ימים". לניסוח מודרני של דיני הוַכַּאלָה ראו </w:t>
+      </w:r>
+      <w:r>
+        <w:rPr>
           <w:rFonts w:ascii="Times New Roman" w:cs="Times New Roman" w:eastAsia="Times New Roman" w:hAnsi="Times New Roman"/>
           <w:sz w:val="20"/>
           <w:szCs w:val="20"/>
         </w:rPr>
-        <w:t xml:space="preserve">N.J. Coulson, Succession in the Muslim Family (1971)</w:t>
+        <w:t xml:space="preserve">AAOIFI, Shari’ah Standard No. 23: Agency (2015)</w:t>
       </w:r>
       <w:r>
         <w:rPr>
@@ -11764,24 +11854,7 @@
           <w:sz w:val="20"/>
           <w:szCs w:val="20"/>
         </w:rPr>
-        <w:t xml:space="preserve">Annelies Moors, Women, Property and Islam: Palestinian Experiences, 1920–1990 (1995)</w:t>
-      </w:r>
-      <w:r>
-        <w:rPr>
-          <w:rFonts w:ascii="David" w:cs="David" w:eastAsia="David" w:hAnsi="David"/>
-          <w:sz w:val="20"/>
-          <w:szCs w:val="20"/>
-          <w:rtl/>
-        </w:rPr>
-        <w:t xml:space="preserve">; ולפרקטיקה בבתי הדין השרעיים בישראל ראו </w:t>
-      </w:r>
-      <w:r>
-        <w:rPr>
-          <w:rFonts w:ascii="Times New Roman" w:cs="Times New Roman" w:eastAsia="Times New Roman" w:hAnsi="Times New Roman"/>
-          <w:sz w:val="20"/>
-          <w:szCs w:val="20"/>
-        </w:rPr>
-        <w:t xml:space="preserve">Aharon Layish, Women and Islamic Law in a Non-Muslim State (1975)</w:t>
+        <w:t xml:space="preserve">N.J. Coulson, Succession in the Muslim Family (1971)</w:t>
       </w:r>
       <w:r>
         <w:rPr>
@@ -11812,25 +11885,24 @@
           <w:sz w:val="20"/>
           <w:szCs w:val="20"/>
         </w:rPr>
-        <w:t xml:space="preserve">Ruth Kark, “Consequences of the Ottoman Land Law: Agrarian and Privatization Processes in Palestine, 1858–1918,” in Societies, Social Inequalities and Marginalization 101 (R. Chand et al. eds., 2017)</w:t>
-      </w:r>
-      <w:r>
-        <w:rPr>
-          <w:rFonts w:ascii="David" w:cs="David" w:eastAsia="David" w:hAnsi="David"/>
-          <w:sz w:val="20"/>
-          <w:szCs w:val="20"/>
-          <w:rtl/>
-        </w:rPr>
-        <w:t xml:space="preserve">; נדן, </w:t>
-      </w:r>
-      <w:r>
-        <w:rPr>
-          <w:rFonts w:ascii="David" w:cs="David" w:eastAsia="David" w:hAnsi="David"/>
-          <w:sz w:val="20"/>
-          <w:szCs w:val="20"/>
-          <w:rtl/>
-        </w:rPr>
-        <w:t xml:space="preserve">לעיל ה"ש 14</w:t>
+        <w:t xml:space="preserve">Annelies Moors, Women, Property and Islam: Palestinian Experiences, 1920–1990 (1995)</w:t>
+      </w:r>
+      <w:r>
+        <w:rPr>
+          <w:rFonts w:ascii="David" w:cs="David" w:eastAsia="David" w:hAnsi="David"/>
+          <w:sz w:val="20"/>
+          <w:szCs w:val="20"/>
+          <w:rtl/>
+        </w:rPr>
+        <w:t xml:space="preserve">; ולפרקטיקה בבתי הדין השרעיים בישראל ראו </w:t>
+      </w:r>
+      <w:r>
+        <w:rPr>
+          <w:rFonts w:ascii="Times New Roman" w:cs="Times New Roman" w:eastAsia="Times New Roman" w:hAnsi="Times New Roman"/>
+          <w:sz w:val="20"/>
+          <w:szCs w:val="20"/>
+        </w:rPr>
+        <w:t xml:space="preserve">Aharon Layish, Women and Islamic Law in a Non-Muslim State (1975)</w:t>
       </w:r>
       <w:r>
         <w:rPr>
@@ -11857,20 +11929,29 @@
       </w:r>
       <w:r>
         <w:rPr>
-          <w:rFonts w:ascii="David" w:cs="David" w:eastAsia="David" w:hAnsi="David"/>
-          <w:sz w:val="20"/>
-          <w:szCs w:val="20"/>
-          <w:rtl/>
-        </w:rPr>
-        <w:t xml:space="preserve">ראו לעיל פרק ה ופרק ו.2.4; והשוו </w:t>
-      </w:r>
-      <w:r>
-        <w:rPr>
           <w:rFonts w:ascii="Times New Roman" w:cs="Times New Roman" w:eastAsia="Times New Roman" w:hAnsi="Times New Roman"/>
           <w:sz w:val="20"/>
           <w:szCs w:val="20"/>
         </w:rPr>
-        <w:t xml:space="preserve">Kareem Ibrahim &amp; Deena Khalil, “Land Titling: A Tool, not a Panacea — Insights from Egypt,” Metropolitics (Dec. 20, 2016)</w:t>
+        <w:t xml:space="preserve">Ruth Kark, “Consequences of the Ottoman Land Law: Agrarian and Privatization Processes in Palestine, 1858–1918,” in Societies, Social Inequalities and Marginalization 101 (R. Chand et al. eds., 2017)</w:t>
+      </w:r>
+      <w:r>
+        <w:rPr>
+          <w:rFonts w:ascii="David" w:cs="David" w:eastAsia="David" w:hAnsi="David"/>
+          <w:sz w:val="20"/>
+          <w:szCs w:val="20"/>
+          <w:rtl/>
+        </w:rPr>
+        <w:t xml:space="preserve">; נדן, </w:t>
+      </w:r>
+      <w:r>
+        <w:rPr>
+          <w:rFonts w:ascii="David" w:cs="David" w:eastAsia="David" w:hAnsi="David"/>
+          <w:sz w:val="20"/>
+          <w:szCs w:val="20"/>
+          <w:rtl/>
+        </w:rPr>
+        <w:t xml:space="preserve">לעיל ה"ש 14</w:t>
       </w:r>
       <w:r>
         <w:rPr>
@@ -11902,6 +11983,46 @@
           <w:szCs w:val="20"/>
           <w:rtl/>
         </w:rPr>
+        <w:t xml:space="preserve">ראו לעיל פרק ה ופרק ו.2.4; והשוו </w:t>
+      </w:r>
+      <w:r>
+        <w:rPr>
+          <w:rFonts w:ascii="Times New Roman" w:cs="Times New Roman" w:eastAsia="Times New Roman" w:hAnsi="Times New Roman"/>
+          <w:sz w:val="20"/>
+          <w:szCs w:val="20"/>
+        </w:rPr>
+        <w:t xml:space="preserve">Kareem Ibrahim &amp; Deena Khalil, “Land Titling: A Tool, not a Panacea — Insights from Egypt,” Metropolitics (Dec. 20, 2016)</w:t>
+      </w:r>
+      <w:r>
+        <w:rPr>
+          <w:rFonts w:ascii="David" w:cs="David" w:eastAsia="David" w:hAnsi="David"/>
+          <w:sz w:val="20"/>
+          <w:szCs w:val="20"/>
+          <w:rtl/>
+        </w:rPr>
+        <w:t xml:space="preserve">.</w:t>
+      </w:r>
+    </w:p>
+  </w:footnote>
+  <w:footnote w:id="109">
+    <w:p>
+      <w:pPr>
+        <w:bidi/>
+        <w:spacing w:after="60"/>
+      </w:pPr>
+      <w:r>
+        <w:rPr>
+          <w:rStyle w:val="FootnoteReference"/>
+        </w:rPr>
+        <w:footnoteRef/>
+      </w:r>
+      <w:r>
+        <w:rPr>
+          <w:rFonts w:ascii="David" w:cs="David" w:eastAsia="David" w:hAnsi="David"/>
+          <w:sz w:val="20"/>
+          <w:szCs w:val="20"/>
+          <w:rtl/>
+        </w:rPr>
         <w:t xml:space="preserve">עניין </w:t>
       </w:r>
       <w:r>
@@ -11944,7 +12065,7 @@
       </w:r>
     </w:p>
   </w:footnote>
-  <w:footnote w:id="109">
+  <w:footnote w:id="110">
     <w:p>
       <w:pPr>
         <w:bidi/>
@@ -11973,64 +12094,6 @@
           <w:rtl/>
         </w:rPr>
         <w:t xml:space="preserve">לעיל ה"ש 35</w:t>
-      </w:r>
-      <w:r>
-        <w:rPr>
-          <w:rFonts w:ascii="David" w:cs="David" w:eastAsia="David" w:hAnsi="David"/>
-          <w:sz w:val="20"/>
-          <w:szCs w:val="20"/>
-          <w:rtl/>
-        </w:rPr>
-        <w:t xml:space="preserve">.</w:t>
-      </w:r>
-    </w:p>
-  </w:footnote>
-  <w:footnote w:id="110">
-    <w:p>
-      <w:pPr>
-        <w:bidi/>
-        <w:spacing w:after="60"/>
-      </w:pPr>
-      <w:r>
-        <w:rPr>
-          <w:rStyle w:val="FootnoteReference"/>
-        </w:rPr>
-        <w:footnoteRef/>
-      </w:r>
-      <w:r>
-        <w:rPr>
-          <w:rFonts w:ascii="David" w:cs="David" w:eastAsia="David" w:hAnsi="David"/>
-          <w:sz w:val="20"/>
-          <w:szCs w:val="20"/>
-          <w:rtl/>
-        </w:rPr>
-        <w:t xml:space="preserve">ראו </w:t>
-      </w:r>
-      <w:r>
-        <w:rPr>
-          <w:rFonts w:ascii="Times New Roman" w:cs="Times New Roman" w:eastAsia="Times New Roman" w:hAnsi="Times New Roman"/>
-          <w:sz w:val="20"/>
-          <w:szCs w:val="20"/>
-        </w:rPr>
-        <w:t xml:space="preserve">Guest v Guest [2022] UKSC 27</w:t>
-      </w:r>
-      <w:r>
-        <w:rPr>
-          <w:rFonts w:ascii="David" w:cs="David" w:eastAsia="David" w:hAnsi="David"/>
-          <w:sz w:val="20"/>
-          <w:szCs w:val="20"/>
-          <w:rtl/>
-        </w:rPr>
-        <w:t xml:space="preserve">, </w:t>
-      </w:r>
-      <w:r>
-        <w:rPr>
-          <w:rFonts w:ascii="David" w:cs="David" w:eastAsia="David" w:hAnsi="David"/>
-          <w:sz w:val="20"/>
-          <w:szCs w:val="20"/>
-          <w:rtl/>
-        </w:rPr>
-        <w:t xml:space="preserve">לעיל ה"ש 77</w:t>
       </w:r>
       <w:r>
         <w:rPr>
@@ -12062,11 +12125,69 @@
           <w:szCs w:val="20"/>
           <w:rtl/>
         </w:rPr>
-        <w:t xml:space="preserve">לרפורמה המצרית ראו לעיל פרק ו.2.4.</w:t>
+        <w:t xml:space="preserve">ראו </w:t>
+      </w:r>
+      <w:r>
+        <w:rPr>
+          <w:rFonts w:ascii="Times New Roman" w:cs="Times New Roman" w:eastAsia="Times New Roman" w:hAnsi="Times New Roman"/>
+          <w:sz w:val="20"/>
+          <w:szCs w:val="20"/>
+        </w:rPr>
+        <w:t xml:space="preserve">Guest v Guest [2022] UKSC 27</w:t>
+      </w:r>
+      <w:r>
+        <w:rPr>
+          <w:rFonts w:ascii="David" w:cs="David" w:eastAsia="David" w:hAnsi="David"/>
+          <w:sz w:val="20"/>
+          <w:szCs w:val="20"/>
+          <w:rtl/>
+        </w:rPr>
+        <w:t xml:space="preserve">, </w:t>
+      </w:r>
+      <w:r>
+        <w:rPr>
+          <w:rFonts w:ascii="David" w:cs="David" w:eastAsia="David" w:hAnsi="David"/>
+          <w:sz w:val="20"/>
+          <w:szCs w:val="20"/>
+          <w:rtl/>
+        </w:rPr>
+        <w:t xml:space="preserve">לעיל ה"ש 78</w:t>
+      </w:r>
+      <w:r>
+        <w:rPr>
+          <w:rFonts w:ascii="David" w:cs="David" w:eastAsia="David" w:hAnsi="David"/>
+          <w:sz w:val="20"/>
+          <w:szCs w:val="20"/>
+          <w:rtl/>
+        </w:rPr>
+        <w:t xml:space="preserve">.</w:t>
       </w:r>
     </w:p>
   </w:footnote>
   <w:footnote w:id="112">
+    <w:p>
+      <w:pPr>
+        <w:bidi/>
+        <w:spacing w:after="60"/>
+      </w:pPr>
+      <w:r>
+        <w:rPr>
+          <w:rStyle w:val="FootnoteReference"/>
+        </w:rPr>
+        <w:footnoteRef/>
+      </w:r>
+      <w:r>
+        <w:rPr>
+          <w:rFonts w:ascii="David" w:cs="David" w:eastAsia="David" w:hAnsi="David"/>
+          <w:sz w:val="20"/>
+          <w:szCs w:val="20"/>
+          <w:rtl/>
+        </w:rPr>
+        <w:t xml:space="preserve">לרפורמה המצרית ראו לעיל פרק ו.2.4.</w:t>
+      </w:r>
+    </w:p>
+  </w:footnote>
+  <w:footnote w:id="113">
     <w:p>
       <w:pPr>
         <w:bidi/>

</xml_diff>

<commit_message>
Integrate the full judgment texts: intertemporal formality regimes, equity-volunteer rule, and permit-silence evidence
From Abu Ganima: new paragraph on the intertemporal regime (s. 80 of the
Ottoman Civil Procedure Law as probative-only for pre-1970 transactions,
per Kaadur v. Daksa), the case's proof profile, and the flip-side evidence
point that heirs' silence toward planning notices weighed against their
ownership claim. From Kabha: the 1920 Land Transfer Ordinance voidness
rule and the holding that English equity protected only purchasers for
value, not donees, linked to the comparative chapter. From Alush: the
settlement-officer channel and the no-writing rule for assignment of
contractual rights. From 7496/19: enforcement of internal family use
arrangements by conduct, confined to the intra-family plane.

Co-Authored-By: Claude Fable 5 <noreply@anthropic.com>
Claude-Session: https://claude.ai/code/session_01PTzmkyUzTNm9DT35momqLP
</commit_message>
<xml_diff>
--- a/seminar/סמינריון-מקרקעין-לא-רשומים.docx
+++ b/seminar/סמינריון-מקרקעין-לא-רשומים.docx
@@ -1680,6 +1680,64 @@
     </w:p>
     <w:p>
       <w:pPr>
+        <w:bidi/>
+        <w:spacing w:after="160" w:line="360"/>
+        <w:ind w:firstLine="420"/>
+        <w:jc w:val="both"/>
+      </w:pPr>
+      <w:r>
+        <w:rPr>
+          <w:rFonts w:ascii="David" w:cs="David" w:eastAsia="David" w:hAnsi="David"/>
+          <w:sz w:val="24"/>
+          <w:szCs w:val="24"/>
+          <w:rtl/>
+        </w:rPr>
+        <w:t xml:space="preserve">חשיבות מעשית ממדרגה ראשונה נודעת בהקשר זה למשטר הבין־זמני. עסקאות רבות מן הנדונות בסכסוכים אלה נכרתו לפני יום תחילתו של חוק המקרקעין (1.1.1970), וחלות עליהן דרישות הצורה של הדין הקודם: סעיף 80 לחוק הפרוצדורה האזרחית העות׳מאני, שפורש בפסיקה כדרישה ראייתית־פרובטיבית ולא מהותית – כך שניתן להוכיח את העסקה בעדות בעל־פה, מקום שבעל הדין שכנגד לא התנגד לעדות.</w:t>
+      </w:r>
+      <w:r>
+        <w:rPr>
+          <w:rStyle w:val="FootnoteReference"/>
+        </w:rPr>
+        <w:footnoteReference w:id="32"/>
+      </w:r>
+      <w:r>
+        <w:rPr>
+          <w:rFonts w:ascii="David" w:cs="David" w:eastAsia="David" w:hAnsi="David"/>
+          <w:sz w:val="24"/>
+          <w:szCs w:val="24"/>
+          <w:rtl/>
+        </w:rPr>
+        <w:t xml:space="preserve"> יישום מובהק נעשה בעניין </w:t>
+      </w:r>
+      <w:r>
+        <w:rPr>
+          <w:rFonts w:ascii="David" w:cs="David" w:eastAsia="David" w:hAnsi="David"/>
+          <w:i/>
+          <w:iCs/>
+          <w:sz w:val="24"/>
+          <w:szCs w:val="24"/>
+          <w:rtl/>
+        </w:rPr>
+        <w:t xml:space="preserve">עיזבון אבו ג׳נימה</w:t>
+      </w:r>
+      <w:r>
+        <w:rPr>
+          <w:rFonts w:ascii="David" w:cs="David" w:eastAsia="David" w:hAnsi="David"/>
+          <w:sz w:val="24"/>
+          <w:szCs w:val="24"/>
+          <w:rtl/>
+        </w:rPr>
+        <w:t xml:space="preserve">: עסקת מכר משנת 1968, שהסכמהּ אבד ושמעולם לא נרשמה, הוכחה על יסוד עדותו של מי שהיה ילד כבן שתים עשרה במעמד העסקה, הודאות בעל דין של שישה עשר נתבעים, הימנעות עשרות נתבעים נוספים מהתגוננות, והחזקה ושימוש בני עשרות שנים ללא מחאה; ובית המשפט הוסיף כי אף אילו חלה דרישת הכתב המהותית של סעיף 8 – זעקת ההגינות הייתה מרפאת את החסר, שעה שההסכם קוים במלואו והמסתמכים נהגו בחלקה מנהג בעלים דורות.</w:t>
+      </w:r>
+      <w:r>
+        <w:rPr>
+          <w:rStyle w:val="FootnoteReference"/>
+        </w:rPr>
+        <w:footnoteReference w:id="33"/>
+      </w:r>
+    </w:p>
+    <w:p>
+      <w:pPr>
         <w:pStyle w:val="Heading2"/>
         <w:bidi/>
         <w:spacing w:after="180" w:before="280"/>
@@ -1717,7 +1775,7 @@
         <w:rPr>
           <w:rStyle w:val="FootnoteReference"/>
         </w:rPr>
-        <w:footnoteReference w:id="32"/>
+        <w:footnoteReference w:id="34"/>
       </w:r>
       <w:r>
         <w:rPr>
@@ -1732,7 +1790,7 @@
         <w:rPr>
           <w:rStyle w:val="FootnoteReference"/>
         </w:rPr>
-        <w:footnoteReference w:id="33"/>
+        <w:footnoteReference w:id="35"/>
       </w:r>
     </w:p>
     <w:p>
@@ -1755,7 +1813,7 @@
         <w:rPr>
           <w:rStyle w:val="FootnoteReference"/>
         </w:rPr>
-        <w:footnoteReference w:id="34"/>
+        <w:footnoteReference w:id="36"/>
       </w:r>
       <w:r>
         <w:rPr>
@@ -1770,22 +1828,42 @@
         <w:rPr>
           <w:rStyle w:val="FootnoteReference"/>
         </w:rPr>
-        <w:footnoteReference w:id="35"/>
-      </w:r>
-      <w:r>
-        <w:rPr>
-          <w:rFonts w:ascii="David" w:cs="David" w:eastAsia="David" w:hAnsi="David"/>
-          <w:sz w:val="24"/>
-          <w:szCs w:val="24"/>
-          <w:rtl/>
-        </w:rPr>
-        <w:t xml:space="preserve"> זהו היפוך מרשים של נקודת המוצא הרישומית: המסמך הבלתי רשום מכריע את הרישום, מכוח סעיף 9 לחוק המקרקעין ועקרון תום הלב. ומנגד, יש לזכור את הגבול: מקום שהדין החל מתנה את השלמת ההקניה ברישום, נפסק כי מסמך מתנה, מסירת חזקה ואף בנייה על הקרקע אינם משלימים את ההעברה, והזכויות נותרות בידי המקנה ועוברות במותו ליורשיו.</w:t>
-      </w:r>
-      <w:r>
-        <w:rPr>
-          <w:rStyle w:val="FootnoteReference"/>
-        </w:rPr>
-        <w:footnoteReference w:id="36"/>
+        <w:footnoteReference w:id="37"/>
+      </w:r>
+      <w:r>
+        <w:rPr>
+          <w:rFonts w:ascii="David" w:cs="David" w:eastAsia="David" w:hAnsi="David"/>
+          <w:sz w:val="24"/>
+          <w:szCs w:val="24"/>
+          <w:rtl/>
+        </w:rPr>
+        <w:t xml:space="preserve"> זהו היפוך מרשים של נקודת המוצא הרישומית: המסמך הבלתי רשום מכריע את הרישום, מכוח סעיף 9 לחוק המקרקעין ועקרון תום הלב. ומנגד ניצב, שוב, הגבול הבין־זמני – והפעם לחומרה: בעניין </w:t>
+      </w:r>
+      <w:r>
+        <w:rPr>
+          <w:rFonts w:ascii="David" w:cs="David" w:eastAsia="David" w:hAnsi="David"/>
+          <w:i/>
+          <w:iCs/>
+          <w:sz w:val="24"/>
+          <w:szCs w:val="24"/>
+          <w:rtl/>
+        </w:rPr>
+        <w:t xml:space="preserve">כבהה</w:t>
+      </w:r>
+      <w:r>
+        <w:rPr>
+          <w:rFonts w:ascii="David" w:cs="David" w:eastAsia="David" w:hAnsi="David"/>
+          <w:sz w:val="24"/>
+          <w:szCs w:val="24"/>
+          <w:rtl/>
+        </w:rPr>
+        <w:t xml:space="preserve"> נדונה מתנת אב לבניו משנת 1952, שחלה עליה פקודת העברת הקרקעות, 1920, המתנה את תוקף ההעברה ברישום בספרי האחוזה ובהסכמת מנהל מחלקת הקרקעות. נפסק כי בהיעדר רישום המתנה "בטלה ומבוטלת" – ומסירת החזקה, בניית בתים רבים על הקרקע ושתיקת האחיות במשך עשורים אינן מרפאות את הבטלות – כך שהזכויות נותרו בידי האב ועברו במותו לכלל יורשיו על פי דין. בית המשפט הדגיש כי אף דיני היושר האנגליים לא היו מושיעים את המקבלים: היושר הגן על רוכש בתמורה שעסקתו לא נרשמה, אך לא על מקבל מתנה שהקנייתה לא הושלמה.</w:t>
+      </w:r>
+      <w:r>
+        <w:rPr>
+          <w:rStyle w:val="FootnoteReference"/>
+        </w:rPr>
+        <w:footnoteReference w:id="38"/>
       </w:r>
     </w:p>
     <w:p>
@@ -1808,7 +1886,7 @@
         <w:rPr>
           <w:rStyle w:val="FootnoteReference"/>
         </w:rPr>
-        <w:footnoteReference w:id="37"/>
+        <w:footnoteReference w:id="39"/>
       </w:r>
       <w:r>
         <w:rPr>
@@ -1859,7 +1937,7 @@
         <w:rPr>
           <w:rStyle w:val="FootnoteReference"/>
         </w:rPr>
-        <w:footnoteReference w:id="38"/>
+        <w:footnoteReference w:id="40"/>
       </w:r>
       <w:r>
         <w:rPr>
@@ -1874,7 +1952,7 @@
         <w:rPr>
           <w:rStyle w:val="FootnoteReference"/>
         </w:rPr>
-        <w:footnoteReference w:id="39"/>
+        <w:footnoteReference w:id="41"/>
       </w:r>
     </w:p>
     <w:p>
@@ -1897,7 +1975,7 @@
         <w:rPr>
           <w:rStyle w:val="FootnoteReference"/>
         </w:rPr>
-        <w:footnoteReference w:id="40"/>
+        <w:footnoteReference w:id="42"/>
       </w:r>
       <w:r>
         <w:rPr>
@@ -1968,7 +2046,7 @@
         <w:rPr>
           <w:rStyle w:val="FootnoteReference"/>
         </w:rPr>
-        <w:footnoteReference w:id="41"/>
+        <w:footnoteReference w:id="43"/>
       </w:r>
       <w:r>
         <w:rPr>
@@ -1983,7 +2061,7 @@
         <w:rPr>
           <w:rStyle w:val="FootnoteReference"/>
         </w:rPr>
-        <w:footnoteReference w:id="42"/>
+        <w:footnoteReference w:id="44"/>
       </w:r>
     </w:p>
     <w:p>
@@ -2039,13 +2117,13 @@
           <w:szCs w:val="24"/>
           <w:rtl/>
         </w:rPr>
-        <w:t xml:space="preserve"> אישר בית המשפט העליון ממצאים בדבר עסקת מכר במקרקעין בלתי רשומים שהתבססו על עדות ישירה, הודאות בעלי דין, החזקה ממושכת וראיות נסיבתיות;</w:t>
-      </w:r>
-      <w:r>
-        <w:rPr>
-          <w:rStyle w:val="FootnoteReference"/>
-        </w:rPr>
-        <w:footnoteReference w:id="43"/>
+        <w:t xml:space="preserve"> אישר בית המשפט העליון, כמפורט לעיל, ממצאים בדבר עסקת מכר במקרקעין בלתי רשומים שהתבססו על עדות ישירה, הודאות בעלי דין, החזקה ממושכת וראיות נסיבתיות;</w:t>
+      </w:r>
+      <w:r>
+        <w:rPr>
+          <w:rStyle w:val="FootnoteReference"/>
+        </w:rPr>
+        <w:footnoteReference w:id="45"/>
       </w:r>
       <w:r>
         <w:rPr>
@@ -2080,7 +2158,7 @@
         <w:rPr>
           <w:rStyle w:val="FootnoteReference"/>
         </w:rPr>
-        <w:footnoteReference w:id="44"/>
+        <w:footnoteReference w:id="46"/>
       </w:r>
       <w:r>
         <w:rPr>
@@ -2112,7 +2190,7 @@
         <w:rPr>
           <w:rStyle w:val="FootnoteReference"/>
         </w:rPr>
-        <w:footnoteReference w:id="45"/>
+        <w:footnoteReference w:id="47"/>
       </w:r>
     </w:p>
     <w:p>
@@ -2135,7 +2213,7 @@
         <w:rPr>
           <w:rStyle w:val="FootnoteReference"/>
         </w:rPr>
-        <w:footnoteReference w:id="46"/>
+        <w:footnoteReference w:id="48"/>
       </w:r>
       <w:r>
         <w:rPr>
@@ -2150,7 +2228,7 @@
         <w:rPr>
           <w:rStyle w:val="FootnoteReference"/>
         </w:rPr>
-        <w:footnoteReference w:id="47"/>
+        <w:footnoteReference w:id="49"/>
       </w:r>
     </w:p>
     <w:p>
@@ -2173,7 +2251,7 @@
         <w:rPr>
           <w:rStyle w:val="FootnoteReference"/>
         </w:rPr>
-        <w:footnoteReference w:id="48"/>
+        <w:footnoteReference w:id="50"/>
       </w:r>
       <w:r>
         <w:rPr>
@@ -2188,7 +2266,7 @@
         <w:rPr>
           <w:rStyle w:val="FootnoteReference"/>
         </w:rPr>
-        <w:footnoteReference w:id="49"/>
+        <w:footnoteReference w:id="51"/>
       </w:r>
       <w:r>
         <w:rPr>
@@ -2203,7 +2281,22 @@
         <w:rPr>
           <w:rStyle w:val="FootnoteReference"/>
         </w:rPr>
-        <w:footnoteReference w:id="50"/>
+        <w:footnoteReference w:id="52"/>
+      </w:r>
+      <w:r>
+        <w:rPr>
+          <w:rFonts w:ascii="David" w:cs="David" w:eastAsia="David" w:hAnsi="David"/>
+          <w:sz w:val="24"/>
+          <w:szCs w:val="24"/>
+          <w:rtl/>
+        </w:rPr>
+        <w:t xml:space="preserve"> ולבסוף, גם כשהמרשם קופא על שם האב המנוח, נכונים בתי המשפט לאכוף בין האחים לבין עצמם הסדרי שימוש פנימיים שנקבעו אף בהתנהגות גרידא – כגון צו המגן על דרך מעבר משותפת בין הבתים – תוך הגבלת ההכרעה למישור הפנים־משפחתי, בלא לפגוע בזכויות יתר השותפים הרשומים שאינם צד להליך.</w:t>
+      </w:r>
+      <w:r>
+        <w:rPr>
+          <w:rStyle w:val="FootnoteReference"/>
+        </w:rPr>
+        <w:footnoteReference w:id="53"/>
       </w:r>
       <w:r>
         <w:rPr>
@@ -2254,7 +2347,7 @@
         <w:rPr>
           <w:rStyle w:val="FootnoteReference"/>
         </w:rPr>
-        <w:footnoteReference w:id="51"/>
+        <w:footnoteReference w:id="54"/>
       </w:r>
     </w:p>
     <w:p>
@@ -2332,7 +2425,7 @@
         <w:rPr>
           <w:rStyle w:val="FootnoteReference"/>
         </w:rPr>
-        <w:footnoteReference w:id="52"/>
+        <w:footnoteReference w:id="55"/>
       </w:r>
       <w:r>
         <w:rPr>
@@ -2364,7 +2457,42 @@
         <w:rPr>
           <w:rStyle w:val="FootnoteReference"/>
         </w:rPr>
-        <w:footnoteReference w:id="53"/>
+        <w:footnoteReference w:id="56"/>
+      </w:r>
+      <w:r>
+        <w:rPr>
+          <w:rFonts w:ascii="David" w:cs="David" w:eastAsia="David" w:hAnsi="David"/>
+          <w:sz w:val="24"/>
+          <w:szCs w:val="24"/>
+          <w:rtl/>
+        </w:rPr>
+        <w:t xml:space="preserve"> וקיים גם צד שני לאותו מטבע: שתיקה נוכח הליכי רישוי עשויה להישקל נגד הטוען לבעלות. בעניין </w:t>
+      </w:r>
+      <w:r>
+        <w:rPr>
+          <w:rFonts w:ascii="David" w:cs="David" w:eastAsia="David" w:hAnsi="David"/>
+          <w:i/>
+          <w:iCs/>
+          <w:sz w:val="24"/>
+          <w:szCs w:val="24"/>
+          <w:rtl/>
+        </w:rPr>
+        <w:t xml:space="preserve">אבו ג׳נימה</w:t>
+      </w:r>
+      <w:r>
+        <w:rPr>
+          <w:rFonts w:ascii="David" w:cs="David" w:eastAsia="David" w:hAnsi="David"/>
+          <w:sz w:val="24"/>
+          <w:szCs w:val="24"/>
+          <w:rtl/>
+        </w:rPr>
+        <w:t xml:space="preserve"> נזקפה לחובת יורשי המוכר העובדה שבמשך שנים קיבלו הודעות רבות מוועדת התכנון על בקשותיו של הרוכש להיתרי בנייה ולהקלות – ולא הגיבו ולא התנגדו; נקבע כי בכך העידו על עצמם שאינם רואים עצמם בעלי זכויות במקרקעין.</w:t>
+      </w:r>
+      <w:r>
+        <w:rPr>
+          <w:rStyle w:val="FootnoteReference"/>
+        </w:rPr>
+        <w:footnoteReference w:id="57"/>
       </w:r>
     </w:p>
     <w:p>
@@ -2406,7 +2534,7 @@
         <w:rPr>
           <w:rStyle w:val="FootnoteReference"/>
         </w:rPr>
-        <w:footnoteReference w:id="54"/>
+        <w:footnoteReference w:id="58"/>
       </w:r>
       <w:r>
         <w:rPr>
@@ -2457,7 +2585,7 @@
         <w:rPr>
           <w:rStyle w:val="FootnoteReference"/>
         </w:rPr>
-        <w:footnoteReference w:id="55"/>
+        <w:footnoteReference w:id="59"/>
       </w:r>
       <w:r>
         <w:rPr>
@@ -2508,7 +2636,7 @@
         <w:rPr>
           <w:rStyle w:val="FootnoteReference"/>
         </w:rPr>
-        <w:footnoteReference w:id="56"/>
+        <w:footnoteReference w:id="60"/>
       </w:r>
       <w:r>
         <w:rPr>
@@ -2559,7 +2687,7 @@
         <w:rPr>
           <w:rStyle w:val="FootnoteReference"/>
         </w:rPr>
-        <w:footnoteReference w:id="57"/>
+        <w:footnoteReference w:id="61"/>
       </w:r>
       <w:r>
         <w:rPr>
@@ -2629,7 +2757,7 @@
         <w:rPr>
           <w:rStyle w:val="FootnoteReference"/>
         </w:rPr>
-        <w:footnoteReference w:id="58"/>
+        <w:footnoteReference w:id="62"/>
       </w:r>
       <w:r>
         <w:rPr>
@@ -2644,7 +2772,7 @@
         <w:rPr>
           <w:rStyle w:val="FootnoteReference"/>
         </w:rPr>
-        <w:footnoteReference w:id="59"/>
+        <w:footnoteReference w:id="63"/>
       </w:r>
       <w:r>
         <w:rPr>
@@ -2659,7 +2787,7 @@
         <w:rPr>
           <w:rStyle w:val="FootnoteReference"/>
         </w:rPr>
-        <w:footnoteReference w:id="60"/>
+        <w:footnoteReference w:id="64"/>
       </w:r>
       <w:r>
         <w:rPr>
@@ -2674,7 +2802,7 @@
         <w:rPr>
           <w:rStyle w:val="FootnoteReference"/>
         </w:rPr>
-        <w:footnoteReference w:id="61"/>
+        <w:footnoteReference w:id="65"/>
       </w:r>
       <w:r>
         <w:rPr>
@@ -2689,7 +2817,7 @@
         <w:rPr>
           <w:rStyle w:val="FootnoteReference"/>
         </w:rPr>
-        <w:footnoteReference w:id="62"/>
+        <w:footnoteReference w:id="66"/>
       </w:r>
     </w:p>
     <w:p>
@@ -2712,7 +2840,7 @@
         <w:rPr>
           <w:rStyle w:val="FootnoteReference"/>
         </w:rPr>
-        <w:footnoteReference w:id="63"/>
+        <w:footnoteReference w:id="67"/>
       </w:r>
       <w:r>
         <w:rPr>
@@ -2727,7 +2855,7 @@
         <w:rPr>
           <w:rStyle w:val="FootnoteReference"/>
         </w:rPr>
-        <w:footnoteReference w:id="64"/>
+        <w:footnoteReference w:id="68"/>
       </w:r>
       <w:r>
         <w:rPr>
@@ -2778,7 +2906,7 @@
         <w:rPr>
           <w:rStyle w:val="FootnoteReference"/>
         </w:rPr>
-        <w:footnoteReference w:id="65"/>
+        <w:footnoteReference w:id="69"/>
       </w:r>
       <w:r>
         <w:rPr>
@@ -2810,7 +2938,7 @@
         <w:rPr>
           <w:rStyle w:val="FootnoteReference"/>
         </w:rPr>
-        <w:footnoteReference w:id="66"/>
+        <w:footnoteReference w:id="70"/>
       </w:r>
       <w:r>
         <w:rPr>
@@ -2861,7 +2989,7 @@
         <w:rPr>
           <w:rStyle w:val="FootnoteReference"/>
         </w:rPr>
-        <w:footnoteReference w:id="67"/>
+        <w:footnoteReference w:id="71"/>
       </w:r>
     </w:p>
     <w:p>
@@ -2901,7 +3029,7 @@
         <w:rPr>
           <w:rStyle w:val="FootnoteReference"/>
         </w:rPr>
-        <w:footnoteReference w:id="68"/>
+        <w:footnoteReference w:id="72"/>
       </w:r>
       <w:r>
         <w:rPr>
@@ -2933,7 +3061,7 @@
         <w:rPr>
           <w:rStyle w:val="FootnoteReference"/>
         </w:rPr>
-        <w:footnoteReference w:id="69"/>
+        <w:footnoteReference w:id="73"/>
       </w:r>
       <w:r>
         <w:rPr>
@@ -3058,7 +3186,7 @@
         <w:rPr>
           <w:rStyle w:val="FootnoteReference"/>
         </w:rPr>
-        <w:footnoteReference w:id="70"/>
+        <w:footnoteReference w:id="74"/>
       </w:r>
       <w:r>
         <w:rPr>
@@ -3092,7 +3220,7 @@
         <w:rPr>
           <w:rStyle w:val="FootnoteReference"/>
         </w:rPr>
-        <w:footnoteReference w:id="71"/>
+        <w:footnoteReference w:id="75"/>
       </w:r>
       <w:r>
         <w:rPr>
@@ -3127,7 +3255,7 @@
         <w:rPr>
           <w:rStyle w:val="FootnoteReference"/>
         </w:rPr>
-        <w:footnoteReference w:id="72"/>
+        <w:footnoteReference w:id="76"/>
       </w:r>
     </w:p>
     <w:p>
@@ -3169,7 +3297,7 @@
         <w:rPr>
           <w:rStyle w:val="FootnoteReference"/>
         </w:rPr>
-        <w:footnoteReference w:id="73"/>
+        <w:footnoteReference w:id="77"/>
       </w:r>
       <w:r>
         <w:rPr>
@@ -3220,7 +3348,7 @@
         <w:rPr>
           <w:rStyle w:val="FootnoteReference"/>
         </w:rPr>
-        <w:footnoteReference w:id="74"/>
+        <w:footnoteReference w:id="78"/>
       </w:r>
       <w:r>
         <w:rPr>
@@ -3235,7 +3363,7 @@
         <w:rPr>
           <w:rStyle w:val="FootnoteReference"/>
         </w:rPr>
-        <w:footnoteReference w:id="75"/>
+        <w:footnoteReference w:id="79"/>
       </w:r>
     </w:p>
     <w:p>
@@ -3294,7 +3422,7 @@
         <w:rPr>
           <w:rStyle w:val="FootnoteReference"/>
         </w:rPr>
-        <w:footnoteReference w:id="76"/>
+        <w:footnoteReference w:id="80"/>
       </w:r>
       <w:r>
         <w:rPr>
@@ -3345,7 +3473,7 @@
         <w:rPr>
           <w:rStyle w:val="FootnoteReference"/>
         </w:rPr>
-        <w:footnoteReference w:id="77"/>
+        <w:footnoteReference w:id="81"/>
       </w:r>
       <w:r>
         <w:rPr>
@@ -3379,7 +3507,7 @@
         <w:rPr>
           <w:rStyle w:val="FootnoteReference"/>
         </w:rPr>
-        <w:footnoteReference w:id="78"/>
+        <w:footnoteReference w:id="82"/>
       </w:r>
       <w:r>
         <w:rPr>
@@ -3467,7 +3595,42 @@
         <w:rPr>
           <w:rStyle w:val="FootnoteReference"/>
         </w:rPr>
-        <w:footnoteReference w:id="79"/>
+        <w:footnoteReference w:id="83"/>
+      </w:r>
+      <w:r>
+        <w:rPr>
+          <w:rFonts w:ascii="David" w:cs="David" w:eastAsia="David" w:hAnsi="David"/>
+          <w:sz w:val="24"/>
+          <w:szCs w:val="24"/>
+          <w:rtl/>
+        </w:rPr>
+        <w:t xml:space="preserve"> עיקרון זה נקלט אל תוך הפסיקה הישראלית עצמה: בעניין </w:t>
+      </w:r>
+      <w:r>
+        <w:rPr>
+          <w:rFonts w:ascii="David" w:cs="David" w:eastAsia="David" w:hAnsi="David"/>
+          <w:i/>
+          <w:iCs/>
+          <w:sz w:val="24"/>
+          <w:szCs w:val="24"/>
+          <w:rtl/>
+        </w:rPr>
+        <w:t xml:space="preserve">כבהה</w:t>
+      </w:r>
+      <w:r>
+        <w:rPr>
+          <w:rFonts w:ascii="David" w:cs="David" w:eastAsia="David" w:hAnsi="David"/>
+          <w:sz w:val="24"/>
+          <w:szCs w:val="24"/>
+          <w:rtl/>
+        </w:rPr>
+        <w:t xml:space="preserve"> נשללה תחולת דיני היושר האנגליים ממקבלי מתנה שלא נרשמה, בנימוק שהיושר הגן רק על עסקה בתמורה – ולא על מתנדב.</w:t>
+      </w:r>
+      <w:r>
+        <w:rPr>
+          <w:rStyle w:val="FootnoteReference"/>
+        </w:rPr>
+        <w:footnoteReference w:id="84"/>
       </w:r>
       <w:r>
         <w:rPr>
@@ -3501,7 +3664,7 @@
         <w:rPr>
           <w:rStyle w:val="FootnoteReference"/>
         </w:rPr>
-        <w:footnoteReference w:id="80"/>
+        <w:footnoteReference w:id="85"/>
       </w:r>
       <w:r>
         <w:rPr>
@@ -3535,7 +3698,7 @@
         <w:rPr>
           <w:rStyle w:val="FootnoteReference"/>
         </w:rPr>
-        <w:footnoteReference w:id="81"/>
+        <w:footnoteReference w:id="86"/>
       </w:r>
       <w:r>
         <w:rPr>
@@ -3550,7 +3713,7 @@
         <w:rPr>
           <w:rStyle w:val="FootnoteReference"/>
         </w:rPr>
-        <w:footnoteReference w:id="82"/>
+        <w:footnoteReference w:id="87"/>
       </w:r>
       <w:r>
         <w:rPr>
@@ -3565,7 +3728,7 @@
         <w:rPr>
           <w:rStyle w:val="FootnoteReference"/>
         </w:rPr>
-        <w:footnoteReference w:id="83"/>
+        <w:footnoteReference w:id="88"/>
       </w:r>
     </w:p>
     <w:p>
@@ -3626,7 +3789,7 @@
         <w:rPr>
           <w:rStyle w:val="FootnoteReference"/>
         </w:rPr>
-        <w:footnoteReference w:id="84"/>
+        <w:footnoteReference w:id="89"/>
       </w:r>
       <w:r>
         <w:rPr>
@@ -3641,7 +3804,7 @@
         <w:rPr>
           <w:rStyle w:val="FootnoteReference"/>
         </w:rPr>
-        <w:footnoteReference w:id="85"/>
+        <w:footnoteReference w:id="90"/>
       </w:r>
       <w:r>
         <w:rPr>
@@ -3656,7 +3819,7 @@
         <w:rPr>
           <w:rStyle w:val="FootnoteReference"/>
         </w:rPr>
-        <w:footnoteReference w:id="86"/>
+        <w:footnoteReference w:id="91"/>
       </w:r>
     </w:p>
     <w:p>
@@ -3698,7 +3861,7 @@
         <w:rPr>
           <w:rStyle w:val="FootnoteReference"/>
         </w:rPr>
-        <w:footnoteReference w:id="87"/>
+        <w:footnoteReference w:id="92"/>
       </w:r>
       <w:r>
         <w:rPr>
@@ -3713,7 +3876,7 @@
         <w:rPr>
           <w:rStyle w:val="FootnoteReference"/>
         </w:rPr>
-        <w:footnoteReference w:id="88"/>
+        <w:footnoteReference w:id="93"/>
       </w:r>
     </w:p>
     <w:p>
@@ -3755,7 +3918,7 @@
         <w:rPr>
           <w:rStyle w:val="FootnoteReference"/>
         </w:rPr>
-        <w:footnoteReference w:id="89"/>
+        <w:footnoteReference w:id="94"/>
       </w:r>
       <w:r>
         <w:rPr>
@@ -3770,7 +3933,7 @@
         <w:rPr>
           <w:rStyle w:val="FootnoteReference"/>
         </w:rPr>
-        <w:footnoteReference w:id="90"/>
+        <w:footnoteReference w:id="95"/>
       </w:r>
       <w:r>
         <w:rPr>
@@ -3785,7 +3948,7 @@
         <w:rPr>
           <w:rStyle w:val="FootnoteReference"/>
         </w:rPr>
-        <w:footnoteReference w:id="91"/>
+        <w:footnoteReference w:id="96"/>
       </w:r>
       <w:r>
         <w:rPr>
@@ -3800,7 +3963,7 @@
         <w:rPr>
           <w:rStyle w:val="FootnoteReference"/>
         </w:rPr>
-        <w:footnoteReference w:id="92"/>
+        <w:footnoteReference w:id="97"/>
       </w:r>
     </w:p>
     <w:p>
@@ -3842,7 +4005,7 @@
         <w:rPr>
           <w:rStyle w:val="FootnoteReference"/>
         </w:rPr>
-        <w:footnoteReference w:id="93"/>
+        <w:footnoteReference w:id="98"/>
       </w:r>
       <w:r>
         <w:rPr>
@@ -3857,7 +4020,7 @@
         <w:rPr>
           <w:rStyle w:val="FootnoteReference"/>
         </w:rPr>
-        <w:footnoteReference w:id="94"/>
+        <w:footnoteReference w:id="99"/>
       </w:r>
       <w:r>
         <w:rPr>
@@ -3872,7 +4035,7 @@
         <w:rPr>
           <w:rStyle w:val="FootnoteReference"/>
         </w:rPr>
-        <w:footnoteReference w:id="95"/>
+        <w:footnoteReference w:id="100"/>
       </w:r>
       <w:r>
         <w:rPr>
@@ -3942,7 +4105,7 @@
         <w:rPr>
           <w:rStyle w:val="FootnoteReference"/>
         </w:rPr>
-        <w:footnoteReference w:id="96"/>
+        <w:footnoteReference w:id="101"/>
       </w:r>
       <w:r>
         <w:rPr>
@@ -3993,7 +4156,7 @@
         <w:rPr>
           <w:rStyle w:val="FootnoteReference"/>
         </w:rPr>
-        <w:footnoteReference w:id="97"/>
+        <w:footnoteReference w:id="102"/>
       </w:r>
       <w:r>
         <w:rPr>
@@ -4008,7 +4171,7 @@
         <w:rPr>
           <w:rStyle w:val="FootnoteReference"/>
         </w:rPr>
-        <w:footnoteReference w:id="98"/>
+        <w:footnoteReference w:id="103"/>
       </w:r>
       <w:r>
         <w:rPr>
@@ -4023,7 +4186,7 @@
         <w:rPr>
           <w:rStyle w:val="FootnoteReference"/>
         </w:rPr>
-        <w:footnoteReference w:id="99"/>
+        <w:footnoteReference w:id="104"/>
       </w:r>
     </w:p>
     <w:p>
@@ -4046,7 +4209,7 @@
         <w:rPr>
           <w:rStyle w:val="FootnoteReference"/>
         </w:rPr>
-        <w:footnoteReference w:id="100"/>
+        <w:footnoteReference w:id="105"/>
       </w:r>
     </w:p>
     <w:p>
@@ -4088,7 +4251,7 @@
         <w:rPr>
           <w:rStyle w:val="FootnoteReference"/>
         </w:rPr>
-        <w:footnoteReference w:id="101"/>
+        <w:footnoteReference w:id="106"/>
       </w:r>
       <w:r>
         <w:rPr>
@@ -4103,7 +4266,7 @@
         <w:rPr>
           <w:rStyle w:val="FootnoteReference"/>
         </w:rPr>
-        <w:footnoteReference w:id="102"/>
+        <w:footnoteReference w:id="107"/>
       </w:r>
       <w:r>
         <w:rPr>
@@ -4118,7 +4281,7 @@
         <w:rPr>
           <w:rStyle w:val="FootnoteReference"/>
         </w:rPr>
-        <w:footnoteReference w:id="103"/>
+        <w:footnoteReference w:id="108"/>
       </w:r>
       <w:r>
         <w:rPr>
@@ -4169,7 +4332,7 @@
         <w:rPr>
           <w:rStyle w:val="FootnoteReference"/>
         </w:rPr>
-        <w:footnoteReference w:id="104"/>
+        <w:footnoteReference w:id="109"/>
       </w:r>
       <w:r>
         <w:rPr>
@@ -4184,7 +4347,7 @@
         <w:rPr>
           <w:rStyle w:val="FootnoteReference"/>
         </w:rPr>
-        <w:footnoteReference w:id="105"/>
+        <w:footnoteReference w:id="110"/>
       </w:r>
       <w:r>
         <w:rPr>
@@ -4199,7 +4362,7 @@
         <w:rPr>
           <w:rStyle w:val="FootnoteReference"/>
         </w:rPr>
-        <w:footnoteReference w:id="106"/>
+        <w:footnoteReference w:id="111"/>
       </w:r>
       <w:r>
         <w:rPr>
@@ -4214,7 +4377,7 @@
         <w:rPr>
           <w:rStyle w:val="FootnoteReference"/>
         </w:rPr>
-        <w:footnoteReference w:id="107"/>
+        <w:footnoteReference w:id="112"/>
       </w:r>
       <w:r>
         <w:rPr>
@@ -4360,7 +4523,7 @@
         <w:rPr>
           <w:rStyle w:val="FootnoteReference"/>
         </w:rPr>
-        <w:footnoteReference w:id="108"/>
+        <w:footnoteReference w:id="113"/>
       </w:r>
     </w:p>
     <w:p>
@@ -4419,7 +4582,7 @@
         <w:rPr>
           <w:rStyle w:val="FootnoteReference"/>
         </w:rPr>
-        <w:footnoteReference w:id="109"/>
+        <w:footnoteReference w:id="114"/>
       </w:r>
       <w:r>
         <w:rPr>
@@ -4434,7 +4597,7 @@
         <w:rPr>
           <w:rStyle w:val="FootnoteReference"/>
         </w:rPr>
-        <w:footnoteReference w:id="110"/>
+        <w:footnoteReference w:id="115"/>
       </w:r>
       <w:r>
         <w:rPr>
@@ -4466,7 +4629,7 @@
         <w:rPr>
           <w:rStyle w:val="FootnoteReference"/>
         </w:rPr>
-        <w:footnoteReference w:id="111"/>
+        <w:footnoteReference w:id="116"/>
       </w:r>
       <w:r>
         <w:rPr>
@@ -4518,7 +4681,7 @@
         <w:rPr>
           <w:rStyle w:val="FootnoteReference"/>
         </w:rPr>
-        <w:footnoteReference w:id="112"/>
+        <w:footnoteReference w:id="117"/>
       </w:r>
       <w:r>
         <w:rPr>
@@ -4533,7 +4696,7 @@
         <w:rPr>
           <w:rStyle w:val="FootnoteReference"/>
         </w:rPr>
-        <w:footnoteReference w:id="113"/>
+        <w:footnoteReference w:id="118"/>
       </w:r>
       <w:r>
         <w:rPr>
@@ -5359,6 +5522,80 @@
           <w:rtl/>
         </w:rPr>
         <w:t xml:space="preserve">, פ"ד נז(5) 49 (2003).</w:t>
+      </w:r>
+    </w:p>
+    <w:p>
+      <w:pPr>
+        <w:bidi/>
+        <w:spacing w:after="120" w:line="300"/>
+        <w:ind w:start="420" w:hanging="420"/>
+        <w:jc w:val="both"/>
+      </w:pPr>
+      <w:r>
+        <w:rPr>
+          <w:rFonts w:ascii="David" w:cs="David" w:eastAsia="David" w:hAnsi="David"/>
+          <w:sz w:val="24"/>
+          <w:szCs w:val="24"/>
+          <w:rtl/>
+        </w:rPr>
+        <w:t xml:space="preserve">ע"א 8234/09 </w:t>
+      </w:r>
+      <w:r>
+        <w:rPr>
+          <w:rFonts w:ascii="David" w:cs="David" w:eastAsia="David" w:hAnsi="David"/>
+          <w:i/>
+          <w:iCs/>
+          <w:sz w:val="24"/>
+          <w:szCs w:val="24"/>
+          <w:rtl/>
+        </w:rPr>
+        <w:t xml:space="preserve">שם טוב נ׳ פרץ</w:t>
+      </w:r>
+      <w:r>
+        <w:rPr>
+          <w:rFonts w:ascii="David" w:cs="David" w:eastAsia="David" w:hAnsi="David"/>
+          <w:sz w:val="24"/>
+          <w:szCs w:val="24"/>
+          <w:rtl/>
+        </w:rPr>
+        <w:t xml:space="preserve"> (נבו 21.3.2011).</w:t>
+      </w:r>
+    </w:p>
+    <w:p>
+      <w:pPr>
+        <w:bidi/>
+        <w:spacing w:after="120" w:line="300"/>
+        <w:ind w:start="420" w:hanging="420"/>
+        <w:jc w:val="both"/>
+      </w:pPr>
+      <w:r>
+        <w:rPr>
+          <w:rFonts w:ascii="David" w:cs="David" w:eastAsia="David" w:hAnsi="David"/>
+          <w:sz w:val="24"/>
+          <w:szCs w:val="24"/>
+          <w:rtl/>
+        </w:rPr>
+        <w:t xml:space="preserve">ע"א 2110/09 </w:t>
+      </w:r>
+      <w:r>
+        <w:rPr>
+          <w:rFonts w:ascii="David" w:cs="David" w:eastAsia="David" w:hAnsi="David"/>
+          <w:i/>
+          <w:iCs/>
+          <w:sz w:val="24"/>
+          <w:szCs w:val="24"/>
+          <w:rtl/>
+        </w:rPr>
+        <w:t xml:space="preserve">קדור נ׳ דקסה</w:t>
+      </w:r>
+      <w:r>
+        <w:rPr>
+          <w:rFonts w:ascii="David" w:cs="David" w:eastAsia="David" w:hAnsi="David"/>
+          <w:sz w:val="24"/>
+          <w:szCs w:val="24"/>
+          <w:rtl/>
+        </w:rPr>
+        <w:t xml:space="preserve"> (נבו 20.9.2012).</w:t>
       </w:r>
     </w:p>
     <w:p>
@@ -8719,7 +8956,7 @@
           <w:szCs w:val="20"/>
           <w:rtl/>
         </w:rPr>
-        <w:t xml:space="preserve">ס׳ 5(א) לחוק המתנה, התשכ"ח-1968. במקרקעין כפופה ההתחייבות גם לס׳ 8 לחוק המקרקעין. ראו מרדכי אלפרדו ראבילו </w:t>
+        <w:t xml:space="preserve">ע"א 2110/09 </w:t>
       </w:r>
       <w:r>
         <w:rPr>
@@ -8730,16 +8967,16 @@
           <w:szCs w:val="20"/>
           <w:rtl/>
         </w:rPr>
-        <w:t xml:space="preserve">חוק המתנה, תשכ"ח-1968</w:t>
-      </w:r>
-      <w:r>
-        <w:rPr>
-          <w:rFonts w:ascii="David" w:cs="David" w:eastAsia="David" w:hAnsi="David"/>
-          <w:sz w:val="20"/>
-          <w:szCs w:val="20"/>
-          <w:rtl/>
-        </w:rPr>
-        <w:t xml:space="preserve"> 331–346 (פירוש לחוקי החוזים מיסודו של ג׳ טדסקי, מהדורה שנייה, תשנ"ז).</w:t>
+        <w:t xml:space="preserve">קדור נ׳ דקסה</w:t>
+      </w:r>
+      <w:r>
+        <w:rPr>
+          <w:rFonts w:ascii="David" w:cs="David" w:eastAsia="David" w:hAnsi="David"/>
+          <w:sz w:val="20"/>
+          <w:szCs w:val="20"/>
+          <w:rtl/>
+        </w:rPr>
+        <w:t xml:space="preserve">, פס׳ 13 לפסק דינו של הנשיא גרוניס (נבו 20.9.2012).</w:t>
       </w:r>
     </w:p>
   </w:footnote>
@@ -8762,25 +8999,67 @@
           <w:szCs w:val="20"/>
           <w:rtl/>
         </w:rPr>
-        <w:t xml:space="preserve">ס׳ 5(ב)–5(ג) לחוק המתנה; ראבילו, </w:t>
-      </w:r>
-      <w:r>
-        <w:rPr>
-          <w:rFonts w:ascii="David" w:cs="David" w:eastAsia="David" w:hAnsi="David"/>
-          <w:sz w:val="20"/>
-          <w:szCs w:val="20"/>
-          <w:rtl/>
-        </w:rPr>
-        <w:t xml:space="preserve">לעיל ה"ש 32</w:t>
-      </w:r>
-      <w:r>
-        <w:rPr>
-          <w:rFonts w:ascii="David" w:cs="David" w:eastAsia="David" w:hAnsi="David"/>
-          <w:sz w:val="20"/>
-          <w:szCs w:val="20"/>
-          <w:rtl/>
-        </w:rPr>
-        <w:t xml:space="preserve">, בעמ׳ 344 ואילך.</w:t>
+        <w:t xml:space="preserve">ע"א 749/18 </w:t>
+      </w:r>
+      <w:r>
+        <w:rPr>
+          <w:rFonts w:ascii="David" w:cs="David" w:eastAsia="David" w:hAnsi="David"/>
+          <w:i/>
+          <w:iCs/>
+          <w:sz w:val="20"/>
+          <w:szCs w:val="20"/>
+          <w:rtl/>
+        </w:rPr>
+        <w:t xml:space="preserve">עיזבון אבו ג׳נימה נ׳ עיזבון אבו ג׳נימה</w:t>
+      </w:r>
+      <w:r>
+        <w:rPr>
+          <w:rFonts w:ascii="David" w:cs="David" w:eastAsia="David" w:hAnsi="David"/>
+          <w:sz w:val="20"/>
+          <w:szCs w:val="20"/>
+          <w:rtl/>
+        </w:rPr>
+        <w:t xml:space="preserve"> (נבו 26.7.2020) (להלן: עניין </w:t>
+      </w:r>
+      <w:r>
+        <w:rPr>
+          <w:rFonts w:ascii="David" w:cs="David" w:eastAsia="David" w:hAnsi="David"/>
+          <w:i/>
+          <w:iCs/>
+          <w:sz w:val="20"/>
+          <w:szCs w:val="20"/>
+          <w:rtl/>
+        </w:rPr>
+        <w:t xml:space="preserve">אבו ג׳נימה</w:t>
+      </w:r>
+      <w:r>
+        <w:rPr>
+          <w:rFonts w:ascii="David" w:cs="David" w:eastAsia="David" w:hAnsi="David"/>
+          <w:sz w:val="20"/>
+          <w:szCs w:val="20"/>
+          <w:rtl/>
+        </w:rPr>
+        <w:t xml:space="preserve">); וראו גם ע"א 8234/09 </w:t>
+      </w:r>
+      <w:r>
+        <w:rPr>
+          <w:rFonts w:ascii="David" w:cs="David" w:eastAsia="David" w:hAnsi="David"/>
+          <w:i/>
+          <w:iCs/>
+          <w:sz w:val="20"/>
+          <w:szCs w:val="20"/>
+          <w:rtl/>
+        </w:rPr>
+        <w:t xml:space="preserve">שם טוב נ׳ פרץ</w:t>
+      </w:r>
+      <w:r>
+        <w:rPr>
+          <w:rFonts w:ascii="David" w:cs="David" w:eastAsia="David" w:hAnsi="David"/>
+          <w:sz w:val="20"/>
+          <w:szCs w:val="20"/>
+          <w:rtl/>
+        </w:rPr>
+        <w:t xml:space="preserve"> (נבו 21.3.2011).</w:t>
       </w:r>
     </w:p>
   </w:footnote>
@@ -8803,7 +9082,7 @@
           <w:szCs w:val="20"/>
           <w:rtl/>
         </w:rPr>
-        <w:t xml:space="preserve">עמ"ש (מחוזי מר׳) 52601-10-23 </w:t>
+        <w:t xml:space="preserve">ס׳ 5(א) לחוק המתנה, התשכ"ח-1968. במקרקעין כפופה ההתחייבות גם לס׳ 8 לחוק המקרקעין. ראו מרדכי אלפרדו ראבילו </w:t>
       </w:r>
       <w:r>
         <w:rPr>
@@ -8814,34 +9093,16 @@
           <w:szCs w:val="20"/>
           <w:rtl/>
         </w:rPr>
-        <w:t xml:space="preserve">א.א. נ׳ אר.א</w:t>
-      </w:r>
-      <w:r>
-        <w:rPr>
-          <w:rFonts w:ascii="David" w:cs="David" w:eastAsia="David" w:hAnsi="David"/>
-          <w:sz w:val="20"/>
-          <w:szCs w:val="20"/>
-          <w:rtl/>
-        </w:rPr>
-        <w:t xml:space="preserve"> (נבו 1.11.2024); ראבילו, </w:t>
-      </w:r>
-      <w:r>
-        <w:rPr>
-          <w:rFonts w:ascii="David" w:cs="David" w:eastAsia="David" w:hAnsi="David"/>
-          <w:sz w:val="20"/>
-          <w:szCs w:val="20"/>
-          <w:rtl/>
-        </w:rPr>
-        <w:t xml:space="preserve">לעיל ה"ש 32</w:t>
-      </w:r>
-      <w:r>
-        <w:rPr>
-          <w:rFonts w:ascii="David" w:cs="David" w:eastAsia="David" w:hAnsi="David"/>
-          <w:sz w:val="20"/>
-          <w:szCs w:val="20"/>
-          <w:rtl/>
-        </w:rPr>
-        <w:t xml:space="preserve">, בעמ׳ 345–346; והשוו גד טדסקי "הרשאה בלתי-הדירה לביצוע מתנה לאדם שלישי" משפטים יט 205 (תשמ"ט).</w:t>
+        <w:t xml:space="preserve">חוק המתנה, תשכ"ח-1968</w:t>
+      </w:r>
+      <w:r>
+        <w:rPr>
+          <w:rFonts w:ascii="David" w:cs="David" w:eastAsia="David" w:hAnsi="David"/>
+          <w:sz w:val="20"/>
+          <w:szCs w:val="20"/>
+          <w:rtl/>
+        </w:rPr>
+        <w:t xml:space="preserve"> 331–346 (פירוש לחוקי החוזים מיסודו של ג׳ טדסקי, מהדורה שנייה, תשנ"ז).</w:t>
       </w:r>
     </w:p>
   </w:footnote>
@@ -8864,7 +9125,48 @@
           <w:szCs w:val="20"/>
           <w:rtl/>
         </w:rPr>
-        <w:t xml:space="preserve">תמ"ש (משפחה ת"א) 18541-01-22 </w:t>
+        <w:t xml:space="preserve">ס׳ 5(ב)–5(ג) לחוק המתנה; ראבילו, </w:t>
+      </w:r>
+      <w:r>
+        <w:rPr>
+          <w:rFonts w:ascii="David" w:cs="David" w:eastAsia="David" w:hAnsi="David"/>
+          <w:sz w:val="20"/>
+          <w:szCs w:val="20"/>
+          <w:rtl/>
+        </w:rPr>
+        <w:t xml:space="preserve">לעיל ה"ש 34</w:t>
+      </w:r>
+      <w:r>
+        <w:rPr>
+          <w:rFonts w:ascii="David" w:cs="David" w:eastAsia="David" w:hAnsi="David"/>
+          <w:sz w:val="20"/>
+          <w:szCs w:val="20"/>
+          <w:rtl/>
+        </w:rPr>
+        <w:t xml:space="preserve">, בעמ׳ 344 ואילך.</w:t>
+      </w:r>
+    </w:p>
+  </w:footnote>
+  <w:footnote w:id="36">
+    <w:p>
+      <w:pPr>
+        <w:bidi/>
+        <w:spacing w:after="60"/>
+      </w:pPr>
+      <w:r>
+        <w:rPr>
+          <w:rStyle w:val="FootnoteReference"/>
+        </w:rPr>
+        <w:footnoteRef/>
+      </w:r>
+      <w:r>
+        <w:rPr>
+          <w:rFonts w:ascii="David" w:cs="David" w:eastAsia="David" w:hAnsi="David"/>
+          <w:sz w:val="20"/>
+          <w:szCs w:val="20"/>
+          <w:rtl/>
+        </w:rPr>
+        <w:t xml:space="preserve">עמ"ש (מחוזי מר׳) 52601-10-23 </w:t>
       </w:r>
       <w:r>
         <w:rPr>
@@ -8875,20 +9177,38 @@
           <w:szCs w:val="20"/>
           <w:rtl/>
         </w:rPr>
-        <w:t xml:space="preserve">פלונים נ׳ אלמונים</w:t>
-      </w:r>
-      <w:r>
-        <w:rPr>
-          <w:rFonts w:ascii="David" w:cs="David" w:eastAsia="David" w:hAnsi="David"/>
-          <w:sz w:val="20"/>
-          <w:szCs w:val="20"/>
-          <w:rtl/>
-        </w:rPr>
-        <w:t xml:space="preserve"> (נבו 15.1.2023).</w:t>
+        <w:t xml:space="preserve">א.א. נ׳ אר.א</w:t>
+      </w:r>
+      <w:r>
+        <w:rPr>
+          <w:rFonts w:ascii="David" w:cs="David" w:eastAsia="David" w:hAnsi="David"/>
+          <w:sz w:val="20"/>
+          <w:szCs w:val="20"/>
+          <w:rtl/>
+        </w:rPr>
+        <w:t xml:space="preserve"> (נבו 1.11.2024); ראבילו, </w:t>
+      </w:r>
+      <w:r>
+        <w:rPr>
+          <w:rFonts w:ascii="David" w:cs="David" w:eastAsia="David" w:hAnsi="David"/>
+          <w:sz w:val="20"/>
+          <w:szCs w:val="20"/>
+          <w:rtl/>
+        </w:rPr>
+        <w:t xml:space="preserve">לעיל ה"ש 34</w:t>
+      </w:r>
+      <w:r>
+        <w:rPr>
+          <w:rFonts w:ascii="David" w:cs="David" w:eastAsia="David" w:hAnsi="David"/>
+          <w:sz w:val="20"/>
+          <w:szCs w:val="20"/>
+          <w:rtl/>
+        </w:rPr>
+        <w:t xml:space="preserve">, בעמ׳ 345–346; והשוו גד טדסקי "הרשאה בלתי-הדירה לביצוע מתנה לאדם שלישי" משפטים יט 205 (תשמ"ט).</w:t>
       </w:r>
     </w:p>
   </w:footnote>
-  <w:footnote w:id="36">
+  <w:footnote w:id="37">
     <w:p>
       <w:pPr>
         <w:bidi/>
@@ -8907,7 +9227,7 @@
           <w:szCs w:val="20"/>
           <w:rtl/>
         </w:rPr>
-        <w:t xml:space="preserve">ע"א 6588/12 </w:t>
+        <w:t xml:space="preserve">תמ"ש (משפחה ת"א) 18541-01-22 </w:t>
       </w:r>
       <w:r>
         <w:rPr>
@@ -8918,57 +9238,16 @@
           <w:szCs w:val="20"/>
           <w:rtl/>
         </w:rPr>
-        <w:t xml:space="preserve">כבהה נ׳ כבהה</w:t>
-      </w:r>
-      <w:r>
-        <w:rPr>
-          <w:rFonts w:ascii="David" w:cs="David" w:eastAsia="David" w:hAnsi="David"/>
-          <w:sz w:val="20"/>
-          <w:szCs w:val="20"/>
-          <w:rtl/>
-        </w:rPr>
-        <w:t xml:space="preserve"> (נבו 24.12.2014).</w:t>
-      </w:r>
-    </w:p>
-  </w:footnote>
-  <w:footnote w:id="37">
-    <w:p>
-      <w:pPr>
-        <w:bidi/>
-        <w:spacing w:after="60"/>
-      </w:pPr>
-      <w:r>
-        <w:rPr>
-          <w:rStyle w:val="FootnoteReference"/>
-        </w:rPr>
-        <w:footnoteRef/>
-      </w:r>
-      <w:r>
-        <w:rPr>
-          <w:rFonts w:ascii="David" w:cs="David" w:eastAsia="David" w:hAnsi="David"/>
-          <w:sz w:val="20"/>
-          <w:szCs w:val="20"/>
-          <w:rtl/>
-        </w:rPr>
-        <w:t xml:space="preserve">ראבילו, </w:t>
-      </w:r>
-      <w:r>
-        <w:rPr>
-          <w:rFonts w:ascii="David" w:cs="David" w:eastAsia="David" w:hAnsi="David"/>
-          <w:sz w:val="20"/>
-          <w:szCs w:val="20"/>
-          <w:rtl/>
-        </w:rPr>
-        <w:t xml:space="preserve">לעיל ה"ש 32</w:t>
-      </w:r>
-      <w:r>
-        <w:rPr>
-          <w:rFonts w:ascii="David" w:cs="David" w:eastAsia="David" w:hAnsi="David"/>
-          <w:sz w:val="20"/>
-          <w:szCs w:val="20"/>
-          <w:rtl/>
-        </w:rPr>
-        <w:t xml:space="preserve">, בעמ׳ 333–337; להשלמת מתנה בקבלת החזקה ראו גם להלן פרק ו.3 לעניין דרישת הקַבְּץ׳ (התפיסה) במשפט השרעי.</w:t>
+        <w:t xml:space="preserve">פלונים נ׳ אלמונים</w:t>
+      </w:r>
+      <w:r>
+        <w:rPr>
+          <w:rFonts w:ascii="David" w:cs="David" w:eastAsia="David" w:hAnsi="David"/>
+          <w:sz w:val="20"/>
+          <w:szCs w:val="20"/>
+          <w:rtl/>
+        </w:rPr>
+        <w:t xml:space="preserve"> (נבו 15.1.2023).</w:t>
       </w:r>
     </w:p>
   </w:footnote>
@@ -8991,7 +9270,47 @@
           <w:szCs w:val="20"/>
           <w:rtl/>
         </w:rPr>
-        <w:t xml:space="preserve">נינה זלצמן "רישיון במקרקעין" הפרקליט מב 24 (תשנ"ה).</w:t>
+        <w:t xml:space="preserve">ע"א 6588/12 </w:t>
+      </w:r>
+      <w:r>
+        <w:rPr>
+          <w:rFonts w:ascii="David" w:cs="David" w:eastAsia="David" w:hAnsi="David"/>
+          <w:i/>
+          <w:iCs/>
+          <w:sz w:val="20"/>
+          <w:szCs w:val="20"/>
+          <w:rtl/>
+        </w:rPr>
+        <w:t xml:space="preserve">כבהה נ׳ כבהה</w:t>
+      </w:r>
+      <w:r>
+        <w:rPr>
+          <w:rFonts w:ascii="David" w:cs="David" w:eastAsia="David" w:hAnsi="David"/>
+          <w:sz w:val="20"/>
+          <w:szCs w:val="20"/>
+          <w:rtl/>
+        </w:rPr>
+        <w:t xml:space="preserve"> (נבו 24.12.2014) (להלן: עניין </w:t>
+      </w:r>
+      <w:r>
+        <w:rPr>
+          <w:rFonts w:ascii="David" w:cs="David" w:eastAsia="David" w:hAnsi="David"/>
+          <w:i/>
+          <w:iCs/>
+          <w:sz w:val="20"/>
+          <w:szCs w:val="20"/>
+          <w:rtl/>
+        </w:rPr>
+        <w:t xml:space="preserve">כבהה</w:t>
+      </w:r>
+      <w:r>
+        <w:rPr>
+          <w:rFonts w:ascii="David" w:cs="David" w:eastAsia="David" w:hAnsi="David"/>
+          <w:sz w:val="20"/>
+          <w:szCs w:val="20"/>
+          <w:rtl/>
+        </w:rPr>
+        <w:t xml:space="preserve">). לעיקרון האנגלי שביסוד ההבחנה – "היושר לא יסייע למתנדב" – ראו להלן פרק ו.1.4.</w:t>
       </w:r>
     </w:p>
   </w:footnote>
@@ -9014,6 +9333,70 @@
           <w:szCs w:val="20"/>
           <w:rtl/>
         </w:rPr>
+        <w:t xml:space="preserve">ראבילו, </w:t>
+      </w:r>
+      <w:r>
+        <w:rPr>
+          <w:rFonts w:ascii="David" w:cs="David" w:eastAsia="David" w:hAnsi="David"/>
+          <w:sz w:val="20"/>
+          <w:szCs w:val="20"/>
+          <w:rtl/>
+        </w:rPr>
+        <w:t xml:space="preserve">לעיל ה"ש 34</w:t>
+      </w:r>
+      <w:r>
+        <w:rPr>
+          <w:rFonts w:ascii="David" w:cs="David" w:eastAsia="David" w:hAnsi="David"/>
+          <w:sz w:val="20"/>
+          <w:szCs w:val="20"/>
+          <w:rtl/>
+        </w:rPr>
+        <w:t xml:space="preserve">, בעמ׳ 333–337; להשלמת מתנה בקבלת החזקה ראו גם להלן פרק ו.3 לעניין דרישת הקַבְּץ׳ (התפיסה) במשפט השרעי.</w:t>
+      </w:r>
+    </w:p>
+  </w:footnote>
+  <w:footnote w:id="40">
+    <w:p>
+      <w:pPr>
+        <w:bidi/>
+        <w:spacing w:after="60"/>
+      </w:pPr>
+      <w:r>
+        <w:rPr>
+          <w:rStyle w:val="FootnoteReference"/>
+        </w:rPr>
+        <w:footnoteRef/>
+      </w:r>
+      <w:r>
+        <w:rPr>
+          <w:rFonts w:ascii="David" w:cs="David" w:eastAsia="David" w:hAnsi="David"/>
+          <w:sz w:val="20"/>
+          <w:szCs w:val="20"/>
+          <w:rtl/>
+        </w:rPr>
+        <w:t xml:space="preserve">נינה זלצמן "רישיון במקרקעין" הפרקליט מב 24 (תשנ"ה).</w:t>
+      </w:r>
+    </w:p>
+  </w:footnote>
+  <w:footnote w:id="41">
+    <w:p>
+      <w:pPr>
+        <w:bidi/>
+        <w:spacing w:after="60"/>
+      </w:pPr>
+      <w:r>
+        <w:rPr>
+          <w:rStyle w:val="FootnoteReference"/>
+        </w:rPr>
+        <w:footnoteRef/>
+      </w:r>
+      <w:r>
+        <w:rPr>
+          <w:rFonts w:ascii="David" w:cs="David" w:eastAsia="David" w:hAnsi="David"/>
+          <w:sz w:val="20"/>
+          <w:szCs w:val="20"/>
+          <w:rtl/>
+        </w:rPr>
         <w:t xml:space="preserve">ע"א 463/79 </w:t>
       </w:r>
       <w:r>
@@ -9058,7 +9441,7 @@
       </w:r>
     </w:p>
   </w:footnote>
-  <w:footnote w:id="40">
+  <w:footnote w:id="42">
     <w:p>
       <w:pPr>
         <w:bidi/>
@@ -9121,7 +9504,7 @@
       </w:r>
     </w:p>
   </w:footnote>
-  <w:footnote w:id="41">
+  <w:footnote w:id="43">
     <w:p>
       <w:pPr>
         <w:bidi/>
@@ -9184,7 +9567,7 @@
       </w:r>
     </w:p>
   </w:footnote>
-  <w:footnote w:id="42">
+  <w:footnote w:id="44">
     <w:p>
       <w:pPr>
         <w:bidi/>
@@ -9212,7 +9595,7 @@
           <w:szCs w:val="20"/>
           <w:rtl/>
         </w:rPr>
-        <w:t xml:space="preserve">לעיל ה"ש 41</w:t>
+        <w:t xml:space="preserve">לעיל ה"ש 43</w:t>
       </w:r>
       <w:r>
         <w:rPr>
@@ -9230,7 +9613,7 @@
           <w:szCs w:val="20"/>
           <w:rtl/>
         </w:rPr>
-        <w:t xml:space="preserve">לעיל ה"ש 38</w:t>
+        <w:t xml:space="preserve">לעיל ה"ש 40</w:t>
       </w:r>
       <w:r>
         <w:rPr>
@@ -9243,7 +9626,7 @@
       </w:r>
     </w:p>
   </w:footnote>
-  <w:footnote w:id="43">
+  <w:footnote w:id="45">
     <w:p>
       <w:pPr>
         <w:bidi/>
@@ -9262,7 +9645,7 @@
           <w:szCs w:val="20"/>
           <w:rtl/>
         </w:rPr>
-        <w:t xml:space="preserve">ע"א 749/18 </w:t>
+        <w:t xml:space="preserve">עניין </w:t>
       </w:r>
       <w:r>
         <w:rPr>
@@ -9273,20 +9656,38 @@
           <w:szCs w:val="20"/>
           <w:rtl/>
         </w:rPr>
-        <w:t xml:space="preserve">עיזבון אבו ג׳נימה נ׳ עיזבון אבו ג׳נימה</w:t>
-      </w:r>
-      <w:r>
-        <w:rPr>
-          <w:rFonts w:ascii="David" w:cs="David" w:eastAsia="David" w:hAnsi="David"/>
-          <w:sz w:val="20"/>
-          <w:szCs w:val="20"/>
-          <w:rtl/>
-        </w:rPr>
-        <w:t xml:space="preserve"> (נבו 26.7.2020).</w:t>
+        <w:t xml:space="preserve">אבו ג׳נימה</w:t>
+      </w:r>
+      <w:r>
+        <w:rPr>
+          <w:rFonts w:ascii="David" w:cs="David" w:eastAsia="David" w:hAnsi="David"/>
+          <w:sz w:val="20"/>
+          <w:szCs w:val="20"/>
+          <w:rtl/>
+        </w:rPr>
+        <w:t xml:space="preserve">, </w:t>
+      </w:r>
+      <w:r>
+        <w:rPr>
+          <w:rFonts w:ascii="David" w:cs="David" w:eastAsia="David" w:hAnsi="David"/>
+          <w:sz w:val="20"/>
+          <w:szCs w:val="20"/>
+          <w:rtl/>
+        </w:rPr>
+        <w:t xml:space="preserve">לעיל ה"ש 33</w:t>
+      </w:r>
+      <w:r>
+        <w:rPr>
+          <w:rFonts w:ascii="David" w:cs="David" w:eastAsia="David" w:hAnsi="David"/>
+          <w:sz w:val="20"/>
+          <w:szCs w:val="20"/>
+          <w:rtl/>
+        </w:rPr>
+        <w:t xml:space="preserve">.</w:t>
       </w:r>
     </w:p>
   </w:footnote>
-  <w:footnote w:id="44">
+  <w:footnote w:id="46">
     <w:p>
       <w:pPr>
         <w:bidi/>
@@ -9369,7 +9770,7 @@
       </w:r>
     </w:p>
   </w:footnote>
-  <w:footnote w:id="45">
+  <w:footnote w:id="47">
     <w:p>
       <w:pPr>
         <w:bidi/>
@@ -9417,7 +9818,7 @@
           <w:szCs w:val="20"/>
           <w:rtl/>
         </w:rPr>
-        <w:t xml:space="preserve">לעיל ה"ש 44</w:t>
+        <w:t xml:space="preserve">לעיל ה"ש 46</w:t>
       </w:r>
       <w:r>
         <w:rPr>
@@ -9430,7 +9831,7 @@
       </w:r>
     </w:p>
   </w:footnote>
-  <w:footnote w:id="46">
+  <w:footnote w:id="48">
     <w:p>
       <w:pPr>
         <w:bidi/>
@@ -9531,7 +9932,7 @@
       </w:r>
     </w:p>
   </w:footnote>
-  <w:footnote w:id="47">
+  <w:footnote w:id="49">
     <w:p>
       <w:pPr>
         <w:bidi/>
@@ -9574,7 +9975,7 @@
       </w:r>
     </w:p>
   </w:footnote>
-  <w:footnote w:id="48">
+  <w:footnote w:id="50">
     <w:p>
       <w:pPr>
         <w:bidi/>
@@ -9617,7 +10018,7 @@
       </w:r>
     </w:p>
   </w:footnote>
-  <w:footnote w:id="49">
+  <w:footnote w:id="51">
     <w:p>
       <w:pPr>
         <w:bidi/>
@@ -9660,7 +10061,7 @@
       </w:r>
     </w:p>
   </w:footnote>
-  <w:footnote w:id="50">
+  <w:footnote w:id="52">
     <w:p>
       <w:pPr>
         <w:bidi/>
@@ -9699,89 +10100,7 @@
           <w:szCs w:val="20"/>
           <w:rtl/>
         </w:rPr>
-        <w:t xml:space="preserve"> (נבו 31.12.2015).</w:t>
-      </w:r>
-    </w:p>
-  </w:footnote>
-  <w:footnote w:id="51">
-    <w:p>
-      <w:pPr>
-        <w:bidi/>
-        <w:spacing w:after="60"/>
-      </w:pPr>
-      <w:r>
-        <w:rPr>
-          <w:rStyle w:val="FootnoteReference"/>
-        </w:rPr>
-        <w:footnoteRef/>
-      </w:r>
-      <w:r>
-        <w:rPr>
-          <w:rFonts w:ascii="David" w:cs="David" w:eastAsia="David" w:hAnsi="David"/>
-          <w:sz w:val="20"/>
-          <w:szCs w:val="20"/>
-          <w:rtl/>
-        </w:rPr>
-        <w:t xml:space="preserve">לביקורת עקרונית על אי-הוודאות הנובעת משסתומי יושר ותום לב בדיני הקניין השוו רייכמן, </w:t>
-      </w:r>
-      <w:r>
-        <w:rPr>
-          <w:rFonts w:ascii="David" w:cs="David" w:eastAsia="David" w:hAnsi="David"/>
-          <w:sz w:val="20"/>
-          <w:szCs w:val="20"/>
-          <w:rtl/>
-        </w:rPr>
-        <w:t xml:space="preserve">לעיל ה"ש 9</w:t>
-      </w:r>
-      <w:r>
-        <w:rPr>
-          <w:rFonts w:ascii="David" w:cs="David" w:eastAsia="David" w:hAnsi="David"/>
-          <w:sz w:val="20"/>
-          <w:szCs w:val="20"/>
-          <w:rtl/>
-        </w:rPr>
-        <w:t xml:space="preserve">, בעמ׳ 297 ואילך; וכהן, </w:t>
-      </w:r>
-      <w:r>
-        <w:rPr>
-          <w:rFonts w:ascii="David" w:cs="David" w:eastAsia="David" w:hAnsi="David"/>
-          <w:sz w:val="20"/>
-          <w:szCs w:val="20"/>
-          <w:rtl/>
-        </w:rPr>
-        <w:t xml:space="preserve">לעיל ה"ש 31</w:t>
-      </w:r>
-      <w:r>
-        <w:rPr>
-          <w:rFonts w:ascii="David" w:cs="David" w:eastAsia="David" w:hAnsi="David"/>
-          <w:sz w:val="20"/>
-          <w:szCs w:val="20"/>
-          <w:rtl/>
-        </w:rPr>
-        <w:t xml:space="preserve">.</w:t>
-      </w:r>
-    </w:p>
-  </w:footnote>
-  <w:footnote w:id="52">
-    <w:p>
-      <w:pPr>
-        <w:bidi/>
-        <w:spacing w:after="60"/>
-      </w:pPr>
-      <w:r>
-        <w:rPr>
-          <w:rStyle w:val="FootnoteReference"/>
-        </w:rPr>
-        <w:footnoteRef/>
-      </w:r>
-      <w:r>
-        <w:rPr>
-          <w:rFonts w:ascii="David" w:cs="David" w:eastAsia="David" w:hAnsi="David"/>
-          <w:sz w:val="20"/>
-          <w:szCs w:val="20"/>
-          <w:rtl/>
-        </w:rPr>
-        <w:t xml:space="preserve">תק׳ 36–38 לתקנות התכנון והבניה (רישוי בניה), התשע"ו-2016; וקודם לכן תק׳ 2א לתקנות התכנון והבניה (בקשה להיתר, תנאיו ואגרות), התש"ל-1970. ההלכה חזרה והדגישה כי מוסדות התכנון אינם מכריעים בסכסוכי קניין.</w:t>
+        <w:t xml:space="preserve"> (נבו 31.12.2015). שם הובהר עוד כי במקרקעין שאינם מוסדרים לא ניתן לרשום זכויות קנייניות עד תום ההסדר, וכי תביעות לרישום זכויות במקרקעין המצויים בהליכי הסדר מתרכזות בידי פקיד ההסדר; וכי המחאת זכות חוזית הנוגעת למקרקעין אף אינה טעונה מסמך בכתב.</w:t>
       </w:r>
     </w:p>
   </w:footnote>
@@ -9804,6 +10123,129 @@
           <w:szCs w:val="20"/>
           <w:rtl/>
         </w:rPr>
+        <w:t xml:space="preserve">בע"מ 7496/19, </w:t>
+      </w:r>
+      <w:r>
+        <w:rPr>
+          <w:rFonts w:ascii="David" w:cs="David" w:eastAsia="David" w:hAnsi="David"/>
+          <w:sz w:val="20"/>
+          <w:szCs w:val="20"/>
+          <w:rtl/>
+        </w:rPr>
+        <w:t xml:space="preserve">לעיל ה"ש 46</w:t>
+      </w:r>
+      <w:r>
+        <w:rPr>
+          <w:rFonts w:ascii="David" w:cs="David" w:eastAsia="David" w:hAnsi="David"/>
+          <w:sz w:val="20"/>
+          <w:szCs w:val="20"/>
+          <w:rtl/>
+        </w:rPr>
+        <w:t xml:space="preserve">.</w:t>
+      </w:r>
+    </w:p>
+  </w:footnote>
+  <w:footnote w:id="54">
+    <w:p>
+      <w:pPr>
+        <w:bidi/>
+        <w:spacing w:after="60"/>
+      </w:pPr>
+      <w:r>
+        <w:rPr>
+          <w:rStyle w:val="FootnoteReference"/>
+        </w:rPr>
+        <w:footnoteRef/>
+      </w:r>
+      <w:r>
+        <w:rPr>
+          <w:rFonts w:ascii="David" w:cs="David" w:eastAsia="David" w:hAnsi="David"/>
+          <w:sz w:val="20"/>
+          <w:szCs w:val="20"/>
+          <w:rtl/>
+        </w:rPr>
+        <w:t xml:space="preserve">לביקורת עקרונית על אי-הוודאות הנובעת משסתומי יושר ותום לב בדיני הקניין השוו רייכמן, </w:t>
+      </w:r>
+      <w:r>
+        <w:rPr>
+          <w:rFonts w:ascii="David" w:cs="David" w:eastAsia="David" w:hAnsi="David"/>
+          <w:sz w:val="20"/>
+          <w:szCs w:val="20"/>
+          <w:rtl/>
+        </w:rPr>
+        <w:t xml:space="preserve">לעיל ה"ש 9</w:t>
+      </w:r>
+      <w:r>
+        <w:rPr>
+          <w:rFonts w:ascii="David" w:cs="David" w:eastAsia="David" w:hAnsi="David"/>
+          <w:sz w:val="20"/>
+          <w:szCs w:val="20"/>
+          <w:rtl/>
+        </w:rPr>
+        <w:t xml:space="preserve">, בעמ׳ 297 ואילך; וכהן, </w:t>
+      </w:r>
+      <w:r>
+        <w:rPr>
+          <w:rFonts w:ascii="David" w:cs="David" w:eastAsia="David" w:hAnsi="David"/>
+          <w:sz w:val="20"/>
+          <w:szCs w:val="20"/>
+          <w:rtl/>
+        </w:rPr>
+        <w:t xml:space="preserve">לעיל ה"ש 31</w:t>
+      </w:r>
+      <w:r>
+        <w:rPr>
+          <w:rFonts w:ascii="David" w:cs="David" w:eastAsia="David" w:hAnsi="David"/>
+          <w:sz w:val="20"/>
+          <w:szCs w:val="20"/>
+          <w:rtl/>
+        </w:rPr>
+        <w:t xml:space="preserve">.</w:t>
+      </w:r>
+    </w:p>
+  </w:footnote>
+  <w:footnote w:id="55">
+    <w:p>
+      <w:pPr>
+        <w:bidi/>
+        <w:spacing w:after="60"/>
+      </w:pPr>
+      <w:r>
+        <w:rPr>
+          <w:rStyle w:val="FootnoteReference"/>
+        </w:rPr>
+        <w:footnoteRef/>
+      </w:r>
+      <w:r>
+        <w:rPr>
+          <w:rFonts w:ascii="David" w:cs="David" w:eastAsia="David" w:hAnsi="David"/>
+          <w:sz w:val="20"/>
+          <w:szCs w:val="20"/>
+          <w:rtl/>
+        </w:rPr>
+        <w:t xml:space="preserve">תק׳ 36–38 לתקנות התכנון והבניה (רישוי בניה), התשע"ו-2016; וקודם לכן תק׳ 2א לתקנות התכנון והבניה (בקשה להיתר, תנאיו ואגרות), התש"ל-1970. ההלכה חזרה והדגישה כי מוסדות התכנון אינם מכריעים בסכסוכי קניין.</w:t>
+      </w:r>
+    </w:p>
+  </w:footnote>
+  <w:footnote w:id="56">
+    <w:p>
+      <w:pPr>
+        <w:bidi/>
+        <w:spacing w:after="60"/>
+      </w:pPr>
+      <w:r>
+        <w:rPr>
+          <w:rStyle w:val="FootnoteReference"/>
+        </w:rPr>
+        <w:footnoteRef/>
+      </w:r>
+      <w:r>
+        <w:rPr>
+          <w:rFonts w:ascii="David" w:cs="David" w:eastAsia="David" w:hAnsi="David"/>
+          <w:sz w:val="20"/>
+          <w:szCs w:val="20"/>
+          <w:rtl/>
+        </w:rPr>
         <w:t xml:space="preserve">ראו פסיקת ערכאות המשפחה שנסקרה לעיל, </w:t>
       </w:r>
       <w:r>
@@ -9813,7 +10255,7 @@
           <w:szCs w:val="20"/>
           <w:rtl/>
         </w:rPr>
-        <w:t xml:space="preserve">לעיל ה"ש 46</w:t>
+        <w:t xml:space="preserve">לעיל ה"ש 48</w:t>
       </w:r>
       <w:r>
         <w:rPr>
@@ -9851,7 +10293,7 @@
           <w:szCs w:val="20"/>
           <w:rtl/>
         </w:rPr>
-        <w:t xml:space="preserve">לעיל ה"ש 39</w:t>
+        <w:t xml:space="preserve">לעיל ה"ש 41</w:t>
       </w:r>
       <w:r>
         <w:rPr>
@@ -9864,7 +10306,7 @@
       </w:r>
     </w:p>
   </w:footnote>
-  <w:footnote w:id="54">
+  <w:footnote w:id="57">
     <w:p>
       <w:pPr>
         <w:bidi/>
@@ -9883,30 +10325,7 @@
           <w:szCs w:val="20"/>
           <w:rtl/>
         </w:rPr>
-        <w:t xml:space="preserve">ס׳ 269 ו-326 לפקודת העיריות [נוסח חדש]. שוכר, בר-רשות ואף פולש עשויים להירשם כמחזיקים לצורכי ארנונה.</w:t>
-      </w:r>
-    </w:p>
-  </w:footnote>
-  <w:footnote w:id="55">
-    <w:p>
-      <w:pPr>
-        <w:bidi/>
-        <w:spacing w:after="60"/>
-      </w:pPr>
-      <w:r>
-        <w:rPr>
-          <w:rStyle w:val="FootnoteReference"/>
-        </w:rPr>
-        <w:footnoteRef/>
-      </w:r>
-      <w:r>
-        <w:rPr>
-          <w:rFonts w:ascii="David" w:cs="David" w:eastAsia="David" w:hAnsi="David"/>
-          <w:sz w:val="20"/>
-          <w:szCs w:val="20"/>
-          <w:rtl/>
-        </w:rPr>
-        <w:t xml:space="preserve">ראו עניין </w:t>
+        <w:t xml:space="preserve">עניין </w:t>
       </w:r>
       <w:r>
         <w:rPr>
@@ -9917,7 +10336,7 @@
           <w:szCs w:val="20"/>
           <w:rtl/>
         </w:rPr>
-        <w:t xml:space="preserve">נאטור</w:t>
+        <w:t xml:space="preserve">אבו ג׳נימה</w:t>
       </w:r>
       <w:r>
         <w:rPr>
@@ -9935,16 +10354,62 @@
           <w:szCs w:val="20"/>
           <w:rtl/>
         </w:rPr>
-        <w:t xml:space="preserve">לעיל ה"ש 24</w:t>
-      </w:r>
-      <w:r>
-        <w:rPr>
-          <w:rFonts w:ascii="David" w:cs="David" w:eastAsia="David" w:hAnsi="David"/>
-          <w:sz w:val="20"/>
-          <w:szCs w:val="20"/>
-          <w:rtl/>
-        </w:rPr>
-        <w:t xml:space="preserve">; עניין </w:t>
+        <w:t xml:space="preserve">לעיל ה"ש 33</w:t>
+      </w:r>
+      <w:r>
+        <w:rPr>
+          <w:rFonts w:ascii="David" w:cs="David" w:eastAsia="David" w:hAnsi="David"/>
+          <w:sz w:val="20"/>
+          <w:szCs w:val="20"/>
+          <w:rtl/>
+        </w:rPr>
+        <w:t xml:space="preserve">.</w:t>
+      </w:r>
+    </w:p>
+  </w:footnote>
+  <w:footnote w:id="58">
+    <w:p>
+      <w:pPr>
+        <w:bidi/>
+        <w:spacing w:after="60"/>
+      </w:pPr>
+      <w:r>
+        <w:rPr>
+          <w:rStyle w:val="FootnoteReference"/>
+        </w:rPr>
+        <w:footnoteRef/>
+      </w:r>
+      <w:r>
+        <w:rPr>
+          <w:rFonts w:ascii="David" w:cs="David" w:eastAsia="David" w:hAnsi="David"/>
+          <w:sz w:val="20"/>
+          <w:szCs w:val="20"/>
+          <w:rtl/>
+        </w:rPr>
+        <w:t xml:space="preserve">ס׳ 269 ו-326 לפקודת העיריות [נוסח חדש]. שוכר, בר-רשות ואף פולש עשויים להירשם כמחזיקים לצורכי ארנונה.</w:t>
+      </w:r>
+    </w:p>
+  </w:footnote>
+  <w:footnote w:id="59">
+    <w:p>
+      <w:pPr>
+        <w:bidi/>
+        <w:spacing w:after="60"/>
+      </w:pPr>
+      <w:r>
+        <w:rPr>
+          <w:rStyle w:val="FootnoteReference"/>
+        </w:rPr>
+        <w:footnoteRef/>
+      </w:r>
+      <w:r>
+        <w:rPr>
+          <w:rFonts w:ascii="David" w:cs="David" w:eastAsia="David" w:hAnsi="David"/>
+          <w:sz w:val="20"/>
+          <w:szCs w:val="20"/>
+          <w:rtl/>
+        </w:rPr>
+        <w:t xml:space="preserve">ראו עניין </w:t>
       </w:r>
       <w:r>
         <w:rPr>
@@ -9955,7 +10420,7 @@
           <w:szCs w:val="20"/>
           <w:rtl/>
         </w:rPr>
-        <w:t xml:space="preserve">אבו ליל</w:t>
+        <w:t xml:space="preserve">נאטור</w:t>
       </w:r>
       <w:r>
         <w:rPr>
@@ -9973,39 +10438,16 @@
           <w:szCs w:val="20"/>
           <w:rtl/>
         </w:rPr>
-        <w:t xml:space="preserve">לעיל ה"ש 27</w:t>
-      </w:r>
-      <w:r>
-        <w:rPr>
-          <w:rFonts w:ascii="David" w:cs="David" w:eastAsia="David" w:hAnsi="David"/>
-          <w:sz w:val="20"/>
-          <w:szCs w:val="20"/>
-          <w:rtl/>
-        </w:rPr>
-        <w:t xml:space="preserve">.</w:t>
-      </w:r>
-    </w:p>
-  </w:footnote>
-  <w:footnote w:id="56">
-    <w:p>
-      <w:pPr>
-        <w:bidi/>
-        <w:spacing w:after="60"/>
-      </w:pPr>
-      <w:r>
-        <w:rPr>
-          <w:rStyle w:val="FootnoteReference"/>
-        </w:rPr>
-        <w:footnoteRef/>
-      </w:r>
-      <w:r>
-        <w:rPr>
-          <w:rFonts w:ascii="David" w:cs="David" w:eastAsia="David" w:hAnsi="David"/>
-          <w:sz w:val="20"/>
-          <w:szCs w:val="20"/>
-          <w:rtl/>
-        </w:rPr>
-        <w:t xml:space="preserve">ס׳ 54(4) לפקודת הראיות [נוסח חדש], התשל"א-1971. ליישום מובהק ראו ע"א 4116/20 </w:t>
+        <w:t xml:space="preserve">לעיל ה"ש 24</w:t>
+      </w:r>
+      <w:r>
+        <w:rPr>
+          <w:rFonts w:ascii="David" w:cs="David" w:eastAsia="David" w:hAnsi="David"/>
+          <w:sz w:val="20"/>
+          <w:szCs w:val="20"/>
+          <w:rtl/>
+        </w:rPr>
+        <w:t xml:space="preserve">; עניין </w:t>
       </w:r>
       <w:r>
         <w:rPr>
@@ -10016,6 +10458,67 @@
           <w:szCs w:val="20"/>
           <w:rtl/>
         </w:rPr>
+        <w:t xml:space="preserve">אבו ליל</w:t>
+      </w:r>
+      <w:r>
+        <w:rPr>
+          <w:rFonts w:ascii="David" w:cs="David" w:eastAsia="David" w:hAnsi="David"/>
+          <w:sz w:val="20"/>
+          <w:szCs w:val="20"/>
+          <w:rtl/>
+        </w:rPr>
+        <w:t xml:space="preserve">, </w:t>
+      </w:r>
+      <w:r>
+        <w:rPr>
+          <w:rFonts w:ascii="David" w:cs="David" w:eastAsia="David" w:hAnsi="David"/>
+          <w:sz w:val="20"/>
+          <w:szCs w:val="20"/>
+          <w:rtl/>
+        </w:rPr>
+        <w:t xml:space="preserve">לעיל ה"ש 27</w:t>
+      </w:r>
+      <w:r>
+        <w:rPr>
+          <w:rFonts w:ascii="David" w:cs="David" w:eastAsia="David" w:hAnsi="David"/>
+          <w:sz w:val="20"/>
+          <w:szCs w:val="20"/>
+          <w:rtl/>
+        </w:rPr>
+        <w:t xml:space="preserve">.</w:t>
+      </w:r>
+    </w:p>
+  </w:footnote>
+  <w:footnote w:id="60">
+    <w:p>
+      <w:pPr>
+        <w:bidi/>
+        <w:spacing w:after="60"/>
+      </w:pPr>
+      <w:r>
+        <w:rPr>
+          <w:rStyle w:val="FootnoteReference"/>
+        </w:rPr>
+        <w:footnoteRef/>
+      </w:r>
+      <w:r>
+        <w:rPr>
+          <w:rFonts w:ascii="David" w:cs="David" w:eastAsia="David" w:hAnsi="David"/>
+          <w:sz w:val="20"/>
+          <w:szCs w:val="20"/>
+          <w:rtl/>
+        </w:rPr>
+        <w:t xml:space="preserve">ס׳ 54(4) לפקודת הראיות [נוסח חדש], התשל"א-1971. ליישום מובהק ראו ע"א 4116/20 </w:t>
+      </w:r>
+      <w:r>
+        <w:rPr>
+          <w:rFonts w:ascii="David" w:cs="David" w:eastAsia="David" w:hAnsi="David"/>
+          <w:i/>
+          <w:iCs/>
+          <w:sz w:val="20"/>
+          <w:szCs w:val="20"/>
+          <w:rtl/>
+        </w:rPr>
         <w:t xml:space="preserve">הוך נ׳ בריכטא</w:t>
       </w:r>
       <w:r>
@@ -10029,7 +10532,7 @@
       </w:r>
     </w:p>
   </w:footnote>
-  <w:footnote w:id="57">
+  <w:footnote w:id="61">
     <w:p>
       <w:pPr>
         <w:bidi/>
@@ -10082,7 +10585,7 @@
       </w:r>
     </w:p>
   </w:footnote>
-  <w:footnote w:id="58">
+  <w:footnote w:id="62">
     <w:p>
       <w:pPr>
         <w:bidi/>
@@ -10125,7 +10628,7 @@
       </w:r>
     </w:p>
   </w:footnote>
-  <w:footnote w:id="59">
+  <w:footnote w:id="63">
     <w:p>
       <w:pPr>
         <w:bidi/>
@@ -10153,7 +10656,7 @@
           <w:szCs w:val="20"/>
           <w:rtl/>
         </w:rPr>
-        <w:t xml:space="preserve">לעיל ה"ש 58</w:t>
+        <w:t xml:space="preserve">לעיל ה"ש 62</w:t>
       </w:r>
       <w:r>
         <w:rPr>
@@ -10163,116 +10666,6 @@
           <w:rtl/>
         </w:rPr>
         <w:t xml:space="preserve">, בעמ׳ 282.</w:t>
-      </w:r>
-    </w:p>
-  </w:footnote>
-  <w:footnote w:id="60">
-    <w:p>
-      <w:pPr>
-        <w:bidi/>
-        <w:spacing w:after="60"/>
-      </w:pPr>
-      <w:r>
-        <w:rPr>
-          <w:rStyle w:val="FootnoteReference"/>
-        </w:rPr>
-        <w:footnoteRef/>
-      </w:r>
-      <w:r>
-        <w:rPr>
-          <w:rFonts w:ascii="David" w:cs="David" w:eastAsia="David" w:hAnsi="David"/>
-          <w:sz w:val="20"/>
-          <w:szCs w:val="20"/>
-          <w:rtl/>
-        </w:rPr>
-        <w:t xml:space="preserve">ס׳ 16(ב) לחוק מיסוי מקרקעין. המחוקק זיהה כבר בשנות השישים את ייפוי הכוח כמסלול עוקף-דיווח, וביקש ללכוד גם אותו ברשת ההצהרה.</w:t>
-      </w:r>
-    </w:p>
-  </w:footnote>
-  <w:footnote w:id="61">
-    <w:p>
-      <w:pPr>
-        <w:bidi/>
-        <w:spacing w:after="60"/>
-      </w:pPr>
-      <w:r>
-        <w:rPr>
-          <w:rStyle w:val="FootnoteReference"/>
-        </w:rPr>
-        <w:footnoteRef/>
-      </w:r>
-      <w:r>
-        <w:rPr>
-          <w:rFonts w:ascii="David" w:cs="David" w:eastAsia="David" w:hAnsi="David"/>
-          <w:sz w:val="20"/>
-          <w:szCs w:val="20"/>
-          <w:rtl/>
-        </w:rPr>
-        <w:t xml:space="preserve">ס׳ 73 לחוק מיסוי מקרקעין.</w:t>
-      </w:r>
-    </w:p>
-  </w:footnote>
-  <w:footnote w:id="62">
-    <w:p>
-      <w:pPr>
-        <w:bidi/>
-        <w:spacing w:after="60"/>
-      </w:pPr>
-      <w:r>
-        <w:rPr>
-          <w:rStyle w:val="FootnoteReference"/>
-        </w:rPr>
-        <w:footnoteRef/>
-      </w:r>
-      <w:r>
-        <w:rPr>
-          <w:rFonts w:ascii="David" w:cs="David" w:eastAsia="David" w:hAnsi="David"/>
-          <w:sz w:val="20"/>
-          <w:szCs w:val="20"/>
-          <w:rtl/>
-        </w:rPr>
-        <w:t xml:space="preserve">ס׳ 324(א) לפקודת העיריות [נוסח חדש]; ולעניין היטל השבחה – ס׳ 10 לתוספת השלישית לחוק התכנון והבנייה, התשכ"ה-1965.</w:t>
-      </w:r>
-    </w:p>
-  </w:footnote>
-  <w:footnote w:id="63">
-    <w:p>
-      <w:pPr>
-        <w:bidi/>
-        <w:spacing w:after="60"/>
-      </w:pPr>
-      <w:r>
-        <w:rPr>
-          <w:rStyle w:val="FootnoteReference"/>
-        </w:rPr>
-        <w:footnoteRef/>
-      </w:r>
-      <w:r>
-        <w:rPr>
-          <w:rFonts w:ascii="David" w:cs="David" w:eastAsia="David" w:hAnsi="David"/>
-          <w:sz w:val="20"/>
-          <w:szCs w:val="20"/>
-          <w:rtl/>
-        </w:rPr>
-        <w:t xml:space="preserve">להגדרות "זכות במקרקעין" ו"מכירה" ראו ס׳ 1 לחוק מיסוי מקרקעין; ולמיסוי מכירת בעלות שביושר ראו גורמן ואהרונוביץ׳, </w:t>
-      </w:r>
-      <w:r>
-        <w:rPr>
-          <w:rFonts w:ascii="David" w:cs="David" w:eastAsia="David" w:hAnsi="David"/>
-          <w:sz w:val="20"/>
-          <w:szCs w:val="20"/>
-          <w:rtl/>
-        </w:rPr>
-        <w:t xml:space="preserve">לעיל ה"ש 58</w:t>
-      </w:r>
-      <w:r>
-        <w:rPr>
-          <w:rFonts w:ascii="David" w:cs="David" w:eastAsia="David" w:hAnsi="David"/>
-          <w:sz w:val="20"/>
-          <w:szCs w:val="20"/>
-          <w:rtl/>
-        </w:rPr>
-        <w:t xml:space="preserve">, בעמ׳ 151.</w:t>
       </w:r>
     </w:p>
   </w:footnote>
@@ -10295,6 +10688,116 @@
           <w:szCs w:val="20"/>
           <w:rtl/>
         </w:rPr>
+        <w:t xml:space="preserve">ס׳ 16(ב) לחוק מיסוי מקרקעין. המחוקק זיהה כבר בשנות השישים את ייפוי הכוח כמסלול עוקף-דיווח, וביקש ללכוד גם אותו ברשת ההצהרה.</w:t>
+      </w:r>
+    </w:p>
+  </w:footnote>
+  <w:footnote w:id="65">
+    <w:p>
+      <w:pPr>
+        <w:bidi/>
+        <w:spacing w:after="60"/>
+      </w:pPr>
+      <w:r>
+        <w:rPr>
+          <w:rStyle w:val="FootnoteReference"/>
+        </w:rPr>
+        <w:footnoteRef/>
+      </w:r>
+      <w:r>
+        <w:rPr>
+          <w:rFonts w:ascii="David" w:cs="David" w:eastAsia="David" w:hAnsi="David"/>
+          <w:sz w:val="20"/>
+          <w:szCs w:val="20"/>
+          <w:rtl/>
+        </w:rPr>
+        <w:t xml:space="preserve">ס׳ 73 לחוק מיסוי מקרקעין.</w:t>
+      </w:r>
+    </w:p>
+  </w:footnote>
+  <w:footnote w:id="66">
+    <w:p>
+      <w:pPr>
+        <w:bidi/>
+        <w:spacing w:after="60"/>
+      </w:pPr>
+      <w:r>
+        <w:rPr>
+          <w:rStyle w:val="FootnoteReference"/>
+        </w:rPr>
+        <w:footnoteRef/>
+      </w:r>
+      <w:r>
+        <w:rPr>
+          <w:rFonts w:ascii="David" w:cs="David" w:eastAsia="David" w:hAnsi="David"/>
+          <w:sz w:val="20"/>
+          <w:szCs w:val="20"/>
+          <w:rtl/>
+        </w:rPr>
+        <w:t xml:space="preserve">ס׳ 324(א) לפקודת העיריות [נוסח חדש]; ולעניין היטל השבחה – ס׳ 10 לתוספת השלישית לחוק התכנון והבנייה, התשכ"ה-1965.</w:t>
+      </w:r>
+    </w:p>
+  </w:footnote>
+  <w:footnote w:id="67">
+    <w:p>
+      <w:pPr>
+        <w:bidi/>
+        <w:spacing w:after="60"/>
+      </w:pPr>
+      <w:r>
+        <w:rPr>
+          <w:rStyle w:val="FootnoteReference"/>
+        </w:rPr>
+        <w:footnoteRef/>
+      </w:r>
+      <w:r>
+        <w:rPr>
+          <w:rFonts w:ascii="David" w:cs="David" w:eastAsia="David" w:hAnsi="David"/>
+          <w:sz w:val="20"/>
+          <w:szCs w:val="20"/>
+          <w:rtl/>
+        </w:rPr>
+        <w:t xml:space="preserve">להגדרות "זכות במקרקעין" ו"מכירה" ראו ס׳ 1 לחוק מיסוי מקרקעין; ולמיסוי מכירת בעלות שביושר ראו גורמן ואהרונוביץ׳, </w:t>
+      </w:r>
+      <w:r>
+        <w:rPr>
+          <w:rFonts w:ascii="David" w:cs="David" w:eastAsia="David" w:hAnsi="David"/>
+          <w:sz w:val="20"/>
+          <w:szCs w:val="20"/>
+          <w:rtl/>
+        </w:rPr>
+        <w:t xml:space="preserve">לעיל ה"ש 62</w:t>
+      </w:r>
+      <w:r>
+        <w:rPr>
+          <w:rFonts w:ascii="David" w:cs="David" w:eastAsia="David" w:hAnsi="David"/>
+          <w:sz w:val="20"/>
+          <w:szCs w:val="20"/>
+          <w:rtl/>
+        </w:rPr>
+        <w:t xml:space="preserve">, בעמ׳ 151.</w:t>
+      </w:r>
+    </w:p>
+  </w:footnote>
+  <w:footnote w:id="68">
+    <w:p>
+      <w:pPr>
+        <w:bidi/>
+        <w:spacing w:after="60"/>
+      </w:pPr>
+      <w:r>
+        <w:rPr>
+          <w:rStyle w:val="FootnoteReference"/>
+        </w:rPr>
+        <w:footnoteRef/>
+      </w:r>
+      <w:r>
+        <w:rPr>
+          <w:rFonts w:ascii="David" w:cs="David" w:eastAsia="David" w:hAnsi="David"/>
+          <w:sz w:val="20"/>
+          <w:szCs w:val="20"/>
+          <w:rtl/>
+        </w:rPr>
         <w:t xml:space="preserve">ו"ע (מחוזי חי׳) 4631-12-13 </w:t>
       </w:r>
       <w:r>
@@ -10324,7 +10827,7 @@
           <w:szCs w:val="20"/>
           <w:rtl/>
         </w:rPr>
-        <w:t xml:space="preserve">לעיל ה"ש 58</w:t>
+        <w:t xml:space="preserve">לעיל ה"ש 62</w:t>
       </w:r>
       <w:r>
         <w:rPr>
@@ -10334,169 +10837,6 @@
           <w:rtl/>
         </w:rPr>
         <w:t xml:space="preserve">, בעמ׳ 153–154.</w:t>
-      </w:r>
-    </w:p>
-  </w:footnote>
-  <w:footnote w:id="65">
-    <w:p>
-      <w:pPr>
-        <w:bidi/>
-        <w:spacing w:after="60"/>
-      </w:pPr>
-      <w:r>
-        <w:rPr>
-          <w:rStyle w:val="FootnoteReference"/>
-        </w:rPr>
-        <w:footnoteRef/>
-      </w:r>
-      <w:r>
-        <w:rPr>
-          <w:rFonts w:ascii="David" w:cs="David" w:eastAsia="David" w:hAnsi="David"/>
-          <w:sz w:val="20"/>
-          <w:szCs w:val="20"/>
-          <w:rtl/>
-        </w:rPr>
-        <w:t xml:space="preserve">לקנסות בגין אי-הגשת הצהרה ולהפרשי הצמדה וריבית ראו פרק אחד-עשר לחוק מיסוי מקרקעין; גורמן ואהרונוביץ׳, </w:t>
-      </w:r>
-      <w:r>
-        <w:rPr>
-          <w:rFonts w:ascii="David" w:cs="David" w:eastAsia="David" w:hAnsi="David"/>
-          <w:sz w:val="20"/>
-          <w:szCs w:val="20"/>
-          <w:rtl/>
-        </w:rPr>
-        <w:t xml:space="preserve">לעיל ה"ש 58</w:t>
-      </w:r>
-      <w:r>
-        <w:rPr>
-          <w:rFonts w:ascii="David" w:cs="David" w:eastAsia="David" w:hAnsi="David"/>
-          <w:sz w:val="20"/>
-          <w:szCs w:val="20"/>
-          <w:rtl/>
-        </w:rPr>
-        <w:t xml:space="preserve">.</w:t>
-      </w:r>
-    </w:p>
-  </w:footnote>
-  <w:footnote w:id="66">
-    <w:p>
-      <w:pPr>
-        <w:bidi/>
-        <w:spacing w:after="60"/>
-      </w:pPr>
-      <w:r>
-        <w:rPr>
-          <w:rStyle w:val="FootnoteReference"/>
-        </w:rPr>
-        <w:footnoteRef/>
-      </w:r>
-      <w:r>
-        <w:rPr>
-          <w:rFonts w:ascii="David" w:cs="David" w:eastAsia="David" w:hAnsi="David"/>
-          <w:sz w:val="20"/>
-          <w:szCs w:val="20"/>
-          <w:rtl/>
-        </w:rPr>
-        <w:t xml:space="preserve">גורמן ואהרונוביץ׳, </w:t>
-      </w:r>
-      <w:r>
-        <w:rPr>
-          <w:rFonts w:ascii="David" w:cs="David" w:eastAsia="David" w:hAnsi="David"/>
-          <w:sz w:val="20"/>
-          <w:szCs w:val="20"/>
-          <w:rtl/>
-        </w:rPr>
-        <w:t xml:space="preserve">לעיל ה"ש 58</w:t>
-      </w:r>
-      <w:r>
-        <w:rPr>
-          <w:rFonts w:ascii="David" w:cs="David" w:eastAsia="David" w:hAnsi="David"/>
-          <w:sz w:val="20"/>
-          <w:szCs w:val="20"/>
-          <w:rtl/>
-        </w:rPr>
-        <w:t xml:space="preserve">, בעמ׳ 282–284, והפסיקה הנסקרת שם.</w:t>
-      </w:r>
-    </w:p>
-  </w:footnote>
-  <w:footnote w:id="67">
-    <w:p>
-      <w:pPr>
-        <w:bidi/>
-        <w:spacing w:after="60"/>
-      </w:pPr>
-      <w:r>
-        <w:rPr>
-          <w:rStyle w:val="FootnoteReference"/>
-        </w:rPr>
-        <w:footnoteRef/>
-      </w:r>
-      <w:r>
-        <w:rPr>
-          <w:rFonts w:ascii="David" w:cs="David" w:eastAsia="David" w:hAnsi="David"/>
-          <w:sz w:val="20"/>
-          <w:szCs w:val="20"/>
-          <w:rtl/>
-        </w:rPr>
-        <w:t xml:space="preserve">להיגיון הגבייתי של הסעיף ראו גורמן ואהרונוביץ׳, </w:t>
-      </w:r>
-      <w:r>
-        <w:rPr>
-          <w:rFonts w:ascii="David" w:cs="David" w:eastAsia="David" w:hAnsi="David"/>
-          <w:sz w:val="20"/>
-          <w:szCs w:val="20"/>
-          <w:rtl/>
-        </w:rPr>
-        <w:t xml:space="preserve">לעיל ה"ש 59</w:t>
-      </w:r>
-      <w:r>
-        <w:rPr>
-          <w:rFonts w:ascii="David" w:cs="David" w:eastAsia="David" w:hAnsi="David"/>
-          <w:sz w:val="20"/>
-          <w:szCs w:val="20"/>
-          <w:rtl/>
-        </w:rPr>
-        <w:t xml:space="preserve">.</w:t>
-      </w:r>
-    </w:p>
-  </w:footnote>
-  <w:footnote w:id="68">
-    <w:p>
-      <w:pPr>
-        <w:bidi/>
-        <w:spacing w:after="60"/>
-      </w:pPr>
-      <w:r>
-        <w:rPr>
-          <w:rStyle w:val="FootnoteReference"/>
-        </w:rPr>
-        <w:footnoteRef/>
-      </w:r>
-      <w:r>
-        <w:rPr>
-          <w:rFonts w:ascii="David" w:cs="David" w:eastAsia="David" w:hAnsi="David"/>
-          <w:sz w:val="20"/>
-          <w:szCs w:val="20"/>
-          <w:rtl/>
-        </w:rPr>
-        <w:t xml:space="preserve">למונח "הון מת" ראו </w:t>
-      </w:r>
-      <w:r>
-        <w:rPr>
-          <w:rFonts w:ascii="Times New Roman" w:cs="Times New Roman" w:eastAsia="Times New Roman" w:hAnsi="Times New Roman"/>
-          <w:sz w:val="20"/>
-          <w:szCs w:val="20"/>
-        </w:rPr>
-        <w:t xml:space="preserve">Hernando de Soto, The Mystery of Capital: Why Capitalism Triumphs in the West and Fails Everywhere Else (2000)</w:t>
-      </w:r>
-      <w:r>
-        <w:rPr>
-          <w:rFonts w:ascii="David" w:cs="David" w:eastAsia="David" w:hAnsi="David"/>
-          <w:sz w:val="20"/>
-          <w:szCs w:val="20"/>
-          <w:rtl/>
-        </w:rPr>
-        <w:t xml:space="preserve">. דה-סוטו פיתח את הניתוח על יסוד עבודת שדה במצרים, שבה נאמד שיעור הנכסים המוחזקים בלא רישום ביותר מ-90%; ראו להלן פרק ו.2.</w:t>
       </w:r>
     </w:p>
   </w:footnote>
@@ -10519,6 +10859,169 @@
           <w:szCs w:val="20"/>
           <w:rtl/>
         </w:rPr>
+        <w:t xml:space="preserve">לקנסות בגין אי-הגשת הצהרה ולהפרשי הצמדה וריבית ראו פרק אחד-עשר לחוק מיסוי מקרקעין; גורמן ואהרונוביץ׳, </w:t>
+      </w:r>
+      <w:r>
+        <w:rPr>
+          <w:rFonts w:ascii="David" w:cs="David" w:eastAsia="David" w:hAnsi="David"/>
+          <w:sz w:val="20"/>
+          <w:szCs w:val="20"/>
+          <w:rtl/>
+        </w:rPr>
+        <w:t xml:space="preserve">לעיל ה"ש 62</w:t>
+      </w:r>
+      <w:r>
+        <w:rPr>
+          <w:rFonts w:ascii="David" w:cs="David" w:eastAsia="David" w:hAnsi="David"/>
+          <w:sz w:val="20"/>
+          <w:szCs w:val="20"/>
+          <w:rtl/>
+        </w:rPr>
+        <w:t xml:space="preserve">.</w:t>
+      </w:r>
+    </w:p>
+  </w:footnote>
+  <w:footnote w:id="70">
+    <w:p>
+      <w:pPr>
+        <w:bidi/>
+        <w:spacing w:after="60"/>
+      </w:pPr>
+      <w:r>
+        <w:rPr>
+          <w:rStyle w:val="FootnoteReference"/>
+        </w:rPr>
+        <w:footnoteRef/>
+      </w:r>
+      <w:r>
+        <w:rPr>
+          <w:rFonts w:ascii="David" w:cs="David" w:eastAsia="David" w:hAnsi="David"/>
+          <w:sz w:val="20"/>
+          <w:szCs w:val="20"/>
+          <w:rtl/>
+        </w:rPr>
+        <w:t xml:space="preserve">גורמן ואהרונוביץ׳, </w:t>
+      </w:r>
+      <w:r>
+        <w:rPr>
+          <w:rFonts w:ascii="David" w:cs="David" w:eastAsia="David" w:hAnsi="David"/>
+          <w:sz w:val="20"/>
+          <w:szCs w:val="20"/>
+          <w:rtl/>
+        </w:rPr>
+        <w:t xml:space="preserve">לעיל ה"ש 62</w:t>
+      </w:r>
+      <w:r>
+        <w:rPr>
+          <w:rFonts w:ascii="David" w:cs="David" w:eastAsia="David" w:hAnsi="David"/>
+          <w:sz w:val="20"/>
+          <w:szCs w:val="20"/>
+          <w:rtl/>
+        </w:rPr>
+        <w:t xml:space="preserve">, בעמ׳ 282–284, והפסיקה הנסקרת שם.</w:t>
+      </w:r>
+    </w:p>
+  </w:footnote>
+  <w:footnote w:id="71">
+    <w:p>
+      <w:pPr>
+        <w:bidi/>
+        <w:spacing w:after="60"/>
+      </w:pPr>
+      <w:r>
+        <w:rPr>
+          <w:rStyle w:val="FootnoteReference"/>
+        </w:rPr>
+        <w:footnoteRef/>
+      </w:r>
+      <w:r>
+        <w:rPr>
+          <w:rFonts w:ascii="David" w:cs="David" w:eastAsia="David" w:hAnsi="David"/>
+          <w:sz w:val="20"/>
+          <w:szCs w:val="20"/>
+          <w:rtl/>
+        </w:rPr>
+        <w:t xml:space="preserve">להיגיון הגבייתי של הסעיף ראו גורמן ואהרונוביץ׳, </w:t>
+      </w:r>
+      <w:r>
+        <w:rPr>
+          <w:rFonts w:ascii="David" w:cs="David" w:eastAsia="David" w:hAnsi="David"/>
+          <w:sz w:val="20"/>
+          <w:szCs w:val="20"/>
+          <w:rtl/>
+        </w:rPr>
+        <w:t xml:space="preserve">לעיל ה"ש 63</w:t>
+      </w:r>
+      <w:r>
+        <w:rPr>
+          <w:rFonts w:ascii="David" w:cs="David" w:eastAsia="David" w:hAnsi="David"/>
+          <w:sz w:val="20"/>
+          <w:szCs w:val="20"/>
+          <w:rtl/>
+        </w:rPr>
+        <w:t xml:space="preserve">.</w:t>
+      </w:r>
+    </w:p>
+  </w:footnote>
+  <w:footnote w:id="72">
+    <w:p>
+      <w:pPr>
+        <w:bidi/>
+        <w:spacing w:after="60"/>
+      </w:pPr>
+      <w:r>
+        <w:rPr>
+          <w:rStyle w:val="FootnoteReference"/>
+        </w:rPr>
+        <w:footnoteRef/>
+      </w:r>
+      <w:r>
+        <w:rPr>
+          <w:rFonts w:ascii="David" w:cs="David" w:eastAsia="David" w:hAnsi="David"/>
+          <w:sz w:val="20"/>
+          <w:szCs w:val="20"/>
+          <w:rtl/>
+        </w:rPr>
+        <w:t xml:space="preserve">למונח "הון מת" ראו </w:t>
+      </w:r>
+      <w:r>
+        <w:rPr>
+          <w:rFonts w:ascii="Times New Roman" w:cs="Times New Roman" w:eastAsia="Times New Roman" w:hAnsi="Times New Roman"/>
+          <w:sz w:val="20"/>
+          <w:szCs w:val="20"/>
+        </w:rPr>
+        <w:t xml:space="preserve">Hernando de Soto, The Mystery of Capital: Why Capitalism Triumphs in the West and Fails Everywhere Else (2000)</w:t>
+      </w:r>
+      <w:r>
+        <w:rPr>
+          <w:rFonts w:ascii="David" w:cs="David" w:eastAsia="David" w:hAnsi="David"/>
+          <w:sz w:val="20"/>
+          <w:szCs w:val="20"/>
+          <w:rtl/>
+        </w:rPr>
+        <w:t xml:space="preserve">. דה-סוטו פיתח את הניתוח על יסוד עבודת שדה במצרים, שבה נאמד שיעור הנכסים המוחזקים בלא רישום ביותר מ-90%; ראו להלן פרק ו.2.</w:t>
+      </w:r>
+    </w:p>
+  </w:footnote>
+  <w:footnote w:id="73">
+    <w:p>
+      <w:pPr>
+        <w:bidi/>
+        <w:spacing w:after="60"/>
+      </w:pPr>
+      <w:r>
+        <w:rPr>
+          <w:rStyle w:val="FootnoteReference"/>
+        </w:rPr>
+        <w:footnoteRef/>
+      </w:r>
+      <w:r>
+        <w:rPr>
+          <w:rFonts w:ascii="David" w:cs="David" w:eastAsia="David" w:hAnsi="David"/>
+          <w:sz w:val="20"/>
+          <w:szCs w:val="20"/>
+          <w:rtl/>
+        </w:rPr>
         <w:t xml:space="preserve">השוו עניין </w:t>
       </w:r>
       <w:r>
@@ -10561,7 +11064,7 @@
       </w:r>
     </w:p>
   </w:footnote>
-  <w:footnote w:id="70">
+  <w:footnote w:id="74">
     <w:p>
       <w:pPr>
         <w:bidi/>
@@ -10592,7 +11095,7 @@
       </w:r>
     </w:p>
   </w:footnote>
-  <w:footnote w:id="71">
+  <w:footnote w:id="75">
     <w:p>
       <w:pPr>
         <w:bidi/>
@@ -10623,7 +11126,7 @@
       </w:r>
     </w:p>
   </w:footnote>
-  <w:footnote w:id="72">
+  <w:footnote w:id="76">
     <w:p>
       <w:pPr>
         <w:bidi/>
@@ -10684,7 +11187,7 @@
       </w:r>
     </w:p>
   </w:footnote>
-  <w:footnote w:id="73">
+  <w:footnote w:id="77">
     <w:p>
       <w:pPr>
         <w:bidi/>
@@ -10703,156 +11206,6 @@
           <w:szCs w:val="20"/>
         </w:rPr>
         <w:t xml:space="preserve">Land Registration Act 2002, s 27</w:t>
-      </w:r>
-      <w:r>
-        <w:rPr>
-          <w:rFonts w:ascii="David" w:cs="David" w:eastAsia="David" w:hAnsi="David"/>
-          <w:sz w:val="20"/>
-          <w:szCs w:val="20"/>
-          <w:rtl/>
-        </w:rPr>
-        <w:t xml:space="preserve">.</w:t>
-      </w:r>
-    </w:p>
-  </w:footnote>
-  <w:footnote w:id="74">
-    <w:p>
-      <w:pPr>
-        <w:bidi/>
-        <w:spacing w:after="60"/>
-      </w:pPr>
-      <w:r>
-        <w:rPr>
-          <w:rStyle w:val="FootnoteReference"/>
-        </w:rPr>
-        <w:footnoteRef/>
-      </w:r>
-      <w:r>
-        <w:rPr>
-          <w:rFonts w:ascii="Times New Roman" w:cs="Times New Roman" w:eastAsia="Times New Roman" w:hAnsi="Times New Roman"/>
-          <w:sz w:val="20"/>
-          <w:szCs w:val="20"/>
-        </w:rPr>
-        <w:t xml:space="preserve">Williams &amp; Glyn’s Bank Ltd v Boland [1981] AC 487 (HL)</w:t>
-      </w:r>
-      <w:r>
-        <w:rPr>
-          <w:rFonts w:ascii="David" w:cs="David" w:eastAsia="David" w:hAnsi="David"/>
-          <w:sz w:val="20"/>
-          <w:szCs w:val="20"/>
-          <w:rtl/>
-        </w:rPr>
-        <w:t xml:space="preserve">; והמשכה של ההגנה כיום ב-</w:t>
-      </w:r>
-      <w:r>
-        <w:rPr>
-          <w:rFonts w:ascii="Times New Roman" w:cs="Times New Roman" w:eastAsia="Times New Roman" w:hAnsi="Times New Roman"/>
-          <w:sz w:val="20"/>
-          <w:szCs w:val="20"/>
-        </w:rPr>
-        <w:t xml:space="preserve">Land Registration Act 2002, sch 3, para 2</w:t>
-      </w:r>
-      <w:r>
-        <w:rPr>
-          <w:rFonts w:ascii="David" w:cs="David" w:eastAsia="David" w:hAnsi="David"/>
-          <w:sz w:val="20"/>
-          <w:szCs w:val="20"/>
-          <w:rtl/>
-        </w:rPr>
-        <w:t xml:space="preserve">.</w:t>
-      </w:r>
-    </w:p>
-  </w:footnote>
-  <w:footnote w:id="75">
-    <w:p>
-      <w:pPr>
-        <w:bidi/>
-        <w:spacing w:after="60"/>
-      </w:pPr>
-      <w:r>
-        <w:rPr>
-          <w:rStyle w:val="FootnoteReference"/>
-        </w:rPr>
-        <w:footnoteRef/>
-      </w:r>
-      <w:r>
-        <w:rPr>
-          <w:rFonts w:ascii="David" w:cs="David" w:eastAsia="David" w:hAnsi="David"/>
-          <w:sz w:val="20"/>
-          <w:szCs w:val="20"/>
-          <w:rtl/>
-        </w:rPr>
-        <w:t xml:space="preserve">לביקורת עדכנית על מוסד הזכויות הגוברות כסדק ב"עקרון המראה" של המרשם ראו </w:t>
-      </w:r>
-      <w:r>
-        <w:rPr>
-          <w:rFonts w:ascii="Times New Roman" w:cs="Times New Roman" w:eastAsia="Times New Roman" w:hAnsi="Times New Roman"/>
-          <w:sz w:val="20"/>
-          <w:szCs w:val="20"/>
-        </w:rPr>
-        <w:t xml:space="preserve">Chris Bevan, "Overriding Interests under the Land Registration Act 2002: Time to Repair the ‘Cracked Mirror’?" [2024] Conv. 123</w:t>
-      </w:r>
-      <w:r>
-        <w:rPr>
-          <w:rFonts w:ascii="David" w:cs="David" w:eastAsia="David" w:hAnsi="David"/>
-          <w:sz w:val="20"/>
-          <w:szCs w:val="20"/>
-          <w:rtl/>
-        </w:rPr>
-        <w:t xml:space="preserve">.</w:t>
-      </w:r>
-    </w:p>
-  </w:footnote>
-  <w:footnote w:id="76">
-    <w:p>
-      <w:pPr>
-        <w:bidi/>
-        <w:spacing w:after="60"/>
-      </w:pPr>
-      <w:r>
-        <w:rPr>
-          <w:rStyle w:val="FootnoteReference"/>
-        </w:rPr>
-        <w:footnoteRef/>
-      </w:r>
-      <w:r>
-        <w:rPr>
-          <w:rFonts w:ascii="Times New Roman" w:cs="Times New Roman" w:eastAsia="Times New Roman" w:hAnsi="Times New Roman"/>
-          <w:sz w:val="20"/>
-          <w:szCs w:val="20"/>
-        </w:rPr>
-        <w:t xml:space="preserve">Stack v Dowden [2007] UKHL 17, [2007] 2 AC 432; Jones v Kernott [2011] UKSC 53, [2012] 1 AC 776</w:t>
-      </w:r>
-      <w:r>
-        <w:rPr>
-          <w:rFonts w:ascii="David" w:cs="David" w:eastAsia="David" w:hAnsi="David"/>
-          <w:sz w:val="20"/>
-          <w:szCs w:val="20"/>
-          <w:rtl/>
-        </w:rPr>
-        <w:t xml:space="preserve">.</w:t>
-      </w:r>
-    </w:p>
-  </w:footnote>
-  <w:footnote w:id="77">
-    <w:p>
-      <w:pPr>
-        <w:bidi/>
-        <w:spacing w:after="60"/>
-      </w:pPr>
-      <w:r>
-        <w:rPr>
-          <w:rStyle w:val="FootnoteReference"/>
-        </w:rPr>
-        <w:footnoteRef/>
-      </w:r>
-      <w:r>
-        <w:rPr>
-          <w:rFonts w:ascii="Times New Roman" w:cs="Times New Roman" w:eastAsia="Times New Roman" w:hAnsi="Times New Roman"/>
-          <w:sz w:val="20"/>
-          <w:szCs w:val="20"/>
-        </w:rPr>
-        <w:t xml:space="preserve">Thorner v Major [2009] UKHL 18, [2009] 1 WLR 776</w:t>
       </w:r>
       <w:r>
         <w:rPr>
@@ -10883,16 +11236,16 @@
           <w:sz w:val="20"/>
           <w:szCs w:val="20"/>
         </w:rPr>
-        <w:t xml:space="preserve">Guest v Guest [2022] UKSC 27, [2022] 3 WLR 911</w:t>
-      </w:r>
-      <w:r>
-        <w:rPr>
-          <w:rFonts w:ascii="David" w:cs="David" w:eastAsia="David" w:hAnsi="David"/>
-          <w:sz w:val="20"/>
-          <w:szCs w:val="20"/>
-          <w:rtl/>
-        </w:rPr>
-        <w:t xml:space="preserve">. לניתוח עדכני ראו </w:t>
+        <w:t xml:space="preserve">Williams &amp; Glyn’s Bank Ltd v Boland [1981] AC 487 (HL)</w:t>
+      </w:r>
+      <w:r>
+        <w:rPr>
+          <w:rFonts w:ascii="David" w:cs="David" w:eastAsia="David" w:hAnsi="David"/>
+          <w:sz w:val="20"/>
+          <w:szCs w:val="20"/>
+          <w:rtl/>
+        </w:rPr>
+        <w:t xml:space="preserve">; והמשכה של ההגנה כיום ב-</w:t>
       </w:r>
       <w:r>
         <w:rPr>
@@ -10900,7 +11253,7 @@
           <w:sz w:val="20"/>
           <w:szCs w:val="20"/>
         </w:rPr>
-        <w:t xml:space="preserve">Alex Waghorn, "Promises in Equity and at Law: Proprietary Estoppel after Guest v Guest" (2023) 86 MLR 1504; Brian Sloan, "Proprietary Estoppel in the Supreme Court: Banquo’s Ghost?" (2023) 82 CLJ 13</w:t>
+        <w:t xml:space="preserve">Land Registration Act 2002, sch 3, para 2</w:t>
       </w:r>
       <w:r>
         <w:rPr>
@@ -10927,38 +11280,29 @@
       </w:r>
       <w:r>
         <w:rPr>
+          <w:rFonts w:ascii="David" w:cs="David" w:eastAsia="David" w:hAnsi="David"/>
+          <w:sz w:val="20"/>
+          <w:szCs w:val="20"/>
+          <w:rtl/>
+        </w:rPr>
+        <w:t xml:space="preserve">לביקורת עדכנית על מוסד הזכויות הגוברות כסדק ב"עקרון המראה" של המרשם ראו </w:t>
+      </w:r>
+      <w:r>
+        <w:rPr>
           <w:rFonts w:ascii="Times New Roman" w:cs="Times New Roman" w:eastAsia="Times New Roman" w:hAnsi="Times New Roman"/>
           <w:sz w:val="20"/>
           <w:szCs w:val="20"/>
         </w:rPr>
-        <w:t xml:space="preserve">Law of Property (Miscellaneous Provisions) Act 1989, ss 1–2</w:t>
-      </w:r>
-      <w:r>
-        <w:rPr>
-          <w:rFonts w:ascii="David" w:cs="David" w:eastAsia="David" w:hAnsi="David"/>
-          <w:sz w:val="20"/>
-          <w:szCs w:val="20"/>
-          <w:rtl/>
-        </w:rPr>
-        <w:t xml:space="preserve">. וראו כבר את ראבילו, </w:t>
-      </w:r>
-      <w:r>
-        <w:rPr>
-          <w:rFonts w:ascii="David" w:cs="David" w:eastAsia="David" w:hAnsi="David"/>
-          <w:sz w:val="20"/>
-          <w:szCs w:val="20"/>
-          <w:rtl/>
-        </w:rPr>
-        <w:t xml:space="preserve">לעיל ה"ש 32</w:t>
-      </w:r>
-      <w:r>
-        <w:rPr>
-          <w:rFonts w:ascii="David" w:cs="David" w:eastAsia="David" w:hAnsi="David"/>
-          <w:sz w:val="20"/>
-          <w:szCs w:val="20"/>
-          <w:rtl/>
-        </w:rPr>
-        <w:t xml:space="preserve">, המצטט את הכלל האנגלי שלפיו הבטחת מתנה גרידא אינה מעבירה בעלות וטעונה מסירה.</w:t>
+        <w:t xml:space="preserve">Chris Bevan, "Overriding Interests under the Land Registration Act 2002: Time to Repair the ‘Cracked Mirror’?" [2024] Conv. 123</w:t>
+      </w:r>
+      <w:r>
+        <w:rPr>
+          <w:rFonts w:ascii="David" w:cs="David" w:eastAsia="David" w:hAnsi="David"/>
+          <w:sz w:val="20"/>
+          <w:szCs w:val="20"/>
+          <w:rtl/>
+        </w:rPr>
+        <w:t xml:space="preserve">.</w:t>
       </w:r>
     </w:p>
   </w:footnote>
@@ -10980,7 +11324,7 @@
           <w:sz w:val="20"/>
           <w:szCs w:val="20"/>
         </w:rPr>
-        <w:t xml:space="preserve">Re Rose [1952] Ch 499 (CA)</w:t>
+        <w:t xml:space="preserve">Stack v Dowden [2007] UKHL 17, [2007] 2 AC 432; Jones v Kernott [2011] UKSC 53, [2012] 1 AC 776</w:t>
       </w:r>
       <w:r>
         <w:rPr>
@@ -11011,7 +11355,7 @@
           <w:sz w:val="20"/>
           <w:szCs w:val="20"/>
         </w:rPr>
-        <w:t xml:space="preserve">Pennington v Waine [2002] EWCA Civ 227, [2002] 1 WLR 2075</w:t>
+        <w:t xml:space="preserve">Thorner v Major [2009] UKHL 18, [2009] 1 WLR 776</w:t>
       </w:r>
       <w:r>
         <w:rPr>
@@ -11042,16 +11386,33 @@
           <w:sz w:val="20"/>
           <w:szCs w:val="20"/>
         </w:rPr>
-        <w:t xml:space="preserve">Powers of Attorney Act 1971, s 4</w:t>
-      </w:r>
-      <w:r>
-        <w:rPr>
-          <w:rFonts w:ascii="David" w:cs="David" w:eastAsia="David" w:hAnsi="David"/>
-          <w:sz w:val="20"/>
-          <w:szCs w:val="20"/>
-          <w:rtl/>
-        </w:rPr>
-        <w:t xml:space="preserve">. זהו המקור ההיסטורי של ס׳ 14(ב) לחוק השליחות הישראלי.</w:t>
+        <w:t xml:space="preserve">Guest v Guest [2022] UKSC 27, [2022] 3 WLR 911</w:t>
+      </w:r>
+      <w:r>
+        <w:rPr>
+          <w:rFonts w:ascii="David" w:cs="David" w:eastAsia="David" w:hAnsi="David"/>
+          <w:sz w:val="20"/>
+          <w:szCs w:val="20"/>
+          <w:rtl/>
+        </w:rPr>
+        <w:t xml:space="preserve">. לניתוח עדכני ראו </w:t>
+      </w:r>
+      <w:r>
+        <w:rPr>
+          <w:rFonts w:ascii="Times New Roman" w:cs="Times New Roman" w:eastAsia="Times New Roman" w:hAnsi="Times New Roman"/>
+          <w:sz w:val="20"/>
+          <w:szCs w:val="20"/>
+        </w:rPr>
+        <w:t xml:space="preserve">Alex Waghorn, "Promises in Equity and at Law: Proprietary Estoppel after Guest v Guest" (2023) 86 MLR 1504; Brian Sloan, "Proprietary Estoppel in the Supreme Court: Banquo’s Ghost?" (2023) 82 CLJ 13</w:t>
+      </w:r>
+      <w:r>
+        <w:rPr>
+          <w:rFonts w:ascii="David" w:cs="David" w:eastAsia="David" w:hAnsi="David"/>
+          <w:sz w:val="20"/>
+          <w:szCs w:val="20"/>
+          <w:rtl/>
+        </w:rPr>
+        <w:t xml:space="preserve">.</w:t>
       </w:r>
     </w:p>
   </w:footnote>
@@ -11069,29 +11430,38 @@
       </w:r>
       <w:r>
         <w:rPr>
-          <w:rFonts w:ascii="David" w:cs="David" w:eastAsia="David" w:hAnsi="David"/>
-          <w:sz w:val="20"/>
-          <w:szCs w:val="20"/>
-          <w:rtl/>
-        </w:rPr>
-        <w:t xml:space="preserve">לניתוח השוואתי של גורל ההתיישנות הרוכשת בשיטות הרישום המודרניות ראו </w:t>
-      </w:r>
-      <w:r>
-        <w:rPr>
           <w:rFonts w:ascii="Times New Roman" w:cs="Times New Roman" w:eastAsia="Times New Roman" w:hAnsi="Times New Roman"/>
           <w:sz w:val="20"/>
           <w:szCs w:val="20"/>
         </w:rPr>
-        <w:t xml:space="preserve">Nadav Shoked, "Who Needs Adverse Possession?," 89 Fordham L. Rev. 2639 (2021)</w:t>
-      </w:r>
-      <w:r>
-        <w:rPr>
-          <w:rFonts w:ascii="David" w:cs="David" w:eastAsia="David" w:hAnsi="David"/>
-          <w:sz w:val="20"/>
-          <w:szCs w:val="20"/>
-          <w:rtl/>
-        </w:rPr>
-        <w:t xml:space="preserve">.</w:t>
+        <w:t xml:space="preserve">Law of Property (Miscellaneous Provisions) Act 1989, ss 1–2</w:t>
+      </w:r>
+      <w:r>
+        <w:rPr>
+          <w:rFonts w:ascii="David" w:cs="David" w:eastAsia="David" w:hAnsi="David"/>
+          <w:sz w:val="20"/>
+          <w:szCs w:val="20"/>
+          <w:rtl/>
+        </w:rPr>
+        <w:t xml:space="preserve">. וראו כבר את ראבילו, </w:t>
+      </w:r>
+      <w:r>
+        <w:rPr>
+          <w:rFonts w:ascii="David" w:cs="David" w:eastAsia="David" w:hAnsi="David"/>
+          <w:sz w:val="20"/>
+          <w:szCs w:val="20"/>
+          <w:rtl/>
+        </w:rPr>
+        <w:t xml:space="preserve">לעיל ה"ש 34</w:t>
+      </w:r>
+      <w:r>
+        <w:rPr>
+          <w:rFonts w:ascii="David" w:cs="David" w:eastAsia="David" w:hAnsi="David"/>
+          <w:sz w:val="20"/>
+          <w:szCs w:val="20"/>
+          <w:rtl/>
+        </w:rPr>
+        <w:t xml:space="preserve">, המצטט את הכלל האנגלי שלפיו הבטחת מתנה גרידא אינה מעבירה בעלות וטעונה מסירה.</w:t>
       </w:r>
     </w:p>
   </w:footnote>
@@ -11114,7 +11484,45 @@
           <w:szCs w:val="20"/>
           <w:rtl/>
         </w:rPr>
-        <w:t xml:space="preserve">ס׳ 418 לקוד האזרחי המצרי (חוק מס׳ 131 לשנת 1948).</w:t>
+        <w:t xml:space="preserve">עניין </w:t>
+      </w:r>
+      <w:r>
+        <w:rPr>
+          <w:rFonts w:ascii="David" w:cs="David" w:eastAsia="David" w:hAnsi="David"/>
+          <w:i/>
+          <w:iCs/>
+          <w:sz w:val="20"/>
+          <w:szCs w:val="20"/>
+          <w:rtl/>
+        </w:rPr>
+        <w:t xml:space="preserve">כבהה</w:t>
+      </w:r>
+      <w:r>
+        <w:rPr>
+          <w:rFonts w:ascii="David" w:cs="David" w:eastAsia="David" w:hAnsi="David"/>
+          <w:sz w:val="20"/>
+          <w:szCs w:val="20"/>
+          <w:rtl/>
+        </w:rPr>
+        <w:t xml:space="preserve">, </w:t>
+      </w:r>
+      <w:r>
+        <w:rPr>
+          <w:rFonts w:ascii="David" w:cs="David" w:eastAsia="David" w:hAnsi="David"/>
+          <w:sz w:val="20"/>
+          <w:szCs w:val="20"/>
+          <w:rtl/>
+        </w:rPr>
+        <w:t xml:space="preserve">לעיל ה"ש 38</w:t>
+      </w:r>
+      <w:r>
+        <w:rPr>
+          <w:rFonts w:ascii="David" w:cs="David" w:eastAsia="David" w:hAnsi="David"/>
+          <w:sz w:val="20"/>
+          <w:szCs w:val="20"/>
+          <w:rtl/>
+        </w:rPr>
+        <w:t xml:space="preserve">.</w:t>
       </w:r>
     </w:p>
   </w:footnote>
@@ -11132,12 +11540,20 @@
       </w:r>
       <w:r>
         <w:rPr>
-          <w:rFonts w:ascii="David" w:cs="David" w:eastAsia="David" w:hAnsi="David"/>
-          <w:sz w:val="20"/>
-          <w:szCs w:val="20"/>
-          <w:rtl/>
-        </w:rPr>
-        <w:t xml:space="preserve">ס׳ 934 לקוד האזרחי המצרי; ס׳ 9 לחוק ארגון הפומביות המקרקעית, חוק מס׳ 114 לשנת 1946. במצרים פועלות במקביל שתי שיטות רישום: רישום שטרות פרסונלי לפי חוק 114/1946, החולש על מרבית המדינה, ורישום זכויות קדסטרלי לפי חוק מס׳ 142 לשנת 1964, שתחולתו מוגבלת.</w:t>
+          <w:rFonts w:ascii="Times New Roman" w:cs="Times New Roman" w:eastAsia="Times New Roman" w:hAnsi="Times New Roman"/>
+          <w:sz w:val="20"/>
+          <w:szCs w:val="20"/>
+        </w:rPr>
+        <w:t xml:space="preserve">Re Rose [1952] Ch 499 (CA)</w:t>
+      </w:r>
+      <w:r>
+        <w:rPr>
+          <w:rFonts w:ascii="David" w:cs="David" w:eastAsia="David" w:hAnsi="David"/>
+          <w:sz w:val="20"/>
+          <w:szCs w:val="20"/>
+          <w:rtl/>
+        </w:rPr>
+        <w:t xml:space="preserve">.</w:t>
       </w:r>
     </w:p>
   </w:footnote>
@@ -11159,25 +11575,7 @@
           <w:sz w:val="20"/>
           <w:szCs w:val="20"/>
         </w:rPr>
-        <w:t xml:space="preserve">“More than 90% of Egypt’s Properties Are Unregistered: Justice Minister,” Daily News Egypt (Feb. 14, 2022); “Egypt’s Property Registration Rate Remains Below 10%…: World Bank,” Daily News Egypt (July 5, 2026)</w:t>
-      </w:r>
-      <w:r>
-        <w:rPr>
-          <w:rFonts w:ascii="David" w:cs="David" w:eastAsia="David" w:hAnsi="David"/>
-          <w:sz w:val="20"/>
-          <w:szCs w:val="20"/>
-          <w:rtl/>
-        </w:rPr>
-        <w:t xml:space="preserve">. הרנדו דה-סוטו ביסס על מצרים את מחקר "ההון המת" שלו: </w:t>
-      </w:r>
-      <w:r>
-        <w:rPr>
-          <w:rFonts w:ascii="David" w:cs="David" w:eastAsia="David" w:hAnsi="David"/>
-          <w:sz w:val="20"/>
-          <w:szCs w:val="20"/>
-          <w:rtl/>
-        </w:rPr>
-        <w:t xml:space="preserve">לעיל ה"ש 68</w:t>
+        <w:t xml:space="preserve">Pennington v Waine [2002] EWCA Civ 227, [2002] 1 WLR 2075</w:t>
       </w:r>
       <w:r>
         <w:rPr>
@@ -11204,12 +11602,20 @@
       </w:r>
       <w:r>
         <w:rPr>
-          <w:rFonts w:ascii="David" w:cs="David" w:eastAsia="David" w:hAnsi="David"/>
-          <w:sz w:val="20"/>
-          <w:szCs w:val="20"/>
-          <w:rtl/>
-        </w:rPr>
-        <w:t xml:space="preserve">ס׳ 715 לקוד האזרחי המצרי. בית המשפט החוקתי העליון של מצרים שב ואישר בשנת 2021 כי ייפוי כוח כזה אינו ניתן לביטול חד-צדדי. ואולם ס׳ 714 מורה כי השליחות פוקעת במות השולח – נקודת תורפה מרכזית של הפרקטיקה, שפסיקת בית המשפט לקסאציה בעניינה אינה אחידה.</w:t>
+          <w:rFonts w:ascii="Times New Roman" w:cs="Times New Roman" w:eastAsia="Times New Roman" w:hAnsi="Times New Roman"/>
+          <w:sz w:val="20"/>
+          <w:szCs w:val="20"/>
+        </w:rPr>
+        <w:t xml:space="preserve">Powers of Attorney Act 1971, s 4</w:t>
+      </w:r>
+      <w:r>
+        <w:rPr>
+          <w:rFonts w:ascii="David" w:cs="David" w:eastAsia="David" w:hAnsi="David"/>
+          <w:sz w:val="20"/>
+          <w:szCs w:val="20"/>
+          <w:rtl/>
+        </w:rPr>
+        <w:t xml:space="preserve">. זהו המקור ההיסטורי של ס׳ 14(ב) לחוק השליחות הישראלי.</w:t>
       </w:r>
     </w:p>
   </w:footnote>
@@ -11232,7 +11638,7 @@
           <w:szCs w:val="20"/>
           <w:rtl/>
         </w:rPr>
-        <w:t xml:space="preserve">לפסיקת בית המשפט לקסאציה המצרי על תביעות אלה ראו הסקירות שבמאגרי לשכת עורכי הדין המצרית; ולתיאור אנליטי באנגלית ראו </w:t>
+        <w:t xml:space="preserve">לניתוח השוואתי של גורל ההתיישנות הרוכשת בשיטות הרישום המודרניות ראו </w:t>
       </w:r>
       <w:r>
         <w:rPr>
@@ -11240,7 +11646,7 @@
           <w:sz w:val="20"/>
           <w:szCs w:val="20"/>
         </w:rPr>
-        <w:t xml:space="preserve">David Sims, "Securing Land Tenure in Egypt: Who Needs Registered Titles?" Metropolitics (June 14, 2016)</w:t>
+        <w:t xml:space="preserve">Nadav Shoked, "Who Needs Adverse Possession?," 89 Fordham L. Rev. 2639 (2021)</w:t>
       </w:r>
       <w:r>
         <w:rPr>
@@ -11272,7 +11678,7 @@
           <w:szCs w:val="20"/>
           <w:rtl/>
         </w:rPr>
-        <w:t xml:space="preserve">ס׳ 968 לקוד האזרחי המצרי. הפרקטיקה המצרית דנה בכך תחת הכותרת "וַצְ׳ע אל-יַד" (הנחת היד) – ההחזקה בפועל כמקור קניין.</w:t>
+        <w:t xml:space="preserve">ס׳ 418 לקוד האזרחי המצרי (חוק מס׳ 131 לשנת 1948).</w:t>
       </w:r>
     </w:p>
   </w:footnote>
@@ -11295,7 +11701,7 @@
           <w:szCs w:val="20"/>
           <w:rtl/>
         </w:rPr>
-        <w:t xml:space="preserve">ס׳ 969 לקוד האזרחי המצרי.</w:t>
+        <w:t xml:space="preserve">ס׳ 934 לקוד האזרחי המצרי; ס׳ 9 לחוק ארגון הפומביות המקרקעית, חוק מס׳ 114 לשנת 1946. במצרים פועלות במקביל שתי שיטות רישום: רישום שטרות פרסונלי לפי חוק 114/1946, החולש על מרבית המדינה, ורישום זכויות קדסטרלי לפי חוק מס׳ 142 לשנת 1964, שתחולתו מוגבלת.</w:t>
       </w:r>
     </w:p>
   </w:footnote>
@@ -11313,12 +11719,38 @@
       </w:r>
       <w:r>
         <w:rPr>
-          <w:rFonts w:ascii="David" w:cs="David" w:eastAsia="David" w:hAnsi="David"/>
-          <w:sz w:val="20"/>
-          <w:szCs w:val="20"/>
-          <w:rtl/>
-        </w:rPr>
-        <w:t xml:space="preserve">ס׳ 970 לקוד האזרחי המצרי, כפי שתוקן בחוק מס׳ 55 לשנת 1970; ולנכסי הציבור ראו גם ס׳ 87(2) לקוד.</w:t>
+          <w:rFonts w:ascii="Times New Roman" w:cs="Times New Roman" w:eastAsia="Times New Roman" w:hAnsi="Times New Roman"/>
+          <w:sz w:val="20"/>
+          <w:szCs w:val="20"/>
+        </w:rPr>
+        <w:t xml:space="preserve">“More than 90% of Egypt’s Properties Are Unregistered: Justice Minister,” Daily News Egypt (Feb. 14, 2022); “Egypt’s Property Registration Rate Remains Below 10%…: World Bank,” Daily News Egypt (July 5, 2026)</w:t>
+      </w:r>
+      <w:r>
+        <w:rPr>
+          <w:rFonts w:ascii="David" w:cs="David" w:eastAsia="David" w:hAnsi="David"/>
+          <w:sz w:val="20"/>
+          <w:szCs w:val="20"/>
+          <w:rtl/>
+        </w:rPr>
+        <w:t xml:space="preserve">. הרנדו דה-סוטו ביסס על מצרים את מחקר "ההון המת" שלו: </w:t>
+      </w:r>
+      <w:r>
+        <w:rPr>
+          <w:rFonts w:ascii="David" w:cs="David" w:eastAsia="David" w:hAnsi="David"/>
+          <w:sz w:val="20"/>
+          <w:szCs w:val="20"/>
+          <w:rtl/>
+        </w:rPr>
+        <w:t xml:space="preserve">לעיל ה"ש 72</w:t>
+      </w:r>
+      <w:r>
+        <w:rPr>
+          <w:rFonts w:ascii="David" w:cs="David" w:eastAsia="David" w:hAnsi="David"/>
+          <w:sz w:val="20"/>
+          <w:szCs w:val="20"/>
+          <w:rtl/>
+        </w:rPr>
+        <w:t xml:space="preserve">.</w:t>
       </w:r>
     </w:p>
   </w:footnote>
@@ -11341,42 +11773,7 @@
           <w:szCs w:val="20"/>
           <w:rtl/>
         </w:rPr>
-        <w:t xml:space="preserve">להשוואה בין גישות שיטות הרישום להתיישנות רוכשת ראו </w:t>
-      </w:r>
-      <w:r>
-        <w:rPr>
-          <w:rFonts w:ascii="Times New Roman" w:cs="Times New Roman" w:eastAsia="Times New Roman" w:hAnsi="Times New Roman"/>
-          <w:sz w:val="20"/>
-          <w:szCs w:val="20"/>
-        </w:rPr>
-        <w:t xml:space="preserve">Shoked</w:t>
-      </w:r>
-      <w:r>
-        <w:rPr>
-          <w:rFonts w:ascii="David" w:cs="David" w:eastAsia="David" w:hAnsi="David"/>
-          <w:sz w:val="20"/>
-          <w:szCs w:val="20"/>
-          <w:rtl/>
-        </w:rPr>
-        <w:t xml:space="preserve">, </w:t>
-      </w:r>
-      <w:r>
-        <w:rPr>
-          <w:rFonts w:ascii="David" w:cs="David" w:eastAsia="David" w:hAnsi="David"/>
-          <w:sz w:val="20"/>
-          <w:szCs w:val="20"/>
-          <w:rtl/>
-        </w:rPr>
-        <w:t xml:space="preserve">לעיל ה"ש 83</w:t>
-      </w:r>
-      <w:r>
-        <w:rPr>
-          <w:rFonts w:ascii="David" w:cs="David" w:eastAsia="David" w:hAnsi="David"/>
-          <w:sz w:val="20"/>
-          <w:szCs w:val="20"/>
-          <w:rtl/>
-        </w:rPr>
-        <w:t xml:space="preserve">. ודוק: בישראל נחסם מסלול זה כמעט כליל – ס׳ 159(ב) לחוק המקרקעין שלל התיישנות במקרקעין מוסדרים, וחזקתו של בן משפחה מסווגת כ"חזקה מרשות"; ראו לעיל פרק ג.6.</w:t>
+        <w:t xml:space="preserve">ס׳ 715 לקוד האזרחי המצרי. בית המשפט החוקתי העליון של מצרים שב ואישר בשנת 2021 כי ייפוי כוח כזה אינו ניתן לביטול חד-צדדי. ואולם ס׳ 714 מורה כי השליחות פוקעת במות השולח – נקודת תורפה מרכזית של הפרקטיקה, שפסיקת בית המשפט לקסאציה בעניינה אינה אחידה.</w:t>
       </w:r>
     </w:p>
   </w:footnote>
@@ -11394,28 +11791,20 @@
       </w:r>
       <w:r>
         <w:rPr>
+          <w:rFonts w:ascii="David" w:cs="David" w:eastAsia="David" w:hAnsi="David"/>
+          <w:sz w:val="20"/>
+          <w:szCs w:val="20"/>
+          <w:rtl/>
+        </w:rPr>
+        <w:t xml:space="preserve">לפסיקת בית המשפט לקסאציה המצרי על תביעות אלה ראו הסקירות שבמאגרי לשכת עורכי הדין המצרית; ולתיאור אנליטי באנגלית ראו </w:t>
+      </w:r>
+      <w:r>
+        <w:rPr>
           <w:rFonts w:ascii="Times New Roman" w:cs="Times New Roman" w:eastAsia="Times New Roman" w:hAnsi="Times New Roman"/>
           <w:sz w:val="20"/>
           <w:szCs w:val="20"/>
         </w:rPr>
-        <w:t xml:space="preserve">“Sisi Orders Delaying Implementation of Controversial Real Estate Law for 2 Years,” Ahram Online (Feb. 28, 2021); “‘Unjust’: Egypt’s Property Registration Plans Face Popular Backlash,” Middle East Eye (2021)</w:t>
-      </w:r>
-      <w:r>
-        <w:rPr>
-          <w:rFonts w:ascii="David" w:cs="David" w:eastAsia="David" w:hAnsi="David"/>
-          <w:sz w:val="20"/>
-          <w:szCs w:val="20"/>
-          <w:rtl/>
-        </w:rPr>
-        <w:t xml:space="preserve">. לניתוח מדיניות ראו </w:t>
-      </w:r>
-      <w:r>
-        <w:rPr>
-          <w:rFonts w:ascii="Times New Roman" w:cs="Times New Roman" w:eastAsia="Times New Roman" w:hAnsi="Times New Roman"/>
-          <w:sz w:val="20"/>
-          <w:szCs w:val="20"/>
-        </w:rPr>
-        <w:t xml:space="preserve">“Real Estate Registration Law Amendments – Development Brief,” The Built Environment Observatory (May 2021)</w:t>
+        <w:t xml:space="preserve">David Sims, "Securing Land Tenure in Egypt: Who Needs Registered Titles?" Metropolitics (June 14, 2016)</w:t>
       </w:r>
       <w:r>
         <w:rPr>
@@ -11447,24 +11836,7 @@
           <w:szCs w:val="20"/>
           <w:rtl/>
         </w:rPr>
-        <w:t xml:space="preserve">חוק מס׳ 9 לשנת 2022 (מצרים), המתקן את חוק מס׳ 114 לשנת 1946; ראו </w:t>
-      </w:r>
-      <w:r>
-        <w:rPr>
-          <w:rFonts w:ascii="Times New Roman" w:cs="Times New Roman" w:eastAsia="Times New Roman" w:hAnsi="Times New Roman"/>
-          <w:sz w:val="20"/>
-          <w:szCs w:val="20"/>
-        </w:rPr>
-        <w:t xml:space="preserve">Shalakany Law Office, “New Amendments to Real Estate Registration Law” (2022)</w:t>
-      </w:r>
-      <w:r>
-        <w:rPr>
-          <w:rFonts w:ascii="David" w:cs="David" w:eastAsia="David" w:hAnsi="David"/>
-          <w:sz w:val="20"/>
-          <w:szCs w:val="20"/>
-          <w:rtl/>
-        </w:rPr>
-        <w:t xml:space="preserve">.</w:t>
+        <w:t xml:space="preserve">ס׳ 968 לקוד האזרחי המצרי. הפרקטיקה המצרית דנה בכך תחת הכותרת "וַצְ׳ע אל-יַד" (הנחת היד) – ההחזקה בפועל כמקור קניין.</w:t>
       </w:r>
     </w:p>
   </w:footnote>
@@ -11487,7 +11859,7 @@
           <w:szCs w:val="20"/>
           <w:rtl/>
         </w:rPr>
-        <w:t xml:space="preserve">ס׳ 2 לחוקת מצרים (2014); ס׳ 1 לקוד האזרחי המצרי (ובו מדרג: חקיקה, מנהג, עקרונות השריעה, עקרונות הצדק); חוק הירושה המצרי, חוק מס׳ 77 לשנת 1943; ולצוואות – חוק מס׳ 71 לשנת 1946.</w:t>
+        <w:t xml:space="preserve">ס׳ 969 לקוד האזרחי המצרי.</w:t>
       </w:r>
     </w:p>
   </w:footnote>
@@ -11510,24 +11882,7 @@
           <w:szCs w:val="20"/>
           <w:rtl/>
         </w:rPr>
-        <w:t xml:space="preserve">לתרגום האנגלי המקובל ראו </w:t>
-      </w:r>
-      <w:r>
-        <w:rPr>
-          <w:rFonts w:ascii="Times New Roman" w:cs="Times New Roman" w:eastAsia="Times New Roman" w:hAnsi="Times New Roman"/>
-          <w:sz w:val="20"/>
-          <w:szCs w:val="20"/>
-        </w:rPr>
-        <w:t xml:space="preserve">C.R. Tyser, D.G. Demetriades &amp; Ismail Haqqi Effendi (trans.), The Mejelle: Being an English Translation of Majallah el-Ahkam-i-Adliya (1901)</w:t>
-      </w:r>
-      <w:r>
-        <w:rPr>
-          <w:rFonts w:ascii="David" w:cs="David" w:eastAsia="David" w:hAnsi="David"/>
-          <w:sz w:val="20"/>
-          <w:szCs w:val="20"/>
-          <w:rtl/>
-        </w:rPr>
-        <w:t xml:space="preserve">; חוק לביטול המג׳לה, התשמ"ד-1984.</w:t>
+        <w:t xml:space="preserve">ס׳ 970 לקוד האזרחי המצרי, כפי שתוקן בחוק מס׳ 55 לשנת 1970; ולנכסי הציבור ראו גם ס׳ 87(2) לקוד.</w:t>
       </w:r>
     </w:p>
   </w:footnote>
@@ -11550,7 +11905,7 @@
           <w:szCs w:val="20"/>
           <w:rtl/>
         </w:rPr>
-        <w:t xml:space="preserve">ס׳ 837, 861–862 למג׳לה. לדוקטרינת ההִבָּה הקלאסית ראו </w:t>
+        <w:t xml:space="preserve">להשוואה בין גישות שיטות הרישום להתיישנות רוכשת ראו </w:t>
       </w:r>
       <w:r>
         <w:rPr>
@@ -11558,16 +11913,34 @@
           <w:sz w:val="20"/>
           <w:szCs w:val="20"/>
         </w:rPr>
-        <w:t xml:space="preserve">Joseph Schacht, An Introduction to Islamic Law (1964); Y. Linant de Bellefonds, “Hiba,” in The Encyclopaedia of Islam (2d ed.)</w:t>
-      </w:r>
-      <w:r>
-        <w:rPr>
-          <w:rFonts w:ascii="David" w:cs="David" w:eastAsia="David" w:hAnsi="David"/>
-          <w:sz w:val="20"/>
-          <w:szCs w:val="20"/>
-          <w:rtl/>
-        </w:rPr>
-        <w:t xml:space="preserve">.</w:t>
+        <w:t xml:space="preserve">Shoked</w:t>
+      </w:r>
+      <w:r>
+        <w:rPr>
+          <w:rFonts w:ascii="David" w:cs="David" w:eastAsia="David" w:hAnsi="David"/>
+          <w:sz w:val="20"/>
+          <w:szCs w:val="20"/>
+          <w:rtl/>
+        </w:rPr>
+        <w:t xml:space="preserve">, </w:t>
+      </w:r>
+      <w:r>
+        <w:rPr>
+          <w:rFonts w:ascii="David" w:cs="David" w:eastAsia="David" w:hAnsi="David"/>
+          <w:sz w:val="20"/>
+          <w:szCs w:val="20"/>
+          <w:rtl/>
+        </w:rPr>
+        <w:t xml:space="preserve">לעיל ה"ש 88</w:t>
+      </w:r>
+      <w:r>
+        <w:rPr>
+          <w:rFonts w:ascii="David" w:cs="David" w:eastAsia="David" w:hAnsi="David"/>
+          <w:sz w:val="20"/>
+          <w:szCs w:val="20"/>
+          <w:rtl/>
+        </w:rPr>
+        <w:t xml:space="preserve">. ודוק: בישראל נחסם מסלול זה כמעט כליל – ס׳ 159(ב) לחוק המקרקעין שלל התיישנות במקרקעין מוסדרים, וחזקתו של בן משפחה מסווגת כ"חזקה מרשות"; ראו לעיל פרק ג.6.</w:t>
       </w:r>
     </w:p>
   </w:footnote>
@@ -11585,12 +11958,37 @@
       </w:r>
       <w:r>
         <w:rPr>
-          <w:rFonts w:ascii="David" w:cs="David" w:eastAsia="David" w:hAnsi="David"/>
-          <w:sz w:val="20"/>
-          <w:szCs w:val="20"/>
-          <w:rtl/>
-        </w:rPr>
-        <w:t xml:space="preserve">ס׳ 866 למג׳לה; וכן ס׳ 872 – מות אחד הצדדים חוסם את החזרה.</w:t>
+          <w:rFonts w:ascii="Times New Roman" w:cs="Times New Roman" w:eastAsia="Times New Roman" w:hAnsi="Times New Roman"/>
+          <w:sz w:val="20"/>
+          <w:szCs w:val="20"/>
+        </w:rPr>
+        <w:t xml:space="preserve">“Sisi Orders Delaying Implementation of Controversial Real Estate Law for 2 Years,” Ahram Online (Feb. 28, 2021); “‘Unjust’: Egypt’s Property Registration Plans Face Popular Backlash,” Middle East Eye (2021)</w:t>
+      </w:r>
+      <w:r>
+        <w:rPr>
+          <w:rFonts w:ascii="David" w:cs="David" w:eastAsia="David" w:hAnsi="David"/>
+          <w:sz w:val="20"/>
+          <w:szCs w:val="20"/>
+          <w:rtl/>
+        </w:rPr>
+        <w:t xml:space="preserve">. לניתוח מדיניות ראו </w:t>
+      </w:r>
+      <w:r>
+        <w:rPr>
+          <w:rFonts w:ascii="Times New Roman" w:cs="Times New Roman" w:eastAsia="Times New Roman" w:hAnsi="Times New Roman"/>
+          <w:sz w:val="20"/>
+          <w:szCs w:val="20"/>
+        </w:rPr>
+        <w:t xml:space="preserve">“Real Estate Registration Law Amendments – Development Brief,” The Built Environment Observatory (May 2021)</w:t>
+      </w:r>
+      <w:r>
+        <w:rPr>
+          <w:rFonts w:ascii="David" w:cs="David" w:eastAsia="David" w:hAnsi="David"/>
+          <w:sz w:val="20"/>
+          <w:szCs w:val="20"/>
+          <w:rtl/>
+        </w:rPr>
+        <w:t xml:space="preserve">.</w:t>
       </w:r>
     </w:p>
   </w:footnote>
@@ -11613,7 +12011,7 @@
           <w:szCs w:val="20"/>
           <w:rtl/>
         </w:rPr>
-        <w:t xml:space="preserve">ס׳ 879 למג׳לה; לדיון עדכני ראו </w:t>
+        <w:t xml:space="preserve">חוק מס׳ 9 לשנת 2022 (מצרים), המתקן את חוק מס׳ 114 לשנת 1946; ראו </w:t>
       </w:r>
       <w:r>
         <w:rPr>
@@ -11621,7 +12019,7 @@
           <w:sz w:val="20"/>
           <w:szCs w:val="20"/>
         </w:rPr>
-        <w:t xml:space="preserve">Siti Norfatirah Abdul Rahmani &amp; Mohd Zamro Muda, “Ownership Status of Hibah Marad al-Mawt,” 34(8) al-Qanatir Int’l J. Islamic Stud. (2025)</w:t>
+        <w:t xml:space="preserve">Shalakany Law Office, “New Amendments to Real Estate Registration Law” (2022)</w:t>
       </w:r>
       <w:r>
         <w:rPr>
@@ -11653,42 +12051,7 @@
           <w:szCs w:val="20"/>
           <w:rtl/>
         </w:rPr>
-        <w:t xml:space="preserve">להוראת המעבר ראו ראבילו, </w:t>
-      </w:r>
-      <w:r>
-        <w:rPr>
-          <w:rFonts w:ascii="David" w:cs="David" w:eastAsia="David" w:hAnsi="David"/>
-          <w:sz w:val="20"/>
-          <w:szCs w:val="20"/>
-          <w:rtl/>
-        </w:rPr>
-        <w:t xml:space="preserve">לעיל ה"ש 32</w:t>
-      </w:r>
-      <w:r>
-        <w:rPr>
-          <w:rFonts w:ascii="David" w:cs="David" w:eastAsia="David" w:hAnsi="David"/>
-          <w:sz w:val="20"/>
-          <w:szCs w:val="20"/>
-          <w:rtl/>
-        </w:rPr>
-        <w:t xml:space="preserve">, בעמ׳ 333–337, המתאר את הדין ערב חוק המתנה; והשוו </w:t>
-      </w:r>
-      <w:r>
-        <w:rPr>
-          <w:rFonts w:ascii="Times New Roman" w:cs="Times New Roman" w:eastAsia="Times New Roman" w:hAnsi="Times New Roman"/>
-          <w:sz w:val="20"/>
-          <w:szCs w:val="20"/>
-        </w:rPr>
-        <w:t xml:space="preserve">L. Landau, “The Gift Law, 1968,” 4 Isr. L. Rev. 260 (1969)</w:t>
-      </w:r>
-      <w:r>
-        <w:rPr>
-          <w:rFonts w:ascii="David" w:cs="David" w:eastAsia="David" w:hAnsi="David"/>
-          <w:sz w:val="20"/>
-          <w:szCs w:val="20"/>
-          <w:rtl/>
-        </w:rPr>
-        <w:t xml:space="preserve">, על החלפת דיני ההִבָּה של המג׳לה בחוק המתנה הישראלי.</w:t>
+        <w:t xml:space="preserve">ס׳ 2 לחוקת מצרים (2014); ס׳ 1 לקוד האזרחי המצרי (ובו מדרג: חקיקה, מנהג, עקרונות השריעה, עקרונות הצדק); חוק הירושה המצרי, חוק מס׳ 77 לשנת 1943; ולצוואות – חוק מס׳ 71 לשנת 1946.</w:t>
       </w:r>
     </w:p>
   </w:footnote>
@@ -11711,7 +12074,24 @@
           <w:szCs w:val="20"/>
           <w:rtl/>
         </w:rPr>
-        <w:t xml:space="preserve">ס׳ 1660 למג׳לה (ולתביעות בעניין יסוד הוקף – 36 שנים, ס׳ 1661).</w:t>
+        <w:t xml:space="preserve">לתרגום האנגלי המקובל ראו </w:t>
+      </w:r>
+      <w:r>
+        <w:rPr>
+          <w:rFonts w:ascii="Times New Roman" w:cs="Times New Roman" w:eastAsia="Times New Roman" w:hAnsi="Times New Roman"/>
+          <w:sz w:val="20"/>
+          <w:szCs w:val="20"/>
+        </w:rPr>
+        <w:t xml:space="preserve">C.R. Tyser, D.G. Demetriades &amp; Ismail Haqqi Effendi (trans.), The Mejelle: Being an English Translation of Majallah el-Ahkam-i-Adliya (1901)</w:t>
+      </w:r>
+      <w:r>
+        <w:rPr>
+          <w:rFonts w:ascii="David" w:cs="David" w:eastAsia="David" w:hAnsi="David"/>
+          <w:sz w:val="20"/>
+          <w:szCs w:val="20"/>
+          <w:rtl/>
+        </w:rPr>
+        <w:t xml:space="preserve">; חוק לביטול המג׳לה, התשמ"ד-1984.</w:t>
       </w:r>
     </w:p>
   </w:footnote>
@@ -11734,7 +12114,24 @@
           <w:szCs w:val="20"/>
           <w:rtl/>
         </w:rPr>
-        <w:t xml:space="preserve">ס׳ 1674 למג׳לה. ההקבלה לס׳ 2 לחוק ההתיישנות, התשי"ח-1958, שאף הוא קובע התיישנות דיונית שאינה מפקיעה את הזכות, גלויה לעין.</w:t>
+        <w:t xml:space="preserve">ס׳ 837, 861–862 למג׳לה. לדוקטרינת ההִבָּה הקלאסית ראו </w:t>
+      </w:r>
+      <w:r>
+        <w:rPr>
+          <w:rFonts w:ascii="Times New Roman" w:cs="Times New Roman" w:eastAsia="Times New Roman" w:hAnsi="Times New Roman"/>
+          <w:sz w:val="20"/>
+          <w:szCs w:val="20"/>
+        </w:rPr>
+        <w:t xml:space="preserve">Joseph Schacht, An Introduction to Islamic Law (1964); Y. Linant de Bellefonds, “Hiba,” in The Encyclopaedia of Islam (2d ed.)</w:t>
+      </w:r>
+      <w:r>
+        <w:rPr>
+          <w:rFonts w:ascii="David" w:cs="David" w:eastAsia="David" w:hAnsi="David"/>
+          <w:sz w:val="20"/>
+          <w:szCs w:val="20"/>
+          <w:rtl/>
+        </w:rPr>
+        <w:t xml:space="preserve">.</w:t>
       </w:r>
     </w:p>
   </w:footnote>
@@ -11757,42 +12154,7 @@
           <w:szCs w:val="20"/>
           <w:rtl/>
         </w:rPr>
-        <w:t xml:space="preserve">ס׳ 20 ו-78 לחוק הקרקעות העות׳מאני, 1858. להיסטוריה של יישום הוראות אלה בארץ ישראל ולגלגולן בפסיקה הישראלית ראו </w:t>
-      </w:r>
-      <w:r>
-        <w:rPr>
-          <w:rFonts w:ascii="Times New Roman" w:cs="Times New Roman" w:eastAsia="Times New Roman" w:hAnsi="Times New Roman"/>
-          <w:sz w:val="20"/>
-          <w:szCs w:val="20"/>
-        </w:rPr>
-        <w:t xml:space="preserve">Ahmad Amara, “Dispossession by Law: How the Israeli Judicial System Utilizes Ottoman Land Law to Expel and Dispossess the Bedouins,” J. Levantine Stud. (2015)</w:t>
-      </w:r>
-      <w:r>
-        <w:rPr>
-          <w:rFonts w:ascii="David" w:cs="David" w:eastAsia="David" w:hAnsi="David"/>
-          <w:sz w:val="20"/>
-          <w:szCs w:val="20"/>
-          <w:rtl/>
-        </w:rPr>
-        <w:t xml:space="preserve">; זנדברג, </w:t>
-      </w:r>
-      <w:r>
-        <w:rPr>
-          <w:rFonts w:ascii="David" w:cs="David" w:eastAsia="David" w:hAnsi="David"/>
-          <w:sz w:val="20"/>
-          <w:szCs w:val="20"/>
-          <w:rtl/>
-        </w:rPr>
-        <w:t xml:space="preserve">לעיל ה"ש 10</w:t>
-      </w:r>
-      <w:r>
-        <w:rPr>
-          <w:rFonts w:ascii="David" w:cs="David" w:eastAsia="David" w:hAnsi="David"/>
-          <w:sz w:val="20"/>
-          <w:szCs w:val="20"/>
-          <w:rtl/>
-        </w:rPr>
-        <w:t xml:space="preserve">.</w:t>
+        <w:t xml:space="preserve">ס׳ 866 למג׳לה; וכן ס׳ 872 – מות אחד הצדדים חוסם את החזרה.</w:t>
       </w:r>
     </w:p>
   </w:footnote>
@@ -11815,7 +12177,7 @@
           <w:szCs w:val="20"/>
           <w:rtl/>
         </w:rPr>
-        <w:t xml:space="preserve">ס׳ 1521 למג׳לה. השליחות פוקעת ככלל במות השולח – כלל שהעמיד בסימן שאלה את ייפויי הכוח הוותיקים שנועדו לפעול "לאחר אריכות ימים". לניסוח מודרני של דיני הוַכַּאלָה ראו </w:t>
+        <w:t xml:space="preserve">ס׳ 879 למג׳לה; לדיון עדכני ראו </w:t>
       </w:r>
       <w:r>
         <w:rPr>
@@ -11823,7 +12185,7 @@
           <w:sz w:val="20"/>
           <w:szCs w:val="20"/>
         </w:rPr>
-        <w:t xml:space="preserve">AAOIFI, Shari’ah Standard No. 23: Agency (2015)</w:t>
+        <w:t xml:space="preserve">Siti Norfatirah Abdul Rahmani &amp; Mohd Zamro Muda, “Ownership Status of Hibah Marad al-Mawt,” 34(8) al-Qanatir Int’l J. Islamic Stud. (2025)</w:t>
       </w:r>
       <w:r>
         <w:rPr>
@@ -11850,20 +12212,47 @@
       </w:r>
       <w:r>
         <w:rPr>
+          <w:rFonts w:ascii="David" w:cs="David" w:eastAsia="David" w:hAnsi="David"/>
+          <w:sz w:val="20"/>
+          <w:szCs w:val="20"/>
+          <w:rtl/>
+        </w:rPr>
+        <w:t xml:space="preserve">להוראת המעבר ראו ראבילו, </w:t>
+      </w:r>
+      <w:r>
+        <w:rPr>
+          <w:rFonts w:ascii="David" w:cs="David" w:eastAsia="David" w:hAnsi="David"/>
+          <w:sz w:val="20"/>
+          <w:szCs w:val="20"/>
+          <w:rtl/>
+        </w:rPr>
+        <w:t xml:space="preserve">לעיל ה"ש 34</w:t>
+      </w:r>
+      <w:r>
+        <w:rPr>
+          <w:rFonts w:ascii="David" w:cs="David" w:eastAsia="David" w:hAnsi="David"/>
+          <w:sz w:val="20"/>
+          <w:szCs w:val="20"/>
+          <w:rtl/>
+        </w:rPr>
+        <w:t xml:space="preserve">, בעמ׳ 333–337, המתאר את הדין ערב חוק המתנה; והשוו </w:t>
+      </w:r>
+      <w:r>
+        <w:rPr>
           <w:rFonts w:ascii="Times New Roman" w:cs="Times New Roman" w:eastAsia="Times New Roman" w:hAnsi="Times New Roman"/>
           <w:sz w:val="20"/>
           <w:szCs w:val="20"/>
         </w:rPr>
-        <w:t xml:space="preserve">N.J. Coulson, Succession in the Muslim Family (1971)</w:t>
-      </w:r>
-      <w:r>
-        <w:rPr>
-          <w:rFonts w:ascii="David" w:cs="David" w:eastAsia="David" w:hAnsi="David"/>
-          <w:sz w:val="20"/>
-          <w:szCs w:val="20"/>
-          <w:rtl/>
-        </w:rPr>
-        <w:t xml:space="preserve">.</w:t>
+        <w:t xml:space="preserve">L. Landau, “The Gift Law, 1968,” 4 Isr. L. Rev. 260 (1969)</w:t>
+      </w:r>
+      <w:r>
+        <w:rPr>
+          <w:rFonts w:ascii="David" w:cs="David" w:eastAsia="David" w:hAnsi="David"/>
+          <w:sz w:val="20"/>
+          <w:szCs w:val="20"/>
+          <w:rtl/>
+        </w:rPr>
+        <w:t xml:space="preserve">, על החלפת דיני ההִבָּה של המג׳לה בחוק המתנה הישראלי.</w:t>
       </w:r>
     </w:p>
   </w:footnote>
@@ -11881,37 +12270,12 @@
       </w:r>
       <w:r>
         <w:rPr>
-          <w:rFonts w:ascii="Times New Roman" w:cs="Times New Roman" w:eastAsia="Times New Roman" w:hAnsi="Times New Roman"/>
-          <w:sz w:val="20"/>
-          <w:szCs w:val="20"/>
-        </w:rPr>
-        <w:t xml:space="preserve">Annelies Moors, Women, Property and Islam: Palestinian Experiences, 1920–1990 (1995)</w:t>
-      </w:r>
-      <w:r>
-        <w:rPr>
-          <w:rFonts w:ascii="David" w:cs="David" w:eastAsia="David" w:hAnsi="David"/>
-          <w:sz w:val="20"/>
-          <w:szCs w:val="20"/>
-          <w:rtl/>
-        </w:rPr>
-        <w:t xml:space="preserve">; ולפרקטיקה בבתי הדין השרעיים בישראל ראו </w:t>
-      </w:r>
-      <w:r>
-        <w:rPr>
-          <w:rFonts w:ascii="Times New Roman" w:cs="Times New Roman" w:eastAsia="Times New Roman" w:hAnsi="Times New Roman"/>
-          <w:sz w:val="20"/>
-          <w:szCs w:val="20"/>
-        </w:rPr>
-        <w:t xml:space="preserve">Aharon Layish, Women and Islamic Law in a Non-Muslim State (1975)</w:t>
-      </w:r>
-      <w:r>
-        <w:rPr>
-          <w:rFonts w:ascii="David" w:cs="David" w:eastAsia="David" w:hAnsi="David"/>
-          <w:sz w:val="20"/>
-          <w:szCs w:val="20"/>
-          <w:rtl/>
-        </w:rPr>
-        <w:t xml:space="preserve">.</w:t>
+          <w:rFonts w:ascii="David" w:cs="David" w:eastAsia="David" w:hAnsi="David"/>
+          <w:sz w:val="20"/>
+          <w:szCs w:val="20"/>
+          <w:rtl/>
+        </w:rPr>
+        <w:t xml:space="preserve">ס׳ 1660 למג׳לה (ולתביעות בעניין יסוד הוקף – 36 שנים, ס׳ 1661).</w:t>
       </w:r>
     </w:p>
   </w:footnote>
@@ -11929,38 +12293,12 @@
       </w:r>
       <w:r>
         <w:rPr>
-          <w:rFonts w:ascii="Times New Roman" w:cs="Times New Roman" w:eastAsia="Times New Roman" w:hAnsi="Times New Roman"/>
-          <w:sz w:val="20"/>
-          <w:szCs w:val="20"/>
-        </w:rPr>
-        <w:t xml:space="preserve">Ruth Kark, “Consequences of the Ottoman Land Law: Agrarian and Privatization Processes in Palestine, 1858–1918,” in Societies, Social Inequalities and Marginalization 101 (R. Chand et al. eds., 2017)</w:t>
-      </w:r>
-      <w:r>
-        <w:rPr>
-          <w:rFonts w:ascii="David" w:cs="David" w:eastAsia="David" w:hAnsi="David"/>
-          <w:sz w:val="20"/>
-          <w:szCs w:val="20"/>
-          <w:rtl/>
-        </w:rPr>
-        <w:t xml:space="preserve">; נדן, </w:t>
-      </w:r>
-      <w:r>
-        <w:rPr>
-          <w:rFonts w:ascii="David" w:cs="David" w:eastAsia="David" w:hAnsi="David"/>
-          <w:sz w:val="20"/>
-          <w:szCs w:val="20"/>
-          <w:rtl/>
-        </w:rPr>
-        <w:t xml:space="preserve">לעיל ה"ש 14</w:t>
-      </w:r>
-      <w:r>
-        <w:rPr>
-          <w:rFonts w:ascii="David" w:cs="David" w:eastAsia="David" w:hAnsi="David"/>
-          <w:sz w:val="20"/>
-          <w:szCs w:val="20"/>
-          <w:rtl/>
-        </w:rPr>
-        <w:t xml:space="preserve">.</w:t>
+          <w:rFonts w:ascii="David" w:cs="David" w:eastAsia="David" w:hAnsi="David"/>
+          <w:sz w:val="20"/>
+          <w:szCs w:val="20"/>
+          <w:rtl/>
+        </w:rPr>
+        <w:t xml:space="preserve">ס׳ 1674 למג׳לה. ההקבלה לס׳ 2 לחוק ההתיישנות, התשי"ח-1958, שאף הוא קובע התיישנות דיונית שאינה מפקיעה את הזכות, גלויה לעין.</w:t>
       </w:r>
     </w:p>
   </w:footnote>
@@ -11983,7 +12321,7 @@
           <w:szCs w:val="20"/>
           <w:rtl/>
         </w:rPr>
-        <w:t xml:space="preserve">ראו לעיל פרק ה ופרק ו.2.4; והשוו </w:t>
+        <w:t xml:space="preserve">ס׳ 20 ו-78 לחוק הקרקעות העות׳מאני, 1858. להיסטוריה של יישום הוראות אלה בארץ ישראל ולגלגולן בפסיקה הישראלית ראו </w:t>
       </w:r>
       <w:r>
         <w:rPr>
@@ -11991,7 +12329,25 @@
           <w:sz w:val="20"/>
           <w:szCs w:val="20"/>
         </w:rPr>
-        <w:t xml:space="preserve">Kareem Ibrahim &amp; Deena Khalil, “Land Titling: A Tool, not a Panacea — Insights from Egypt,” Metropolitics (Dec. 20, 2016)</w:t>
+        <w:t xml:space="preserve">Ahmad Amara, “Dispossession by Law: How the Israeli Judicial System Utilizes Ottoman Land Law to Expel and Dispossess the Bedouins,” J. Levantine Stud. (2015)</w:t>
+      </w:r>
+      <w:r>
+        <w:rPr>
+          <w:rFonts w:ascii="David" w:cs="David" w:eastAsia="David" w:hAnsi="David"/>
+          <w:sz w:val="20"/>
+          <w:szCs w:val="20"/>
+          <w:rtl/>
+        </w:rPr>
+        <w:t xml:space="preserve">; זנדברג, </w:t>
+      </w:r>
+      <w:r>
+        <w:rPr>
+          <w:rFonts w:ascii="David" w:cs="David" w:eastAsia="David" w:hAnsi="David"/>
+          <w:sz w:val="20"/>
+          <w:szCs w:val="20"/>
+          <w:rtl/>
+        </w:rPr>
+        <w:t xml:space="preserve">לעיל ה"ש 10</w:t>
       </w:r>
       <w:r>
         <w:rPr>
@@ -12023,6 +12379,214 @@
           <w:szCs w:val="20"/>
           <w:rtl/>
         </w:rPr>
+        <w:t xml:space="preserve">ס׳ 1521 למג׳לה. השליחות פוקעת ככלל במות השולח – כלל שהעמיד בסימן שאלה את ייפויי הכוח הוותיקים שנועדו לפעול "לאחר אריכות ימים". לניסוח מודרני של דיני הוַכַּאלָה ראו </w:t>
+      </w:r>
+      <w:r>
+        <w:rPr>
+          <w:rFonts w:ascii="Times New Roman" w:cs="Times New Roman" w:eastAsia="Times New Roman" w:hAnsi="Times New Roman"/>
+          <w:sz w:val="20"/>
+          <w:szCs w:val="20"/>
+        </w:rPr>
+        <w:t xml:space="preserve">AAOIFI, Shari’ah Standard No. 23: Agency (2015)</w:t>
+      </w:r>
+      <w:r>
+        <w:rPr>
+          <w:rFonts w:ascii="David" w:cs="David" w:eastAsia="David" w:hAnsi="David"/>
+          <w:sz w:val="20"/>
+          <w:szCs w:val="20"/>
+          <w:rtl/>
+        </w:rPr>
+        <w:t xml:space="preserve">.</w:t>
+      </w:r>
+    </w:p>
+  </w:footnote>
+  <w:footnote w:id="110">
+    <w:p>
+      <w:pPr>
+        <w:bidi/>
+        <w:spacing w:after="60"/>
+      </w:pPr>
+      <w:r>
+        <w:rPr>
+          <w:rStyle w:val="FootnoteReference"/>
+        </w:rPr>
+        <w:footnoteRef/>
+      </w:r>
+      <w:r>
+        <w:rPr>
+          <w:rFonts w:ascii="Times New Roman" w:cs="Times New Roman" w:eastAsia="Times New Roman" w:hAnsi="Times New Roman"/>
+          <w:sz w:val="20"/>
+          <w:szCs w:val="20"/>
+        </w:rPr>
+        <w:t xml:space="preserve">N.J. Coulson, Succession in the Muslim Family (1971)</w:t>
+      </w:r>
+      <w:r>
+        <w:rPr>
+          <w:rFonts w:ascii="David" w:cs="David" w:eastAsia="David" w:hAnsi="David"/>
+          <w:sz w:val="20"/>
+          <w:szCs w:val="20"/>
+          <w:rtl/>
+        </w:rPr>
+        <w:t xml:space="preserve">.</w:t>
+      </w:r>
+    </w:p>
+  </w:footnote>
+  <w:footnote w:id="111">
+    <w:p>
+      <w:pPr>
+        <w:bidi/>
+        <w:spacing w:after="60"/>
+      </w:pPr>
+      <w:r>
+        <w:rPr>
+          <w:rStyle w:val="FootnoteReference"/>
+        </w:rPr>
+        <w:footnoteRef/>
+      </w:r>
+      <w:r>
+        <w:rPr>
+          <w:rFonts w:ascii="Times New Roman" w:cs="Times New Roman" w:eastAsia="Times New Roman" w:hAnsi="Times New Roman"/>
+          <w:sz w:val="20"/>
+          <w:szCs w:val="20"/>
+        </w:rPr>
+        <w:t xml:space="preserve">Annelies Moors, Women, Property and Islam: Palestinian Experiences, 1920–1990 (1995)</w:t>
+      </w:r>
+      <w:r>
+        <w:rPr>
+          <w:rFonts w:ascii="David" w:cs="David" w:eastAsia="David" w:hAnsi="David"/>
+          <w:sz w:val="20"/>
+          <w:szCs w:val="20"/>
+          <w:rtl/>
+        </w:rPr>
+        <w:t xml:space="preserve">; ולפרקטיקה בבתי הדין השרעיים בישראל ראו </w:t>
+      </w:r>
+      <w:r>
+        <w:rPr>
+          <w:rFonts w:ascii="Times New Roman" w:cs="Times New Roman" w:eastAsia="Times New Roman" w:hAnsi="Times New Roman"/>
+          <w:sz w:val="20"/>
+          <w:szCs w:val="20"/>
+        </w:rPr>
+        <w:t xml:space="preserve">Aharon Layish, Women and Islamic Law in a Non-Muslim State (1975)</w:t>
+      </w:r>
+      <w:r>
+        <w:rPr>
+          <w:rFonts w:ascii="David" w:cs="David" w:eastAsia="David" w:hAnsi="David"/>
+          <w:sz w:val="20"/>
+          <w:szCs w:val="20"/>
+          <w:rtl/>
+        </w:rPr>
+        <w:t xml:space="preserve">.</w:t>
+      </w:r>
+    </w:p>
+  </w:footnote>
+  <w:footnote w:id="112">
+    <w:p>
+      <w:pPr>
+        <w:bidi/>
+        <w:spacing w:after="60"/>
+      </w:pPr>
+      <w:r>
+        <w:rPr>
+          <w:rStyle w:val="FootnoteReference"/>
+        </w:rPr>
+        <w:footnoteRef/>
+      </w:r>
+      <w:r>
+        <w:rPr>
+          <w:rFonts w:ascii="Times New Roman" w:cs="Times New Roman" w:eastAsia="Times New Roman" w:hAnsi="Times New Roman"/>
+          <w:sz w:val="20"/>
+          <w:szCs w:val="20"/>
+        </w:rPr>
+        <w:t xml:space="preserve">Ruth Kark, “Consequences of the Ottoman Land Law: Agrarian and Privatization Processes in Palestine, 1858–1918,” in Societies, Social Inequalities and Marginalization 101 (R. Chand et al. eds., 2017)</w:t>
+      </w:r>
+      <w:r>
+        <w:rPr>
+          <w:rFonts w:ascii="David" w:cs="David" w:eastAsia="David" w:hAnsi="David"/>
+          <w:sz w:val="20"/>
+          <w:szCs w:val="20"/>
+          <w:rtl/>
+        </w:rPr>
+        <w:t xml:space="preserve">; נדן, </w:t>
+      </w:r>
+      <w:r>
+        <w:rPr>
+          <w:rFonts w:ascii="David" w:cs="David" w:eastAsia="David" w:hAnsi="David"/>
+          <w:sz w:val="20"/>
+          <w:szCs w:val="20"/>
+          <w:rtl/>
+        </w:rPr>
+        <w:t xml:space="preserve">לעיל ה"ש 14</w:t>
+      </w:r>
+      <w:r>
+        <w:rPr>
+          <w:rFonts w:ascii="David" w:cs="David" w:eastAsia="David" w:hAnsi="David"/>
+          <w:sz w:val="20"/>
+          <w:szCs w:val="20"/>
+          <w:rtl/>
+        </w:rPr>
+        <w:t xml:space="preserve">.</w:t>
+      </w:r>
+    </w:p>
+  </w:footnote>
+  <w:footnote w:id="113">
+    <w:p>
+      <w:pPr>
+        <w:bidi/>
+        <w:spacing w:after="60"/>
+      </w:pPr>
+      <w:r>
+        <w:rPr>
+          <w:rStyle w:val="FootnoteReference"/>
+        </w:rPr>
+        <w:footnoteRef/>
+      </w:r>
+      <w:r>
+        <w:rPr>
+          <w:rFonts w:ascii="David" w:cs="David" w:eastAsia="David" w:hAnsi="David"/>
+          <w:sz w:val="20"/>
+          <w:szCs w:val="20"/>
+          <w:rtl/>
+        </w:rPr>
+        <w:t xml:space="preserve">ראו לעיל פרק ה ופרק ו.2.4; והשוו </w:t>
+      </w:r>
+      <w:r>
+        <w:rPr>
+          <w:rFonts w:ascii="Times New Roman" w:cs="Times New Roman" w:eastAsia="Times New Roman" w:hAnsi="Times New Roman"/>
+          <w:sz w:val="20"/>
+          <w:szCs w:val="20"/>
+        </w:rPr>
+        <w:t xml:space="preserve">Kareem Ibrahim &amp; Deena Khalil, “Land Titling: A Tool, not a Panacea — Insights from Egypt,” Metropolitics (Dec. 20, 2016)</w:t>
+      </w:r>
+      <w:r>
+        <w:rPr>
+          <w:rFonts w:ascii="David" w:cs="David" w:eastAsia="David" w:hAnsi="David"/>
+          <w:sz w:val="20"/>
+          <w:szCs w:val="20"/>
+          <w:rtl/>
+        </w:rPr>
+        <w:t xml:space="preserve">.</w:t>
+      </w:r>
+    </w:p>
+  </w:footnote>
+  <w:footnote w:id="114">
+    <w:p>
+      <w:pPr>
+        <w:bidi/>
+        <w:spacing w:after="60"/>
+      </w:pPr>
+      <w:r>
+        <w:rPr>
+          <w:rStyle w:val="FootnoteReference"/>
+        </w:rPr>
+        <w:footnoteRef/>
+      </w:r>
+      <w:r>
+        <w:rPr>
+          <w:rFonts w:ascii="David" w:cs="David" w:eastAsia="David" w:hAnsi="David"/>
+          <w:sz w:val="20"/>
+          <w:szCs w:val="20"/>
+          <w:rtl/>
+        </w:rPr>
         <w:t xml:space="preserve">עניין </w:t>
       </w:r>
       <w:r>
@@ -12065,7 +12629,7 @@
       </w:r>
     </w:p>
   </w:footnote>
-  <w:footnote w:id="110">
+  <w:footnote w:id="115">
     <w:p>
       <w:pPr>
         <w:bidi/>
@@ -12093,7 +12657,7 @@
           <w:szCs w:val="20"/>
           <w:rtl/>
         </w:rPr>
-        <w:t xml:space="preserve">לעיל ה"ש 35</w:t>
+        <w:t xml:space="preserve">לעיל ה"ש 37</w:t>
       </w:r>
       <w:r>
         <w:rPr>
@@ -12106,7 +12670,7 @@
       </w:r>
     </w:p>
   </w:footnote>
-  <w:footnote w:id="111">
+  <w:footnote w:id="116">
     <w:p>
       <w:pPr>
         <w:bidi/>
@@ -12151,7 +12715,7 @@
           <w:szCs w:val="20"/>
           <w:rtl/>
         </w:rPr>
-        <w:t xml:space="preserve">לעיל ה"ש 78</w:t>
+        <w:t xml:space="preserve">לעיל ה"ש 82</w:t>
       </w:r>
       <w:r>
         <w:rPr>
@@ -12164,7 +12728,7 @@
       </w:r>
     </w:p>
   </w:footnote>
-  <w:footnote w:id="112">
+  <w:footnote w:id="117">
     <w:p>
       <w:pPr>
         <w:bidi/>
@@ -12187,7 +12751,7 @@
       </w:r>
     </w:p>
   </w:footnote>
-  <w:footnote w:id="113">
+  <w:footnote w:id="118">
     <w:p>
       <w:pPr>
         <w:bidi/>

</xml_diff>

<commit_message>
Correct the Hoch citation: district judgment vs. interim SC decision
The full text showed CA 4116/20 (17.9.2020) is an interim-relief decision
by Justice Baron, not a judgment dismissing the claim; the dismissal is the
Jerusalem District Court judgment (OM 48783-04-18, 4.5.2020). Recast the
footnote to cite the district judgment for the holding, added the point
that non-registration during the donor's lifetime deprived the heirs of
the ability to examine the claims, and noted the interim no-disposition
order. Bibliography updated with both entries.

Co-Authored-By: Claude Fable 5 <noreply@anthropic.com>
Claude-Session: https://claude.ai/code/session_01PTzmkyUzTNm9DT35momqLP
</commit_message>
<xml_diff>
--- a/seminar/סמינריון-מקרקעין-לא-רשומים.docx
+++ b/seminar/סמינריון-מקרקעין-לא-רשומים.docx
@@ -5918,7 +5918,7 @@
           <w:szCs w:val="24"/>
           <w:rtl/>
         </w:rPr>
-        <w:t xml:space="preserve">ע"א 4116/20 </w:t>
+        <w:t xml:space="preserve">ה"פ (מחוזי י-ם) 48783-04-18 </w:t>
       </w:r>
       <w:r>
         <w:rPr>
@@ -5938,7 +5938,44 @@
           <w:szCs w:val="24"/>
           <w:rtl/>
         </w:rPr>
-        <w:t xml:space="preserve"> (נבו 17.9.2020).</w:t>
+        <w:t xml:space="preserve"> (נבו 4.5.2020).</w:t>
+      </w:r>
+    </w:p>
+    <w:p>
+      <w:pPr>
+        <w:bidi/>
+        <w:spacing w:after="120" w:line="300"/>
+        <w:ind w:start="420" w:hanging="420"/>
+        <w:jc w:val="both"/>
+      </w:pPr>
+      <w:r>
+        <w:rPr>
+          <w:rFonts w:ascii="David" w:cs="David" w:eastAsia="David" w:hAnsi="David"/>
+          <w:sz w:val="24"/>
+          <w:szCs w:val="24"/>
+          <w:rtl/>
+        </w:rPr>
+        <w:t xml:space="preserve">ע"א 4116/20 </w:t>
+      </w:r>
+      <w:r>
+        <w:rPr>
+          <w:rFonts w:ascii="David" w:cs="David" w:eastAsia="David" w:hAnsi="David"/>
+          <w:i/>
+          <w:iCs/>
+          <w:sz w:val="24"/>
+          <w:szCs w:val="24"/>
+          <w:rtl/>
+        </w:rPr>
+        <w:t xml:space="preserve">הוך נ׳ בריכטא</w:t>
+      </w:r>
+      <w:r>
+        <w:rPr>
+          <w:rFonts w:ascii="David" w:cs="David" w:eastAsia="David" w:hAnsi="David"/>
+          <w:sz w:val="24"/>
+          <w:szCs w:val="24"/>
+          <w:rtl/>
+        </w:rPr>
+        <w:t xml:space="preserve"> (החלטה, נבו 17.9.2020).</w:t>
       </w:r>
     </w:p>
     <w:p>
@@ -10508,7 +10545,7 @@
           <w:szCs w:val="20"/>
           <w:rtl/>
         </w:rPr>
-        <w:t xml:space="preserve">ס׳ 54(4) לפקודת הראיות [נוסח חדש], התשל"א-1971. ליישום מובהק ראו ע"א 4116/20 </w:t>
+        <w:t xml:space="preserve">ס׳ 54(4) לפקודת הראיות [נוסח חדש], התשל"א-1971. ליישום מובהק ראו ה"פ (מחוזי י-ם) 48783-04-18 </w:t>
       </w:r>
       <w:r>
         <w:rPr>
@@ -10528,7 +10565,27 @@
           <w:szCs w:val="20"/>
           <w:rtl/>
         </w:rPr>
-        <w:t xml:space="preserve"> (נבו 17.9.2020), שבו נדחתה תביעה משפחתית להעברת זכויות מכוח מתנה נטענת נוכח השיהוי, היעדר הרישום, שינויי הגרסה ואי-עמידה בנטל השכנוע הכבד הנדרש נגד עיזבון.</w:t>
+        <w:t xml:space="preserve"> (נבו 4.5.2020): תביעה משפחתית להצהרה על זכויות מכוח מתנה נטענת נדחתה, משנקבע כי בתביעה נגד עיזבון, שהוגשה שנים רבות לאחר ההעברה הנטענת, מוטל נטל שכנוע כבד – והוא לא הורם נוכח שינויי הגרסה (ממתנה לתמורה) וההימנעות מרישום המתנה בחיי הנותן, הימנעות ששללה מן היורשים את האפשרות לברר את הטענות. על פסק הדין הוגש ערעור, שבגדרו ניתן צו מניעה זמני האוסר דיספוזיציה בנכס: ע"א 4116/20 </w:t>
+      </w:r>
+      <w:r>
+        <w:rPr>
+          <w:rFonts w:ascii="David" w:cs="David" w:eastAsia="David" w:hAnsi="David"/>
+          <w:i/>
+          <w:iCs/>
+          <w:sz w:val="20"/>
+          <w:szCs w:val="20"/>
+          <w:rtl/>
+        </w:rPr>
+        <w:t xml:space="preserve">הוך נ׳ בריכטא</w:t>
+      </w:r>
+      <w:r>
+        <w:rPr>
+          <w:rFonts w:ascii="David" w:cs="David" w:eastAsia="David" w:hAnsi="David"/>
+          <w:sz w:val="20"/>
+          <w:szCs w:val="20"/>
+          <w:rtl/>
+        </w:rPr>
+        <w:t xml:space="preserve"> (החלטה, נבו 17.9.2020).</w:t>
       </w:r>
     </w:p>
   </w:footnote>

</xml_diff>

<commit_message>
Integrate Barak on irrevocable agency (secs. 915-918) and Namdar on planning-injury compensation
From Barak, The Agency Law vol. 2 pp. 1241-1245: the classic Kar two-kinds
distinction, the critique of the term 'irrevocable' as a misnomer, the
explicit Mejelle lineage of s. 14(b) (arts. 1521-1527) woven into the
comparative Sharia chapter, and the English agent-interest limitation
versus the Israeli third-party extension in the common-law chapter.
From Namdar, Injury to Land pp. 429-439: s. 197 planning compensation
extends to unregistered equitable owners and renewable RMI authorization
holders - completing the tax chapter's asymmetry argument (the economic
law sees the unregistered holder from both sides; only the registry
ignores him). Bibliography updated.

Co-Authored-By: Claude Fable 5 <noreply@anthropic.com>
Claude-Session: https://claude.ai/code/session_01PTzmkyUzTNm9DT35momqLP
</commit_message>
<xml_diff>
--- a/seminar/סמינריון-מקרקעין-לא-רשומים.docx
+++ b/seminar/סמינריון-מקרקעין-לא-רשומים.docx
@@ -1563,7 +1563,7 @@
           <w:szCs w:val="24"/>
           <w:rtl/>
         </w:rPr>
-        <w:t xml:space="preserve"> שנית, כותרת "בלתי חוזר" אינה מילת קסם. בעניין </w:t>
+        <w:t xml:space="preserve"> ההבחנה הקלאסית נוסחה עוד בעניין </w:t>
       </w:r>
       <w:r>
         <w:rPr>
@@ -1574,6 +1574,56 @@
           <w:szCs w:val="24"/>
           <w:rtl/>
         </w:rPr>
+        <w:t xml:space="preserve">קר</w:t>
+      </w:r>
+      <w:r>
+        <w:rPr>
+          <w:rFonts w:ascii="David" w:cs="David" w:eastAsia="David" w:hAnsi="David"/>
+          <w:sz w:val="24"/>
+          <w:szCs w:val="24"/>
+          <w:rtl/>
+        </w:rPr>
+        <w:t xml:space="preserve">: יש ייפוי כוח הניתן כדי שהמורשה יבצע עסקה שהמרשה מעוניין בה – וממנו רשאי המרשה לחזור בו בכל עת; ויש ייפוי כוח הניתן לביצוע עסקה שאדם אחר מעוניין בה, ובידי אותו אחר "קנויה הזכות שהעסקה תבוצע" – וממנו אין המרשה יכול לחזור בו, שכן הביטול יפגע בזכות שכבר אינה שלו.</w:t>
+      </w:r>
+      <w:r>
+        <w:rPr>
+          <w:rStyle w:val="FootnoteReference"/>
+        </w:rPr>
+        <w:footnoteReference w:id="29"/>
+      </w:r>
+      <w:r>
+        <w:rPr>
+          <w:rFonts w:ascii="David" w:cs="David" w:eastAsia="David" w:hAnsi="David"/>
+          <w:sz w:val="24"/>
+          <w:szCs w:val="24"/>
+          <w:rtl/>
+        </w:rPr>
+        <w:t xml:space="preserve"> שנית, כותרת "בלתי חוזר" אינה מילת קסם – וברק אף מטעים כי הכינוי עצמו "אינו מוצלח": אי־ההדירות היא תוצאת האינטרס המובטח, לא תולדת הכותרת שנבחרה למסמך.</w:t>
+      </w:r>
+      <w:r>
+        <w:rPr>
+          <w:rStyle w:val="FootnoteReference"/>
+        </w:rPr>
+        <w:footnoteReference w:id="30"/>
+      </w:r>
+      <w:r>
+        <w:rPr>
+          <w:rFonts w:ascii="David" w:cs="David" w:eastAsia="David" w:hAnsi="David"/>
+          <w:sz w:val="24"/>
+          <w:szCs w:val="24"/>
+          <w:rtl/>
+        </w:rPr>
+        <w:t xml:space="preserve"> בעניין </w:t>
+      </w:r>
+      <w:r>
+        <w:rPr>
+          <w:rFonts w:ascii="David" w:cs="David" w:eastAsia="David" w:hAnsi="David"/>
+          <w:i/>
+          <w:iCs/>
+          <w:sz w:val="24"/>
+          <w:szCs w:val="24"/>
+          <w:rtl/>
+        </w:rPr>
         <w:t xml:space="preserve">צימבלר</w:t>
       </w:r>
       <w:r>
@@ -1589,7 +1639,7 @@
         <w:rPr>
           <w:rStyle w:val="FootnoteReference"/>
         </w:rPr>
-        <w:footnoteReference w:id="29"/>
+        <w:footnoteReference w:id="31"/>
       </w:r>
       <w:r>
         <w:rPr>
@@ -1604,7 +1654,7 @@
         <w:rPr>
           <w:rStyle w:val="FootnoteReference"/>
         </w:rPr>
-        <w:footnoteReference w:id="30"/>
+        <w:footnoteReference w:id="32"/>
       </w:r>
     </w:p>
     <w:p>
@@ -1666,7 +1716,7 @@
         <w:rPr>
           <w:rStyle w:val="FootnoteReference"/>
         </w:rPr>
-        <w:footnoteReference w:id="31"/>
+        <w:footnoteReference w:id="33"/>
       </w:r>
       <w:r>
         <w:rPr>
@@ -1698,7 +1748,7 @@
         <w:rPr>
           <w:rStyle w:val="FootnoteReference"/>
         </w:rPr>
-        <w:footnoteReference w:id="32"/>
+        <w:footnoteReference w:id="34"/>
       </w:r>
       <w:r>
         <w:rPr>
@@ -1733,7 +1783,7 @@
         <w:rPr>
           <w:rStyle w:val="FootnoteReference"/>
         </w:rPr>
-        <w:footnoteReference w:id="33"/>
+        <w:footnoteReference w:id="35"/>
       </w:r>
     </w:p>
     <w:p>
@@ -1775,7 +1825,7 @@
         <w:rPr>
           <w:rStyle w:val="FootnoteReference"/>
         </w:rPr>
-        <w:footnoteReference w:id="34"/>
+        <w:footnoteReference w:id="36"/>
       </w:r>
       <w:r>
         <w:rPr>
@@ -1790,7 +1840,7 @@
         <w:rPr>
           <w:rStyle w:val="FootnoteReference"/>
         </w:rPr>
-        <w:footnoteReference w:id="35"/>
+        <w:footnoteReference w:id="37"/>
       </w:r>
     </w:p>
     <w:p>
@@ -1813,7 +1863,7 @@
         <w:rPr>
           <w:rStyle w:val="FootnoteReference"/>
         </w:rPr>
-        <w:footnoteReference w:id="36"/>
+        <w:footnoteReference w:id="38"/>
       </w:r>
       <w:r>
         <w:rPr>
@@ -1828,7 +1878,7 @@
         <w:rPr>
           <w:rStyle w:val="FootnoteReference"/>
         </w:rPr>
-        <w:footnoteReference w:id="37"/>
+        <w:footnoteReference w:id="39"/>
       </w:r>
       <w:r>
         <w:rPr>
@@ -1863,7 +1913,7 @@
         <w:rPr>
           <w:rStyle w:val="FootnoteReference"/>
         </w:rPr>
-        <w:footnoteReference w:id="38"/>
+        <w:footnoteReference w:id="40"/>
       </w:r>
     </w:p>
     <w:p>
@@ -1886,7 +1936,7 @@
         <w:rPr>
           <w:rStyle w:val="FootnoteReference"/>
         </w:rPr>
-        <w:footnoteReference w:id="39"/>
+        <w:footnoteReference w:id="41"/>
       </w:r>
       <w:r>
         <w:rPr>
@@ -1937,7 +1987,7 @@
         <w:rPr>
           <w:rStyle w:val="FootnoteReference"/>
         </w:rPr>
-        <w:footnoteReference w:id="40"/>
+        <w:footnoteReference w:id="42"/>
       </w:r>
       <w:r>
         <w:rPr>
@@ -1952,7 +2002,7 @@
         <w:rPr>
           <w:rStyle w:val="FootnoteReference"/>
         </w:rPr>
-        <w:footnoteReference w:id="41"/>
+        <w:footnoteReference w:id="43"/>
       </w:r>
     </w:p>
     <w:p>
@@ -1975,7 +2025,7 @@
         <w:rPr>
           <w:rStyle w:val="FootnoteReference"/>
         </w:rPr>
-        <w:footnoteReference w:id="42"/>
+        <w:footnoteReference w:id="44"/>
       </w:r>
       <w:r>
         <w:rPr>
@@ -2046,7 +2096,7 @@
         <w:rPr>
           <w:rStyle w:val="FootnoteReference"/>
         </w:rPr>
-        <w:footnoteReference w:id="43"/>
+        <w:footnoteReference w:id="45"/>
       </w:r>
       <w:r>
         <w:rPr>
@@ -2061,7 +2111,7 @@
         <w:rPr>
           <w:rStyle w:val="FootnoteReference"/>
         </w:rPr>
-        <w:footnoteReference w:id="44"/>
+        <w:footnoteReference w:id="46"/>
       </w:r>
     </w:p>
     <w:p>
@@ -2123,7 +2173,7 @@
         <w:rPr>
           <w:rStyle w:val="FootnoteReference"/>
         </w:rPr>
-        <w:footnoteReference w:id="45"/>
+        <w:footnoteReference w:id="47"/>
       </w:r>
       <w:r>
         <w:rPr>
@@ -2158,7 +2208,7 @@
         <w:rPr>
           <w:rStyle w:val="FootnoteReference"/>
         </w:rPr>
-        <w:footnoteReference w:id="46"/>
+        <w:footnoteReference w:id="48"/>
       </w:r>
       <w:r>
         <w:rPr>
@@ -2190,7 +2240,7 @@
         <w:rPr>
           <w:rStyle w:val="FootnoteReference"/>
         </w:rPr>
-        <w:footnoteReference w:id="47"/>
+        <w:footnoteReference w:id="49"/>
       </w:r>
     </w:p>
     <w:p>
@@ -2213,7 +2263,7 @@
         <w:rPr>
           <w:rStyle w:val="FootnoteReference"/>
         </w:rPr>
-        <w:footnoteReference w:id="48"/>
+        <w:footnoteReference w:id="50"/>
       </w:r>
       <w:r>
         <w:rPr>
@@ -2228,7 +2278,7 @@
         <w:rPr>
           <w:rStyle w:val="FootnoteReference"/>
         </w:rPr>
-        <w:footnoteReference w:id="49"/>
+        <w:footnoteReference w:id="51"/>
       </w:r>
     </w:p>
     <w:p>
@@ -2251,7 +2301,7 @@
         <w:rPr>
           <w:rStyle w:val="FootnoteReference"/>
         </w:rPr>
-        <w:footnoteReference w:id="50"/>
+        <w:footnoteReference w:id="52"/>
       </w:r>
       <w:r>
         <w:rPr>
@@ -2266,7 +2316,7 @@
         <w:rPr>
           <w:rStyle w:val="FootnoteReference"/>
         </w:rPr>
-        <w:footnoteReference w:id="51"/>
+        <w:footnoteReference w:id="53"/>
       </w:r>
       <w:r>
         <w:rPr>
@@ -2281,7 +2331,7 @@
         <w:rPr>
           <w:rStyle w:val="FootnoteReference"/>
         </w:rPr>
-        <w:footnoteReference w:id="52"/>
+        <w:footnoteReference w:id="54"/>
       </w:r>
       <w:r>
         <w:rPr>
@@ -2296,7 +2346,7 @@
         <w:rPr>
           <w:rStyle w:val="FootnoteReference"/>
         </w:rPr>
-        <w:footnoteReference w:id="53"/>
+        <w:footnoteReference w:id="55"/>
       </w:r>
       <w:r>
         <w:rPr>
@@ -2347,7 +2397,7 @@
         <w:rPr>
           <w:rStyle w:val="FootnoteReference"/>
         </w:rPr>
-        <w:footnoteReference w:id="54"/>
+        <w:footnoteReference w:id="56"/>
       </w:r>
     </w:p>
     <w:p>
@@ -2425,7 +2475,7 @@
         <w:rPr>
           <w:rStyle w:val="FootnoteReference"/>
         </w:rPr>
-        <w:footnoteReference w:id="55"/>
+        <w:footnoteReference w:id="57"/>
       </w:r>
       <w:r>
         <w:rPr>
@@ -2457,7 +2507,7 @@
         <w:rPr>
           <w:rStyle w:val="FootnoteReference"/>
         </w:rPr>
-        <w:footnoteReference w:id="56"/>
+        <w:footnoteReference w:id="58"/>
       </w:r>
       <w:r>
         <w:rPr>
@@ -2492,7 +2542,7 @@
         <w:rPr>
           <w:rStyle w:val="FootnoteReference"/>
         </w:rPr>
-        <w:footnoteReference w:id="57"/>
+        <w:footnoteReference w:id="59"/>
       </w:r>
     </w:p>
     <w:p>
@@ -2534,7 +2584,7 @@
         <w:rPr>
           <w:rStyle w:val="FootnoteReference"/>
         </w:rPr>
-        <w:footnoteReference w:id="58"/>
+        <w:footnoteReference w:id="60"/>
       </w:r>
       <w:r>
         <w:rPr>
@@ -2585,7 +2635,7 @@
         <w:rPr>
           <w:rStyle w:val="FootnoteReference"/>
         </w:rPr>
-        <w:footnoteReference w:id="59"/>
+        <w:footnoteReference w:id="61"/>
       </w:r>
       <w:r>
         <w:rPr>
@@ -2636,7 +2686,7 @@
         <w:rPr>
           <w:rStyle w:val="FootnoteReference"/>
         </w:rPr>
-        <w:footnoteReference w:id="60"/>
+        <w:footnoteReference w:id="62"/>
       </w:r>
       <w:r>
         <w:rPr>
@@ -2687,7 +2737,7 @@
         <w:rPr>
           <w:rStyle w:val="FootnoteReference"/>
         </w:rPr>
-        <w:footnoteReference w:id="61"/>
+        <w:footnoteReference w:id="63"/>
       </w:r>
       <w:r>
         <w:rPr>
@@ -2757,7 +2807,7 @@
         <w:rPr>
           <w:rStyle w:val="FootnoteReference"/>
         </w:rPr>
-        <w:footnoteReference w:id="62"/>
+        <w:footnoteReference w:id="64"/>
       </w:r>
       <w:r>
         <w:rPr>
@@ -2772,7 +2822,7 @@
         <w:rPr>
           <w:rStyle w:val="FootnoteReference"/>
         </w:rPr>
-        <w:footnoteReference w:id="63"/>
+        <w:footnoteReference w:id="65"/>
       </w:r>
       <w:r>
         <w:rPr>
@@ -2787,7 +2837,7 @@
         <w:rPr>
           <w:rStyle w:val="FootnoteReference"/>
         </w:rPr>
-        <w:footnoteReference w:id="64"/>
+        <w:footnoteReference w:id="66"/>
       </w:r>
       <w:r>
         <w:rPr>
@@ -2802,7 +2852,7 @@
         <w:rPr>
           <w:rStyle w:val="FootnoteReference"/>
         </w:rPr>
-        <w:footnoteReference w:id="65"/>
+        <w:footnoteReference w:id="67"/>
       </w:r>
       <w:r>
         <w:rPr>
@@ -2817,7 +2867,7 @@
         <w:rPr>
           <w:rStyle w:val="FootnoteReference"/>
         </w:rPr>
-        <w:footnoteReference w:id="66"/>
+        <w:footnoteReference w:id="68"/>
       </w:r>
     </w:p>
     <w:p>
@@ -2840,7 +2890,7 @@
         <w:rPr>
           <w:rStyle w:val="FootnoteReference"/>
         </w:rPr>
-        <w:footnoteReference w:id="67"/>
+        <w:footnoteReference w:id="69"/>
       </w:r>
       <w:r>
         <w:rPr>
@@ -2855,16 +2905,31 @@
         <w:rPr>
           <w:rStyle w:val="FootnoteReference"/>
         </w:rPr>
-        <w:footnoteReference w:id="68"/>
-      </w:r>
-      <w:r>
-        <w:rPr>
-          <w:rFonts w:ascii="David" w:cs="David" w:eastAsia="David" w:hAnsi="David"/>
-          <w:sz w:val="24"/>
-          <w:szCs w:val="24"/>
-          <w:rtl/>
-        </w:rPr>
-        <w:t xml:space="preserve"> התוצאה המבנית מרתקת: דווקא מפני שהמס "רואה" את העסקה ואת ההחזקה הבלתי רשומות, נוצר פער בין שני מרשמים – מרשם הזכויות, שבו העסקה אינה קיימת, ומרשם המס, שבו היא הייתה אמורה להיות מדווחת זה מכבר. פער זה אינו סימטרי: המחזיק הבלתי רשום נושא בחבויות המס של בעלים – בלא ליהנות מהגנותיו הקנייניות של בעלים.</w:t>
+        <w:footnoteReference w:id="70"/>
+      </w:r>
+      <w:r>
+        <w:rPr>
+          <w:rFonts w:ascii="David" w:cs="David" w:eastAsia="David" w:hAnsi="David"/>
+          <w:sz w:val="24"/>
+          <w:szCs w:val="24"/>
+          <w:rtl/>
+        </w:rPr>
+        <w:t xml:space="preserve"> תמונה מקבילה עולה מזירה כלכלית נוספת – דיני פיצויי הפגיעה התכנונית: הזכאות לפיצויים לפי סעיף 197 לחוק התכנון והבנייה, הנתונה ל"בעל המקרקעין או בעל זכות בהם", פורשה אף היא פירוש כלכלי רחב, ככוללת בעלים שביושר שזכותם מעולם לא נרשמה בפנקסים ואף בעלי הרשאה מתחדשת במקרקעי ישראל.</w:t>
+      </w:r>
+      <w:r>
+        <w:rPr>
+          <w:rStyle w:val="FootnoteReference"/>
+        </w:rPr>
+        <w:footnoteReference w:id="71"/>
+      </w:r>
+      <w:r>
+        <w:rPr>
+          <w:rFonts w:ascii="David" w:cs="David" w:eastAsia="David" w:hAnsi="David"/>
+          <w:sz w:val="24"/>
+          <w:szCs w:val="24"/>
+          <w:rtl/>
+        </w:rPr>
+        <w:t xml:space="preserve"> התוצאה המבנית מרתקת: הדין הכלכלי – המס הגובה מזה והפיצוי התכנוני המשולם מזה – "רואה" את המחזיק הבלתי רשום משני עבריו; רק מרשם הזכויות מתעלם ממנו. וכך נוצר פער בין שני מרשמים: מרשם הזכויות, שבו העסקה אינה קיימת, ומרשם המס, שבו היא הייתה אמורה להיות מדווחת זה מכבר. הפער אינו סימטרי: המחזיק הבלתי רשום נושא בחבויות המס של בעלים – בלא ליהנות מהגנותיו הקנייניות של בעלים.</w:t>
       </w:r>
     </w:p>
     <w:p>
@@ -2906,7 +2971,7 @@
         <w:rPr>
           <w:rStyle w:val="FootnoteReference"/>
         </w:rPr>
-        <w:footnoteReference w:id="69"/>
+        <w:footnoteReference w:id="72"/>
       </w:r>
       <w:r>
         <w:rPr>
@@ -2938,7 +3003,7 @@
         <w:rPr>
           <w:rStyle w:val="FootnoteReference"/>
         </w:rPr>
-        <w:footnoteReference w:id="70"/>
+        <w:footnoteReference w:id="73"/>
       </w:r>
       <w:r>
         <w:rPr>
@@ -2989,7 +3054,7 @@
         <w:rPr>
           <w:rStyle w:val="FootnoteReference"/>
         </w:rPr>
-        <w:footnoteReference w:id="71"/>
+        <w:footnoteReference w:id="74"/>
       </w:r>
     </w:p>
     <w:p>
@@ -3029,7 +3094,7 @@
         <w:rPr>
           <w:rStyle w:val="FootnoteReference"/>
         </w:rPr>
-        <w:footnoteReference w:id="72"/>
+        <w:footnoteReference w:id="75"/>
       </w:r>
       <w:r>
         <w:rPr>
@@ -3061,7 +3126,7 @@
         <w:rPr>
           <w:rStyle w:val="FootnoteReference"/>
         </w:rPr>
-        <w:footnoteReference w:id="73"/>
+        <w:footnoteReference w:id="76"/>
       </w:r>
       <w:r>
         <w:rPr>
@@ -3186,7 +3251,7 @@
         <w:rPr>
           <w:rStyle w:val="FootnoteReference"/>
         </w:rPr>
-        <w:footnoteReference w:id="74"/>
+        <w:footnoteReference w:id="77"/>
       </w:r>
       <w:r>
         <w:rPr>
@@ -3220,7 +3285,7 @@
         <w:rPr>
           <w:rStyle w:val="FootnoteReference"/>
         </w:rPr>
-        <w:footnoteReference w:id="75"/>
+        <w:footnoteReference w:id="78"/>
       </w:r>
       <w:r>
         <w:rPr>
@@ -3255,7 +3320,7 @@
         <w:rPr>
           <w:rStyle w:val="FootnoteReference"/>
         </w:rPr>
-        <w:footnoteReference w:id="76"/>
+        <w:footnoteReference w:id="79"/>
       </w:r>
     </w:p>
     <w:p>
@@ -3297,7 +3362,7 @@
         <w:rPr>
           <w:rStyle w:val="FootnoteReference"/>
         </w:rPr>
-        <w:footnoteReference w:id="77"/>
+        <w:footnoteReference w:id="80"/>
       </w:r>
       <w:r>
         <w:rPr>
@@ -3348,7 +3413,7 @@
         <w:rPr>
           <w:rStyle w:val="FootnoteReference"/>
         </w:rPr>
-        <w:footnoteReference w:id="78"/>
+        <w:footnoteReference w:id="81"/>
       </w:r>
       <w:r>
         <w:rPr>
@@ -3363,7 +3428,7 @@
         <w:rPr>
           <w:rStyle w:val="FootnoteReference"/>
         </w:rPr>
-        <w:footnoteReference w:id="79"/>
+        <w:footnoteReference w:id="82"/>
       </w:r>
     </w:p>
     <w:p>
@@ -3422,7 +3487,7 @@
         <w:rPr>
           <w:rStyle w:val="FootnoteReference"/>
         </w:rPr>
-        <w:footnoteReference w:id="80"/>
+        <w:footnoteReference w:id="83"/>
       </w:r>
       <w:r>
         <w:rPr>
@@ -3473,7 +3538,7 @@
         <w:rPr>
           <w:rStyle w:val="FootnoteReference"/>
         </w:rPr>
-        <w:footnoteReference w:id="81"/>
+        <w:footnoteReference w:id="84"/>
       </w:r>
       <w:r>
         <w:rPr>
@@ -3507,7 +3572,7 @@
         <w:rPr>
           <w:rStyle w:val="FootnoteReference"/>
         </w:rPr>
-        <w:footnoteReference w:id="82"/>
+        <w:footnoteReference w:id="85"/>
       </w:r>
       <w:r>
         <w:rPr>
@@ -3595,7 +3660,7 @@
         <w:rPr>
           <w:rStyle w:val="FootnoteReference"/>
         </w:rPr>
-        <w:footnoteReference w:id="83"/>
+        <w:footnoteReference w:id="86"/>
       </w:r>
       <w:r>
         <w:rPr>
@@ -3630,7 +3695,7 @@
         <w:rPr>
           <w:rStyle w:val="FootnoteReference"/>
         </w:rPr>
-        <w:footnoteReference w:id="84"/>
+        <w:footnoteReference w:id="87"/>
       </w:r>
       <w:r>
         <w:rPr>
@@ -3664,7 +3729,7 @@
         <w:rPr>
           <w:rStyle w:val="FootnoteReference"/>
         </w:rPr>
-        <w:footnoteReference w:id="85"/>
+        <w:footnoteReference w:id="88"/>
       </w:r>
       <w:r>
         <w:rPr>
@@ -3698,7 +3763,7 @@
         <w:rPr>
           <w:rStyle w:val="FootnoteReference"/>
         </w:rPr>
-        <w:footnoteReference w:id="86"/>
+        <w:footnoteReference w:id="89"/>
       </w:r>
       <w:r>
         <w:rPr>
@@ -3713,7 +3778,22 @@
         <w:rPr>
           <w:rStyle w:val="FootnoteReference"/>
         </w:rPr>
-        <w:footnoteReference w:id="87"/>
+        <w:footnoteReference w:id="90"/>
+      </w:r>
+      <w:r>
+        <w:rPr>
+          <w:rFonts w:ascii="David" w:cs="David" w:eastAsia="David" w:hAnsi="David"/>
+          <w:sz w:val="24"/>
+          <w:szCs w:val="24"/>
+          <w:rtl/>
+        </w:rPr>
+        <w:t xml:space="preserve"> ודוק, הבדל אחד חשוב: במשפט המקובל האינטרס המבטיח את אי־ההדירות חייב להיות אינטרס של מיופה הכוח עצמו, ואילו חוק השליחות הישראלי הרחיב את ההגנה גם לאינטרס של צד שלישי – הרחבה שחשיבותה רבה דווקא בעסקאות המשפחתיות, שבהן ייפוי הכוח ניתן תכופות להבטחת זכותו של בן משפחה שאינו מיופה הכוח.</w:t>
+      </w:r>
+      <w:r>
+        <w:rPr>
+          <w:rStyle w:val="FootnoteReference"/>
+        </w:rPr>
+        <w:footnoteReference w:id="91"/>
       </w:r>
       <w:r>
         <w:rPr>
@@ -3728,7 +3808,7 @@
         <w:rPr>
           <w:rStyle w:val="FootnoteReference"/>
         </w:rPr>
-        <w:footnoteReference w:id="88"/>
+        <w:footnoteReference w:id="92"/>
       </w:r>
     </w:p>
     <w:p>
@@ -3789,7 +3869,7 @@
         <w:rPr>
           <w:rStyle w:val="FootnoteReference"/>
         </w:rPr>
-        <w:footnoteReference w:id="89"/>
+        <w:footnoteReference w:id="93"/>
       </w:r>
       <w:r>
         <w:rPr>
@@ -3804,7 +3884,7 @@
         <w:rPr>
           <w:rStyle w:val="FootnoteReference"/>
         </w:rPr>
-        <w:footnoteReference w:id="90"/>
+        <w:footnoteReference w:id="94"/>
       </w:r>
       <w:r>
         <w:rPr>
@@ -3819,7 +3899,7 @@
         <w:rPr>
           <w:rStyle w:val="FootnoteReference"/>
         </w:rPr>
-        <w:footnoteReference w:id="91"/>
+        <w:footnoteReference w:id="95"/>
       </w:r>
     </w:p>
     <w:p>
@@ -3861,7 +3941,7 @@
         <w:rPr>
           <w:rStyle w:val="FootnoteReference"/>
         </w:rPr>
-        <w:footnoteReference w:id="92"/>
+        <w:footnoteReference w:id="96"/>
       </w:r>
       <w:r>
         <w:rPr>
@@ -3876,7 +3956,7 @@
         <w:rPr>
           <w:rStyle w:val="FootnoteReference"/>
         </w:rPr>
-        <w:footnoteReference w:id="93"/>
+        <w:footnoteReference w:id="97"/>
       </w:r>
     </w:p>
     <w:p>
@@ -3918,7 +3998,7 @@
         <w:rPr>
           <w:rStyle w:val="FootnoteReference"/>
         </w:rPr>
-        <w:footnoteReference w:id="94"/>
+        <w:footnoteReference w:id="98"/>
       </w:r>
       <w:r>
         <w:rPr>
@@ -3933,7 +4013,7 @@
         <w:rPr>
           <w:rStyle w:val="FootnoteReference"/>
         </w:rPr>
-        <w:footnoteReference w:id="95"/>
+        <w:footnoteReference w:id="99"/>
       </w:r>
       <w:r>
         <w:rPr>
@@ -3948,7 +4028,7 @@
         <w:rPr>
           <w:rStyle w:val="FootnoteReference"/>
         </w:rPr>
-        <w:footnoteReference w:id="96"/>
+        <w:footnoteReference w:id="100"/>
       </w:r>
       <w:r>
         <w:rPr>
@@ -3963,7 +4043,7 @@
         <w:rPr>
           <w:rStyle w:val="FootnoteReference"/>
         </w:rPr>
-        <w:footnoteReference w:id="97"/>
+        <w:footnoteReference w:id="101"/>
       </w:r>
     </w:p>
     <w:p>
@@ -4005,7 +4085,7 @@
         <w:rPr>
           <w:rStyle w:val="FootnoteReference"/>
         </w:rPr>
-        <w:footnoteReference w:id="98"/>
+        <w:footnoteReference w:id="102"/>
       </w:r>
       <w:r>
         <w:rPr>
@@ -4020,7 +4100,7 @@
         <w:rPr>
           <w:rStyle w:val="FootnoteReference"/>
         </w:rPr>
-        <w:footnoteReference w:id="99"/>
+        <w:footnoteReference w:id="103"/>
       </w:r>
       <w:r>
         <w:rPr>
@@ -4035,7 +4115,7 @@
         <w:rPr>
           <w:rStyle w:val="FootnoteReference"/>
         </w:rPr>
-        <w:footnoteReference w:id="100"/>
+        <w:footnoteReference w:id="104"/>
       </w:r>
       <w:r>
         <w:rPr>
@@ -4105,7 +4185,7 @@
         <w:rPr>
           <w:rStyle w:val="FootnoteReference"/>
         </w:rPr>
-        <w:footnoteReference w:id="101"/>
+        <w:footnoteReference w:id="105"/>
       </w:r>
       <w:r>
         <w:rPr>
@@ -4156,7 +4236,7 @@
         <w:rPr>
           <w:rStyle w:val="FootnoteReference"/>
         </w:rPr>
-        <w:footnoteReference w:id="102"/>
+        <w:footnoteReference w:id="106"/>
       </w:r>
       <w:r>
         <w:rPr>
@@ -4171,7 +4251,7 @@
         <w:rPr>
           <w:rStyle w:val="FootnoteReference"/>
         </w:rPr>
-        <w:footnoteReference w:id="103"/>
+        <w:footnoteReference w:id="107"/>
       </w:r>
       <w:r>
         <w:rPr>
@@ -4186,7 +4266,7 @@
         <w:rPr>
           <w:rStyle w:val="FootnoteReference"/>
         </w:rPr>
-        <w:footnoteReference w:id="104"/>
+        <w:footnoteReference w:id="108"/>
       </w:r>
     </w:p>
     <w:p>
@@ -4209,7 +4289,7 @@
         <w:rPr>
           <w:rStyle w:val="FootnoteReference"/>
         </w:rPr>
-        <w:footnoteReference w:id="105"/>
+        <w:footnoteReference w:id="109"/>
       </w:r>
     </w:p>
     <w:p>
@@ -4251,7 +4331,7 @@
         <w:rPr>
           <w:rStyle w:val="FootnoteReference"/>
         </w:rPr>
-        <w:footnoteReference w:id="106"/>
+        <w:footnoteReference w:id="110"/>
       </w:r>
       <w:r>
         <w:rPr>
@@ -4266,7 +4346,7 @@
         <w:rPr>
           <w:rStyle w:val="FootnoteReference"/>
         </w:rPr>
-        <w:footnoteReference w:id="107"/>
+        <w:footnoteReference w:id="111"/>
       </w:r>
       <w:r>
         <w:rPr>
@@ -4281,7 +4361,7 @@
         <w:rPr>
           <w:rStyle w:val="FootnoteReference"/>
         </w:rPr>
-        <w:footnoteReference w:id="108"/>
+        <w:footnoteReference w:id="112"/>
       </w:r>
       <w:r>
         <w:rPr>
@@ -4332,7 +4412,22 @@
         <w:rPr>
           <w:rStyle w:val="FootnoteReference"/>
         </w:rPr>
-        <w:footnoteReference w:id="109"/>
+        <w:footnoteReference w:id="113"/>
+      </w:r>
+      <w:r>
+        <w:rPr>
+          <w:rFonts w:ascii="David" w:cs="David" w:eastAsia="David" w:hAnsi="David"/>
+          <w:sz w:val="24"/>
+          <w:szCs w:val="24"/>
+          <w:rtl/>
+        </w:rPr>
+        <w:t xml:space="preserve"> ואין מדובר בהשערה גנאלוגית בלבד: ברק מציין במפורש כי בעיצוב ההרשאה להבטחת זכותו של אחר שבסעיף 14(ב) הלך המחוקק הישראלי "בעקבות המג׳לה" – סעיפים 1521, 1522 ו-1527 שבה – ובעקבות שיטות קונטיננטליות שנהגו כמותה.</w:t>
+      </w:r>
+      <w:r>
+        <w:rPr>
+          <w:rStyle w:val="FootnoteReference"/>
+        </w:rPr>
+        <w:footnoteReference w:id="114"/>
       </w:r>
       <w:r>
         <w:rPr>
@@ -4347,7 +4442,7 @@
         <w:rPr>
           <w:rStyle w:val="FootnoteReference"/>
         </w:rPr>
-        <w:footnoteReference w:id="110"/>
+        <w:footnoteReference w:id="115"/>
       </w:r>
       <w:r>
         <w:rPr>
@@ -4362,7 +4457,7 @@
         <w:rPr>
           <w:rStyle w:val="FootnoteReference"/>
         </w:rPr>
-        <w:footnoteReference w:id="111"/>
+        <w:footnoteReference w:id="116"/>
       </w:r>
       <w:r>
         <w:rPr>
@@ -4377,7 +4472,7 @@
         <w:rPr>
           <w:rStyle w:val="FootnoteReference"/>
         </w:rPr>
-        <w:footnoteReference w:id="112"/>
+        <w:footnoteReference w:id="117"/>
       </w:r>
       <w:r>
         <w:rPr>
@@ -4523,7 +4618,7 @@
         <w:rPr>
           <w:rStyle w:val="FootnoteReference"/>
         </w:rPr>
-        <w:footnoteReference w:id="113"/>
+        <w:footnoteReference w:id="118"/>
       </w:r>
     </w:p>
     <w:p>
@@ -4582,7 +4677,7 @@
         <w:rPr>
           <w:rStyle w:val="FootnoteReference"/>
         </w:rPr>
-        <w:footnoteReference w:id="114"/>
+        <w:footnoteReference w:id="119"/>
       </w:r>
       <w:r>
         <w:rPr>
@@ -4597,7 +4692,7 @@
         <w:rPr>
           <w:rStyle w:val="FootnoteReference"/>
         </w:rPr>
-        <w:footnoteReference w:id="115"/>
+        <w:footnoteReference w:id="120"/>
       </w:r>
       <w:r>
         <w:rPr>
@@ -4629,7 +4724,7 @@
         <w:rPr>
           <w:rStyle w:val="FootnoteReference"/>
         </w:rPr>
-        <w:footnoteReference w:id="116"/>
+        <w:footnoteReference w:id="121"/>
       </w:r>
       <w:r>
         <w:rPr>
@@ -4681,7 +4776,7 @@
         <w:rPr>
           <w:rStyle w:val="FootnoteReference"/>
         </w:rPr>
-        <w:footnoteReference w:id="117"/>
+        <w:footnoteReference w:id="122"/>
       </w:r>
       <w:r>
         <w:rPr>
@@ -4696,7 +4791,7 @@
         <w:rPr>
           <w:rStyle w:val="FootnoteReference"/>
         </w:rPr>
-        <w:footnoteReference w:id="118"/>
+        <w:footnoteReference w:id="123"/>
       </w:r>
       <w:r>
         <w:rPr>
@@ -5081,6 +5176,23 @@
           <w:szCs w:val="24"/>
           <w:rtl/>
         </w:rPr>
+        <w:t xml:space="preserve">חוק התכנון והבנייה, התשכ"ה-1965.</w:t>
+      </w:r>
+    </w:p>
+    <w:p>
+      <w:pPr>
+        <w:bidi/>
+        <w:spacing w:after="120" w:line="300"/>
+        <w:ind w:start="420" w:hanging="420"/>
+        <w:jc w:val="both"/>
+      </w:pPr>
+      <w:r>
+        <w:rPr>
+          <w:rFonts w:ascii="David" w:cs="David" w:eastAsia="David" w:hAnsi="David"/>
+          <w:sz w:val="24"/>
+          <w:szCs w:val="24"/>
+          <w:rtl/>
+        </w:rPr>
         <w:t xml:space="preserve">פקודת העיריות [נוסח חדש].</w:t>
       </w:r>
     </w:p>
@@ -5168,6 +5280,43 @@
           <w:szCs w:val="24"/>
           <w:rtl/>
         </w:rPr>
+        <w:t xml:space="preserve">ע"פ 114/63 </w:t>
+      </w:r>
+      <w:r>
+        <w:rPr>
+          <w:rFonts w:ascii="David" w:cs="David" w:eastAsia="David" w:hAnsi="David"/>
+          <w:i/>
+          <w:iCs/>
+          <w:sz w:val="24"/>
+          <w:szCs w:val="24"/>
+          <w:rtl/>
+        </w:rPr>
+        <w:t xml:space="preserve">קר נ׳ היועץ המשפטי לממשלה</w:t>
+      </w:r>
+      <w:r>
+        <w:rPr>
+          <w:rFonts w:ascii="David" w:cs="David" w:eastAsia="David" w:hAnsi="David"/>
+          <w:sz w:val="24"/>
+          <w:szCs w:val="24"/>
+          <w:rtl/>
+        </w:rPr>
+        <w:t xml:space="preserve">, פ"ד יח(3) 561 (1964).</w:t>
+      </w:r>
+    </w:p>
+    <w:p>
+      <w:pPr>
+        <w:bidi/>
+        <w:spacing w:after="120" w:line="300"/>
+        <w:ind w:start="420" w:hanging="420"/>
+        <w:jc w:val="both"/>
+      </w:pPr>
+      <w:r>
+        <w:rPr>
+          <w:rFonts w:ascii="David" w:cs="David" w:eastAsia="David" w:hAnsi="David"/>
+          <w:sz w:val="24"/>
+          <w:szCs w:val="24"/>
+          <w:rtl/>
+        </w:rPr>
         <w:t xml:space="preserve">בר"ע 178/70 </w:t>
       </w:r>
       <w:r>
@@ -6743,6 +6892,43 @@
           <w:rtl/>
         </w:rPr>
         <w:t xml:space="preserve">רונית לוין-שנור "הפרטה, הפרדה והפליה – זניחת ההליכים של הסדר הזכויות במקרקעין במזרח ירושלים" עיוני משפט לד 183 (2011).</w:t>
+      </w:r>
+    </w:p>
+    <w:p>
+      <w:pPr>
+        <w:bidi/>
+        <w:spacing w:after="120" w:line="300"/>
+        <w:ind w:start="420" w:hanging="420"/>
+        <w:jc w:val="both"/>
+      </w:pPr>
+      <w:r>
+        <w:rPr>
+          <w:rFonts w:ascii="David" w:cs="David" w:eastAsia="David" w:hAnsi="David"/>
+          <w:sz w:val="24"/>
+          <w:szCs w:val="24"/>
+          <w:rtl/>
+        </w:rPr>
+        <w:t xml:space="preserve">אהרן נמדר </w:t>
+      </w:r>
+      <w:r>
+        <w:rPr>
+          <w:rFonts w:ascii="David" w:cs="David" w:eastAsia="David" w:hAnsi="David"/>
+          <w:i/>
+          <w:iCs/>
+          <w:sz w:val="24"/>
+          <w:szCs w:val="24"/>
+          <w:rtl/>
+        </w:rPr>
+        <w:t xml:space="preserve">פגיעה במקרקעין [פיצויים בגין נזקי תכנית]</w:t>
+      </w:r>
+      <w:r>
+        <w:rPr>
+          <w:rFonts w:ascii="David" w:cs="David" w:eastAsia="David" w:hAnsi="David"/>
+          <w:sz w:val="24"/>
+          <w:szCs w:val="24"/>
+          <w:rtl/>
+        </w:rPr>
+        <w:t xml:space="preserve"> (תשס"ח).</w:t>
       </w:r>
     </w:p>
     <w:p>
@@ -8823,7 +9009,7 @@
           <w:szCs w:val="20"/>
           <w:rtl/>
         </w:rPr>
-        <w:t xml:space="preserve"> כרך ב (מהדורה שנייה, 1996).</w:t>
+        <w:t xml:space="preserve"> כרך ב 1241–1245 (מהדורה שנייה, 1996).</w:t>
       </w:r>
     </w:p>
   </w:footnote>
@@ -8846,7 +9032,7 @@
           <w:szCs w:val="20"/>
           <w:rtl/>
         </w:rPr>
-        <w:t xml:space="preserve">ע"א 1559/99 </w:t>
+        <w:t xml:space="preserve">ע"פ 114/63 </w:t>
       </w:r>
       <w:r>
         <w:rPr>
@@ -8857,16 +9043,34 @@
           <w:szCs w:val="20"/>
           <w:rtl/>
         </w:rPr>
-        <w:t xml:space="preserve">צימבלר נ׳ תורג׳מן</w:t>
-      </w:r>
-      <w:r>
-        <w:rPr>
-          <w:rFonts w:ascii="David" w:cs="David" w:eastAsia="David" w:hAnsi="David"/>
-          <w:sz w:val="20"/>
-          <w:szCs w:val="20"/>
-          <w:rtl/>
-        </w:rPr>
-        <w:t xml:space="preserve">, פ"ד נז(5) 49 (2003).</w:t>
+        <w:t xml:space="preserve">קר נ׳ היועץ המשפטי לממשלה</w:t>
+      </w:r>
+      <w:r>
+        <w:rPr>
+          <w:rFonts w:ascii="David" w:cs="David" w:eastAsia="David" w:hAnsi="David"/>
+          <w:sz w:val="20"/>
+          <w:szCs w:val="20"/>
+          <w:rtl/>
+        </w:rPr>
+        <w:t xml:space="preserve">, פ"ד יח(3) 561, 564 (1964); והדברים אומצו בפסיקה מאוחרת – ראו ברק, </w:t>
+      </w:r>
+      <w:r>
+        <w:rPr>
+          <w:rFonts w:ascii="David" w:cs="David" w:eastAsia="David" w:hAnsi="David"/>
+          <w:sz w:val="20"/>
+          <w:szCs w:val="20"/>
+          <w:rtl/>
+        </w:rPr>
+        <w:t xml:space="preserve">לעיל ה"ש 28</w:t>
+      </w:r>
+      <w:r>
+        <w:rPr>
+          <w:rFonts w:ascii="David" w:cs="David" w:eastAsia="David" w:hAnsi="David"/>
+          <w:sz w:val="20"/>
+          <w:szCs w:val="20"/>
+          <w:rtl/>
+        </w:rPr>
+        <w:t xml:space="preserve">, בעמ׳ 1244–1245.</w:t>
       </w:r>
     </w:p>
   </w:footnote>
@@ -8889,7 +9093,48 @@
           <w:szCs w:val="20"/>
           <w:rtl/>
         </w:rPr>
-        <w:t xml:space="preserve">עניין </w:t>
+        <w:t xml:space="preserve">ברק, </w:t>
+      </w:r>
+      <w:r>
+        <w:rPr>
+          <w:rFonts w:ascii="David" w:cs="David" w:eastAsia="David" w:hAnsi="David"/>
+          <w:sz w:val="20"/>
+          <w:szCs w:val="20"/>
+          <w:rtl/>
+        </w:rPr>
+        <w:t xml:space="preserve">לעיל ה"ש 28</w:t>
+      </w:r>
+      <w:r>
+        <w:rPr>
+          <w:rFonts w:ascii="David" w:cs="David" w:eastAsia="David" w:hAnsi="David"/>
+          <w:sz w:val="20"/>
+          <w:szCs w:val="20"/>
+          <w:rtl/>
+        </w:rPr>
+        <w:t xml:space="preserve">, בעמ׳ 1242.</w:t>
+      </w:r>
+    </w:p>
+  </w:footnote>
+  <w:footnote w:id="31">
+    <w:p>
+      <w:pPr>
+        <w:bidi/>
+        <w:spacing w:after="60"/>
+      </w:pPr>
+      <w:r>
+        <w:rPr>
+          <w:rStyle w:val="FootnoteReference"/>
+        </w:rPr>
+        <w:footnoteRef/>
+      </w:r>
+      <w:r>
+        <w:rPr>
+          <w:rFonts w:ascii="David" w:cs="David" w:eastAsia="David" w:hAnsi="David"/>
+          <w:sz w:val="20"/>
+          <w:szCs w:val="20"/>
+          <w:rtl/>
+        </w:rPr>
+        <w:t xml:space="preserve">ע"א 1559/99 </w:t>
       </w:r>
       <w:r>
         <w:rPr>
@@ -8900,38 +9145,20 @@
           <w:szCs w:val="20"/>
           <w:rtl/>
         </w:rPr>
-        <w:t xml:space="preserve">בדארנה</w:t>
-      </w:r>
-      <w:r>
-        <w:rPr>
-          <w:rFonts w:ascii="David" w:cs="David" w:eastAsia="David" w:hAnsi="David"/>
-          <w:sz w:val="20"/>
-          <w:szCs w:val="20"/>
-          <w:rtl/>
-        </w:rPr>
-        <w:t xml:space="preserve">, </w:t>
-      </w:r>
-      <w:r>
-        <w:rPr>
-          <w:rFonts w:ascii="David" w:cs="David" w:eastAsia="David" w:hAnsi="David"/>
-          <w:sz w:val="20"/>
-          <w:szCs w:val="20"/>
-          <w:rtl/>
-        </w:rPr>
-        <w:t xml:space="preserve">לעיל ה"ש 8</w:t>
-      </w:r>
-      <w:r>
-        <w:rPr>
-          <w:rFonts w:ascii="David" w:cs="David" w:eastAsia="David" w:hAnsi="David"/>
-          <w:sz w:val="20"/>
-          <w:szCs w:val="20"/>
-          <w:rtl/>
-        </w:rPr>
-        <w:t xml:space="preserve">.</w:t>
+        <w:t xml:space="preserve">צימבלר נ׳ תורג׳מן</w:t>
+      </w:r>
+      <w:r>
+        <w:rPr>
+          <w:rFonts w:ascii="David" w:cs="David" w:eastAsia="David" w:hAnsi="David"/>
+          <w:sz w:val="20"/>
+          <w:szCs w:val="20"/>
+          <w:rtl/>
+        </w:rPr>
+        <w:t xml:space="preserve">, פ"ד נז(5) 49 (2003).</w:t>
       </w:r>
     </w:p>
   </w:footnote>
-  <w:footnote w:id="31">
+  <w:footnote w:id="32">
     <w:p>
       <w:pPr>
         <w:bidi/>
@@ -8950,7 +9177,7 @@
           <w:szCs w:val="20"/>
           <w:rtl/>
         </w:rPr>
-        <w:t xml:space="preserve">ע"א 986/93 </w:t>
+        <w:t xml:space="preserve">עניין </w:t>
       </w:r>
       <w:r>
         <w:rPr>
@@ -8961,20 +9188,38 @@
           <w:szCs w:val="20"/>
           <w:rtl/>
         </w:rPr>
-        <w:t xml:space="preserve">קלמר נ׳ גיא</w:t>
-      </w:r>
-      <w:r>
-        <w:rPr>
-          <w:rFonts w:ascii="David" w:cs="David" w:eastAsia="David" w:hAnsi="David"/>
-          <w:sz w:val="20"/>
-          <w:szCs w:val="20"/>
-          <w:rtl/>
-        </w:rPr>
-        <w:t xml:space="preserve">, פ"ד נ(1) 185 (1996). לדרישת הכתב וגלגוליה ראו נילי כהן "צורת החוזה" הפרקליט לח 383 (תשמ"ט).</w:t>
+        <w:t xml:space="preserve">בדארנה</w:t>
+      </w:r>
+      <w:r>
+        <w:rPr>
+          <w:rFonts w:ascii="David" w:cs="David" w:eastAsia="David" w:hAnsi="David"/>
+          <w:sz w:val="20"/>
+          <w:szCs w:val="20"/>
+          <w:rtl/>
+        </w:rPr>
+        <w:t xml:space="preserve">, </w:t>
+      </w:r>
+      <w:r>
+        <w:rPr>
+          <w:rFonts w:ascii="David" w:cs="David" w:eastAsia="David" w:hAnsi="David"/>
+          <w:sz w:val="20"/>
+          <w:szCs w:val="20"/>
+          <w:rtl/>
+        </w:rPr>
+        <w:t xml:space="preserve">לעיל ה"ש 8</w:t>
+      </w:r>
+      <w:r>
+        <w:rPr>
+          <w:rFonts w:ascii="David" w:cs="David" w:eastAsia="David" w:hAnsi="David"/>
+          <w:sz w:val="20"/>
+          <w:szCs w:val="20"/>
+          <w:rtl/>
+        </w:rPr>
+        <w:t xml:space="preserve">.</w:t>
       </w:r>
     </w:p>
   </w:footnote>
-  <w:footnote w:id="32">
+  <w:footnote w:id="33">
     <w:p>
       <w:pPr>
         <w:bidi/>
@@ -8993,7 +9238,7 @@
           <w:szCs w:val="20"/>
           <w:rtl/>
         </w:rPr>
-        <w:t xml:space="preserve">ע"א 2110/09 </w:t>
+        <w:t xml:space="preserve">ע"א 986/93 </w:t>
       </w:r>
       <w:r>
         <w:rPr>
@@ -9004,20 +9249,20 @@
           <w:szCs w:val="20"/>
           <w:rtl/>
         </w:rPr>
-        <w:t xml:space="preserve">קדור נ׳ דקסה</w:t>
-      </w:r>
-      <w:r>
-        <w:rPr>
-          <w:rFonts w:ascii="David" w:cs="David" w:eastAsia="David" w:hAnsi="David"/>
-          <w:sz w:val="20"/>
-          <w:szCs w:val="20"/>
-          <w:rtl/>
-        </w:rPr>
-        <w:t xml:space="preserve">, פס׳ 13 לפסק דינו של הנשיא גרוניס (נבו 20.9.2012).</w:t>
+        <w:t xml:space="preserve">קלמר נ׳ גיא</w:t>
+      </w:r>
+      <w:r>
+        <w:rPr>
+          <w:rFonts w:ascii="David" w:cs="David" w:eastAsia="David" w:hAnsi="David"/>
+          <w:sz w:val="20"/>
+          <w:szCs w:val="20"/>
+          <w:rtl/>
+        </w:rPr>
+        <w:t xml:space="preserve">, פ"ד נ(1) 185 (1996). לדרישת הכתב וגלגוליה ראו נילי כהן "צורת החוזה" הפרקליט לח 383 (תשמ"ט).</w:t>
       </w:r>
     </w:p>
   </w:footnote>
-  <w:footnote w:id="33">
+  <w:footnote w:id="34">
     <w:p>
       <w:pPr>
         <w:bidi/>
@@ -9036,7 +9281,7 @@
           <w:szCs w:val="20"/>
           <w:rtl/>
         </w:rPr>
-        <w:t xml:space="preserve">ע"א 749/18 </w:t>
+        <w:t xml:space="preserve">ע"א 2110/09 </w:t>
       </w:r>
       <w:r>
         <w:rPr>
@@ -9047,16 +9292,39 @@
           <w:szCs w:val="20"/>
           <w:rtl/>
         </w:rPr>
-        <w:t xml:space="preserve">עיזבון אבו ג׳נימה נ׳ עיזבון אבו ג׳נימה</w:t>
-      </w:r>
-      <w:r>
-        <w:rPr>
-          <w:rFonts w:ascii="David" w:cs="David" w:eastAsia="David" w:hAnsi="David"/>
-          <w:sz w:val="20"/>
-          <w:szCs w:val="20"/>
-          <w:rtl/>
-        </w:rPr>
-        <w:t xml:space="preserve"> (נבו 26.7.2020) (להלן: עניין </w:t>
+        <w:t xml:space="preserve">קדור נ׳ דקסה</w:t>
+      </w:r>
+      <w:r>
+        <w:rPr>
+          <w:rFonts w:ascii="David" w:cs="David" w:eastAsia="David" w:hAnsi="David"/>
+          <w:sz w:val="20"/>
+          <w:szCs w:val="20"/>
+          <w:rtl/>
+        </w:rPr>
+        <w:t xml:space="preserve">, פס׳ 13 לפסק דינו של הנשיא גרוניס (נבו 20.9.2012).</w:t>
+      </w:r>
+    </w:p>
+  </w:footnote>
+  <w:footnote w:id="35">
+    <w:p>
+      <w:pPr>
+        <w:bidi/>
+        <w:spacing w:after="60"/>
+      </w:pPr>
+      <w:r>
+        <w:rPr>
+          <w:rStyle w:val="FootnoteReference"/>
+        </w:rPr>
+        <w:footnoteRef/>
+      </w:r>
+      <w:r>
+        <w:rPr>
+          <w:rFonts w:ascii="David" w:cs="David" w:eastAsia="David" w:hAnsi="David"/>
+          <w:sz w:val="20"/>
+          <w:szCs w:val="20"/>
+          <w:rtl/>
+        </w:rPr>
+        <w:t xml:space="preserve">ע"א 749/18 </w:t>
       </w:r>
       <w:r>
         <w:rPr>
@@ -9067,16 +9335,16 @@
           <w:szCs w:val="20"/>
           <w:rtl/>
         </w:rPr>
-        <w:t xml:space="preserve">אבו ג׳נימה</w:t>
-      </w:r>
-      <w:r>
-        <w:rPr>
-          <w:rFonts w:ascii="David" w:cs="David" w:eastAsia="David" w:hAnsi="David"/>
-          <w:sz w:val="20"/>
-          <w:szCs w:val="20"/>
-          <w:rtl/>
-        </w:rPr>
-        <w:t xml:space="preserve">); וראו גם ע"א 8234/09 </w:t>
+        <w:t xml:space="preserve">עיזבון אבו ג׳נימה נ׳ עיזבון אבו ג׳נימה</w:t>
+      </w:r>
+      <w:r>
+        <w:rPr>
+          <w:rFonts w:ascii="David" w:cs="David" w:eastAsia="David" w:hAnsi="David"/>
+          <w:sz w:val="20"/>
+          <w:szCs w:val="20"/>
+          <w:rtl/>
+        </w:rPr>
+        <w:t xml:space="preserve"> (נבו 26.7.2020) (להלן: עניין </w:t>
       </w:r>
       <w:r>
         <w:rPr>
@@ -9087,39 +9355,16 @@
           <w:szCs w:val="20"/>
           <w:rtl/>
         </w:rPr>
-        <w:t xml:space="preserve">שם טוב נ׳ פרץ</w:t>
-      </w:r>
-      <w:r>
-        <w:rPr>
-          <w:rFonts w:ascii="David" w:cs="David" w:eastAsia="David" w:hAnsi="David"/>
-          <w:sz w:val="20"/>
-          <w:szCs w:val="20"/>
-          <w:rtl/>
-        </w:rPr>
-        <w:t xml:space="preserve"> (נבו 21.3.2011).</w:t>
-      </w:r>
-    </w:p>
-  </w:footnote>
-  <w:footnote w:id="34">
-    <w:p>
-      <w:pPr>
-        <w:bidi/>
-        <w:spacing w:after="60"/>
-      </w:pPr>
-      <w:r>
-        <w:rPr>
-          <w:rStyle w:val="FootnoteReference"/>
-        </w:rPr>
-        <w:footnoteRef/>
-      </w:r>
-      <w:r>
-        <w:rPr>
-          <w:rFonts w:ascii="David" w:cs="David" w:eastAsia="David" w:hAnsi="David"/>
-          <w:sz w:val="20"/>
-          <w:szCs w:val="20"/>
-          <w:rtl/>
-        </w:rPr>
-        <w:t xml:space="preserve">ס׳ 5(א) לחוק המתנה, התשכ"ח-1968. במקרקעין כפופה ההתחייבות גם לס׳ 8 לחוק המקרקעין. ראו מרדכי אלפרדו ראבילו </w:t>
+        <w:t xml:space="preserve">אבו ג׳נימה</w:t>
+      </w:r>
+      <w:r>
+        <w:rPr>
+          <w:rFonts w:ascii="David" w:cs="David" w:eastAsia="David" w:hAnsi="David"/>
+          <w:sz w:val="20"/>
+          <w:szCs w:val="20"/>
+          <w:rtl/>
+        </w:rPr>
+        <w:t xml:space="preserve">); וראו גם ע"א 8234/09 </w:t>
       </w:r>
       <w:r>
         <w:rPr>
@@ -9130,57 +9375,16 @@
           <w:szCs w:val="20"/>
           <w:rtl/>
         </w:rPr>
-        <w:t xml:space="preserve">חוק המתנה, תשכ"ח-1968</w:t>
-      </w:r>
-      <w:r>
-        <w:rPr>
-          <w:rFonts w:ascii="David" w:cs="David" w:eastAsia="David" w:hAnsi="David"/>
-          <w:sz w:val="20"/>
-          <w:szCs w:val="20"/>
-          <w:rtl/>
-        </w:rPr>
-        <w:t xml:space="preserve"> 331–346 (פירוש לחוקי החוזים מיסודו של ג׳ טדסקי, מהדורה שנייה, תשנ"ז).</w:t>
-      </w:r>
-    </w:p>
-  </w:footnote>
-  <w:footnote w:id="35">
-    <w:p>
-      <w:pPr>
-        <w:bidi/>
-        <w:spacing w:after="60"/>
-      </w:pPr>
-      <w:r>
-        <w:rPr>
-          <w:rStyle w:val="FootnoteReference"/>
-        </w:rPr>
-        <w:footnoteRef/>
-      </w:r>
-      <w:r>
-        <w:rPr>
-          <w:rFonts w:ascii="David" w:cs="David" w:eastAsia="David" w:hAnsi="David"/>
-          <w:sz w:val="20"/>
-          <w:szCs w:val="20"/>
-          <w:rtl/>
-        </w:rPr>
-        <w:t xml:space="preserve">ס׳ 5(ב)–5(ג) לחוק המתנה; ראבילו, </w:t>
-      </w:r>
-      <w:r>
-        <w:rPr>
-          <w:rFonts w:ascii="David" w:cs="David" w:eastAsia="David" w:hAnsi="David"/>
-          <w:sz w:val="20"/>
-          <w:szCs w:val="20"/>
-          <w:rtl/>
-        </w:rPr>
-        <w:t xml:space="preserve">לעיל ה"ש 34</w:t>
-      </w:r>
-      <w:r>
-        <w:rPr>
-          <w:rFonts w:ascii="David" w:cs="David" w:eastAsia="David" w:hAnsi="David"/>
-          <w:sz w:val="20"/>
-          <w:szCs w:val="20"/>
-          <w:rtl/>
-        </w:rPr>
-        <w:t xml:space="preserve">, בעמ׳ 344 ואילך.</w:t>
+        <w:t xml:space="preserve">שם טוב נ׳ פרץ</w:t>
+      </w:r>
+      <w:r>
+        <w:rPr>
+          <w:rFonts w:ascii="David" w:cs="David" w:eastAsia="David" w:hAnsi="David"/>
+          <w:sz w:val="20"/>
+          <w:szCs w:val="20"/>
+          <w:rtl/>
+        </w:rPr>
+        <w:t xml:space="preserve"> (נבו 21.3.2011).</w:t>
       </w:r>
     </w:p>
   </w:footnote>
@@ -9203,7 +9407,7 @@
           <w:szCs w:val="20"/>
           <w:rtl/>
         </w:rPr>
-        <w:t xml:space="preserve">עמ"ש (מחוזי מר׳) 52601-10-23 </w:t>
+        <w:t xml:space="preserve">ס׳ 5(א) לחוק המתנה, התשכ"ח-1968. במקרקעין כפופה ההתחייבות גם לס׳ 8 לחוק המקרקעין. ראו מרדכי אלפרדו ראבילו </w:t>
       </w:r>
       <w:r>
         <w:rPr>
@@ -9214,34 +9418,16 @@
           <w:szCs w:val="20"/>
           <w:rtl/>
         </w:rPr>
-        <w:t xml:space="preserve">א.א. נ׳ אר.א</w:t>
-      </w:r>
-      <w:r>
-        <w:rPr>
-          <w:rFonts w:ascii="David" w:cs="David" w:eastAsia="David" w:hAnsi="David"/>
-          <w:sz w:val="20"/>
-          <w:szCs w:val="20"/>
-          <w:rtl/>
-        </w:rPr>
-        <w:t xml:space="preserve"> (נבו 1.11.2024); ראבילו, </w:t>
-      </w:r>
-      <w:r>
-        <w:rPr>
-          <w:rFonts w:ascii="David" w:cs="David" w:eastAsia="David" w:hAnsi="David"/>
-          <w:sz w:val="20"/>
-          <w:szCs w:val="20"/>
-          <w:rtl/>
-        </w:rPr>
-        <w:t xml:space="preserve">לעיל ה"ש 34</w:t>
-      </w:r>
-      <w:r>
-        <w:rPr>
-          <w:rFonts w:ascii="David" w:cs="David" w:eastAsia="David" w:hAnsi="David"/>
-          <w:sz w:val="20"/>
-          <w:szCs w:val="20"/>
-          <w:rtl/>
-        </w:rPr>
-        <w:t xml:space="preserve">, בעמ׳ 345–346; והשוו גד טדסקי "הרשאה בלתי-הדירה לביצוע מתנה לאדם שלישי" משפטים יט 205 (תשמ"ט).</w:t>
+        <w:t xml:space="preserve">חוק המתנה, תשכ"ח-1968</w:t>
+      </w:r>
+      <w:r>
+        <w:rPr>
+          <w:rFonts w:ascii="David" w:cs="David" w:eastAsia="David" w:hAnsi="David"/>
+          <w:sz w:val="20"/>
+          <w:szCs w:val="20"/>
+          <w:rtl/>
+        </w:rPr>
+        <w:t xml:space="preserve"> 331–346 (פירוש לחוקי החוזים מיסודו של ג׳ טדסקי, מהדורה שנייה, תשנ"ז).</w:t>
       </w:r>
     </w:p>
   </w:footnote>
@@ -9264,7 +9450,48 @@
           <w:szCs w:val="20"/>
           <w:rtl/>
         </w:rPr>
-        <w:t xml:space="preserve">תמ"ש (משפחה ת"א) 18541-01-22 </w:t>
+        <w:t xml:space="preserve">ס׳ 5(ב)–5(ג) לחוק המתנה; ראבילו, </w:t>
+      </w:r>
+      <w:r>
+        <w:rPr>
+          <w:rFonts w:ascii="David" w:cs="David" w:eastAsia="David" w:hAnsi="David"/>
+          <w:sz w:val="20"/>
+          <w:szCs w:val="20"/>
+          <w:rtl/>
+        </w:rPr>
+        <w:t xml:space="preserve">לעיל ה"ש 36</w:t>
+      </w:r>
+      <w:r>
+        <w:rPr>
+          <w:rFonts w:ascii="David" w:cs="David" w:eastAsia="David" w:hAnsi="David"/>
+          <w:sz w:val="20"/>
+          <w:szCs w:val="20"/>
+          <w:rtl/>
+        </w:rPr>
+        <w:t xml:space="preserve">, בעמ׳ 344 ואילך.</w:t>
+      </w:r>
+    </w:p>
+  </w:footnote>
+  <w:footnote w:id="38">
+    <w:p>
+      <w:pPr>
+        <w:bidi/>
+        <w:spacing w:after="60"/>
+      </w:pPr>
+      <w:r>
+        <w:rPr>
+          <w:rStyle w:val="FootnoteReference"/>
+        </w:rPr>
+        <w:footnoteRef/>
+      </w:r>
+      <w:r>
+        <w:rPr>
+          <w:rFonts w:ascii="David" w:cs="David" w:eastAsia="David" w:hAnsi="David"/>
+          <w:sz w:val="20"/>
+          <w:szCs w:val="20"/>
+          <w:rtl/>
+        </w:rPr>
+        <w:t xml:space="preserve">עמ"ש (מחוזי מר׳) 52601-10-23 </w:t>
       </w:r>
       <w:r>
         <w:rPr>
@@ -9275,20 +9502,38 @@
           <w:szCs w:val="20"/>
           <w:rtl/>
         </w:rPr>
-        <w:t xml:space="preserve">פלונים נ׳ אלמונים</w:t>
-      </w:r>
-      <w:r>
-        <w:rPr>
-          <w:rFonts w:ascii="David" w:cs="David" w:eastAsia="David" w:hAnsi="David"/>
-          <w:sz w:val="20"/>
-          <w:szCs w:val="20"/>
-          <w:rtl/>
-        </w:rPr>
-        <w:t xml:space="preserve"> (נבו 15.1.2023).</w:t>
+        <w:t xml:space="preserve">א.א. נ׳ אר.א</w:t>
+      </w:r>
+      <w:r>
+        <w:rPr>
+          <w:rFonts w:ascii="David" w:cs="David" w:eastAsia="David" w:hAnsi="David"/>
+          <w:sz w:val="20"/>
+          <w:szCs w:val="20"/>
+          <w:rtl/>
+        </w:rPr>
+        <w:t xml:space="preserve"> (נבו 1.11.2024); ראבילו, </w:t>
+      </w:r>
+      <w:r>
+        <w:rPr>
+          <w:rFonts w:ascii="David" w:cs="David" w:eastAsia="David" w:hAnsi="David"/>
+          <w:sz w:val="20"/>
+          <w:szCs w:val="20"/>
+          <w:rtl/>
+        </w:rPr>
+        <w:t xml:space="preserve">לעיל ה"ש 36</w:t>
+      </w:r>
+      <w:r>
+        <w:rPr>
+          <w:rFonts w:ascii="David" w:cs="David" w:eastAsia="David" w:hAnsi="David"/>
+          <w:sz w:val="20"/>
+          <w:szCs w:val="20"/>
+          <w:rtl/>
+        </w:rPr>
+        <w:t xml:space="preserve">, בעמ׳ 345–346; והשוו גד טדסקי "הרשאה בלתי-הדירה לביצוע מתנה לאדם שלישי" משפטים יט 205 (תשמ"ט).</w:t>
       </w:r>
     </w:p>
   </w:footnote>
-  <w:footnote w:id="38">
+  <w:footnote w:id="39">
     <w:p>
       <w:pPr>
         <w:bidi/>
@@ -9307,7 +9552,7 @@
           <w:szCs w:val="20"/>
           <w:rtl/>
         </w:rPr>
-        <w:t xml:space="preserve">ע"א 6588/12 </w:t>
+        <w:t xml:space="preserve">תמ"ש (משפחה ת"א) 18541-01-22 </w:t>
       </w:r>
       <w:r>
         <w:rPr>
@@ -9318,16 +9563,39 @@
           <w:szCs w:val="20"/>
           <w:rtl/>
         </w:rPr>
-        <w:t xml:space="preserve">כבהה נ׳ כבהה</w:t>
-      </w:r>
-      <w:r>
-        <w:rPr>
-          <w:rFonts w:ascii="David" w:cs="David" w:eastAsia="David" w:hAnsi="David"/>
-          <w:sz w:val="20"/>
-          <w:szCs w:val="20"/>
-          <w:rtl/>
-        </w:rPr>
-        <w:t xml:space="preserve"> (נבו 24.12.2014) (להלן: עניין </w:t>
+        <w:t xml:space="preserve">פלונים נ׳ אלמונים</w:t>
+      </w:r>
+      <w:r>
+        <w:rPr>
+          <w:rFonts w:ascii="David" w:cs="David" w:eastAsia="David" w:hAnsi="David"/>
+          <w:sz w:val="20"/>
+          <w:szCs w:val="20"/>
+          <w:rtl/>
+        </w:rPr>
+        <w:t xml:space="preserve"> (נבו 15.1.2023).</w:t>
+      </w:r>
+    </w:p>
+  </w:footnote>
+  <w:footnote w:id="40">
+    <w:p>
+      <w:pPr>
+        <w:bidi/>
+        <w:spacing w:after="60"/>
+      </w:pPr>
+      <w:r>
+        <w:rPr>
+          <w:rStyle w:val="FootnoteReference"/>
+        </w:rPr>
+        <w:footnoteRef/>
+      </w:r>
+      <w:r>
+        <w:rPr>
+          <w:rFonts w:ascii="David" w:cs="David" w:eastAsia="David" w:hAnsi="David"/>
+          <w:sz w:val="20"/>
+          <w:szCs w:val="20"/>
+          <w:rtl/>
+        </w:rPr>
+        <w:t xml:space="preserve">ע"א 6588/12 </w:t>
       </w:r>
       <w:r>
         <w:rPr>
@@ -9338,6 +9606,26 @@
           <w:szCs w:val="20"/>
           <w:rtl/>
         </w:rPr>
+        <w:t xml:space="preserve">כבהה נ׳ כבהה</w:t>
+      </w:r>
+      <w:r>
+        <w:rPr>
+          <w:rFonts w:ascii="David" w:cs="David" w:eastAsia="David" w:hAnsi="David"/>
+          <w:sz w:val="20"/>
+          <w:szCs w:val="20"/>
+          <w:rtl/>
+        </w:rPr>
+        <w:t xml:space="preserve"> (נבו 24.12.2014) (להלן: עניין </w:t>
+      </w:r>
+      <w:r>
+        <w:rPr>
+          <w:rFonts w:ascii="David" w:cs="David" w:eastAsia="David" w:hAnsi="David"/>
+          <w:i/>
+          <w:iCs/>
+          <w:sz w:val="20"/>
+          <w:szCs w:val="20"/>
+          <w:rtl/>
+        </w:rPr>
         <w:t xml:space="preserve">כבהה</w:t>
       </w:r>
       <w:r>
@@ -9348,70 +9636,6 @@
           <w:rtl/>
         </w:rPr>
         <w:t xml:space="preserve">). לעיקרון האנגלי שביסוד ההבחנה – "היושר לא יסייע למתנדב" – ראו להלן פרק ו.1.4.</w:t>
-      </w:r>
-    </w:p>
-  </w:footnote>
-  <w:footnote w:id="39">
-    <w:p>
-      <w:pPr>
-        <w:bidi/>
-        <w:spacing w:after="60"/>
-      </w:pPr>
-      <w:r>
-        <w:rPr>
-          <w:rStyle w:val="FootnoteReference"/>
-        </w:rPr>
-        <w:footnoteRef/>
-      </w:r>
-      <w:r>
-        <w:rPr>
-          <w:rFonts w:ascii="David" w:cs="David" w:eastAsia="David" w:hAnsi="David"/>
-          <w:sz w:val="20"/>
-          <w:szCs w:val="20"/>
-          <w:rtl/>
-        </w:rPr>
-        <w:t xml:space="preserve">ראבילו, </w:t>
-      </w:r>
-      <w:r>
-        <w:rPr>
-          <w:rFonts w:ascii="David" w:cs="David" w:eastAsia="David" w:hAnsi="David"/>
-          <w:sz w:val="20"/>
-          <w:szCs w:val="20"/>
-          <w:rtl/>
-        </w:rPr>
-        <w:t xml:space="preserve">לעיל ה"ש 34</w:t>
-      </w:r>
-      <w:r>
-        <w:rPr>
-          <w:rFonts w:ascii="David" w:cs="David" w:eastAsia="David" w:hAnsi="David"/>
-          <w:sz w:val="20"/>
-          <w:szCs w:val="20"/>
-          <w:rtl/>
-        </w:rPr>
-        <w:t xml:space="preserve">, בעמ׳ 333–337; להשלמת מתנה בקבלת החזקה ראו גם להלן פרק ו.3 לעניין דרישת הקַבְּץ׳ (התפיסה) במשפט השרעי.</w:t>
-      </w:r>
-    </w:p>
-  </w:footnote>
-  <w:footnote w:id="40">
-    <w:p>
-      <w:pPr>
-        <w:bidi/>
-        <w:spacing w:after="60"/>
-      </w:pPr>
-      <w:r>
-        <w:rPr>
-          <w:rStyle w:val="FootnoteReference"/>
-        </w:rPr>
-        <w:footnoteRef/>
-      </w:r>
-      <w:r>
-        <w:rPr>
-          <w:rFonts w:ascii="David" w:cs="David" w:eastAsia="David" w:hAnsi="David"/>
-          <w:sz w:val="20"/>
-          <w:szCs w:val="20"/>
-          <w:rtl/>
-        </w:rPr>
-        <w:t xml:space="preserve">נינה זלצמן "רישיון במקרקעין" הפרקליט מב 24 (תשנ"ה).</w:t>
       </w:r>
     </w:p>
   </w:footnote>
@@ -9434,6 +9658,70 @@
           <w:szCs w:val="20"/>
           <w:rtl/>
         </w:rPr>
+        <w:t xml:space="preserve">ראבילו, </w:t>
+      </w:r>
+      <w:r>
+        <w:rPr>
+          <w:rFonts w:ascii="David" w:cs="David" w:eastAsia="David" w:hAnsi="David"/>
+          <w:sz w:val="20"/>
+          <w:szCs w:val="20"/>
+          <w:rtl/>
+        </w:rPr>
+        <w:t xml:space="preserve">לעיל ה"ש 36</w:t>
+      </w:r>
+      <w:r>
+        <w:rPr>
+          <w:rFonts w:ascii="David" w:cs="David" w:eastAsia="David" w:hAnsi="David"/>
+          <w:sz w:val="20"/>
+          <w:szCs w:val="20"/>
+          <w:rtl/>
+        </w:rPr>
+        <w:t xml:space="preserve">, בעמ׳ 333–337; להשלמת מתנה בקבלת החזקה ראו גם להלן פרק ו.3 לעניין דרישת הקַבְּץ׳ (התפיסה) במשפט השרעי.</w:t>
+      </w:r>
+    </w:p>
+  </w:footnote>
+  <w:footnote w:id="42">
+    <w:p>
+      <w:pPr>
+        <w:bidi/>
+        <w:spacing w:after="60"/>
+      </w:pPr>
+      <w:r>
+        <w:rPr>
+          <w:rStyle w:val="FootnoteReference"/>
+        </w:rPr>
+        <w:footnoteRef/>
+      </w:r>
+      <w:r>
+        <w:rPr>
+          <w:rFonts w:ascii="David" w:cs="David" w:eastAsia="David" w:hAnsi="David"/>
+          <w:sz w:val="20"/>
+          <w:szCs w:val="20"/>
+          <w:rtl/>
+        </w:rPr>
+        <w:t xml:space="preserve">נינה זלצמן "רישיון במקרקעין" הפרקליט מב 24 (תשנ"ה).</w:t>
+      </w:r>
+    </w:p>
+  </w:footnote>
+  <w:footnote w:id="43">
+    <w:p>
+      <w:pPr>
+        <w:bidi/>
+        <w:spacing w:after="60"/>
+      </w:pPr>
+      <w:r>
+        <w:rPr>
+          <w:rStyle w:val="FootnoteReference"/>
+        </w:rPr>
+        <w:footnoteRef/>
+      </w:r>
+      <w:r>
+        <w:rPr>
+          <w:rFonts w:ascii="David" w:cs="David" w:eastAsia="David" w:hAnsi="David"/>
+          <w:sz w:val="20"/>
+          <w:szCs w:val="20"/>
+          <w:rtl/>
+        </w:rPr>
         <w:t xml:space="preserve">ע"א 463/79 </w:t>
       </w:r>
       <w:r>
@@ -9478,7 +9766,7 @@
       </w:r>
     </w:p>
   </w:footnote>
-  <w:footnote w:id="42">
+  <w:footnote w:id="44">
     <w:p>
       <w:pPr>
         <w:bidi/>
@@ -9541,7 +9829,7 @@
       </w:r>
     </w:p>
   </w:footnote>
-  <w:footnote w:id="43">
+  <w:footnote w:id="45">
     <w:p>
       <w:pPr>
         <w:bidi/>
@@ -9604,7 +9892,7 @@
       </w:r>
     </w:p>
   </w:footnote>
-  <w:footnote w:id="44">
+  <w:footnote w:id="46">
     <w:p>
       <w:pPr>
         <w:bidi/>
@@ -9632,7 +9920,7 @@
           <w:szCs w:val="20"/>
           <w:rtl/>
         </w:rPr>
-        <w:t xml:space="preserve">לעיל ה"ש 43</w:t>
+        <w:t xml:space="preserve">לעיל ה"ש 45</w:t>
       </w:r>
       <w:r>
         <w:rPr>
@@ -9650,7 +9938,7 @@
           <w:szCs w:val="20"/>
           <w:rtl/>
         </w:rPr>
-        <w:t xml:space="preserve">לעיל ה"ש 40</w:t>
+        <w:t xml:space="preserve">לעיל ה"ש 42</w:t>
       </w:r>
       <w:r>
         <w:rPr>
@@ -9663,7 +9951,7 @@
       </w:r>
     </w:p>
   </w:footnote>
-  <w:footnote w:id="45">
+  <w:footnote w:id="47">
     <w:p>
       <w:pPr>
         <w:bidi/>
@@ -9711,7 +9999,7 @@
           <w:szCs w:val="20"/>
           <w:rtl/>
         </w:rPr>
-        <w:t xml:space="preserve">לעיל ה"ש 33</w:t>
+        <w:t xml:space="preserve">לעיל ה"ש 35</w:t>
       </w:r>
       <w:r>
         <w:rPr>
@@ -9724,7 +10012,7 @@
       </w:r>
     </w:p>
   </w:footnote>
-  <w:footnote w:id="46">
+  <w:footnote w:id="48">
     <w:p>
       <w:pPr>
         <w:bidi/>
@@ -9807,7 +10095,7 @@
       </w:r>
     </w:p>
   </w:footnote>
-  <w:footnote w:id="47">
+  <w:footnote w:id="49">
     <w:p>
       <w:pPr>
         <w:bidi/>
@@ -9855,7 +10143,7 @@
           <w:szCs w:val="20"/>
           <w:rtl/>
         </w:rPr>
-        <w:t xml:space="preserve">לעיל ה"ש 46</w:t>
+        <w:t xml:space="preserve">לעיל ה"ש 48</w:t>
       </w:r>
       <w:r>
         <w:rPr>
@@ -9868,7 +10156,7 @@
       </w:r>
     </w:p>
   </w:footnote>
-  <w:footnote w:id="48">
+  <w:footnote w:id="50">
     <w:p>
       <w:pPr>
         <w:bidi/>
@@ -9969,7 +10257,7 @@
       </w:r>
     </w:p>
   </w:footnote>
-  <w:footnote w:id="49">
+  <w:footnote w:id="51">
     <w:p>
       <w:pPr>
         <w:bidi/>
@@ -10012,7 +10300,7 @@
       </w:r>
     </w:p>
   </w:footnote>
-  <w:footnote w:id="50">
+  <w:footnote w:id="52">
     <w:p>
       <w:pPr>
         <w:bidi/>
@@ -10055,7 +10343,7 @@
       </w:r>
     </w:p>
   </w:footnote>
-  <w:footnote w:id="51">
+  <w:footnote w:id="53">
     <w:p>
       <w:pPr>
         <w:bidi/>
@@ -10098,7 +10386,7 @@
       </w:r>
     </w:p>
   </w:footnote>
-  <w:footnote w:id="52">
+  <w:footnote w:id="54">
     <w:p>
       <w:pPr>
         <w:bidi/>
@@ -10141,7 +10429,7 @@
       </w:r>
     </w:p>
   </w:footnote>
-  <w:footnote w:id="53">
+  <w:footnote w:id="55">
     <w:p>
       <w:pPr>
         <w:bidi/>
@@ -10169,7 +10457,7 @@
           <w:szCs w:val="20"/>
           <w:rtl/>
         </w:rPr>
-        <w:t xml:space="preserve">לעיל ה"ש 46</w:t>
+        <w:t xml:space="preserve">לעיל ה"ש 48</w:t>
       </w:r>
       <w:r>
         <w:rPr>
@@ -10179,88 +10467,6 @@
           <w:rtl/>
         </w:rPr>
         <w:t xml:space="preserve">.</w:t>
-      </w:r>
-    </w:p>
-  </w:footnote>
-  <w:footnote w:id="54">
-    <w:p>
-      <w:pPr>
-        <w:bidi/>
-        <w:spacing w:after="60"/>
-      </w:pPr>
-      <w:r>
-        <w:rPr>
-          <w:rStyle w:val="FootnoteReference"/>
-        </w:rPr>
-        <w:footnoteRef/>
-      </w:r>
-      <w:r>
-        <w:rPr>
-          <w:rFonts w:ascii="David" w:cs="David" w:eastAsia="David" w:hAnsi="David"/>
-          <w:sz w:val="20"/>
-          <w:szCs w:val="20"/>
-          <w:rtl/>
-        </w:rPr>
-        <w:t xml:space="preserve">לביקורת עקרונית על אי-הוודאות הנובעת משסתומי יושר ותום לב בדיני הקניין השוו רייכמן, </w:t>
-      </w:r>
-      <w:r>
-        <w:rPr>
-          <w:rFonts w:ascii="David" w:cs="David" w:eastAsia="David" w:hAnsi="David"/>
-          <w:sz w:val="20"/>
-          <w:szCs w:val="20"/>
-          <w:rtl/>
-        </w:rPr>
-        <w:t xml:space="preserve">לעיל ה"ש 9</w:t>
-      </w:r>
-      <w:r>
-        <w:rPr>
-          <w:rFonts w:ascii="David" w:cs="David" w:eastAsia="David" w:hAnsi="David"/>
-          <w:sz w:val="20"/>
-          <w:szCs w:val="20"/>
-          <w:rtl/>
-        </w:rPr>
-        <w:t xml:space="preserve">, בעמ׳ 297 ואילך; וכהן, </w:t>
-      </w:r>
-      <w:r>
-        <w:rPr>
-          <w:rFonts w:ascii="David" w:cs="David" w:eastAsia="David" w:hAnsi="David"/>
-          <w:sz w:val="20"/>
-          <w:szCs w:val="20"/>
-          <w:rtl/>
-        </w:rPr>
-        <w:t xml:space="preserve">לעיל ה"ש 31</w:t>
-      </w:r>
-      <w:r>
-        <w:rPr>
-          <w:rFonts w:ascii="David" w:cs="David" w:eastAsia="David" w:hAnsi="David"/>
-          <w:sz w:val="20"/>
-          <w:szCs w:val="20"/>
-          <w:rtl/>
-        </w:rPr>
-        <w:t xml:space="preserve">.</w:t>
-      </w:r>
-    </w:p>
-  </w:footnote>
-  <w:footnote w:id="55">
-    <w:p>
-      <w:pPr>
-        <w:bidi/>
-        <w:spacing w:after="60"/>
-      </w:pPr>
-      <w:r>
-        <w:rPr>
-          <w:rStyle w:val="FootnoteReference"/>
-        </w:rPr>
-        <w:footnoteRef/>
-      </w:r>
-      <w:r>
-        <w:rPr>
-          <w:rFonts w:ascii="David" w:cs="David" w:eastAsia="David" w:hAnsi="David"/>
-          <w:sz w:val="20"/>
-          <w:szCs w:val="20"/>
-          <w:rtl/>
-        </w:rPr>
-        <w:t xml:space="preserve">תק׳ 36–38 לתקנות התכנון והבניה (רישוי בניה), התשע"ו-2016; וקודם לכן תק׳ 2א לתקנות התכנון והבניה (בקשה להיתר, תנאיו ואגרות), התש"ל-1970. ההלכה חזרה והדגישה כי מוסדות התכנון אינם מכריעים בסכסוכי קניין.</w:t>
       </w:r>
     </w:p>
   </w:footnote>
@@ -10283,6 +10489,88 @@
           <w:szCs w:val="20"/>
           <w:rtl/>
         </w:rPr>
+        <w:t xml:space="preserve">לביקורת עקרונית על אי-הוודאות הנובעת משסתומי יושר ותום לב בדיני הקניין השוו רייכמן, </w:t>
+      </w:r>
+      <w:r>
+        <w:rPr>
+          <w:rFonts w:ascii="David" w:cs="David" w:eastAsia="David" w:hAnsi="David"/>
+          <w:sz w:val="20"/>
+          <w:szCs w:val="20"/>
+          <w:rtl/>
+        </w:rPr>
+        <w:t xml:space="preserve">לעיל ה"ש 9</w:t>
+      </w:r>
+      <w:r>
+        <w:rPr>
+          <w:rFonts w:ascii="David" w:cs="David" w:eastAsia="David" w:hAnsi="David"/>
+          <w:sz w:val="20"/>
+          <w:szCs w:val="20"/>
+          <w:rtl/>
+        </w:rPr>
+        <w:t xml:space="preserve">, בעמ׳ 297 ואילך; וכהן, </w:t>
+      </w:r>
+      <w:r>
+        <w:rPr>
+          <w:rFonts w:ascii="David" w:cs="David" w:eastAsia="David" w:hAnsi="David"/>
+          <w:sz w:val="20"/>
+          <w:szCs w:val="20"/>
+          <w:rtl/>
+        </w:rPr>
+        <w:t xml:space="preserve">לעיל ה"ש 33</w:t>
+      </w:r>
+      <w:r>
+        <w:rPr>
+          <w:rFonts w:ascii="David" w:cs="David" w:eastAsia="David" w:hAnsi="David"/>
+          <w:sz w:val="20"/>
+          <w:szCs w:val="20"/>
+          <w:rtl/>
+        </w:rPr>
+        <w:t xml:space="preserve">.</w:t>
+      </w:r>
+    </w:p>
+  </w:footnote>
+  <w:footnote w:id="57">
+    <w:p>
+      <w:pPr>
+        <w:bidi/>
+        <w:spacing w:after="60"/>
+      </w:pPr>
+      <w:r>
+        <w:rPr>
+          <w:rStyle w:val="FootnoteReference"/>
+        </w:rPr>
+        <w:footnoteRef/>
+      </w:r>
+      <w:r>
+        <w:rPr>
+          <w:rFonts w:ascii="David" w:cs="David" w:eastAsia="David" w:hAnsi="David"/>
+          <w:sz w:val="20"/>
+          <w:szCs w:val="20"/>
+          <w:rtl/>
+        </w:rPr>
+        <w:t xml:space="preserve">תק׳ 36–38 לתקנות התכנון והבניה (רישוי בניה), התשע"ו-2016; וקודם לכן תק׳ 2א לתקנות התכנון והבניה (בקשה להיתר, תנאיו ואגרות), התש"ל-1970. ההלכה חזרה והדגישה כי מוסדות התכנון אינם מכריעים בסכסוכי קניין.</w:t>
+      </w:r>
+    </w:p>
+  </w:footnote>
+  <w:footnote w:id="58">
+    <w:p>
+      <w:pPr>
+        <w:bidi/>
+        <w:spacing w:after="60"/>
+      </w:pPr>
+      <w:r>
+        <w:rPr>
+          <w:rStyle w:val="FootnoteReference"/>
+        </w:rPr>
+        <w:footnoteRef/>
+      </w:r>
+      <w:r>
+        <w:rPr>
+          <w:rFonts w:ascii="David" w:cs="David" w:eastAsia="David" w:hAnsi="David"/>
+          <w:sz w:val="20"/>
+          <w:szCs w:val="20"/>
+          <w:rtl/>
+        </w:rPr>
         <w:t xml:space="preserve">ראו פסיקת ערכאות המשפחה שנסקרה לעיל, </w:t>
       </w:r>
       <w:r>
@@ -10292,7 +10580,7 @@
           <w:szCs w:val="20"/>
           <w:rtl/>
         </w:rPr>
-        <w:t xml:space="preserve">לעיל ה"ש 48</w:t>
+        <w:t xml:space="preserve">לעיל ה"ש 50</w:t>
       </w:r>
       <w:r>
         <w:rPr>
@@ -10330,7 +10618,7 @@
           <w:szCs w:val="20"/>
           <w:rtl/>
         </w:rPr>
-        <w:t xml:space="preserve">לעיל ה"ש 41</w:t>
+        <w:t xml:space="preserve">לעיל ה"ש 43</w:t>
       </w:r>
       <w:r>
         <w:rPr>
@@ -10343,7 +10631,7 @@
       </w:r>
     </w:p>
   </w:footnote>
-  <w:footnote w:id="57">
+  <w:footnote w:id="59">
     <w:p>
       <w:pPr>
         <w:bidi/>
@@ -10391,7 +10679,7 @@
           <w:szCs w:val="20"/>
           <w:rtl/>
         </w:rPr>
-        <w:t xml:space="preserve">לעיל ה"ש 33</w:t>
+        <w:t xml:space="preserve">לעיל ה"ש 35</w:t>
       </w:r>
       <w:r>
         <w:rPr>
@@ -10404,7 +10692,7 @@
       </w:r>
     </w:p>
   </w:footnote>
-  <w:footnote w:id="58">
+  <w:footnote w:id="60">
     <w:p>
       <w:pPr>
         <w:bidi/>
@@ -10427,7 +10715,7 @@
       </w:r>
     </w:p>
   </w:footnote>
-  <w:footnote w:id="59">
+  <w:footnote w:id="61">
     <w:p>
       <w:pPr>
         <w:bidi/>
@@ -10526,7 +10814,7 @@
       </w:r>
     </w:p>
   </w:footnote>
-  <w:footnote w:id="60">
+  <w:footnote w:id="62">
     <w:p>
       <w:pPr>
         <w:bidi/>
@@ -10589,7 +10877,7 @@
       </w:r>
     </w:p>
   </w:footnote>
-  <w:footnote w:id="61">
+  <w:footnote w:id="63">
     <w:p>
       <w:pPr>
         <w:bidi/>
@@ -10642,7 +10930,7 @@
       </w:r>
     </w:p>
   </w:footnote>
-  <w:footnote w:id="62">
+  <w:footnote w:id="64">
     <w:p>
       <w:pPr>
         <w:bidi/>
@@ -10685,7 +10973,7 @@
       </w:r>
     </w:p>
   </w:footnote>
-  <w:footnote w:id="63">
+  <w:footnote w:id="65">
     <w:p>
       <w:pPr>
         <w:bidi/>
@@ -10713,7 +11001,7 @@
           <w:szCs w:val="20"/>
           <w:rtl/>
         </w:rPr>
-        <w:t xml:space="preserve">לעיל ה"ש 62</w:t>
+        <w:t xml:space="preserve">לעיל ה"ש 64</w:t>
       </w:r>
       <w:r>
         <w:rPr>
@@ -10723,52 +11011,6 @@
           <w:rtl/>
         </w:rPr>
         <w:t xml:space="preserve">, בעמ׳ 282.</w:t>
-      </w:r>
-    </w:p>
-  </w:footnote>
-  <w:footnote w:id="64">
-    <w:p>
-      <w:pPr>
-        <w:bidi/>
-        <w:spacing w:after="60"/>
-      </w:pPr>
-      <w:r>
-        <w:rPr>
-          <w:rStyle w:val="FootnoteReference"/>
-        </w:rPr>
-        <w:footnoteRef/>
-      </w:r>
-      <w:r>
-        <w:rPr>
-          <w:rFonts w:ascii="David" w:cs="David" w:eastAsia="David" w:hAnsi="David"/>
-          <w:sz w:val="20"/>
-          <w:szCs w:val="20"/>
-          <w:rtl/>
-        </w:rPr>
-        <w:t xml:space="preserve">ס׳ 16(ב) לחוק מיסוי מקרקעין. המחוקק זיהה כבר בשנות השישים את ייפוי הכוח כמסלול עוקף-דיווח, וביקש ללכוד גם אותו ברשת ההצהרה.</w:t>
-      </w:r>
-    </w:p>
-  </w:footnote>
-  <w:footnote w:id="65">
-    <w:p>
-      <w:pPr>
-        <w:bidi/>
-        <w:spacing w:after="60"/>
-      </w:pPr>
-      <w:r>
-        <w:rPr>
-          <w:rStyle w:val="FootnoteReference"/>
-        </w:rPr>
-        <w:footnoteRef/>
-      </w:r>
-      <w:r>
-        <w:rPr>
-          <w:rFonts w:ascii="David" w:cs="David" w:eastAsia="David" w:hAnsi="David"/>
-          <w:sz w:val="20"/>
-          <w:szCs w:val="20"/>
-          <w:rtl/>
-        </w:rPr>
-        <w:t xml:space="preserve">ס׳ 73 לחוק מיסוי מקרקעין.</w:t>
       </w:r>
     </w:p>
   </w:footnote>
@@ -10791,7 +11033,7 @@
           <w:szCs w:val="20"/>
           <w:rtl/>
         </w:rPr>
-        <w:t xml:space="preserve">ס׳ 324(א) לפקודת העיריות [נוסח חדש]; ולעניין היטל השבחה – ס׳ 10 לתוספת השלישית לחוק התכנון והבנייה, התשכ"ה-1965.</w:t>
+        <w:t xml:space="preserve">ס׳ 16(ב) לחוק מיסוי מקרקעין. המחוקק זיהה כבר בשנות השישים את ייפוי הכוח כמסלול עוקף-דיווח, וביקש ללכוד גם אותו ברשת ההצהרה.</w:t>
       </w:r>
     </w:p>
   </w:footnote>
@@ -10814,25 +11056,7 @@
           <w:szCs w:val="20"/>
           <w:rtl/>
         </w:rPr>
-        <w:t xml:space="preserve">להגדרות "זכות במקרקעין" ו"מכירה" ראו ס׳ 1 לחוק מיסוי מקרקעין; ולמיסוי מכירת בעלות שביושר ראו גורמן ואהרונוביץ׳, </w:t>
-      </w:r>
-      <w:r>
-        <w:rPr>
-          <w:rFonts w:ascii="David" w:cs="David" w:eastAsia="David" w:hAnsi="David"/>
-          <w:sz w:val="20"/>
-          <w:szCs w:val="20"/>
-          <w:rtl/>
-        </w:rPr>
-        <w:t xml:space="preserve">לעיל ה"ש 62</w:t>
-      </w:r>
-      <w:r>
-        <w:rPr>
-          <w:rFonts w:ascii="David" w:cs="David" w:eastAsia="David" w:hAnsi="David"/>
-          <w:sz w:val="20"/>
-          <w:szCs w:val="20"/>
-          <w:rtl/>
-        </w:rPr>
-        <w:t xml:space="preserve">, בעמ׳ 151.</w:t>
+        <w:t xml:space="preserve">ס׳ 73 לחוק מיסוי מקרקעין.</w:t>
       </w:r>
     </w:p>
   </w:footnote>
@@ -10855,6 +11079,70 @@
           <w:szCs w:val="20"/>
           <w:rtl/>
         </w:rPr>
+        <w:t xml:space="preserve">ס׳ 324(א) לפקודת העיריות [נוסח חדש]; ולעניין היטל השבחה – ס׳ 10 לתוספת השלישית לחוק התכנון והבנייה, התשכ"ה-1965.</w:t>
+      </w:r>
+    </w:p>
+  </w:footnote>
+  <w:footnote w:id="69">
+    <w:p>
+      <w:pPr>
+        <w:bidi/>
+        <w:spacing w:after="60"/>
+      </w:pPr>
+      <w:r>
+        <w:rPr>
+          <w:rStyle w:val="FootnoteReference"/>
+        </w:rPr>
+        <w:footnoteRef/>
+      </w:r>
+      <w:r>
+        <w:rPr>
+          <w:rFonts w:ascii="David" w:cs="David" w:eastAsia="David" w:hAnsi="David"/>
+          <w:sz w:val="20"/>
+          <w:szCs w:val="20"/>
+          <w:rtl/>
+        </w:rPr>
+        <w:t xml:space="preserve">להגדרות "זכות במקרקעין" ו"מכירה" ראו ס׳ 1 לחוק מיסוי מקרקעין; ולמיסוי מכירת בעלות שביושר ראו גורמן ואהרונוביץ׳, </w:t>
+      </w:r>
+      <w:r>
+        <w:rPr>
+          <w:rFonts w:ascii="David" w:cs="David" w:eastAsia="David" w:hAnsi="David"/>
+          <w:sz w:val="20"/>
+          <w:szCs w:val="20"/>
+          <w:rtl/>
+        </w:rPr>
+        <w:t xml:space="preserve">לעיל ה"ש 64</w:t>
+      </w:r>
+      <w:r>
+        <w:rPr>
+          <w:rFonts w:ascii="David" w:cs="David" w:eastAsia="David" w:hAnsi="David"/>
+          <w:sz w:val="20"/>
+          <w:szCs w:val="20"/>
+          <w:rtl/>
+        </w:rPr>
+        <w:t xml:space="preserve">, בעמ׳ 151.</w:t>
+      </w:r>
+    </w:p>
+  </w:footnote>
+  <w:footnote w:id="70">
+    <w:p>
+      <w:pPr>
+        <w:bidi/>
+        <w:spacing w:after="60"/>
+      </w:pPr>
+      <w:r>
+        <w:rPr>
+          <w:rStyle w:val="FootnoteReference"/>
+        </w:rPr>
+        <w:footnoteRef/>
+      </w:r>
+      <w:r>
+        <w:rPr>
+          <w:rFonts w:ascii="David" w:cs="David" w:eastAsia="David" w:hAnsi="David"/>
+          <w:sz w:val="20"/>
+          <w:szCs w:val="20"/>
+          <w:rtl/>
+        </w:rPr>
         <w:t xml:space="preserve">ו"ע (מחוזי חי׳) 4631-12-13 </w:t>
       </w:r>
       <w:r>
@@ -10884,7 +11172,7 @@
           <w:szCs w:val="20"/>
           <w:rtl/>
         </w:rPr>
-        <w:t xml:space="preserve">לעיל ה"ש 62</w:t>
+        <w:t xml:space="preserve">לעיל ה"ש 64</w:t>
       </w:r>
       <w:r>
         <w:rPr>
@@ -10894,88 +11182,6 @@
           <w:rtl/>
         </w:rPr>
         <w:t xml:space="preserve">, בעמ׳ 153–154.</w:t>
-      </w:r>
-    </w:p>
-  </w:footnote>
-  <w:footnote w:id="69">
-    <w:p>
-      <w:pPr>
-        <w:bidi/>
-        <w:spacing w:after="60"/>
-      </w:pPr>
-      <w:r>
-        <w:rPr>
-          <w:rStyle w:val="FootnoteReference"/>
-        </w:rPr>
-        <w:footnoteRef/>
-      </w:r>
-      <w:r>
-        <w:rPr>
-          <w:rFonts w:ascii="David" w:cs="David" w:eastAsia="David" w:hAnsi="David"/>
-          <w:sz w:val="20"/>
-          <w:szCs w:val="20"/>
-          <w:rtl/>
-        </w:rPr>
-        <w:t xml:space="preserve">לקנסות בגין אי-הגשת הצהרה ולהפרשי הצמדה וריבית ראו פרק אחד-עשר לחוק מיסוי מקרקעין; גורמן ואהרונוביץ׳, </w:t>
-      </w:r>
-      <w:r>
-        <w:rPr>
-          <w:rFonts w:ascii="David" w:cs="David" w:eastAsia="David" w:hAnsi="David"/>
-          <w:sz w:val="20"/>
-          <w:szCs w:val="20"/>
-          <w:rtl/>
-        </w:rPr>
-        <w:t xml:space="preserve">לעיל ה"ש 62</w:t>
-      </w:r>
-      <w:r>
-        <w:rPr>
-          <w:rFonts w:ascii="David" w:cs="David" w:eastAsia="David" w:hAnsi="David"/>
-          <w:sz w:val="20"/>
-          <w:szCs w:val="20"/>
-          <w:rtl/>
-        </w:rPr>
-        <w:t xml:space="preserve">.</w:t>
-      </w:r>
-    </w:p>
-  </w:footnote>
-  <w:footnote w:id="70">
-    <w:p>
-      <w:pPr>
-        <w:bidi/>
-        <w:spacing w:after="60"/>
-      </w:pPr>
-      <w:r>
-        <w:rPr>
-          <w:rStyle w:val="FootnoteReference"/>
-        </w:rPr>
-        <w:footnoteRef/>
-      </w:r>
-      <w:r>
-        <w:rPr>
-          <w:rFonts w:ascii="David" w:cs="David" w:eastAsia="David" w:hAnsi="David"/>
-          <w:sz w:val="20"/>
-          <w:szCs w:val="20"/>
-          <w:rtl/>
-        </w:rPr>
-        <w:t xml:space="preserve">גורמן ואהרונוביץ׳, </w:t>
-      </w:r>
-      <w:r>
-        <w:rPr>
-          <w:rFonts w:ascii="David" w:cs="David" w:eastAsia="David" w:hAnsi="David"/>
-          <w:sz w:val="20"/>
-          <w:szCs w:val="20"/>
-          <w:rtl/>
-        </w:rPr>
-        <w:t xml:space="preserve">לעיל ה"ש 62</w:t>
-      </w:r>
-      <w:r>
-        <w:rPr>
-          <w:rFonts w:ascii="David" w:cs="David" w:eastAsia="David" w:hAnsi="David"/>
-          <w:sz w:val="20"/>
-          <w:szCs w:val="20"/>
-          <w:rtl/>
-        </w:rPr>
-        <w:t xml:space="preserve">, בעמ׳ 282–284, והפסיקה הנסקרת שם.</w:t>
       </w:r>
     </w:p>
   </w:footnote>
@@ -10998,25 +11204,27 @@
           <w:szCs w:val="20"/>
           <w:rtl/>
         </w:rPr>
-        <w:t xml:space="preserve">להיגיון הגבייתי של הסעיף ראו גורמן ואהרונוביץ׳, </w:t>
-      </w:r>
-      <w:r>
-        <w:rPr>
-          <w:rFonts w:ascii="David" w:cs="David" w:eastAsia="David" w:hAnsi="David"/>
-          <w:sz w:val="20"/>
-          <w:szCs w:val="20"/>
-          <w:rtl/>
-        </w:rPr>
-        <w:t xml:space="preserve">לעיל ה"ש 63</w:t>
-      </w:r>
-      <w:r>
-        <w:rPr>
-          <w:rFonts w:ascii="David" w:cs="David" w:eastAsia="David" w:hAnsi="David"/>
-          <w:sz w:val="20"/>
-          <w:szCs w:val="20"/>
-          <w:rtl/>
-        </w:rPr>
-        <w:t xml:space="preserve">.</w:t>
+        <w:t xml:space="preserve">ס׳ 197 לחוק התכנון והבנייה, התשכ"ה-1965; אהרן נמדר </w:t>
+      </w:r>
+      <w:r>
+        <w:rPr>
+          <w:rFonts w:ascii="David" w:cs="David" w:eastAsia="David" w:hAnsi="David"/>
+          <w:i/>
+          <w:iCs/>
+          <w:sz w:val="20"/>
+          <w:szCs w:val="20"/>
+          <w:rtl/>
+        </w:rPr>
+        <w:t xml:space="preserve">פגיעה במקרקעין [פיצויים בגין נזקי תכנית]</w:t>
+      </w:r>
+      <w:r>
+        <w:rPr>
+          <w:rFonts w:ascii="David" w:cs="David" w:eastAsia="David" w:hAnsi="David"/>
+          <w:sz w:val="20"/>
+          <w:szCs w:val="20"/>
+          <w:rtl/>
+        </w:rPr>
+        <w:t xml:space="preserve"> 429–439 (תשס"ח) (הבעלים שביושר, שזכותו קדמה לחוק המקרקעין, זכאי לפיצוי אף שאינו רשום; והשוו שם לעניין ההרשאה המתחדשת כל שלוש שנים).</w:t>
       </w:r>
     </w:p>
   </w:footnote>
@@ -11039,24 +11247,25 @@
           <w:szCs w:val="20"/>
           <w:rtl/>
         </w:rPr>
-        <w:t xml:space="preserve">למונח "הון מת" ראו </w:t>
-      </w:r>
-      <w:r>
-        <w:rPr>
-          <w:rFonts w:ascii="Times New Roman" w:cs="Times New Roman" w:eastAsia="Times New Roman" w:hAnsi="Times New Roman"/>
-          <w:sz w:val="20"/>
-          <w:szCs w:val="20"/>
-        </w:rPr>
-        <w:t xml:space="preserve">Hernando de Soto, The Mystery of Capital: Why Capitalism Triumphs in the West and Fails Everywhere Else (2000)</w:t>
-      </w:r>
-      <w:r>
-        <w:rPr>
-          <w:rFonts w:ascii="David" w:cs="David" w:eastAsia="David" w:hAnsi="David"/>
-          <w:sz w:val="20"/>
-          <w:szCs w:val="20"/>
-          <w:rtl/>
-        </w:rPr>
-        <w:t xml:space="preserve">. דה-סוטו פיתח את הניתוח על יסוד עבודת שדה במצרים, שבה נאמד שיעור הנכסים המוחזקים בלא רישום ביותר מ-90%; ראו להלן פרק ו.2.</w:t>
+        <w:t xml:space="preserve">לקנסות בגין אי-הגשת הצהרה ולהפרשי הצמדה וריבית ראו פרק אחד-עשר לחוק מיסוי מקרקעין; גורמן ואהרונוביץ׳, </w:t>
+      </w:r>
+      <w:r>
+        <w:rPr>
+          <w:rFonts w:ascii="David" w:cs="David" w:eastAsia="David" w:hAnsi="David"/>
+          <w:sz w:val="20"/>
+          <w:szCs w:val="20"/>
+          <w:rtl/>
+        </w:rPr>
+        <w:t xml:space="preserve">לעיל ה"ש 64</w:t>
+      </w:r>
+      <w:r>
+        <w:rPr>
+          <w:rFonts w:ascii="David" w:cs="David" w:eastAsia="David" w:hAnsi="David"/>
+          <w:sz w:val="20"/>
+          <w:szCs w:val="20"/>
+          <w:rtl/>
+        </w:rPr>
+        <w:t xml:space="preserve">.</w:t>
       </w:r>
     </w:p>
   </w:footnote>
@@ -11079,6 +11288,128 @@
           <w:szCs w:val="20"/>
           <w:rtl/>
         </w:rPr>
+        <w:t xml:space="preserve">גורמן ואהרונוביץ׳, </w:t>
+      </w:r>
+      <w:r>
+        <w:rPr>
+          <w:rFonts w:ascii="David" w:cs="David" w:eastAsia="David" w:hAnsi="David"/>
+          <w:sz w:val="20"/>
+          <w:szCs w:val="20"/>
+          <w:rtl/>
+        </w:rPr>
+        <w:t xml:space="preserve">לעיל ה"ש 64</w:t>
+      </w:r>
+      <w:r>
+        <w:rPr>
+          <w:rFonts w:ascii="David" w:cs="David" w:eastAsia="David" w:hAnsi="David"/>
+          <w:sz w:val="20"/>
+          <w:szCs w:val="20"/>
+          <w:rtl/>
+        </w:rPr>
+        <w:t xml:space="preserve">, בעמ׳ 282–284, והפסיקה הנסקרת שם.</w:t>
+      </w:r>
+    </w:p>
+  </w:footnote>
+  <w:footnote w:id="74">
+    <w:p>
+      <w:pPr>
+        <w:bidi/>
+        <w:spacing w:after="60"/>
+      </w:pPr>
+      <w:r>
+        <w:rPr>
+          <w:rStyle w:val="FootnoteReference"/>
+        </w:rPr>
+        <w:footnoteRef/>
+      </w:r>
+      <w:r>
+        <w:rPr>
+          <w:rFonts w:ascii="David" w:cs="David" w:eastAsia="David" w:hAnsi="David"/>
+          <w:sz w:val="20"/>
+          <w:szCs w:val="20"/>
+          <w:rtl/>
+        </w:rPr>
+        <w:t xml:space="preserve">להיגיון הגבייתי של הסעיף ראו גורמן ואהרונוביץ׳, </w:t>
+      </w:r>
+      <w:r>
+        <w:rPr>
+          <w:rFonts w:ascii="David" w:cs="David" w:eastAsia="David" w:hAnsi="David"/>
+          <w:sz w:val="20"/>
+          <w:szCs w:val="20"/>
+          <w:rtl/>
+        </w:rPr>
+        <w:t xml:space="preserve">לעיל ה"ש 65</w:t>
+      </w:r>
+      <w:r>
+        <w:rPr>
+          <w:rFonts w:ascii="David" w:cs="David" w:eastAsia="David" w:hAnsi="David"/>
+          <w:sz w:val="20"/>
+          <w:szCs w:val="20"/>
+          <w:rtl/>
+        </w:rPr>
+        <w:t xml:space="preserve">.</w:t>
+      </w:r>
+    </w:p>
+  </w:footnote>
+  <w:footnote w:id="75">
+    <w:p>
+      <w:pPr>
+        <w:bidi/>
+        <w:spacing w:after="60"/>
+      </w:pPr>
+      <w:r>
+        <w:rPr>
+          <w:rStyle w:val="FootnoteReference"/>
+        </w:rPr>
+        <w:footnoteRef/>
+      </w:r>
+      <w:r>
+        <w:rPr>
+          <w:rFonts w:ascii="David" w:cs="David" w:eastAsia="David" w:hAnsi="David"/>
+          <w:sz w:val="20"/>
+          <w:szCs w:val="20"/>
+          <w:rtl/>
+        </w:rPr>
+        <w:t xml:space="preserve">למונח "הון מת" ראו </w:t>
+      </w:r>
+      <w:r>
+        <w:rPr>
+          <w:rFonts w:ascii="Times New Roman" w:cs="Times New Roman" w:eastAsia="Times New Roman" w:hAnsi="Times New Roman"/>
+          <w:sz w:val="20"/>
+          <w:szCs w:val="20"/>
+        </w:rPr>
+        <w:t xml:space="preserve">Hernando de Soto, The Mystery of Capital: Why Capitalism Triumphs in the West and Fails Everywhere Else (2000)</w:t>
+      </w:r>
+      <w:r>
+        <w:rPr>
+          <w:rFonts w:ascii="David" w:cs="David" w:eastAsia="David" w:hAnsi="David"/>
+          <w:sz w:val="20"/>
+          <w:szCs w:val="20"/>
+          <w:rtl/>
+        </w:rPr>
+        <w:t xml:space="preserve">. דה-סוטו פיתח את הניתוח על יסוד עבודת שדה במצרים, שבה נאמד שיעור הנכסים המוחזקים בלא רישום ביותר מ-90%; ראו להלן פרק ו.2.</w:t>
+      </w:r>
+    </w:p>
+  </w:footnote>
+  <w:footnote w:id="76">
+    <w:p>
+      <w:pPr>
+        <w:bidi/>
+        <w:spacing w:after="60"/>
+      </w:pPr>
+      <w:r>
+        <w:rPr>
+          <w:rStyle w:val="FootnoteReference"/>
+        </w:rPr>
+        <w:footnoteRef/>
+      </w:r>
+      <w:r>
+        <w:rPr>
+          <w:rFonts w:ascii="David" w:cs="David" w:eastAsia="David" w:hAnsi="David"/>
+          <w:sz w:val="20"/>
+          <w:szCs w:val="20"/>
+          <w:rtl/>
+        </w:rPr>
         <w:t xml:space="preserve">השוו עניין </w:t>
       </w:r>
       <w:r>
@@ -11108,7 +11439,7 @@
           <w:szCs w:val="20"/>
           <w:rtl/>
         </w:rPr>
-        <w:t xml:space="preserve">לעיל ה"ש 29</w:t>
+        <w:t xml:space="preserve">לעיל ה"ש 31</w:t>
       </w:r>
       <w:r>
         <w:rPr>
@@ -11121,7 +11452,7 @@
       </w:r>
     </w:p>
   </w:footnote>
-  <w:footnote w:id="74">
+  <w:footnote w:id="77">
     <w:p>
       <w:pPr>
         <w:bidi/>
@@ -11152,7 +11483,7 @@
       </w:r>
     </w:p>
   </w:footnote>
-  <w:footnote w:id="75">
+  <w:footnote w:id="78">
     <w:p>
       <w:pPr>
         <w:bidi/>
@@ -11183,7 +11514,7 @@
       </w:r>
     </w:p>
   </w:footnote>
-  <w:footnote w:id="76">
+  <w:footnote w:id="79">
     <w:p>
       <w:pPr>
         <w:bidi/>
@@ -11244,7 +11575,7 @@
       </w:r>
     </w:p>
   </w:footnote>
-  <w:footnote w:id="77">
+  <w:footnote w:id="80">
     <w:p>
       <w:pPr>
         <w:bidi/>
@@ -11263,125 +11594,6 @@
           <w:szCs w:val="20"/>
         </w:rPr>
         <w:t xml:space="preserve">Land Registration Act 2002, s 27</w:t>
-      </w:r>
-      <w:r>
-        <w:rPr>
-          <w:rFonts w:ascii="David" w:cs="David" w:eastAsia="David" w:hAnsi="David"/>
-          <w:sz w:val="20"/>
-          <w:szCs w:val="20"/>
-          <w:rtl/>
-        </w:rPr>
-        <w:t xml:space="preserve">.</w:t>
-      </w:r>
-    </w:p>
-  </w:footnote>
-  <w:footnote w:id="78">
-    <w:p>
-      <w:pPr>
-        <w:bidi/>
-        <w:spacing w:after="60"/>
-      </w:pPr>
-      <w:r>
-        <w:rPr>
-          <w:rStyle w:val="FootnoteReference"/>
-        </w:rPr>
-        <w:footnoteRef/>
-      </w:r>
-      <w:r>
-        <w:rPr>
-          <w:rFonts w:ascii="Times New Roman" w:cs="Times New Roman" w:eastAsia="Times New Roman" w:hAnsi="Times New Roman"/>
-          <w:sz w:val="20"/>
-          <w:szCs w:val="20"/>
-        </w:rPr>
-        <w:t xml:space="preserve">Williams &amp; Glyn’s Bank Ltd v Boland [1981] AC 487 (HL)</w:t>
-      </w:r>
-      <w:r>
-        <w:rPr>
-          <w:rFonts w:ascii="David" w:cs="David" w:eastAsia="David" w:hAnsi="David"/>
-          <w:sz w:val="20"/>
-          <w:szCs w:val="20"/>
-          <w:rtl/>
-        </w:rPr>
-        <w:t xml:space="preserve">; והמשכה של ההגנה כיום ב-</w:t>
-      </w:r>
-      <w:r>
-        <w:rPr>
-          <w:rFonts w:ascii="Times New Roman" w:cs="Times New Roman" w:eastAsia="Times New Roman" w:hAnsi="Times New Roman"/>
-          <w:sz w:val="20"/>
-          <w:szCs w:val="20"/>
-        </w:rPr>
-        <w:t xml:space="preserve">Land Registration Act 2002, sch 3, para 2</w:t>
-      </w:r>
-      <w:r>
-        <w:rPr>
-          <w:rFonts w:ascii="David" w:cs="David" w:eastAsia="David" w:hAnsi="David"/>
-          <w:sz w:val="20"/>
-          <w:szCs w:val="20"/>
-          <w:rtl/>
-        </w:rPr>
-        <w:t xml:space="preserve">.</w:t>
-      </w:r>
-    </w:p>
-  </w:footnote>
-  <w:footnote w:id="79">
-    <w:p>
-      <w:pPr>
-        <w:bidi/>
-        <w:spacing w:after="60"/>
-      </w:pPr>
-      <w:r>
-        <w:rPr>
-          <w:rStyle w:val="FootnoteReference"/>
-        </w:rPr>
-        <w:footnoteRef/>
-      </w:r>
-      <w:r>
-        <w:rPr>
-          <w:rFonts w:ascii="David" w:cs="David" w:eastAsia="David" w:hAnsi="David"/>
-          <w:sz w:val="20"/>
-          <w:szCs w:val="20"/>
-          <w:rtl/>
-        </w:rPr>
-        <w:t xml:space="preserve">לביקורת עדכנית על מוסד הזכויות הגוברות כסדק ב"עקרון המראה" של המרשם ראו </w:t>
-      </w:r>
-      <w:r>
-        <w:rPr>
-          <w:rFonts w:ascii="Times New Roman" w:cs="Times New Roman" w:eastAsia="Times New Roman" w:hAnsi="Times New Roman"/>
-          <w:sz w:val="20"/>
-          <w:szCs w:val="20"/>
-        </w:rPr>
-        <w:t xml:space="preserve">Chris Bevan, "Overriding Interests under the Land Registration Act 2002: Time to Repair the ‘Cracked Mirror’?" [2024] Conv. 123</w:t>
-      </w:r>
-      <w:r>
-        <w:rPr>
-          <w:rFonts w:ascii="David" w:cs="David" w:eastAsia="David" w:hAnsi="David"/>
-          <w:sz w:val="20"/>
-          <w:szCs w:val="20"/>
-          <w:rtl/>
-        </w:rPr>
-        <w:t xml:space="preserve">.</w:t>
-      </w:r>
-    </w:p>
-  </w:footnote>
-  <w:footnote w:id="80">
-    <w:p>
-      <w:pPr>
-        <w:bidi/>
-        <w:spacing w:after="60"/>
-      </w:pPr>
-      <w:r>
-        <w:rPr>
-          <w:rStyle w:val="FootnoteReference"/>
-        </w:rPr>
-        <w:footnoteRef/>
-      </w:r>
-      <w:r>
-        <w:rPr>
-          <w:rFonts w:ascii="Times New Roman" w:cs="Times New Roman" w:eastAsia="Times New Roman" w:hAnsi="Times New Roman"/>
-          <w:sz w:val="20"/>
-          <w:szCs w:val="20"/>
-        </w:rPr>
-        <w:t xml:space="preserve">Stack v Dowden [2007] UKHL 17, [2007] 2 AC 432; Jones v Kernott [2011] UKSC 53, [2012] 1 AC 776</w:t>
       </w:r>
       <w:r>
         <w:rPr>
@@ -11412,7 +11624,24 @@
           <w:sz w:val="20"/>
           <w:szCs w:val="20"/>
         </w:rPr>
-        <w:t xml:space="preserve">Thorner v Major [2009] UKHL 18, [2009] 1 WLR 776</w:t>
+        <w:t xml:space="preserve">Williams &amp; Glyn’s Bank Ltd v Boland [1981] AC 487 (HL)</w:t>
+      </w:r>
+      <w:r>
+        <w:rPr>
+          <w:rFonts w:ascii="David" w:cs="David" w:eastAsia="David" w:hAnsi="David"/>
+          <w:sz w:val="20"/>
+          <w:szCs w:val="20"/>
+          <w:rtl/>
+        </w:rPr>
+        <w:t xml:space="preserve">; והמשכה של ההגנה כיום ב-</w:t>
+      </w:r>
+      <w:r>
+        <w:rPr>
+          <w:rFonts w:ascii="Times New Roman" w:cs="Times New Roman" w:eastAsia="Times New Roman" w:hAnsi="Times New Roman"/>
+          <w:sz w:val="20"/>
+          <w:szCs w:val="20"/>
+        </w:rPr>
+        <w:t xml:space="preserve">Land Registration Act 2002, sch 3, para 2</w:t>
       </w:r>
       <w:r>
         <w:rPr>
@@ -11439,28 +11668,20 @@
       </w:r>
       <w:r>
         <w:rPr>
+          <w:rFonts w:ascii="David" w:cs="David" w:eastAsia="David" w:hAnsi="David"/>
+          <w:sz w:val="20"/>
+          <w:szCs w:val="20"/>
+          <w:rtl/>
+        </w:rPr>
+        <w:t xml:space="preserve">לביקורת עדכנית על מוסד הזכויות הגוברות כסדק ב"עקרון המראה" של המרשם ראו </w:t>
+      </w:r>
+      <w:r>
+        <w:rPr>
           <w:rFonts w:ascii="Times New Roman" w:cs="Times New Roman" w:eastAsia="Times New Roman" w:hAnsi="Times New Roman"/>
           <w:sz w:val="20"/>
           <w:szCs w:val="20"/>
         </w:rPr>
-        <w:t xml:space="preserve">Guest v Guest [2022] UKSC 27, [2022] 3 WLR 911</w:t>
-      </w:r>
-      <w:r>
-        <w:rPr>
-          <w:rFonts w:ascii="David" w:cs="David" w:eastAsia="David" w:hAnsi="David"/>
-          <w:sz w:val="20"/>
-          <w:szCs w:val="20"/>
-          <w:rtl/>
-        </w:rPr>
-        <w:t xml:space="preserve">. לניתוח עדכני ראו </w:t>
-      </w:r>
-      <w:r>
-        <w:rPr>
-          <w:rFonts w:ascii="Times New Roman" w:cs="Times New Roman" w:eastAsia="Times New Roman" w:hAnsi="Times New Roman"/>
-          <w:sz w:val="20"/>
-          <w:szCs w:val="20"/>
-        </w:rPr>
-        <w:t xml:space="preserve">Alex Waghorn, "Promises in Equity and at Law: Proprietary Estoppel after Guest v Guest" (2023) 86 MLR 1504; Brian Sloan, "Proprietary Estoppel in the Supreme Court: Banquo’s Ghost?" (2023) 82 CLJ 13</w:t>
+        <w:t xml:space="preserve">Chris Bevan, "Overriding Interests under the Land Registration Act 2002: Time to Repair the ‘Cracked Mirror’?" [2024] Conv. 123</w:t>
       </w:r>
       <w:r>
         <w:rPr>
@@ -11491,34 +11712,16 @@
           <w:sz w:val="20"/>
           <w:szCs w:val="20"/>
         </w:rPr>
-        <w:t xml:space="preserve">Law of Property (Miscellaneous Provisions) Act 1989, ss 1–2</w:t>
-      </w:r>
-      <w:r>
-        <w:rPr>
-          <w:rFonts w:ascii="David" w:cs="David" w:eastAsia="David" w:hAnsi="David"/>
-          <w:sz w:val="20"/>
-          <w:szCs w:val="20"/>
-          <w:rtl/>
-        </w:rPr>
-        <w:t xml:space="preserve">. וראו כבר את ראבילו, </w:t>
-      </w:r>
-      <w:r>
-        <w:rPr>
-          <w:rFonts w:ascii="David" w:cs="David" w:eastAsia="David" w:hAnsi="David"/>
-          <w:sz w:val="20"/>
-          <w:szCs w:val="20"/>
-          <w:rtl/>
-        </w:rPr>
-        <w:t xml:space="preserve">לעיל ה"ש 34</w:t>
-      </w:r>
-      <w:r>
-        <w:rPr>
-          <w:rFonts w:ascii="David" w:cs="David" w:eastAsia="David" w:hAnsi="David"/>
-          <w:sz w:val="20"/>
-          <w:szCs w:val="20"/>
-          <w:rtl/>
-        </w:rPr>
-        <w:t xml:space="preserve">, המצטט את הכלל האנגלי שלפיו הבטחת מתנה גרידא אינה מעבירה בעלות וטעונה מסירה.</w:t>
+        <w:t xml:space="preserve">Stack v Dowden [2007] UKHL 17, [2007] 2 AC 432; Jones v Kernott [2011] UKSC 53, [2012] 1 AC 776</w:t>
+      </w:r>
+      <w:r>
+        <w:rPr>
+          <w:rFonts w:ascii="David" w:cs="David" w:eastAsia="David" w:hAnsi="David"/>
+          <w:sz w:val="20"/>
+          <w:szCs w:val="20"/>
+          <w:rtl/>
+        </w:rPr>
+        <w:t xml:space="preserve">.</w:t>
       </w:r>
     </w:p>
   </w:footnote>
@@ -11536,6 +11739,134 @@
       </w:r>
       <w:r>
         <w:rPr>
+          <w:rFonts w:ascii="Times New Roman" w:cs="Times New Roman" w:eastAsia="Times New Roman" w:hAnsi="Times New Roman"/>
+          <w:sz w:val="20"/>
+          <w:szCs w:val="20"/>
+        </w:rPr>
+        <w:t xml:space="preserve">Thorner v Major [2009] UKHL 18, [2009] 1 WLR 776</w:t>
+      </w:r>
+      <w:r>
+        <w:rPr>
+          <w:rFonts w:ascii="David" w:cs="David" w:eastAsia="David" w:hAnsi="David"/>
+          <w:sz w:val="20"/>
+          <w:szCs w:val="20"/>
+          <w:rtl/>
+        </w:rPr>
+        <w:t xml:space="preserve">.</w:t>
+      </w:r>
+    </w:p>
+  </w:footnote>
+  <w:footnote w:id="85">
+    <w:p>
+      <w:pPr>
+        <w:bidi/>
+        <w:spacing w:after="60"/>
+      </w:pPr>
+      <w:r>
+        <w:rPr>
+          <w:rStyle w:val="FootnoteReference"/>
+        </w:rPr>
+        <w:footnoteRef/>
+      </w:r>
+      <w:r>
+        <w:rPr>
+          <w:rFonts w:ascii="Times New Roman" w:cs="Times New Roman" w:eastAsia="Times New Roman" w:hAnsi="Times New Roman"/>
+          <w:sz w:val="20"/>
+          <w:szCs w:val="20"/>
+        </w:rPr>
+        <w:t xml:space="preserve">Guest v Guest [2022] UKSC 27, [2022] 3 WLR 911</w:t>
+      </w:r>
+      <w:r>
+        <w:rPr>
+          <w:rFonts w:ascii="David" w:cs="David" w:eastAsia="David" w:hAnsi="David"/>
+          <w:sz w:val="20"/>
+          <w:szCs w:val="20"/>
+          <w:rtl/>
+        </w:rPr>
+        <w:t xml:space="preserve">. לניתוח עדכני ראו </w:t>
+      </w:r>
+      <w:r>
+        <w:rPr>
+          <w:rFonts w:ascii="Times New Roman" w:cs="Times New Roman" w:eastAsia="Times New Roman" w:hAnsi="Times New Roman"/>
+          <w:sz w:val="20"/>
+          <w:szCs w:val="20"/>
+        </w:rPr>
+        <w:t xml:space="preserve">Alex Waghorn, "Promises in Equity and at Law: Proprietary Estoppel after Guest v Guest" (2023) 86 MLR 1504; Brian Sloan, "Proprietary Estoppel in the Supreme Court: Banquo’s Ghost?" (2023) 82 CLJ 13</w:t>
+      </w:r>
+      <w:r>
+        <w:rPr>
+          <w:rFonts w:ascii="David" w:cs="David" w:eastAsia="David" w:hAnsi="David"/>
+          <w:sz w:val="20"/>
+          <w:szCs w:val="20"/>
+          <w:rtl/>
+        </w:rPr>
+        <w:t xml:space="preserve">.</w:t>
+      </w:r>
+    </w:p>
+  </w:footnote>
+  <w:footnote w:id="86">
+    <w:p>
+      <w:pPr>
+        <w:bidi/>
+        <w:spacing w:after="60"/>
+      </w:pPr>
+      <w:r>
+        <w:rPr>
+          <w:rStyle w:val="FootnoteReference"/>
+        </w:rPr>
+        <w:footnoteRef/>
+      </w:r>
+      <w:r>
+        <w:rPr>
+          <w:rFonts w:ascii="Times New Roman" w:cs="Times New Roman" w:eastAsia="Times New Roman" w:hAnsi="Times New Roman"/>
+          <w:sz w:val="20"/>
+          <w:szCs w:val="20"/>
+        </w:rPr>
+        <w:t xml:space="preserve">Law of Property (Miscellaneous Provisions) Act 1989, ss 1–2</w:t>
+      </w:r>
+      <w:r>
+        <w:rPr>
+          <w:rFonts w:ascii="David" w:cs="David" w:eastAsia="David" w:hAnsi="David"/>
+          <w:sz w:val="20"/>
+          <w:szCs w:val="20"/>
+          <w:rtl/>
+        </w:rPr>
+        <w:t xml:space="preserve">. וראו כבר את ראבילו, </w:t>
+      </w:r>
+      <w:r>
+        <w:rPr>
+          <w:rFonts w:ascii="David" w:cs="David" w:eastAsia="David" w:hAnsi="David"/>
+          <w:sz w:val="20"/>
+          <w:szCs w:val="20"/>
+          <w:rtl/>
+        </w:rPr>
+        <w:t xml:space="preserve">לעיל ה"ש 36</w:t>
+      </w:r>
+      <w:r>
+        <w:rPr>
+          <w:rFonts w:ascii="David" w:cs="David" w:eastAsia="David" w:hAnsi="David"/>
+          <w:sz w:val="20"/>
+          <w:szCs w:val="20"/>
+          <w:rtl/>
+        </w:rPr>
+        <w:t xml:space="preserve">, המצטט את הכלל האנגלי שלפיו הבטחת מתנה גרידא אינה מעבירה בעלות וטעונה מסירה.</w:t>
+      </w:r>
+    </w:p>
+  </w:footnote>
+  <w:footnote w:id="87">
+    <w:p>
+      <w:pPr>
+        <w:bidi/>
+        <w:spacing w:after="60"/>
+      </w:pPr>
+      <w:r>
+        <w:rPr>
+          <w:rStyle w:val="FootnoteReference"/>
+        </w:rPr>
+        <w:footnoteRef/>
+      </w:r>
+      <w:r>
+        <w:rPr>
           <w:rFonts w:ascii="David" w:cs="David" w:eastAsia="David" w:hAnsi="David"/>
           <w:sz w:val="20"/>
           <w:szCs w:val="20"/>
@@ -11570,7 +11901,7 @@
           <w:szCs w:val="20"/>
           <w:rtl/>
         </w:rPr>
-        <w:t xml:space="preserve">לעיל ה"ש 38</w:t>
+        <w:t xml:space="preserve">לעיל ה"ש 40</w:t>
       </w:r>
       <w:r>
         <w:rPr>
@@ -11580,99 +11911,6 @@
           <w:rtl/>
         </w:rPr>
         <w:t xml:space="preserve">.</w:t>
-      </w:r>
-    </w:p>
-  </w:footnote>
-  <w:footnote w:id="85">
-    <w:p>
-      <w:pPr>
-        <w:bidi/>
-        <w:spacing w:after="60"/>
-      </w:pPr>
-      <w:r>
-        <w:rPr>
-          <w:rStyle w:val="FootnoteReference"/>
-        </w:rPr>
-        <w:footnoteRef/>
-      </w:r>
-      <w:r>
-        <w:rPr>
-          <w:rFonts w:ascii="Times New Roman" w:cs="Times New Roman" w:eastAsia="Times New Roman" w:hAnsi="Times New Roman"/>
-          <w:sz w:val="20"/>
-          <w:szCs w:val="20"/>
-        </w:rPr>
-        <w:t xml:space="preserve">Re Rose [1952] Ch 499 (CA)</w:t>
-      </w:r>
-      <w:r>
-        <w:rPr>
-          <w:rFonts w:ascii="David" w:cs="David" w:eastAsia="David" w:hAnsi="David"/>
-          <w:sz w:val="20"/>
-          <w:szCs w:val="20"/>
-          <w:rtl/>
-        </w:rPr>
-        <w:t xml:space="preserve">.</w:t>
-      </w:r>
-    </w:p>
-  </w:footnote>
-  <w:footnote w:id="86">
-    <w:p>
-      <w:pPr>
-        <w:bidi/>
-        <w:spacing w:after="60"/>
-      </w:pPr>
-      <w:r>
-        <w:rPr>
-          <w:rStyle w:val="FootnoteReference"/>
-        </w:rPr>
-        <w:footnoteRef/>
-      </w:r>
-      <w:r>
-        <w:rPr>
-          <w:rFonts w:ascii="Times New Roman" w:cs="Times New Roman" w:eastAsia="Times New Roman" w:hAnsi="Times New Roman"/>
-          <w:sz w:val="20"/>
-          <w:szCs w:val="20"/>
-        </w:rPr>
-        <w:t xml:space="preserve">Pennington v Waine [2002] EWCA Civ 227, [2002] 1 WLR 2075</w:t>
-      </w:r>
-      <w:r>
-        <w:rPr>
-          <w:rFonts w:ascii="David" w:cs="David" w:eastAsia="David" w:hAnsi="David"/>
-          <w:sz w:val="20"/>
-          <w:szCs w:val="20"/>
-          <w:rtl/>
-        </w:rPr>
-        <w:t xml:space="preserve">.</w:t>
-      </w:r>
-    </w:p>
-  </w:footnote>
-  <w:footnote w:id="87">
-    <w:p>
-      <w:pPr>
-        <w:bidi/>
-        <w:spacing w:after="60"/>
-      </w:pPr>
-      <w:r>
-        <w:rPr>
-          <w:rStyle w:val="FootnoteReference"/>
-        </w:rPr>
-        <w:footnoteRef/>
-      </w:r>
-      <w:r>
-        <w:rPr>
-          <w:rFonts w:ascii="Times New Roman" w:cs="Times New Roman" w:eastAsia="Times New Roman" w:hAnsi="Times New Roman"/>
-          <w:sz w:val="20"/>
-          <w:szCs w:val="20"/>
-        </w:rPr>
-        <w:t xml:space="preserve">Powers of Attorney Act 1971, s 4</w:t>
-      </w:r>
-      <w:r>
-        <w:rPr>
-          <w:rFonts w:ascii="David" w:cs="David" w:eastAsia="David" w:hAnsi="David"/>
-          <w:sz w:val="20"/>
-          <w:szCs w:val="20"/>
-          <w:rtl/>
-        </w:rPr>
-        <w:t xml:space="preserve">. זהו המקור ההיסטורי של ס׳ 14(ב) לחוק השליחות הישראלי.</w:t>
       </w:r>
     </w:p>
   </w:footnote>
@@ -11690,20 +11928,11 @@
       </w:r>
       <w:r>
         <w:rPr>
-          <w:rFonts w:ascii="David" w:cs="David" w:eastAsia="David" w:hAnsi="David"/>
-          <w:sz w:val="20"/>
-          <w:szCs w:val="20"/>
-          <w:rtl/>
-        </w:rPr>
-        <w:t xml:space="preserve">לניתוח השוואתי של גורל ההתיישנות הרוכשת בשיטות הרישום המודרניות ראו </w:t>
-      </w:r>
-      <w:r>
-        <w:rPr>
           <w:rFonts w:ascii="Times New Roman" w:cs="Times New Roman" w:eastAsia="Times New Roman" w:hAnsi="Times New Roman"/>
           <w:sz w:val="20"/>
           <w:szCs w:val="20"/>
         </w:rPr>
-        <w:t xml:space="preserve">Nadav Shoked, "Who Needs Adverse Possession?," 89 Fordham L. Rev. 2639 (2021)</w:t>
+        <w:t xml:space="preserve">Re Rose [1952] Ch 499 (CA)</w:t>
       </w:r>
       <w:r>
         <w:rPr>
@@ -11730,12 +11959,20 @@
       </w:r>
       <w:r>
         <w:rPr>
-          <w:rFonts w:ascii="David" w:cs="David" w:eastAsia="David" w:hAnsi="David"/>
-          <w:sz w:val="20"/>
-          <w:szCs w:val="20"/>
-          <w:rtl/>
-        </w:rPr>
-        <w:t xml:space="preserve">ס׳ 418 לקוד האזרחי המצרי (חוק מס׳ 131 לשנת 1948).</w:t>
+          <w:rFonts w:ascii="Times New Roman" w:cs="Times New Roman" w:eastAsia="Times New Roman" w:hAnsi="Times New Roman"/>
+          <w:sz w:val="20"/>
+          <w:szCs w:val="20"/>
+        </w:rPr>
+        <w:t xml:space="preserve">Pennington v Waine [2002] EWCA Civ 227, [2002] 1 WLR 2075</w:t>
+      </w:r>
+      <w:r>
+        <w:rPr>
+          <w:rFonts w:ascii="David" w:cs="David" w:eastAsia="David" w:hAnsi="David"/>
+          <w:sz w:val="20"/>
+          <w:szCs w:val="20"/>
+          <w:rtl/>
+        </w:rPr>
+        <w:t xml:space="preserve">.</w:t>
       </w:r>
     </w:p>
   </w:footnote>
@@ -11753,12 +11990,20 @@
       </w:r>
       <w:r>
         <w:rPr>
-          <w:rFonts w:ascii="David" w:cs="David" w:eastAsia="David" w:hAnsi="David"/>
-          <w:sz w:val="20"/>
-          <w:szCs w:val="20"/>
-          <w:rtl/>
-        </w:rPr>
-        <w:t xml:space="preserve">ס׳ 934 לקוד האזרחי המצרי; ס׳ 9 לחוק ארגון הפומביות המקרקעית, חוק מס׳ 114 לשנת 1946. במצרים פועלות במקביל שתי שיטות רישום: רישום שטרות פרסונלי לפי חוק 114/1946, החולש על מרבית המדינה, ורישום זכויות קדסטרלי לפי חוק מס׳ 142 לשנת 1964, שתחולתו מוגבלת.</w:t>
+          <w:rFonts w:ascii="Times New Roman" w:cs="Times New Roman" w:eastAsia="Times New Roman" w:hAnsi="Times New Roman"/>
+          <w:sz w:val="20"/>
+          <w:szCs w:val="20"/>
+        </w:rPr>
+        <w:t xml:space="preserve">Powers of Attorney Act 1971, s 4</w:t>
+      </w:r>
+      <w:r>
+        <w:rPr>
+          <w:rFonts w:ascii="David" w:cs="David" w:eastAsia="David" w:hAnsi="David"/>
+          <w:sz w:val="20"/>
+          <w:szCs w:val="20"/>
+          <w:rtl/>
+        </w:rPr>
+        <w:t xml:space="preserve">. זהו המקור ההיסטורי של ס׳ 14(ב) לחוק השליחות הישראלי.</w:t>
       </w:r>
     </w:p>
   </w:footnote>
@@ -11776,38 +12021,30 @@
       </w:r>
       <w:r>
         <w:rPr>
-          <w:rFonts w:ascii="Times New Roman" w:cs="Times New Roman" w:eastAsia="Times New Roman" w:hAnsi="Times New Roman"/>
-          <w:sz w:val="20"/>
-          <w:szCs w:val="20"/>
-        </w:rPr>
-        <w:t xml:space="preserve">“More than 90% of Egypt’s Properties Are Unregistered: Justice Minister,” Daily News Egypt (Feb. 14, 2022); “Egypt’s Property Registration Rate Remains Below 10%…: World Bank,” Daily News Egypt (July 5, 2026)</w:t>
-      </w:r>
-      <w:r>
-        <w:rPr>
-          <w:rFonts w:ascii="David" w:cs="David" w:eastAsia="David" w:hAnsi="David"/>
-          <w:sz w:val="20"/>
-          <w:szCs w:val="20"/>
-          <w:rtl/>
-        </w:rPr>
-        <w:t xml:space="preserve">. הרנדו דה-סוטו ביסס על מצרים את מחקר "ההון המת" שלו: </w:t>
-      </w:r>
-      <w:r>
-        <w:rPr>
-          <w:rFonts w:ascii="David" w:cs="David" w:eastAsia="David" w:hAnsi="David"/>
-          <w:sz w:val="20"/>
-          <w:szCs w:val="20"/>
-          <w:rtl/>
-        </w:rPr>
-        <w:t xml:space="preserve">לעיל ה"ש 72</w:t>
-      </w:r>
-      <w:r>
-        <w:rPr>
-          <w:rFonts w:ascii="David" w:cs="David" w:eastAsia="David" w:hAnsi="David"/>
-          <w:sz w:val="20"/>
-          <w:szCs w:val="20"/>
-          <w:rtl/>
-        </w:rPr>
-        <w:t xml:space="preserve">.</w:t>
+          <w:rFonts w:ascii="David" w:cs="David" w:eastAsia="David" w:hAnsi="David"/>
+          <w:sz w:val="20"/>
+          <w:szCs w:val="20"/>
+          <w:rtl/>
+        </w:rPr>
+        <w:t xml:space="preserve">ברק, </w:t>
+      </w:r>
+      <w:r>
+        <w:rPr>
+          <w:rFonts w:ascii="David" w:cs="David" w:eastAsia="David" w:hAnsi="David"/>
+          <w:sz w:val="20"/>
+          <w:szCs w:val="20"/>
+          <w:rtl/>
+        </w:rPr>
+        <w:t xml:space="preserve">לעיל ה"ש 28</w:t>
+      </w:r>
+      <w:r>
+        <w:rPr>
+          <w:rFonts w:ascii="David" w:cs="David" w:eastAsia="David" w:hAnsi="David"/>
+          <w:sz w:val="20"/>
+          <w:szCs w:val="20"/>
+          <w:rtl/>
+        </w:rPr>
+        <w:t xml:space="preserve">, בעמ׳ 1243.</w:t>
       </w:r>
     </w:p>
   </w:footnote>
@@ -11830,7 +12067,24 @@
           <w:szCs w:val="20"/>
           <w:rtl/>
         </w:rPr>
-        <w:t xml:space="preserve">ס׳ 715 לקוד האזרחי המצרי. בית המשפט החוקתי העליון של מצרים שב ואישר בשנת 2021 כי ייפוי כוח כזה אינו ניתן לביטול חד-צדדי. ואולם ס׳ 714 מורה כי השליחות פוקעת במות השולח – נקודת תורפה מרכזית של הפרקטיקה, שפסיקת בית המשפט לקסאציה בעניינה אינה אחידה.</w:t>
+        <w:t xml:space="preserve">לניתוח השוואתי של גורל ההתיישנות הרוכשת בשיטות הרישום המודרניות ראו </w:t>
+      </w:r>
+      <w:r>
+        <w:rPr>
+          <w:rFonts w:ascii="Times New Roman" w:cs="Times New Roman" w:eastAsia="Times New Roman" w:hAnsi="Times New Roman"/>
+          <w:sz w:val="20"/>
+          <w:szCs w:val="20"/>
+        </w:rPr>
+        <w:t xml:space="preserve">Nadav Shoked, "Who Needs Adverse Possession?," 89 Fordham L. Rev. 2639 (2021)</w:t>
+      </w:r>
+      <w:r>
+        <w:rPr>
+          <w:rFonts w:ascii="David" w:cs="David" w:eastAsia="David" w:hAnsi="David"/>
+          <w:sz w:val="20"/>
+          <w:szCs w:val="20"/>
+          <w:rtl/>
+        </w:rPr>
+        <w:t xml:space="preserve">.</w:t>
       </w:r>
     </w:p>
   </w:footnote>
@@ -11853,24 +12107,7 @@
           <w:szCs w:val="20"/>
           <w:rtl/>
         </w:rPr>
-        <w:t xml:space="preserve">לפסיקת בית המשפט לקסאציה המצרי על תביעות אלה ראו הסקירות שבמאגרי לשכת עורכי הדין המצרית; ולתיאור אנליטי באנגלית ראו </w:t>
-      </w:r>
-      <w:r>
-        <w:rPr>
-          <w:rFonts w:ascii="Times New Roman" w:cs="Times New Roman" w:eastAsia="Times New Roman" w:hAnsi="Times New Roman"/>
-          <w:sz w:val="20"/>
-          <w:szCs w:val="20"/>
-        </w:rPr>
-        <w:t xml:space="preserve">David Sims, "Securing Land Tenure in Egypt: Who Needs Registered Titles?" Metropolitics (June 14, 2016)</w:t>
-      </w:r>
-      <w:r>
-        <w:rPr>
-          <w:rFonts w:ascii="David" w:cs="David" w:eastAsia="David" w:hAnsi="David"/>
-          <w:sz w:val="20"/>
-          <w:szCs w:val="20"/>
-          <w:rtl/>
-        </w:rPr>
-        <w:t xml:space="preserve">.</w:t>
+        <w:t xml:space="preserve">ס׳ 418 לקוד האזרחי המצרי (חוק מס׳ 131 לשנת 1948).</w:t>
       </w:r>
     </w:p>
   </w:footnote>
@@ -11893,7 +12130,7 @@
           <w:szCs w:val="20"/>
           <w:rtl/>
         </w:rPr>
-        <w:t xml:space="preserve">ס׳ 968 לקוד האזרחי המצרי. הפרקטיקה המצרית דנה בכך תחת הכותרת "וַצְ׳ע אל-יַד" (הנחת היד) – ההחזקה בפועל כמקור קניין.</w:t>
+        <w:t xml:space="preserve">ס׳ 934 לקוד האזרחי המצרי; ס׳ 9 לחוק ארגון הפומביות המקרקעית, חוק מס׳ 114 לשנת 1946. במצרים פועלות במקביל שתי שיטות רישום: רישום שטרות פרסונלי לפי חוק 114/1946, החולש על מרבית המדינה, ורישום זכויות קדסטרלי לפי חוק מס׳ 142 לשנת 1964, שתחולתו מוגבלת.</w:t>
       </w:r>
     </w:p>
   </w:footnote>
@@ -11911,12 +12148,38 @@
       </w:r>
       <w:r>
         <w:rPr>
-          <w:rFonts w:ascii="David" w:cs="David" w:eastAsia="David" w:hAnsi="David"/>
-          <w:sz w:val="20"/>
-          <w:szCs w:val="20"/>
-          <w:rtl/>
-        </w:rPr>
-        <w:t xml:space="preserve">ס׳ 969 לקוד האזרחי המצרי.</w:t>
+          <w:rFonts w:ascii="Times New Roman" w:cs="Times New Roman" w:eastAsia="Times New Roman" w:hAnsi="Times New Roman"/>
+          <w:sz w:val="20"/>
+          <w:szCs w:val="20"/>
+        </w:rPr>
+        <w:t xml:space="preserve">“More than 90% of Egypt’s Properties Are Unregistered: Justice Minister,” Daily News Egypt (Feb. 14, 2022); “Egypt’s Property Registration Rate Remains Below 10%…: World Bank,” Daily News Egypt (July 5, 2026)</w:t>
+      </w:r>
+      <w:r>
+        <w:rPr>
+          <w:rFonts w:ascii="David" w:cs="David" w:eastAsia="David" w:hAnsi="David"/>
+          <w:sz w:val="20"/>
+          <w:szCs w:val="20"/>
+          <w:rtl/>
+        </w:rPr>
+        <w:t xml:space="preserve">. הרנדו דה-סוטו ביסס על מצרים את מחקר "ההון המת" שלו: </w:t>
+      </w:r>
+      <w:r>
+        <w:rPr>
+          <w:rFonts w:ascii="David" w:cs="David" w:eastAsia="David" w:hAnsi="David"/>
+          <w:sz w:val="20"/>
+          <w:szCs w:val="20"/>
+          <w:rtl/>
+        </w:rPr>
+        <w:t xml:space="preserve">לעיל ה"ש 75</w:t>
+      </w:r>
+      <w:r>
+        <w:rPr>
+          <w:rFonts w:ascii="David" w:cs="David" w:eastAsia="David" w:hAnsi="David"/>
+          <w:sz w:val="20"/>
+          <w:szCs w:val="20"/>
+          <w:rtl/>
+        </w:rPr>
+        <w:t xml:space="preserve">.</w:t>
       </w:r>
     </w:p>
   </w:footnote>
@@ -11939,7 +12202,7 @@
           <w:szCs w:val="20"/>
           <w:rtl/>
         </w:rPr>
-        <w:t xml:space="preserve">ס׳ 970 לקוד האזרחי המצרי, כפי שתוקן בחוק מס׳ 55 לשנת 1970; ולנכסי הציבור ראו גם ס׳ 87(2) לקוד.</w:t>
+        <w:t xml:space="preserve">ס׳ 715 לקוד האזרחי המצרי. בית המשפט החוקתי העליון של מצרים שב ואישר בשנת 2021 כי ייפוי כוח כזה אינו ניתן לביטול חד-צדדי. ואולם ס׳ 714 מורה כי השליחות פוקעת במות השולח – נקודת תורפה מרכזית של הפרקטיקה, שפסיקת בית המשפט לקסאציה בעניינה אינה אחידה.</w:t>
       </w:r>
     </w:p>
   </w:footnote>
@@ -11962,7 +12225,7 @@
           <w:szCs w:val="20"/>
           <w:rtl/>
         </w:rPr>
-        <w:t xml:space="preserve">להשוואה בין גישות שיטות הרישום להתיישנות רוכשת ראו </w:t>
+        <w:t xml:space="preserve">לפסיקת בית המשפט לקסאציה המצרי על תביעות אלה ראו הסקירות שבמאגרי לשכת עורכי הדין המצרית; ולתיאור אנליטי באנגלית ראו </w:t>
       </w:r>
       <w:r>
         <w:rPr>
@@ -11970,34 +12233,16 @@
           <w:sz w:val="20"/>
           <w:szCs w:val="20"/>
         </w:rPr>
-        <w:t xml:space="preserve">Shoked</w:t>
-      </w:r>
-      <w:r>
-        <w:rPr>
-          <w:rFonts w:ascii="David" w:cs="David" w:eastAsia="David" w:hAnsi="David"/>
-          <w:sz w:val="20"/>
-          <w:szCs w:val="20"/>
-          <w:rtl/>
-        </w:rPr>
-        <w:t xml:space="preserve">, </w:t>
-      </w:r>
-      <w:r>
-        <w:rPr>
-          <w:rFonts w:ascii="David" w:cs="David" w:eastAsia="David" w:hAnsi="David"/>
-          <w:sz w:val="20"/>
-          <w:szCs w:val="20"/>
-          <w:rtl/>
-        </w:rPr>
-        <w:t xml:space="preserve">לעיל ה"ש 88</w:t>
-      </w:r>
-      <w:r>
-        <w:rPr>
-          <w:rFonts w:ascii="David" w:cs="David" w:eastAsia="David" w:hAnsi="David"/>
-          <w:sz w:val="20"/>
-          <w:szCs w:val="20"/>
-          <w:rtl/>
-        </w:rPr>
-        <w:t xml:space="preserve">. ודוק: בישראל נחסם מסלול זה כמעט כליל – ס׳ 159(ב) לחוק המקרקעין שלל התיישנות במקרקעין מוסדרים, וחזקתו של בן משפחה מסווגת כ"חזקה מרשות"; ראו לעיל פרק ג.6.</w:t>
+        <w:t xml:space="preserve">David Sims, "Securing Land Tenure in Egypt: Who Needs Registered Titles?" Metropolitics (June 14, 2016)</w:t>
+      </w:r>
+      <w:r>
+        <w:rPr>
+          <w:rFonts w:ascii="David" w:cs="David" w:eastAsia="David" w:hAnsi="David"/>
+          <w:sz w:val="20"/>
+          <w:szCs w:val="20"/>
+          <w:rtl/>
+        </w:rPr>
+        <w:t xml:space="preserve">.</w:t>
       </w:r>
     </w:p>
   </w:footnote>
@@ -12015,37 +12260,12 @@
       </w:r>
       <w:r>
         <w:rPr>
-          <w:rFonts w:ascii="Times New Roman" w:cs="Times New Roman" w:eastAsia="Times New Roman" w:hAnsi="Times New Roman"/>
-          <w:sz w:val="20"/>
-          <w:szCs w:val="20"/>
-        </w:rPr>
-        <w:t xml:space="preserve">“Sisi Orders Delaying Implementation of Controversial Real Estate Law for 2 Years,” Ahram Online (Feb. 28, 2021); “‘Unjust’: Egypt’s Property Registration Plans Face Popular Backlash,” Middle East Eye (2021)</w:t>
-      </w:r>
-      <w:r>
-        <w:rPr>
-          <w:rFonts w:ascii="David" w:cs="David" w:eastAsia="David" w:hAnsi="David"/>
-          <w:sz w:val="20"/>
-          <w:szCs w:val="20"/>
-          <w:rtl/>
-        </w:rPr>
-        <w:t xml:space="preserve">. לניתוח מדיניות ראו </w:t>
-      </w:r>
-      <w:r>
-        <w:rPr>
-          <w:rFonts w:ascii="Times New Roman" w:cs="Times New Roman" w:eastAsia="Times New Roman" w:hAnsi="Times New Roman"/>
-          <w:sz w:val="20"/>
-          <w:szCs w:val="20"/>
-        </w:rPr>
-        <w:t xml:space="preserve">“Real Estate Registration Law Amendments – Development Brief,” The Built Environment Observatory (May 2021)</w:t>
-      </w:r>
-      <w:r>
-        <w:rPr>
-          <w:rFonts w:ascii="David" w:cs="David" w:eastAsia="David" w:hAnsi="David"/>
-          <w:sz w:val="20"/>
-          <w:szCs w:val="20"/>
-          <w:rtl/>
-        </w:rPr>
-        <w:t xml:space="preserve">.</w:t>
+          <w:rFonts w:ascii="David" w:cs="David" w:eastAsia="David" w:hAnsi="David"/>
+          <w:sz w:val="20"/>
+          <w:szCs w:val="20"/>
+          <w:rtl/>
+        </w:rPr>
+        <w:t xml:space="preserve">ס׳ 968 לקוד האזרחי המצרי. הפרקטיקה המצרית דנה בכך תחת הכותרת "וַצְ׳ע אל-יַד" (הנחת היד) – ההחזקה בפועל כמקור קניין.</w:t>
       </w:r>
     </w:p>
   </w:footnote>
@@ -12068,24 +12288,7 @@
           <w:szCs w:val="20"/>
           <w:rtl/>
         </w:rPr>
-        <w:t xml:space="preserve">חוק מס׳ 9 לשנת 2022 (מצרים), המתקן את חוק מס׳ 114 לשנת 1946; ראו </w:t>
-      </w:r>
-      <w:r>
-        <w:rPr>
-          <w:rFonts w:ascii="Times New Roman" w:cs="Times New Roman" w:eastAsia="Times New Roman" w:hAnsi="Times New Roman"/>
-          <w:sz w:val="20"/>
-          <w:szCs w:val="20"/>
-        </w:rPr>
-        <w:t xml:space="preserve">Shalakany Law Office, “New Amendments to Real Estate Registration Law” (2022)</w:t>
-      </w:r>
-      <w:r>
-        <w:rPr>
-          <w:rFonts w:ascii="David" w:cs="David" w:eastAsia="David" w:hAnsi="David"/>
-          <w:sz w:val="20"/>
-          <w:szCs w:val="20"/>
-          <w:rtl/>
-        </w:rPr>
-        <w:t xml:space="preserve">.</w:t>
+        <w:t xml:space="preserve">ס׳ 969 לקוד האזרחי המצרי.</w:t>
       </w:r>
     </w:p>
   </w:footnote>
@@ -12108,7 +12311,7 @@
           <w:szCs w:val="20"/>
           <w:rtl/>
         </w:rPr>
-        <w:t xml:space="preserve">ס׳ 2 לחוקת מצרים (2014); ס׳ 1 לקוד האזרחי המצרי (ובו מדרג: חקיקה, מנהג, עקרונות השריעה, עקרונות הצדק); חוק הירושה המצרי, חוק מס׳ 77 לשנת 1943; ולצוואות – חוק מס׳ 71 לשנת 1946.</w:t>
+        <w:t xml:space="preserve">ס׳ 970 לקוד האזרחי המצרי, כפי שתוקן בחוק מס׳ 55 לשנת 1970; ולנכסי הציבור ראו גם ס׳ 87(2) לקוד.</w:t>
       </w:r>
     </w:p>
   </w:footnote>
@@ -12131,7 +12334,7 @@
           <w:szCs w:val="20"/>
           <w:rtl/>
         </w:rPr>
-        <w:t xml:space="preserve">לתרגום האנגלי המקובל ראו </w:t>
+        <w:t xml:space="preserve">להשוואה בין גישות שיטות הרישום להתיישנות רוכשת ראו </w:t>
       </w:r>
       <w:r>
         <w:rPr>
@@ -12139,16 +12342,34 @@
           <w:sz w:val="20"/>
           <w:szCs w:val="20"/>
         </w:rPr>
-        <w:t xml:space="preserve">C.R. Tyser, D.G. Demetriades &amp; Ismail Haqqi Effendi (trans.), The Mejelle: Being an English Translation of Majallah el-Ahkam-i-Adliya (1901)</w:t>
-      </w:r>
-      <w:r>
-        <w:rPr>
-          <w:rFonts w:ascii="David" w:cs="David" w:eastAsia="David" w:hAnsi="David"/>
-          <w:sz w:val="20"/>
-          <w:szCs w:val="20"/>
-          <w:rtl/>
-        </w:rPr>
-        <w:t xml:space="preserve">; חוק לביטול המג׳לה, התשמ"ד-1984.</w:t>
+        <w:t xml:space="preserve">Shoked</w:t>
+      </w:r>
+      <w:r>
+        <w:rPr>
+          <w:rFonts w:ascii="David" w:cs="David" w:eastAsia="David" w:hAnsi="David"/>
+          <w:sz w:val="20"/>
+          <w:szCs w:val="20"/>
+          <w:rtl/>
+        </w:rPr>
+        <w:t xml:space="preserve">, </w:t>
+      </w:r>
+      <w:r>
+        <w:rPr>
+          <w:rFonts w:ascii="David" w:cs="David" w:eastAsia="David" w:hAnsi="David"/>
+          <w:sz w:val="20"/>
+          <w:szCs w:val="20"/>
+          <w:rtl/>
+        </w:rPr>
+        <w:t xml:space="preserve">לעיל ה"ש 92</w:t>
+      </w:r>
+      <w:r>
+        <w:rPr>
+          <w:rFonts w:ascii="David" w:cs="David" w:eastAsia="David" w:hAnsi="David"/>
+          <w:sz w:val="20"/>
+          <w:szCs w:val="20"/>
+          <w:rtl/>
+        </w:rPr>
+        <w:t xml:space="preserve">. ודוק: בישראל נחסם מסלול זה כמעט כליל – ס׳ 159(ב) לחוק המקרקעין שלל התיישנות במקרקעין מוסדרים, וחזקתו של בן משפחה מסווגת כ"חזקה מרשות"; ראו לעיל פרק ג.6.</w:t>
       </w:r>
     </w:p>
   </w:footnote>
@@ -12166,20 +12387,28 @@
       </w:r>
       <w:r>
         <w:rPr>
-          <w:rFonts w:ascii="David" w:cs="David" w:eastAsia="David" w:hAnsi="David"/>
-          <w:sz w:val="20"/>
-          <w:szCs w:val="20"/>
-          <w:rtl/>
-        </w:rPr>
-        <w:t xml:space="preserve">ס׳ 837, 861–862 למג׳לה. לדוקטרינת ההִבָּה הקלאסית ראו </w:t>
-      </w:r>
-      <w:r>
-        <w:rPr>
           <w:rFonts w:ascii="Times New Roman" w:cs="Times New Roman" w:eastAsia="Times New Roman" w:hAnsi="Times New Roman"/>
           <w:sz w:val="20"/>
           <w:szCs w:val="20"/>
         </w:rPr>
-        <w:t xml:space="preserve">Joseph Schacht, An Introduction to Islamic Law (1964); Y. Linant de Bellefonds, “Hiba,” in The Encyclopaedia of Islam (2d ed.)</w:t>
+        <w:t xml:space="preserve">“Sisi Orders Delaying Implementation of Controversial Real Estate Law for 2 Years,” Ahram Online (Feb. 28, 2021); “‘Unjust’: Egypt’s Property Registration Plans Face Popular Backlash,” Middle East Eye (2021)</w:t>
+      </w:r>
+      <w:r>
+        <w:rPr>
+          <w:rFonts w:ascii="David" w:cs="David" w:eastAsia="David" w:hAnsi="David"/>
+          <w:sz w:val="20"/>
+          <w:szCs w:val="20"/>
+          <w:rtl/>
+        </w:rPr>
+        <w:t xml:space="preserve">. לניתוח מדיניות ראו </w:t>
+      </w:r>
+      <w:r>
+        <w:rPr>
+          <w:rFonts w:ascii="Times New Roman" w:cs="Times New Roman" w:eastAsia="Times New Roman" w:hAnsi="Times New Roman"/>
+          <w:sz w:val="20"/>
+          <w:szCs w:val="20"/>
+        </w:rPr>
+        <w:t xml:space="preserve">“Real Estate Registration Law Amendments – Development Brief,” The Built Environment Observatory (May 2021)</w:t>
       </w:r>
       <w:r>
         <w:rPr>
@@ -12211,7 +12440,24 @@
           <w:szCs w:val="20"/>
           <w:rtl/>
         </w:rPr>
-        <w:t xml:space="preserve">ס׳ 866 למג׳לה; וכן ס׳ 872 – מות אחד הצדדים חוסם את החזרה.</w:t>
+        <w:t xml:space="preserve">חוק מס׳ 9 לשנת 2022 (מצרים), המתקן את חוק מס׳ 114 לשנת 1946; ראו </w:t>
+      </w:r>
+      <w:r>
+        <w:rPr>
+          <w:rFonts w:ascii="Times New Roman" w:cs="Times New Roman" w:eastAsia="Times New Roman" w:hAnsi="Times New Roman"/>
+          <w:sz w:val="20"/>
+          <w:szCs w:val="20"/>
+        </w:rPr>
+        <w:t xml:space="preserve">Shalakany Law Office, “New Amendments to Real Estate Registration Law” (2022)</w:t>
+      </w:r>
+      <w:r>
+        <w:rPr>
+          <w:rFonts w:ascii="David" w:cs="David" w:eastAsia="David" w:hAnsi="David"/>
+          <w:sz w:val="20"/>
+          <w:szCs w:val="20"/>
+          <w:rtl/>
+        </w:rPr>
+        <w:t xml:space="preserve">.</w:t>
       </w:r>
     </w:p>
   </w:footnote>
@@ -12234,24 +12480,7 @@
           <w:szCs w:val="20"/>
           <w:rtl/>
         </w:rPr>
-        <w:t xml:space="preserve">ס׳ 879 למג׳לה; לדיון עדכני ראו </w:t>
-      </w:r>
-      <w:r>
-        <w:rPr>
-          <w:rFonts w:ascii="Times New Roman" w:cs="Times New Roman" w:eastAsia="Times New Roman" w:hAnsi="Times New Roman"/>
-          <w:sz w:val="20"/>
-          <w:szCs w:val="20"/>
-        </w:rPr>
-        <w:t xml:space="preserve">Siti Norfatirah Abdul Rahmani &amp; Mohd Zamro Muda, “Ownership Status of Hibah Marad al-Mawt,” 34(8) al-Qanatir Int’l J. Islamic Stud. (2025)</w:t>
-      </w:r>
-      <w:r>
-        <w:rPr>
-          <w:rFonts w:ascii="David" w:cs="David" w:eastAsia="David" w:hAnsi="David"/>
-          <w:sz w:val="20"/>
-          <w:szCs w:val="20"/>
-          <w:rtl/>
-        </w:rPr>
-        <w:t xml:space="preserve">.</w:t>
+        <w:t xml:space="preserve">ס׳ 2 לחוקת מצרים (2014); ס׳ 1 לקוד האזרחי המצרי (ובו מדרג: חקיקה, מנהג, עקרונות השריעה, עקרונות הצדק); חוק הירושה המצרי, חוק מס׳ 77 לשנת 1943; ולצוואות – חוק מס׳ 71 לשנת 1946.</w:t>
       </w:r>
     </w:p>
   </w:footnote>
@@ -12274,25 +12503,7 @@
           <w:szCs w:val="20"/>
           <w:rtl/>
         </w:rPr>
-        <w:t xml:space="preserve">להוראת המעבר ראו ראבילו, </w:t>
-      </w:r>
-      <w:r>
-        <w:rPr>
-          <w:rFonts w:ascii="David" w:cs="David" w:eastAsia="David" w:hAnsi="David"/>
-          <w:sz w:val="20"/>
-          <w:szCs w:val="20"/>
-          <w:rtl/>
-        </w:rPr>
-        <w:t xml:space="preserve">לעיל ה"ש 34</w:t>
-      </w:r>
-      <w:r>
-        <w:rPr>
-          <w:rFonts w:ascii="David" w:cs="David" w:eastAsia="David" w:hAnsi="David"/>
-          <w:sz w:val="20"/>
-          <w:szCs w:val="20"/>
-          <w:rtl/>
-        </w:rPr>
-        <w:t xml:space="preserve">, בעמ׳ 333–337, המתאר את הדין ערב חוק המתנה; והשוו </w:t>
+        <w:t xml:space="preserve">לתרגום האנגלי המקובל ראו </w:t>
       </w:r>
       <w:r>
         <w:rPr>
@@ -12300,16 +12511,16 @@
           <w:sz w:val="20"/>
           <w:szCs w:val="20"/>
         </w:rPr>
-        <w:t xml:space="preserve">L. Landau, “The Gift Law, 1968,” 4 Isr. L. Rev. 260 (1969)</w:t>
-      </w:r>
-      <w:r>
-        <w:rPr>
-          <w:rFonts w:ascii="David" w:cs="David" w:eastAsia="David" w:hAnsi="David"/>
-          <w:sz w:val="20"/>
-          <w:szCs w:val="20"/>
-          <w:rtl/>
-        </w:rPr>
-        <w:t xml:space="preserve">, על החלפת דיני ההִבָּה של המג׳לה בחוק המתנה הישראלי.</w:t>
+        <w:t xml:space="preserve">C.R. Tyser, D.G. Demetriades &amp; Ismail Haqqi Effendi (trans.), The Mejelle: Being an English Translation of Majallah el-Ahkam-i-Adliya (1901)</w:t>
+      </w:r>
+      <w:r>
+        <w:rPr>
+          <w:rFonts w:ascii="David" w:cs="David" w:eastAsia="David" w:hAnsi="David"/>
+          <w:sz w:val="20"/>
+          <w:szCs w:val="20"/>
+          <w:rtl/>
+        </w:rPr>
+        <w:t xml:space="preserve">; חוק לביטול המג׳לה, התשמ"ד-1984.</w:t>
       </w:r>
     </w:p>
   </w:footnote>
@@ -12332,7 +12543,24 @@
           <w:szCs w:val="20"/>
           <w:rtl/>
         </w:rPr>
-        <w:t xml:space="preserve">ס׳ 1660 למג׳לה (ולתביעות בעניין יסוד הוקף – 36 שנים, ס׳ 1661).</w:t>
+        <w:t xml:space="preserve">ס׳ 837, 861–862 למג׳לה. לדוקטרינת ההִבָּה הקלאסית ראו </w:t>
+      </w:r>
+      <w:r>
+        <w:rPr>
+          <w:rFonts w:ascii="Times New Roman" w:cs="Times New Roman" w:eastAsia="Times New Roman" w:hAnsi="Times New Roman"/>
+          <w:sz w:val="20"/>
+          <w:szCs w:val="20"/>
+        </w:rPr>
+        <w:t xml:space="preserve">Joseph Schacht, An Introduction to Islamic Law (1964); Y. Linant de Bellefonds, “Hiba,” in The Encyclopaedia of Islam (2d ed.)</w:t>
+      </w:r>
+      <w:r>
+        <w:rPr>
+          <w:rFonts w:ascii="David" w:cs="David" w:eastAsia="David" w:hAnsi="David"/>
+          <w:sz w:val="20"/>
+          <w:szCs w:val="20"/>
+          <w:rtl/>
+        </w:rPr>
+        <w:t xml:space="preserve">.</w:t>
       </w:r>
     </w:p>
   </w:footnote>
@@ -12355,7 +12583,7 @@
           <w:szCs w:val="20"/>
           <w:rtl/>
         </w:rPr>
-        <w:t xml:space="preserve">ס׳ 1674 למג׳לה. ההקבלה לס׳ 2 לחוק ההתיישנות, התשי"ח-1958, שאף הוא קובע התיישנות דיונית שאינה מפקיעה את הזכות, גלויה לעין.</w:t>
+        <w:t xml:space="preserve">ס׳ 866 למג׳לה; וכן ס׳ 872 – מות אחד הצדדים חוסם את החזרה.</w:t>
       </w:r>
     </w:p>
   </w:footnote>
@@ -12378,7 +12606,7 @@
           <w:szCs w:val="20"/>
           <w:rtl/>
         </w:rPr>
-        <w:t xml:space="preserve">ס׳ 20 ו-78 לחוק הקרקעות העות׳מאני, 1858. להיסטוריה של יישום הוראות אלה בארץ ישראל ולגלגולן בפסיקה הישראלית ראו </w:t>
+        <w:t xml:space="preserve">ס׳ 879 למג׳לה; לדיון עדכני ראו </w:t>
       </w:r>
       <w:r>
         <w:rPr>
@@ -12386,25 +12614,7 @@
           <w:sz w:val="20"/>
           <w:szCs w:val="20"/>
         </w:rPr>
-        <w:t xml:space="preserve">Ahmad Amara, “Dispossession by Law: How the Israeli Judicial System Utilizes Ottoman Land Law to Expel and Dispossess the Bedouins,” J. Levantine Stud. (2015)</w:t>
-      </w:r>
-      <w:r>
-        <w:rPr>
-          <w:rFonts w:ascii="David" w:cs="David" w:eastAsia="David" w:hAnsi="David"/>
-          <w:sz w:val="20"/>
-          <w:szCs w:val="20"/>
-          <w:rtl/>
-        </w:rPr>
-        <w:t xml:space="preserve">; זנדברג, </w:t>
-      </w:r>
-      <w:r>
-        <w:rPr>
-          <w:rFonts w:ascii="David" w:cs="David" w:eastAsia="David" w:hAnsi="David"/>
-          <w:sz w:val="20"/>
-          <w:szCs w:val="20"/>
-          <w:rtl/>
-        </w:rPr>
-        <w:t xml:space="preserve">לעיל ה"ש 10</w:t>
+        <w:t xml:space="preserve">Siti Norfatirah Abdul Rahmani &amp; Mohd Zamro Muda, “Ownership Status of Hibah Marad al-Mawt,” 34(8) al-Qanatir Int’l J. Islamic Stud. (2025)</w:t>
       </w:r>
       <w:r>
         <w:rPr>
@@ -12436,7 +12646,25 @@
           <w:szCs w:val="20"/>
           <w:rtl/>
         </w:rPr>
-        <w:t xml:space="preserve">ס׳ 1521 למג׳לה. השליחות פוקעת ככלל במות השולח – כלל שהעמיד בסימן שאלה את ייפויי הכוח הוותיקים שנועדו לפעול "לאחר אריכות ימים". לניסוח מודרני של דיני הוַכַּאלָה ראו </w:t>
+        <w:t xml:space="preserve">להוראת המעבר ראו ראבילו, </w:t>
+      </w:r>
+      <w:r>
+        <w:rPr>
+          <w:rFonts w:ascii="David" w:cs="David" w:eastAsia="David" w:hAnsi="David"/>
+          <w:sz w:val="20"/>
+          <w:szCs w:val="20"/>
+          <w:rtl/>
+        </w:rPr>
+        <w:t xml:space="preserve">לעיל ה"ש 36</w:t>
+      </w:r>
+      <w:r>
+        <w:rPr>
+          <w:rFonts w:ascii="David" w:cs="David" w:eastAsia="David" w:hAnsi="David"/>
+          <w:sz w:val="20"/>
+          <w:szCs w:val="20"/>
+          <w:rtl/>
+        </w:rPr>
+        <w:t xml:space="preserve">, בעמ׳ 333–337, המתאר את הדין ערב חוק המתנה; והשוו </w:t>
       </w:r>
       <w:r>
         <w:rPr>
@@ -12444,16 +12672,16 @@
           <w:sz w:val="20"/>
           <w:szCs w:val="20"/>
         </w:rPr>
-        <w:t xml:space="preserve">AAOIFI, Shari’ah Standard No. 23: Agency (2015)</w:t>
-      </w:r>
-      <w:r>
-        <w:rPr>
-          <w:rFonts w:ascii="David" w:cs="David" w:eastAsia="David" w:hAnsi="David"/>
-          <w:sz w:val="20"/>
-          <w:szCs w:val="20"/>
-          <w:rtl/>
-        </w:rPr>
-        <w:t xml:space="preserve">.</w:t>
+        <w:t xml:space="preserve">L. Landau, “The Gift Law, 1968,” 4 Isr. L. Rev. 260 (1969)</w:t>
+      </w:r>
+      <w:r>
+        <w:rPr>
+          <w:rFonts w:ascii="David" w:cs="David" w:eastAsia="David" w:hAnsi="David"/>
+          <w:sz w:val="20"/>
+          <w:szCs w:val="20"/>
+          <w:rtl/>
+        </w:rPr>
+        <w:t xml:space="preserve">, על החלפת דיני ההִבָּה של המג׳לה בחוק המתנה הישראלי.</w:t>
       </w:r>
     </w:p>
   </w:footnote>
@@ -12471,20 +12699,12 @@
       </w:r>
       <w:r>
         <w:rPr>
-          <w:rFonts w:ascii="Times New Roman" w:cs="Times New Roman" w:eastAsia="Times New Roman" w:hAnsi="Times New Roman"/>
-          <w:sz w:val="20"/>
-          <w:szCs w:val="20"/>
-        </w:rPr>
-        <w:t xml:space="preserve">N.J. Coulson, Succession in the Muslim Family (1971)</w:t>
-      </w:r>
-      <w:r>
-        <w:rPr>
-          <w:rFonts w:ascii="David" w:cs="David" w:eastAsia="David" w:hAnsi="David"/>
-          <w:sz w:val="20"/>
-          <w:szCs w:val="20"/>
-          <w:rtl/>
-        </w:rPr>
-        <w:t xml:space="preserve">.</w:t>
+          <w:rFonts w:ascii="David" w:cs="David" w:eastAsia="David" w:hAnsi="David"/>
+          <w:sz w:val="20"/>
+          <w:szCs w:val="20"/>
+          <w:rtl/>
+        </w:rPr>
+        <w:t xml:space="preserve">ס׳ 1660 למג׳לה (ולתביעות בעניין יסוד הוקף – 36 שנים, ס׳ 1661).</w:t>
       </w:r>
     </w:p>
   </w:footnote>
@@ -12502,37 +12722,12 @@
       </w:r>
       <w:r>
         <w:rPr>
-          <w:rFonts w:ascii="Times New Roman" w:cs="Times New Roman" w:eastAsia="Times New Roman" w:hAnsi="Times New Roman"/>
-          <w:sz w:val="20"/>
-          <w:szCs w:val="20"/>
-        </w:rPr>
-        <w:t xml:space="preserve">Annelies Moors, Women, Property and Islam: Palestinian Experiences, 1920–1990 (1995)</w:t>
-      </w:r>
-      <w:r>
-        <w:rPr>
-          <w:rFonts w:ascii="David" w:cs="David" w:eastAsia="David" w:hAnsi="David"/>
-          <w:sz w:val="20"/>
-          <w:szCs w:val="20"/>
-          <w:rtl/>
-        </w:rPr>
-        <w:t xml:space="preserve">; ולפרקטיקה בבתי הדין השרעיים בישראל ראו </w:t>
-      </w:r>
-      <w:r>
-        <w:rPr>
-          <w:rFonts w:ascii="Times New Roman" w:cs="Times New Roman" w:eastAsia="Times New Roman" w:hAnsi="Times New Roman"/>
-          <w:sz w:val="20"/>
-          <w:szCs w:val="20"/>
-        </w:rPr>
-        <w:t xml:space="preserve">Aharon Layish, Women and Islamic Law in a Non-Muslim State (1975)</w:t>
-      </w:r>
-      <w:r>
-        <w:rPr>
-          <w:rFonts w:ascii="David" w:cs="David" w:eastAsia="David" w:hAnsi="David"/>
-          <w:sz w:val="20"/>
-          <w:szCs w:val="20"/>
-          <w:rtl/>
-        </w:rPr>
-        <w:t xml:space="preserve">.</w:t>
+          <w:rFonts w:ascii="David" w:cs="David" w:eastAsia="David" w:hAnsi="David"/>
+          <w:sz w:val="20"/>
+          <w:szCs w:val="20"/>
+          <w:rtl/>
+        </w:rPr>
+        <w:t xml:space="preserve">ס׳ 1674 למג׳לה. ההקבלה לס׳ 2 לחוק ההתיישנות, התשי"ח-1958, שאף הוא קובע התיישנות דיונית שאינה מפקיעה את הזכות, גלויה לעין.</w:t>
       </w:r>
     </w:p>
   </w:footnote>
@@ -12550,29 +12745,38 @@
       </w:r>
       <w:r>
         <w:rPr>
+          <w:rFonts w:ascii="David" w:cs="David" w:eastAsia="David" w:hAnsi="David"/>
+          <w:sz w:val="20"/>
+          <w:szCs w:val="20"/>
+          <w:rtl/>
+        </w:rPr>
+        <w:t xml:space="preserve">ס׳ 20 ו-78 לחוק הקרקעות העות׳מאני, 1858. להיסטוריה של יישום הוראות אלה בארץ ישראל ולגלגולן בפסיקה הישראלית ראו </w:t>
+      </w:r>
+      <w:r>
+        <w:rPr>
           <w:rFonts w:ascii="Times New Roman" w:cs="Times New Roman" w:eastAsia="Times New Roman" w:hAnsi="Times New Roman"/>
           <w:sz w:val="20"/>
           <w:szCs w:val="20"/>
         </w:rPr>
-        <w:t xml:space="preserve">Ruth Kark, “Consequences of the Ottoman Land Law: Agrarian and Privatization Processes in Palestine, 1858–1918,” in Societies, Social Inequalities and Marginalization 101 (R. Chand et al. eds., 2017)</w:t>
-      </w:r>
-      <w:r>
-        <w:rPr>
-          <w:rFonts w:ascii="David" w:cs="David" w:eastAsia="David" w:hAnsi="David"/>
-          <w:sz w:val="20"/>
-          <w:szCs w:val="20"/>
-          <w:rtl/>
-        </w:rPr>
-        <w:t xml:space="preserve">; נדן, </w:t>
-      </w:r>
-      <w:r>
-        <w:rPr>
-          <w:rFonts w:ascii="David" w:cs="David" w:eastAsia="David" w:hAnsi="David"/>
-          <w:sz w:val="20"/>
-          <w:szCs w:val="20"/>
-          <w:rtl/>
-        </w:rPr>
-        <w:t xml:space="preserve">לעיל ה"ש 14</w:t>
+        <w:t xml:space="preserve">Ahmad Amara, “Dispossession by Law: How the Israeli Judicial System Utilizes Ottoman Land Law to Expel and Dispossess the Bedouins,” J. Levantine Stud. (2015)</w:t>
+      </w:r>
+      <w:r>
+        <w:rPr>
+          <w:rFonts w:ascii="David" w:cs="David" w:eastAsia="David" w:hAnsi="David"/>
+          <w:sz w:val="20"/>
+          <w:szCs w:val="20"/>
+          <w:rtl/>
+        </w:rPr>
+        <w:t xml:space="preserve">; זנדברג, </w:t>
+      </w:r>
+      <w:r>
+        <w:rPr>
+          <w:rFonts w:ascii="David" w:cs="David" w:eastAsia="David" w:hAnsi="David"/>
+          <w:sz w:val="20"/>
+          <w:szCs w:val="20"/>
+          <w:rtl/>
+        </w:rPr>
+        <w:t xml:space="preserve">לעיל ה"ש 10</w:t>
       </w:r>
       <w:r>
         <w:rPr>
@@ -12604,7 +12808,7 @@
           <w:szCs w:val="20"/>
           <w:rtl/>
         </w:rPr>
-        <w:t xml:space="preserve">ראו לעיל פרק ה ופרק ו.2.4; והשוו </w:t>
+        <w:t xml:space="preserve">ס׳ 1521 למג׳לה. השליחות פוקעת ככלל במות השולח – כלל שהעמיד בסימן שאלה את ייפויי הכוח הוותיקים שנועדו לפעול "לאחר אריכות ימים". לניסוח מודרני של דיני הוַכַּאלָה ראו </w:t>
       </w:r>
       <w:r>
         <w:rPr>
@@ -12612,7 +12816,7 @@
           <w:sz w:val="20"/>
           <w:szCs w:val="20"/>
         </w:rPr>
-        <w:t xml:space="preserve">Kareem Ibrahim &amp; Deena Khalil, “Land Titling: A Tool, not a Panacea — Insights from Egypt,” Metropolitics (Dec. 20, 2016)</w:t>
+        <w:t xml:space="preserve">AAOIFI, Shari’ah Standard No. 23: Agency (2015)</w:t>
       </w:r>
       <w:r>
         <w:rPr>
@@ -12644,6 +12848,215 @@
           <w:szCs w:val="20"/>
           <w:rtl/>
         </w:rPr>
+        <w:t xml:space="preserve">ברק, </w:t>
+      </w:r>
+      <w:r>
+        <w:rPr>
+          <w:rFonts w:ascii="David" w:cs="David" w:eastAsia="David" w:hAnsi="David"/>
+          <w:sz w:val="20"/>
+          <w:szCs w:val="20"/>
+          <w:rtl/>
+        </w:rPr>
+        <w:t xml:space="preserve">לעיל ה"ש 28</w:t>
+      </w:r>
+      <w:r>
+        <w:rPr>
+          <w:rFonts w:ascii="David" w:cs="David" w:eastAsia="David" w:hAnsi="David"/>
+          <w:sz w:val="20"/>
+          <w:szCs w:val="20"/>
+          <w:rtl/>
+        </w:rPr>
+        <w:t xml:space="preserve">, בעמ׳ 1241.</w:t>
+      </w:r>
+    </w:p>
+  </w:footnote>
+  <w:footnote w:id="115">
+    <w:p>
+      <w:pPr>
+        <w:bidi/>
+        <w:spacing w:after="60"/>
+      </w:pPr>
+      <w:r>
+        <w:rPr>
+          <w:rStyle w:val="FootnoteReference"/>
+        </w:rPr>
+        <w:footnoteRef/>
+      </w:r>
+      <w:r>
+        <w:rPr>
+          <w:rFonts w:ascii="Times New Roman" w:cs="Times New Roman" w:eastAsia="Times New Roman" w:hAnsi="Times New Roman"/>
+          <w:sz w:val="20"/>
+          <w:szCs w:val="20"/>
+        </w:rPr>
+        <w:t xml:space="preserve">N.J. Coulson, Succession in the Muslim Family (1971)</w:t>
+      </w:r>
+      <w:r>
+        <w:rPr>
+          <w:rFonts w:ascii="David" w:cs="David" w:eastAsia="David" w:hAnsi="David"/>
+          <w:sz w:val="20"/>
+          <w:szCs w:val="20"/>
+          <w:rtl/>
+        </w:rPr>
+        <w:t xml:space="preserve">.</w:t>
+      </w:r>
+    </w:p>
+  </w:footnote>
+  <w:footnote w:id="116">
+    <w:p>
+      <w:pPr>
+        <w:bidi/>
+        <w:spacing w:after="60"/>
+      </w:pPr>
+      <w:r>
+        <w:rPr>
+          <w:rStyle w:val="FootnoteReference"/>
+        </w:rPr>
+        <w:footnoteRef/>
+      </w:r>
+      <w:r>
+        <w:rPr>
+          <w:rFonts w:ascii="Times New Roman" w:cs="Times New Roman" w:eastAsia="Times New Roman" w:hAnsi="Times New Roman"/>
+          <w:sz w:val="20"/>
+          <w:szCs w:val="20"/>
+        </w:rPr>
+        <w:t xml:space="preserve">Annelies Moors, Women, Property and Islam: Palestinian Experiences, 1920–1990 (1995)</w:t>
+      </w:r>
+      <w:r>
+        <w:rPr>
+          <w:rFonts w:ascii="David" w:cs="David" w:eastAsia="David" w:hAnsi="David"/>
+          <w:sz w:val="20"/>
+          <w:szCs w:val="20"/>
+          <w:rtl/>
+        </w:rPr>
+        <w:t xml:space="preserve">; ולפרקטיקה בבתי הדין השרעיים בישראל ראו </w:t>
+      </w:r>
+      <w:r>
+        <w:rPr>
+          <w:rFonts w:ascii="Times New Roman" w:cs="Times New Roman" w:eastAsia="Times New Roman" w:hAnsi="Times New Roman"/>
+          <w:sz w:val="20"/>
+          <w:szCs w:val="20"/>
+        </w:rPr>
+        <w:t xml:space="preserve">Aharon Layish, Women and Islamic Law in a Non-Muslim State (1975)</w:t>
+      </w:r>
+      <w:r>
+        <w:rPr>
+          <w:rFonts w:ascii="David" w:cs="David" w:eastAsia="David" w:hAnsi="David"/>
+          <w:sz w:val="20"/>
+          <w:szCs w:val="20"/>
+          <w:rtl/>
+        </w:rPr>
+        <w:t xml:space="preserve">.</w:t>
+      </w:r>
+    </w:p>
+  </w:footnote>
+  <w:footnote w:id="117">
+    <w:p>
+      <w:pPr>
+        <w:bidi/>
+        <w:spacing w:after="60"/>
+      </w:pPr>
+      <w:r>
+        <w:rPr>
+          <w:rStyle w:val="FootnoteReference"/>
+        </w:rPr>
+        <w:footnoteRef/>
+      </w:r>
+      <w:r>
+        <w:rPr>
+          <w:rFonts w:ascii="Times New Roman" w:cs="Times New Roman" w:eastAsia="Times New Roman" w:hAnsi="Times New Roman"/>
+          <w:sz w:val="20"/>
+          <w:szCs w:val="20"/>
+        </w:rPr>
+        <w:t xml:space="preserve">Ruth Kark, “Consequences of the Ottoman Land Law: Agrarian and Privatization Processes in Palestine, 1858–1918,” in Societies, Social Inequalities and Marginalization 101 (R. Chand et al. eds., 2017)</w:t>
+      </w:r>
+      <w:r>
+        <w:rPr>
+          <w:rFonts w:ascii="David" w:cs="David" w:eastAsia="David" w:hAnsi="David"/>
+          <w:sz w:val="20"/>
+          <w:szCs w:val="20"/>
+          <w:rtl/>
+        </w:rPr>
+        <w:t xml:space="preserve">; נדן, </w:t>
+      </w:r>
+      <w:r>
+        <w:rPr>
+          <w:rFonts w:ascii="David" w:cs="David" w:eastAsia="David" w:hAnsi="David"/>
+          <w:sz w:val="20"/>
+          <w:szCs w:val="20"/>
+          <w:rtl/>
+        </w:rPr>
+        <w:t xml:space="preserve">לעיל ה"ש 14</w:t>
+      </w:r>
+      <w:r>
+        <w:rPr>
+          <w:rFonts w:ascii="David" w:cs="David" w:eastAsia="David" w:hAnsi="David"/>
+          <w:sz w:val="20"/>
+          <w:szCs w:val="20"/>
+          <w:rtl/>
+        </w:rPr>
+        <w:t xml:space="preserve">.</w:t>
+      </w:r>
+    </w:p>
+  </w:footnote>
+  <w:footnote w:id="118">
+    <w:p>
+      <w:pPr>
+        <w:bidi/>
+        <w:spacing w:after="60"/>
+      </w:pPr>
+      <w:r>
+        <w:rPr>
+          <w:rStyle w:val="FootnoteReference"/>
+        </w:rPr>
+        <w:footnoteRef/>
+      </w:r>
+      <w:r>
+        <w:rPr>
+          <w:rFonts w:ascii="David" w:cs="David" w:eastAsia="David" w:hAnsi="David"/>
+          <w:sz w:val="20"/>
+          <w:szCs w:val="20"/>
+          <w:rtl/>
+        </w:rPr>
+        <w:t xml:space="preserve">ראו לעיל פרק ה ופרק ו.2.4; והשוו </w:t>
+      </w:r>
+      <w:r>
+        <w:rPr>
+          <w:rFonts w:ascii="Times New Roman" w:cs="Times New Roman" w:eastAsia="Times New Roman" w:hAnsi="Times New Roman"/>
+          <w:sz w:val="20"/>
+          <w:szCs w:val="20"/>
+        </w:rPr>
+        <w:t xml:space="preserve">Kareem Ibrahim &amp; Deena Khalil, “Land Titling: A Tool, not a Panacea — Insights from Egypt,” Metropolitics (Dec. 20, 2016)</w:t>
+      </w:r>
+      <w:r>
+        <w:rPr>
+          <w:rFonts w:ascii="David" w:cs="David" w:eastAsia="David" w:hAnsi="David"/>
+          <w:sz w:val="20"/>
+          <w:szCs w:val="20"/>
+          <w:rtl/>
+        </w:rPr>
+        <w:t xml:space="preserve">.</w:t>
+      </w:r>
+    </w:p>
+  </w:footnote>
+  <w:footnote w:id="119">
+    <w:p>
+      <w:pPr>
+        <w:bidi/>
+        <w:spacing w:after="60"/>
+      </w:pPr>
+      <w:r>
+        <w:rPr>
+          <w:rStyle w:val="FootnoteReference"/>
+        </w:rPr>
+        <w:footnoteRef/>
+      </w:r>
+      <w:r>
+        <w:rPr>
+          <w:rFonts w:ascii="David" w:cs="David" w:eastAsia="David" w:hAnsi="David"/>
+          <w:sz w:val="20"/>
+          <w:szCs w:val="20"/>
+          <w:rtl/>
+        </w:rPr>
         <w:t xml:space="preserve">עניין </w:t>
       </w:r>
       <w:r>
@@ -12673,7 +13086,7 @@
           <w:szCs w:val="20"/>
           <w:rtl/>
         </w:rPr>
-        <w:t xml:space="preserve">לעיל ה"ש 29</w:t>
+        <w:t xml:space="preserve">לעיל ה"ש 31</w:t>
       </w:r>
       <w:r>
         <w:rPr>
@@ -12686,7 +13099,7 @@
       </w:r>
     </w:p>
   </w:footnote>
-  <w:footnote w:id="115">
+  <w:footnote w:id="120">
     <w:p>
       <w:pPr>
         <w:bidi/>
@@ -12714,7 +13127,7 @@
           <w:szCs w:val="20"/>
           <w:rtl/>
         </w:rPr>
-        <w:t xml:space="preserve">לעיל ה"ש 37</w:t>
+        <w:t xml:space="preserve">לעיל ה"ש 39</w:t>
       </w:r>
       <w:r>
         <w:rPr>
@@ -12727,7 +13140,7 @@
       </w:r>
     </w:p>
   </w:footnote>
-  <w:footnote w:id="116">
+  <w:footnote w:id="121">
     <w:p>
       <w:pPr>
         <w:bidi/>
@@ -12772,7 +13185,7 @@
           <w:szCs w:val="20"/>
           <w:rtl/>
         </w:rPr>
-        <w:t xml:space="preserve">לעיל ה"ש 82</w:t>
+        <w:t xml:space="preserve">לעיל ה"ש 85</w:t>
       </w:r>
       <w:r>
         <w:rPr>
@@ -12785,7 +13198,7 @@
       </w:r>
     </w:p>
   </w:footnote>
-  <w:footnote w:id="117">
+  <w:footnote w:id="122">
     <w:p>
       <w:pPr>
         <w:bidi/>
@@ -12808,7 +13221,7 @@
       </w:r>
     </w:p>
   </w:footnote>
-  <w:footnote w:id="118">
+  <w:footnote w:id="123">
     <w:p>
       <w:pPr>
         <w:bidi/>

</xml_diff>

<commit_message>
Add the Riess point: pre-1965 Israeli courts applied Mejelle art. 1522 directly
Per Barak p. 1244 n. 188, before the Agency Law Israeli courts applied
Mejelle art. 1522 directly, reading it as imposing a statutory duty on the
agent toward the protected third party - strengthening the genealogy
argument in the Sharia chapter. Riess v. Forer added to the bibliography.

Co-Authored-By: Claude Fable 5 <noreply@anthropic.com>
Claude-Session: https://claude.ai/code/session_01PTzmkyUzTNm9DT35momqLP
</commit_message>
<xml_diff>
--- a/seminar/סמינריון-מקרקעין-לא-רשומים.docx
+++ b/seminar/סמינריון-מקרקעין-לא-רשומים.docx
@@ -4421,7 +4421,7 @@
           <w:szCs w:val="24"/>
           <w:rtl/>
         </w:rPr>
-        <w:t xml:space="preserve"> ואין מדובר בהשערה גנאלוגית בלבד: ברק מציין במפורש כי בעיצוב ההרשאה להבטחת זכותו של אחר שבסעיף 14(ב) הלך המחוקק הישראלי "בעקבות המג׳לה" – סעיפים 1521, 1522 ו-1527 שבה – ובעקבות שיטות קונטיננטליות שנהגו כמותה.</w:t>
+        <w:t xml:space="preserve"> ואין מדובר בהשערה גנאלוגית בלבד: ברק מציין במפורש כי בעיצוב ההרשאה להבטחת זכותו של אחר שבסעיף 14(ב) הלך המחוקק הישראלי "בעקבות המג׳לה" – סעיפים 1521, 1522 ו-1527 שבה – ובעקבות שיטות קונטיננטליות שנהגו כמותה; ועוד קודם לחוק השליחות החילו בתי המשפט בישראל את סעיף 1522 למג׳לה במישרין, ופירשוהו כמטיל על השלוח חובה סטטוטורית כלפי הצד השלישי שההרשאה נועדה להבטיח את זכותו.</w:t>
       </w:r>
       <w:r>
         <w:rPr>
@@ -5301,6 +5301,43 @@
           <w:rtl/>
         </w:rPr>
         <w:t xml:space="preserve">, פ"ד יח(3) 561 (1964).</w:t>
+      </w:r>
+    </w:p>
+    <w:p>
+      <w:pPr>
+        <w:bidi/>
+        <w:spacing w:after="120" w:line="300"/>
+        <w:ind w:start="420" w:hanging="420"/>
+        <w:jc w:val="both"/>
+      </w:pPr>
+      <w:r>
+        <w:rPr>
+          <w:rFonts w:ascii="David" w:cs="David" w:eastAsia="David" w:hAnsi="David"/>
+          <w:sz w:val="24"/>
+          <w:szCs w:val="24"/>
+          <w:rtl/>
+        </w:rPr>
+        <w:t xml:space="preserve">ע"א 516/65 </w:t>
+      </w:r>
+      <w:r>
+        <w:rPr>
+          <w:rFonts w:ascii="David" w:cs="David" w:eastAsia="David" w:hAnsi="David"/>
+          <w:i/>
+          <w:iCs/>
+          <w:sz w:val="24"/>
+          <w:szCs w:val="24"/>
+          <w:rtl/>
+        </w:rPr>
+        <w:t xml:space="preserve">ריעס נ׳ פורר</w:t>
+      </w:r>
+      <w:r>
+        <w:rPr>
+          <w:rFonts w:ascii="David" w:cs="David" w:eastAsia="David" w:hAnsi="David"/>
+          <w:sz w:val="24"/>
+          <w:szCs w:val="24"/>
+          <w:rtl/>
+        </w:rPr>
+        <w:t xml:space="preserve">, פ"ד כ(3) 488 (1966).</w:t>
       </w:r>
     </w:p>
     <w:p>
@@ -12866,7 +12903,27 @@
           <w:szCs w:val="20"/>
           <w:rtl/>
         </w:rPr>
-        <w:t xml:space="preserve">, בעמ׳ 1241.</w:t>
+        <w:t xml:space="preserve">, בעמ׳ 1241, 1244; ע"א 516/65 </w:t>
+      </w:r>
+      <w:r>
+        <w:rPr>
+          <w:rFonts w:ascii="David" w:cs="David" w:eastAsia="David" w:hAnsi="David"/>
+          <w:i/>
+          <w:iCs/>
+          <w:sz w:val="20"/>
+          <w:szCs w:val="20"/>
+          <w:rtl/>
+        </w:rPr>
+        <w:t xml:space="preserve">ריעס נ׳ פורר</w:t>
+      </w:r>
+      <w:r>
+        <w:rPr>
+          <w:rFonts w:ascii="David" w:cs="David" w:eastAsia="David" w:hAnsi="David"/>
+          <w:sz w:val="20"/>
+          <w:szCs w:val="20"/>
+          <w:rtl/>
+        </w:rPr>
+        <w:t xml:space="preserve">, פ"ד כ(3) 488 (1966).</w:t>
       </w:r>
     </w:p>
   </w:footnote>

</xml_diff>

<commit_message>
Add Weisman p. 327 n. 2: a caution note alone confers no market-overt protection
Co-Authored-By: Claude Fable 5 <noreply@anthropic.com>
Claude-Session: https://claude.ai/code/session_01PTzmkyUzTNm9DT35momqLP
</commit_message>
<xml_diff>
--- a/seminar/סמינריון-מקרקעין-לא-רשומים.docx
+++ b/seminar/סמינריון-מקרקעין-לא-רשומים.docx
@@ -1648,7 +1648,7 @@
           <w:szCs w:val="24"/>
           <w:rtl/>
         </w:rPr>
-        <w:t xml:space="preserve"> שלישית, ייפוי הכוח אינו מקנה את הגנות הרישום: מי שלא השלים את הרישום אינו נהנה מתקנת השוק שבסעיף 10, וזכותו נותרת חשופה לעסקה נוגדת שנרשמה בתום לב.</w:t>
+        <w:t xml:space="preserve"> שלישית, ייפוי הכוח אינו מקנה את הגנות הרישום: מי שלא השלים את הרישום אינו נהנה מתקנת השוק שבסעיף 10, וזכותו נותרת חשופה לעסקה נוגדת שנרשמה בתום לב – ואף רישום הערת אזהרה בלבד, מקום שהוא אפשרי, אינו מקנה הגנה זו.</w:t>
       </w:r>
       <w:r>
         <w:rPr>
@@ -9252,7 +9252,45 @@
           <w:szCs w:val="20"/>
           <w:rtl/>
         </w:rPr>
-        <w:t xml:space="preserve">.</w:t>
+        <w:t xml:space="preserve">; ולעניין הערת האזהרה – ויסמן </w:t>
+      </w:r>
+      <w:r>
+        <w:rPr>
+          <w:rFonts w:ascii="David" w:cs="David" w:eastAsia="David" w:hAnsi="David"/>
+          <w:i/>
+          <w:iCs/>
+          <w:sz w:val="20"/>
+          <w:szCs w:val="20"/>
+          <w:rtl/>
+        </w:rPr>
+        <w:t xml:space="preserve">דיני קניין</w:t>
+      </w:r>
+      <w:r>
+        <w:rPr>
+          <w:rFonts w:ascii="David" w:cs="David" w:eastAsia="David" w:hAnsi="David"/>
+          <w:sz w:val="20"/>
+          <w:szCs w:val="20"/>
+          <w:rtl/>
+        </w:rPr>
+        <w:t xml:space="preserve">, </w:t>
+      </w:r>
+      <w:r>
+        <w:rPr>
+          <w:rFonts w:ascii="David" w:cs="David" w:eastAsia="David" w:hAnsi="David"/>
+          <w:sz w:val="20"/>
+          <w:szCs w:val="20"/>
+          <w:rtl/>
+        </w:rPr>
+        <w:t xml:space="preserve">לעיל ה"ש 9</w:t>
+      </w:r>
+      <w:r>
+        <w:rPr>
+          <w:rFonts w:ascii="David" w:cs="David" w:eastAsia="David" w:hAnsi="David"/>
+          <w:sz w:val="20"/>
+          <w:szCs w:val="20"/>
+          <w:rtl/>
+        </w:rPr>
+        <w:t xml:space="preserve">, בעמ׳ 327 ה"ש 2, והאסמכתאות שם.</w:t>
       </w:r>
     </w:p>
   </w:footnote>

</xml_diff>

<commit_message>
Integrate Hashash v. Damari: sharing agreements over RMI-authorization rights are obligatory, outside the writing requirement
The 1977 foundational precedent: where the grantor holds only bar-rashut
status and an obligatory right to demand a lease from the ILA, an oral
sharing agreement is not a 'transaction in land' requiring writing, and
the spouse is entitled internally to half the obligatory rights - key for
localities where holdings rest on RMI development agreements.

Co-Authored-By: Claude Fable 5 <noreply@anthropic.com>
Claude-Session: https://claude.ai/code/session_01PTzmkyUzTNm9DT35momqLP
</commit_message>
<xml_diff>
--- a/seminar/סמינריון-מקרקעין-לא-רשומים.docx
+++ b/seminar/סמינריון-מקרקעין-לא-רשומים.docx
@@ -2355,7 +2355,27 @@
           <w:szCs w:val="24"/>
           <w:rtl/>
         </w:rPr>
-        <w:t xml:space="preserve"> וההבחנה בין זכות קניינית לזכות חוזית גרידא נושאת גם נפקות דיונית, לעניין סיווג התביעה וסמכות הערכאות.</w:t>
+        <w:t xml:space="preserve"> וההבחנה בין זכות קניינית לזכות חוזית גרידא נושאת נפקות כפולה. במישור המהותי היא נקבעה כבר בעניין </w:t>
+      </w:r>
+      <w:r>
+        <w:rPr>
+          <w:rFonts w:ascii="David" w:cs="David" w:eastAsia="David" w:hAnsi="David"/>
+          <w:i/>
+          <w:iCs/>
+          <w:sz w:val="24"/>
+          <w:szCs w:val="24"/>
+          <w:rtl/>
+        </w:rPr>
+        <w:t xml:space="preserve">חשש נ׳ דמארי</w:t>
+      </w:r>
+      <w:r>
+        <w:rPr>
+          <w:rFonts w:ascii="David" w:cs="David" w:eastAsia="David" w:hAnsi="David"/>
+          <w:sz w:val="24"/>
+          <w:szCs w:val="24"/>
+          <w:rtl/>
+        </w:rPr>
+        <w:t xml:space="preserve">: מקום שהמקנה עצמו מחזיק רק במעמד של בר־רשות ובזכות אובליגטורית לדרוש חכירה ממינהל מקרקעי ישראל, הסכם – אף בעל־פה – לשיתוף בזכויות אלה איננו "עסקה במקרקעין" הטעונה מסמך בכתב, שהרי אין בידי המקנה זכות קניינית להקנות; ובן הזוג זכאי, ביחסים הפנימיים, למחצית הזכויות האובליגטוריות כלפי המינהל.</w:t>
       </w:r>
       <w:r>
         <w:rPr>
@@ -2370,13 +2390,28 @@
           <w:szCs w:val="24"/>
           <w:rtl/>
         </w:rPr>
+        <w:t xml:space="preserve"> ובמישור הדיוני – לעניין סיווג התביעה וסמכות הערכאות.</w:t>
+      </w:r>
+      <w:r>
+        <w:rPr>
+          <w:rStyle w:val="FootnoteReference"/>
+        </w:rPr>
+        <w:footnoteReference w:id="57"/>
+      </w:r>
+      <w:r>
+        <w:rPr>
+          <w:rFonts w:ascii="David" w:cs="David" w:eastAsia="David" w:hAnsi="David"/>
+          <w:sz w:val="24"/>
+          <w:szCs w:val="24"/>
+          <w:rtl/>
+        </w:rPr>
         <w:t xml:space="preserve"> ולבסוף, גם כשהמרשם קופא על שם האב המנוח, נכונים בתי המשפט לאכוף בין האחים לבין עצמם הסדרי שימוש פנימיים שנקבעו אף בהתנהגות גרידא – כגון צו המגן על דרך מעבר משותפת בין הבתים – תוך הגבלת ההכרעה למישור הפנים־משפחתי, בלא לפגוע בזכויות יתר השותפים הרשומים שאינם צד להליך.</w:t>
       </w:r>
       <w:r>
         <w:rPr>
           <w:rStyle w:val="FootnoteReference"/>
         </w:rPr>
-        <w:footnoteReference w:id="57"/>
+        <w:footnoteReference w:id="58"/>
       </w:r>
       <w:r>
         <w:rPr>
@@ -2427,7 +2462,7 @@
         <w:rPr>
           <w:rStyle w:val="FootnoteReference"/>
         </w:rPr>
-        <w:footnoteReference w:id="58"/>
+        <w:footnoteReference w:id="59"/>
       </w:r>
     </w:p>
     <w:p>
@@ -2505,7 +2540,7 @@
         <w:rPr>
           <w:rStyle w:val="FootnoteReference"/>
         </w:rPr>
-        <w:footnoteReference w:id="59"/>
+        <w:footnoteReference w:id="60"/>
       </w:r>
       <w:r>
         <w:rPr>
@@ -2537,7 +2572,7 @@
         <w:rPr>
           <w:rStyle w:val="FootnoteReference"/>
         </w:rPr>
-        <w:footnoteReference w:id="60"/>
+        <w:footnoteReference w:id="61"/>
       </w:r>
       <w:r>
         <w:rPr>
@@ -2572,7 +2607,7 @@
         <w:rPr>
           <w:rStyle w:val="FootnoteReference"/>
         </w:rPr>
-        <w:footnoteReference w:id="61"/>
+        <w:footnoteReference w:id="62"/>
       </w:r>
     </w:p>
     <w:p>
@@ -2614,7 +2649,7 @@
         <w:rPr>
           <w:rStyle w:val="FootnoteReference"/>
         </w:rPr>
-        <w:footnoteReference w:id="62"/>
+        <w:footnoteReference w:id="63"/>
       </w:r>
       <w:r>
         <w:rPr>
@@ -2665,7 +2700,7 @@
         <w:rPr>
           <w:rStyle w:val="FootnoteReference"/>
         </w:rPr>
-        <w:footnoteReference w:id="63"/>
+        <w:footnoteReference w:id="64"/>
       </w:r>
       <w:r>
         <w:rPr>
@@ -2716,7 +2751,7 @@
         <w:rPr>
           <w:rStyle w:val="FootnoteReference"/>
         </w:rPr>
-        <w:footnoteReference w:id="64"/>
+        <w:footnoteReference w:id="65"/>
       </w:r>
       <w:r>
         <w:rPr>
@@ -2767,7 +2802,7 @@
         <w:rPr>
           <w:rStyle w:val="FootnoteReference"/>
         </w:rPr>
-        <w:footnoteReference w:id="65"/>
+        <w:footnoteReference w:id="66"/>
       </w:r>
       <w:r>
         <w:rPr>
@@ -2837,7 +2872,7 @@
         <w:rPr>
           <w:rStyle w:val="FootnoteReference"/>
         </w:rPr>
-        <w:footnoteReference w:id="66"/>
+        <w:footnoteReference w:id="67"/>
       </w:r>
       <w:r>
         <w:rPr>
@@ -2852,7 +2887,7 @@
         <w:rPr>
           <w:rStyle w:val="FootnoteReference"/>
         </w:rPr>
-        <w:footnoteReference w:id="67"/>
+        <w:footnoteReference w:id="68"/>
       </w:r>
       <w:r>
         <w:rPr>
@@ -2867,7 +2902,7 @@
         <w:rPr>
           <w:rStyle w:val="FootnoteReference"/>
         </w:rPr>
-        <w:footnoteReference w:id="68"/>
+        <w:footnoteReference w:id="69"/>
       </w:r>
       <w:r>
         <w:rPr>
@@ -2882,7 +2917,7 @@
         <w:rPr>
           <w:rStyle w:val="FootnoteReference"/>
         </w:rPr>
-        <w:footnoteReference w:id="69"/>
+        <w:footnoteReference w:id="70"/>
       </w:r>
       <w:r>
         <w:rPr>
@@ -2897,7 +2932,7 @@
         <w:rPr>
           <w:rStyle w:val="FootnoteReference"/>
         </w:rPr>
-        <w:footnoteReference w:id="70"/>
+        <w:footnoteReference w:id="71"/>
       </w:r>
     </w:p>
     <w:p>
@@ -2920,7 +2955,7 @@
         <w:rPr>
           <w:rStyle w:val="FootnoteReference"/>
         </w:rPr>
-        <w:footnoteReference w:id="71"/>
+        <w:footnoteReference w:id="72"/>
       </w:r>
       <w:r>
         <w:rPr>
@@ -2935,7 +2970,7 @@
         <w:rPr>
           <w:rStyle w:val="FootnoteReference"/>
         </w:rPr>
-        <w:footnoteReference w:id="72"/>
+        <w:footnoteReference w:id="73"/>
       </w:r>
       <w:r>
         <w:rPr>
@@ -2950,7 +2985,7 @@
         <w:rPr>
           <w:rStyle w:val="FootnoteReference"/>
         </w:rPr>
-        <w:footnoteReference w:id="73"/>
+        <w:footnoteReference w:id="74"/>
       </w:r>
       <w:r>
         <w:rPr>
@@ -3001,7 +3036,7 @@
         <w:rPr>
           <w:rStyle w:val="FootnoteReference"/>
         </w:rPr>
-        <w:footnoteReference w:id="74"/>
+        <w:footnoteReference w:id="75"/>
       </w:r>
       <w:r>
         <w:rPr>
@@ -3033,7 +3068,7 @@
         <w:rPr>
           <w:rStyle w:val="FootnoteReference"/>
         </w:rPr>
-        <w:footnoteReference w:id="75"/>
+        <w:footnoteReference w:id="76"/>
       </w:r>
       <w:r>
         <w:rPr>
@@ -3084,7 +3119,7 @@
         <w:rPr>
           <w:rStyle w:val="FootnoteReference"/>
         </w:rPr>
-        <w:footnoteReference w:id="76"/>
+        <w:footnoteReference w:id="77"/>
       </w:r>
     </w:p>
     <w:p>
@@ -3124,7 +3159,7 @@
         <w:rPr>
           <w:rStyle w:val="FootnoteReference"/>
         </w:rPr>
-        <w:footnoteReference w:id="77"/>
+        <w:footnoteReference w:id="78"/>
       </w:r>
       <w:r>
         <w:rPr>
@@ -3156,7 +3191,7 @@
         <w:rPr>
           <w:rStyle w:val="FootnoteReference"/>
         </w:rPr>
-        <w:footnoteReference w:id="78"/>
+        <w:footnoteReference w:id="79"/>
       </w:r>
       <w:r>
         <w:rPr>
@@ -3207,7 +3242,7 @@
         <w:rPr>
           <w:rStyle w:val="FootnoteReference"/>
         </w:rPr>
-        <w:footnoteReference w:id="79"/>
+        <w:footnoteReference w:id="80"/>
       </w:r>
     </w:p>
     <w:p>
@@ -3287,7 +3322,7 @@
         <w:rPr>
           <w:rStyle w:val="FootnoteReference"/>
         </w:rPr>
-        <w:footnoteReference w:id="80"/>
+        <w:footnoteReference w:id="81"/>
       </w:r>
       <w:r>
         <w:rPr>
@@ -3321,7 +3356,7 @@
         <w:rPr>
           <w:rStyle w:val="FootnoteReference"/>
         </w:rPr>
-        <w:footnoteReference w:id="81"/>
+        <w:footnoteReference w:id="82"/>
       </w:r>
       <w:r>
         <w:rPr>
@@ -3356,7 +3391,7 @@
         <w:rPr>
           <w:rStyle w:val="FootnoteReference"/>
         </w:rPr>
-        <w:footnoteReference w:id="82"/>
+        <w:footnoteReference w:id="83"/>
       </w:r>
     </w:p>
     <w:p>
@@ -3398,7 +3433,7 @@
         <w:rPr>
           <w:rStyle w:val="FootnoteReference"/>
         </w:rPr>
-        <w:footnoteReference w:id="83"/>
+        <w:footnoteReference w:id="84"/>
       </w:r>
       <w:r>
         <w:rPr>
@@ -3449,7 +3484,7 @@
         <w:rPr>
           <w:rStyle w:val="FootnoteReference"/>
         </w:rPr>
-        <w:footnoteReference w:id="84"/>
+        <w:footnoteReference w:id="85"/>
       </w:r>
       <w:r>
         <w:rPr>
@@ -3464,7 +3499,7 @@
         <w:rPr>
           <w:rStyle w:val="FootnoteReference"/>
         </w:rPr>
-        <w:footnoteReference w:id="85"/>
+        <w:footnoteReference w:id="86"/>
       </w:r>
     </w:p>
     <w:p>
@@ -3523,7 +3558,7 @@
         <w:rPr>
           <w:rStyle w:val="FootnoteReference"/>
         </w:rPr>
-        <w:footnoteReference w:id="86"/>
+        <w:footnoteReference w:id="87"/>
       </w:r>
       <w:r>
         <w:rPr>
@@ -3574,7 +3609,7 @@
         <w:rPr>
           <w:rStyle w:val="FootnoteReference"/>
         </w:rPr>
-        <w:footnoteReference w:id="87"/>
+        <w:footnoteReference w:id="88"/>
       </w:r>
       <w:r>
         <w:rPr>
@@ -3608,7 +3643,7 @@
         <w:rPr>
           <w:rStyle w:val="FootnoteReference"/>
         </w:rPr>
-        <w:footnoteReference w:id="88"/>
+        <w:footnoteReference w:id="89"/>
       </w:r>
       <w:r>
         <w:rPr>
@@ -3696,7 +3731,7 @@
         <w:rPr>
           <w:rStyle w:val="FootnoteReference"/>
         </w:rPr>
-        <w:footnoteReference w:id="89"/>
+        <w:footnoteReference w:id="90"/>
       </w:r>
       <w:r>
         <w:rPr>
@@ -3731,7 +3766,7 @@
         <w:rPr>
           <w:rStyle w:val="FootnoteReference"/>
         </w:rPr>
-        <w:footnoteReference w:id="90"/>
+        <w:footnoteReference w:id="91"/>
       </w:r>
       <w:r>
         <w:rPr>
@@ -3765,7 +3800,7 @@
         <w:rPr>
           <w:rStyle w:val="FootnoteReference"/>
         </w:rPr>
-        <w:footnoteReference w:id="91"/>
+        <w:footnoteReference w:id="92"/>
       </w:r>
       <w:r>
         <w:rPr>
@@ -3799,7 +3834,7 @@
         <w:rPr>
           <w:rStyle w:val="FootnoteReference"/>
         </w:rPr>
-        <w:footnoteReference w:id="92"/>
+        <w:footnoteReference w:id="93"/>
       </w:r>
       <w:r>
         <w:rPr>
@@ -3814,7 +3849,7 @@
         <w:rPr>
           <w:rStyle w:val="FootnoteReference"/>
         </w:rPr>
-        <w:footnoteReference w:id="93"/>
+        <w:footnoteReference w:id="94"/>
       </w:r>
       <w:r>
         <w:rPr>
@@ -3829,7 +3864,7 @@
         <w:rPr>
           <w:rStyle w:val="FootnoteReference"/>
         </w:rPr>
-        <w:footnoteReference w:id="94"/>
+        <w:footnoteReference w:id="95"/>
       </w:r>
       <w:r>
         <w:rPr>
@@ -3844,7 +3879,7 @@
         <w:rPr>
           <w:rStyle w:val="FootnoteReference"/>
         </w:rPr>
-        <w:footnoteReference w:id="95"/>
+        <w:footnoteReference w:id="96"/>
       </w:r>
     </w:p>
     <w:p>
@@ -3905,7 +3940,7 @@
         <w:rPr>
           <w:rStyle w:val="FootnoteReference"/>
         </w:rPr>
-        <w:footnoteReference w:id="96"/>
+        <w:footnoteReference w:id="97"/>
       </w:r>
       <w:r>
         <w:rPr>
@@ -3920,7 +3955,7 @@
         <w:rPr>
           <w:rStyle w:val="FootnoteReference"/>
         </w:rPr>
-        <w:footnoteReference w:id="97"/>
+        <w:footnoteReference w:id="98"/>
       </w:r>
       <w:r>
         <w:rPr>
@@ -3935,7 +3970,7 @@
         <w:rPr>
           <w:rStyle w:val="FootnoteReference"/>
         </w:rPr>
-        <w:footnoteReference w:id="98"/>
+        <w:footnoteReference w:id="99"/>
       </w:r>
     </w:p>
     <w:p>
@@ -3977,7 +4012,7 @@
         <w:rPr>
           <w:rStyle w:val="FootnoteReference"/>
         </w:rPr>
-        <w:footnoteReference w:id="99"/>
+        <w:footnoteReference w:id="100"/>
       </w:r>
       <w:r>
         <w:rPr>
@@ -3992,7 +4027,7 @@
         <w:rPr>
           <w:rStyle w:val="FootnoteReference"/>
         </w:rPr>
-        <w:footnoteReference w:id="100"/>
+        <w:footnoteReference w:id="101"/>
       </w:r>
     </w:p>
     <w:p>
@@ -4034,7 +4069,7 @@
         <w:rPr>
           <w:rStyle w:val="FootnoteReference"/>
         </w:rPr>
-        <w:footnoteReference w:id="101"/>
+        <w:footnoteReference w:id="102"/>
       </w:r>
       <w:r>
         <w:rPr>
@@ -4049,7 +4084,7 @@
         <w:rPr>
           <w:rStyle w:val="FootnoteReference"/>
         </w:rPr>
-        <w:footnoteReference w:id="102"/>
+        <w:footnoteReference w:id="103"/>
       </w:r>
       <w:r>
         <w:rPr>
@@ -4064,7 +4099,7 @@
         <w:rPr>
           <w:rStyle w:val="FootnoteReference"/>
         </w:rPr>
-        <w:footnoteReference w:id="103"/>
+        <w:footnoteReference w:id="104"/>
       </w:r>
       <w:r>
         <w:rPr>
@@ -4079,7 +4114,7 @@
         <w:rPr>
           <w:rStyle w:val="FootnoteReference"/>
         </w:rPr>
-        <w:footnoteReference w:id="104"/>
+        <w:footnoteReference w:id="105"/>
       </w:r>
     </w:p>
     <w:p>
@@ -4121,7 +4156,7 @@
         <w:rPr>
           <w:rStyle w:val="FootnoteReference"/>
         </w:rPr>
-        <w:footnoteReference w:id="105"/>
+        <w:footnoteReference w:id="106"/>
       </w:r>
       <w:r>
         <w:rPr>
@@ -4136,7 +4171,7 @@
         <w:rPr>
           <w:rStyle w:val="FootnoteReference"/>
         </w:rPr>
-        <w:footnoteReference w:id="106"/>
+        <w:footnoteReference w:id="107"/>
       </w:r>
       <w:r>
         <w:rPr>
@@ -4151,7 +4186,7 @@
         <w:rPr>
           <w:rStyle w:val="FootnoteReference"/>
         </w:rPr>
-        <w:footnoteReference w:id="107"/>
+        <w:footnoteReference w:id="108"/>
       </w:r>
       <w:r>
         <w:rPr>
@@ -4221,7 +4256,7 @@
         <w:rPr>
           <w:rStyle w:val="FootnoteReference"/>
         </w:rPr>
-        <w:footnoteReference w:id="108"/>
+        <w:footnoteReference w:id="109"/>
       </w:r>
       <w:r>
         <w:rPr>
@@ -4272,7 +4307,7 @@
         <w:rPr>
           <w:rStyle w:val="FootnoteReference"/>
         </w:rPr>
-        <w:footnoteReference w:id="109"/>
+        <w:footnoteReference w:id="110"/>
       </w:r>
       <w:r>
         <w:rPr>
@@ -4287,7 +4322,7 @@
         <w:rPr>
           <w:rStyle w:val="FootnoteReference"/>
         </w:rPr>
-        <w:footnoteReference w:id="110"/>
+        <w:footnoteReference w:id="111"/>
       </w:r>
       <w:r>
         <w:rPr>
@@ -4302,7 +4337,7 @@
         <w:rPr>
           <w:rStyle w:val="FootnoteReference"/>
         </w:rPr>
-        <w:footnoteReference w:id="111"/>
+        <w:footnoteReference w:id="112"/>
       </w:r>
     </w:p>
     <w:p>
@@ -4325,7 +4360,7 @@
         <w:rPr>
           <w:rStyle w:val="FootnoteReference"/>
         </w:rPr>
-        <w:footnoteReference w:id="112"/>
+        <w:footnoteReference w:id="113"/>
       </w:r>
     </w:p>
     <w:p>
@@ -4367,7 +4402,7 @@
         <w:rPr>
           <w:rStyle w:val="FootnoteReference"/>
         </w:rPr>
-        <w:footnoteReference w:id="113"/>
+        <w:footnoteReference w:id="114"/>
       </w:r>
       <w:r>
         <w:rPr>
@@ -4382,7 +4417,7 @@
         <w:rPr>
           <w:rStyle w:val="FootnoteReference"/>
         </w:rPr>
-        <w:footnoteReference w:id="114"/>
+        <w:footnoteReference w:id="115"/>
       </w:r>
       <w:r>
         <w:rPr>
@@ -4397,7 +4432,7 @@
         <w:rPr>
           <w:rStyle w:val="FootnoteReference"/>
         </w:rPr>
-        <w:footnoteReference w:id="115"/>
+        <w:footnoteReference w:id="116"/>
       </w:r>
       <w:r>
         <w:rPr>
@@ -4448,7 +4483,7 @@
         <w:rPr>
           <w:rStyle w:val="FootnoteReference"/>
         </w:rPr>
-        <w:footnoteReference w:id="116"/>
+        <w:footnoteReference w:id="117"/>
       </w:r>
       <w:r>
         <w:rPr>
@@ -4463,7 +4498,7 @@
         <w:rPr>
           <w:rStyle w:val="FootnoteReference"/>
         </w:rPr>
-        <w:footnoteReference w:id="117"/>
+        <w:footnoteReference w:id="118"/>
       </w:r>
       <w:r>
         <w:rPr>
@@ -4478,7 +4513,7 @@
         <w:rPr>
           <w:rStyle w:val="FootnoteReference"/>
         </w:rPr>
-        <w:footnoteReference w:id="118"/>
+        <w:footnoteReference w:id="119"/>
       </w:r>
       <w:r>
         <w:rPr>
@@ -4493,7 +4528,7 @@
         <w:rPr>
           <w:rStyle w:val="FootnoteReference"/>
         </w:rPr>
-        <w:footnoteReference w:id="119"/>
+        <w:footnoteReference w:id="120"/>
       </w:r>
       <w:r>
         <w:rPr>
@@ -4508,7 +4543,7 @@
         <w:rPr>
           <w:rStyle w:val="FootnoteReference"/>
         </w:rPr>
-        <w:footnoteReference w:id="120"/>
+        <w:footnoteReference w:id="121"/>
       </w:r>
       <w:r>
         <w:rPr>
@@ -4654,7 +4689,7 @@
         <w:rPr>
           <w:rStyle w:val="FootnoteReference"/>
         </w:rPr>
-        <w:footnoteReference w:id="121"/>
+        <w:footnoteReference w:id="122"/>
       </w:r>
     </w:p>
     <w:p>
@@ -4713,7 +4748,7 @@
         <w:rPr>
           <w:rStyle w:val="FootnoteReference"/>
         </w:rPr>
-        <w:footnoteReference w:id="122"/>
+        <w:footnoteReference w:id="123"/>
       </w:r>
       <w:r>
         <w:rPr>
@@ -4728,7 +4763,7 @@
         <w:rPr>
           <w:rStyle w:val="FootnoteReference"/>
         </w:rPr>
-        <w:footnoteReference w:id="123"/>
+        <w:footnoteReference w:id="124"/>
       </w:r>
       <w:r>
         <w:rPr>
@@ -4760,7 +4795,7 @@
         <w:rPr>
           <w:rStyle w:val="FootnoteReference"/>
         </w:rPr>
-        <w:footnoteReference w:id="124"/>
+        <w:footnoteReference w:id="125"/>
       </w:r>
       <w:r>
         <w:rPr>
@@ -4812,7 +4847,7 @@
         <w:rPr>
           <w:rStyle w:val="FootnoteReference"/>
         </w:rPr>
-        <w:footnoteReference w:id="125"/>
+        <w:footnoteReference w:id="126"/>
       </w:r>
       <w:r>
         <w:rPr>
@@ -4827,7 +4862,7 @@
         <w:rPr>
           <w:rStyle w:val="FootnoteReference"/>
         </w:rPr>
-        <w:footnoteReference w:id="126"/>
+        <w:footnoteReference w:id="127"/>
       </w:r>
       <w:r>
         <w:rPr>
@@ -5448,6 +5483,43 @@
           <w:rtl/>
         </w:rPr>
         <w:t xml:space="preserve">, פ"ד כו(2) 781 (1972).</w:t>
+      </w:r>
+    </w:p>
+    <w:p>
+      <w:pPr>
+        <w:bidi/>
+        <w:spacing w:after="120" w:line="300"/>
+        <w:ind w:start="420" w:hanging="420"/>
+        <w:jc w:val="both"/>
+      </w:pPr>
+      <w:r>
+        <w:rPr>
+          <w:rFonts w:ascii="David" w:cs="David" w:eastAsia="David" w:hAnsi="David"/>
+          <w:sz w:val="24"/>
+          <w:szCs w:val="24"/>
+          <w:rtl/>
+        </w:rPr>
+        <w:t xml:space="preserve">ע"א 514/76 </w:t>
+      </w:r>
+      <w:r>
+        <w:rPr>
+          <w:rFonts w:ascii="David" w:cs="David" w:eastAsia="David" w:hAnsi="David"/>
+          <w:i/>
+          <w:iCs/>
+          <w:sz w:val="24"/>
+          <w:szCs w:val="24"/>
+          <w:rtl/>
+        </w:rPr>
+        <w:t xml:space="preserve">חשש נ׳ דמארי</w:t>
+      </w:r>
+      <w:r>
+        <w:rPr>
+          <w:rFonts w:ascii="David" w:cs="David" w:eastAsia="David" w:hAnsi="David"/>
+          <w:sz w:val="24"/>
+          <w:szCs w:val="24"/>
+          <w:rtl/>
+        </w:rPr>
+        <w:t xml:space="preserve">, פ"ד לא(2) 505 (1977).</w:t>
       </w:r>
     </w:p>
     <w:p>
@@ -10807,27 +10879,27 @@
           <w:szCs w:val="20"/>
           <w:rtl/>
         </w:rPr>
-        <w:t xml:space="preserve">רע"א 4890/15 </w:t>
-      </w:r>
-      <w:r>
-        <w:rPr>
-          <w:rFonts w:ascii="David" w:cs="David" w:eastAsia="David" w:hAnsi="David"/>
-          <w:i/>
-          <w:iCs/>
-          <w:sz w:val="20"/>
-          <w:szCs w:val="20"/>
-          <w:rtl/>
-        </w:rPr>
-        <w:t xml:space="preserve">אלוש נ׳ עיריית טבריה</w:t>
-      </w:r>
-      <w:r>
-        <w:rPr>
-          <w:rFonts w:ascii="David" w:cs="David" w:eastAsia="David" w:hAnsi="David"/>
-          <w:sz w:val="20"/>
-          <w:szCs w:val="20"/>
-          <w:rtl/>
-        </w:rPr>
-        <w:t xml:space="preserve"> (נבו 31.12.2015). שם הובהר עוד כי במקרקעין שאינם מוסדרים לא ניתן לרשום זכויות קנייניות עד תום ההסדר, וכי תביעות לרישום זכויות במקרקעין המצויים בהליכי הסדר מתרכזות בידי פקיד ההסדר; וכי המחאת זכות חוזית הנוגעת למקרקעין אף אינה טעונה מסמך בכתב.</w:t>
+        <w:t xml:space="preserve">ע"א 514/76 </w:t>
+      </w:r>
+      <w:r>
+        <w:rPr>
+          <w:rFonts w:ascii="David" w:cs="David" w:eastAsia="David" w:hAnsi="David"/>
+          <w:i/>
+          <w:iCs/>
+          <w:sz w:val="20"/>
+          <w:szCs w:val="20"/>
+          <w:rtl/>
+        </w:rPr>
+        <w:t xml:space="preserve">חשש נ׳ דמארי</w:t>
+      </w:r>
+      <w:r>
+        <w:rPr>
+          <w:rFonts w:ascii="David" w:cs="David" w:eastAsia="David" w:hAnsi="David"/>
+          <w:sz w:val="20"/>
+          <w:szCs w:val="20"/>
+          <w:rtl/>
+        </w:rPr>
+        <w:t xml:space="preserve">, פ"ד לא(2) 505 (1977). הקביעה חשובה במיוחד ליישובים שבהם ההחזקה נסמכת על הסכמי פיתוח והרשאות של רשות מקרקעי ישראל: בגדרם, ההעברות הפנים-משפחתיות כולן פועלות במישור האובליגטורי – ומחוץ לדרישת הכתב.</w:t>
       </w:r>
     </w:p>
   </w:footnote>
@@ -10850,25 +10922,27 @@
           <w:szCs w:val="20"/>
           <w:rtl/>
         </w:rPr>
-        <w:t xml:space="preserve">בע"מ 7496/19, </w:t>
-      </w:r>
-      <w:r>
-        <w:rPr>
-          <w:rFonts w:ascii="David" w:cs="David" w:eastAsia="David" w:hAnsi="David"/>
-          <w:sz w:val="20"/>
-          <w:szCs w:val="20"/>
-          <w:rtl/>
-        </w:rPr>
-        <w:t xml:space="preserve">לעיל ה"ש 50</w:t>
-      </w:r>
-      <w:r>
-        <w:rPr>
-          <w:rFonts w:ascii="David" w:cs="David" w:eastAsia="David" w:hAnsi="David"/>
-          <w:sz w:val="20"/>
-          <w:szCs w:val="20"/>
-          <w:rtl/>
-        </w:rPr>
-        <w:t xml:space="preserve">.</w:t>
+        <w:t xml:space="preserve">רע"א 4890/15 </w:t>
+      </w:r>
+      <w:r>
+        <w:rPr>
+          <w:rFonts w:ascii="David" w:cs="David" w:eastAsia="David" w:hAnsi="David"/>
+          <w:i/>
+          <w:iCs/>
+          <w:sz w:val="20"/>
+          <w:szCs w:val="20"/>
+          <w:rtl/>
+        </w:rPr>
+        <w:t xml:space="preserve">אלוש נ׳ עיריית טבריה</w:t>
+      </w:r>
+      <w:r>
+        <w:rPr>
+          <w:rFonts w:ascii="David" w:cs="David" w:eastAsia="David" w:hAnsi="David"/>
+          <w:sz w:val="20"/>
+          <w:szCs w:val="20"/>
+          <w:rtl/>
+        </w:rPr>
+        <w:t xml:space="preserve"> (נבו 31.12.2015). שם הובהר עוד כי במקרקעין שאינם מוסדרים לא ניתן לרשום זכויות קנייניות עד תום ההסדר, וכי תביעות לרישום זכויות במקרקעין המצויים בהליכי הסדר מתרכזות בידי פקיד ההסדר; וכי המחאת זכות חוזית הנוגעת למקרקעין אף אינה טעונה מסמך בכתב.</w:t>
       </w:r>
     </w:p>
   </w:footnote>
@@ -10891,34 +10965,16 @@
           <w:szCs w:val="20"/>
           <w:rtl/>
         </w:rPr>
-        <w:t xml:space="preserve">לביקורת עקרונית על אי-הוודאות הנובעת משסתומי יושר ותום לב בדיני הקניין השוו רייכמן, </w:t>
-      </w:r>
-      <w:r>
-        <w:rPr>
-          <w:rFonts w:ascii="David" w:cs="David" w:eastAsia="David" w:hAnsi="David"/>
-          <w:sz w:val="20"/>
-          <w:szCs w:val="20"/>
-          <w:rtl/>
-        </w:rPr>
-        <w:t xml:space="preserve">לעיל ה"ש 9</w:t>
-      </w:r>
-      <w:r>
-        <w:rPr>
-          <w:rFonts w:ascii="David" w:cs="David" w:eastAsia="David" w:hAnsi="David"/>
-          <w:sz w:val="20"/>
-          <w:szCs w:val="20"/>
-          <w:rtl/>
-        </w:rPr>
-        <w:t xml:space="preserve">, בעמ׳ 297 ואילך; וכהן, </w:t>
-      </w:r>
-      <w:r>
-        <w:rPr>
-          <w:rFonts w:ascii="David" w:cs="David" w:eastAsia="David" w:hAnsi="David"/>
-          <w:sz w:val="20"/>
-          <w:szCs w:val="20"/>
-          <w:rtl/>
-        </w:rPr>
-        <w:t xml:space="preserve">לעיל ה"ש 35</w:t>
+        <w:t xml:space="preserve">בע"מ 7496/19, </w:t>
+      </w:r>
+      <w:r>
+        <w:rPr>
+          <w:rFonts w:ascii="David" w:cs="David" w:eastAsia="David" w:hAnsi="David"/>
+          <w:sz w:val="20"/>
+          <w:szCs w:val="20"/>
+          <w:rtl/>
+        </w:rPr>
+        <w:t xml:space="preserve">לעיל ה"ש 50</w:t>
       </w:r>
       <w:r>
         <w:rPr>
@@ -10950,7 +11006,43 @@
           <w:szCs w:val="20"/>
           <w:rtl/>
         </w:rPr>
-        <w:t xml:space="preserve">תק׳ 36–38 לתקנות התכנון והבניה (רישוי בניה), התשע"ו-2016; וקודם לכן תק׳ 2א לתקנות התכנון והבניה (בקשה להיתר, תנאיו ואגרות), התש"ל-1970. ההלכה חזרה והדגישה כי מוסדות התכנון אינם מכריעים בסכסוכי קניין.</w:t>
+        <w:t xml:space="preserve">לביקורת עקרונית על אי-הוודאות הנובעת משסתומי יושר ותום לב בדיני הקניין השוו רייכמן, </w:t>
+      </w:r>
+      <w:r>
+        <w:rPr>
+          <w:rFonts w:ascii="David" w:cs="David" w:eastAsia="David" w:hAnsi="David"/>
+          <w:sz w:val="20"/>
+          <w:szCs w:val="20"/>
+          <w:rtl/>
+        </w:rPr>
+        <w:t xml:space="preserve">לעיל ה"ש 9</w:t>
+      </w:r>
+      <w:r>
+        <w:rPr>
+          <w:rFonts w:ascii="David" w:cs="David" w:eastAsia="David" w:hAnsi="David"/>
+          <w:sz w:val="20"/>
+          <w:szCs w:val="20"/>
+          <w:rtl/>
+        </w:rPr>
+        <w:t xml:space="preserve">, בעמ׳ 297 ואילך; וכהן, </w:t>
+      </w:r>
+      <w:r>
+        <w:rPr>
+          <w:rFonts w:ascii="David" w:cs="David" w:eastAsia="David" w:hAnsi="David"/>
+          <w:sz w:val="20"/>
+          <w:szCs w:val="20"/>
+          <w:rtl/>
+        </w:rPr>
+        <w:t xml:space="preserve">לעיל ה"ש 35</w:t>
+      </w:r>
+      <w:r>
+        <w:rPr>
+          <w:rFonts w:ascii="David" w:cs="David" w:eastAsia="David" w:hAnsi="David"/>
+          <w:sz w:val="20"/>
+          <w:szCs w:val="20"/>
+          <w:rtl/>
+        </w:rPr>
+        <w:t xml:space="preserve">.</w:t>
       </w:r>
     </w:p>
   </w:footnote>
@@ -10973,63 +11065,7 @@
           <w:szCs w:val="20"/>
           <w:rtl/>
         </w:rPr>
-        <w:t xml:space="preserve">ראו פסיקת ערכאות המשפחה שנסקרה לעיל, </w:t>
-      </w:r>
-      <w:r>
-        <w:rPr>
-          <w:rFonts w:ascii="David" w:cs="David" w:eastAsia="David" w:hAnsi="David"/>
-          <w:sz w:val="20"/>
-          <w:szCs w:val="20"/>
-          <w:rtl/>
-        </w:rPr>
-        <w:t xml:space="preserve">לעיל ה"ש 52</w:t>
-      </w:r>
-      <w:r>
-        <w:rPr>
-          <w:rFonts w:ascii="David" w:cs="David" w:eastAsia="David" w:hAnsi="David"/>
-          <w:sz w:val="20"/>
-          <w:szCs w:val="20"/>
-          <w:rtl/>
-        </w:rPr>
-        <w:t xml:space="preserve">; ולמשקל ההשקעה והבנייה בהסכמה ראו עניין </w:t>
-      </w:r>
-      <w:r>
-        <w:rPr>
-          <w:rFonts w:ascii="David" w:cs="David" w:eastAsia="David" w:hAnsi="David"/>
-          <w:i/>
-          <w:iCs/>
-          <w:sz w:val="20"/>
-          <w:szCs w:val="20"/>
-          <w:rtl/>
-        </w:rPr>
-        <w:t xml:space="preserve">ג׳בראן</w:t>
-      </w:r>
-      <w:r>
-        <w:rPr>
-          <w:rFonts w:ascii="David" w:cs="David" w:eastAsia="David" w:hAnsi="David"/>
-          <w:sz w:val="20"/>
-          <w:szCs w:val="20"/>
-          <w:rtl/>
-        </w:rPr>
-        <w:t xml:space="preserve">, </w:t>
-      </w:r>
-      <w:r>
-        <w:rPr>
-          <w:rFonts w:ascii="David" w:cs="David" w:eastAsia="David" w:hAnsi="David"/>
-          <w:sz w:val="20"/>
-          <w:szCs w:val="20"/>
-          <w:rtl/>
-        </w:rPr>
-        <w:t xml:space="preserve">לעיל ה"ש 45</w:t>
-      </w:r>
-      <w:r>
-        <w:rPr>
-          <w:rFonts w:ascii="David" w:cs="David" w:eastAsia="David" w:hAnsi="David"/>
-          <w:sz w:val="20"/>
-          <w:szCs w:val="20"/>
-          <w:rtl/>
-        </w:rPr>
-        <w:t xml:space="preserve">.</w:t>
+        <w:t xml:space="preserve">תק׳ 36–38 לתקנות התכנון והבניה (רישוי בניה), התשע"ו-2016; וקודם לכן תק׳ 2א לתקנות התכנון והבניה (בקשה להיתר, תנאיו ואגרות), התש"ל-1970. ההלכה חזרה והדגישה כי מוסדות התכנון אינם מכריעים בסכסוכי קניין.</w:t>
       </w:r>
     </w:p>
   </w:footnote>
@@ -11052,18 +11088,36 @@
           <w:szCs w:val="20"/>
           <w:rtl/>
         </w:rPr>
-        <w:t xml:space="preserve">עניין </w:t>
-      </w:r>
-      <w:r>
-        <w:rPr>
-          <w:rFonts w:ascii="David" w:cs="David" w:eastAsia="David" w:hAnsi="David"/>
-          <w:i/>
-          <w:iCs/>
-          <w:sz w:val="20"/>
-          <w:szCs w:val="20"/>
-          <w:rtl/>
-        </w:rPr>
-        <w:t xml:space="preserve">אבו ג׳נימה</w:t>
+        <w:t xml:space="preserve">ראו פסיקת ערכאות המשפחה שנסקרה לעיל, </w:t>
+      </w:r>
+      <w:r>
+        <w:rPr>
+          <w:rFonts w:ascii="David" w:cs="David" w:eastAsia="David" w:hAnsi="David"/>
+          <w:sz w:val="20"/>
+          <w:szCs w:val="20"/>
+          <w:rtl/>
+        </w:rPr>
+        <w:t xml:space="preserve">לעיל ה"ש 52</w:t>
+      </w:r>
+      <w:r>
+        <w:rPr>
+          <w:rFonts w:ascii="David" w:cs="David" w:eastAsia="David" w:hAnsi="David"/>
+          <w:sz w:val="20"/>
+          <w:szCs w:val="20"/>
+          <w:rtl/>
+        </w:rPr>
+        <w:t xml:space="preserve">; ולמשקל ההשקעה והבנייה בהסכמה ראו עניין </w:t>
+      </w:r>
+      <w:r>
+        <w:rPr>
+          <w:rFonts w:ascii="David" w:cs="David" w:eastAsia="David" w:hAnsi="David"/>
+          <w:i/>
+          <w:iCs/>
+          <w:sz w:val="20"/>
+          <w:szCs w:val="20"/>
+          <w:rtl/>
+        </w:rPr>
+        <w:t xml:space="preserve">ג׳בראן</w:t>
       </w:r>
       <w:r>
         <w:rPr>
@@ -11081,7 +11135,7 @@
           <w:szCs w:val="20"/>
           <w:rtl/>
         </w:rPr>
-        <w:t xml:space="preserve">לעיל ה"ש 37</w:t>
+        <w:t xml:space="preserve">לעיל ה"ש 45</w:t>
       </w:r>
       <w:r>
         <w:rPr>
@@ -11113,7 +11167,45 @@
           <w:szCs w:val="20"/>
           <w:rtl/>
         </w:rPr>
-        <w:t xml:space="preserve">ס׳ 269 ו-326 לפקודת העיריות [נוסח חדש]. שוכר, בר-רשות ואף פולש עשויים להירשם כמחזיקים לצורכי ארנונה.</w:t>
+        <w:t xml:space="preserve">עניין </w:t>
+      </w:r>
+      <w:r>
+        <w:rPr>
+          <w:rFonts w:ascii="David" w:cs="David" w:eastAsia="David" w:hAnsi="David"/>
+          <w:i/>
+          <w:iCs/>
+          <w:sz w:val="20"/>
+          <w:szCs w:val="20"/>
+          <w:rtl/>
+        </w:rPr>
+        <w:t xml:space="preserve">אבו ג׳נימה</w:t>
+      </w:r>
+      <w:r>
+        <w:rPr>
+          <w:rFonts w:ascii="David" w:cs="David" w:eastAsia="David" w:hAnsi="David"/>
+          <w:sz w:val="20"/>
+          <w:szCs w:val="20"/>
+          <w:rtl/>
+        </w:rPr>
+        <w:t xml:space="preserve">, </w:t>
+      </w:r>
+      <w:r>
+        <w:rPr>
+          <w:rFonts w:ascii="David" w:cs="David" w:eastAsia="David" w:hAnsi="David"/>
+          <w:sz w:val="20"/>
+          <w:szCs w:val="20"/>
+          <w:rtl/>
+        </w:rPr>
+        <w:t xml:space="preserve">לעיל ה"ש 37</w:t>
+      </w:r>
+      <w:r>
+        <w:rPr>
+          <w:rFonts w:ascii="David" w:cs="David" w:eastAsia="David" w:hAnsi="David"/>
+          <w:sz w:val="20"/>
+          <w:szCs w:val="20"/>
+          <w:rtl/>
+        </w:rPr>
+        <w:t xml:space="preserve">.</w:t>
       </w:r>
     </w:p>
   </w:footnote>
@@ -11136,83 +11228,7 @@
           <w:szCs w:val="20"/>
           <w:rtl/>
         </w:rPr>
-        <w:t xml:space="preserve">ראו עניין </w:t>
-      </w:r>
-      <w:r>
-        <w:rPr>
-          <w:rFonts w:ascii="David" w:cs="David" w:eastAsia="David" w:hAnsi="David"/>
-          <w:i/>
-          <w:iCs/>
-          <w:sz w:val="20"/>
-          <w:szCs w:val="20"/>
-          <w:rtl/>
-        </w:rPr>
-        <w:t xml:space="preserve">נאטור</w:t>
-      </w:r>
-      <w:r>
-        <w:rPr>
-          <w:rFonts w:ascii="David" w:cs="David" w:eastAsia="David" w:hAnsi="David"/>
-          <w:sz w:val="20"/>
-          <w:szCs w:val="20"/>
-          <w:rtl/>
-        </w:rPr>
-        <w:t xml:space="preserve">, </w:t>
-      </w:r>
-      <w:r>
-        <w:rPr>
-          <w:rFonts w:ascii="David" w:cs="David" w:eastAsia="David" w:hAnsi="David"/>
-          <w:sz w:val="20"/>
-          <w:szCs w:val="20"/>
-          <w:rtl/>
-        </w:rPr>
-        <w:t xml:space="preserve">לעיל ה"ש 26</w:t>
-      </w:r>
-      <w:r>
-        <w:rPr>
-          <w:rFonts w:ascii="David" w:cs="David" w:eastAsia="David" w:hAnsi="David"/>
-          <w:sz w:val="20"/>
-          <w:szCs w:val="20"/>
-          <w:rtl/>
-        </w:rPr>
-        <w:t xml:space="preserve">; עניין </w:t>
-      </w:r>
-      <w:r>
-        <w:rPr>
-          <w:rFonts w:ascii="David" w:cs="David" w:eastAsia="David" w:hAnsi="David"/>
-          <w:i/>
-          <w:iCs/>
-          <w:sz w:val="20"/>
-          <w:szCs w:val="20"/>
-          <w:rtl/>
-        </w:rPr>
-        <w:t xml:space="preserve">אבו ליל</w:t>
-      </w:r>
-      <w:r>
-        <w:rPr>
-          <w:rFonts w:ascii="David" w:cs="David" w:eastAsia="David" w:hAnsi="David"/>
-          <w:sz w:val="20"/>
-          <w:szCs w:val="20"/>
-          <w:rtl/>
-        </w:rPr>
-        <w:t xml:space="preserve">, </w:t>
-      </w:r>
-      <w:r>
-        <w:rPr>
-          <w:rFonts w:ascii="David" w:cs="David" w:eastAsia="David" w:hAnsi="David"/>
-          <w:sz w:val="20"/>
-          <w:szCs w:val="20"/>
-          <w:rtl/>
-        </w:rPr>
-        <w:t xml:space="preserve">לעיל ה"ש 29</w:t>
-      </w:r>
-      <w:r>
-        <w:rPr>
-          <w:rFonts w:ascii="David" w:cs="David" w:eastAsia="David" w:hAnsi="David"/>
-          <w:sz w:val="20"/>
-          <w:szCs w:val="20"/>
-          <w:rtl/>
-        </w:rPr>
-        <w:t xml:space="preserve">.</w:t>
+        <w:t xml:space="preserve">ס׳ 269 ו-326 לפקודת העיריות [נוסח חדש]. שוכר, בר-רשות ואף פולש עשויים להירשם כמחזיקים לצורכי ארנונה.</w:t>
       </w:r>
     </w:p>
   </w:footnote>
@@ -11235,47 +11251,83 @@
           <w:szCs w:val="20"/>
           <w:rtl/>
         </w:rPr>
-        <w:t xml:space="preserve">ס׳ 54(4) לפקודת הראיות [נוסח חדש], התשל"א-1971. ליישום מובהק ראו ה"פ (מחוזי י-ם) 48783-04-18 </w:t>
-      </w:r>
-      <w:r>
-        <w:rPr>
-          <w:rFonts w:ascii="David" w:cs="David" w:eastAsia="David" w:hAnsi="David"/>
-          <w:i/>
-          <w:iCs/>
-          <w:sz w:val="20"/>
-          <w:szCs w:val="20"/>
-          <w:rtl/>
-        </w:rPr>
-        <w:t xml:space="preserve">הוך נ׳ בריכטא</w:t>
-      </w:r>
-      <w:r>
-        <w:rPr>
-          <w:rFonts w:ascii="David" w:cs="David" w:eastAsia="David" w:hAnsi="David"/>
-          <w:sz w:val="20"/>
-          <w:szCs w:val="20"/>
-          <w:rtl/>
-        </w:rPr>
-        <w:t xml:space="preserve"> (נבו 4.5.2020): תביעה משפחתית להצהרה על זכויות מכוח מתנה נטענת נדחתה, משנקבע כי בתביעה נגד עיזבון, שהוגשה שנים רבות לאחר ההעברה הנטענת, מוטל נטל שכנוע כבד – והוא לא הורם נוכח שינויי הגרסה (ממתנה לתמורה) וההימנעות מרישום המתנה בחיי הנותן, הימנעות ששללה מן היורשים את האפשרות לברר את הטענות. על פסק הדין הוגש ערעור, שבגדרו ניתן צו מניעה זמני האוסר דיספוזיציה בנכס: ע"א 4116/20 </w:t>
-      </w:r>
-      <w:r>
-        <w:rPr>
-          <w:rFonts w:ascii="David" w:cs="David" w:eastAsia="David" w:hAnsi="David"/>
-          <w:i/>
-          <w:iCs/>
-          <w:sz w:val="20"/>
-          <w:szCs w:val="20"/>
-          <w:rtl/>
-        </w:rPr>
-        <w:t xml:space="preserve">הוך נ׳ בריכטא</w:t>
-      </w:r>
-      <w:r>
-        <w:rPr>
-          <w:rFonts w:ascii="David" w:cs="David" w:eastAsia="David" w:hAnsi="David"/>
-          <w:sz w:val="20"/>
-          <w:szCs w:val="20"/>
-          <w:rtl/>
-        </w:rPr>
-        <w:t xml:space="preserve"> (החלטה, נבו 17.9.2020).</w:t>
+        <w:t xml:space="preserve">ראו עניין </w:t>
+      </w:r>
+      <w:r>
+        <w:rPr>
+          <w:rFonts w:ascii="David" w:cs="David" w:eastAsia="David" w:hAnsi="David"/>
+          <w:i/>
+          <w:iCs/>
+          <w:sz w:val="20"/>
+          <w:szCs w:val="20"/>
+          <w:rtl/>
+        </w:rPr>
+        <w:t xml:space="preserve">נאטור</w:t>
+      </w:r>
+      <w:r>
+        <w:rPr>
+          <w:rFonts w:ascii="David" w:cs="David" w:eastAsia="David" w:hAnsi="David"/>
+          <w:sz w:val="20"/>
+          <w:szCs w:val="20"/>
+          <w:rtl/>
+        </w:rPr>
+        <w:t xml:space="preserve">, </w:t>
+      </w:r>
+      <w:r>
+        <w:rPr>
+          <w:rFonts w:ascii="David" w:cs="David" w:eastAsia="David" w:hAnsi="David"/>
+          <w:sz w:val="20"/>
+          <w:szCs w:val="20"/>
+          <w:rtl/>
+        </w:rPr>
+        <w:t xml:space="preserve">לעיל ה"ש 26</w:t>
+      </w:r>
+      <w:r>
+        <w:rPr>
+          <w:rFonts w:ascii="David" w:cs="David" w:eastAsia="David" w:hAnsi="David"/>
+          <w:sz w:val="20"/>
+          <w:szCs w:val="20"/>
+          <w:rtl/>
+        </w:rPr>
+        <w:t xml:space="preserve">; עניין </w:t>
+      </w:r>
+      <w:r>
+        <w:rPr>
+          <w:rFonts w:ascii="David" w:cs="David" w:eastAsia="David" w:hAnsi="David"/>
+          <w:i/>
+          <w:iCs/>
+          <w:sz w:val="20"/>
+          <w:szCs w:val="20"/>
+          <w:rtl/>
+        </w:rPr>
+        <w:t xml:space="preserve">אבו ליל</w:t>
+      </w:r>
+      <w:r>
+        <w:rPr>
+          <w:rFonts w:ascii="David" w:cs="David" w:eastAsia="David" w:hAnsi="David"/>
+          <w:sz w:val="20"/>
+          <w:szCs w:val="20"/>
+          <w:rtl/>
+        </w:rPr>
+        <w:t xml:space="preserve">, </w:t>
+      </w:r>
+      <w:r>
+        <w:rPr>
+          <w:rFonts w:ascii="David" w:cs="David" w:eastAsia="David" w:hAnsi="David"/>
+          <w:sz w:val="20"/>
+          <w:szCs w:val="20"/>
+          <w:rtl/>
+        </w:rPr>
+        <w:t xml:space="preserve">לעיל ה"ש 29</w:t>
+      </w:r>
+      <w:r>
+        <w:rPr>
+          <w:rFonts w:ascii="David" w:cs="David" w:eastAsia="David" w:hAnsi="David"/>
+          <w:sz w:val="20"/>
+          <w:szCs w:val="20"/>
+          <w:rtl/>
+        </w:rPr>
+        <w:t xml:space="preserve">.</w:t>
       </w:r>
     </w:p>
   </w:footnote>
@@ -11298,37 +11350,47 @@
           <w:szCs w:val="20"/>
           <w:rtl/>
         </w:rPr>
-        <w:t xml:space="preserve">רע"א 7060/12 </w:t>
-      </w:r>
-      <w:r>
-        <w:rPr>
-          <w:rFonts w:ascii="David" w:cs="David" w:eastAsia="David" w:hAnsi="David"/>
-          <w:i/>
-          <w:iCs/>
-          <w:sz w:val="20"/>
-          <w:szCs w:val="20"/>
-          <w:rtl/>
-        </w:rPr>
-        <w:t xml:space="preserve">מדינת ישראל נ׳ </w:t>
-      </w:r>
-      <w:r>
-        <w:rPr>
-          <w:rFonts w:ascii="Times New Roman" w:cs="Times New Roman" w:eastAsia="Times New Roman" w:hAnsi="Times New Roman"/>
-          <w:i/>
-          <w:iCs/>
-          <w:sz w:val="20"/>
-          <w:szCs w:val="20"/>
-        </w:rPr>
-        <w:t xml:space="preserve">United Israel Appeal Inc</w:t>
-      </w:r>
-      <w:r>
-        <w:rPr>
-          <w:rFonts w:ascii="David" w:cs="David" w:eastAsia="David" w:hAnsi="David"/>
-          <w:sz w:val="20"/>
-          <w:szCs w:val="20"/>
-          <w:rtl/>
-        </w:rPr>
-        <w:t xml:space="preserve"> (נבו 30.4.2015).</w:t>
+        <w:t xml:space="preserve">ס׳ 54(4) לפקודת הראיות [נוסח חדש], התשל"א-1971. ליישום מובהק ראו ה"פ (מחוזי י-ם) 48783-04-18 </w:t>
+      </w:r>
+      <w:r>
+        <w:rPr>
+          <w:rFonts w:ascii="David" w:cs="David" w:eastAsia="David" w:hAnsi="David"/>
+          <w:i/>
+          <w:iCs/>
+          <w:sz w:val="20"/>
+          <w:szCs w:val="20"/>
+          <w:rtl/>
+        </w:rPr>
+        <w:t xml:space="preserve">הוך נ׳ בריכטא</w:t>
+      </w:r>
+      <w:r>
+        <w:rPr>
+          <w:rFonts w:ascii="David" w:cs="David" w:eastAsia="David" w:hAnsi="David"/>
+          <w:sz w:val="20"/>
+          <w:szCs w:val="20"/>
+          <w:rtl/>
+        </w:rPr>
+        <w:t xml:space="preserve"> (נבו 4.5.2020): תביעה משפחתית להצהרה על זכויות מכוח מתנה נטענת נדחתה, משנקבע כי בתביעה נגד עיזבון, שהוגשה שנים רבות לאחר ההעברה הנטענת, מוטל נטל שכנוע כבד – והוא לא הורם נוכח שינויי הגרסה (ממתנה לתמורה) וההימנעות מרישום המתנה בחיי הנותן, הימנעות ששללה מן היורשים את האפשרות לברר את הטענות. על פסק הדין הוגש ערעור, שבגדרו ניתן צו מניעה זמני האוסר דיספוזיציה בנכס: ע"א 4116/20 </w:t>
+      </w:r>
+      <w:r>
+        <w:rPr>
+          <w:rFonts w:ascii="David" w:cs="David" w:eastAsia="David" w:hAnsi="David"/>
+          <w:i/>
+          <w:iCs/>
+          <w:sz w:val="20"/>
+          <w:szCs w:val="20"/>
+          <w:rtl/>
+        </w:rPr>
+        <w:t xml:space="preserve">הוך נ׳ בריכטא</w:t>
+      </w:r>
+      <w:r>
+        <w:rPr>
+          <w:rFonts w:ascii="David" w:cs="David" w:eastAsia="David" w:hAnsi="David"/>
+          <w:sz w:val="20"/>
+          <w:szCs w:val="20"/>
+          <w:rtl/>
+        </w:rPr>
+        <w:t xml:space="preserve"> (החלטה, נבו 17.9.2020).</w:t>
       </w:r>
     </w:p>
   </w:footnote>
@@ -11351,27 +11413,37 @@
           <w:szCs w:val="20"/>
           <w:rtl/>
         </w:rPr>
-        <w:t xml:space="preserve">ס׳ 16(א) לחוק מיסוי מקרקעין (שבח ורכישה), התשכ"ג-1963 (להלן: חוק מיסוי מקרקעין). לניתוח מקיף של הסעיף ראו אבי גורמן ושי אהרונוביץ׳ </w:t>
-      </w:r>
-      <w:r>
-        <w:rPr>
-          <w:rFonts w:ascii="David" w:cs="David" w:eastAsia="David" w:hAnsi="David"/>
-          <w:i/>
-          <w:iCs/>
-          <w:sz w:val="20"/>
-          <w:szCs w:val="20"/>
-          <w:rtl/>
-        </w:rPr>
-        <w:t xml:space="preserve">מיסוי מקרקעין – פרשנות, הלכה ומעשה</w:t>
-      </w:r>
-      <w:r>
-        <w:rPr>
-          <w:rFonts w:ascii="David" w:cs="David" w:eastAsia="David" w:hAnsi="David"/>
-          <w:sz w:val="20"/>
-          <w:szCs w:val="20"/>
-          <w:rtl/>
-        </w:rPr>
-        <w:t xml:space="preserve"> 278–293 (2017) (להלן: גורמן ואהרונוביץ׳).</w:t>
+        <w:t xml:space="preserve">רע"א 7060/12 </w:t>
+      </w:r>
+      <w:r>
+        <w:rPr>
+          <w:rFonts w:ascii="David" w:cs="David" w:eastAsia="David" w:hAnsi="David"/>
+          <w:i/>
+          <w:iCs/>
+          <w:sz w:val="20"/>
+          <w:szCs w:val="20"/>
+          <w:rtl/>
+        </w:rPr>
+        <w:t xml:space="preserve">מדינת ישראל נ׳ </w:t>
+      </w:r>
+      <w:r>
+        <w:rPr>
+          <w:rFonts w:ascii="Times New Roman" w:cs="Times New Roman" w:eastAsia="Times New Roman" w:hAnsi="Times New Roman"/>
+          <w:i/>
+          <w:iCs/>
+          <w:sz w:val="20"/>
+          <w:szCs w:val="20"/>
+        </w:rPr>
+        <w:t xml:space="preserve">United Israel Appeal Inc</w:t>
+      </w:r>
+      <w:r>
+        <w:rPr>
+          <w:rFonts w:ascii="David" w:cs="David" w:eastAsia="David" w:hAnsi="David"/>
+          <w:sz w:val="20"/>
+          <w:szCs w:val="20"/>
+          <w:rtl/>
+        </w:rPr>
+        <w:t xml:space="preserve"> (נבו 30.4.2015).</w:t>
       </w:r>
     </w:p>
   </w:footnote>
@@ -11394,25 +11466,27 @@
           <w:szCs w:val="20"/>
           <w:rtl/>
         </w:rPr>
-        <w:t xml:space="preserve">גורמן ואהרונוביץ׳, </w:t>
-      </w:r>
-      <w:r>
-        <w:rPr>
-          <w:rFonts w:ascii="David" w:cs="David" w:eastAsia="David" w:hAnsi="David"/>
-          <w:sz w:val="20"/>
-          <w:szCs w:val="20"/>
-          <w:rtl/>
-        </w:rPr>
-        <w:t xml:space="preserve">לעיל ה"ש 66</w:t>
-      </w:r>
-      <w:r>
-        <w:rPr>
-          <w:rFonts w:ascii="David" w:cs="David" w:eastAsia="David" w:hAnsi="David"/>
-          <w:sz w:val="20"/>
-          <w:szCs w:val="20"/>
-          <w:rtl/>
-        </w:rPr>
-        <w:t xml:space="preserve">, בעמ׳ 282.</w:t>
+        <w:t xml:space="preserve">ס׳ 16(א) לחוק מיסוי מקרקעין (שבח ורכישה), התשכ"ג-1963 (להלן: חוק מיסוי מקרקעין). לניתוח מקיף של הסעיף ראו אבי גורמן ושי אהרונוביץ׳ </w:t>
+      </w:r>
+      <w:r>
+        <w:rPr>
+          <w:rFonts w:ascii="David" w:cs="David" w:eastAsia="David" w:hAnsi="David"/>
+          <w:i/>
+          <w:iCs/>
+          <w:sz w:val="20"/>
+          <w:szCs w:val="20"/>
+          <w:rtl/>
+        </w:rPr>
+        <w:t xml:space="preserve">מיסוי מקרקעין – פרשנות, הלכה ומעשה</w:t>
+      </w:r>
+      <w:r>
+        <w:rPr>
+          <w:rFonts w:ascii="David" w:cs="David" w:eastAsia="David" w:hAnsi="David"/>
+          <w:sz w:val="20"/>
+          <w:szCs w:val="20"/>
+          <w:rtl/>
+        </w:rPr>
+        <w:t xml:space="preserve"> 278–293 (2017) (להלן: גורמן ואהרונוביץ׳).</w:t>
       </w:r>
     </w:p>
   </w:footnote>
@@ -11435,7 +11509,25 @@
           <w:szCs w:val="20"/>
           <w:rtl/>
         </w:rPr>
-        <w:t xml:space="preserve">ס׳ 16(ב) לחוק מיסוי מקרקעין. המחוקק זיהה כבר בשנות השישים את ייפוי הכוח כמסלול עוקף-דיווח, וביקש ללכוד גם אותו ברשת ההצהרה.</w:t>
+        <w:t xml:space="preserve">גורמן ואהרונוביץ׳, </w:t>
+      </w:r>
+      <w:r>
+        <w:rPr>
+          <w:rFonts w:ascii="David" w:cs="David" w:eastAsia="David" w:hAnsi="David"/>
+          <w:sz w:val="20"/>
+          <w:szCs w:val="20"/>
+          <w:rtl/>
+        </w:rPr>
+        <w:t xml:space="preserve">לעיל ה"ש 67</w:t>
+      </w:r>
+      <w:r>
+        <w:rPr>
+          <w:rFonts w:ascii="David" w:cs="David" w:eastAsia="David" w:hAnsi="David"/>
+          <w:sz w:val="20"/>
+          <w:szCs w:val="20"/>
+          <w:rtl/>
+        </w:rPr>
+        <w:t xml:space="preserve">, בעמ׳ 282.</w:t>
       </w:r>
     </w:p>
   </w:footnote>
@@ -11458,7 +11550,7 @@
           <w:szCs w:val="20"/>
           <w:rtl/>
         </w:rPr>
-        <w:t xml:space="preserve">ס׳ 73 לחוק מיסוי מקרקעין.</w:t>
+        <w:t xml:space="preserve">ס׳ 16(ב) לחוק מיסוי מקרקעין. המחוקק זיהה כבר בשנות השישים את ייפוי הכוח כמסלול עוקף-דיווח, וביקש ללכוד גם אותו ברשת ההצהרה.</w:t>
       </w:r>
     </w:p>
   </w:footnote>
@@ -11481,7 +11573,7 @@
           <w:szCs w:val="20"/>
           <w:rtl/>
         </w:rPr>
-        <w:t xml:space="preserve">ס׳ 324(א) לפקודת העיריות [נוסח חדש]; ולעניין היטל השבחה – ס׳ 10 לתוספת השלישית לחוק התכנון והבנייה, התשכ"ה-1965.</w:t>
+        <w:t xml:space="preserve">ס׳ 73 לחוק מיסוי מקרקעין.</w:t>
       </w:r>
     </w:p>
   </w:footnote>
@@ -11504,25 +11596,7 @@
           <w:szCs w:val="20"/>
           <w:rtl/>
         </w:rPr>
-        <w:t xml:space="preserve">להגדרות "זכות במקרקעין" ו"מכירה" ראו ס׳ 1 לחוק מיסוי מקרקעין; ולמיסוי מכירת בעלות שביושר ראו גורמן ואהרונוביץ׳, </w:t>
-      </w:r>
-      <w:r>
-        <w:rPr>
-          <w:rFonts w:ascii="David" w:cs="David" w:eastAsia="David" w:hAnsi="David"/>
-          <w:sz w:val="20"/>
-          <w:szCs w:val="20"/>
-          <w:rtl/>
-        </w:rPr>
-        <w:t xml:space="preserve">לעיל ה"ש 66</w:t>
-      </w:r>
-      <w:r>
-        <w:rPr>
-          <w:rFonts w:ascii="David" w:cs="David" w:eastAsia="David" w:hAnsi="David"/>
-          <w:sz w:val="20"/>
-          <w:szCs w:val="20"/>
-          <w:rtl/>
-        </w:rPr>
-        <w:t xml:space="preserve">, בעמ׳ 151.</w:t>
+        <w:t xml:space="preserve">ס׳ 324(א) לפקודת העיריות [נוסח חדש]; ולעניין היטל השבחה – ס׳ 10 לתוספת השלישית לחוק התכנון והבנייה, התשכ"ה-1965.</w:t>
       </w:r>
     </w:p>
   </w:footnote>
@@ -11545,45 +11619,25 @@
           <w:szCs w:val="20"/>
           <w:rtl/>
         </w:rPr>
-        <w:t xml:space="preserve">ו"ע (מחוזי חי׳) 4631-12-13 </w:t>
-      </w:r>
-      <w:r>
-        <w:rPr>
-          <w:rFonts w:ascii="David" w:cs="David" w:eastAsia="David" w:hAnsi="David"/>
-          <w:i/>
-          <w:iCs/>
-          <w:sz w:val="20"/>
-          <w:szCs w:val="20"/>
-          <w:rtl/>
-        </w:rPr>
-        <w:t xml:space="preserve">גולדברג נ׳ מנהל מיסוי מקרקעין – חדרה</w:t>
-      </w:r>
-      <w:r>
-        <w:rPr>
-          <w:rFonts w:ascii="David" w:cs="David" w:eastAsia="David" w:hAnsi="David"/>
-          <w:sz w:val="20"/>
-          <w:szCs w:val="20"/>
-          <w:rtl/>
-        </w:rPr>
-        <w:t xml:space="preserve">, מיסים כט(3) ה-320 (2015); גורמן ואהרונוביץ׳, </w:t>
-      </w:r>
-      <w:r>
-        <w:rPr>
-          <w:rFonts w:ascii="David" w:cs="David" w:eastAsia="David" w:hAnsi="David"/>
-          <w:sz w:val="20"/>
-          <w:szCs w:val="20"/>
-          <w:rtl/>
-        </w:rPr>
-        <w:t xml:space="preserve">לעיל ה"ש 66</w:t>
-      </w:r>
-      <w:r>
-        <w:rPr>
-          <w:rFonts w:ascii="David" w:cs="David" w:eastAsia="David" w:hAnsi="David"/>
-          <w:sz w:val="20"/>
-          <w:szCs w:val="20"/>
-          <w:rtl/>
-        </w:rPr>
-        <w:t xml:space="preserve">, בעמ׳ 153–154.</w:t>
+        <w:t xml:space="preserve">להגדרות "זכות במקרקעין" ו"מכירה" ראו ס׳ 1 לחוק מיסוי מקרקעין; ולמיסוי מכירת בעלות שביושר ראו גורמן ואהרונוביץ׳, </w:t>
+      </w:r>
+      <w:r>
+        <w:rPr>
+          <w:rFonts w:ascii="David" w:cs="David" w:eastAsia="David" w:hAnsi="David"/>
+          <w:sz w:val="20"/>
+          <w:szCs w:val="20"/>
+          <w:rtl/>
+        </w:rPr>
+        <w:t xml:space="preserve">לעיל ה"ש 67</w:t>
+      </w:r>
+      <w:r>
+        <w:rPr>
+          <w:rFonts w:ascii="David" w:cs="David" w:eastAsia="David" w:hAnsi="David"/>
+          <w:sz w:val="20"/>
+          <w:szCs w:val="20"/>
+          <w:rtl/>
+        </w:rPr>
+        <w:t xml:space="preserve">, בעמ׳ 151.</w:t>
       </w:r>
     </w:p>
   </w:footnote>
@@ -11606,27 +11660,45 @@
           <w:szCs w:val="20"/>
           <w:rtl/>
         </w:rPr>
-        <w:t xml:space="preserve">ס׳ 197 לחוק התכנון והבנייה, התשכ"ה-1965; אהרן נמדר </w:t>
-      </w:r>
-      <w:r>
-        <w:rPr>
-          <w:rFonts w:ascii="David" w:cs="David" w:eastAsia="David" w:hAnsi="David"/>
-          <w:i/>
-          <w:iCs/>
-          <w:sz w:val="20"/>
-          <w:szCs w:val="20"/>
-          <w:rtl/>
-        </w:rPr>
-        <w:t xml:space="preserve">פגיעה במקרקעין [פיצויים בגין נזקי תכנית]</w:t>
-      </w:r>
-      <w:r>
-        <w:rPr>
-          <w:rFonts w:ascii="David" w:cs="David" w:eastAsia="David" w:hAnsi="David"/>
-          <w:sz w:val="20"/>
-          <w:szCs w:val="20"/>
-          <w:rtl/>
-        </w:rPr>
-        <w:t xml:space="preserve"> 429–439 (תשס"ח) (הבעלים שביושר, שזכותו קדמה לחוק המקרקעין, זכאי לפיצוי אף שאינו רשום; והשוו שם לעניין ההרשאה המתחדשת כל שלוש שנים).</w:t>
+        <w:t xml:space="preserve">ו"ע (מחוזי חי׳) 4631-12-13 </w:t>
+      </w:r>
+      <w:r>
+        <w:rPr>
+          <w:rFonts w:ascii="David" w:cs="David" w:eastAsia="David" w:hAnsi="David"/>
+          <w:i/>
+          <w:iCs/>
+          <w:sz w:val="20"/>
+          <w:szCs w:val="20"/>
+          <w:rtl/>
+        </w:rPr>
+        <w:t xml:space="preserve">גולדברג נ׳ מנהל מיסוי מקרקעין – חדרה</w:t>
+      </w:r>
+      <w:r>
+        <w:rPr>
+          <w:rFonts w:ascii="David" w:cs="David" w:eastAsia="David" w:hAnsi="David"/>
+          <w:sz w:val="20"/>
+          <w:szCs w:val="20"/>
+          <w:rtl/>
+        </w:rPr>
+        <w:t xml:space="preserve">, מיסים כט(3) ה-320 (2015); גורמן ואהרונוביץ׳, </w:t>
+      </w:r>
+      <w:r>
+        <w:rPr>
+          <w:rFonts w:ascii="David" w:cs="David" w:eastAsia="David" w:hAnsi="David"/>
+          <w:sz w:val="20"/>
+          <w:szCs w:val="20"/>
+          <w:rtl/>
+        </w:rPr>
+        <w:t xml:space="preserve">לעיל ה"ש 67</w:t>
+      </w:r>
+      <w:r>
+        <w:rPr>
+          <w:rFonts w:ascii="David" w:cs="David" w:eastAsia="David" w:hAnsi="David"/>
+          <w:sz w:val="20"/>
+          <w:szCs w:val="20"/>
+          <w:rtl/>
+        </w:rPr>
+        <w:t xml:space="preserve">, בעמ׳ 153–154.</w:t>
       </w:r>
     </w:p>
   </w:footnote>
@@ -11649,25 +11721,27 @@
           <w:szCs w:val="20"/>
           <w:rtl/>
         </w:rPr>
-        <w:t xml:space="preserve">לקנסות בגין אי-הגשת הצהרה ולהפרשי הצמדה וריבית ראו פרק אחד-עשר לחוק מיסוי מקרקעין; גורמן ואהרונוביץ׳, </w:t>
-      </w:r>
-      <w:r>
-        <w:rPr>
-          <w:rFonts w:ascii="David" w:cs="David" w:eastAsia="David" w:hAnsi="David"/>
-          <w:sz w:val="20"/>
-          <w:szCs w:val="20"/>
-          <w:rtl/>
-        </w:rPr>
-        <w:t xml:space="preserve">לעיל ה"ש 66</w:t>
-      </w:r>
-      <w:r>
-        <w:rPr>
-          <w:rFonts w:ascii="David" w:cs="David" w:eastAsia="David" w:hAnsi="David"/>
-          <w:sz w:val="20"/>
-          <w:szCs w:val="20"/>
-          <w:rtl/>
-        </w:rPr>
-        <w:t xml:space="preserve">.</w:t>
+        <w:t xml:space="preserve">ס׳ 197 לחוק התכנון והבנייה, התשכ"ה-1965; אהרן נמדר </w:t>
+      </w:r>
+      <w:r>
+        <w:rPr>
+          <w:rFonts w:ascii="David" w:cs="David" w:eastAsia="David" w:hAnsi="David"/>
+          <w:i/>
+          <w:iCs/>
+          <w:sz w:val="20"/>
+          <w:szCs w:val="20"/>
+          <w:rtl/>
+        </w:rPr>
+        <w:t xml:space="preserve">פגיעה במקרקעין [פיצויים בגין נזקי תכנית]</w:t>
+      </w:r>
+      <w:r>
+        <w:rPr>
+          <w:rFonts w:ascii="David" w:cs="David" w:eastAsia="David" w:hAnsi="David"/>
+          <w:sz w:val="20"/>
+          <w:szCs w:val="20"/>
+          <w:rtl/>
+        </w:rPr>
+        <w:t xml:space="preserve"> 429–439 (תשס"ח) (הבעלים שביושר, שזכותו קדמה לחוק המקרקעין, זכאי לפיצוי אף שאינו רשום; והשוו שם לעניין ההרשאה המתחדשת כל שלוש שנים).</w:t>
       </w:r>
     </w:p>
   </w:footnote>
@@ -11690,25 +11764,25 @@
           <w:szCs w:val="20"/>
           <w:rtl/>
         </w:rPr>
-        <w:t xml:space="preserve">גורמן ואהרונוביץ׳, </w:t>
-      </w:r>
-      <w:r>
-        <w:rPr>
-          <w:rFonts w:ascii="David" w:cs="David" w:eastAsia="David" w:hAnsi="David"/>
-          <w:sz w:val="20"/>
-          <w:szCs w:val="20"/>
-          <w:rtl/>
-        </w:rPr>
-        <w:t xml:space="preserve">לעיל ה"ש 66</w:t>
-      </w:r>
-      <w:r>
-        <w:rPr>
-          <w:rFonts w:ascii="David" w:cs="David" w:eastAsia="David" w:hAnsi="David"/>
-          <w:sz w:val="20"/>
-          <w:szCs w:val="20"/>
-          <w:rtl/>
-        </w:rPr>
-        <w:t xml:space="preserve">, בעמ׳ 282–284, והפסיקה הנסקרת שם.</w:t>
+        <w:t xml:space="preserve">לקנסות בגין אי-הגשת הצהרה ולהפרשי הצמדה וריבית ראו פרק אחד-עשר לחוק מיסוי מקרקעין; גורמן ואהרונוביץ׳, </w:t>
+      </w:r>
+      <w:r>
+        <w:rPr>
+          <w:rFonts w:ascii="David" w:cs="David" w:eastAsia="David" w:hAnsi="David"/>
+          <w:sz w:val="20"/>
+          <w:szCs w:val="20"/>
+          <w:rtl/>
+        </w:rPr>
+        <w:t xml:space="preserve">לעיל ה"ש 67</w:t>
+      </w:r>
+      <w:r>
+        <w:rPr>
+          <w:rFonts w:ascii="David" w:cs="David" w:eastAsia="David" w:hAnsi="David"/>
+          <w:sz w:val="20"/>
+          <w:szCs w:val="20"/>
+          <w:rtl/>
+        </w:rPr>
+        <w:t xml:space="preserve">.</w:t>
       </w:r>
     </w:p>
   </w:footnote>
@@ -11731,7 +11805,7 @@
           <w:szCs w:val="20"/>
           <w:rtl/>
         </w:rPr>
-        <w:t xml:space="preserve">להיגיון הגבייתי של הסעיף ראו גורמן ואהרונוביץ׳, </w:t>
+        <w:t xml:space="preserve">גורמן ואהרונוביץ׳, </w:t>
       </w:r>
       <w:r>
         <w:rPr>
@@ -11749,7 +11823,7 @@
           <w:szCs w:val="20"/>
           <w:rtl/>
         </w:rPr>
-        <w:t xml:space="preserve">.</w:t>
+        <w:t xml:space="preserve">, בעמ׳ 282–284, והפסיקה הנסקרת שם.</w:t>
       </w:r>
     </w:p>
   </w:footnote>
@@ -11772,24 +11846,25 @@
           <w:szCs w:val="20"/>
           <w:rtl/>
         </w:rPr>
-        <w:t xml:space="preserve">למונח "הון מת" ראו </w:t>
-      </w:r>
-      <w:r>
-        <w:rPr>
-          <w:rFonts w:ascii="Times New Roman" w:cs="Times New Roman" w:eastAsia="Times New Roman" w:hAnsi="Times New Roman"/>
-          <w:sz w:val="20"/>
-          <w:szCs w:val="20"/>
-        </w:rPr>
-        <w:t xml:space="preserve">Hernando de Soto, The Mystery of Capital: Why Capitalism Triumphs in the West and Fails Everywhere Else (2000)</w:t>
-      </w:r>
-      <w:r>
-        <w:rPr>
-          <w:rFonts w:ascii="David" w:cs="David" w:eastAsia="David" w:hAnsi="David"/>
-          <w:sz w:val="20"/>
-          <w:szCs w:val="20"/>
-          <w:rtl/>
-        </w:rPr>
-        <w:t xml:space="preserve">. דה-סוטו פיתח את הניתוח על יסוד עבודת שדה במצרים, שבה נאמד שיעור הנכסים המוחזקים בלא רישום ביותר מ-90%; ראו להלן פרק ו.2.</w:t>
+        <w:t xml:space="preserve">להיגיון הגבייתי של הסעיף ראו גורמן ואהרונוביץ׳, </w:t>
+      </w:r>
+      <w:r>
+        <w:rPr>
+          <w:rFonts w:ascii="David" w:cs="David" w:eastAsia="David" w:hAnsi="David"/>
+          <w:sz w:val="20"/>
+          <w:szCs w:val="20"/>
+          <w:rtl/>
+        </w:rPr>
+        <w:t xml:space="preserve">לעיל ה"ש 68</w:t>
+      </w:r>
+      <w:r>
+        <w:rPr>
+          <w:rFonts w:ascii="David" w:cs="David" w:eastAsia="David" w:hAnsi="David"/>
+          <w:sz w:val="20"/>
+          <w:szCs w:val="20"/>
+          <w:rtl/>
+        </w:rPr>
+        <w:t xml:space="preserve">.</w:t>
       </w:r>
     </w:p>
   </w:footnote>
@@ -11812,45 +11887,24 @@
           <w:szCs w:val="20"/>
           <w:rtl/>
         </w:rPr>
-        <w:t xml:space="preserve">השוו עניין </w:t>
-      </w:r>
-      <w:r>
-        <w:rPr>
-          <w:rFonts w:ascii="David" w:cs="David" w:eastAsia="David" w:hAnsi="David"/>
-          <w:i/>
-          <w:iCs/>
-          <w:sz w:val="20"/>
-          <w:szCs w:val="20"/>
-          <w:rtl/>
-        </w:rPr>
-        <w:t xml:space="preserve">צימבלר</w:t>
-      </w:r>
-      <w:r>
-        <w:rPr>
-          <w:rFonts w:ascii="David" w:cs="David" w:eastAsia="David" w:hAnsi="David"/>
-          <w:sz w:val="20"/>
-          <w:szCs w:val="20"/>
-          <w:rtl/>
-        </w:rPr>
-        <w:t xml:space="preserve">, </w:t>
-      </w:r>
-      <w:r>
-        <w:rPr>
-          <w:rFonts w:ascii="David" w:cs="David" w:eastAsia="David" w:hAnsi="David"/>
-          <w:sz w:val="20"/>
-          <w:szCs w:val="20"/>
-          <w:rtl/>
-        </w:rPr>
-        <w:t xml:space="preserve">לעיל ה"ש 33</w:t>
-      </w:r>
-      <w:r>
-        <w:rPr>
-          <w:rFonts w:ascii="David" w:cs="David" w:eastAsia="David" w:hAnsi="David"/>
-          <w:sz w:val="20"/>
-          <w:szCs w:val="20"/>
-          <w:rtl/>
-        </w:rPr>
-        <w:t xml:space="preserve">, שבו לא נזקפה ההתנהלות הבלתי פורמלית רבת-השנים לחובת הרוכשת.</w:t>
+        <w:t xml:space="preserve">למונח "הון מת" ראו </w:t>
+      </w:r>
+      <w:r>
+        <w:rPr>
+          <w:rFonts w:ascii="Times New Roman" w:cs="Times New Roman" w:eastAsia="Times New Roman" w:hAnsi="Times New Roman"/>
+          <w:sz w:val="20"/>
+          <w:szCs w:val="20"/>
+        </w:rPr>
+        <w:t xml:space="preserve">Hernando de Soto, The Mystery of Capital: Why Capitalism Triumphs in the West and Fails Everywhere Else (2000)</w:t>
+      </w:r>
+      <w:r>
+        <w:rPr>
+          <w:rFonts w:ascii="David" w:cs="David" w:eastAsia="David" w:hAnsi="David"/>
+          <w:sz w:val="20"/>
+          <w:szCs w:val="20"/>
+          <w:rtl/>
+        </w:rPr>
+        <w:t xml:space="preserve">. דה-סוטו פיתח את הניתוח על יסוד עבודת שדה במצרים, שבה נאמד שיעור הנכסים המוחזקים בלא רישום ביותר מ-90%; ראו להלן פרק ו.2.</w:t>
       </w:r>
     </w:p>
   </w:footnote>
@@ -11873,7 +11927,45 @@
           <w:szCs w:val="20"/>
           <w:rtl/>
         </w:rPr>
-        <w:t xml:space="preserve">יוער כי תופעה מקבילה קיימת גם במשפט העברי, שיטת הדין הדתית הנוספת הפועלת בישראל: קרקע נקנית בו בכסף, בשטר, בחזקה או בקניין סודר – בלא כל דרישת רישום – ובבתי הדין הרבניים רווחת העמדה שעסקת מקרקעין תקפה אף בלא רישום, תוך מחלוקת אם מכוח הכלל "דינא דמלכותא דינא" יש לאמץ את דרישת הרישום של דין המדינה. ראו "חוזים על פי דיני התורה" כתר א 71–75 (תשנ"ו). מפאת קוצר היריעה לא יורחב הדיון בשיטה זו.</w:t>
+        <w:t xml:space="preserve">השוו עניין </w:t>
+      </w:r>
+      <w:r>
+        <w:rPr>
+          <w:rFonts w:ascii="David" w:cs="David" w:eastAsia="David" w:hAnsi="David"/>
+          <w:i/>
+          <w:iCs/>
+          <w:sz w:val="20"/>
+          <w:szCs w:val="20"/>
+          <w:rtl/>
+        </w:rPr>
+        <w:t xml:space="preserve">צימבלר</w:t>
+      </w:r>
+      <w:r>
+        <w:rPr>
+          <w:rFonts w:ascii="David" w:cs="David" w:eastAsia="David" w:hAnsi="David"/>
+          <w:sz w:val="20"/>
+          <w:szCs w:val="20"/>
+          <w:rtl/>
+        </w:rPr>
+        <w:t xml:space="preserve">, </w:t>
+      </w:r>
+      <w:r>
+        <w:rPr>
+          <w:rFonts w:ascii="David" w:cs="David" w:eastAsia="David" w:hAnsi="David"/>
+          <w:sz w:val="20"/>
+          <w:szCs w:val="20"/>
+          <w:rtl/>
+        </w:rPr>
+        <w:t xml:space="preserve">לעיל ה"ש 33</w:t>
+      </w:r>
+      <w:r>
+        <w:rPr>
+          <w:rFonts w:ascii="David" w:cs="David" w:eastAsia="David" w:hAnsi="David"/>
+          <w:sz w:val="20"/>
+          <w:szCs w:val="20"/>
+          <w:rtl/>
+        </w:rPr>
+        <w:t xml:space="preserve">, שבו לא נזקפה ההתנהלות הבלתי פורמלית רבת-השנים לחובת הרוכשת.</w:t>
       </w:r>
     </w:p>
   </w:footnote>
@@ -11891,20 +11983,12 @@
       </w:r>
       <w:r>
         <w:rPr>
-          <w:rFonts w:ascii="Times New Roman" w:cs="Times New Roman" w:eastAsia="Times New Roman" w:hAnsi="Times New Roman"/>
-          <w:sz w:val="20"/>
-          <w:szCs w:val="20"/>
-        </w:rPr>
-        <w:t xml:space="preserve">Lysaght v Edwards (1876) 2 Ch D 499 (Ch)</w:t>
-      </w:r>
-      <w:r>
-        <w:rPr>
-          <w:rFonts w:ascii="David" w:cs="David" w:eastAsia="David" w:hAnsi="David"/>
-          <w:sz w:val="20"/>
-          <w:szCs w:val="20"/>
-          <w:rtl/>
-        </w:rPr>
-        <w:t xml:space="preserve">.</w:t>
+          <w:rFonts w:ascii="David" w:cs="David" w:eastAsia="David" w:hAnsi="David"/>
+          <w:sz w:val="20"/>
+          <w:szCs w:val="20"/>
+          <w:rtl/>
+        </w:rPr>
+        <w:t xml:space="preserve">יוער כי תופעה מקבילה קיימת גם במשפט העברי, שיטת הדין הדתית הנוספת הפועלת בישראל: קרקע נקנית בו בכסף, בשטר, בחזקה או בקניין סודר – בלא כל דרישת רישום – ובבתי הדין הרבניים רווחת העמדה שעסקת מקרקעין תקפה אף בלא רישום, תוך מחלוקת אם מכוח הכלל "דינא דמלכותא דינא" יש לאמץ את דרישת הרישום של דין המדינה. ראו "חוזים על פי דיני התורה" כתר א 71–75 (תשנ"ו). מפאת קוצר היריעה לא יורחב הדיון בשיטה זו.</w:t>
       </w:r>
     </w:p>
   </w:footnote>
@@ -11926,7 +12010,7 @@
           <w:sz w:val="20"/>
           <w:szCs w:val="20"/>
         </w:rPr>
-        <w:t xml:space="preserve">Walsh v Lonsdale (1882) 21 Ch D 9 (CA)</w:t>
+        <w:t xml:space="preserve">Lysaght v Edwards (1876) 2 Ch D 499 (Ch)</w:t>
       </w:r>
       <w:r>
         <w:rPr>
@@ -11953,41 +12037,11 @@
       </w:r>
       <w:r>
         <w:rPr>
-          <w:rFonts w:ascii="David" w:cs="David" w:eastAsia="David" w:hAnsi="David"/>
-          <w:sz w:val="20"/>
-          <w:szCs w:val="20"/>
-          <w:rtl/>
-        </w:rPr>
-        <w:t xml:space="preserve">ס׳ 161 לחוק המקרקעין ("אין זכות במקרקעין אלא לפי חוק"); עניין </w:t>
-      </w:r>
-      <w:r>
-        <w:rPr>
-          <w:rFonts w:ascii="David" w:cs="David" w:eastAsia="David" w:hAnsi="David"/>
-          <w:i/>
-          <w:iCs/>
-          <w:sz w:val="20"/>
-          <w:szCs w:val="20"/>
-          <w:rtl/>
-        </w:rPr>
-        <w:t xml:space="preserve">אהרונוב</w:t>
-      </w:r>
-      <w:r>
-        <w:rPr>
-          <w:rFonts w:ascii="David" w:cs="David" w:eastAsia="David" w:hAnsi="David"/>
-          <w:sz w:val="20"/>
-          <w:szCs w:val="20"/>
-          <w:rtl/>
-        </w:rPr>
-        <w:t xml:space="preserve">, </w:t>
-      </w:r>
-      <w:r>
-        <w:rPr>
-          <w:rFonts w:ascii="David" w:cs="David" w:eastAsia="David" w:hAnsi="David"/>
-          <w:sz w:val="20"/>
-          <w:szCs w:val="20"/>
-          <w:rtl/>
-        </w:rPr>
-        <w:t xml:space="preserve">לעיל ה"ש 21</w:t>
+          <w:rFonts w:ascii="Times New Roman" w:cs="Times New Roman" w:eastAsia="Times New Roman" w:hAnsi="Times New Roman"/>
+          <w:sz w:val="20"/>
+          <w:szCs w:val="20"/>
+        </w:rPr>
+        <w:t xml:space="preserve">Walsh v Lonsdale (1882) 21 Ch D 9 (CA)</w:t>
       </w:r>
       <w:r>
         <w:rPr>
@@ -12014,11 +12068,41 @@
       </w:r>
       <w:r>
         <w:rPr>
-          <w:rFonts w:ascii="Times New Roman" w:cs="Times New Roman" w:eastAsia="Times New Roman" w:hAnsi="Times New Roman"/>
-          <w:sz w:val="20"/>
-          <w:szCs w:val="20"/>
-        </w:rPr>
-        <w:t xml:space="preserve">Land Registration Act 2002, s 27</w:t>
+          <w:rFonts w:ascii="David" w:cs="David" w:eastAsia="David" w:hAnsi="David"/>
+          <w:sz w:val="20"/>
+          <w:szCs w:val="20"/>
+          <w:rtl/>
+        </w:rPr>
+        <w:t xml:space="preserve">ס׳ 161 לחוק המקרקעין ("אין זכות במקרקעין אלא לפי חוק"); עניין </w:t>
+      </w:r>
+      <w:r>
+        <w:rPr>
+          <w:rFonts w:ascii="David" w:cs="David" w:eastAsia="David" w:hAnsi="David"/>
+          <w:i/>
+          <w:iCs/>
+          <w:sz w:val="20"/>
+          <w:szCs w:val="20"/>
+          <w:rtl/>
+        </w:rPr>
+        <w:t xml:space="preserve">אהרונוב</w:t>
+      </w:r>
+      <w:r>
+        <w:rPr>
+          <w:rFonts w:ascii="David" w:cs="David" w:eastAsia="David" w:hAnsi="David"/>
+          <w:sz w:val="20"/>
+          <w:szCs w:val="20"/>
+          <w:rtl/>
+        </w:rPr>
+        <w:t xml:space="preserve">, </w:t>
+      </w:r>
+      <w:r>
+        <w:rPr>
+          <w:rFonts w:ascii="David" w:cs="David" w:eastAsia="David" w:hAnsi="David"/>
+          <w:sz w:val="20"/>
+          <w:szCs w:val="20"/>
+          <w:rtl/>
+        </w:rPr>
+        <w:t xml:space="preserve">לעיל ה"ש 21</w:t>
       </w:r>
       <w:r>
         <w:rPr>
@@ -12049,24 +12133,7 @@
           <w:sz w:val="20"/>
           <w:szCs w:val="20"/>
         </w:rPr>
-        <w:t xml:space="preserve">Williams &amp; Glyn’s Bank Ltd v Boland [1981] AC 487 (HL)</w:t>
-      </w:r>
-      <w:r>
-        <w:rPr>
-          <w:rFonts w:ascii="David" w:cs="David" w:eastAsia="David" w:hAnsi="David"/>
-          <w:sz w:val="20"/>
-          <w:szCs w:val="20"/>
-          <w:rtl/>
-        </w:rPr>
-        <w:t xml:space="preserve">; והמשכה של ההגנה כיום ב-</w:t>
-      </w:r>
-      <w:r>
-        <w:rPr>
-          <w:rFonts w:ascii="Times New Roman" w:cs="Times New Roman" w:eastAsia="Times New Roman" w:hAnsi="Times New Roman"/>
-          <w:sz w:val="20"/>
-          <w:szCs w:val="20"/>
-        </w:rPr>
-        <w:t xml:space="preserve">Land Registration Act 2002, sch 3, para 2</w:t>
+        <w:t xml:space="preserve">Land Registration Act 2002, s 27</w:t>
       </w:r>
       <w:r>
         <w:rPr>
@@ -12093,20 +12160,28 @@
       </w:r>
       <w:r>
         <w:rPr>
-          <w:rFonts w:ascii="David" w:cs="David" w:eastAsia="David" w:hAnsi="David"/>
-          <w:sz w:val="20"/>
-          <w:szCs w:val="20"/>
-          <w:rtl/>
-        </w:rPr>
-        <w:t xml:space="preserve">לביקורת עדכנית על מוסד הזכויות הגוברות כסדק ב"עקרון המראה" של המרשם ראו </w:t>
-      </w:r>
-      <w:r>
-        <w:rPr>
           <w:rFonts w:ascii="Times New Roman" w:cs="Times New Roman" w:eastAsia="Times New Roman" w:hAnsi="Times New Roman"/>
           <w:sz w:val="20"/>
           <w:szCs w:val="20"/>
         </w:rPr>
-        <w:t xml:space="preserve">Chris Bevan, "Overriding Interests under the Land Registration Act 2002: Time to Repair the ‘Cracked Mirror’?" [2024] Conv. 123</w:t>
+        <w:t xml:space="preserve">Williams &amp; Glyn’s Bank Ltd v Boland [1981] AC 487 (HL)</w:t>
+      </w:r>
+      <w:r>
+        <w:rPr>
+          <w:rFonts w:ascii="David" w:cs="David" w:eastAsia="David" w:hAnsi="David"/>
+          <w:sz w:val="20"/>
+          <w:szCs w:val="20"/>
+          <w:rtl/>
+        </w:rPr>
+        <w:t xml:space="preserve">; והמשכה של ההגנה כיום ב-</w:t>
+      </w:r>
+      <w:r>
+        <w:rPr>
+          <w:rFonts w:ascii="Times New Roman" w:cs="Times New Roman" w:eastAsia="Times New Roman" w:hAnsi="Times New Roman"/>
+          <w:sz w:val="20"/>
+          <w:szCs w:val="20"/>
+        </w:rPr>
+        <w:t xml:space="preserve">Land Registration Act 2002, sch 3, para 2</w:t>
       </w:r>
       <w:r>
         <w:rPr>
@@ -12133,11 +12208,20 @@
       </w:r>
       <w:r>
         <w:rPr>
+          <w:rFonts w:ascii="David" w:cs="David" w:eastAsia="David" w:hAnsi="David"/>
+          <w:sz w:val="20"/>
+          <w:szCs w:val="20"/>
+          <w:rtl/>
+        </w:rPr>
+        <w:t xml:space="preserve">לביקורת עדכנית על מוסד הזכויות הגוברות כסדק ב"עקרון המראה" של המרשם ראו </w:t>
+      </w:r>
+      <w:r>
+        <w:rPr>
           <w:rFonts w:ascii="Times New Roman" w:cs="Times New Roman" w:eastAsia="Times New Roman" w:hAnsi="Times New Roman"/>
           <w:sz w:val="20"/>
           <w:szCs w:val="20"/>
         </w:rPr>
-        <w:t xml:space="preserve">Stack v Dowden [2007] UKHL 17, [2007] 2 AC 432; Jones v Kernott [2011] UKSC 53, [2012] 1 AC 776</w:t>
+        <w:t xml:space="preserve">Chris Bevan, "Overriding Interests under the Land Registration Act 2002: Time to Repair the ‘Cracked Mirror’?" [2024] Conv. 123</w:t>
       </w:r>
       <w:r>
         <w:rPr>
@@ -12168,7 +12252,7 @@
           <w:sz w:val="20"/>
           <w:szCs w:val="20"/>
         </w:rPr>
-        <w:t xml:space="preserve">Thorner v Major [2009] UKHL 18, [2009] 1 WLR 776</w:t>
+        <w:t xml:space="preserve">Stack v Dowden [2007] UKHL 17, [2007] 2 AC 432; Jones v Kernott [2011] UKSC 53, [2012] 1 AC 776</w:t>
       </w:r>
       <w:r>
         <w:rPr>
@@ -12199,24 +12283,7 @@
           <w:sz w:val="20"/>
           <w:szCs w:val="20"/>
         </w:rPr>
-        <w:t xml:space="preserve">Guest v Guest [2022] UKSC 27, [2022] 3 WLR 911</w:t>
-      </w:r>
-      <w:r>
-        <w:rPr>
-          <w:rFonts w:ascii="David" w:cs="David" w:eastAsia="David" w:hAnsi="David"/>
-          <w:sz w:val="20"/>
-          <w:szCs w:val="20"/>
-          <w:rtl/>
-        </w:rPr>
-        <w:t xml:space="preserve">. לניתוח עדכני ראו </w:t>
-      </w:r>
-      <w:r>
-        <w:rPr>
-          <w:rFonts w:ascii="Times New Roman" w:cs="Times New Roman" w:eastAsia="Times New Roman" w:hAnsi="Times New Roman"/>
-          <w:sz w:val="20"/>
-          <w:szCs w:val="20"/>
-        </w:rPr>
-        <w:t xml:space="preserve">Alex Waghorn, "Promises in Equity and at Law: Proprietary Estoppel after Guest v Guest" (2023) 86 MLR 1504; Brian Sloan, "Proprietary Estoppel in the Supreme Court: Banquo’s Ghost?" (2023) 82 CLJ 13</w:t>
+        <w:t xml:space="preserve">Thorner v Major [2009] UKHL 18, [2009] 1 WLR 776</w:t>
       </w:r>
       <w:r>
         <w:rPr>
@@ -12247,34 +12314,33 @@
           <w:sz w:val="20"/>
           <w:szCs w:val="20"/>
         </w:rPr>
-        <w:t xml:space="preserve">Law of Property (Miscellaneous Provisions) Act 1989, ss 1–2</w:t>
-      </w:r>
-      <w:r>
-        <w:rPr>
-          <w:rFonts w:ascii="David" w:cs="David" w:eastAsia="David" w:hAnsi="David"/>
-          <w:sz w:val="20"/>
-          <w:szCs w:val="20"/>
-          <w:rtl/>
-        </w:rPr>
-        <w:t xml:space="preserve">. וראו כבר את ראבילו, </w:t>
-      </w:r>
-      <w:r>
-        <w:rPr>
-          <w:rFonts w:ascii="David" w:cs="David" w:eastAsia="David" w:hAnsi="David"/>
-          <w:sz w:val="20"/>
-          <w:szCs w:val="20"/>
-          <w:rtl/>
-        </w:rPr>
-        <w:t xml:space="preserve">לעיל ה"ש 38</w:t>
-      </w:r>
-      <w:r>
-        <w:rPr>
-          <w:rFonts w:ascii="David" w:cs="David" w:eastAsia="David" w:hAnsi="David"/>
-          <w:sz w:val="20"/>
-          <w:szCs w:val="20"/>
-          <w:rtl/>
-        </w:rPr>
-        <w:t xml:space="preserve">, המצטט את הכלל האנגלי שלפיו הבטחת מתנה גרידא אינה מעבירה בעלות וטעונה מסירה.</w:t>
+        <w:t xml:space="preserve">Guest v Guest [2022] UKSC 27, [2022] 3 WLR 911</w:t>
+      </w:r>
+      <w:r>
+        <w:rPr>
+          <w:rFonts w:ascii="David" w:cs="David" w:eastAsia="David" w:hAnsi="David"/>
+          <w:sz w:val="20"/>
+          <w:szCs w:val="20"/>
+          <w:rtl/>
+        </w:rPr>
+        <w:t xml:space="preserve">. לניתוח עדכני ראו </w:t>
+      </w:r>
+      <w:r>
+        <w:rPr>
+          <w:rFonts w:ascii="Times New Roman" w:cs="Times New Roman" w:eastAsia="Times New Roman" w:hAnsi="Times New Roman"/>
+          <w:sz w:val="20"/>
+          <w:szCs w:val="20"/>
+        </w:rPr>
+        <w:t xml:space="preserve">Alex Waghorn, "Promises in Equity and at Law: Proprietary Estoppel after Guest v Guest" (2023) 86 MLR 1504; Brian Sloan, "Proprietary Estoppel in the Supreme Court: Banquo’s Ghost?" (2023) 82 CLJ 13</w:t>
+      </w:r>
+      <w:r>
+        <w:rPr>
+          <w:rFonts w:ascii="David" w:cs="David" w:eastAsia="David" w:hAnsi="David"/>
+          <w:sz w:val="20"/>
+          <w:szCs w:val="20"/>
+          <w:rtl/>
+        </w:rPr>
+        <w:t xml:space="preserve">.</w:t>
       </w:r>
     </w:p>
   </w:footnote>
@@ -12292,50 +12358,38 @@
       </w:r>
       <w:r>
         <w:rPr>
-          <w:rFonts w:ascii="David" w:cs="David" w:eastAsia="David" w:hAnsi="David"/>
-          <w:sz w:val="20"/>
-          <w:szCs w:val="20"/>
-          <w:rtl/>
-        </w:rPr>
-        <w:t xml:space="preserve">עניין </w:t>
-      </w:r>
-      <w:r>
-        <w:rPr>
-          <w:rFonts w:ascii="David" w:cs="David" w:eastAsia="David" w:hAnsi="David"/>
-          <w:i/>
-          <w:iCs/>
-          <w:sz w:val="20"/>
-          <w:szCs w:val="20"/>
-          <w:rtl/>
-        </w:rPr>
-        <w:t xml:space="preserve">כבהה</w:t>
-      </w:r>
-      <w:r>
-        <w:rPr>
-          <w:rFonts w:ascii="David" w:cs="David" w:eastAsia="David" w:hAnsi="David"/>
-          <w:sz w:val="20"/>
-          <w:szCs w:val="20"/>
-          <w:rtl/>
-        </w:rPr>
-        <w:t xml:space="preserve">, </w:t>
-      </w:r>
-      <w:r>
-        <w:rPr>
-          <w:rFonts w:ascii="David" w:cs="David" w:eastAsia="David" w:hAnsi="David"/>
-          <w:sz w:val="20"/>
-          <w:szCs w:val="20"/>
-          <w:rtl/>
-        </w:rPr>
-        <w:t xml:space="preserve">לעיל ה"ש 42</w:t>
-      </w:r>
-      <w:r>
-        <w:rPr>
-          <w:rFonts w:ascii="David" w:cs="David" w:eastAsia="David" w:hAnsi="David"/>
-          <w:sz w:val="20"/>
-          <w:szCs w:val="20"/>
-          <w:rtl/>
-        </w:rPr>
-        <w:t xml:space="preserve">.</w:t>
+          <w:rFonts w:ascii="Times New Roman" w:cs="Times New Roman" w:eastAsia="Times New Roman" w:hAnsi="Times New Roman"/>
+          <w:sz w:val="20"/>
+          <w:szCs w:val="20"/>
+        </w:rPr>
+        <w:t xml:space="preserve">Law of Property (Miscellaneous Provisions) Act 1989, ss 1–2</w:t>
+      </w:r>
+      <w:r>
+        <w:rPr>
+          <w:rFonts w:ascii="David" w:cs="David" w:eastAsia="David" w:hAnsi="David"/>
+          <w:sz w:val="20"/>
+          <w:szCs w:val="20"/>
+          <w:rtl/>
+        </w:rPr>
+        <w:t xml:space="preserve">. וראו כבר את ראבילו, </w:t>
+      </w:r>
+      <w:r>
+        <w:rPr>
+          <w:rFonts w:ascii="David" w:cs="David" w:eastAsia="David" w:hAnsi="David"/>
+          <w:sz w:val="20"/>
+          <w:szCs w:val="20"/>
+          <w:rtl/>
+        </w:rPr>
+        <w:t xml:space="preserve">לעיל ה"ש 38</w:t>
+      </w:r>
+      <w:r>
+        <w:rPr>
+          <w:rFonts w:ascii="David" w:cs="David" w:eastAsia="David" w:hAnsi="David"/>
+          <w:sz w:val="20"/>
+          <w:szCs w:val="20"/>
+          <w:rtl/>
+        </w:rPr>
+        <w:t xml:space="preserve">, המצטט את הכלל האנגלי שלפיו הבטחת מתנה גרידא אינה מעבירה בעלות וטעונה מסירה.</w:t>
       </w:r>
     </w:p>
   </w:footnote>
@@ -12353,11 +12407,41 @@
       </w:r>
       <w:r>
         <w:rPr>
-          <w:rFonts w:ascii="Times New Roman" w:cs="Times New Roman" w:eastAsia="Times New Roman" w:hAnsi="Times New Roman"/>
-          <w:sz w:val="20"/>
-          <w:szCs w:val="20"/>
-        </w:rPr>
-        <w:t xml:space="preserve">Re Rose [1952] Ch 499 (CA)</w:t>
+          <w:rFonts w:ascii="David" w:cs="David" w:eastAsia="David" w:hAnsi="David"/>
+          <w:sz w:val="20"/>
+          <w:szCs w:val="20"/>
+          <w:rtl/>
+        </w:rPr>
+        <w:t xml:space="preserve">עניין </w:t>
+      </w:r>
+      <w:r>
+        <w:rPr>
+          <w:rFonts w:ascii="David" w:cs="David" w:eastAsia="David" w:hAnsi="David"/>
+          <w:i/>
+          <w:iCs/>
+          <w:sz w:val="20"/>
+          <w:szCs w:val="20"/>
+          <w:rtl/>
+        </w:rPr>
+        <w:t xml:space="preserve">כבהה</w:t>
+      </w:r>
+      <w:r>
+        <w:rPr>
+          <w:rFonts w:ascii="David" w:cs="David" w:eastAsia="David" w:hAnsi="David"/>
+          <w:sz w:val="20"/>
+          <w:szCs w:val="20"/>
+          <w:rtl/>
+        </w:rPr>
+        <w:t xml:space="preserve">, </w:t>
+      </w:r>
+      <w:r>
+        <w:rPr>
+          <w:rFonts w:ascii="David" w:cs="David" w:eastAsia="David" w:hAnsi="David"/>
+          <w:sz w:val="20"/>
+          <w:szCs w:val="20"/>
+          <w:rtl/>
+        </w:rPr>
+        <w:t xml:space="preserve">לעיל ה"ש 42</w:t>
       </w:r>
       <w:r>
         <w:rPr>
@@ -12388,7 +12472,7 @@
           <w:sz w:val="20"/>
           <w:szCs w:val="20"/>
         </w:rPr>
-        <w:t xml:space="preserve">Pennington v Waine [2002] EWCA Civ 227, [2002] 1 WLR 2075</w:t>
+        <w:t xml:space="preserve">Re Rose [1952] Ch 499 (CA)</w:t>
       </w:r>
       <w:r>
         <w:rPr>
@@ -12419,16 +12503,16 @@
           <w:sz w:val="20"/>
           <w:szCs w:val="20"/>
         </w:rPr>
-        <w:t xml:space="preserve">Powers of Attorney Act 1971, s 4</w:t>
-      </w:r>
-      <w:r>
-        <w:rPr>
-          <w:rFonts w:ascii="David" w:cs="David" w:eastAsia="David" w:hAnsi="David"/>
-          <w:sz w:val="20"/>
-          <w:szCs w:val="20"/>
-          <w:rtl/>
-        </w:rPr>
-        <w:t xml:space="preserve">. זהו המקור ההיסטורי של ס׳ 14(ב) לחוק השליחות הישראלי.</w:t>
+        <w:t xml:space="preserve">Pennington v Waine [2002] EWCA Civ 227, [2002] 1 WLR 2075</w:t>
+      </w:r>
+      <w:r>
+        <w:rPr>
+          <w:rFonts w:ascii="David" w:cs="David" w:eastAsia="David" w:hAnsi="David"/>
+          <w:sz w:val="20"/>
+          <w:szCs w:val="20"/>
+          <w:rtl/>
+        </w:rPr>
+        <w:t xml:space="preserve">.</w:t>
       </w:r>
     </w:p>
   </w:footnote>
@@ -12446,30 +12530,20 @@
       </w:r>
       <w:r>
         <w:rPr>
-          <w:rFonts w:ascii="David" w:cs="David" w:eastAsia="David" w:hAnsi="David"/>
-          <w:sz w:val="20"/>
-          <w:szCs w:val="20"/>
-          <w:rtl/>
-        </w:rPr>
-        <w:t xml:space="preserve">ברק, </w:t>
-      </w:r>
-      <w:r>
-        <w:rPr>
-          <w:rFonts w:ascii="David" w:cs="David" w:eastAsia="David" w:hAnsi="David"/>
-          <w:sz w:val="20"/>
-          <w:szCs w:val="20"/>
-          <w:rtl/>
-        </w:rPr>
-        <w:t xml:space="preserve">לעיל ה"ש 30</w:t>
-      </w:r>
-      <w:r>
-        <w:rPr>
-          <w:rFonts w:ascii="David" w:cs="David" w:eastAsia="David" w:hAnsi="David"/>
-          <w:sz w:val="20"/>
-          <w:szCs w:val="20"/>
-          <w:rtl/>
-        </w:rPr>
-        <w:t xml:space="preserve">, בעמ׳ 1243.</w:t>
+          <w:rFonts w:ascii="Times New Roman" w:cs="Times New Roman" w:eastAsia="Times New Roman" w:hAnsi="Times New Roman"/>
+          <w:sz w:val="20"/>
+          <w:szCs w:val="20"/>
+        </w:rPr>
+        <w:t xml:space="preserve">Powers of Attorney Act 1971, s 4</w:t>
+      </w:r>
+      <w:r>
+        <w:rPr>
+          <w:rFonts w:ascii="David" w:cs="David" w:eastAsia="David" w:hAnsi="David"/>
+          <w:sz w:val="20"/>
+          <w:szCs w:val="20"/>
+          <w:rtl/>
+        </w:rPr>
+        <w:t xml:space="preserve">. זהו המקור ההיסטורי של ס׳ 14(ב) לחוק השליחות הישראלי.</w:t>
       </w:r>
     </w:p>
   </w:footnote>
@@ -12492,24 +12566,25 @@
           <w:szCs w:val="20"/>
           <w:rtl/>
         </w:rPr>
-        <w:t xml:space="preserve">לניתוח השוואתי של גורל ההתיישנות הרוכשת בשיטות הרישום המודרניות ראו </w:t>
-      </w:r>
-      <w:r>
-        <w:rPr>
-          <w:rFonts w:ascii="Times New Roman" w:cs="Times New Roman" w:eastAsia="Times New Roman" w:hAnsi="Times New Roman"/>
-          <w:sz w:val="20"/>
-          <w:szCs w:val="20"/>
-        </w:rPr>
-        <w:t xml:space="preserve">Nadav Shoked, "Who Needs Adverse Possession?," 89 Fordham L. Rev. 2639 (2021)</w:t>
-      </w:r>
-      <w:r>
-        <w:rPr>
-          <w:rFonts w:ascii="David" w:cs="David" w:eastAsia="David" w:hAnsi="David"/>
-          <w:sz w:val="20"/>
-          <w:szCs w:val="20"/>
-          <w:rtl/>
-        </w:rPr>
-        <w:t xml:space="preserve">.</w:t>
+        <w:t xml:space="preserve">ברק, </w:t>
+      </w:r>
+      <w:r>
+        <w:rPr>
+          <w:rFonts w:ascii="David" w:cs="David" w:eastAsia="David" w:hAnsi="David"/>
+          <w:sz w:val="20"/>
+          <w:szCs w:val="20"/>
+          <w:rtl/>
+        </w:rPr>
+        <w:t xml:space="preserve">לעיל ה"ש 30</w:t>
+      </w:r>
+      <w:r>
+        <w:rPr>
+          <w:rFonts w:ascii="David" w:cs="David" w:eastAsia="David" w:hAnsi="David"/>
+          <w:sz w:val="20"/>
+          <w:szCs w:val="20"/>
+          <w:rtl/>
+        </w:rPr>
+        <w:t xml:space="preserve">, בעמ׳ 1243.</w:t>
       </w:r>
     </w:p>
   </w:footnote>
@@ -12532,7 +12607,24 @@
           <w:szCs w:val="20"/>
           <w:rtl/>
         </w:rPr>
-        <w:t xml:space="preserve">ס׳ 418 לקוד האזרחי המצרי (חוק מס׳ 131 לשנת 1948).</w:t>
+        <w:t xml:space="preserve">לניתוח השוואתי של גורל ההתיישנות הרוכשת בשיטות הרישום המודרניות ראו </w:t>
+      </w:r>
+      <w:r>
+        <w:rPr>
+          <w:rFonts w:ascii="Times New Roman" w:cs="Times New Roman" w:eastAsia="Times New Roman" w:hAnsi="Times New Roman"/>
+          <w:sz w:val="20"/>
+          <w:szCs w:val="20"/>
+        </w:rPr>
+        <w:t xml:space="preserve">Nadav Shoked, "Who Needs Adverse Possession?," 89 Fordham L. Rev. 2639 (2021)</w:t>
+      </w:r>
+      <w:r>
+        <w:rPr>
+          <w:rFonts w:ascii="David" w:cs="David" w:eastAsia="David" w:hAnsi="David"/>
+          <w:sz w:val="20"/>
+          <w:szCs w:val="20"/>
+          <w:rtl/>
+        </w:rPr>
+        <w:t xml:space="preserve">.</w:t>
       </w:r>
     </w:p>
   </w:footnote>
@@ -12555,7 +12647,7 @@
           <w:szCs w:val="20"/>
           <w:rtl/>
         </w:rPr>
-        <w:t xml:space="preserve">ס׳ 934 לקוד האזרחי המצרי; ס׳ 9 לחוק ארגון הפומביות המקרקעית, חוק מס׳ 114 לשנת 1946. במצרים פועלות במקביל שתי שיטות רישום: רישום שטרות פרסונלי לפי חוק 114/1946, החולש על מרבית המדינה, ורישום זכויות קדסטרלי לפי חוק מס׳ 142 לשנת 1964, שתחולתו מוגבלת.</w:t>
+        <w:t xml:space="preserve">ס׳ 418 לקוד האזרחי המצרי (חוק מס׳ 131 לשנת 1948).</w:t>
       </w:r>
     </w:p>
   </w:footnote>
@@ -12573,38 +12665,12 @@
       </w:r>
       <w:r>
         <w:rPr>
-          <w:rFonts w:ascii="Times New Roman" w:cs="Times New Roman" w:eastAsia="Times New Roman" w:hAnsi="Times New Roman"/>
-          <w:sz w:val="20"/>
-          <w:szCs w:val="20"/>
-        </w:rPr>
-        <w:t xml:space="preserve">“More than 90% of Egypt’s Properties Are Unregistered: Justice Minister,” Daily News Egypt (Feb. 14, 2022); “Egypt’s Property Registration Rate Remains Below 10%…: World Bank,” Daily News Egypt (July 5, 2026)</w:t>
-      </w:r>
-      <w:r>
-        <w:rPr>
-          <w:rFonts w:ascii="David" w:cs="David" w:eastAsia="David" w:hAnsi="David"/>
-          <w:sz w:val="20"/>
-          <w:szCs w:val="20"/>
-          <w:rtl/>
-        </w:rPr>
-        <w:t xml:space="preserve">. הרנדו דה-סוטו ביסס על מצרים את מחקר "ההון המת" שלו: </w:t>
-      </w:r>
-      <w:r>
-        <w:rPr>
-          <w:rFonts w:ascii="David" w:cs="David" w:eastAsia="David" w:hAnsi="David"/>
-          <w:sz w:val="20"/>
-          <w:szCs w:val="20"/>
-          <w:rtl/>
-        </w:rPr>
-        <w:t xml:space="preserve">לעיל ה"ש 77</w:t>
-      </w:r>
-      <w:r>
-        <w:rPr>
-          <w:rFonts w:ascii="David" w:cs="David" w:eastAsia="David" w:hAnsi="David"/>
-          <w:sz w:val="20"/>
-          <w:szCs w:val="20"/>
-          <w:rtl/>
-        </w:rPr>
-        <w:t xml:space="preserve">.</w:t>
+          <w:rFonts w:ascii="David" w:cs="David" w:eastAsia="David" w:hAnsi="David"/>
+          <w:sz w:val="20"/>
+          <w:szCs w:val="20"/>
+          <w:rtl/>
+        </w:rPr>
+        <w:t xml:space="preserve">ס׳ 934 לקוד האזרחי המצרי; ס׳ 9 לחוק ארגון הפומביות המקרקעית, חוק מס׳ 114 לשנת 1946. במצרים פועלות במקביל שתי שיטות רישום: רישום שטרות פרסונלי לפי חוק 114/1946, החולש על מרבית המדינה, ורישום זכויות קדסטרלי לפי חוק מס׳ 142 לשנת 1964, שתחולתו מוגבלת.</w:t>
       </w:r>
     </w:p>
   </w:footnote>
@@ -12622,12 +12688,38 @@
       </w:r>
       <w:r>
         <w:rPr>
-          <w:rFonts w:ascii="David" w:cs="David" w:eastAsia="David" w:hAnsi="David"/>
-          <w:sz w:val="20"/>
-          <w:szCs w:val="20"/>
-          <w:rtl/>
-        </w:rPr>
-        <w:t xml:space="preserve">ס׳ 715 לקוד האזרחי המצרי. בית המשפט החוקתי העליון של מצרים שב ואישר בשנת 2021 כי ייפוי כוח כזה אינו ניתן לביטול חד-צדדי. ואולם ס׳ 714 מורה כי השליחות פוקעת במות השולח – נקודת תורפה מרכזית של הפרקטיקה, שפסיקת בית המשפט לקסאציה בעניינה אינה אחידה.</w:t>
+          <w:rFonts w:ascii="Times New Roman" w:cs="Times New Roman" w:eastAsia="Times New Roman" w:hAnsi="Times New Roman"/>
+          <w:sz w:val="20"/>
+          <w:szCs w:val="20"/>
+        </w:rPr>
+        <w:t xml:space="preserve">“More than 90% of Egypt’s Properties Are Unregistered: Justice Minister,” Daily News Egypt (Feb. 14, 2022); “Egypt’s Property Registration Rate Remains Below 10%…: World Bank,” Daily News Egypt (July 5, 2026)</w:t>
+      </w:r>
+      <w:r>
+        <w:rPr>
+          <w:rFonts w:ascii="David" w:cs="David" w:eastAsia="David" w:hAnsi="David"/>
+          <w:sz w:val="20"/>
+          <w:szCs w:val="20"/>
+          <w:rtl/>
+        </w:rPr>
+        <w:t xml:space="preserve">. הרנדו דה-סוטו ביסס על מצרים את מחקר "ההון המת" שלו: </w:t>
+      </w:r>
+      <w:r>
+        <w:rPr>
+          <w:rFonts w:ascii="David" w:cs="David" w:eastAsia="David" w:hAnsi="David"/>
+          <w:sz w:val="20"/>
+          <w:szCs w:val="20"/>
+          <w:rtl/>
+        </w:rPr>
+        <w:t xml:space="preserve">לעיל ה"ש 78</w:t>
+      </w:r>
+      <w:r>
+        <w:rPr>
+          <w:rFonts w:ascii="David" w:cs="David" w:eastAsia="David" w:hAnsi="David"/>
+          <w:sz w:val="20"/>
+          <w:szCs w:val="20"/>
+          <w:rtl/>
+        </w:rPr>
+        <w:t xml:space="preserve">.</w:t>
       </w:r>
     </w:p>
   </w:footnote>
@@ -12650,24 +12742,7 @@
           <w:szCs w:val="20"/>
           <w:rtl/>
         </w:rPr>
-        <w:t xml:space="preserve">לפסיקת בית המשפט לקסאציה המצרי על תביעות אלה ראו הסקירות שבמאגרי לשכת עורכי הדין המצרית; ולתיאור אנליטי באנגלית ראו </w:t>
-      </w:r>
-      <w:r>
-        <w:rPr>
-          <w:rFonts w:ascii="Times New Roman" w:cs="Times New Roman" w:eastAsia="Times New Roman" w:hAnsi="Times New Roman"/>
-          <w:sz w:val="20"/>
-          <w:szCs w:val="20"/>
-        </w:rPr>
-        <w:t xml:space="preserve">David Sims, "Securing Land Tenure in Egypt: Who Needs Registered Titles?" Metropolitics (June 14, 2016)</w:t>
-      </w:r>
-      <w:r>
-        <w:rPr>
-          <w:rFonts w:ascii="David" w:cs="David" w:eastAsia="David" w:hAnsi="David"/>
-          <w:sz w:val="20"/>
-          <w:szCs w:val="20"/>
-          <w:rtl/>
-        </w:rPr>
-        <w:t xml:space="preserve">.</w:t>
+        <w:t xml:space="preserve">ס׳ 715 לקוד האזרחי המצרי. בית המשפט החוקתי העליון של מצרים שב ואישר בשנת 2021 כי ייפוי כוח כזה אינו ניתן לביטול חד-צדדי. ואולם ס׳ 714 מורה כי השליחות פוקעת במות השולח – נקודת תורפה מרכזית של הפרקטיקה, שפסיקת בית המשפט לקסאציה בעניינה אינה אחידה.</w:t>
       </w:r>
     </w:p>
   </w:footnote>
@@ -12690,7 +12765,24 @@
           <w:szCs w:val="20"/>
           <w:rtl/>
         </w:rPr>
-        <w:t xml:space="preserve">ס׳ 968 לקוד האזרחי המצרי. הפרקטיקה המצרית דנה בכך תחת הכותרת "וַצְ׳ע אל-יַד" (הנחת היד) – ההחזקה בפועל כמקור קניין.</w:t>
+        <w:t xml:space="preserve">לפסיקת בית המשפט לקסאציה המצרי על תביעות אלה ראו הסקירות שבמאגרי לשכת עורכי הדין המצרית; ולתיאור אנליטי באנגלית ראו </w:t>
+      </w:r>
+      <w:r>
+        <w:rPr>
+          <w:rFonts w:ascii="Times New Roman" w:cs="Times New Roman" w:eastAsia="Times New Roman" w:hAnsi="Times New Roman"/>
+          <w:sz w:val="20"/>
+          <w:szCs w:val="20"/>
+        </w:rPr>
+        <w:t xml:space="preserve">David Sims, "Securing Land Tenure in Egypt: Who Needs Registered Titles?" Metropolitics (June 14, 2016)</w:t>
+      </w:r>
+      <w:r>
+        <w:rPr>
+          <w:rFonts w:ascii="David" w:cs="David" w:eastAsia="David" w:hAnsi="David"/>
+          <w:sz w:val="20"/>
+          <w:szCs w:val="20"/>
+          <w:rtl/>
+        </w:rPr>
+        <w:t xml:space="preserve">.</w:t>
       </w:r>
     </w:p>
   </w:footnote>
@@ -12713,7 +12805,7 @@
           <w:szCs w:val="20"/>
           <w:rtl/>
         </w:rPr>
-        <w:t xml:space="preserve">ס׳ 969 לקוד האזרחי המצרי.</w:t>
+        <w:t xml:space="preserve">ס׳ 968 לקוד האזרחי המצרי. הפרקטיקה המצרית דנה בכך תחת הכותרת "וַצְ׳ע אל-יַד" (הנחת היד) – ההחזקה בפועל כמקור קניין.</w:t>
       </w:r>
     </w:p>
   </w:footnote>
@@ -12736,7 +12828,7 @@
           <w:szCs w:val="20"/>
           <w:rtl/>
         </w:rPr>
-        <w:t xml:space="preserve">ס׳ 970 לקוד האזרחי המצרי, כפי שתוקן בחוק מס׳ 55 לשנת 1970; ולנכסי הציבור ראו גם ס׳ 87(2) לקוד.</w:t>
+        <w:t xml:space="preserve">ס׳ 969 לקוד האזרחי המצרי.</w:t>
       </w:r>
     </w:p>
   </w:footnote>
@@ -12759,42 +12851,7 @@
           <w:szCs w:val="20"/>
           <w:rtl/>
         </w:rPr>
-        <w:t xml:space="preserve">להשוואה בין גישות שיטות הרישום להתיישנות רוכשת ראו </w:t>
-      </w:r>
-      <w:r>
-        <w:rPr>
-          <w:rFonts w:ascii="Times New Roman" w:cs="Times New Roman" w:eastAsia="Times New Roman" w:hAnsi="Times New Roman"/>
-          <w:sz w:val="20"/>
-          <w:szCs w:val="20"/>
-        </w:rPr>
-        <w:t xml:space="preserve">Shoked</w:t>
-      </w:r>
-      <w:r>
-        <w:rPr>
-          <w:rFonts w:ascii="David" w:cs="David" w:eastAsia="David" w:hAnsi="David"/>
-          <w:sz w:val="20"/>
-          <w:szCs w:val="20"/>
-          <w:rtl/>
-        </w:rPr>
-        <w:t xml:space="preserve">, </w:t>
-      </w:r>
-      <w:r>
-        <w:rPr>
-          <w:rFonts w:ascii="David" w:cs="David" w:eastAsia="David" w:hAnsi="David"/>
-          <w:sz w:val="20"/>
-          <w:szCs w:val="20"/>
-          <w:rtl/>
-        </w:rPr>
-        <w:t xml:space="preserve">לעיל ה"ש 95</w:t>
-      </w:r>
-      <w:r>
-        <w:rPr>
-          <w:rFonts w:ascii="David" w:cs="David" w:eastAsia="David" w:hAnsi="David"/>
-          <w:sz w:val="20"/>
-          <w:szCs w:val="20"/>
-          <w:rtl/>
-        </w:rPr>
-        <w:t xml:space="preserve">. ודוק: בישראל נחסם מסלול זה כמעט כליל – ס׳ 159(ב) לחוק המקרקעין שלל התיישנות במקרקעין מוסדרים, וחזקתו של בן משפחה מסווגת כ"חזקה מרשות"; ראו לעיל פרק ג.6.</w:t>
+        <w:t xml:space="preserve">ס׳ 970 לקוד האזרחי המצרי, כפי שתוקן בחוק מס׳ 55 לשנת 1970; ולנכסי הציבור ראו גם ס׳ 87(2) לקוד.</w:t>
       </w:r>
     </w:p>
   </w:footnote>
@@ -12812,37 +12869,47 @@
       </w:r>
       <w:r>
         <w:rPr>
+          <w:rFonts w:ascii="David" w:cs="David" w:eastAsia="David" w:hAnsi="David"/>
+          <w:sz w:val="20"/>
+          <w:szCs w:val="20"/>
+          <w:rtl/>
+        </w:rPr>
+        <w:t xml:space="preserve">להשוואה בין גישות שיטות הרישום להתיישנות רוכשת ראו </w:t>
+      </w:r>
+      <w:r>
+        <w:rPr>
           <w:rFonts w:ascii="Times New Roman" w:cs="Times New Roman" w:eastAsia="Times New Roman" w:hAnsi="Times New Roman"/>
           <w:sz w:val="20"/>
           <w:szCs w:val="20"/>
         </w:rPr>
-        <w:t xml:space="preserve">“Sisi Orders Delaying Implementation of Controversial Real Estate Law for 2 Years,” Ahram Online (Feb. 28, 2021); “‘Unjust’: Egypt’s Property Registration Plans Face Popular Backlash,” Middle East Eye (2021)</w:t>
-      </w:r>
-      <w:r>
-        <w:rPr>
-          <w:rFonts w:ascii="David" w:cs="David" w:eastAsia="David" w:hAnsi="David"/>
-          <w:sz w:val="20"/>
-          <w:szCs w:val="20"/>
-          <w:rtl/>
-        </w:rPr>
-        <w:t xml:space="preserve">. לניתוח מדיניות ראו </w:t>
-      </w:r>
-      <w:r>
-        <w:rPr>
-          <w:rFonts w:ascii="Times New Roman" w:cs="Times New Roman" w:eastAsia="Times New Roman" w:hAnsi="Times New Roman"/>
-          <w:sz w:val="20"/>
-          <w:szCs w:val="20"/>
-        </w:rPr>
-        <w:t xml:space="preserve">“Real Estate Registration Law Amendments – Development Brief,” The Built Environment Observatory (May 2021)</w:t>
-      </w:r>
-      <w:r>
-        <w:rPr>
-          <w:rFonts w:ascii="David" w:cs="David" w:eastAsia="David" w:hAnsi="David"/>
-          <w:sz w:val="20"/>
-          <w:szCs w:val="20"/>
-          <w:rtl/>
-        </w:rPr>
-        <w:t xml:space="preserve">.</w:t>
+        <w:t xml:space="preserve">Shoked</w:t>
+      </w:r>
+      <w:r>
+        <w:rPr>
+          <w:rFonts w:ascii="David" w:cs="David" w:eastAsia="David" w:hAnsi="David"/>
+          <w:sz w:val="20"/>
+          <w:szCs w:val="20"/>
+          <w:rtl/>
+        </w:rPr>
+        <w:t xml:space="preserve">, </w:t>
+      </w:r>
+      <w:r>
+        <w:rPr>
+          <w:rFonts w:ascii="David" w:cs="David" w:eastAsia="David" w:hAnsi="David"/>
+          <w:sz w:val="20"/>
+          <w:szCs w:val="20"/>
+          <w:rtl/>
+        </w:rPr>
+        <w:t xml:space="preserve">לעיל ה"ש 96</w:t>
+      </w:r>
+      <w:r>
+        <w:rPr>
+          <w:rFonts w:ascii="David" w:cs="David" w:eastAsia="David" w:hAnsi="David"/>
+          <w:sz w:val="20"/>
+          <w:szCs w:val="20"/>
+          <w:rtl/>
+        </w:rPr>
+        <w:t xml:space="preserve">. ודוק: בישראל נחסם מסלול זה כמעט כליל – ס׳ 159(ב) לחוק המקרקעין שלל התיישנות במקרקעין מוסדרים, וחזקתו של בן משפחה מסווגת כ"חזקה מרשות"; ראו לעיל פרק ג.6.</w:t>
       </w:r>
     </w:p>
   </w:footnote>
@@ -12860,20 +12927,28 @@
       </w:r>
       <w:r>
         <w:rPr>
-          <w:rFonts w:ascii="David" w:cs="David" w:eastAsia="David" w:hAnsi="David"/>
-          <w:sz w:val="20"/>
-          <w:szCs w:val="20"/>
-          <w:rtl/>
-        </w:rPr>
-        <w:t xml:space="preserve">חוק מס׳ 9 לשנת 2022 (מצרים), המתקן את חוק מס׳ 114 לשנת 1946; ראו </w:t>
-      </w:r>
-      <w:r>
-        <w:rPr>
           <w:rFonts w:ascii="Times New Roman" w:cs="Times New Roman" w:eastAsia="Times New Roman" w:hAnsi="Times New Roman"/>
           <w:sz w:val="20"/>
           <w:szCs w:val="20"/>
         </w:rPr>
-        <w:t xml:space="preserve">Shalakany Law Office, “New Amendments to Real Estate Registration Law” (2022)</w:t>
+        <w:t xml:space="preserve">“Sisi Orders Delaying Implementation of Controversial Real Estate Law for 2 Years,” Ahram Online (Feb. 28, 2021); “‘Unjust’: Egypt’s Property Registration Plans Face Popular Backlash,” Middle East Eye (2021)</w:t>
+      </w:r>
+      <w:r>
+        <w:rPr>
+          <w:rFonts w:ascii="David" w:cs="David" w:eastAsia="David" w:hAnsi="David"/>
+          <w:sz w:val="20"/>
+          <w:szCs w:val="20"/>
+          <w:rtl/>
+        </w:rPr>
+        <w:t xml:space="preserve">. לניתוח מדיניות ראו </w:t>
+      </w:r>
+      <w:r>
+        <w:rPr>
+          <w:rFonts w:ascii="Times New Roman" w:cs="Times New Roman" w:eastAsia="Times New Roman" w:hAnsi="Times New Roman"/>
+          <w:sz w:val="20"/>
+          <w:szCs w:val="20"/>
+        </w:rPr>
+        <w:t xml:space="preserve">“Real Estate Registration Law Amendments – Development Brief,” The Built Environment Observatory (May 2021)</w:t>
       </w:r>
       <w:r>
         <w:rPr>
@@ -12905,7 +12980,24 @@
           <w:szCs w:val="20"/>
           <w:rtl/>
         </w:rPr>
-        <w:t xml:space="preserve">ס׳ 2 לחוקת מצרים (2014); ס׳ 1 לקוד האזרחי המצרי (ובו מדרג: חקיקה, מנהג, עקרונות השריעה, עקרונות הצדק); חוק הירושה המצרי, חוק מס׳ 77 לשנת 1943; ולצוואות – חוק מס׳ 71 לשנת 1946.</w:t>
+        <w:t xml:space="preserve">חוק מס׳ 9 לשנת 2022 (מצרים), המתקן את חוק מס׳ 114 לשנת 1946; ראו </w:t>
+      </w:r>
+      <w:r>
+        <w:rPr>
+          <w:rFonts w:ascii="Times New Roman" w:cs="Times New Roman" w:eastAsia="Times New Roman" w:hAnsi="Times New Roman"/>
+          <w:sz w:val="20"/>
+          <w:szCs w:val="20"/>
+        </w:rPr>
+        <w:t xml:space="preserve">Shalakany Law Office, “New Amendments to Real Estate Registration Law” (2022)</w:t>
+      </w:r>
+      <w:r>
+        <w:rPr>
+          <w:rFonts w:ascii="David" w:cs="David" w:eastAsia="David" w:hAnsi="David"/>
+          <w:sz w:val="20"/>
+          <w:szCs w:val="20"/>
+          <w:rtl/>
+        </w:rPr>
+        <w:t xml:space="preserve">.</w:t>
       </w:r>
     </w:p>
   </w:footnote>
@@ -12928,24 +13020,7 @@
           <w:szCs w:val="20"/>
           <w:rtl/>
         </w:rPr>
-        <w:t xml:space="preserve">לתרגום האנגלי המקובל ראו </w:t>
-      </w:r>
-      <w:r>
-        <w:rPr>
-          <w:rFonts w:ascii="Times New Roman" w:cs="Times New Roman" w:eastAsia="Times New Roman" w:hAnsi="Times New Roman"/>
-          <w:sz w:val="20"/>
-          <w:szCs w:val="20"/>
-        </w:rPr>
-        <w:t xml:space="preserve">C.R. Tyser, D.G. Demetriades &amp; Ismail Haqqi Effendi (trans.), The Mejelle: Being an English Translation of Majallah el-Ahkam-i-Adliya (1901)</w:t>
-      </w:r>
-      <w:r>
-        <w:rPr>
-          <w:rFonts w:ascii="David" w:cs="David" w:eastAsia="David" w:hAnsi="David"/>
-          <w:sz w:val="20"/>
-          <w:szCs w:val="20"/>
-          <w:rtl/>
-        </w:rPr>
-        <w:t xml:space="preserve">; חוק לביטול המג׳לה, התשמ"ד-1984.</w:t>
+        <w:t xml:space="preserve">ס׳ 2 לחוקת מצרים (2014); ס׳ 1 לקוד האזרחי המצרי (ובו מדרג: חקיקה, מנהג, עקרונות השריעה, עקרונות הצדק); חוק הירושה המצרי, חוק מס׳ 77 לשנת 1943; ולצוואות – חוק מס׳ 71 לשנת 1946.</w:t>
       </w:r>
     </w:p>
   </w:footnote>
@@ -12968,7 +13043,7 @@
           <w:szCs w:val="20"/>
           <w:rtl/>
         </w:rPr>
-        <w:t xml:space="preserve">ס׳ 837, 861–862 למג׳לה. לדוקטרינת ההִבָּה הקלאסית ראו </w:t>
+        <w:t xml:space="preserve">לתרגום האנגלי המקובל ראו </w:t>
       </w:r>
       <w:r>
         <w:rPr>
@@ -12976,16 +13051,16 @@
           <w:sz w:val="20"/>
           <w:szCs w:val="20"/>
         </w:rPr>
-        <w:t xml:space="preserve">Joseph Schacht, An Introduction to Islamic Law (1964); Y. Linant de Bellefonds, “Hiba,” in The Encyclopaedia of Islam (2d ed.)</w:t>
-      </w:r>
-      <w:r>
-        <w:rPr>
-          <w:rFonts w:ascii="David" w:cs="David" w:eastAsia="David" w:hAnsi="David"/>
-          <w:sz w:val="20"/>
-          <w:szCs w:val="20"/>
-          <w:rtl/>
-        </w:rPr>
-        <w:t xml:space="preserve">.</w:t>
+        <w:t xml:space="preserve">C.R. Tyser, D.G. Demetriades &amp; Ismail Haqqi Effendi (trans.), The Mejelle: Being an English Translation of Majallah el-Ahkam-i-Adliya (1901)</w:t>
+      </w:r>
+      <w:r>
+        <w:rPr>
+          <w:rFonts w:ascii="David" w:cs="David" w:eastAsia="David" w:hAnsi="David"/>
+          <w:sz w:val="20"/>
+          <w:szCs w:val="20"/>
+          <w:rtl/>
+        </w:rPr>
+        <w:t xml:space="preserve">; חוק לביטול המג׳לה, התשמ"ד-1984.</w:t>
       </w:r>
     </w:p>
   </w:footnote>
@@ -13008,7 +13083,24 @@
           <w:szCs w:val="20"/>
           <w:rtl/>
         </w:rPr>
-        <w:t xml:space="preserve">ס׳ 866 למג׳לה; וכן ס׳ 872 – מות אחד הצדדים חוסם את החזרה.</w:t>
+        <w:t xml:space="preserve">ס׳ 837, 861–862 למג׳לה. לדוקטרינת ההִבָּה הקלאסית ראו </w:t>
+      </w:r>
+      <w:r>
+        <w:rPr>
+          <w:rFonts w:ascii="Times New Roman" w:cs="Times New Roman" w:eastAsia="Times New Roman" w:hAnsi="Times New Roman"/>
+          <w:sz w:val="20"/>
+          <w:szCs w:val="20"/>
+        </w:rPr>
+        <w:t xml:space="preserve">Joseph Schacht, An Introduction to Islamic Law (1964); Y. Linant de Bellefonds, “Hiba,” in The Encyclopaedia of Islam (2d ed.)</w:t>
+      </w:r>
+      <w:r>
+        <w:rPr>
+          <w:rFonts w:ascii="David" w:cs="David" w:eastAsia="David" w:hAnsi="David"/>
+          <w:sz w:val="20"/>
+          <w:szCs w:val="20"/>
+          <w:rtl/>
+        </w:rPr>
+        <w:t xml:space="preserve">.</w:t>
       </w:r>
     </w:p>
   </w:footnote>
@@ -13031,24 +13123,7 @@
           <w:szCs w:val="20"/>
           <w:rtl/>
         </w:rPr>
-        <w:t xml:space="preserve">ס׳ 879 למג׳לה; לדיון עדכני ראו </w:t>
-      </w:r>
-      <w:r>
-        <w:rPr>
-          <w:rFonts w:ascii="Times New Roman" w:cs="Times New Roman" w:eastAsia="Times New Roman" w:hAnsi="Times New Roman"/>
-          <w:sz w:val="20"/>
-          <w:szCs w:val="20"/>
-        </w:rPr>
-        <w:t xml:space="preserve">Siti Norfatirah Abdul Rahmani &amp; Mohd Zamro Muda, “Ownership Status of Hibah Marad al-Mawt,” 34(8) al-Qanatir Int’l J. Islamic Stud. (2025)</w:t>
-      </w:r>
-      <w:r>
-        <w:rPr>
-          <w:rFonts w:ascii="David" w:cs="David" w:eastAsia="David" w:hAnsi="David"/>
-          <w:sz w:val="20"/>
-          <w:szCs w:val="20"/>
-          <w:rtl/>
-        </w:rPr>
-        <w:t xml:space="preserve">.</w:t>
+        <w:t xml:space="preserve">ס׳ 866 למג׳לה; וכן ס׳ 872 – מות אחד הצדדים חוסם את החזרה.</w:t>
       </w:r>
     </w:p>
   </w:footnote>
@@ -13071,25 +13146,7 @@
           <w:szCs w:val="20"/>
           <w:rtl/>
         </w:rPr>
-        <w:t xml:space="preserve">להוראת המעבר ראו ראבילו, </w:t>
-      </w:r>
-      <w:r>
-        <w:rPr>
-          <w:rFonts w:ascii="David" w:cs="David" w:eastAsia="David" w:hAnsi="David"/>
-          <w:sz w:val="20"/>
-          <w:szCs w:val="20"/>
-          <w:rtl/>
-        </w:rPr>
-        <w:t xml:space="preserve">לעיל ה"ש 38</w:t>
-      </w:r>
-      <w:r>
-        <w:rPr>
-          <w:rFonts w:ascii="David" w:cs="David" w:eastAsia="David" w:hAnsi="David"/>
-          <w:sz w:val="20"/>
-          <w:szCs w:val="20"/>
-          <w:rtl/>
-        </w:rPr>
-        <w:t xml:space="preserve">, בעמ׳ 333–337, המתאר את הדין ערב חוק המתנה; והשוו </w:t>
+        <w:t xml:space="preserve">ס׳ 879 למג׳לה; לדיון עדכני ראו </w:t>
       </w:r>
       <w:r>
         <w:rPr>
@@ -13097,16 +13154,16 @@
           <w:sz w:val="20"/>
           <w:szCs w:val="20"/>
         </w:rPr>
-        <w:t xml:space="preserve">L. Landau, “The Gift Law, 1968,” 4 Isr. L. Rev. 260 (1969)</w:t>
-      </w:r>
-      <w:r>
-        <w:rPr>
-          <w:rFonts w:ascii="David" w:cs="David" w:eastAsia="David" w:hAnsi="David"/>
-          <w:sz w:val="20"/>
-          <w:szCs w:val="20"/>
-          <w:rtl/>
-        </w:rPr>
-        <w:t xml:space="preserve">, על החלפת דיני ההִבָּה של המג׳לה בחוק המתנה הישראלי.</w:t>
+        <w:t xml:space="preserve">Siti Norfatirah Abdul Rahmani &amp; Mohd Zamro Muda, “Ownership Status of Hibah Marad al-Mawt,” 34(8) al-Qanatir Int’l J. Islamic Stud. (2025)</w:t>
+      </w:r>
+      <w:r>
+        <w:rPr>
+          <w:rFonts w:ascii="David" w:cs="David" w:eastAsia="David" w:hAnsi="David"/>
+          <w:sz w:val="20"/>
+          <w:szCs w:val="20"/>
+          <w:rtl/>
+        </w:rPr>
+        <w:t xml:space="preserve">.</w:t>
       </w:r>
     </w:p>
   </w:footnote>
@@ -13129,7 +13186,42 @@
           <w:szCs w:val="20"/>
           <w:rtl/>
         </w:rPr>
-        <w:t xml:space="preserve">ס׳ 1660 למג׳לה (ולתביעות בעניין יסוד הוקף – 36 שנים, ס׳ 1661).</w:t>
+        <w:t xml:space="preserve">להוראת המעבר ראו ראבילו, </w:t>
+      </w:r>
+      <w:r>
+        <w:rPr>
+          <w:rFonts w:ascii="David" w:cs="David" w:eastAsia="David" w:hAnsi="David"/>
+          <w:sz w:val="20"/>
+          <w:szCs w:val="20"/>
+          <w:rtl/>
+        </w:rPr>
+        <w:t xml:space="preserve">לעיל ה"ש 38</w:t>
+      </w:r>
+      <w:r>
+        <w:rPr>
+          <w:rFonts w:ascii="David" w:cs="David" w:eastAsia="David" w:hAnsi="David"/>
+          <w:sz w:val="20"/>
+          <w:szCs w:val="20"/>
+          <w:rtl/>
+        </w:rPr>
+        <w:t xml:space="preserve">, בעמ׳ 333–337, המתאר את הדין ערב חוק המתנה; והשוו </w:t>
+      </w:r>
+      <w:r>
+        <w:rPr>
+          <w:rFonts w:ascii="Times New Roman" w:cs="Times New Roman" w:eastAsia="Times New Roman" w:hAnsi="Times New Roman"/>
+          <w:sz w:val="20"/>
+          <w:szCs w:val="20"/>
+        </w:rPr>
+        <w:t xml:space="preserve">L. Landau, “The Gift Law, 1968,” 4 Isr. L. Rev. 260 (1969)</w:t>
+      </w:r>
+      <w:r>
+        <w:rPr>
+          <w:rFonts w:ascii="David" w:cs="David" w:eastAsia="David" w:hAnsi="David"/>
+          <w:sz w:val="20"/>
+          <w:szCs w:val="20"/>
+          <w:rtl/>
+        </w:rPr>
+        <w:t xml:space="preserve">, על החלפת דיני ההִבָּה של המג׳לה בחוק המתנה הישראלי.</w:t>
       </w:r>
     </w:p>
   </w:footnote>
@@ -13152,7 +13244,7 @@
           <w:szCs w:val="20"/>
           <w:rtl/>
         </w:rPr>
-        <w:t xml:space="preserve">ס׳ 1674 למג׳לה. ההקבלה לס׳ 2 לחוק ההתיישנות, התשי"ח-1958, שאף הוא קובע התיישנות דיונית שאינה מפקיעה את הזכות, גלויה לעין.</w:t>
+        <w:t xml:space="preserve">ס׳ 1660 למג׳לה (ולתביעות בעניין יסוד הוקף – 36 שנים, ס׳ 1661).</w:t>
       </w:r>
     </w:p>
   </w:footnote>
@@ -13175,42 +13267,7 @@
           <w:szCs w:val="20"/>
           <w:rtl/>
         </w:rPr>
-        <w:t xml:space="preserve">ס׳ 20 ו-78 לחוק הקרקעות העות׳מאני, 1858. להיסטוריה של יישום הוראות אלה בארץ ישראל ולגלגולן בפסיקה הישראלית ראו </w:t>
-      </w:r>
-      <w:r>
-        <w:rPr>
-          <w:rFonts w:ascii="Times New Roman" w:cs="Times New Roman" w:eastAsia="Times New Roman" w:hAnsi="Times New Roman"/>
-          <w:sz w:val="20"/>
-          <w:szCs w:val="20"/>
-        </w:rPr>
-        <w:t xml:space="preserve">Ahmad Amara, “Dispossession by Law: How the Israeli Judicial System Utilizes Ottoman Land Law to Expel and Dispossess the Bedouins,” J. Levantine Stud. (2015)</w:t>
-      </w:r>
-      <w:r>
-        <w:rPr>
-          <w:rFonts w:ascii="David" w:cs="David" w:eastAsia="David" w:hAnsi="David"/>
-          <w:sz w:val="20"/>
-          <w:szCs w:val="20"/>
-          <w:rtl/>
-        </w:rPr>
-        <w:t xml:space="preserve">; זנדברג, </w:t>
-      </w:r>
-      <w:r>
-        <w:rPr>
-          <w:rFonts w:ascii="David" w:cs="David" w:eastAsia="David" w:hAnsi="David"/>
-          <w:sz w:val="20"/>
-          <w:szCs w:val="20"/>
-          <w:rtl/>
-        </w:rPr>
-        <w:t xml:space="preserve">לעיל ה"ש 10</w:t>
-      </w:r>
-      <w:r>
-        <w:rPr>
-          <w:rFonts w:ascii="David" w:cs="David" w:eastAsia="David" w:hAnsi="David"/>
-          <w:sz w:val="20"/>
-          <w:szCs w:val="20"/>
-          <w:rtl/>
-        </w:rPr>
-        <w:t xml:space="preserve">.</w:t>
+        <w:t xml:space="preserve">ס׳ 1674 למג׳לה. ההקבלה לס׳ 2 לחוק ההתיישנות, התשי"ח-1958, שאף הוא קובע התיישנות דיונית שאינה מפקיעה את הזכות, גלויה לעין.</w:t>
       </w:r>
     </w:p>
   </w:footnote>
@@ -13233,7 +13290,7 @@
           <w:szCs w:val="20"/>
           <w:rtl/>
         </w:rPr>
-        <w:t xml:space="preserve">ס׳ 1521 למג׳לה. השליחות פוקעת ככלל במות השולח – כלל שהעמיד בסימן שאלה את ייפויי הכוח הוותיקים שנועדו לפעול "לאחר אריכות ימים". לניסוח מודרני של דיני הוַכַּאלָה ראו </w:t>
+        <w:t xml:space="preserve">ס׳ 20 ו-78 לחוק הקרקעות העות׳מאני, 1858. להיסטוריה של יישום הוראות אלה בארץ ישראל ולגלגולן בפסיקה הישראלית ראו </w:t>
       </w:r>
       <w:r>
         <w:rPr>
@@ -13241,7 +13298,25 @@
           <w:sz w:val="20"/>
           <w:szCs w:val="20"/>
         </w:rPr>
-        <w:t xml:space="preserve">AAOIFI, Shari’ah Standard No. 23: Agency (2015)</w:t>
+        <w:t xml:space="preserve">Ahmad Amara, “Dispossession by Law: How the Israeli Judicial System Utilizes Ottoman Land Law to Expel and Dispossess the Bedouins,” J. Levantine Stud. (2015)</w:t>
+      </w:r>
+      <w:r>
+        <w:rPr>
+          <w:rFonts w:ascii="David" w:cs="David" w:eastAsia="David" w:hAnsi="David"/>
+          <w:sz w:val="20"/>
+          <w:szCs w:val="20"/>
+          <w:rtl/>
+        </w:rPr>
+        <w:t xml:space="preserve">; זנדברג, </w:t>
+      </w:r>
+      <w:r>
+        <w:rPr>
+          <w:rFonts w:ascii="David" w:cs="David" w:eastAsia="David" w:hAnsi="David"/>
+          <w:sz w:val="20"/>
+          <w:szCs w:val="20"/>
+          <w:rtl/>
+        </w:rPr>
+        <w:t xml:space="preserve">לעיל ה"ש 10</w:t>
       </w:r>
       <w:r>
         <w:rPr>
@@ -13273,45 +13348,24 @@
           <w:szCs w:val="20"/>
           <w:rtl/>
         </w:rPr>
-        <w:t xml:space="preserve">ברק, </w:t>
-      </w:r>
-      <w:r>
-        <w:rPr>
-          <w:rFonts w:ascii="David" w:cs="David" w:eastAsia="David" w:hAnsi="David"/>
-          <w:sz w:val="20"/>
-          <w:szCs w:val="20"/>
-          <w:rtl/>
-        </w:rPr>
-        <w:t xml:space="preserve">לעיל ה"ש 30</w:t>
-      </w:r>
-      <w:r>
-        <w:rPr>
-          <w:rFonts w:ascii="David" w:cs="David" w:eastAsia="David" w:hAnsi="David"/>
-          <w:sz w:val="20"/>
-          <w:szCs w:val="20"/>
-          <w:rtl/>
-        </w:rPr>
-        <w:t xml:space="preserve">, בעמ׳ 1241, 1244; ע"א 516/65 </w:t>
-      </w:r>
-      <w:r>
-        <w:rPr>
-          <w:rFonts w:ascii="David" w:cs="David" w:eastAsia="David" w:hAnsi="David"/>
-          <w:i/>
-          <w:iCs/>
-          <w:sz w:val="20"/>
-          <w:szCs w:val="20"/>
-          <w:rtl/>
-        </w:rPr>
-        <w:t xml:space="preserve">ריעס נ׳ פורר</w:t>
-      </w:r>
-      <w:r>
-        <w:rPr>
-          <w:rFonts w:ascii="David" w:cs="David" w:eastAsia="David" w:hAnsi="David"/>
-          <w:sz w:val="20"/>
-          <w:szCs w:val="20"/>
-          <w:rtl/>
-        </w:rPr>
-        <w:t xml:space="preserve">, פ"ד כ(3) 488 (1966).</w:t>
+        <w:t xml:space="preserve">ס׳ 1521 למג׳לה. השליחות פוקעת ככלל במות השולח – כלל שהעמיד בסימן שאלה את ייפויי הכוח הוותיקים שנועדו לפעול "לאחר אריכות ימים". לניסוח מודרני של דיני הוַכַּאלָה ראו </w:t>
+      </w:r>
+      <w:r>
+        <w:rPr>
+          <w:rFonts w:ascii="Times New Roman" w:cs="Times New Roman" w:eastAsia="Times New Roman" w:hAnsi="Times New Roman"/>
+          <w:sz w:val="20"/>
+          <w:szCs w:val="20"/>
+        </w:rPr>
+        <w:t xml:space="preserve">AAOIFI, Shari’ah Standard No. 23: Agency (2015)</w:t>
+      </w:r>
+      <w:r>
+        <w:rPr>
+          <w:rFonts w:ascii="David" w:cs="David" w:eastAsia="David" w:hAnsi="David"/>
+          <w:sz w:val="20"/>
+          <w:szCs w:val="20"/>
+          <w:rtl/>
+        </w:rPr>
+        <w:t xml:space="preserve">.</w:t>
       </w:r>
     </w:p>
   </w:footnote>
@@ -13329,20 +13383,50 @@
       </w:r>
       <w:r>
         <w:rPr>
-          <w:rFonts w:ascii="Times New Roman" w:cs="Times New Roman" w:eastAsia="Times New Roman" w:hAnsi="Times New Roman"/>
-          <w:sz w:val="20"/>
-          <w:szCs w:val="20"/>
-        </w:rPr>
-        <w:t xml:space="preserve">N.J. Coulson, Succession in the Muslim Family (1971)</w:t>
-      </w:r>
-      <w:r>
-        <w:rPr>
-          <w:rFonts w:ascii="David" w:cs="David" w:eastAsia="David" w:hAnsi="David"/>
-          <w:sz w:val="20"/>
-          <w:szCs w:val="20"/>
-          <w:rtl/>
-        </w:rPr>
-        <w:t xml:space="preserve">.</w:t>
+          <w:rFonts w:ascii="David" w:cs="David" w:eastAsia="David" w:hAnsi="David"/>
+          <w:sz w:val="20"/>
+          <w:szCs w:val="20"/>
+          <w:rtl/>
+        </w:rPr>
+        <w:t xml:space="preserve">ברק, </w:t>
+      </w:r>
+      <w:r>
+        <w:rPr>
+          <w:rFonts w:ascii="David" w:cs="David" w:eastAsia="David" w:hAnsi="David"/>
+          <w:sz w:val="20"/>
+          <w:szCs w:val="20"/>
+          <w:rtl/>
+        </w:rPr>
+        <w:t xml:space="preserve">לעיל ה"ש 30</w:t>
+      </w:r>
+      <w:r>
+        <w:rPr>
+          <w:rFonts w:ascii="David" w:cs="David" w:eastAsia="David" w:hAnsi="David"/>
+          <w:sz w:val="20"/>
+          <w:szCs w:val="20"/>
+          <w:rtl/>
+        </w:rPr>
+        <w:t xml:space="preserve">, בעמ׳ 1241, 1244; ע"א 516/65 </w:t>
+      </w:r>
+      <w:r>
+        <w:rPr>
+          <w:rFonts w:ascii="David" w:cs="David" w:eastAsia="David" w:hAnsi="David"/>
+          <w:i/>
+          <w:iCs/>
+          <w:sz w:val="20"/>
+          <w:szCs w:val="20"/>
+          <w:rtl/>
+        </w:rPr>
+        <w:t xml:space="preserve">ריעס נ׳ פורר</w:t>
+      </w:r>
+      <w:r>
+        <w:rPr>
+          <w:rFonts w:ascii="David" w:cs="David" w:eastAsia="David" w:hAnsi="David"/>
+          <w:sz w:val="20"/>
+          <w:szCs w:val="20"/>
+          <w:rtl/>
+        </w:rPr>
+        <w:t xml:space="preserve">, פ"ד כ(3) 488 (1966).</w:t>
       </w:r>
     </w:p>
   </w:footnote>
@@ -13364,24 +13448,7 @@
           <w:sz w:val="20"/>
           <w:szCs w:val="20"/>
         </w:rPr>
-        <w:t xml:space="preserve">Annelies Moors, Women, Property and Islam: Palestinian Experiences, 1920–1990 (1995)</w:t>
-      </w:r>
-      <w:r>
-        <w:rPr>
-          <w:rFonts w:ascii="David" w:cs="David" w:eastAsia="David" w:hAnsi="David"/>
-          <w:sz w:val="20"/>
-          <w:szCs w:val="20"/>
-          <w:rtl/>
-        </w:rPr>
-        <w:t xml:space="preserve">; ולפרקטיקה בבתי הדין השרעיים בישראל ראו </w:t>
-      </w:r>
-      <w:r>
-        <w:rPr>
-          <w:rFonts w:ascii="Times New Roman" w:cs="Times New Roman" w:eastAsia="Times New Roman" w:hAnsi="Times New Roman"/>
-          <w:sz w:val="20"/>
-          <w:szCs w:val="20"/>
-        </w:rPr>
-        <w:t xml:space="preserve">Aharon Layish, Women and Islamic Law in a Non-Muslim State (1975)</w:t>
+        <w:t xml:space="preserve">N.J. Coulson, Succession in the Muslim Family (1971)</w:t>
       </w:r>
       <w:r>
         <w:rPr>
@@ -13412,25 +13479,24 @@
           <w:sz w:val="20"/>
           <w:szCs w:val="20"/>
         </w:rPr>
-        <w:t xml:space="preserve">Ruth Kark, “Consequences of the Ottoman Land Law: Agrarian and Privatization Processes in Palestine, 1858–1918,” in Societies, Social Inequalities and Marginalization 101 (R. Chand et al. eds., 2017)</w:t>
-      </w:r>
-      <w:r>
-        <w:rPr>
-          <w:rFonts w:ascii="David" w:cs="David" w:eastAsia="David" w:hAnsi="David"/>
-          <w:sz w:val="20"/>
-          <w:szCs w:val="20"/>
-          <w:rtl/>
-        </w:rPr>
-        <w:t xml:space="preserve">; נדן, </w:t>
-      </w:r>
-      <w:r>
-        <w:rPr>
-          <w:rFonts w:ascii="David" w:cs="David" w:eastAsia="David" w:hAnsi="David"/>
-          <w:sz w:val="20"/>
-          <w:szCs w:val="20"/>
-          <w:rtl/>
-        </w:rPr>
-        <w:t xml:space="preserve">לעיל ה"ש 14</w:t>
+        <w:t xml:space="preserve">Annelies Moors, Women, Property and Islam: Palestinian Experiences, 1920–1990 (1995)</w:t>
+      </w:r>
+      <w:r>
+        <w:rPr>
+          <w:rFonts w:ascii="David" w:cs="David" w:eastAsia="David" w:hAnsi="David"/>
+          <w:sz w:val="20"/>
+          <w:szCs w:val="20"/>
+          <w:rtl/>
+        </w:rPr>
+        <w:t xml:space="preserve">; ולפרקטיקה בבתי הדין השרעיים בישראל ראו </w:t>
+      </w:r>
+      <w:r>
+        <w:rPr>
+          <w:rFonts w:ascii="Times New Roman" w:cs="Times New Roman" w:eastAsia="Times New Roman" w:hAnsi="Times New Roman"/>
+          <w:sz w:val="20"/>
+          <w:szCs w:val="20"/>
+        </w:rPr>
+        <w:t xml:space="preserve">Aharon Layish, Women and Islamic Law in a Non-Muslim State (1975)</w:t>
       </w:r>
       <w:r>
         <w:rPr>
@@ -13457,20 +13523,29 @@
       </w:r>
       <w:r>
         <w:rPr>
-          <w:rFonts w:ascii="David" w:cs="David" w:eastAsia="David" w:hAnsi="David"/>
-          <w:sz w:val="20"/>
-          <w:szCs w:val="20"/>
-          <w:rtl/>
-        </w:rPr>
-        <w:t xml:space="preserve">ראו לעיל פרק ה ופרק ו.2.4; והשוו </w:t>
-      </w:r>
-      <w:r>
-        <w:rPr>
           <w:rFonts w:ascii="Times New Roman" w:cs="Times New Roman" w:eastAsia="Times New Roman" w:hAnsi="Times New Roman"/>
           <w:sz w:val="20"/>
           <w:szCs w:val="20"/>
         </w:rPr>
-        <w:t xml:space="preserve">Kareem Ibrahim &amp; Deena Khalil, “Land Titling: A Tool, not a Panacea — Insights from Egypt,” Metropolitics (Dec. 20, 2016)</w:t>
+        <w:t xml:space="preserve">Ruth Kark, “Consequences of the Ottoman Land Law: Agrarian and Privatization Processes in Palestine, 1858–1918,” in Societies, Social Inequalities and Marginalization 101 (R. Chand et al. eds., 2017)</w:t>
+      </w:r>
+      <w:r>
+        <w:rPr>
+          <w:rFonts w:ascii="David" w:cs="David" w:eastAsia="David" w:hAnsi="David"/>
+          <w:sz w:val="20"/>
+          <w:szCs w:val="20"/>
+          <w:rtl/>
+        </w:rPr>
+        <w:t xml:space="preserve">; נדן, </w:t>
+      </w:r>
+      <w:r>
+        <w:rPr>
+          <w:rFonts w:ascii="David" w:cs="David" w:eastAsia="David" w:hAnsi="David"/>
+          <w:sz w:val="20"/>
+          <w:szCs w:val="20"/>
+          <w:rtl/>
+        </w:rPr>
+        <w:t xml:space="preserve">לעיל ה"ש 14</w:t>
       </w:r>
       <w:r>
         <w:rPr>
@@ -13502,36 +13577,15 @@
           <w:szCs w:val="20"/>
           <w:rtl/>
         </w:rPr>
-        <w:t xml:space="preserve">עניין </w:t>
-      </w:r>
-      <w:r>
-        <w:rPr>
-          <w:rFonts w:ascii="David" w:cs="David" w:eastAsia="David" w:hAnsi="David"/>
-          <w:i/>
-          <w:iCs/>
-          <w:sz w:val="20"/>
-          <w:szCs w:val="20"/>
-          <w:rtl/>
-        </w:rPr>
-        <w:t xml:space="preserve">צימבלר</w:t>
-      </w:r>
-      <w:r>
-        <w:rPr>
-          <w:rFonts w:ascii="David" w:cs="David" w:eastAsia="David" w:hAnsi="David"/>
-          <w:sz w:val="20"/>
-          <w:szCs w:val="20"/>
-          <w:rtl/>
-        </w:rPr>
-        <w:t xml:space="preserve">, </w:t>
-      </w:r>
-      <w:r>
-        <w:rPr>
-          <w:rFonts w:ascii="David" w:cs="David" w:eastAsia="David" w:hAnsi="David"/>
-          <w:sz w:val="20"/>
-          <w:szCs w:val="20"/>
-          <w:rtl/>
-        </w:rPr>
-        <w:t xml:space="preserve">לעיל ה"ש 33</w:t>
+        <w:t xml:space="preserve">ראו לעיל פרק ה ופרק ו.2.4; והשוו </w:t>
+      </w:r>
+      <w:r>
+        <w:rPr>
+          <w:rFonts w:ascii="Times New Roman" w:cs="Times New Roman" w:eastAsia="Times New Roman" w:hAnsi="Times New Roman"/>
+          <w:sz w:val="20"/>
+          <w:szCs w:val="20"/>
+        </w:rPr>
+        <w:t xml:space="preserve">Kareem Ibrahim &amp; Deena Khalil, “Land Titling: A Tool, not a Panacea — Insights from Egypt,” Metropolitics (Dec. 20, 2016)</w:t>
       </w:r>
       <w:r>
         <w:rPr>
@@ -13563,16 +13617,36 @@
           <w:szCs w:val="20"/>
           <w:rtl/>
         </w:rPr>
-        <w:t xml:space="preserve">תמ"ש 18541-01-22, </w:t>
-      </w:r>
-      <w:r>
-        <w:rPr>
-          <w:rFonts w:ascii="David" w:cs="David" w:eastAsia="David" w:hAnsi="David"/>
-          <w:sz w:val="20"/>
-          <w:szCs w:val="20"/>
-          <w:rtl/>
-        </w:rPr>
-        <w:t xml:space="preserve">לעיל ה"ש 41</w:t>
+        <w:t xml:space="preserve">עניין </w:t>
+      </w:r>
+      <w:r>
+        <w:rPr>
+          <w:rFonts w:ascii="David" w:cs="David" w:eastAsia="David" w:hAnsi="David"/>
+          <w:i/>
+          <w:iCs/>
+          <w:sz w:val="20"/>
+          <w:szCs w:val="20"/>
+          <w:rtl/>
+        </w:rPr>
+        <w:t xml:space="preserve">צימבלר</w:t>
+      </w:r>
+      <w:r>
+        <w:rPr>
+          <w:rFonts w:ascii="David" w:cs="David" w:eastAsia="David" w:hAnsi="David"/>
+          <w:sz w:val="20"/>
+          <w:szCs w:val="20"/>
+          <w:rtl/>
+        </w:rPr>
+        <w:t xml:space="preserve">, </w:t>
+      </w:r>
+      <w:r>
+        <w:rPr>
+          <w:rFonts w:ascii="David" w:cs="David" w:eastAsia="David" w:hAnsi="David"/>
+          <w:sz w:val="20"/>
+          <w:szCs w:val="20"/>
+          <w:rtl/>
+        </w:rPr>
+        <w:t xml:space="preserve">לעיל ה"ש 33</w:t>
       </w:r>
       <w:r>
         <w:rPr>
@@ -13604,33 +13678,16 @@
           <w:szCs w:val="20"/>
           <w:rtl/>
         </w:rPr>
-        <w:t xml:space="preserve">ראו </w:t>
-      </w:r>
-      <w:r>
-        <w:rPr>
-          <w:rFonts w:ascii="Times New Roman" w:cs="Times New Roman" w:eastAsia="Times New Roman" w:hAnsi="Times New Roman"/>
-          <w:sz w:val="20"/>
-          <w:szCs w:val="20"/>
-        </w:rPr>
-        <w:t xml:space="preserve">Guest v Guest [2022] UKSC 27</w:t>
-      </w:r>
-      <w:r>
-        <w:rPr>
-          <w:rFonts w:ascii="David" w:cs="David" w:eastAsia="David" w:hAnsi="David"/>
-          <w:sz w:val="20"/>
-          <w:szCs w:val="20"/>
-          <w:rtl/>
-        </w:rPr>
-        <w:t xml:space="preserve">, </w:t>
-      </w:r>
-      <w:r>
-        <w:rPr>
-          <w:rFonts w:ascii="David" w:cs="David" w:eastAsia="David" w:hAnsi="David"/>
-          <w:sz w:val="20"/>
-          <w:szCs w:val="20"/>
-          <w:rtl/>
-        </w:rPr>
-        <w:t xml:space="preserve">לעיל ה"ש 88</w:t>
+        <w:t xml:space="preserve">תמ"ש 18541-01-22, </w:t>
+      </w:r>
+      <w:r>
+        <w:rPr>
+          <w:rFonts w:ascii="David" w:cs="David" w:eastAsia="David" w:hAnsi="David"/>
+          <w:sz w:val="20"/>
+          <w:szCs w:val="20"/>
+          <w:rtl/>
+        </w:rPr>
+        <w:t xml:space="preserve">לעיל ה"ש 41</w:t>
       </w:r>
       <w:r>
         <w:rPr>
@@ -13662,11 +13719,69 @@
           <w:szCs w:val="20"/>
           <w:rtl/>
         </w:rPr>
-        <w:t xml:space="preserve">לרפורמה המצרית ראו לעיל פרק ו.2.4.</w:t>
+        <w:t xml:space="preserve">ראו </w:t>
+      </w:r>
+      <w:r>
+        <w:rPr>
+          <w:rFonts w:ascii="Times New Roman" w:cs="Times New Roman" w:eastAsia="Times New Roman" w:hAnsi="Times New Roman"/>
+          <w:sz w:val="20"/>
+          <w:szCs w:val="20"/>
+        </w:rPr>
+        <w:t xml:space="preserve">Guest v Guest [2022] UKSC 27</w:t>
+      </w:r>
+      <w:r>
+        <w:rPr>
+          <w:rFonts w:ascii="David" w:cs="David" w:eastAsia="David" w:hAnsi="David"/>
+          <w:sz w:val="20"/>
+          <w:szCs w:val="20"/>
+          <w:rtl/>
+        </w:rPr>
+        <w:t xml:space="preserve">, </w:t>
+      </w:r>
+      <w:r>
+        <w:rPr>
+          <w:rFonts w:ascii="David" w:cs="David" w:eastAsia="David" w:hAnsi="David"/>
+          <w:sz w:val="20"/>
+          <w:szCs w:val="20"/>
+          <w:rtl/>
+        </w:rPr>
+        <w:t xml:space="preserve">לעיל ה"ש 89</w:t>
+      </w:r>
+      <w:r>
+        <w:rPr>
+          <w:rFonts w:ascii="David" w:cs="David" w:eastAsia="David" w:hAnsi="David"/>
+          <w:sz w:val="20"/>
+          <w:szCs w:val="20"/>
+          <w:rtl/>
+        </w:rPr>
+        <w:t xml:space="preserve">.</w:t>
       </w:r>
     </w:p>
   </w:footnote>
   <w:footnote w:id="126">
+    <w:p>
+      <w:pPr>
+        <w:bidi/>
+        <w:spacing w:after="60"/>
+      </w:pPr>
+      <w:r>
+        <w:rPr>
+          <w:rStyle w:val="FootnoteReference"/>
+        </w:rPr>
+        <w:footnoteRef/>
+      </w:r>
+      <w:r>
+        <w:rPr>
+          <w:rFonts w:ascii="David" w:cs="David" w:eastAsia="David" w:hAnsi="David"/>
+          <w:sz w:val="20"/>
+          <w:szCs w:val="20"/>
+          <w:rtl/>
+        </w:rPr>
+        <w:t xml:space="preserve">לרפורמה המצרית ראו לעיל פרק ו.2.4.</w:t>
+      </w:r>
+    </w:p>
+  </w:footnote>
+  <w:footnote w:id="127">
     <w:p>
       <w:pPr>
         <w:bidi/>

</xml_diff>

<commit_message>
Correct Shaked edition details: second edition (Bursi), not 2014 first edition
Co-Authored-By: Claude Fable 5 <noreply@anthropic.com>
Claude-Session: https://claude.ai/code/session_01PTzmkyUzTNm9DT35momqLP
</commit_message>
<xml_diff>
--- a/seminar/סמינריון-מקרקעין-לא-רשומים.docx
+++ b/seminar/סמינריון-מקרקעין-לא-רשומים.docx
@@ -7931,7 +7931,7 @@
           <w:szCs w:val="24"/>
           <w:rtl/>
         </w:rPr>
-        <w:t xml:space="preserve"> (2014).</w:t>
+        <w:t xml:space="preserve"> (מהדורה שנייה, 2024).</w:t>
       </w:r>
     </w:p>
     <w:p>
@@ -11060,7 +11060,7 @@
           <w:szCs w:val="20"/>
           <w:rtl/>
         </w:rPr>
-        <w:t xml:space="preserve"> 405–408 (מהדורה שנייה, 2023) (להלן: שקד).</w:t>
+        <w:t xml:space="preserve"> 405–408 (מהדורה שנייה, 2024) (להלן: שקד).</w:t>
       </w:r>
     </w:p>
   </w:footnote>

</xml_diff>

<commit_message>
Conform footnotes and bibliography to Uniform Citation Rules 3rd ed.; remove maqaf hyphens from prose
- Italicize Hebrew journal names in all article citations (rule 24.1)
- Drop comma before year in edition parentheticals (rule 23.6)
- En dash between Hebrew and Gregorian statute years (rule 2.4)
- Rabello treatise year per rulebook's own example (1996)
- Missim citation format changed to volume/issue style
- Bluebook styling for foreign sources: small caps for books and journals, italic article titles, UK statute chapter numbers (rules 35-36)
- Remove Hebrew maqaf from compound words in prose; keep hyphens in names, titles and Arabic transliterations

Co-Authored-By: Claude Fable 5 <noreply@anthropic.com>
Claude-Session: https://claude.ai/code/session_01PTzmkyUzTNm9DT35momqLP
</commit_message>
<xml_diff>
--- a/seminar/סמינריון-מקרקעין-לא-רשומים.docx
+++ b/seminar/סמינריון-מקרקעין-לא-רשומים.docx
@@ -89,7 +89,7 @@
           <w:szCs w:val="44"/>
           <w:rtl/>
         </w:rPr>
-        <w:t xml:space="preserve">הכרעה בזכויות במקרקעין לא רשומים בסכסוכים פנים־משפחתיים בחברה הערבית</w:t>
+        <w:t xml:space="preserve">הכרעה בזכויות במקרקעין לא רשומים בסכסוכים פנים משפחתיים בחברה הערבית</w:t>
       </w:r>
     </w:p>
     <w:p>
@@ -212,7 +212,7 @@
           <w:szCs w:val="20"/>
           <w:rtl/>
         </w:rPr>
-        <w:t xml:space="preserve">הערות השוליים והביבליוגרפיה ערוכות על פי כללי האזכור האחיד בכתיבה המשפטית (מהדורה שלישית, 2021)</w:t>
+        <w:t xml:space="preserve">הערות השוליים והביבליוגרפיה ערוכות על פי כללי האזכור האחיד בכתיבה המשפטית (מהדורה שלישית 2021)</w:t>
       </w:r>
     </w:p>
     <w:p>
@@ -320,7 +320,7 @@
           <w:szCs w:val="24"/>
           <w:rtl/>
         </w:rPr>
-        <w:t xml:space="preserve"> ואולם, המציאות הקניינית בישראל – ובחברה הערבית בפרט – רחוקה מן האידיאל הרישומי. חלק ניכר מן המקרקעין ביישובים הערביים מוחזק ומועבר מדור לדור על יסוד הסכמות בעל־פה, ייפויי כוח בלתי חוזרים ישנים, חלוקות משפחתיות בלתי כתובות והחזקה רבת־שנים, בלא שהעסקאות הושלמו ברישום בפנקסי המקרקעין ולעיתים אף בלא שדווחו לרשויות המס. כאשר פורץ סכסוך בתוך המשפחה – בין אחים, בין יורשים או בין דורות – נדרש בית המשפט להכריע בזכויות על יסוד תשתית ראייתית חסרה, שבמרכזה מסמכים ישנים, עדויות בעל־פה וראיות נסיבתיות.</w:t>
+        <w:t xml:space="preserve"> ואולם, המציאות הקניינית בישראל – ובחברה הערבית בפרט – רחוקה מן האידיאל הרישומי. חלק ניכר מן המקרקעין ביישובים הערביים מוחזק ומועבר מדור לדור על יסוד הסכמות בעל פה, ייפויי כוח בלתי חוזרים ישנים, חלוקות משפחתיות בלתי כתובות והחזקה רבת שנים, בלא שהעסקאות הושלמו ברישום בפנקסי המקרקעין ולעיתים אף בלא שדווחו לרשויות המס. כאשר פורץ סכסוך בתוך המשפחה – בין אחים, בין יורשים או בין דורות – נדרש בית המשפט להכריע בזכויות על יסוד תשתית ראייתית חסרה, שבמרכזה מסמכים ישנים, עדויות בעל פה וראיות נסיבתיות.</w:t>
       </w:r>
     </w:p>
     <w:p>
@@ -337,7 +337,7 @@
           <w:szCs w:val="24"/>
           <w:rtl/>
         </w:rPr>
-        <w:t xml:space="preserve">עבודה זו בוחנת – מתוך עמדה ביקורתית – כיצד מכריעים בתי המשפט בישראל בזכויות במקרקעין לא רשומים בסכסוכים פנים־משפחתיים בחברה הערבית. הטענה המרכזית שתפותח היא כפולה: ראשית, כי הדין הישראלי "האורתודוקסי" – זה של סעיפים 6–10 לחוק המקרקעין – מניח שוק נדל"ן מודרני, מערבי ומסחרי, ומתעלם מפרקטיקות קהילתיות ומסורתיות של החזקה והעברה; שנית, כי הכלים שפיתחה הפסיקה כדי למלא את החלל – "זעקת ההגינות", הזכות שביושר, הרישיון הבלתי הדיר – הם פתרונות בדיעבד, התלויים בשיקול דעת שיפוטי רחב, בעוד שהחסם המבני האמיתי, "התניית הרישום" בהסדרת מס היסטורית, נותר על כנו. את הטענות הללו תבחן העבודה גם בראי משפט משווה: המשפט המקובל האנגלי – מקור היניקה ההיסטורי של דוקטרינת הזכויות שביושר;</w:t>
+        <w:t xml:space="preserve">עבודה זו בוחנת – מתוך עמדה ביקורתית – כיצד מכריעים בתי המשפט בישראל בזכויות במקרקעין לא רשומים בסכסוכים פנים משפחתיים בחברה הערבית. הטענה המרכזית שתפותח היא כפולה: ראשית, כי הדין הישראלי "האורתודוקסי" – זה של סעיפים 6–10 לחוק המקרקעין – מניח שוק נדל"ן מודרני, מערבי ומסחרי, ומתעלם מפרקטיקות קהילתיות ומסורתיות של החזקה והעברה; שנית, כי הכלים שפיתחה הפסיקה כדי למלא את החלל – "זעקת ההגינות", הזכות שביושר, הרישיון הבלתי הדיר – הם פתרונות בדיעבד, התלויים בשיקול דעת שיפוטי רחב, בעוד שהחסם המבני האמיתי, "התניית הרישום" בהסדרת מס היסטורית, נותר על כנו. את הטענות הללו תבחן העבודה גם בראי משפט משווה: המשפט המקובל האנגלי – מקור היניקה ההיסטורי של דוקטרינת הזכויות שביושר;</w:t>
       </w:r>
       <w:r>
         <w:rPr>
@@ -352,7 +352,7 @@
           <w:szCs w:val="24"/>
           <w:rtl/>
         </w:rPr>
-        <w:t xml:space="preserve"> המשפט המצרי – שיטה ערבית מודרנית המתמודדת עם שיעורי אי־רישום עצומים; והמשפט השרעי האסלאמי – התשתית ההיסטורית והתרבותית שעליה צמחו דפוסי ההחזקה הבלתי פורמליים הרווחים בחברה הערבית בישראל.</w:t>
+        <w:t xml:space="preserve"> המשפט המצרי – שיטה ערבית מודרנית המתמודדת עם שיעורי אי רישום עצומים; והמשפט השרעי האסלאמי – התשתית ההיסטורית והתרבותית שעליה צמחו דפוסי ההחזקה הבלתי פורמליים הרווחים בחברה הערבית בישראל.</w:t>
       </w:r>
     </w:p>
     <w:p>
@@ -414,7 +414,7 @@
           <w:szCs w:val="24"/>
           <w:rtl/>
         </w:rPr>
-        <w:t xml:space="preserve">באילו כלים משפטיים וראייתיים מתמודדים בתי המשפט בישראל עם היעדר רישום פורמלי בסכסוכי מקרקעין פנים־משפחתיים בחברה הערבית, שעה שחלק גדול מן המקרקעין אינם מוסדרים או נסמכים על הסכמים ישנים – בעל־פה או בייפויי כוח – שלא דווחו לרשויות המס?</w:t>
+        <w:t xml:space="preserve">באילו כלים משפטיים וראייתיים מתמודדים בתי המשפט בישראל עם היעדר רישום פורמלי בסכסוכי מקרקעין פנים משפחתיים בחברה הערבית, שעה שחלק גדול מן המקרקעין אינם מוסדרים או נסמכים על הסכמים ישנים – בעל פה או בייפויי כוח – שלא דווחו לרשויות המס?</w:t>
       </w:r>
     </w:p>
     <w:p>
@@ -504,7 +504,7 @@
           <w:szCs w:val="24"/>
           <w:rtl/>
         </w:rPr>
-        <w:t xml:space="preserve">העבודה משלבת ניתוח דוקטרינרי־ביקורתי של החקיקה והפסיקה הישראלית עם עיון משווה פונקציונלי, והיא בנויה על חמישה צעדי מחקר: (1) מיפוי נורמטיבי וביקורת תפיסת "מסך המרשם" של חוק המקרקעין; (2) ניתוח ביקורתי של המענה הפסיקתי ובחינת יציבותו; (3) שקלול ארגז הכלים הראייתי החלופי שגיבשו בתי המשפט לענייני משפחה; (4) ניתוח "המלכוד הכלכלי" הגלום בחוקי המס; (5) העמדת הממצאים במבחן משווה מול שלוש שיטות המשפט. נקודת המוצא המתודולוגית היא כי שאלת "מה דינו של מי שקנה, קיבל במתנה או ירש מקרקעין אך לא נרשם" היא בעיה אוניברסלית, שכל שיטת משפט נדרשת לה, וכי השוואת הפתרונות מאירה את בחירות המשפט הישראלי באור ביקורתי.</w:t>
+        <w:t xml:space="preserve">העבודה משלבת ניתוח דוקטרינרי ביקורתי של החקיקה והפסיקה הישראלית עם עיון משווה פונקציונלי, והיא בנויה על חמישה צעדי מחקר: (1) מיפוי נורמטיבי וביקורת תפיסת "מסך המרשם" של חוק המקרקעין; (2) ניתוח ביקורתי של המענה הפסיקתי ובחינת יציבותו; (3) שקלול ארגז הכלים הראייתי החלופי שגיבשו בתי המשפט לענייני משפחה; (4) ניתוח "המלכוד הכלכלי" הגלום בחוקי המס; (5) העמדת הממצאים במבחן משווה מול שלוש שיטות המשפט. נקודת המוצא המתודולוגית היא כי שאלת "מה דינו של מי שקנה, קיבל במתנה או ירש מקרקעין אך לא נרשם" היא בעיה אוניברסלית, שכל שיטת משפט נדרשת לה, וכי השוואת הפתרונות מאירה את בחירות המשפט הישראלי באור ביקורתי.</w:t>
       </w:r>
       <w:r>
         <w:rPr>
@@ -577,7 +577,7 @@
           <w:szCs w:val="24"/>
           <w:rtl/>
         </w:rPr>
-        <w:t xml:space="preserve"> עומד על מאפייני סכסוכי המקרקעין הפנים־משפחתיים בחברה הערבית: שורשיהם ההיסטוריים, דפוסי ההעברה הבלתי פורמליים והאנטומיה של הסכסוך הטיפוסי. </w:t>
+        <w:t xml:space="preserve"> עומד על מאפייני סכסוכי המקרקעין הפנים משפחתיים בחברה הערבית: שורשיהם ההיסטוריים, דפוסי ההעברה הבלתי פורמליים והאנטומיה של הסכסוך הטיפוסי. </w:t>
       </w:r>
       <w:r>
         <w:rPr>
@@ -732,7 +732,7 @@
           <w:szCs w:val="24"/>
           <w:rtl/>
         </w:rPr>
-        <w:t xml:space="preserve">חוק המקרקעין, התשכ"ט-1969, עיצב את דיני הקניין הישראליים סביב מרשם המקרקעין. "עסקה במקרקעין" מוגדרת בסעיף 6 לחוק כהקניה של בעלות או של זכות אחרת במקרקעין לפי רצון המקנה, למעט הורשה על פי צוואה;</w:t>
+        <w:t xml:space="preserve">חוק המקרקעין, התשכ"ט–1969, עיצב את דיני הקניין הישראליים סביב מרשם המקרקעין. "עסקה במקרקעין" מוגדרת בסעיף 6 לחוק כהקניה של בעלות או של זכות אחרת במקרקעין לפי רצון המקנה, למעט הורשה על פי צוואה;</w:t>
       </w:r>
       <w:r>
         <w:rPr>
@@ -866,7 +866,7 @@
           <w:szCs w:val="24"/>
           <w:rtl/>
         </w:rPr>
-        <w:t xml:space="preserve">שיטת הרישום הישראלית היא שיטה דואלית. לצד פנקסי הזכויות של המקרקעין המוסדרים – פרי הליכי הסדר לפי פקודת הסדר זכויות במקרקעין [נוסח חדש], התשכ"ט-1969, שמקורם בפקודת קרקעות (סידור זכות הקנין) המנדטורית משנת 1928 – מתקיימים פנקסי שטרות של מקרקעין לא מוסדרים, שהרישום בהם ראייתי בלבד וניתן לסתירה.</w:t>
+        <w:t xml:space="preserve">שיטת הרישום הישראלית היא שיטה דואלית. לצד פנקסי הזכויות של המקרקעין המוסדרים – פרי הליכי הסדר לפי פקודת הסדר זכויות במקרקעין [נוסח חדש], התשכ"ט–1969, שמקורם בפקודת קרקעות (סידור זכות הקנין) המנדטורית משנת 1928 – מתקיימים פנקסי שטרות של מקרקעין לא מוסדרים, שהרישום בהם ראייתי בלבד וניתן לסתירה.</w:t>
       </w:r>
       <w:r>
         <w:rPr>
@@ -881,7 +881,7 @@
           <w:szCs w:val="24"/>
           <w:rtl/>
         </w:rPr>
-        <w:t xml:space="preserve"> הליך ההסדר נועד לברר אחת ולתמיד את הזכויות בקרקע: תביעות מוגשות לפקיד ההסדר, מתבררות, ובסופו נרשמות הזכויות רישום ראשון. סעיף 81 לפקודת ההסדר מורה כי הרישום בעקבות ההסדר מבטל כל זכות הסותרת אותו – הוראה דרמטית, שהפכה את אי־ההשתתפות בהליכי ההסדר לאובדן זכויות של ממש.</w:t>
+        <w:t xml:space="preserve"> הליך ההסדר נועד לברר אחת ולתמיד את הזכויות בקרקע: תביעות מוגשות לפקיד ההסדר, מתבררות, ובסופו נרשמות הזכויות רישום ראשון. סעיף 81 לפקודת ההסדר מורה כי הרישום בעקבות ההסדר מבטל כל זכות הסותרת אותו – הוראה דרמטית, שהפכה את אי ההשתתפות בהליכי ההסדר לאובדן זכויות של ממש.</w:t>
       </w:r>
       <w:r>
         <w:rPr>
@@ -923,7 +923,7 @@
           <w:szCs w:val="24"/>
           <w:rtl/>
         </w:rPr>
-        <w:t xml:space="preserve">המבנה שתואר לעיל – רישום קונסטיטוטיבי, כתב מהותי, ראיה חותכת ותקנת שוק – הוא מבנה קוהרנטי להפליא, אך הקוהרנטיות שלו נשענת על הנחת יסוד סמויה: שוק נדל"ן מודרני, מסחרי ואנונימי, שבו צדדים זרים מתקשרים באמצעות עורכי דין, בודקים נסח טאבו, רושמים הערות אזהרה ומשלימים רישום בתוך חודשים. לשוק כזה, המרשם הוא אכן "מראה" של הזכויות, וכל סטייה ממנו – חריג מסוכן שיש למזערו. אלא שהחוק החיל את המבנה הזה, באחידות עיוורת, גם על מציאות קניינית שונה בתכלית: קהילות שבהן הקרקע היא נכס משפחתי רב־דורי, ההתקשרות נעשית בין קרובים על יסוד אמון, והמרשם – מקום שהוא קיים – קפא לפני דורות על שם אב המשפחה. במציאות זו המרשם אינו מראה אלא מסך: הוא מסתיר את מערך הזכויות החי יותר משהוא משקף אותו.</w:t>
+        <w:t xml:space="preserve">המבנה שתואר לעיל – רישום קונסטיטוטיבי, כתב מהותי, ראיה חותכת ותקנת שוק – הוא מבנה קוהרנטי להפליא, אך הקוהרנטיות שלו נשענת על הנחת יסוד סמויה: שוק נדל"ן מודרני, מסחרי ואנונימי, שבו צדדים זרים מתקשרים באמצעות עורכי דין, בודקים נסח טאבו, רושמים הערות אזהרה ומשלימים רישום בתוך חודשים. לשוק כזה, המרשם הוא אכן "מראה" של הזכויות, וכל סטייה ממנו – חריג מסוכן שיש למזערו. אלא שהחוק החיל את המבנה הזה, באחידות עיוורת, גם על מציאות קניינית שונה בתכלית: קהילות שבהן הקרקע היא נכס משפחתי רב דורי, ההתקשרות נעשית בין קרובים על יסוד אמון, והמרשם – מקום שהוא קיים – קפא לפני דורות על שם אב המשפחה. במציאות זו המרשם אינו מראה אלא מסך: הוא מסתיר את מערך הזכויות החי יותר משהוא משקף אותו.</w:t>
       </w:r>
       <w:r>
         <w:rPr>
@@ -965,7 +965,7 @@
           <w:szCs w:val="32"/>
           <w:rtl/>
         </w:rPr>
-        <w:t xml:space="preserve">פרק ב: מאפייני סכסוכי מקרקעין פנים־משפחתיים בחברה הערבית</w:t>
+        <w:t xml:space="preserve">פרק ב: מאפייני סכסוכי מקרקעין פנים משפחתיים בחברה הערבית</w:t>
       </w:r>
     </w:p>
     <w:p>
@@ -1001,7 +1001,7 @@
           <w:szCs w:val="24"/>
           <w:rtl/>
         </w:rPr>
-        <w:t xml:space="preserve">תופעת אי־הרישום בחברה הערבית אינה "עצלות רישומית"; היא תוצר היסטורי ומבני. תחת השלטון העות׳מאני סווגו הקרקעות על פי חוק הקרקעות העות׳מאני משנת 1858 לקטגוריות – מוּלְכּ, מירי, וַקְף, מַתְרוּכֶּה ומַוַואת – כאשר עבירת קרקעות מסוג מירי חייבה רישום בספרי הטאבו (טאפו).</w:t>
+        <w:t xml:space="preserve">תופעת אי הרישום בחברה הערבית אינה "עצלות רישומית"; היא תוצר היסטורי ומבני. תחת השלטון העות׳מאני סווגו הקרקעות על פי חוק הקרקעות העות׳מאני משנת 1858 לקטגוריות – מוּלְכּ, מירי, וַקְף, מַתְרוּכֶּה ומַוַואת – כאשר עבירת קרקעות מסוג מירי חייבה רישום בספרי הטאבו (טאפו).</w:t>
       </w:r>
       <w:r>
         <w:rPr>
@@ -1031,7 +1031,7 @@
           <w:szCs w:val="24"/>
           <w:rtl/>
         </w:rPr>
-        <w:t xml:space="preserve"> הליכי ההסדר – המנדטוריים והישראליים – שנועדו לחסל את אי־הוודאות הזו, פעלו ביישובים ערביים באופן חלקי בלבד: בחלקם לא הושלמו עד היום, ובאחרים הושלמו תוך רישום קרקעות על שם המדינה ורשות הפיתוח, באופן שהותיר מחזיקים בני דורות בלא רישום.</w:t>
+        <w:t xml:space="preserve"> הליכי ההסדר – המנדטוריים והישראליים – שנועדו לחסל את אי הוודאות הזו, פעלו ביישובים ערביים באופן חלקי בלבד: בחלקם לא הושלמו עד היום, ובאחרים הושלמו תוך רישום קרקעות על שם המדינה ורשות הפיתוח, באופן שהותיר מחזיקים בני דורות בלא רישום.</w:t>
       </w:r>
       <w:r>
         <w:rPr>
@@ -1056,7 +1056,7 @@
           <w:szCs w:val="28"/>
           <w:rtl/>
         </w:rPr>
-        <w:t xml:space="preserve">ב.2 דפוסי ההעברה הבלתי פורמליים: ייפוי הכוח, המתנה שבעל־פה והחלוקה הפנימית</w:t>
+        <w:t xml:space="preserve">ב.2 דפוסי ההעברה הבלתי פורמליים: ייפוי הכוח, המתנה שבעל פה והחלוקה הפנימית</w:t>
       </w:r>
     </w:p>
     <w:p>
@@ -1073,7 +1073,7 @@
           <w:szCs w:val="24"/>
           <w:rtl/>
         </w:rPr>
-        <w:t xml:space="preserve">על המצע ההיסטורי נשתלו, לאחר קום המדינה, שלושה גורמים מודרניים. הראשון – דיני המס: רישום עסקה מותנה, כפי שיפורט בפרק ה, בדיווח לרשויות מיסוי מקרקעין ובתשלום המסים הנגזרים, ובמשפחות שבהן העסקאות נעשו לפני עשרות שנים ולא דווחו, עלות ההסדרה מרתיעה מרישום עד היום. השני – התרבות המשפטית הפנים־משפחתית: העברות בין אב לבניו, בין אחים או אגב נישואין נתפסות כעניין משפחתי שאינו טעון פורמליזציה, ולכל היותר נערך ייפוי כוח נוטריוני בלתי חוזר "ליום פקודה". השלישי – מגבלות תכנוניות המקשות על פיצול חלקות ורישום חלוקות בעין.</w:t>
+        <w:t xml:space="preserve">על המצע ההיסטורי נשתלו, לאחר קום המדינה, שלושה גורמים מודרניים. הראשון – דיני המס: רישום עסקה מותנה, כפי שיפורט בפרק ה, בדיווח לרשויות מיסוי מקרקעין ובתשלום המסים הנגזרים, ובמשפחות שבהן העסקאות נעשו לפני עשרות שנים ולא דווחו, עלות ההסדרה מרתיעה מרישום עד היום. השני – התרבות המשפטית הפנים משפחתית: העברות בין אב לבניו, בין אחים או אגב נישואין נתפסות כעניין משפחתי שאינו טעון פורמליזציה, ולכל היותר נערך ייפוי כוח נוטריוני בלתי חוזר "ליום פקודה". השלישי – מגבלות תכנוניות המקשות על פיצול חלקות ורישום חלוקות בעין.</w:t>
       </w:r>
       <w:r>
         <w:rPr>
@@ -1111,7 +1111,7 @@
           <w:szCs w:val="24"/>
           <w:rtl/>
         </w:rPr>
-        <w:t xml:space="preserve">ההקשר הדמוגרפי־חברתי מבהיר את סדרי הגודל: בסוף שנת 2022 מנתה האוכלוסייה הערבית בישראל כ-2.04 מיליון נפש – כ-21.1% מכלל האוכלוסייה – וכשלושה רבעים מן התושבים הערבים מתגוררים ביישובים ערביים הומוגניים, בכ-163 יישובים.</w:t>
+        <w:t xml:space="preserve">ההקשר הדמוגרפי והחברתי מבהיר את סדרי הגודל: בסוף שנת 2022 מנתה האוכלוסייה הערבית בישראל כ-2.04 מיליון נפש – כ-21.1% מכלל האוכלוסייה – וכשלושה רבעים מן התושבים הערבים מתגוררים ביישובים ערביים הומוגניים, בכ-163 יישובים.</w:t>
       </w:r>
       <w:r>
         <w:rPr>
@@ -1141,7 +1141,7 @@
           <w:szCs w:val="24"/>
           <w:rtl/>
         </w:rPr>
-        <w:t xml:space="preserve"> עדות אמפירית עדכנית לעומק התופעה מצויה גם במחקר שוק המקרקעין: מחקר שנערך לאחרונה בארבעה יישובים ערביים ודרוזיים בישראל מצא כי שוק הקרקעות המקומי מתפקד כתת־שוק נבדל, המעוצב במידה מכרעת על ידי עסקאות פנים־משפחתיות בלתי פורמליות וזכויות קניין בלתי מוסדרות, במנותק ממנגנוני השוק הרגילים.</w:t>
+        <w:t xml:space="preserve"> עדות אמפירית עדכנית לעומק התופעה מצויה גם במחקר שוק המקרקעין: מחקר שנערך לאחרונה בארבעה יישובים ערביים ודרוזיים בישראל מצא כי שוק הקרקעות המקומי מתפקד כתת שוק נבדל, המעוצב במידה מכרעת על ידי עסקאות פנים משפחתיות בלתי פורמליות וזכויות קניין בלתי מוסדרות, במנותק ממנגנוני השוק הרגילים.</w:t>
       </w:r>
       <w:r>
         <w:rPr>
@@ -1183,7 +1183,7 @@
           <w:szCs w:val="24"/>
           <w:rtl/>
         </w:rPr>
-        <w:t xml:space="preserve">הסכסוך הפנים־משפחתי הטיפוסי מבשיל בשלושה שלבים. בשלב הראשון – "שלב ההרמוניה" – מתבצעת ההעברה הבלתי פורמלית: האב מחלק בעל־פה את חלקותיו בין בניו, או מוכר לאחיו חלקה כנגד ייפוי כוח בלתי חוזר; הכל יודעים, איש אינו רושם. בשלב השני – "שלב ההשקעה" – המקבל בונה את ביתו, מוציא היתר בנייה בהסכמת בני המשפחה, משלם ארנונה, נוטע ומגדר; ההסתמכות מעמיקה, והתיעוד היחיד הוא מנהלי ונסיבתי. בשלב השלישי – "שלב הקרע" – נפטר המקנה, ובני הדור השני או השלישי, שלא היו צד להסכמות ולעיתים לא ידעו עליהן, מגלים כי המרשם – או צו הירושה – מקנה להם על הנייר את שחולק זה מכבר בפועל. התביעה מוגשת אז, עשרות שנים לאחר האירועים, כשעדי המפתח אינם עוד בין החיים.</w:t>
+        <w:t xml:space="preserve">הסכסוך הפנים משפחתי הטיפוסי מבשיל בשלושה שלבים. בשלב הראשון – "שלב ההרמוניה" – מתבצעת ההעברה הבלתי פורמלית: האב מחלק בעל פה את חלקותיו בין בניו, או מוכר לאחיו חלקה כנגד ייפוי כוח בלתי חוזר; הכל יודעים, איש אינו רושם. בשלב השני – "שלב ההשקעה" – המקבל בונה את ביתו, מוציא היתר בנייה בהסכמת בני המשפחה, משלם ארנונה, נוטע ומגדר; ההסתמכות מעמיקה, והתיעוד היחיד הוא מנהלי ונסיבתי. בשלב השלישי – "שלב הקרע" – נפטר המקנה, ובני הדור השני או השלישי, שלא היו צד להסכמות ולעיתים לא ידעו עליהן, מגלים כי המרשם – או צו הירושה – מקנה להם על הנייר את שחולק זה מכבר בפועל. התביעה מוגשת אז, עשרות שנים לאחר האירועים, כשעדי המפתח אינם עוד בין החיים.</w:t>
       </w:r>
       <w:r>
         <w:rPr>
@@ -1244,7 +1244,7 @@
           <w:szCs w:val="28"/>
           <w:rtl/>
         </w:rPr>
-        <w:t xml:space="preserve">ג.1 עסקה שלא נגמרה ברישום: מהתחייבות אובליגטורית לזכות מעין־קניינית</w:t>
+        <w:t xml:space="preserve">ג.1 עסקה שלא נגמרה ברישום: מהתחייבות אובליגטורית לזכות מעין קניינית</w:t>
       </w:r>
     </w:p>
     <w:p>
@@ -1281,7 +1281,7 @@
           <w:szCs w:val="24"/>
           <w:rtl/>
         </w:rPr>
-        <w:t xml:space="preserve"> שב בית המשפט העליון והעניק לזכות זו ממד קנייני־מהותי: משנכרת חוזה מכר מחייב, קמה לקונה "זכות שביושר תוצרת הארץ" – זכות מעין־קניינית הפועלת כלפי צדדים שלישיים מסוימים – ולפיכך עיקול שהוטל על ידי נושה של המוכר לאחר ההתחייבות אינו גובר על זכות הקונה, אף אם הקונה לא רשם הערת אזהרה.</w:t>
+        <w:t xml:space="preserve"> שב בית המשפט העליון והעניק לזכות זו ממד קנייני מהותי: משנכרת חוזה מכר מחייב, קמה לקונה "זכות שביושר תוצרת הארץ" – זכות מעין קניינית הפועלת כלפי צדדים שלישיים מסוימים – ולפיכך עיקול שהוטל על ידי נושה של המוכר לאחר ההתחייבות אינו גובר על זכות הקונה, אף אם הקונה לא רשם הערת אזהרה.</w:t>
       </w:r>
       <w:r>
         <w:rPr>
@@ -1397,7 +1397,7 @@
           <w:szCs w:val="24"/>
           <w:rtl/>
         </w:rPr>
-        <w:t xml:space="preserve">להשלמת התמונה חשוב דיוק אחד, שהובלט בספרות ההוצאה לפועל: מחדלו של הקונה מרישום הערת אזהרה אינו נזקף לחובתו במערכה מול הנושה המעקל. הערת האזהרה נועדה למנוע "תאונות משפטיות" בהתנגשות בין עסקאות נוגדות – להזהיר רוכש פוטנציאלי מפני התקשרות עם מי שכבר התחייב; ואולם הנושה הכספי, שנשייתו נולדה בלא כל זיקה לנכס ואשר אינו מסתמך על מצבו הרישומי, אינו נמנה עם מי שההערה נועדה להגן עליהם, ולכן אין הצדקה להעדיפו רק בשל אי־הרישום.</w:t>
+        <w:t xml:space="preserve">להשלמת התמונה חשוב דיוק אחד, שהובלט בספרות ההוצאה לפועל: מחדלו של הקונה מרישום הערת אזהרה אינו נזקף לחובתו במערכה מול הנושה המעקל. הערת האזהרה נועדה למנוע "תאונות משפטיות" בהתנגשות בין עסקאות נוגדות – להזהיר רוכש פוטנציאלי מפני התקשרות עם מי שכבר התחייב; ואולם הנושה הכספי, שנשייתו נולדה בלא כל זיקה לנכס ואשר אינו מסתמך על מצבו הרישומי, אינו נמנה עם מי שההערה נועדה להגן עליהם, ולכן אין הצדקה להעדיפו רק בשל אי הרישום.</w:t>
       </w:r>
       <w:r>
         <w:rPr>
@@ -1412,7 +1412,7 @@
           <w:szCs w:val="24"/>
           <w:rtl/>
         </w:rPr>
-        <w:t xml:space="preserve"> לקביעה זו חשיבות מעשית ראשונה במעלה בענייננו: בסכסוכים הפנים־משפחתיים איש אינו רושם הערות אזהרה – ובמקרקעין שאינם רשומים כלל אף אין אפשרות לרשמן – ובכל זאת אין בכך כדי להפקיר את זכות בני המשפחה לנושי המקנה.</w:t>
+        <w:t xml:space="preserve"> לקביעה זו חשיבות מעשית ראשונה במעלה בענייננו: בסכסוכים הפנים משפחתיים איש אינו רושם הערות אזהרה – ובמקרקעין שאינם רשומים כלל אף אין אפשרות לרשמן – ובכל זאת אין בכך כדי להפקיר את זכות בני המשפחה לנושי המקנה.</w:t>
       </w:r>
     </w:p>
     <w:p>
@@ -1448,7 +1448,7 @@
           <w:szCs w:val="24"/>
           <w:rtl/>
         </w:rPr>
-        <w:t xml:space="preserve">בסכסוכים הפנים־משפחתיים, המסמך היחיד הקיים על פי רוב אינו חוזה ערוך כדין אלא ייפוי כוח נוטריוני בלתי חוזר, שנחתם לפני עשרות שנים לטובת הקונה או המקבל. השאלה אם ייפוי כוח כזה ממלא את דרישת הכתב שבסעיף 8 לחוק, שנדונה בפרק א, הוכרעה בחיוב עקרוני: בעניין </w:t>
+        <w:t xml:space="preserve">בסכסוכים הפנים משפחתיים, המסמך היחיד הקיים על פי רוב אינו חוזה ערוך כדין אלא ייפוי כוח נוטריוני בלתי חוזר, שנחתם לפני עשרות שנים לטובת הקונה או המקבל. השאלה אם ייפוי כוח כזה ממלא את דרישת הכתב שבסעיף 8 לחוק, שנדונה בפרק א, הוכרעה בחיוב עקרוני: בעניין </w:t>
       </w:r>
       <w:r>
         <w:rPr>
@@ -1593,7 +1593,7 @@
           <w:szCs w:val="24"/>
           <w:rtl/>
         </w:rPr>
-        <w:t xml:space="preserve">עם זאת, אין ייפוי הכוח חזות הכל. ראשית, ככלי הרשאה הוא כפוף לדיני השליחות: רק ייפוי כוח שניתן "להבטחת זכותו של אדם אחר", כאמור בסעיף 14(ב) לחוק השליחות, התשכ"ה-1965, אינו פוקע בביטולו של השולח או במותו – ושאלת סיווגו של מסמך קונקרטי היא שאלה פרשנית נכבדה.</w:t>
+        <w:t xml:space="preserve">עם זאת, אין ייפוי הכוח חזות הכל. ראשית, ככלי הרשאה הוא כפוף לדיני השליחות: רק ייפוי כוח שניתן "להבטחת זכותו של אדם אחר", כאמור בסעיף 14(ב) לחוק השליחות, התשכ"ה–1965, אינו פוקע בביטולו של השולח או במותו – ושאלת סיווגו של מסמך קונקרטי היא שאלה פרשנית נכבדה.</w:t>
       </w:r>
       <w:r>
         <w:rPr>
@@ -1643,7 +1643,7 @@
           <w:szCs w:val="24"/>
           <w:rtl/>
         </w:rPr>
-        <w:t xml:space="preserve"> שנית, כותרת "בלתי חוזר" אינה מילת קסם – וברק אף מטעים כי הכינוי עצמו "אינו מוצלח": אי־ההדירות היא תוצאת האינטרס המובטח, לא תולדת הכותרת שנבחרה למסמך.</w:t>
+        <w:t xml:space="preserve"> שנית, כותרת "בלתי חוזר" אינה מילת קסם – וברק אף מטעים כי הכינוי עצמו "אינו מוצלח": אי ההדירות היא תוצאת האינטרס המובטח, לא תולדת הכותרת שנבחרה למסמך.</w:t>
       </w:r>
       <w:r>
         <w:rPr>
@@ -1735,7 +1735,7 @@
           <w:szCs w:val="24"/>
           <w:rtl/>
         </w:rPr>
-        <w:t xml:space="preserve">מה דינם של אותם מקרים – שכיחים בסכסוך הפנים־משפחתי – שבהם אין אפילו ייפוי כוח, אלא הסכמה בעל־פה שקוימה בפועל? כאן נכנסת לפעולה הלכת </w:t>
+        <w:t xml:space="preserve">מה דינם של אותם מקרים – שכיחים בסכסוך הפנים משפחתי – שבהם אין אפילו ייפוי כוח, אלא הסכמה בעל פה שקוימה בפועל? כאן נכנסת לפעולה הלכת </w:t>
       </w:r>
       <w:r>
         <w:rPr>
@@ -1755,7 +1755,7 @@
           <w:szCs w:val="24"/>
           <w:rtl/>
         </w:rPr>
-        <w:t xml:space="preserve">. באותה פרשה נכרת בעל־פה הסכם קומבינציה, הצדדים קיימוהו במלואו – הבתים נבנו והחזקות נמסרו – ורק אז נטען להיעדר מסמך בכתב. בית המשפט העליון אכף את העסקה: לשיטת הנשיא ברק, עקרון תום הלב שבסעיף 12 לחוק החוזים עשוי, במקרים מיוחדים שבהם עולה "זעקת ההגינות", לגבור על דרישת הכתב; לשיטת השופט זמיר, ביצועו המלא של ההסכם בפועל ממלא את תכליות הדרישה.</w:t>
+        <w:t xml:space="preserve">. באותה פרשה נכרת בעל פה הסכם קומבינציה, הצדדים קיימוהו במלואו – הבתים נבנו והחזקות נמסרו – ורק אז נטען להיעדר מסמך בכתב. בית המשפט העליון אכף את העסקה: לשיטת הנשיא ברק, עקרון תום הלב שבסעיף 12 לחוק החוזים עשוי, במקרים מיוחדים שבהם עולה "זעקת ההגינות", לגבור על דרישת הכתב; לשיטת השופט זמיר, ביצועו המלא של ההסכם בפועל ממלא את תכליות הדרישה.</w:t>
       </w:r>
       <w:r>
         <w:rPr>
@@ -1770,7 +1770,7 @@
           <w:szCs w:val="24"/>
           <w:rtl/>
         </w:rPr>
-        <w:t xml:space="preserve"> הלכה זו – שנועדה מלכתחילה למנוע שימוש ציני בדרישת הצורה – היא כלי מרכזי בסכסוכים משפחתיים, שבהם יחסי האמון הם ההסבר הטבעי להיעדר המסמכים, והסתמכות רבת־שנים (בניית בית, השקעה, מגורים) היא שיוצרת את זעקת ההגינות.</w:t>
+        <w:t xml:space="preserve"> הלכה זו – שנועדה מלכתחילה למנוע שימוש ציני בדרישת הצורה – היא כלי מרכזי בסכסוכים משפחתיים, שבהם יחסי האמון הם ההסבר הטבעי להיעדר המסמכים, והסתמכות רבת שנים (בניית בית, השקעה, מגורים) היא שיוצרת את זעקת ההגינות.</w:t>
       </w:r>
     </w:p>
     <w:p>
@@ -1847,7 +1847,7 @@
           <w:szCs w:val="24"/>
           <w:rtl/>
         </w:rPr>
-        <w:t xml:space="preserve"> אף נקבעה רשימה של יסודות שחובה שיופיעו במסמך; אולם בהמשך נטשה הפסיקה את עמדתה המקורית – היא צמצמה את מספר הפרטים הנדרשים, פיתחה מנגנוני "השלמה נורמטיבית" מכוח הוראות חוק ונוהג, והתירה להשלים יסוד חסר אף בראיות חיצוניות שבעל־פה – עד שדי כיום, ככלל, במסמך דל פרטים המעיד כי הצדדים גמרו בדעתם להתקשר.</w:t>
+        <w:t xml:space="preserve"> אף נקבעה רשימה של יסודות שחובה שיופיעו במסמך; אולם בהמשך נטשה הפסיקה את עמדתה המקורית – היא צמצמה את מספר הפרטים הנדרשים, פיתחה מנגנוני "השלמה נורמטיבית" מכוח הוראות חוק ונוהג, והתירה להשלים יסוד חסר אף בראיות חיצוניות שבעל פה – עד שדי כיום, ככלל, במסמך דל פרטים המעיד כי הצדדים גמרו בדעתם להתקשר.</w:t>
       </w:r>
       <w:r>
         <w:rPr>
@@ -1877,7 +1877,7 @@
           <w:szCs w:val="24"/>
           <w:rtl/>
         </w:rPr>
-        <w:t xml:space="preserve"> יישומה של זעקת ההגינות בסכסוך פנים־משפחתי מן החברה הערבית מדגים את כוחה: בעניין </w:t>
+        <w:t xml:space="preserve"> יישומה של זעקת ההגינות בסכסוך פנים משפחתי מן החברה הערבית מדגים את כוחה: בעניין </w:t>
       </w:r>
       <w:r>
         <w:rPr>
@@ -1920,7 +1920,7 @@
           <w:szCs w:val="24"/>
           <w:rtl/>
         </w:rPr>
-        <w:t xml:space="preserve">חשיבות מעשית ממדרגה ראשונה נודעת בהקשר זה למשטר הבין־זמני. עסקאות רבות מן הנדונות בסכסוכים אלה נכרתו לפני יום תחילתו של חוק המקרקעין (1.1.1970), וחלות עליהן דרישות הצורה של הדין הקודם: סעיף 80 לחוק הפרוצדורה האזרחית העות׳מאני, שפורש בפסיקה כדרישה ראייתית־פרובטיבית ולא מהותית – כך שניתן להוכיח את העסקה בעדות בעל־פה, מקום שבעל הדין שכנגד לא התנגד לעדות.</w:t>
+        <w:t xml:space="preserve">חשיבות מעשית ממדרגה ראשונה נודעת בהקשר זה למשטר הבין זמני. עסקאות רבות מן הנדונות בסכסוכים אלה נכרתו לפני יום תחילתו של חוק המקרקעין (1.1.1970), וחלות עליהן דרישות הצורה של הדין הקודם: סעיף 80 לחוק הפרוצדורה האזרחית העות׳מאני, שפורש בפסיקה כדרישה ראייתית פרובטיבית ולא מהותית – כך שניתן להוכיח את העסקה בעדות בעל פה, מקום שבעל הדין שכנגד לא התנגד לעדות.</w:t>
       </w:r>
       <w:r>
         <w:rPr>
@@ -1997,7 +1997,7 @@
           <w:szCs w:val="24"/>
           <w:rtl/>
         </w:rPr>
-        <w:t xml:space="preserve">חלק ניכר מן ההעברות הפנים־משפחתיות אינן מכר אלא מתנה: אב "הרושם" בעל־פה מגרש לבנו, סב המחלק את אדמותיו לנכדיו. חוק המתנה, התשכ"ח-1968, מבחין בין מתנה שהוקנתה לאלתר לבין התחייבות לתת מתנה בעתיד, הטעונה מסמך בכתב.</w:t>
+        <w:t xml:space="preserve">חלק ניכר מן ההעברות הפנים משפחתיות אינן מכר אלא מתנה: אב "הרושם" בעל פה מגרש לבנו, סב המחלק את אדמותיו לנכדיו. חוק המתנה, התשכ"ח–1968, מבחין בין מתנה שהוקנתה לאלתר לבין התחייבות לתת מתנה בעתיד, הטעונה מסמך בכתב.</w:t>
       </w:r>
       <w:r>
         <w:rPr>
@@ -2080,7 +2080,7 @@
           <w:szCs w:val="24"/>
           <w:rtl/>
         </w:rPr>
-        <w:t xml:space="preserve"> זהו היפוך מרשים של נקודת המוצא הרישומית: המסמך הבלתי רשום מכריע את הרישום, מכוח סעיף 9 לחוק המקרקעין ועקרון תום הלב. ומנגד ניצב, שוב, הגבול הבין־זמני – והפעם לחומרה: בעניין </w:t>
+        <w:t xml:space="preserve"> זהו היפוך מרשים של נקודת המוצא הרישומית: המסמך הבלתי רשום מכריע את הרישום, מכוח סעיף 9 לחוק המקרקעין ועקרון תום הלב. ומנגד ניצב, שוב, הגבול הבין זמני – והפעם לחומרה: בעניין </w:t>
       </w:r>
       <w:r>
         <w:rPr>
@@ -2312,7 +2312,7 @@
           <w:szCs w:val="24"/>
           <w:rtl/>
         </w:rPr>
-        <w:t xml:space="preserve"> משמעות הדבר בסכסוך הבין־דורי היא שהרישיון מגן על הדור שקיבל את ההרשאה, אך אינו יכול לשמש תשתית לתביעת בעלות של הדור השלישי. בכך נבדל הרישיון מן הזכות שביושר: הראשון הוא מגן; השנייה – חרב. ודוק: בעניין </w:t>
+        <w:t xml:space="preserve"> משמעות הדבר בסכסוך הבין דורי היא שהרישיון מגן על הדור שקיבל את ההרשאה, אך אינו יכול לשמש תשתית לתביעת בעלות של הדור השלישי. בכך נבדל הרישיון מן הזכות שביושר: הראשון הוא מגן; השנייה – חרב. ודוק: בעניין </w:t>
       </w:r>
       <w:r>
         <w:rPr>
@@ -2332,7 +2332,7 @@
           <w:szCs w:val="24"/>
           <w:rtl/>
         </w:rPr>
-        <w:t xml:space="preserve"> עצמו נדחתה טענת משפחה ששילמה כשליש משווי הדירה וישבה בה עשרות שנים, ונקבע כי בידיה רישיון מגורים בלבד שאינו עובר ליורשים – המחשה חדה למחיר שגובה סיווגה של החזקה רבת־שנים כ"רשות" גרידא.</w:t>
+        <w:t xml:space="preserve"> עצמו נדחתה טענת משפחה ששילמה כשליש משווי הדירה וישבה בה עשרות שנים, ונקבע כי בידיה רישיון מגורים בלבד שאינו עובר ליורשים – המחשה חדה למחיר שגובה סיווגה של החזקה רבת שנים כ"רשות" גרידא.</w:t>
       </w:r>
     </w:p>
     <w:p>
@@ -2349,7 +2349,7 @@
           <w:szCs w:val="24"/>
           <w:rtl/>
         </w:rPr>
-        <w:t xml:space="preserve">ואולם דווקא במקרים החריגים שבהם מוכרת אי־הדירות, חורג הרישיון ממעמדו האישי. בעניין </w:t>
+        <w:t xml:space="preserve">ואולם דווקא במקרים החריגים שבהם מוכרת אי הדירות, חורג הרישיון ממעמדו האישי. בעניין </w:t>
       </w:r>
       <w:r>
         <w:rPr>
@@ -2369,7 +2369,7 @@
           <w:szCs w:val="24"/>
           <w:rtl/>
         </w:rPr>
-        <w:t xml:space="preserve"> העניקו הורים לבנם ולכלתו זכות מגורים בנחלתם; משהוטל עיקול על זכויות ההורים, נפסק כי זכות בר־הרשות הבלתי הדירה גוברת על המעקל: מקום שהצדק מחייב את קיומה של זכות בלתי הדירה, מכוחו של השתק – המכונה גם השתק קנייני (proprietary estoppel) – תחול הזכות אף כלפי צד שלישי שאליו עברו זכויות בעל המקרקעין, נושה, יורש או רוכש, למעט רוכש בתמורה ובתום לב שלא ידע על זכות השימוש.</w:t>
+        <w:t xml:space="preserve"> העניקו הורים לבנם ולכלתו זכות מגורים בנחלתם; משהוטל עיקול על זכויות ההורים, נפסק כי זכות בר הרשות הבלתי הדירה גוברת על המעקל: מקום שהצדק מחייב את קיומה של זכות בלתי הדירה, מכוחו של השתק – המכונה גם השתק קנייני (proprietary estoppel) – תחול הזכות אף כלפי צד שלישי שאליו עברו זכויות בעל המקרקעין, נושה, יורש או רוכש, למעט רוכש בתמורה ובתום לב שלא ידע על זכות השימוש.</w:t>
       </w:r>
       <w:r>
         <w:rPr>
@@ -2384,7 +2384,7 @@
           <w:szCs w:val="24"/>
           <w:rtl/>
         </w:rPr>
-        <w:t xml:space="preserve"> זהו אחד המקומות שבהם הדוקטרינה הישראלית קוראת לעצמה בשמה האנגלי – עדות לכך שהזיקה לדיני היושר המשווים, שתידון בפרק ו, איננה מטפורה אלא ייחוס מפורש. ולבסוף, גם רישיון שבוטל כדין אינו מותיר את בר־הרשות בידיים ריקות: ביטולה של רשות שהושקע על יסודה עשוי להיות מותנה בפיצוי, אלא שההלכה גודרת אותו – פיצוי בגין השבחת המקרקעין, קרי ההשקעות שהשביחו את הקרקע, ולא פיצוי בגין זכות כלשהי במקרקעין.</w:t>
+        <w:t xml:space="preserve"> זהו אחד המקומות שבהם הדוקטרינה הישראלית קוראת לעצמה בשמה האנגלי – עדות לכך שהזיקה לדיני היושר המשווים, שתידון בפרק ו, איננה מטפורה אלא ייחוס מפורש. ולבסוף, גם רישיון שבוטל כדין אינו מותיר את בר הרשות בידיים ריקות: ביטולה של רשות שהושקע על יסודה עשוי להיות מותנה בפיצוי, אלא שההלכה גודרת אותו – פיצוי בגין השבחת המקרקעין, קרי ההשקעות שהשביחו את הקרקע, ולא פיצוי בגין זכות כלשהי במקרקעין.</w:t>
       </w:r>
       <w:r>
         <w:rPr>
@@ -2409,7 +2409,7 @@
           <w:szCs w:val="28"/>
           <w:rtl/>
         </w:rPr>
-        <w:t xml:space="preserve">ג.6 התיישנות, חזקה רבת־שנים וטענת הבעלות הנוגדת</w:t>
+        <w:t xml:space="preserve">ג.6 התיישנות, חזקה רבת שנים וטענת הבעלות הנוגדת</w:t>
       </w:r>
     </w:p>
     <w:p>
@@ -2441,7 +2441,7 @@
           <w:szCs w:val="24"/>
           <w:rtl/>
         </w:rPr>
-        <w:t xml:space="preserve"> בסכסוכים פנים־משפחתיים ערכה של הטענה מוגבל: חזקתו של בן משפחה נתפסת על פי רוב כחזקה מכוח הרשאה – "חזקה מרשות" – ולא כחזקה נוגדת הצוהלת כנגד הבעלים, ולכן אין היא מבשילה להתיישנות רוכשת. דווקא ההרמוניה המשפחתית, המאפיינת את השלב הראשון של ההסדר הפנימי, שוללת מן המחזיק את פירות החזקה כאשר פורץ העימות כעבור דור.</w:t>
+        <w:t xml:space="preserve"> בסכסוכים פנים משפחתיים ערכה של הטענה מוגבל: חזקתו של בן משפחה נתפסת על פי רוב כחזקה מכוח הרשאה – "חזקה מרשות" – ולא כחזקה נוגדת הצוהלת כנגד הבעלים, ולכן אין היא מבשילה להתיישנות רוכשת. דווקא ההרמוניה המשפחתית, המאפיינת את השלב הראשון של ההסדר הפנימי, שוללת מן המחזיק את פירות החזקה כאשר פורץ העימות כעבור דור.</w:t>
       </w:r>
       <w:r>
         <w:rPr>
@@ -2593,7 +2593,7 @@
           <w:szCs w:val="24"/>
           <w:rtl/>
         </w:rPr>
-        <w:t xml:space="preserve">דברים אלה – שנאמרו אגב סכסוך בין ענפי משפחה אחת על מקרקעין בלתי רשומים – הם תמצית עניינה של עבודה זו: מקום שהמרשם אינו יכול לשמש נקודת מוצא ונקודת סיום, נדרש בית המשפט לבנות את ההכרעה מחומרים אחרים. ובקוטב הנגדי, סירוב עקבי להפוך מנהג והחזקה כשלעצמם לבעלות: בית המשפט לענייני משפחה בנצרת דחה במפורש טענה להקניית בעלות מכוח "מנהג במגזר הערבי" והחזקה ממושכת, בקבעו כי הסכמות בעל־פה ומנהג אינם גוברים על הדין הישראלי ואינם מצדיקים הצהרת בעלות בלא תשתית משפטית וראייתית;</w:t>
+        <w:t xml:space="preserve">דברים אלה – שנאמרו אגב סכסוך בין ענפי משפחה אחת על מקרקעין בלתי רשומים – הם תמצית עניינה של עבודה זו: מקום שהמרשם אינו יכול לשמש נקודת מוצא ונקודת סיום, נדרש בית המשפט לבנות את ההכרעה מחומרים אחרים. ובקוטב הנגדי, סירוב עקבי להפוך מנהג והחזקה כשלעצמם לבעלות: בית המשפט לענייני משפחה בנצרת דחה במפורש טענה להקניית בעלות מכוח "מנהג במגזר הערבי" והחזקה ממושכת, בקבעו כי הסכמות בעל פה ומנהג אינם גוברים על הדין הישראלי ואינם מצדיקים הצהרת בעלות בלא תשתית משפטית וראייתית;</w:t>
       </w:r>
       <w:r>
         <w:rPr>
@@ -2696,7 +2696,7 @@
           <w:szCs w:val="24"/>
           <w:rtl/>
         </w:rPr>
-        <w:t xml:space="preserve">: מקום שהמקנה עצמו מחזיק רק במעמד של בר־רשות ובזכות אובליגטורית לדרוש חכירה ממינהל מקרקעי ישראל, הסכם – אף בעל־פה – לשיתוף בזכויות אלה איננו "עסקה במקרקעין" הטעונה מסמך בכתב, שהרי אין בידי המקנה זכות קניינית להקנות; ובן הזוג זכאי, ביחסים הפנימיים, למחצית הזכויות האובליגטוריות כלפי המינהל.</w:t>
+        <w:t xml:space="preserve">: מקום שהמקנה עצמו מחזיק רק במעמד של בר רשות ובזכות אובליגטורית לדרוש חכירה ממינהל מקרקעי ישראל, הסכם – אף בעל פה – לשיתוף בזכויות אלה איננו "עסקה במקרקעין" הטעונה מסמך בכתב, שהרי אין בידי המקנה זכות קניינית להקנות; ובן הזוג זכאי, ביחסים הפנימיים, למחצית הזכויות האובליגטוריות כלפי המינהל.</w:t>
       </w:r>
       <w:r>
         <w:rPr>
@@ -2726,7 +2726,7 @@
           <w:szCs w:val="24"/>
           <w:rtl/>
         </w:rPr>
-        <w:t xml:space="preserve"> ולבסוף, גם כשהמרשם קופא על שם האב המנוח, נכונים בתי המשפט לאכוף בין האחים לבין עצמם הסדרי שימוש פנימיים שנקבעו אף בהתנהגות גרידא – כגון צו המגן על דרך מעבר משותפת בין הבתים – תוך הגבלת ההכרעה למישור הפנים־משפחתי, בלא לפגוע בזכויות יתר השותפים הרשומים שאינם צד להליך.</w:t>
+        <w:t xml:space="preserve"> ולבסוף, גם כשהמרשם קופא על שם האב המנוח, נכונים בתי המשפט לאכוף בין האחים לבין עצמם הסדרי שימוש פנימיים שנקבעו אף בהתנהגות גרידא – כגון צו המגן על דרך מעבר משותפת בין הבתים – תוך הגבלת ההכרעה למישור הפנים משפחתי, בלא לפגוע בזכויות יתר השותפים הרשומים שאינם צד להליך.</w:t>
       </w:r>
       <w:r>
         <w:rPr>
@@ -2777,7 +2777,7 @@
           <w:szCs w:val="24"/>
           <w:rtl/>
         </w:rPr>
-        <w:t xml:space="preserve">העיון בארגז הכלים מלמד עד כמה מרשימה יצירתיות הפסיקה – ועד כמה שברירית התוצאה. כל אחד מן הכלים הוא חריג שנבנה על חריג: "זעקת ההגינות" מותנית ב"מקרים מיוחדים" שאין להם הגדרה; אי־הדירותו של רישיון תלויה במשקל שייתן בית המשפט להשקעה ולציפייה; סיווגו של ייפוי כוח כ"מסמך עסקה" תלוי בניסוחו של נוטריון משנות השבעים; והזכות שביושר עצמה נסוגה מפני נרשם תם לב. התוצאה היא משטר שבו גורל הזכויות אינו נגזר מכללים הניתנים לידיעה מראש אלא מהערכה שיפוטית בדיעבד של הגינות, אשם והסתמכות – הערכה הרגישה מטבעה לזהות השופט, לרושם העדים ולמידת ה"אשם" היחסי של בני המשפחה.</w:t>
+        <w:t xml:space="preserve">העיון בארגז הכלים מלמד עד כמה מרשימה יצירתיות הפסיקה – ועד כמה שברירית התוצאה. כל אחד מן הכלים הוא חריג שנבנה על חריג: "זעקת ההגינות" מותנית ב"מקרים מיוחדים" שאין להם הגדרה; אי הדירותו של רישיון תלויה במשקל שייתן בית המשפט להשקעה ולציפייה; סיווגו של ייפוי כוח כ"מסמך עסקה" תלוי בניסוחו של נוטריון משנות השבעים; והזכות שביושר עצמה נסוגה מפני נרשם תם לב. התוצאה היא משטר שבו גורל הזכויות אינו נגזר מכללים הניתנים לידיעה מראש אלא מהערכה שיפוטית בדיעבד של הגינות, אשם והסתמכות – הערכה הרגישה מטבעה לזהות השופט, לרושם העדים ולמידת ה"אשם" היחסי של בני המשפחה.</w:t>
       </w:r>
       <w:r>
         <w:rPr>
@@ -2800,7 +2800,7 @@
           <w:szCs w:val="24"/>
           <w:rtl/>
         </w:rPr>
-        <w:t xml:space="preserve">חמור מכך: הכלים כולם פועלים במישור הבין־אישי, ואין בכוחם לרפא את הפגם המערכתי. גם התובע שזכה – שהוכיח את העסקה, שנהנה מ"זעקת ההגינות" – מקבל בידו פסק דין הצהרתי, ולא רישום: בינו לבין הטאבו עדיין ניצבות חבויות המס ההיסטוריות שיידונו בפרק ה. הפסיקה, במילים אחרות, מטפלת בסימפטום – הסכסוך שהבשיל – ואינה יכולה לטפל בגורם: מבנה תמריצים המרחיק את החברה הערבית מן המרשם. זהו, בסופו של דבר, "פלסטר משפטי": חיוני לעצירת הדימום במקרה הקונקרטי, חסר אונים מול המחלה.</w:t>
+        <w:t xml:space="preserve">חמור מכך: הכלים כולם פועלים במישור הבין אישי, ואין בכוחם לרפא את הפגם המערכתי. גם התובע שזכה – שהוכיח את העסקה, שנהנה מ"זעקת ההגינות" – מקבל בידו פסק דין הצהרתי, ולא רישום: בינו לבין הטאבו עדיין ניצבות חבויות המס ההיסטוריות שיידונו בפרק ה. הפסיקה, במילים אחרות, מטפלת בסימפטום – הסכסוך שהבשיל – ואינה יכולה לטפל בגורם: מבנה תמריצים המרחיק את החברה הערבית מן המרשם. זהו, בסופו של דבר, "פלסטר משפטי": חיוני לעצירת הדימום במקרה הקונקרטי, חסר אונים מול המחלה.</w:t>
       </w:r>
     </w:p>
     <w:p>
@@ -2855,7 +2855,7 @@
           <w:szCs w:val="24"/>
           <w:rtl/>
         </w:rPr>
-        <w:t xml:space="preserve">בסכסוכים פנים־משפחתיים נשמעת תדיר הטענה: "אני הוצאתי את היתר הבנייה – סימן שהקרקע שלי". הטענה מפתה אך מוקשית מיסודה. מוסדות התכנון אינם ערכאה קניינית: הוועדה המקומית בוחנת התאמה תכנונית, ואישורה אינו הכרעה בזכויות. תקנות התכנון והבנייה מסדירות מי רשאי להגיש בקשה להיתר ומחייבות הודעה לבעלי זכויות אחרים, אך הן עצמן מורות כי אין בהוצאת ההיתר כדי לקבוע זכויות במקרקעין.</w:t>
+        <w:t xml:space="preserve">בסכסוכים פנים משפחתיים נשמעת תדיר הטענה: "אני הוצאתי את היתר הבנייה – סימן שהקרקע שלי". הטענה מפתה אך מוקשית מיסודה. מוסדות התכנון אינם ערכאה קניינית: הוועדה המקומית בוחנת התאמה תכנונית, ואישורה אינו הכרעה בזכויות. תקנות התכנון והבנייה מסדירות מי רשאי להגיש בקשה להיתר ומחייבות הודעה לבעלי זכויות אחרים, אך הן עצמן מורות כי אין בהוצאת ההיתר כדי לקבוע זכויות במקרקעין.</w:t>
       </w:r>
       <w:r>
         <w:rPr>
@@ -2887,7 +2887,7 @@
           <w:szCs w:val="24"/>
           <w:rtl/>
         </w:rPr>
-        <w:t xml:space="preserve">דווקא בכך טמון ערכו הראייתי העקיף. בהקשר הפנים־משפחתי, שבו העסקאות נעשות בעל־פה, שתיקת המשפחה בזמן אמת היא ראיה רבת משמעות: אם בשנת 1985 בנה האח את ביתו על החלקה, הגיש בקשה להיתר, פרסם אותה כדין, ואיש מן האחים – שידעו על הבנייה וראוה בעיניהם – לא מחה ולא התנגד, הרי שהתנהגות זו תומכת בגרסה כי החלוקה המשפחתית הנטענת אכן הוסכמה. ההיתר אינו מקור הזכות; הוא תיעוד בן־הזמן של הסכמה חברתית שאבדה מאז. ברוח זו נהגו בתי המשפט לשקול היתרי בנייה, תשלומי היטלים ואישורי רשויות כחלק ממכלול ראייתי התומך בקיומה של הרשאה או זכות – אך לא כראיה עצמאית מכרעת.</w:t>
+        <w:t xml:space="preserve">דווקא בכך טמון ערכו הראייתי העקיף. בהקשר הפנים משפחתי, שבו העסקאות נעשות בעל פה, שתיקת המשפחה בזמן אמת היא ראיה רבת משמעות: אם בשנת 1985 בנה האח את ביתו על החלקה, הגיש בקשה להיתר, פרסם אותה כדין, ואיש מן האחים – שידעו על הבנייה וראוה בעיניהם – לא מחה ולא התנגד, הרי שהתנהגות זו תומכת בגרסה כי החלוקה המשפחתית הנטענת אכן הוסכמה. ההיתר אינו מקור הזכות; הוא תיעוד בן הזמן של הסכמה חברתית שאבדה מאז. ברוח זו נהגו בתי המשפט לשקול היתרי בנייה, תשלומי היטלים ואישורי רשויות כחלק ממכלול ראייתי התומך בקיומה של הרשאה או זכות – אך לא כראיה עצמאית מכרעת.</w:t>
       </w:r>
       <w:r>
         <w:rPr>
@@ -3015,7 +3015,7 @@
           <w:szCs w:val="24"/>
           <w:rtl/>
         </w:rPr>
-        <w:t xml:space="preserve">קטגוריה ראייתית שלישית, ייחודית לסכסוכים אלה, היא המסמכים ההיסטוריים: ייפוי הכוח הנוטריוני משנות החמישים עד השמונים, שטרות מכר מסורתיים, קבלות תמורה בכתב יד, רישומי טאבו עות׳מאניים ומנדטוריים ותרשומות פנימיות של המשפחה. כוחם של מסמכים אלה כפול: הם ראיה בת־הזמן – שנוצרה בטרם קם אינטרס דיוני – והם עשויים, כמפורט בפרק ג, לעלות כדי "מסמך בכתב" הממלא את דרישת סעיף 8 עצמה.</w:t>
+        <w:t xml:space="preserve">קטגוריה ראייתית שלישית, ייחודית לסכסוכים אלה, היא המסמכים ההיסטוריים: ייפוי הכוח הנוטריוני משנות החמישים עד השמונים, שטרות מכר מסורתיים, קבלות תמורה בכתב יד, רישומי טאבו עות׳מאניים ומנדטוריים ותרשומות פנימיות של המשפחה. כוחם של מסמכים אלה כפול: הם ראיה בת הזמן – שנוצרה בטרם קם אינטרס דיוני – והם עשויים, כמפורט בפרק ג, לעלות כדי "מסמך בכתב" הממלא את דרישת סעיף 8 עצמה.</w:t>
       </w:r>
       <w:r>
         <w:rPr>
@@ -3066,7 +3066,7 @@
           <w:szCs w:val="24"/>
           <w:rtl/>
         </w:rPr>
-        <w:t xml:space="preserve">מן הפסיקה ניתן לחלץ מדרג בלתי פורמלי של ראיות. במדרגה העליונה – מסמך בן־זמן המגלם את העסקה: ייפוי כוח בלתי חוזר מפורט, שטר מסורתי, קבלות תשלום, ובלבד שאמיתותם הוכחה. במדרגה השנייה – ביצוע גלוי ורצוף: מסירת חזקה, בנייה, עיבוד, גידור, מגורים רבי־שנים בידיעת הכל. במדרגה השלישית – התיעוד המנהלי הנסיבתי: היתרי בנייה, תשלומי ארנונה והיטלים, מכתבים לרשויות, רישומים אצל רשות מקרקעי ישראל או חברה משכנת. ובמדרגה הרביעית – עדויות בעל־פה של בני משפחה, הנבחנות בזהירות יתרה נוכח האינטרס והזמן שחלף, ובכפוף לדרישת הסיוע בתביעות נגד עיזבון.</w:t>
+        <w:t xml:space="preserve">מן הפסיקה ניתן לחלץ מדרג בלתי פורמלי של ראיות. במדרגה העליונה – מסמך בן זמן המגלם את העסקה: ייפוי כוח בלתי חוזר מפורט, שטר מסורתי, קבלות תשלום, ובלבד שאמיתותם הוכחה. במדרגה השנייה – ביצוע גלוי ורצוף: מסירת חזקה, בנייה, עיבוד, גידור, מגורים רבי שנים בידיעת הכל. במדרגה השלישית – התיעוד המנהלי הנסיבתי: היתרי בנייה, תשלומי ארנונה והיטלים, מכתבים לרשויות, רישומים אצל רשות מקרקעי ישראל או חברה משכנת. ובמדרגה הרביעית – עדויות בעל פה של בני משפחה, הנבחנות בזהירות יתרה נוכח האינטרס והזמן שחלף, ובכפוף לדרישת הסיוע בתביעות נגד עיזבון.</w:t>
       </w:r>
       <w:r>
         <w:rPr>
@@ -3132,7 +3132,7 @@
           <w:szCs w:val="24"/>
           <w:rtl/>
         </w:rPr>
-        <w:t xml:space="preserve"> אך צדו האחר – שהמערכת התכנונית והפיסקלית הפכה לרשם־בפועל – נותר בלא מענה מוסדי. התוצאה היא שהכרעות קנייניות נשענות על תיעוד שנוצר למטרות אחרות, על ידי גופים אחרים, בסטנדרטים ראייתיים אחרים; ושופטי המשפחה נאלצים לבנות מהריסות התיעוד המנהלי את שהמרשם היה אמור לספק מלכתחילה. זוהי עדות נוספת, מוסדית הפעם, לכשל שתואר בפרק א: מקום שהמרשם הוא מסך, מישהו אחר נאלץ להיות מראה.</w:t>
+        <w:t xml:space="preserve"> אך צדו האחר – שהמערכת התכנונית והפיסקלית הפכה לרשם בפועל – נותר בלא מענה מוסדי. התוצאה היא שהכרעות קנייניות נשענות על תיעוד שנוצר למטרות אחרות, על ידי גופים אחרים, בסטנדרטים ראייתיים אחרים; ושופטי המשפחה נאלצים לבנות מהריסות התיעוד המנהלי את שהמרשם היה אמור לספק מלכתחילה. זוהי עדות נוספת, מוסדית הפעם, לכשל שתואר בפרק א: מקום שהמרשם הוא מסך, מישהו אחר נאלץ להיות מראה.</w:t>
       </w:r>
     </w:p>
     <w:p>
@@ -3187,7 +3187,7 @@
           <w:szCs w:val="24"/>
           <w:rtl/>
         </w:rPr>
-        <w:t xml:space="preserve">שער הכניסה למרשם המקרקעין עובר דרך רשות המסים. חוק מיסוי מקרקעין (שבח ורכישה), התשכ"ג-1963, אינו מסתפק בהטלת מס על מכירת זכות במקרקעין; הוא כורך את תוקפה המשפטי של העסקה ואת רישומה בהסדרת החבות. סעיף 16(א)(1) לחוק מתנה את תוקפן של מכירת זכות במקרקעין ופעולה באיגוד מקרקעין בתשלום המס או במילוי חלופות הביטחון הקבועות בו, וסעיף 16(א)(2) מורה כי מכירת זכות במקרקעין לא תירשם בפנקס המקרקעין אלא אם אישר המנהל שהיא פטורה ממס או שהמס שולם, או שניתנה ערובה מתאימה.</w:t>
+        <w:t xml:space="preserve">שער הכניסה למרשם המקרקעין עובר דרך רשות המסים. חוק מיסוי מקרקעין (שבח ורכישה), התשכ"ג–1963, אינו מסתפק בהטלת מס על מכירת זכות במקרקעין; הוא כורך את תוקפה המשפטי של העסקה ואת רישומה בהסדרת החבות. סעיף 16(א)(1) לחוק מתנה את תוקפן של מכירת זכות במקרקעין ופעולה באיגוד מקרקעין בתשלום המס או במילוי חלופות הביטחון הקבועות בו, וסעיף 16(א)(2) מורה כי מכירת זכות במקרקעין לא תירשם בפנקס המקרקעין אלא אם אישר המנהל שהיא פטורה ממס או שהמס שולם, או שניתנה ערובה מתאימה.</w:t>
       </w:r>
       <w:r>
         <w:rPr>
@@ -3285,7 +3285,7 @@
           <w:szCs w:val="24"/>
           <w:rtl/>
         </w:rPr>
-        <w:t xml:space="preserve"> רוחב יריעה זה מרחיק לכת עד כדי לכידת ההחזקות הרופפות ביותר: אף "הרשאה" במקרקעי ישראל – מעמד של בר־רשות גרידא, המתחדש מעת לעת – הוכרה כ"זכות במקרקעין" לצורכי מס, מקום שההרשאה מתחדשת בפועל באופן אוטומטי, ואפילו לא קיים במועד המכירה הסכם פורמלי תקף בין המחזיק לרשות.</w:t>
+        <w:t xml:space="preserve"> רוחב יריעה זה מרחיק לכת עד כדי לכידת ההחזקות הרופפות ביותר: אף "הרשאה" במקרקעי ישראל – מעמד של בר רשות גרידא, המתחדש מעת לעת – הוכרה כ"זכות במקרקעין" לצורכי מס, מקום שההרשאה מתחדשת בפועל באופן אוטומטי, ואפילו לא קיים במועד המכירה הסכם פורמלי תקף בין המחזיק לרשות.</w:t>
       </w:r>
       <w:r>
         <w:rPr>
@@ -3351,7 +3351,7 @@
           <w:szCs w:val="24"/>
           <w:rtl/>
         </w:rPr>
-        <w:t xml:space="preserve">טלו עסקה טיפוסית: בשנת 1978 מכר – או העניק – אב לבנו מגרש בכפר, כנגד ייפוי כוח בלתי חוזר שנחתם אצל נוטריון. איש לא הצהיר לרשויות; הבן בנה את ביתו וחי בו. בחלוף ארבעים וחמש שנים, כשהנכדים מבקשים להסדיר את הרישום – אם לצורך משכנתה, אם בעקבות סכסוך – מתעוררות שלוש שכבות של חבות: מס השבח (או מס המתנה ההיסטורי, לפי הדין שחל במועד העסקה) בגין המכירה המקורית; מס הרכישה; והפרשי הצמדה, ריבית וקנסות בגין אי־ההצהרה, המצטברים ממועד העסקה.</w:t>
+        <w:t xml:space="preserve">טלו עסקה טיפוסית: בשנת 1978 מכר – או העניק – אב לבנו מגרש בכפר, כנגד ייפוי כוח בלתי חוזר שנחתם אצל נוטריון. איש לא הצהיר לרשויות; הבן בנה את ביתו וחי בו. בחלוף ארבעים וחמש שנים, כשהנכדים מבקשים להסדיר את הרישום – אם לצורך משכנתה, אם בעקבות סכסוך – מתעוררות שלוש שכבות של חבות: מס השבח (או מס המתנה ההיסטורי, לפי הדין שחל במועד העסקה) בגין המכירה המקורית; מס הרכישה; והפרשי הצמדה, ריבית וקנסות בגין אי ההצהרה, המצטברים ממועד העסקה.</w:t>
       </w:r>
       <w:r>
         <w:rPr>
@@ -3383,7 +3383,7 @@
           <w:szCs w:val="24"/>
           <w:rtl/>
         </w:rPr>
-        <w:t xml:space="preserve">חשוב לדייק במעמדה המשפטי של "התניית הרישום": אי־הדיווח אינו מאיין את העסקה במישור האזרחי שבין הצדדים. הפסיקה והספרות ריככו את הוראת סעיף 16 ופירשוה כך שהעדר דיווח משעה את תוקפה של המכירה אך אינו שולל אותו לצמיתות – ההצהרה ניתנת להגשה באיחור, ומשעה שהתקיים אחד התנאים, ניתן לעסקה תוקף רטרואקטיבי מיום כריתתה.</w:t>
+        <w:t xml:space="preserve">חשוב לדייק במעמדה המשפטי של "התניית הרישום": אי הדיווח אינו מאיין את העסקה במישור האזרחי שבין הצדדים. הפסיקה והספרות ריככו את הוראת סעיף 16 ופירשוה כך שהעדר דיווח משעה את תוקפה של המכירה אך אינו שולל אותו לצמיתות – ההצהרה ניתנת להגשה באיחור, ומשעה שהתקיים אחד התנאים, ניתן לעסקה תוקף רטרואקטיבי מיום כריתתה.</w:t>
       </w:r>
       <w:r>
         <w:rPr>
@@ -3417,7 +3417,7 @@
           <w:szCs w:val="28"/>
           <w:rtl/>
         </w:rPr>
-        <w:t xml:space="preserve">ה.3 ביקורת: כלי אנטי־העלמה שהפך חסם – חוסר התיאום בין רשויות המס למציאות החברתית</w:t>
+        <w:t xml:space="preserve">ה.3 ביקורת: כלי למניעת העלמה שהפך חסם – חוסר התיאום בין רשויות המס למציאות החברתית</w:t>
       </w:r>
     </w:p>
     <w:p>
@@ -3434,7 +3434,7 @@
           <w:szCs w:val="24"/>
           <w:rtl/>
         </w:rPr>
-        <w:t xml:space="preserve">מנגנון "התניית הרישום" נולד כתכליתו: כלי לחימה בהעלמות מס בשוק נדל"ן מסחרי, שבו הצדדים זרים זה לזה, העסקה חד־פעמית, והתמריץ היחיד לדיווח הוא המחסום הרישומי. בשוק כזה המנגנון יעיל: הקונה, החפץ ברישום מיידי, כופה את הדיווח על שני הצדדים. ואולם, ביישומו על ההעברה הפנים־משפחתית בחברה הערבית מתהפכת הלוגיקה: הצדדים אינם חפצים ברישום מיידי – ההעברה "הושלמה" מבחינתם במסירת החזקה ובייפוי הכוח – ולכן המחסום אינו כופה דיווח אלא פשוט נותר ניצב, שנה אחר שנה, כשהחוב ההיסטורי צובר הצמדה, ריבית וקנסות מאחוריו. כלי שנועד למנוע העלמה בשוק פעיל הפך, באוכלוסייה שדפוסיה שונים, למנציח אי־רישום.</w:t>
+        <w:t xml:space="preserve">מנגנון "התניית הרישום" נולד כתכליתו: כלי לחימה בהעלמות מס בשוק נדל"ן מסחרי, שבו הצדדים זרים זה לזה, העסקה חד פעמית, והתמריץ היחיד לדיווח הוא המחסום הרישומי. בשוק כזה המנגנון יעיל: הקונה, החפץ ברישום מיידי, כופה את הדיווח על שני הצדדים. ואולם, ביישומו על ההעברה הפנים משפחתית בחברה הערבית מתהפכת הלוגיקה: הצדדים אינם חפצים ברישום מיידי – ההעברה "הושלמה" מבחינתם במסירת החזקה ובייפוי הכוח – ולכן המחסום אינו כופה דיווח אלא פשוט נותר ניצב, שנה אחר שנה, כשהחוב ההיסטורי צובר הצמדה, ריבית וקנסות מאחוריו. כלי שנועד למנוע העלמה בשוק פעיל הפך, באוכלוסייה שדפוסיה שונים, למנציח אי רישום.</w:t>
       </w:r>
       <w:r>
         <w:rPr>
@@ -3474,7 +3474,7 @@
           <w:szCs w:val="24"/>
           <w:rtl/>
         </w:rPr>
-        <w:t xml:space="preserve">) רב־דורית: ככל שחולף הזמן עלות ההסדרה גדלה – שרשרת ההעברות מתארכת, שכן כל חוליה בלתי מדווחת גוררת שומה נפרדת, ומספר בעלי העניין מתרבה עם כל דור יורשים. משפחות מגלות כי כדי לרשום את הנכד יש להסדיר תחילה את עסקת הסב. דווקא המשפחות הזקוקות ביותר לוודאות קניינית נדחקות אל מחוץ למרשם, והונן הקנייני נותר "הון מת" – נכסים שאינם ניתנים למשכון, לביטוח ולמימוש שוקי.</w:t>
+        <w:t xml:space="preserve">) רב דורית: ככל שחולף הזמן עלות ההסדרה גדלה – שרשרת ההעברות מתארכת, שכן כל חוליה בלתי מדווחת גוררת שומה נפרדת, ומספר בעלי העניין מתרבה עם כל דור יורשים. משפחות מגלות כי כדי לרשום את הנכד יש להסדיר תחילה את עסקת הסב. דווקא המשפחות הזקוקות ביותר לוודאות קניינית נדחקות אל מחוץ למרשם, והונן הקנייני נותר "הון מת" – נכסים שאינם ניתנים למשכון, לביטוח ולמימוש שוקי.</w:t>
       </w:r>
       <w:r>
         <w:rPr>
@@ -3489,7 +3489,7 @@
           <w:szCs w:val="24"/>
           <w:rtl/>
         </w:rPr>
-        <w:t xml:space="preserve"> ולמעגל נוסף יש לתת את הדעת: המלכוד עצמו מוליד סכסוכים. כל עוד ההסדרה יקרה מנשוא, נותר המרשם על שם המוריש, וכל דור יורשים חדש יורש – יחד עם הקרקע – את אי־הבהירות ואת פוטנציאל העימות. "התניית הרישום" איננה אפוא רק שאלה פיסקלית; היא גורם ישיר בייצור ההתדיינות הפנים־משפחתית הנדונה בעבודה זו.</w:t>
+        <w:t xml:space="preserve"> ולמעגל נוסף יש לתת את הדעת: המלכוד עצמו מוליד סכסוכים. כל עוד ההסדרה יקרה מנשוא, נותר המרשם על שם המוריש, וכל דור יורשים חדש יורש – יחד עם הקרקע – את אי הבהירות ואת פוטנציאל העימות. "התניית הרישום" איננה אפוא רק שאלה פיסקלית; היא גורם ישיר בייצור ההתדיינות הפנים משפחתית הנדונה בעבודה זו.</w:t>
       </w:r>
     </w:p>
     <w:p>
@@ -3506,7 +3506,7 @@
           <w:szCs w:val="24"/>
           <w:rtl/>
         </w:rPr>
-        <w:t xml:space="preserve">ולבסוף, ההשלכה הראייתית: אי־הדיווח ההיסטורי מקשה על הטוען לעסקה להציג את סממני האמינות שמערכת המס מספקת בדרך כלל – שומה עצמית מזמן אמת, אישורי תשלום, הצהרות חתומות. בהיעדרם נשען בית המשפט על הראיות הנסיבתיות שנדונו בפרק ד. ומנגד, טענת יורש כי "אילו הייתה עסקה, הייתה מדווחת" זוכה בפסיקה למשקל מוגבל, שכן אי־הדיווח היה, כמתואר, נורמה חברתית רחבה ולא אינדיקציה לפיקטיביות העסקה הקונקרטית.</w:t>
+        <w:t xml:space="preserve">ולבסוף, ההשלכה הראייתית: אי הדיווח ההיסטורי מקשה על הטוען לעסקה להציג את סממני האמינות שמערכת המס מספקת בדרך כלל – שומה עצמית מזמן אמת, אישורי תשלום, הצהרות חתומות. בהיעדרם נשען בית המשפט על הראיות הנסיבתיות שנדונו בפרק ד. ומנגד, טענת יורש כי "אילו הייתה עסקה, הייתה מדווחת" זוכה בפסיקה למשקל מוגבל, שכן אי הדיווח היה, כמתואר, נורמה חברתית רחבה ולא אינדיקציה לפיקטיביות העסקה הקונקרטית.</w:t>
       </w:r>
       <w:r>
         <w:rPr>
@@ -3618,7 +3618,7 @@
           <w:szCs w:val="24"/>
           <w:rtl/>
         </w:rPr>
-        <w:t xml:space="preserve">אבן הפינה של הדין האנגלי בסוגייתנו הונחה במאה התשע־עשרה: משנכרת חוזה מכר מקרקעין הניתן לאכיפה בעין, הופך המוכר לנאמן של הקונה, והקונה – לבעלים שביושר, עוד בטרם הועברה הבעלות המשפטית. כך נפסק בעניין </w:t>
+        <w:t xml:space="preserve">אבן הפינה של הדין האנגלי בסוגייתנו הונחה במאה התשע עשרה: משנכרת חוזה מכר מקרקעין הניתן לאכיפה בעין, הופך המוכר לנאמן של הקונה, והקונה – לבעלים שביושר, עוד בטרם הועברה הבעלות המשפטית. כך נפסק בעניין </w:t>
       </w:r>
       <w:r>
         <w:rPr>
@@ -3856,7 +3856,7 @@
           <w:szCs w:val="24"/>
           <w:rtl/>
         </w:rPr>
-        <w:t xml:space="preserve">את מקומם של ייפוי הכוח והעסקה בעל־פה הישראליים ממלאים באנגליה שני מוסדות יושר, המשיבים יחדיו על שאלות המחקר הראשונה והשלישית. הראשון – הנאמנות המשתמעת מכוונה משותפת (</w:t>
+        <w:t xml:space="preserve">את מקומם של ייפוי הכוח והעסקה בעל פה הישראליים ממלאים באנגליה שני מוסדות יושר, המשיבים יחדיו על שאלות המחקר הראשונה והשלישית. הראשון – הנאמנות המשתמעת מכוונה משותפת (</w:t>
       </w:r>
       <w:r>
         <w:rPr>
@@ -3973,7 +3973,7 @@
           <w:szCs w:val="24"/>
           <w:rtl/>
         </w:rPr>
-        <w:t xml:space="preserve"> העיקרון המארגן הוא הגנה מובנית מפני התנהגות בלתי מצפונית: ההסתמכות הפיזית רבת־השנים בנכס גוברת על הצורה ועל הרישום הפורמלי. הדמיון לעובדות המקרים הישראליים – הבן שבנה על חלקת אביו, האח שעיבד את האדמה בהבטחה שתהיה שלו – מפתיע בעוצמתו: הלכת </w:t>
+        <w:t xml:space="preserve"> העיקרון המארגן הוא הגנה מובנית מפני התנהגות בלתי מצפונית: ההסתמכות הפיזית רבת השנים בנכס גוברת על הצורה ועל הרישום הפורמלי. הדמיון לעובדות המקרים הישראליים – הבן שבנה על חלקת אביו, האח שעיבד את האדמה בהבטחה שתהיה שלו – מפתיע בעוצמתו: הלכת </w:t>
       </w:r>
       <w:r>
         <w:rPr>
@@ -4179,7 +4179,7 @@
           <w:szCs w:val="24"/>
           <w:rtl/>
         </w:rPr>
-        <w:t xml:space="preserve"> ודוק, הבדל אחד חשוב: במשפט המקובל האינטרס המבטיח את אי־ההדירות חייב להיות אינטרס של מיופה הכוח עצמו, ואילו חוק השליחות הישראלי הרחיב את ההגנה גם לאינטרס של צד שלישי – הרחבה שחשיבותה רבה דווקא בעסקאות המשפחתיות, שבהן ייפוי הכוח ניתן תכופות להבטחת זכותו של בן משפחה שאינו מיופה הכוח.</w:t>
+        <w:t xml:space="preserve"> ודוק, הבדל אחד חשוב: במשפט המקובל האינטרס המבטיח את אי ההדירות חייב להיות אינטרס של מיופה הכוח עצמו, ואילו חוק השליחות הישראלי הרחיב את ההגנה גם לאינטרס של צד שלישי – הרחבה שחשיבותה רבה דווקא בעסקאות המשפחתיות, שבהן ייפוי הכוח ניתן תכופות להבטחת זכותו של בן משפחה שאינו מיופה הכוח.</w:t>
       </w:r>
       <w:r>
         <w:rPr>
@@ -4255,7 +4255,7 @@
           <w:szCs w:val="24"/>
           <w:rtl/>
         </w:rPr>
-        <w:t xml:space="preserve">הקוד האזרחי המצרי משנת 1948, פרי עטו של עבד אל־רזאק אל־סנהורי, הגדיר את המכר כחוזה אובליגטורי – התחייבות המוכר להעביר את הבעלות כנגד מחיר –</w:t>
+        <w:t xml:space="preserve">הקוד האזרחי המצרי משנת 1948, פרי עטו של עבד אל-רזאק אל-סנהורי, הגדיר את המכר כחוזה אובליגטורי – התחייבות המוכר להעביר את הבעלות כנגד מחיר –</w:t>
       </w:r>
       <w:r>
         <w:rPr>
@@ -4342,7 +4342,7 @@
           <w:szCs w:val="24"/>
           <w:rtl/>
         </w:rPr>
-        <w:t xml:space="preserve"> לצד ייפוי הכוח פיתח הדין המצרי שתי תביעות ייחודיות: "תביעת אימות החתימה" (דעוא צחת אל־תוקיע) – הליך שמרני שבו מאשר בית המשפט אך את אמיתות חתימת המוכר, בלא לבחון את תוקף העסקה; ו"תביעת התוקף והנפקות" (דעוא צחה ונפאד׳) – שבה מוצהר על תוקפו של חוזה המכר הבלתי רשום, ורישום כתב התביעה עצמו משריין לקונה עדיפות: פסק הדין שיירשם ייוחס אחורנית למועד רישום התביעה.</w:t>
+        <w:t xml:space="preserve"> לצד ייפוי הכוח פיתח הדין המצרי שתי תביעות ייחודיות: "תביעת אימות החתימה" (דעוא צחת אל-תוקיע) – הליך שמרני שבו מאשר בית המשפט אך את אמיתות חתימת המוכר, בלא לבחון את תוקף העסקה; ו"תביעת התוקף והנפקות" (דעוא צחה ונפאד׳) – שבה מוצהר על תוקפו של חוזה המכר הבלתי רשום, ורישום כתב התביעה עצמו משריין לקונה עדיפות: פסק הדין שיירשם ייוחס אחורנית למועד רישום התביעה.</w:t>
       </w:r>
       <w:r>
         <w:rPr>
@@ -4429,7 +4429,7 @@
           <w:szCs w:val="24"/>
           <w:rtl/>
         </w:rPr>
-        <w:t xml:space="preserve"> המשמעות לסכסוך הפנים־משפחתי מרחיקת לכת: במצרים, האח שהחזיק בחלקה חמש עשרה שנים ללא עוררין הוא בעליה כדין, והתיישנותו "מנקה" את שרשרת העסקאות ההיסטורית – על פגמי הצורה, המסמכים האבודים וחבויות העבר שבה. המשפט המצרי מכיר בכך שהחיים חזקים מן הנייר, ומספק שסתום מבני היכן שהישראלי מספק, לכל היותר, שסתום שיפוטי.</w:t>
+        <w:t xml:space="preserve"> המשמעות לסכסוך הפנים משפחתי מרחיקת לכת: במצרים, האח שהחזיק בחלקה חמש עשרה שנים ללא עוררין הוא בעליה כדין, והתיישנותו "מנקה" את שרשרת העסקאות ההיסטורית – על פגמי הצורה, המסמכים האבודים וחבויות העבר שבה. המשפט המצרי מכיר בכך שהחיים חזקים מן הנייר, ומספק שסתום מבני היכן שהישראלי מספק, לכל היותר, שסתום שיפוטי.</w:t>
       </w:r>
       <w:r>
         <w:rPr>
@@ -4471,7 +4471,7 @@
           <w:szCs w:val="24"/>
           <w:rtl/>
         </w:rPr>
-        <w:t xml:space="preserve">בשנת 2020 ניסתה מצרים לכפות רישום בכוח: תיקון לחוק 114/1946 התנה חיבור נכסים לחשמל, למים ולגז בהוכחת רישום, בצירוף אגרות. פרץ זעם ציבורי – הצעד נתפס כהתניית שירותים חיוניים בתשלום כופר רישומי – והנשיא א־סיסי הורה לדחות את יישום החוק בשנתיים.</w:t>
+        <w:t xml:space="preserve">בשנת 2020 ניסתה מצרים לכפות רישום בכוח: תיקון לחוק 114/1946 התנה חיבור נכסים לחשמל, למים ולגז בהוכחת רישום, בצירוף אגרות. פרץ זעם ציבורי – הצעד נתפס כהתניית שירותים חיוניים בתשלום כופר רישומי – והנשיא א-סיסי הורה לדחות את יישום החוק בשנתיים.</w:t>
       </w:r>
       <w:r>
         <w:rPr>
@@ -4486,7 +4486,7 @@
           <w:szCs w:val="24"/>
           <w:rtl/>
         </w:rPr>
-        <w:t xml:space="preserve"> בשנת 2022 בא היפוך הגישה: חוק מס׳ 9 לשנת 2022 קיצר את הליך הרישום לתקרה של 37 ימים, החליף את האגרות היחסיות באגרות קבועות ומתונות – והחשוב מכל: ניתק את הרישום מתשלום מס העסקה, כך שאי־הסדרת המס שוב אינה חוסמת את שערי המרשם.</w:t>
+        <w:t xml:space="preserve"> בשנת 2022 בא היפוך הגישה: חוק מס׳ 9 לשנת 2022 קיצר את הליך הרישום לתקרה של 37 ימים, החליף את האגרות היחסיות באגרות קבועות ומתונות – והחשוב מכל: ניתק את הרישום מתשלום מס העסקה, כך שאי הסדרת המס שוב אינה חוסמת את שערי המרשם.</w:t>
       </w:r>
       <w:r>
         <w:rPr>
@@ -4501,7 +4501,7 @@
           <w:szCs w:val="24"/>
           <w:rtl/>
         </w:rPr>
-        <w:t xml:space="preserve"> אשר לכינוי "המשפט המצרי (השרעי)" – הוא מדויק רק בחלקו: חוקת מצרים קובעת כי "עקרונות השריעה האסלאמית הם המקור הראשי לחקיקה", וסעיף 1 לקוד האזרחי מציב את עקרונות השריעה כמקור שיורי, אך דיני הקניין והחיובים הם ביסודם קונטיננטליים־צרפתיים. השריעה שולטת שליטה מלאה בתחום אחד הקריטי לענייננו – הירושה: חוק הירושה המצרי (חוק מס׳ 77 לשנת 1943) הוא קודיפיקציה של דיני הפַרַאאִץ׳ השרעיים.</w:t>
+        <w:t xml:space="preserve"> אשר לכינוי "המשפט המצרי (השרעי)" – הוא מדויק רק בחלקו: חוקת מצרים קובעת כי "עקרונות השריעה האסלאמית הם המקור הראשי לחקיקה", וסעיף 1 לקוד האזרחי מציב את עקרונות השריעה כמקור שיורי, אך דיני הקניין והחיובים הם ביסודם קונטיננטליים צרפתיים. השריעה שולטת שליטה מלאה בתחום אחד הקריטי לענייננו – הירושה: חוק הירושה המצרי (חוק מס׳ 77 לשנת 1943) הוא קודיפיקציה של דיני הפַרַאאִץ׳ השרעיים.</w:t>
       </w:r>
       <w:r>
         <w:rPr>
@@ -4516,7 +4516,7 @@
           <w:szCs w:val="24"/>
           <w:rtl/>
         </w:rPr>
-        <w:t xml:space="preserve"> צירוף זה – ירושה שרעית קוגנטית מעל מרשם ריק – מוליד במצרים בדיוק את הסכסוך הפנים־משפחתי המוכר מבתי המשפט בנצרת: עיזבון בלתי רשום, מנות שרעיות תיאורטיות, והחזקות בפועל שחילקה המשפחה בדרכה שלה.</w:t>
+        <w:t xml:space="preserve"> צירוף זה – ירושה שרעית קוגנטית מעל מרשם ריק – מוליד במצרים בדיוק את הסכסוך הפנים משפחתי המוכר מבתי המשפט בנצרת: עיזבון בלתי רשום, מנות שרעיות תיאורטיות, והחזקות בפועל שחילקה המשפחה בדרכה שלה.</w:t>
       </w:r>
     </w:p>
     <w:p>
@@ -4571,7 +4571,7 @@
           <w:szCs w:val="24"/>
           <w:rtl/>
         </w:rPr>
-        <w:t xml:space="preserve">המשפט השרעי הקלאסי אינו מכיר מרשם זכויות. ההקניה בו נשענת על מעשים גלויים – הצעה, קיבול ותפיסה – והפומביות מושגת בקהילה, לא בפנקס. הקודיפיקציה הנודעת של הדין האזרחי השרעי בנוסחו החנפי היא המג׳לה העות׳מאנית (מג׳לת אל־אחכאם אל־עדליה, 1869–1876), שחלה בארץ ישראל עד לחקיקה הישראלית המודרנית, ובוטלה סופית רק בחוק לביטול המג׳לה, התשמ"ד-1984.</w:t>
+        <w:t xml:space="preserve">המשפט השרעי הקלאסי אינו מכיר מרשם זכויות. ההקניה בו נשענת על מעשים גלויים – הצעה, קיבול ותפיסה – והפומביות מושגת בקהילה, לא בפנקס. הקודיפיקציה הנודעת של הדין האזרחי השרעי בנוסחו החנפי היא המג׳לה העות׳מאנית (מג׳לת אל-אחכאם אל-עדליה, 1869–1876), שחלה בארץ ישראל עד לחקיקה הישראלית המודרנית, ובוטלה סופית רק בחוק לביטול המג׳לה, התשמ"ד–1984.</w:t>
       </w:r>
       <w:r>
         <w:rPr>
@@ -4948,7 +4948,7 @@
           <w:szCs w:val="24"/>
           <w:rtl/>
         </w:rPr>
-        <w:t xml:space="preserve">כל שיטה הצמיחה תחליף פונקציונלי לרישום, והשוואת התחליפים מאלפת: באנגליה התחליף הוא שיפוטי־עקרוני (נאמנות משתמעת והשתק קנייני, הנתפרים למידותיו של כל מקרה); במצרים ובחברה הערבית בישראל – מסמכי־פרטי (ייפוי הכוח הבלתי הדיר); ובשריעה – עובדתי־פיזי (הקבּץ׳ והחיאזה). המקבילה המבנית בין מצרים לחברה הערבית בישראל היא הממצא ההשוואתי המרכזי של עבודה זו: אותו מכשיר עצמו, מאותם טעמים עצמם – מרשם יקר, איטי וכרוך במס – ועם אותן נקודות תורפה עצמן: פקיעה במות המרשה, פגיעות לעסקאות נוגדות, והיזקקות בסופו של יום לאישור שיפוטי בדיעבד.</w:t>
+        <w:t xml:space="preserve">כל שיטה הצמיחה תחליף פונקציונלי לרישום, והשוואת התחליפים מאלפת: באנגליה התחליף הוא שיפוטי (נאמנות משתמעת והשתק קנייני, הנתפרים למידותיו של כל מקרה); במצרים ובחברה הערבית בישראל – מסמך פרטי (ייפוי הכוח הבלתי הדיר); ובשריעה – עובדתי (הקבּץ׳ והחיאזה). המקבילה המבנית בין מצרים לחברה הערבית בישראל היא הממצא ההשוואתי המרכזי של עבודה זו: אותו מכשיר עצמו, מאותם טעמים עצמם – מרשם יקר, איטי וכרוך במס – ועם אותן נקודות תורפה עצמן: פקיעה במות המרשה, פגיעות לעסקאות נוגדות, והיזקקות בסופו של יום לאישור שיפוטי בדיעבד.</w:t>
       </w:r>
     </w:p>
     <w:p>
@@ -4967,16 +4967,16 @@
           <w:szCs w:val="24"/>
           <w:rtl/>
         </w:rPr>
-        <w:t xml:space="preserve">הציר השלישי – ההעברה הפנים־משפחתית וההחזקה רבת־השנים. </w:t>
-      </w:r>
-      <w:r>
-        <w:rPr>
-          <w:rFonts w:ascii="David" w:cs="David" w:eastAsia="David" w:hAnsi="David"/>
-          <w:sz w:val="24"/>
-          <w:szCs w:val="24"/>
-          <w:rtl/>
-        </w:rPr>
-        <w:t xml:space="preserve">שלוש השיטות פיתחו רגישות מיוחדת דווקא להקשר המשפחתי, אך במנגנונים הפוכים. השריעה מקשיחה את ההקניה (דרישת תפיסה) ומרככת את החזרה (איסור חזרה בין קרובים) – איזון המגן על יציבות ההענקות בתוך המשפחה, ומעניקה להחזקה ארוכת השנים מעמד מכריע. מצרים מתרגמת את אותו רעיון ללשון חקיקתית מודרנית: חמש עשרה שנות חזקה – בעלות. האנגלים מרככים את הצורה עצמה: ההשתק הקנייני נולד ופרח בסכסוכי המשק המשפחתי, מתוך הכרה שבתוך המשפחה איש אינו עורך חוזים. והדין הישראלי משלב: דרישת כתב קשיחה להלכה, ולצדה שסתומי "זעקת ההגינות", זכות שביושר וויתור־בכתב על חזרה ממתנה הגלום בייפוי הכוח – אך בלא כל מסלול שבו החזקה כשלעצמה מבשילה לזכות. השילוב הישראלי עובד – אך במחיר אי־ודאות ניכר, שכן הוא תלוי כולו בהפעלה שיפוטית בדיעבד של שסתומים עמומים.</w:t>
+        <w:t xml:space="preserve">הציר השלישי – ההעברה הפנים משפחתית וההחזקה רבת השנים. </w:t>
+      </w:r>
+      <w:r>
+        <w:rPr>
+          <w:rFonts w:ascii="David" w:cs="David" w:eastAsia="David" w:hAnsi="David"/>
+          <w:sz w:val="24"/>
+          <w:szCs w:val="24"/>
+          <w:rtl/>
+        </w:rPr>
+        <w:t xml:space="preserve">שלוש השיטות פיתחו רגישות מיוחדת דווקא להקשר המשפחתי, אך במנגנונים הפוכים. השריעה מקשיחה את ההקניה (דרישת תפיסה) ומרככת את החזרה (איסור חזרה בין קרובים) – איזון המגן על יציבות ההענקות בתוך המשפחה, ומעניקה להחזקה ארוכת השנים מעמד מכריע. מצרים מתרגמת את אותו רעיון ללשון חקיקתית מודרנית: חמש עשרה שנות חזקה – בעלות. האנגלים מרככים את הצורה עצמה: ההשתק הקנייני נולד ופרח בסכסוכי המשק המשפחתי, מתוך הכרה שבתוך המשפחה איש אינו עורך חוזים. והדין הישראלי משלב: דרישת כתב קשיחה להלכה, ולצדה שסתומי "זעקת ההגינות", זכות שביושר וויתור בכתב על חזרה ממתנה הגלום בייפוי הכוח – אך בלא כל מסלול שבו החזקה כשלעצמה מבשילה לזכות. השילוב הישראלי עובד – אך במחיר אי ודאות ניכר, שכן הוא תלוי כולו בהפעלה שיפוטית בדיעבד של שסתומים עמומים.</w:t>
       </w:r>
     </w:p>
     <w:p>
@@ -5004,7 +5004,7 @@
           <w:szCs w:val="24"/>
           <w:rtl/>
         </w:rPr>
-        <w:t xml:space="preserve">כאן מציעה ההשוואה את לקח המדיניות החד ביותר. אנגליה מעולם לא כרכה את הרישום בגביית מסי העסקה במלוא החומרה הישראלית, ומרשמהּ המקוון זול ומהיר. מצרים כרכה – וקצרה אי־רישום של תשעים אחוזים; משהבינה זאת, ניתקה ב-2022 את הרישום מן המס וקיצצה את אגרותיו. ישראל עודנה מחזיקה בצימוד מלא: סעיף 16 לחוק מיסוי מקרקעין וסעיף 324 לפקודת העיריות מציבים את רשות המסים ואת הרשות המקומית כשוערי המרשם. הניסיון המצרי מלמד שצימוד כזה, ביישומו על אוכלוסייה שבה אי־הרישום הוא נחלת הכלל, אינו מגבה את הגבייה אלא מקבע את אי־הרישום – על כל מחיריו הראייתיים, הכלכליים והחברתיים.</w:t>
+        <w:t xml:space="preserve">כאן מציעה ההשוואה את לקח המדיניות החד ביותר. אנגליה מעולם לא כרכה את הרישום בגביית מסי העסקה במלוא החומרה הישראלית, ומרשמהּ המקוון זול ומהיר. מצרים כרכה – וקצרה אי רישום של תשעים אחוזים; משהבינה זאת, ניתקה ב-2022 את הרישום מן המס וקיצצה את אגרותיו. ישראל עודנה מחזיקה בצימוד מלא: סעיף 16 לחוק מיסוי מקרקעין וסעיף 324 לפקודת העיריות מציבים את רשות המסים ואת הרשות המקומית כשוערי המרשם. הניסיון המצרי מלמד שצימוד כזה, ביישומו על אוכלוסייה שבה אי הרישום הוא נחלת הכלל, אינו מגבה את הגבייה אלא מקבע את אי הרישום – על כל מחיריו הראייתיים, הכלכליים והחברתיים.</w:t>
       </w:r>
       <w:r>
         <w:rPr>
@@ -5046,7 +5046,7 @@
           <w:szCs w:val="24"/>
           <w:rtl/>
         </w:rPr>
-        <w:t xml:space="preserve">שלוש שאלות המחקר שהוצבו בפתח העבודה נבחנו כל אחת בפרקה, אך רק משמניחים את הממצאים זה לצד זה מתגלה כי אין מדובר בשלוש בעיות נפרדות אלא בשלושה פנים של תופעה אחת. הכלים המשפטיים והראייתיים שבהם מכריעים בתי המשפט – הזכות שביושר, ייפוי הכוח הבלתי חוזר, זעקת ההגינות והרישיון – הם התגובה השיפוטית לחלל שיצר "מסך המרשם" בהיפגשו עם דפוסי הקניין המשפחתיים של החברה הערבית; המשקל שניתן להיתרי הבנייה ולתשלומי הארנונה הוא תוצר של אותו חלל עצמו, שהרי בהיעדר תיעוד קנייני נותר רק התיעוד המנהלי; ו"התניית הרישום" במס היא המנוע המבני המשמר את החלל ומזין את שתי התופעות האחרות. נוצר מעגל שלם וסגור: חסם הכניסה למרשם מנציח את אי־הרישום; אי־הרישום דוחק את המשפחות אל תחליפים פרטיים ומנהליים; התחליפים קורסים בחילופי הדורות אל תוך סכסוך; הסכסוך מוכרע בדיעבד בכלי היושר; ואף פסק הדין שבסוף הדרך אינו ניתן לרישום, שכן החסם הפיסקלי עודנו ניצב על מכונו – והמעגל שב ומתחיל. ההשוואה לימדה שהמעגל הזה אינו ייחודי לישראל: מצרים נקלעה אליו בממדים לאומיים, אנגליה נמנעה ממנו בזכות מרשם זול ונגיש ודיני יושר מפותחים, והמשפט השרעי, שקדם למרשם, כלל לא נזקק לו. ייחודו הישראלי של המעגל הוא בכך שהוא פוגע באוכלוסייה מובחנת, בעוד הדין הכללי מתפקד היטב עבור השוק המסחרי – כשל שהוא, במונחי פרק א, חלוקתי במהותו.</w:t>
+        <w:t xml:space="preserve">שלוש שאלות המחקר שהוצבו בפתח העבודה נבחנו כל אחת בפרקה, אך רק משמניחים את הממצאים זה לצד זה מתגלה כי אין מדובר בשלוש בעיות נפרדות אלא בשלושה פנים של תופעה אחת. הכלים המשפטיים והראייתיים שבהם מכריעים בתי המשפט – הזכות שביושר, ייפוי הכוח הבלתי חוזר, זעקת ההגינות והרישיון – הם התגובה השיפוטית לחלל שיצר "מסך המרשם" בהיפגשו עם דפוסי הקניין המשפחתיים של החברה הערבית; המשקל שניתן להיתרי הבנייה ולתשלומי הארנונה הוא תוצר של אותו חלל עצמו, שהרי בהיעדר תיעוד קנייני נותר רק התיעוד המנהלי; ו"התניית הרישום" במס היא המנוע המבני המשמר את החלל ומזין את שתי התופעות האחרות. נוצר מעגל שלם וסגור: חסם הכניסה למרשם מנציח את אי הרישום; אי הרישום דוחק את המשפחות אל תחליפים פרטיים ומנהליים; התחליפים קורסים בחילופי הדורות אל תוך סכסוך; הסכסוך מוכרע בדיעבד בכלי היושר; ואף פסק הדין שבסוף הדרך אינו ניתן לרישום, שכן החסם הפיסקלי עודנו ניצב על מכונו – והמעגל שב ומתחיל. ההשוואה לימדה שהמעגל הזה אינו ייחודי לישראל: מצרים נקלעה אליו בממדים לאומיים, אנגליה נמנעה ממנו בזכות מרשם זול ונגיש ודיני יושר מפותחים, והמשפט השרעי, שקדם למרשם, כלל לא נזקק לו. ייחודו הישראלי של המעגל הוא בכך שהוא פוגע באוכלוסייה מובחנת, בעוד הדין הכללי מתפקד היטב עבור השוק המסחרי – כשל שהוא, במונחי פרק א, חלוקתי במהותו.</w:t>
       </w:r>
     </w:p>
     <w:p>
@@ -5093,7 +5093,7 @@
           <w:szCs w:val="24"/>
           <w:rtl/>
         </w:rPr>
-        <w:t xml:space="preserve"> ואולם דווקא הצלחה נקודתית זו מסתירה כישלון מערכתי, הנגלה רק במבט אינטגרטיבי. ראשית, כל אחד מן הכלים הוא חריג שנבנה על חריג – "זעקת ההגינות" מותנית ב"מקרים מיוחדים" שאין להם הגדרה, אי־הדירותו של רישיון תלויה בשקילה בדיעבד של השקעה וציפייה, וסיווגו של ייפוי כוח כמסמך עסקה תלוי בניסוחו של נוטריון משנות השבעים – ומשטר הנשען כולו על הערכה שיפוטית בדיעבד של הגינות והסתמכות מייצר תוצאות בלתי צפויות, המשתנות מתיק לתיק. שנית, אי־הוודאות הזו אינה נייטרלית להתנהגות הצדדים: מי שסבור כי יזכה בדין אינו ממהר להתפשר, ומי שאינו יודע את מעמדו אינו יכול לתמחר אותו, כך שהגמישות שנועדה לעשות צדק מוסיפה בעצמה דלק להתדיינות. ושלישית – וזה החיבור שבין פרק ג לפרק ה, שאין להבינו אלא במשולב – הכלים כולם פועלים במישור הבין־אישי ואינם מייצרים רישום: הזוכה המושלם, שהוכיח את עסקתו וזכה להצהרה על זכויותיו, נותר עומד לפני אותו מחסום מס שהרתיע את אביו ואת סבו לפניו, ופסק דינו הופך לנכס משפחתי נוסף שאינו רשום. הפסיקה מטפלת אפוא בסימפטום – הסכסוך שהבשיל – ואין בכוחה לטפל בגורם: מבנה תמריצים המרחיק את החברה הערבית מן המרשם.</w:t>
+        <w:t xml:space="preserve"> ואולם דווקא הצלחה נקודתית זו מסתירה כישלון מערכתי, הנגלה רק במבט אינטגרטיבי. ראשית, כל אחד מן הכלים הוא חריג שנבנה על חריג – "זעקת ההגינות" מותנית ב"מקרים מיוחדים" שאין להם הגדרה, אי הדירותו של רישיון תלויה בשקילה בדיעבד של השקעה וציפייה, וסיווגו של ייפוי כוח כמסמך עסקה תלוי בניסוחו של נוטריון משנות השבעים – ומשטר הנשען כולו על הערכה שיפוטית בדיעבד של הגינות והסתמכות מייצר תוצאות בלתי צפויות, המשתנות מתיק לתיק. שנית, אי הוודאות הזו אינה נייטרלית להתנהגות הצדדים: מי שסבור כי יזכה בדין אינו ממהר להתפשר, ומי שאינו יודע את מעמדו אינו יכול לתמחר אותו, כך שהגמישות שנועדה לעשות צדק מוסיפה בעצמה דלק להתדיינות. ושלישית – וזה החיבור שבין פרק ג לפרק ה, שאין להבינו אלא במשולב – הכלים כולם פועלים במישור הבין אישי ואינם מייצרים רישום: הזוכה המושלם, שהוכיח את עסקתו וזכה להצהרה על זכויותיו, נותר עומד לפני אותו מחסום מס שהרתיע את אביו ואת סבו לפניו, ופסק דינו הופך לנכס משפחתי נוסף שאינו רשום. הפסיקה מטפלת אפוא בסימפטום – הסכסוך שהבשיל – ואין בכוחה לטפל בגורם: מבנה תמריצים המרחיק את החברה הערבית מן המרשם.</w:t>
       </w:r>
     </w:p>
     <w:p>
@@ -5110,7 +5110,7 @@
           <w:szCs w:val="24"/>
           <w:rtl/>
         </w:rPr>
-        <w:t xml:space="preserve">המבט ההשוואתי מעניק לביקורת הזו גם קנה מידה וגם כיוון. מן הדין האנגלי עולה כי גמישות שיפוטית אינה חייבת להיות חסרת צורה: ההשתק הקנייני, שצמח בדיוק באותם סכסוכי משק משפחתי שאנו דנים בהם, אינו "זעקה" עמומה אלא עילה סדורה בת יסודות מוגדרים – הבטחה, הסתמכות, שינוי מצב לרעה ואי־מצפוניות שבהתכחשות – שסעדיה נדונים אף הם במסגרת שהתווה בית המשפט העליון הבריטי בפסיקה עקבית.</w:t>
+        <w:t xml:space="preserve">המבט ההשוואתי מעניק לביקורת הזו גם קנה מידה וגם כיוון. מן הדין האנגלי עולה כי גמישות שיפוטית אינה חייבת להיות חסרת צורה: ההשתק הקנייני, שצמח בדיוק באותם סכסוכי משק משפחתי שאנו דנים בהם, אינו "זעקה" עמומה אלא עילה סדורה בת יסודות מוגדרים – הבטחה, הסתמכות, שינוי מצב לרעה ואי מצפוניות שבהתכחשות – שסעדיה נדונים אף הם במסגרת שהתווה בית המשפט העליון הבריטי בפסיקה עקבית.</w:t>
       </w:r>
       <w:r>
         <w:rPr>
@@ -5145,7 +5145,7 @@
           <w:szCs w:val="24"/>
           <w:rtl/>
         </w:rPr>
-        <w:t xml:space="preserve"> הישראלית עושה, כפי שנוכחנו, את אותה מלאכה פונקציונלית – אך בלא המסגרת, ולכן בלא היכולת לבקר את הפעלתה ביקורת ערעורית אפקטיבית ובלא שהציבור יכול לכלכל צעדיו על פיה. מן הדין המצרי עולה הלקח ההפוך, והוא נוקב לא פחות: מקום שהמחוקק אינו מתקן את החסם המבני, שום תחכום של תחליפים – תַוְכּיל, תביעות אימות, ואפילו התיישנות רוכשת סטטוטורית – אינו בולם את קריסת המרשם, ותשעים אחוזי אי־רישום הם עדות לכך; ומשהבינה זאת מצרים, בחרה ברפורמת 2022 לוותר על מנוף הגבייה כדי להציל את הפנקס. ומן המשפט השרעי עולה תובנה שלישית, עמוקה משתיהן: שיטה יכולה להשתית יציבות קניינית על עובדה חברתית גלויה – התפיסה – ולא על פנקס; ובחברה שבה ההחזקה הגלויה, הידועה לכל בני החמולה, היא עדיין מוסד חברתי חי, יש בתובנה זו כדי להצדיק – לא אימוץ הדוקטרינה כלשונה, אלא – מתן משקל ראייתי ומהותי גדול בהרבה להחזקה ארוכת שנים שאין חולק עליה, ברוח סעיף 78 לחוק הקרקעות העות׳מאני, שהפך חזקה מעובדת לזכות רישום ולא להפך.</w:t>
+        <w:t xml:space="preserve"> הישראלית עושה, כפי שנוכחנו, את אותה מלאכה פונקציונלית – אך בלא המסגרת, ולכן בלא היכולת לבקר את הפעלתה ביקורת ערעורית אפקטיבית ובלא שהציבור יכול לכלכל צעדיו על פיה. מן הדין המצרי עולה הלקח ההפוך, והוא נוקב לא פחות: מקום שהמחוקק אינו מתקן את החסם המבני, שום תחכום של תחליפים – תַוְכּיל, תביעות אימות, ואפילו התיישנות רוכשת סטטוטורית – אינו בולם את קריסת המרשם, ותשעים אחוזי אי רישום הם עדות לכך; ומשהבינה זאת מצרים, בחרה ברפורמת 2022 לוותר על מנוף הגבייה כדי להציל את הפנקס. ומן המשפט השרעי עולה תובנה שלישית, עמוקה משתיהן: שיטה יכולה להשתית יציבות קניינית על עובדה חברתית גלויה – התפיסה – ולא על פנקס; ובחברה שבה ההחזקה הגלויה, הידועה לכל בני החמולה, היא עדיין מוסד חברתי חי, יש בתובנה זו כדי להצדיק – לא אימוץ הדוקטרינה כלשונה, אלא – מתן משקל ראייתי ומהותי גדול בהרבה להחזקה ארוכת שנים שאין חולק עליה, ברוח סעיף 78 לחוק הקרקעות העות׳מאני, שהפך חזקה מעובדת לזכות רישום ולא להפך.</w:t>
       </w:r>
     </w:p>
     <w:p>
@@ -5162,7 +5162,7 @@
           <w:szCs w:val="24"/>
           <w:rtl/>
         </w:rPr>
-        <w:t xml:space="preserve">משלושת הלקחים הללו נגזרים, במהלך אחד, כיווני התיקון – והם חייבים לפעול בשלושת המישורים בעת ובעונה אחת, שכן המעגל שתואר לעיל אינו ניתן לשבירה בנקודה אחת בלבד. במישור החקיקתי־פיסקלי, פריצת המעגל מתחילה בנקודה שזיהתה מצרים: הוראת שעה להסדרת עסקאות פנים־משפחתיות היסטוריות, שתכלול ויתור על קנסות וריבית (להבדיל מקרן המס), תקרת חבות ומסלול שומה מקוצר לעסקאות שמסמכיהן אבדו. עלות הוויתור נמוכה משנדמה – המס ההיסטורי ממילא אינו נגבה, שכן העסקאות אינן מדווחות – ואילו התועלת, הכנסת דור שלם של נכסים למרשם ולבסיס המס העתידי, ניכרת.</w:t>
+        <w:t xml:space="preserve">משלושת הלקחים הללו נגזרים, במהלך אחד, כיווני התיקון – והם חייבים לפעול בשלושת המישורים בעת ובעונה אחת, שכן המעגל שתואר לעיל אינו ניתן לשבירה בנקודה אחת בלבד. במישור החקיקתי והפיסקלי, פריצת המעגל מתחילה בנקודה שזיהתה מצרים: הוראת שעה להסדרת עסקאות פנים משפחתיות היסטוריות, שתכלול ויתור על קנסות וריבית (להבדיל מקרן המס), תקרת חבות ומסלול שומה מקוצר לעסקאות שמסמכיהן אבדו. עלות הוויתור נמוכה משנדמה – המס ההיסטורי ממילא אינו נגבה, שכן העסקאות אינן מדווחות – ואילו התועלת, הכנסת דור שלם של נכסים למרשם ולבסיס המס העתידי, ניכרת.</w:t>
       </w:r>
       <w:r>
         <w:rPr>
@@ -5192,7 +5192,7 @@
           <w:szCs w:val="24"/>
           <w:rtl/>
         </w:rPr>
-        <w:t xml:space="preserve"> ובמישור השיפוטי, ראוי לעגן בגלוי את המדרג הראייתי שהותווה בפרק ד ולהכיר בכך שהיעדר מסמכים ואי־דיווח היסטורי הם בהקשר זה נורמה תרבותית ואינם אינדיקציה לחוסר אמינות; להמשיג, ברוח הדין האנגלי, "השתק קנייני ישראלי" בן ארבעה יסודות שיחליף את הפנייה הבלתי ממושמעת לזעקת ההגינות; ולהקנות לבתי המשפט לענייני משפחה – הזירה המרכזית של סכסוכים אלה – סמכות מפורשת להורות, אגב פסק הדין, על השלמת הרישום בכפוף להסדרת המס במתווה שייקבע, כדי שפסק הדין עצמו לא יישאר זכות שאינה רשומה. שלושת המישורים תלויים זה בזה: בלא ההקלה הפיסקלית יישאר העיגון השיפוטי הצהרתי; בלא המסגור הדוקטרינרי תישאר ההקלה הפיסקלית בלתי מנוצלת בידי מי שאינו יכול להוכיח את עסקתו; ובלא השלמת ההסדר יוסיף כל דור להוריש לדור הבא סכסוך גדול משהוריש לו קודמו. רק פעולה משולבת תהפוך את הדרך אל המרשם מחומה – לגשר.</w:t>
+        <w:t xml:space="preserve"> ובמישור השיפוטי, ראוי לעגן בגלוי את המדרג הראייתי שהותווה בפרק ד ולהכיר בכך שהיעדר מסמכים ואי דיווח היסטורי הם בהקשר זה נורמה תרבותית ואינם אינדיקציה לחוסר אמינות; להמשיג, ברוח הדין האנגלי, "השתק קנייני ישראלי" בן ארבעה יסודות שיחליף את הפנייה הבלתי ממושמעת לזעקת ההגינות; ולהקנות לבתי המשפט לענייני משפחה – הזירה המרכזית של סכסוכים אלה – סמכות מפורשת להורות, אגב פסק הדין, על השלמת הרישום בכפוף להסדרת המס במתווה שייקבע, כדי שפסק הדין עצמו לא יישאר זכות שאינה רשומה. שלושת המישורים תלויים זה בזה: בלא ההקלה הפיסקלית יישאר העיגון השיפוטי הצהרתי; בלא המסגור הדוקטרינרי תישאר ההקלה הפיסקלית בלתי מנוצלת בידי מי שאינו יכול להוכיח את עסקתו; ובלא השלמת ההסדר יוסיף כל דור להוריש לדור הבא סכסוך גדול משהוריש לו קודמו. רק פעולה משולבת תהפוך את הדרך אל המרשם מחומה – לגשר.</w:t>
       </w:r>
     </w:p>
     <w:p>
@@ -5287,7 +5287,7 @@
           <w:szCs w:val="24"/>
           <w:rtl/>
         </w:rPr>
-        <w:t xml:space="preserve"> – התניית הרישום במס – נמצא כי הצימוד הסטטוטורי שבין המרשם לרשות המסים פועל על עסקאות היסטוריות כחסם מצטבר: חוב השבח, הרכישה, ההצמדה, הריבית והקנסות של עסקת שנות השבעים מוטל כתנאי סף על הדור המבקש להסדיר היום. במישור האזרחי אין באי־הדיווח כדי לאיין את העסקה, אך במישור המעשי הוא מקים "מעגל אי־רישום" המזין את עצמו – והוא עצמו מחולל סכסוכים. הניסיון המצרי, שבו הוליד צימוד דומה אי־רישום של למעלה מתשעים אחוזים עד שנותק ברפורמת 2022, מלמד כי מדובר בכשל מדיניות מבני ולא בכשל אכיפה.</w:t>
+        <w:t xml:space="preserve"> – התניית הרישום במס – נמצא כי הצימוד הסטטוטורי שבין המרשם לרשות המסים פועל על עסקאות היסטוריות כחסם מצטבר: חוב השבח, הרכישה, ההצמדה, הריבית והקנסות של עסקת שנות השבעים מוטל כתנאי סף על הדור המבקש להסדיר היום. במישור האזרחי אין באי הדיווח כדי לאיין את העסקה, אך במישור המעשי הוא מקים "מעגל אי רישום" המזין את עצמו – והוא עצמו מחולל סכסוכים. הניסיון המצרי, שבו הוליד צימוד דומה אי רישום של למעלה מתשעים אחוזים עד שנותק ברפורמת 2022, מלמד כי מדובר בכשל מדיניות מבני ולא בכשל אכיפה.</w:t>
       </w:r>
     </w:p>
     <w:p>
@@ -5315,7 +5315,7 @@
           <w:szCs w:val="24"/>
           <w:rtl/>
         </w:rPr>
-        <w:t xml:space="preserve"> – משקלם של היתר הבנייה והארנונה – הוצע בפרק ד מדרג: אלה אינן ראיות בעלות, שכן מוסדות התכנון והגבייה אינם מכריעים בקניין והארנונה נגבית מן המחזיק באשר הוא; אך הן ראיות נסיבתיות רבות ערך להחזקה, להשקעה ולהסכמה המשפחתית שבזמן אמת – ובעיקר לשתיקתם רבת־השנים של בני המשפחה החולקים היום. כוחן במצטבר ובקוהרנטיות שלהן עם יתר הראיות, לא כתחליף רישום; ועצם הישענות ההכרעה הקניינית על תיעוד מנהלי שנוצר למטרות אחרות היא סימפטום לכשל המרשם.</w:t>
+        <w:t xml:space="preserve"> – משקלם של היתר הבנייה והארנונה – הוצע בפרק ד מדרג: אלה אינן ראיות בעלות, שכן מוסדות התכנון והגבייה אינם מכריעים בקניין והארנונה נגבית מן המחזיק באשר הוא; אך הן ראיות נסיבתיות רבות ערך להחזקה, להשקעה ולהסכמה המשפחתית שבזמן אמת – ובעיקר לשתיקתם רבת השנים של בני המשפחה החולקים היום. כוחן במצטבר ובקוהרנטיות שלהן עם יתר הראיות, לא כתחליף רישום; ועצם הישענות ההכרעה הקניינית על תיעוד מנהלי שנוצר למטרות אחרות היא סימפטום לכשל המרשם.</w:t>
       </w:r>
     </w:p>
     <w:p>
@@ -5343,7 +5343,7 @@
           <w:szCs w:val="24"/>
           <w:rtl/>
         </w:rPr>
-        <w:t xml:space="preserve"> חשפה העבודה רצף גנאלוגי אחד: מן הקַבְּץ׳ והחִיאזָה השרעיים, דרך המג׳לה וחוק הקרקעות העות׳מאני, אל ייפוי הכוח הבלתי חוזר של הפרקטיקה הערבית – בישראל כבמצרים – ואל הזכות שביושר שמקורה אנגלי. הסכסוך הפנים־משפחתי על מקרקעין לא רשומים איננו "סטייה" מקומית מן הדין, אלא מפגש בין שלוש תפיסות הקניה היסטוריות החיות בשכבות השיטה: תפיסה פיזית, מסמך פרטי ומרשם ממלכתי. השופט הישראלי המכריע בתיק כזה מיישב, בלא דעת, בין המג׳לה לבין חוק המקרקעין.</w:t>
+        <w:t xml:space="preserve"> חשפה העבודה רצף גנאלוגי אחד: מן הקַבְּץ׳ והחִיאזָה השרעיים, דרך המג׳לה וחוק הקרקעות העות׳מאני, אל ייפוי הכוח הבלתי חוזר של הפרקטיקה הערבית – בישראל כבמצרים – ואל הזכות שביושר שמקורה אנגלי. הסכסוך הפנים משפחתי על מקרקעין לא רשומים איננו "סטייה" מקומית מן הדין, אלא מפגש בין שלוש תפיסות הקניה היסטוריות החיות בשכבות השיטה: תפיסה פיזית, מסמך פרטי ומרשם ממלכתי. השופט הישראלי המכריע בתיק כזה מיישב, בלא דעת, בין המג׳לה לבין חוק המקרקעין.</w:t>
       </w:r>
     </w:p>
     <w:p>
@@ -5360,7 +5360,7 @@
           <w:szCs w:val="24"/>
           <w:rtl/>
         </w:rPr>
-        <w:t xml:space="preserve">המסקנה המרכזית העולה מן המכלול – ומכיווני התיקון שהותוו בפרק ז – היא שנקודת הכובד של הטיפול בתופעה חייבת לנוע מן ההכרעה השיפוטית בדיעבד אל הסרת החסמים מראש: הסדרה פיסקלית מקילה לעסקאות היסטוריות, השלמת הליכי ההסדר בשיתוף הקהילות, ומסגור דוקטרינרי יציב של ההגנה על המסתמך. נותרות פתוחות שאלות הראויות למחקר המשך: היקפה האמפירי המדויק של התופעה, מעמדן של נשים בהסדרים הפנים־משפחתיים הנדונים, והשאלה כיצד ישפיעו מהלכי הרישום המקוון על דפוסי ההסדרה. המרשם הוא משאת הנפש; אך עד שיגיעו אליו כל בתי החברה הערבית, מוטב שהדרך אליו תהיה גשר – ולא חומה.</w:t>
+        <w:t xml:space="preserve">המסקנה המרכזית העולה מן המכלול – ומכיווני התיקון שהותוו בפרק ז – היא שנקודת הכובד של הטיפול בתופעה חייבת לנוע מן ההכרעה השיפוטית בדיעבד אל הסרת החסמים מראש: הסדרה פיסקלית מקילה לעסקאות היסטוריות, השלמת הליכי ההסדר בשיתוף הקהילות, ומסגור דוקטרינרי יציב של ההגנה על המסתמך. נותרות פתוחות שאלות הראויות למחקר המשך: היקפה האמפירי המדויק של התופעה, מעמדן של נשים בהסדרים הפנים משפחתיים הנדונים, והשאלה כיצד ישפיעו מהלכי הרישום המקוון על דפוסי ההסדרה. המרשם הוא משאת הנפש; אך עד שיגיעו אליו כל בתי החברה הערבית, מוטב שהדרך אליו תהיה גשר – ולא חומה.</w:t>
       </w:r>
     </w:p>
     <w:p>
@@ -5415,7 +5415,7 @@
           <w:szCs w:val="24"/>
           <w:rtl/>
         </w:rPr>
-        <w:t xml:space="preserve">חוק המקרקעין, התשכ"ט-1969.</w:t>
+        <w:t xml:space="preserve">חוק המקרקעין, התשכ"ט–1969.</w:t>
       </w:r>
     </w:p>
     <w:p>
@@ -5432,7 +5432,7 @@
           <w:szCs w:val="24"/>
           <w:rtl/>
         </w:rPr>
-        <w:t xml:space="preserve">חוק המתנה, התשכ"ח-1968.</w:t>
+        <w:t xml:space="preserve">חוק המתנה, התשכ"ח–1968.</w:t>
       </w:r>
     </w:p>
     <w:p>
@@ -5449,7 +5449,7 @@
           <w:szCs w:val="24"/>
           <w:rtl/>
         </w:rPr>
-        <w:t xml:space="preserve">חוק השליחות, התשכ"ה-1965.</w:t>
+        <w:t xml:space="preserve">חוק השליחות, התשכ"ה–1965.</w:t>
       </w:r>
     </w:p>
     <w:p>
@@ -5466,7 +5466,7 @@
           <w:szCs w:val="24"/>
           <w:rtl/>
         </w:rPr>
-        <w:t xml:space="preserve">חוק הירושה, התשכ"ה-1965.</w:t>
+        <w:t xml:space="preserve">חוק הירושה, התשכ"ה–1965.</w:t>
       </w:r>
     </w:p>
     <w:p>
@@ -5483,7 +5483,7 @@
           <w:szCs w:val="24"/>
           <w:rtl/>
         </w:rPr>
-        <w:t xml:space="preserve">חוק מיסוי מקרקעין (שבח ורכישה), התשכ"ג-1963.</w:t>
+        <w:t xml:space="preserve">חוק מיסוי מקרקעין (שבח ורכישה), התשכ"ג–1963.</w:t>
       </w:r>
     </w:p>
     <w:p>
@@ -5500,7 +5500,7 @@
           <w:szCs w:val="24"/>
           <w:rtl/>
         </w:rPr>
-        <w:t xml:space="preserve">חוק ההתיישנות, התשי"ח-1958.</w:t>
+        <w:t xml:space="preserve">חוק ההתיישנות, התשי"ח–1958.</w:t>
       </w:r>
     </w:p>
     <w:p>
@@ -5517,7 +5517,7 @@
           <w:szCs w:val="24"/>
           <w:rtl/>
         </w:rPr>
-        <w:t xml:space="preserve">חוק לביטול המג׳לה, התשמ"ד-1984.</w:t>
+        <w:t xml:space="preserve">חוק לביטול המג׳לה, התשמ"ד–1984.</w:t>
       </w:r>
     </w:p>
     <w:p>
@@ -5534,7 +5534,7 @@
           <w:szCs w:val="24"/>
           <w:rtl/>
         </w:rPr>
-        <w:t xml:space="preserve">פקודת הסדר זכויות במקרקעין [נוסח חדש], התשכ"ט-1969.</w:t>
+        <w:t xml:space="preserve">פקודת הסדר זכויות במקרקעין [נוסח חדש], התשכ"ט–1969.</w:t>
       </w:r>
     </w:p>
     <w:p>
@@ -5551,7 +5551,7 @@
           <w:szCs w:val="24"/>
           <w:rtl/>
         </w:rPr>
-        <w:t xml:space="preserve">פקודת הראיות [נוסח חדש], התשל"א-1971.</w:t>
+        <w:t xml:space="preserve">פקודת הראיות [נוסח חדש], התשל"א–1971.</w:t>
       </w:r>
     </w:p>
     <w:p>
@@ -5568,7 +5568,7 @@
           <w:szCs w:val="24"/>
           <w:rtl/>
         </w:rPr>
-        <w:t xml:space="preserve">חוק התכנון והבנייה, התשכ"ה-1965.</w:t>
+        <w:t xml:space="preserve">חוק התכנון והבנייה, התשכ"ה–1965.</w:t>
       </w:r>
     </w:p>
     <w:p>
@@ -5602,7 +5602,7 @@
           <w:szCs w:val="24"/>
           <w:rtl/>
         </w:rPr>
-        <w:t xml:space="preserve">תקנות התכנון והבניה (רישוי בניה), התשע"ו-2016.</w:t>
+        <w:t xml:space="preserve">תקנות התכנון והבניה (רישוי בניה), התשע"ו–2016.</w:t>
       </w:r>
     </w:p>
     <w:p>
@@ -5636,7 +5636,7 @@
           <w:szCs w:val="24"/>
           <w:rtl/>
         </w:rPr>
-        <w:t xml:space="preserve">מג׳לת אל-אחכאם אל-עדליה (המג׳לה), 1876-1869.</w:t>
+        <w:t xml:space="preserve">מג׳לת אל-אחכאם אל-עדליה (המג׳לה), 1869–1876.</w:t>
       </w:r>
     </w:p>
     <w:p>
@@ -6627,7 +6627,27 @@
           <w:szCs w:val="24"/>
           <w:rtl/>
         </w:rPr>
-        <w:t xml:space="preserve">, מיסים כט(3) ה-320 (2015).</w:t>
+        <w:t xml:space="preserve">, </w:t>
+      </w:r>
+      <w:r>
+        <w:rPr>
+          <w:rFonts w:ascii="David" w:cs="David" w:eastAsia="David" w:hAnsi="David"/>
+          <w:i/>
+          <w:iCs/>
+          <w:sz w:val="24"/>
+          <w:szCs w:val="24"/>
+          <w:rtl/>
+        </w:rPr>
+        <w:t xml:space="preserve">מיסים</w:t>
+      </w:r>
+      <w:r>
+        <w:rPr>
+          <w:rFonts w:ascii="David" w:cs="David" w:eastAsia="David" w:hAnsi="David"/>
+          <w:sz w:val="24"/>
+          <w:szCs w:val="24"/>
+          <w:rtl/>
+        </w:rPr>
+        <w:t xml:space="preserve"> כט/3 ה-320 (2015).</w:t>
       </w:r>
     </w:p>
     <w:p>
@@ -7386,7 +7406,7 @@
           <w:szCs w:val="24"/>
           <w:rtl/>
         </w:rPr>
-        <w:t xml:space="preserve"> (מהדורה שביעית, 2018).</w:t>
+        <w:t xml:space="preserve"> (מהדורה שביעית 2018).</w:t>
       </w:r>
     </w:p>
     <w:p>
@@ -7423,7 +7443,7 @@
           <w:szCs w:val="24"/>
           <w:rtl/>
         </w:rPr>
-        <w:t xml:space="preserve"> (מהדורה שנייה, 1996).</w:t>
+        <w:t xml:space="preserve"> (מהדורה שנייה 1996).</w:t>
       </w:r>
     </w:p>
     <w:p>
@@ -7497,7 +7517,7 @@
           <w:szCs w:val="24"/>
           <w:rtl/>
         </w:rPr>
-        <w:t xml:space="preserve"> (מהדורה שנייה, 2021).</w:t>
+        <w:t xml:space="preserve"> (מהדורה שנייה 2021).</w:t>
       </w:r>
     </w:p>
     <w:p>
@@ -7551,7 +7571,27 @@
           <w:szCs w:val="24"/>
           <w:rtl/>
         </w:rPr>
-        <w:t xml:space="preserve">יהושע ויסמן "יפוי-כוח בלתי-חוזר כתחליף לבעלות" משפטים יד 572 (תשמ"ה).</w:t>
+        <w:t xml:space="preserve">יהושע ויסמן "יפוי-כוח בלתי-חוזר כתחליף לבעלות" </w:t>
+      </w:r>
+      <w:r>
+        <w:rPr>
+          <w:rFonts w:ascii="David" w:cs="David" w:eastAsia="David" w:hAnsi="David"/>
+          <w:i/>
+          <w:iCs/>
+          <w:sz w:val="24"/>
+          <w:szCs w:val="24"/>
+          <w:rtl/>
+        </w:rPr>
+        <w:t xml:space="preserve">משפטים</w:t>
+      </w:r>
+      <w:r>
+        <w:rPr>
+          <w:rFonts w:ascii="David" w:cs="David" w:eastAsia="David" w:hAnsi="David"/>
+          <w:sz w:val="24"/>
+          <w:szCs w:val="24"/>
+          <w:rtl/>
+        </w:rPr>
+        <w:t xml:space="preserve"> יד 572 (תשמ"ה).</w:t>
       </w:r>
     </w:p>
     <w:p>
@@ -7568,7 +7608,27 @@
           <w:szCs w:val="24"/>
           <w:rtl/>
         </w:rPr>
-        <w:t xml:space="preserve">נינה זלצמן "רישיון במקרקעין" הפרקליט מב 24 (תשנ"ה).</w:t>
+        <w:t xml:space="preserve">נינה זלצמן "רישיון במקרקעין" </w:t>
+      </w:r>
+      <w:r>
+        <w:rPr>
+          <w:rFonts w:ascii="David" w:cs="David" w:eastAsia="David" w:hAnsi="David"/>
+          <w:i/>
+          <w:iCs/>
+          <w:sz w:val="24"/>
+          <w:szCs w:val="24"/>
+          <w:rtl/>
+        </w:rPr>
+        <w:t xml:space="preserve">הפרקליט</w:t>
+      </w:r>
+      <w:r>
+        <w:rPr>
+          <w:rFonts w:ascii="David" w:cs="David" w:eastAsia="David" w:hAnsi="David"/>
+          <w:sz w:val="24"/>
+          <w:szCs w:val="24"/>
+          <w:rtl/>
+        </w:rPr>
+        <w:t xml:space="preserve"> מב 24 (תשנ"ה).</w:t>
       </w:r>
     </w:p>
     <w:p>
@@ -7585,7 +7645,27 @@
           <w:szCs w:val="24"/>
           <w:rtl/>
         </w:rPr>
-        <w:t xml:space="preserve">"חוזים על פי דיני התורה" כתר א 71 (תשנ"ו).</w:t>
+        <w:t xml:space="preserve">"חוזים על פי דיני התורה" </w:t>
+      </w:r>
+      <w:r>
+        <w:rPr>
+          <w:rFonts w:ascii="David" w:cs="David" w:eastAsia="David" w:hAnsi="David"/>
+          <w:i/>
+          <w:iCs/>
+          <w:sz w:val="24"/>
+          <w:szCs w:val="24"/>
+          <w:rtl/>
+        </w:rPr>
+        <w:t xml:space="preserve">כתר</w:t>
+      </w:r>
+      <w:r>
+        <w:rPr>
+          <w:rFonts w:ascii="David" w:cs="David" w:eastAsia="David" w:hAnsi="David"/>
+          <w:sz w:val="24"/>
+          <w:szCs w:val="24"/>
+          <w:rtl/>
+        </w:rPr>
+        <w:t xml:space="preserve"> א 71 (תשנ"ו).</w:t>
       </w:r>
     </w:p>
     <w:p>
@@ -7676,7 +7756,27 @@
           <w:szCs w:val="24"/>
           <w:rtl/>
         </w:rPr>
-        <w:t xml:space="preserve">חיים זנדברג "עסקה בזכות אובליגטורית או בזכות במקרקעין? תכלית, לשון ואקטיביזם שיפוטי" משפטים על אתר יג 79 (תש"ף).</w:t>
+        <w:t xml:space="preserve">חיים זנדברג "עסקה בזכות אובליגטורית או בזכות במקרקעין? תכלית, לשון ואקטיביזם שיפוטי" </w:t>
+      </w:r>
+      <w:r>
+        <w:rPr>
+          <w:rFonts w:ascii="David" w:cs="David" w:eastAsia="David" w:hAnsi="David"/>
+          <w:i/>
+          <w:iCs/>
+          <w:sz w:val="24"/>
+          <w:szCs w:val="24"/>
+          <w:rtl/>
+        </w:rPr>
+        <w:t xml:space="preserve">משפטים על אתר</w:t>
+      </w:r>
+      <w:r>
+        <w:rPr>
+          <w:rFonts w:ascii="David" w:cs="David" w:eastAsia="David" w:hAnsi="David"/>
+          <w:sz w:val="24"/>
+          <w:szCs w:val="24"/>
+          <w:rtl/>
+        </w:rPr>
+        <w:t xml:space="preserve"> יג 79 (תש"ף).</w:t>
       </w:r>
     </w:p>
     <w:p>
@@ -7693,7 +7793,27 @@
           <w:szCs w:val="24"/>
           <w:rtl/>
         </w:rPr>
-        <w:t xml:space="preserve">גד טדסקי "הרשאה בלתי-הדירה לביצוע מתנה לאדם שלישי" משפטים יט 205 (תשמ"ט).</w:t>
+        <w:t xml:space="preserve">גד טדסקי "הרשאה בלתי-הדירה לביצוע מתנה לאדם שלישי" </w:t>
+      </w:r>
+      <w:r>
+        <w:rPr>
+          <w:rFonts w:ascii="David" w:cs="David" w:eastAsia="David" w:hAnsi="David"/>
+          <w:i/>
+          <w:iCs/>
+          <w:sz w:val="24"/>
+          <w:szCs w:val="24"/>
+          <w:rtl/>
+        </w:rPr>
+        <w:t xml:space="preserve">משפטים</w:t>
+      </w:r>
+      <w:r>
+        <w:rPr>
+          <w:rFonts w:ascii="David" w:cs="David" w:eastAsia="David" w:hAnsi="David"/>
+          <w:sz w:val="24"/>
+          <w:szCs w:val="24"/>
+          <w:rtl/>
+        </w:rPr>
+        <w:t xml:space="preserve"> יט 205 (תשמ"ט).</w:t>
       </w:r>
     </w:p>
     <w:p>
@@ -7710,7 +7830,27 @@
           <w:szCs w:val="24"/>
           <w:rtl/>
         </w:rPr>
-        <w:t xml:space="preserve">אורן יפתחאל, סנדי קדר ואחמד אמארה "עיון מחדש בהלכת 'הנגב המת': זכויות קניין במרחב הבדווי" משפט וממשל יד 7 (2012).</w:t>
+        <w:t xml:space="preserve">אורן יפתחאל, סנדי קדר ואחמד אמארה "עיון מחדש בהלכת 'הנגב המת': זכויות קניין במרחב הבדווי" </w:t>
+      </w:r>
+      <w:r>
+        <w:rPr>
+          <w:rFonts w:ascii="David" w:cs="David" w:eastAsia="David" w:hAnsi="David"/>
+          <w:i/>
+          <w:iCs/>
+          <w:sz w:val="24"/>
+          <w:szCs w:val="24"/>
+          <w:rtl/>
+        </w:rPr>
+        <w:t xml:space="preserve">משפט וממשל</w:t>
+      </w:r>
+      <w:r>
+        <w:rPr>
+          <w:rFonts w:ascii="David" w:cs="David" w:eastAsia="David" w:hAnsi="David"/>
+          <w:sz w:val="24"/>
+          <w:szCs w:val="24"/>
+          <w:rtl/>
+        </w:rPr>
+        <w:t xml:space="preserve"> יד 7 (2012).</w:t>
       </w:r>
     </w:p>
     <w:p>
@@ -7727,7 +7867,27 @@
           <w:szCs w:val="24"/>
           <w:rtl/>
         </w:rPr>
-        <w:t xml:space="preserve">נילי כהן "צורת החוזה" הפרקליט לח 383 (תשמ"ט).</w:t>
+        <w:t xml:space="preserve">נילי כהן "צורת החוזה" </w:t>
+      </w:r>
+      <w:r>
+        <w:rPr>
+          <w:rFonts w:ascii="David" w:cs="David" w:eastAsia="David" w:hAnsi="David"/>
+          <w:i/>
+          <w:iCs/>
+          <w:sz w:val="24"/>
+          <w:szCs w:val="24"/>
+          <w:rtl/>
+        </w:rPr>
+        <w:t xml:space="preserve">הפרקליט</w:t>
+      </w:r>
+      <w:r>
+        <w:rPr>
+          <w:rFonts w:ascii="David" w:cs="David" w:eastAsia="David" w:hAnsi="David"/>
+          <w:sz w:val="24"/>
+          <w:szCs w:val="24"/>
+          <w:rtl/>
+        </w:rPr>
+        <w:t xml:space="preserve"> לח 383 (תשמ"ט).</w:t>
       </w:r>
     </w:p>
     <w:p>
@@ -7744,7 +7904,27 @@
           <w:szCs w:val="24"/>
           <w:rtl/>
         </w:rPr>
-        <w:t xml:space="preserve">רונית לוין-שנור "הפרטה, הפרדה והפליה – זניחת ההליכים של הסדר הזכויות במקרקעין במזרח ירושלים" עיוני משפט לד 183 (2011).</w:t>
+        <w:t xml:space="preserve">רונית לוין-שנור "הפרטה, הפרדה והפליה – זניחת ההליכים של הסדר הזכויות במקרקעין במזרח ירושלים" </w:t>
+      </w:r>
+      <w:r>
+        <w:rPr>
+          <w:rFonts w:ascii="David" w:cs="David" w:eastAsia="David" w:hAnsi="David"/>
+          <w:i/>
+          <w:iCs/>
+          <w:sz w:val="24"/>
+          <w:szCs w:val="24"/>
+          <w:rtl/>
+        </w:rPr>
+        <w:t xml:space="preserve">עיוני משפט</w:t>
+      </w:r>
+      <w:r>
+        <w:rPr>
+          <w:rFonts w:ascii="David" w:cs="David" w:eastAsia="David" w:hAnsi="David"/>
+          <w:sz w:val="24"/>
+          <w:szCs w:val="24"/>
+          <w:rtl/>
+        </w:rPr>
+        <w:t xml:space="preserve"> לד 183 (2011).</w:t>
       </w:r>
     </w:p>
     <w:p>
@@ -7855,7 +8035,7 @@
           <w:szCs w:val="24"/>
           <w:rtl/>
         </w:rPr>
-        <w:t xml:space="preserve"> כרך א (מהדורה שנייה, 2018).</w:t>
+        <w:t xml:space="preserve"> כרך א (מהדורה שנייה 2018).</w:t>
       </w:r>
     </w:p>
     <w:p>
@@ -7883,16 +8063,16 @@
           <w:szCs w:val="24"/>
           <w:rtl/>
         </w:rPr>
-        <w:t xml:space="preserve">חוק המתנה, תשכ"ח-1968</w:t>
-      </w:r>
-      <w:r>
-        <w:rPr>
-          <w:rFonts w:ascii="David" w:cs="David" w:eastAsia="David" w:hAnsi="David"/>
-          <w:sz w:val="24"/>
-          <w:szCs w:val="24"/>
-          <w:rtl/>
-        </w:rPr>
-        <w:t xml:space="preserve"> (פירוש לחוקי החוזים מיסודו של ג׳ טדסקי, מהדורה שנייה, תשנ"ז).</w:t>
+        <w:t xml:space="preserve">חוק המתנה, תשכ"ח–1968</w:t>
+      </w:r>
+      <w:r>
+        <w:rPr>
+          <w:rFonts w:ascii="David" w:cs="David" w:eastAsia="David" w:hAnsi="David"/>
+          <w:sz w:val="24"/>
+          <w:szCs w:val="24"/>
+          <w:rtl/>
+        </w:rPr>
+        <w:t xml:space="preserve"> (פירוש לחוקי החוזים מיסודו של ג׳ טדסקי, מהדורה שנייה 1996).</w:t>
       </w:r>
     </w:p>
     <w:p>
@@ -7909,7 +8089,27 @@
           <w:szCs w:val="24"/>
           <w:rtl/>
         </w:rPr>
-        <w:t xml:space="preserve">אוריאל רייכמן "הערת האזהרה – מהות, יצירה והגנה כנגד עסקות נוגדות" עיוני משפט י 297 (1984).</w:t>
+        <w:t xml:space="preserve">אוריאל רייכמן "הערת האזהרה – מהות, יצירה והגנה כנגד עסקות נוגדות" </w:t>
+      </w:r>
+      <w:r>
+        <w:rPr>
+          <w:rFonts w:ascii="David" w:cs="David" w:eastAsia="David" w:hAnsi="David"/>
+          <w:i/>
+          <w:iCs/>
+          <w:sz w:val="24"/>
+          <w:szCs w:val="24"/>
+          <w:rtl/>
+        </w:rPr>
+        <w:t xml:space="preserve">עיוני משפט</w:t>
+      </w:r>
+      <w:r>
+        <w:rPr>
+          <w:rFonts w:ascii="David" w:cs="David" w:eastAsia="David" w:hAnsi="David"/>
+          <w:sz w:val="24"/>
+          <w:szCs w:val="24"/>
+          <w:rtl/>
+        </w:rPr>
+        <w:t xml:space="preserve"> י 297 (1984).</w:t>
       </w:r>
     </w:p>
     <w:p>
@@ -7983,7 +8183,7 @@
           <w:szCs w:val="24"/>
           <w:rtl/>
         </w:rPr>
-        <w:t xml:space="preserve"> (מהדורה שנייה, 2024).</w:t>
+        <w:t xml:space="preserve"> (מהדורה שנייה 2024).</w:t>
       </w:r>
     </w:p>
     <w:p>
@@ -8017,7 +8217,7 @@
           <w:sz w:val="24"/>
           <w:szCs w:val="24"/>
         </w:rPr>
-        <w:t xml:space="preserve">Land Registration Act 2002 (UK).</w:t>
+        <w:t xml:space="preserve">Land Registration Act 2002, c. 9 (UK).</w:t>
       </w:r>
     </w:p>
     <w:p>
@@ -8032,7 +8232,7 @@
           <w:sz w:val="24"/>
           <w:szCs w:val="24"/>
         </w:rPr>
-        <w:t xml:space="preserve">Land Registration Act 1925 (UK).</w:t>
+        <w:t xml:space="preserve">Land Registration Act 1925, c. 21 (UK).</w:t>
       </w:r>
     </w:p>
     <w:p>
@@ -8047,7 +8247,7 @@
           <w:sz w:val="24"/>
           <w:szCs w:val="24"/>
         </w:rPr>
-        <w:t xml:space="preserve">Law of Property (Miscellaneous Provisions) Act 1989 (UK).</w:t>
+        <w:t xml:space="preserve">Law of Property (Miscellaneous Provisions) Act 1989, c. 34 (UK).</w:t>
       </w:r>
     </w:p>
     <w:p>
@@ -8062,7 +8262,7 @@
           <w:sz w:val="24"/>
           <w:szCs w:val="24"/>
         </w:rPr>
-        <w:t xml:space="preserve">Powers of Attorney Act 1971 (UK).</w:t>
+        <w:t xml:space="preserve">Powers of Attorney Act 1971, c. 27 (UK).</w:t>
       </w:r>
     </w:p>
     <w:p>
@@ -8336,7 +8536,42 @@
           <w:sz w:val="24"/>
           <w:szCs w:val="24"/>
         </w:rPr>
-        <w:t xml:space="preserve">Ahmad Amara, “Dispossession by Law: How the Israeli Judicial System Utilizes Ottoman Land Law to Expel and Dispossess the Bedouins,” Journal of Levantine Studies (2015).</w:t>
+        <w:t xml:space="preserve">Ahmad Amara, </w:t>
+      </w:r>
+      <w:r>
+        <w:rPr>
+          <w:rFonts w:ascii="Times New Roman" w:cs="Times New Roman" w:eastAsia="Times New Roman" w:hAnsi="Times New Roman"/>
+          <w:i/>
+          <w:iCs/>
+          <w:sz w:val="24"/>
+          <w:szCs w:val="24"/>
+        </w:rPr>
+        <w:t xml:space="preserve">Dispossession by Law: How the Israeli Judicial System Utilizes Ottoman Land Law to Expel and Dispossess the Bedouins</w:t>
+      </w:r>
+      <w:r>
+        <w:rPr>
+          <w:rFonts w:ascii="Times New Roman" w:cs="Times New Roman" w:eastAsia="Times New Roman" w:hAnsi="Times New Roman"/>
+          <w:sz w:val="24"/>
+          <w:szCs w:val="24"/>
+        </w:rPr>
+        <w:t xml:space="preserve">, </w:t>
+      </w:r>
+      <w:r>
+        <w:rPr>
+          <w:rFonts w:ascii="Times New Roman" w:cs="Times New Roman" w:eastAsia="Times New Roman" w:hAnsi="Times New Roman"/>
+          <w:smallCaps/>
+          <w:sz w:val="24"/>
+          <w:szCs w:val="24"/>
+        </w:rPr>
+        <w:t xml:space="preserve">Journal of Levantine Studies</w:t>
+      </w:r>
+      <w:r>
+        <w:rPr>
+          <w:rFonts w:ascii="Times New Roman" w:cs="Times New Roman" w:eastAsia="Times New Roman" w:hAnsi="Times New Roman"/>
+          <w:sz w:val="24"/>
+          <w:szCs w:val="24"/>
+        </w:rPr>
+        <w:t xml:space="preserve"> (2015).</w:t>
       </w:r>
     </w:p>
     <w:p>
@@ -8351,7 +8586,42 @@
           <w:sz w:val="24"/>
           <w:szCs w:val="24"/>
         </w:rPr>
-        <w:t xml:space="preserve">Chris Bevan, “Overriding Interests under the Land Registration Act 2002: Time to Repair the ‘Cracked Mirror’?” [2024] Conveyancer &amp; Property Lawyer 123.</w:t>
+        <w:t xml:space="preserve">Chris Bevan, </w:t>
+      </w:r>
+      <w:r>
+        <w:rPr>
+          <w:rFonts w:ascii="Times New Roman" w:cs="Times New Roman" w:eastAsia="Times New Roman" w:hAnsi="Times New Roman"/>
+          <w:i/>
+          <w:iCs/>
+          <w:sz w:val="24"/>
+          <w:szCs w:val="24"/>
+        </w:rPr>
+        <w:t xml:space="preserve">Overriding Interests under the Land Registration Act 2002: Time to Repair the ‘Cracked Mirror’?</w:t>
+      </w:r>
+      <w:r>
+        <w:rPr>
+          <w:rFonts w:ascii="Times New Roman" w:cs="Times New Roman" w:eastAsia="Times New Roman" w:hAnsi="Times New Roman"/>
+          <w:sz w:val="24"/>
+          <w:szCs w:val="24"/>
+        </w:rPr>
+        <w:t xml:space="preserve"> [2024] </w:t>
+      </w:r>
+      <w:r>
+        <w:rPr>
+          <w:rFonts w:ascii="Times New Roman" w:cs="Times New Roman" w:eastAsia="Times New Roman" w:hAnsi="Times New Roman"/>
+          <w:smallCaps/>
+          <w:sz w:val="24"/>
+          <w:szCs w:val="24"/>
+        </w:rPr>
+        <w:t xml:space="preserve">Conveyancer &amp; Property Lawyer</w:t>
+      </w:r>
+      <w:r>
+        <w:rPr>
+          <w:rFonts w:ascii="Times New Roman" w:cs="Times New Roman" w:eastAsia="Times New Roman" w:hAnsi="Times New Roman"/>
+          <w:sz w:val="24"/>
+          <w:szCs w:val="24"/>
+        </w:rPr>
+        <w:t xml:space="preserve"> 123.</w:t>
       </w:r>
     </w:p>
     <w:p>
@@ -8363,10 +8633,19 @@
       <w:r>
         <w:rPr>
           <w:rFonts w:ascii="Times New Roman" w:cs="Times New Roman" w:eastAsia="Times New Roman" w:hAnsi="Times New Roman"/>
-          <w:sz w:val="24"/>
-          <w:szCs w:val="24"/>
-        </w:rPr>
-        <w:t xml:space="preserve">N.J. Coulson, Succession in the Muslim Family (1971).</w:t>
+          <w:smallCaps/>
+          <w:sz w:val="24"/>
+          <w:szCs w:val="24"/>
+        </w:rPr>
+        <w:t xml:space="preserve">N.J. Coulson, Succession in the Muslim Family</w:t>
+      </w:r>
+      <w:r>
+        <w:rPr>
+          <w:rFonts w:ascii="Times New Roman" w:cs="Times New Roman" w:eastAsia="Times New Roman" w:hAnsi="Times New Roman"/>
+          <w:sz w:val="24"/>
+          <w:szCs w:val="24"/>
+        </w:rPr>
+        <w:t xml:space="preserve"> (1971).</w:t>
       </w:r>
     </w:p>
     <w:p>
@@ -8378,10 +8657,19 @@
       <w:r>
         <w:rPr>
           <w:rFonts w:ascii="Times New Roman" w:cs="Times New Roman" w:eastAsia="Times New Roman" w:hAnsi="Times New Roman"/>
-          <w:sz w:val="24"/>
-          <w:szCs w:val="24"/>
-        </w:rPr>
-        <w:t xml:space="preserve">Hernando de Soto, The Mystery of Capital: Why Capitalism Triumphs in the West and Fails Everywhere Else (2000).</w:t>
+          <w:smallCaps/>
+          <w:sz w:val="24"/>
+          <w:szCs w:val="24"/>
+        </w:rPr>
+        <w:t xml:space="preserve">Hernando de Soto, The Mystery of Capital: Why Capitalism Triumphs in the West and Fails Everywhere Else</w:t>
+      </w:r>
+      <w:r>
+        <w:rPr>
+          <w:rFonts w:ascii="Times New Roman" w:cs="Times New Roman" w:eastAsia="Times New Roman" w:hAnsi="Times New Roman"/>
+          <w:sz w:val="24"/>
+          <w:szCs w:val="24"/>
+        </w:rPr>
+        <w:t xml:space="preserve"> (2000).</w:t>
       </w:r>
     </w:p>
     <w:p>
@@ -8396,7 +8684,42 @@
           <w:sz w:val="24"/>
           <w:szCs w:val="24"/>
         </w:rPr>
-        <w:t xml:space="preserve">Kareem Ibrahim &amp; Deena Khalil, “Land Titling: A Tool, not a Panacea — Insights from Egypt,” Metropolitics (Dec. 20, 2016), metropolitics.org.</w:t>
+        <w:t xml:space="preserve">Kareem Ibrahim &amp; Deena Khalil, </w:t>
+      </w:r>
+      <w:r>
+        <w:rPr>
+          <w:rFonts w:ascii="Times New Roman" w:cs="Times New Roman" w:eastAsia="Times New Roman" w:hAnsi="Times New Roman"/>
+          <w:i/>
+          <w:iCs/>
+          <w:sz w:val="24"/>
+          <w:szCs w:val="24"/>
+        </w:rPr>
+        <w:t xml:space="preserve">Land Titling: A Tool, not a Panacea — Insights from Egypt</w:t>
+      </w:r>
+      <w:r>
+        <w:rPr>
+          <w:rFonts w:ascii="Times New Roman" w:cs="Times New Roman" w:eastAsia="Times New Roman" w:hAnsi="Times New Roman"/>
+          <w:sz w:val="24"/>
+          <w:szCs w:val="24"/>
+        </w:rPr>
+        <w:t xml:space="preserve">, </w:t>
+      </w:r>
+      <w:r>
+        <w:rPr>
+          <w:rFonts w:ascii="Times New Roman" w:cs="Times New Roman" w:eastAsia="Times New Roman" w:hAnsi="Times New Roman"/>
+          <w:smallCaps/>
+          <w:sz w:val="24"/>
+          <w:szCs w:val="24"/>
+        </w:rPr>
+        <w:t xml:space="preserve">Metropolitics</w:t>
+      </w:r>
+      <w:r>
+        <w:rPr>
+          <w:rFonts w:ascii="Times New Roman" w:cs="Times New Roman" w:eastAsia="Times New Roman" w:hAnsi="Times New Roman"/>
+          <w:sz w:val="24"/>
+          <w:szCs w:val="24"/>
+        </w:rPr>
+        <w:t xml:space="preserve"> (Dec. 20, 2016), metropolitics.org.</w:t>
       </w:r>
     </w:p>
     <w:p>
@@ -8411,7 +8734,42 @@
           <w:sz w:val="24"/>
           <w:szCs w:val="24"/>
         </w:rPr>
-        <w:t xml:space="preserve">Ruth Kark, “Consequences of the Ottoman Land Law: Agrarian and Privatization Processes in Palestine, 1858–1918,” in Societies, Social Inequalities and Marginalization (R. Chand, E. Nel &amp; S. Pelc eds., 2017).</w:t>
+        <w:t xml:space="preserve">Ruth Kark, </w:t>
+      </w:r>
+      <w:r>
+        <w:rPr>
+          <w:rFonts w:ascii="Times New Roman" w:cs="Times New Roman" w:eastAsia="Times New Roman" w:hAnsi="Times New Roman"/>
+          <w:i/>
+          <w:iCs/>
+          <w:sz w:val="24"/>
+          <w:szCs w:val="24"/>
+        </w:rPr>
+        <w:t xml:space="preserve">Consequences of the Ottoman Land Law: Agrarian and Privatization Processes in Palestine, 1858–1918</w:t>
+      </w:r>
+      <w:r>
+        <w:rPr>
+          <w:rFonts w:ascii="Times New Roman" w:cs="Times New Roman" w:eastAsia="Times New Roman" w:hAnsi="Times New Roman"/>
+          <w:sz w:val="24"/>
+          <w:szCs w:val="24"/>
+        </w:rPr>
+        <w:t xml:space="preserve">, in </w:t>
+      </w:r>
+      <w:r>
+        <w:rPr>
+          <w:rFonts w:ascii="Times New Roman" w:cs="Times New Roman" w:eastAsia="Times New Roman" w:hAnsi="Times New Roman"/>
+          <w:smallCaps/>
+          <w:sz w:val="24"/>
+          <w:szCs w:val="24"/>
+        </w:rPr>
+        <w:t xml:space="preserve">Societies, Social Inequalities and Marginalization</w:t>
+      </w:r>
+      <w:r>
+        <w:rPr>
+          <w:rFonts w:ascii="Times New Roman" w:cs="Times New Roman" w:eastAsia="Times New Roman" w:hAnsi="Times New Roman"/>
+          <w:sz w:val="24"/>
+          <w:szCs w:val="24"/>
+        </w:rPr>
+        <w:t xml:space="preserve"> (R. Chand, E. Nel &amp; S. Pelc eds., 2017).</w:t>
       </w:r>
     </w:p>
     <w:p>
@@ -8426,7 +8784,42 @@
           <w:sz w:val="24"/>
           <w:szCs w:val="24"/>
         </w:rPr>
-        <w:t xml:space="preserve">Nasr Kheir &amp; Boris A. Portnov, “Land Market Segmentation Along Ethnic Lines: Four Urban Localities in Israel as a Case Study,” 136 Land Use Policy art. 106916 (2024).</w:t>
+        <w:t xml:space="preserve">Nasr Kheir &amp; Boris A. Portnov, </w:t>
+      </w:r>
+      <w:r>
+        <w:rPr>
+          <w:rFonts w:ascii="Times New Roman" w:cs="Times New Roman" w:eastAsia="Times New Roman" w:hAnsi="Times New Roman"/>
+          <w:i/>
+          <w:iCs/>
+          <w:sz w:val="24"/>
+          <w:szCs w:val="24"/>
+        </w:rPr>
+        <w:t xml:space="preserve">Land Market Segmentation Along Ethnic Lines: Four Urban Localities in Israel as a Case Study</w:t>
+      </w:r>
+      <w:r>
+        <w:rPr>
+          <w:rFonts w:ascii="Times New Roman" w:cs="Times New Roman" w:eastAsia="Times New Roman" w:hAnsi="Times New Roman"/>
+          <w:sz w:val="24"/>
+          <w:szCs w:val="24"/>
+        </w:rPr>
+        <w:t xml:space="preserve">, 136 </w:t>
+      </w:r>
+      <w:r>
+        <w:rPr>
+          <w:rFonts w:ascii="Times New Roman" w:cs="Times New Roman" w:eastAsia="Times New Roman" w:hAnsi="Times New Roman"/>
+          <w:smallCaps/>
+          <w:sz w:val="24"/>
+          <w:szCs w:val="24"/>
+        </w:rPr>
+        <w:t xml:space="preserve">Land Use Policy</w:t>
+      </w:r>
+      <w:r>
+        <w:rPr>
+          <w:rFonts w:ascii="Times New Roman" w:cs="Times New Roman" w:eastAsia="Times New Roman" w:hAnsi="Times New Roman"/>
+          <w:sz w:val="24"/>
+          <w:szCs w:val="24"/>
+        </w:rPr>
+        <w:t xml:space="preserve"> art. 106916 (2024).</w:t>
       </w:r>
     </w:p>
     <w:p>
@@ -8441,7 +8834,42 @@
           <w:sz w:val="24"/>
           <w:szCs w:val="24"/>
         </w:rPr>
-        <w:t xml:space="preserve">L. Landau, “The Gift Law, 1968,” 4 Israel Law Review 260 (1969).</w:t>
+        <w:t xml:space="preserve">L. Landau, </w:t>
+      </w:r>
+      <w:r>
+        <w:rPr>
+          <w:rFonts w:ascii="Times New Roman" w:cs="Times New Roman" w:eastAsia="Times New Roman" w:hAnsi="Times New Roman"/>
+          <w:i/>
+          <w:iCs/>
+          <w:sz w:val="24"/>
+          <w:szCs w:val="24"/>
+        </w:rPr>
+        <w:t xml:space="preserve">The Gift Law, 1968</w:t>
+      </w:r>
+      <w:r>
+        <w:rPr>
+          <w:rFonts w:ascii="Times New Roman" w:cs="Times New Roman" w:eastAsia="Times New Roman" w:hAnsi="Times New Roman"/>
+          <w:sz w:val="24"/>
+          <w:szCs w:val="24"/>
+        </w:rPr>
+        <w:t xml:space="preserve">, 4 </w:t>
+      </w:r>
+      <w:r>
+        <w:rPr>
+          <w:rFonts w:ascii="Times New Roman" w:cs="Times New Roman" w:eastAsia="Times New Roman" w:hAnsi="Times New Roman"/>
+          <w:smallCaps/>
+          <w:sz w:val="24"/>
+          <w:szCs w:val="24"/>
+        </w:rPr>
+        <w:t xml:space="preserve">Israel Law Review</w:t>
+      </w:r>
+      <w:r>
+        <w:rPr>
+          <w:rFonts w:ascii="Times New Roman" w:cs="Times New Roman" w:eastAsia="Times New Roman" w:hAnsi="Times New Roman"/>
+          <w:sz w:val="24"/>
+          <w:szCs w:val="24"/>
+        </w:rPr>
+        <w:t xml:space="preserve"> 260 (1969).</w:t>
       </w:r>
     </w:p>
     <w:p>
@@ -8453,10 +8881,19 @@
       <w:r>
         <w:rPr>
           <w:rFonts w:ascii="Times New Roman" w:cs="Times New Roman" w:eastAsia="Times New Roman" w:hAnsi="Times New Roman"/>
-          <w:sz w:val="24"/>
-          <w:szCs w:val="24"/>
-        </w:rPr>
-        <w:t xml:space="preserve">Aharon Layish, Women and Islamic Law in a Non-Muslim State: A Study Based on Decisions of the Shari‘a Courts in Israel (1975).</w:t>
+          <w:smallCaps/>
+          <w:sz w:val="24"/>
+          <w:szCs w:val="24"/>
+        </w:rPr>
+        <w:t xml:space="preserve">Aharon Layish, Women and Islamic Law in a Non-Muslim State: A Study Based on Decisions of the Shari‘a Courts in Israel</w:t>
+      </w:r>
+      <w:r>
+        <w:rPr>
+          <w:rFonts w:ascii="Times New Roman" w:cs="Times New Roman" w:eastAsia="Times New Roman" w:hAnsi="Times New Roman"/>
+          <w:sz w:val="24"/>
+          <w:szCs w:val="24"/>
+        </w:rPr>
+        <w:t xml:space="preserve"> (1975).</w:t>
       </w:r>
     </w:p>
     <w:p>
@@ -8471,7 +8908,42 @@
           <w:sz w:val="24"/>
           <w:szCs w:val="24"/>
         </w:rPr>
-        <w:t xml:space="preserve">Y. Linant de Bellefonds, “Hiba,” in The Encyclopaedia of Islam (2d ed.).</w:t>
+        <w:t xml:space="preserve">Y. Linant de Bellefonds, </w:t>
+      </w:r>
+      <w:r>
+        <w:rPr>
+          <w:rFonts w:ascii="Times New Roman" w:cs="Times New Roman" w:eastAsia="Times New Roman" w:hAnsi="Times New Roman"/>
+          <w:i/>
+          <w:iCs/>
+          <w:sz w:val="24"/>
+          <w:szCs w:val="24"/>
+        </w:rPr>
+        <w:t xml:space="preserve">Hiba</w:t>
+      </w:r>
+      <w:r>
+        <w:rPr>
+          <w:rFonts w:ascii="Times New Roman" w:cs="Times New Roman" w:eastAsia="Times New Roman" w:hAnsi="Times New Roman"/>
+          <w:sz w:val="24"/>
+          <w:szCs w:val="24"/>
+        </w:rPr>
+        <w:t xml:space="preserve">, in </w:t>
+      </w:r>
+      <w:r>
+        <w:rPr>
+          <w:rFonts w:ascii="Times New Roman" w:cs="Times New Roman" w:eastAsia="Times New Roman" w:hAnsi="Times New Roman"/>
+          <w:smallCaps/>
+          <w:sz w:val="24"/>
+          <w:szCs w:val="24"/>
+        </w:rPr>
+        <w:t xml:space="preserve">The Encyclopaedia of Islam</w:t>
+      </w:r>
+      <w:r>
+        <w:rPr>
+          <w:rFonts w:ascii="Times New Roman" w:cs="Times New Roman" w:eastAsia="Times New Roman" w:hAnsi="Times New Roman"/>
+          <w:sz w:val="24"/>
+          <w:szCs w:val="24"/>
+        </w:rPr>
+        <w:t xml:space="preserve"> (2d ed.).</w:t>
       </w:r>
     </w:p>
     <w:p>
@@ -8483,10 +8955,19 @@
       <w:r>
         <w:rPr>
           <w:rFonts w:ascii="Times New Roman" w:cs="Times New Roman" w:eastAsia="Times New Roman" w:hAnsi="Times New Roman"/>
-          <w:sz w:val="24"/>
-          <w:szCs w:val="24"/>
-        </w:rPr>
-        <w:t xml:space="preserve">Annelies Moors, Women, Property and Islam: Palestinian Experiences, 1920–1990 (1995).</w:t>
+          <w:smallCaps/>
+          <w:sz w:val="24"/>
+          <w:szCs w:val="24"/>
+        </w:rPr>
+        <w:t xml:space="preserve">Annelies Moors, Women, Property and Islam: Palestinian Experiences, 1920–1990</w:t>
+      </w:r>
+      <w:r>
+        <w:rPr>
+          <w:rFonts w:ascii="Times New Roman" w:cs="Times New Roman" w:eastAsia="Times New Roman" w:hAnsi="Times New Roman"/>
+          <w:sz w:val="24"/>
+          <w:szCs w:val="24"/>
+        </w:rPr>
+        <w:t xml:space="preserve"> (1995).</w:t>
       </w:r>
     </w:p>
     <w:p>
@@ -8501,7 +8982,42 @@
           <w:sz w:val="24"/>
           <w:szCs w:val="24"/>
         </w:rPr>
-        <w:t xml:space="preserve">Amos Nadan, “Colonial Misunderstanding of an Efficient Peasant Institution: Land Settlement and Musha‘ Tenure in Mandate Palestine, 1921–47,” 46 Journal of the Economic and Social History of the Orient 320 (2003).</w:t>
+        <w:t xml:space="preserve">Amos Nadan, </w:t>
+      </w:r>
+      <w:r>
+        <w:rPr>
+          <w:rFonts w:ascii="Times New Roman" w:cs="Times New Roman" w:eastAsia="Times New Roman" w:hAnsi="Times New Roman"/>
+          <w:i/>
+          <w:iCs/>
+          <w:sz w:val="24"/>
+          <w:szCs w:val="24"/>
+        </w:rPr>
+        <w:t xml:space="preserve">Colonial Misunderstanding of an Efficient Peasant Institution: Land Settlement and Musha‘ Tenure in Mandate Palestine, 1921–47</w:t>
+      </w:r>
+      <w:r>
+        <w:rPr>
+          <w:rFonts w:ascii="Times New Roman" w:cs="Times New Roman" w:eastAsia="Times New Roman" w:hAnsi="Times New Roman"/>
+          <w:sz w:val="24"/>
+          <w:szCs w:val="24"/>
+        </w:rPr>
+        <w:t xml:space="preserve">, 46 </w:t>
+      </w:r>
+      <w:r>
+        <w:rPr>
+          <w:rFonts w:ascii="Times New Roman" w:cs="Times New Roman" w:eastAsia="Times New Roman" w:hAnsi="Times New Roman"/>
+          <w:smallCaps/>
+          <w:sz w:val="24"/>
+          <w:szCs w:val="24"/>
+        </w:rPr>
+        <w:t xml:space="preserve">Journal of the Economic and Social History of the Orient</w:t>
+      </w:r>
+      <w:r>
+        <w:rPr>
+          <w:rFonts w:ascii="Times New Roman" w:cs="Times New Roman" w:eastAsia="Times New Roman" w:hAnsi="Times New Roman"/>
+          <w:sz w:val="24"/>
+          <w:szCs w:val="24"/>
+        </w:rPr>
+        <w:t xml:space="preserve"> 320 (2003).</w:t>
       </w:r>
     </w:p>
     <w:p>
@@ -8516,7 +9032,42 @@
           <w:sz w:val="24"/>
           <w:szCs w:val="24"/>
         </w:rPr>
-        <w:t xml:space="preserve">Siti Norfatirah Abdul Rahmani &amp; Mohd Zamro Muda, “Ownership Status of Hibah Marad al-Mawt: A Study on the Views of Classical and Contemporary Scholars,” 34(8) al-Qanatir: International Journal of Islamic Studies (2025).</w:t>
+        <w:t xml:space="preserve">Siti Norfatirah Abdul Rahmani &amp; Mohd Zamro Muda, </w:t>
+      </w:r>
+      <w:r>
+        <w:rPr>
+          <w:rFonts w:ascii="Times New Roman" w:cs="Times New Roman" w:eastAsia="Times New Roman" w:hAnsi="Times New Roman"/>
+          <w:i/>
+          <w:iCs/>
+          <w:sz w:val="24"/>
+          <w:szCs w:val="24"/>
+        </w:rPr>
+        <w:t xml:space="preserve">Ownership Status of Hibah Marad al-Mawt: A Study on the Views of Classical and Contemporary Scholars</w:t>
+      </w:r>
+      <w:r>
+        <w:rPr>
+          <w:rFonts w:ascii="Times New Roman" w:cs="Times New Roman" w:eastAsia="Times New Roman" w:hAnsi="Times New Roman"/>
+          <w:sz w:val="24"/>
+          <w:szCs w:val="24"/>
+        </w:rPr>
+        <w:t xml:space="preserve">, 34(8) </w:t>
+      </w:r>
+      <w:r>
+        <w:rPr>
+          <w:rFonts w:ascii="Times New Roman" w:cs="Times New Roman" w:eastAsia="Times New Roman" w:hAnsi="Times New Roman"/>
+          <w:smallCaps/>
+          <w:sz w:val="24"/>
+          <w:szCs w:val="24"/>
+        </w:rPr>
+        <w:t xml:space="preserve">al-Qanatir: International Journal of Islamic Studies</w:t>
+      </w:r>
+      <w:r>
+        <w:rPr>
+          <w:rFonts w:ascii="Times New Roman" w:cs="Times New Roman" w:eastAsia="Times New Roman" w:hAnsi="Times New Roman"/>
+          <w:sz w:val="24"/>
+          <w:szCs w:val="24"/>
+        </w:rPr>
+        <w:t xml:space="preserve"> (2025).</w:t>
       </w:r>
     </w:p>
     <w:p>
@@ -8528,10 +9079,19 @@
       <w:r>
         <w:rPr>
           <w:rFonts w:ascii="Times New Roman" w:cs="Times New Roman" w:eastAsia="Times New Roman" w:hAnsi="Times New Roman"/>
-          <w:sz w:val="24"/>
-          <w:szCs w:val="24"/>
-        </w:rPr>
-        <w:t xml:space="preserve">Joseph Schacht, An Introduction to Islamic Law (1964).</w:t>
+          <w:smallCaps/>
+          <w:sz w:val="24"/>
+          <w:szCs w:val="24"/>
+        </w:rPr>
+        <w:t xml:space="preserve">Joseph Schacht, An Introduction to Islamic Law</w:t>
+      </w:r>
+      <w:r>
+        <w:rPr>
+          <w:rFonts w:ascii="Times New Roman" w:cs="Times New Roman" w:eastAsia="Times New Roman" w:hAnsi="Times New Roman"/>
+          <w:sz w:val="24"/>
+          <w:szCs w:val="24"/>
+        </w:rPr>
+        <w:t xml:space="preserve"> (1964).</w:t>
       </w:r>
     </w:p>
     <w:p>
@@ -8546,7 +9106,42 @@
           <w:sz w:val="24"/>
           <w:szCs w:val="24"/>
         </w:rPr>
-        <w:t xml:space="preserve">Nadav Shoked, “Who Needs Adverse Possession?,” 89 Fordham Law Review 2639 (2021).</w:t>
+        <w:t xml:space="preserve">Nadav Shoked, </w:t>
+      </w:r>
+      <w:r>
+        <w:rPr>
+          <w:rFonts w:ascii="Times New Roman" w:cs="Times New Roman" w:eastAsia="Times New Roman" w:hAnsi="Times New Roman"/>
+          <w:i/>
+          <w:iCs/>
+          <w:sz w:val="24"/>
+          <w:szCs w:val="24"/>
+        </w:rPr>
+        <w:t xml:space="preserve">Who Needs Adverse Possession?</w:t>
+      </w:r>
+      <w:r>
+        <w:rPr>
+          <w:rFonts w:ascii="Times New Roman" w:cs="Times New Roman" w:eastAsia="Times New Roman" w:hAnsi="Times New Roman"/>
+          <w:sz w:val="24"/>
+          <w:szCs w:val="24"/>
+        </w:rPr>
+        <w:t xml:space="preserve">, 89 </w:t>
+      </w:r>
+      <w:r>
+        <w:rPr>
+          <w:rFonts w:ascii="Times New Roman" w:cs="Times New Roman" w:eastAsia="Times New Roman" w:hAnsi="Times New Roman"/>
+          <w:smallCaps/>
+          <w:sz w:val="24"/>
+          <w:szCs w:val="24"/>
+        </w:rPr>
+        <w:t xml:space="preserve">Fordham Law Review</w:t>
+      </w:r>
+      <w:r>
+        <w:rPr>
+          <w:rFonts w:ascii="Times New Roman" w:cs="Times New Roman" w:eastAsia="Times New Roman" w:hAnsi="Times New Roman"/>
+          <w:sz w:val="24"/>
+          <w:szCs w:val="24"/>
+        </w:rPr>
+        <w:t xml:space="preserve"> 2639 (2021).</w:t>
       </w:r>
     </w:p>
     <w:p>
@@ -8561,7 +9156,42 @@
           <w:sz w:val="24"/>
           <w:szCs w:val="24"/>
         </w:rPr>
-        <w:t xml:space="preserve">David Sims, “Securing Land Tenure in Egypt: Who Needs Registered Titles?” Metropolitics (June 14, 2016), metropolitiques.eu.</w:t>
+        <w:t xml:space="preserve">David Sims, </w:t>
+      </w:r>
+      <w:r>
+        <w:rPr>
+          <w:rFonts w:ascii="Times New Roman" w:cs="Times New Roman" w:eastAsia="Times New Roman" w:hAnsi="Times New Roman"/>
+          <w:i/>
+          <w:iCs/>
+          <w:sz w:val="24"/>
+          <w:szCs w:val="24"/>
+        </w:rPr>
+        <w:t xml:space="preserve">Securing Land Tenure in Egypt: Who Needs Registered Titles?</w:t>
+      </w:r>
+      <w:r>
+        <w:rPr>
+          <w:rFonts w:ascii="Times New Roman" w:cs="Times New Roman" w:eastAsia="Times New Roman" w:hAnsi="Times New Roman"/>
+          <w:sz w:val="24"/>
+          <w:szCs w:val="24"/>
+        </w:rPr>
+        <w:t xml:space="preserve">, </w:t>
+      </w:r>
+      <w:r>
+        <w:rPr>
+          <w:rFonts w:ascii="Times New Roman" w:cs="Times New Roman" w:eastAsia="Times New Roman" w:hAnsi="Times New Roman"/>
+          <w:smallCaps/>
+          <w:sz w:val="24"/>
+          <w:szCs w:val="24"/>
+        </w:rPr>
+        <w:t xml:space="preserve">Metropolitics</w:t>
+      </w:r>
+      <w:r>
+        <w:rPr>
+          <w:rFonts w:ascii="Times New Roman" w:cs="Times New Roman" w:eastAsia="Times New Roman" w:hAnsi="Times New Roman"/>
+          <w:sz w:val="24"/>
+          <w:szCs w:val="24"/>
+        </w:rPr>
+        <w:t xml:space="preserve"> (June 14, 2016), metropolitiques.eu.</w:t>
       </w:r>
     </w:p>
     <w:p>
@@ -8576,7 +9206,42 @@
           <w:sz w:val="24"/>
           <w:szCs w:val="24"/>
         </w:rPr>
-        <w:t xml:space="preserve">Brian Sloan, “Proprietary Estoppel in the Supreme Court: Banquo’s Ghost?” (2023) 82 Cambridge Law Journal 13.</w:t>
+        <w:t xml:space="preserve">Brian Sloan, </w:t>
+      </w:r>
+      <w:r>
+        <w:rPr>
+          <w:rFonts w:ascii="Times New Roman" w:cs="Times New Roman" w:eastAsia="Times New Roman" w:hAnsi="Times New Roman"/>
+          <w:i/>
+          <w:iCs/>
+          <w:sz w:val="24"/>
+          <w:szCs w:val="24"/>
+        </w:rPr>
+        <w:t xml:space="preserve">Proprietary Estoppel in the Supreme Court: Banquo’s Ghost?</w:t>
+      </w:r>
+      <w:r>
+        <w:rPr>
+          <w:rFonts w:ascii="Times New Roman" w:cs="Times New Roman" w:eastAsia="Times New Roman" w:hAnsi="Times New Roman"/>
+          <w:sz w:val="24"/>
+          <w:szCs w:val="24"/>
+        </w:rPr>
+        <w:t xml:space="preserve">, (2023) 82 </w:t>
+      </w:r>
+      <w:r>
+        <w:rPr>
+          <w:rFonts w:ascii="Times New Roman" w:cs="Times New Roman" w:eastAsia="Times New Roman" w:hAnsi="Times New Roman"/>
+          <w:smallCaps/>
+          <w:sz w:val="24"/>
+          <w:szCs w:val="24"/>
+        </w:rPr>
+        <w:t xml:space="preserve">Cambridge Law Journal</w:t>
+      </w:r>
+      <w:r>
+        <w:rPr>
+          <w:rFonts w:ascii="Times New Roman" w:cs="Times New Roman" w:eastAsia="Times New Roman" w:hAnsi="Times New Roman"/>
+          <w:sz w:val="24"/>
+          <w:szCs w:val="24"/>
+        </w:rPr>
+        <w:t xml:space="preserve"> 13.</w:t>
       </w:r>
     </w:p>
     <w:p>
@@ -8588,10 +9253,19 @@
       <w:r>
         <w:rPr>
           <w:rFonts w:ascii="Times New Roman" w:cs="Times New Roman" w:eastAsia="Times New Roman" w:hAnsi="Times New Roman"/>
-          <w:sz w:val="24"/>
-          <w:szCs w:val="24"/>
-        </w:rPr>
-        <w:t xml:space="preserve">Kenneth W. Stein, The Land Question in Palestine, 1917–1939 (1984).</w:t>
+          <w:smallCaps/>
+          <w:sz w:val="24"/>
+          <w:szCs w:val="24"/>
+        </w:rPr>
+        <w:t xml:space="preserve">Kenneth W. Stein, The Land Question in Palestine, 1917–1939</w:t>
+      </w:r>
+      <w:r>
+        <w:rPr>
+          <w:rFonts w:ascii="Times New Roman" w:cs="Times New Roman" w:eastAsia="Times New Roman" w:hAnsi="Times New Roman"/>
+          <w:sz w:val="24"/>
+          <w:szCs w:val="24"/>
+        </w:rPr>
+        <w:t xml:space="preserve"> (1984).</w:t>
       </w:r>
     </w:p>
     <w:p>
@@ -8606,7 +9280,42 @@
           <w:sz w:val="24"/>
           <w:szCs w:val="24"/>
         </w:rPr>
-        <w:t xml:space="preserve">Alex Waghorn, “Promises in Equity and at Law: Proprietary Estoppel after Guest v Guest” (2023) 86 Modern Law Review 1504.</w:t>
+        <w:t xml:space="preserve">Alex Waghorn, </w:t>
+      </w:r>
+      <w:r>
+        <w:rPr>
+          <w:rFonts w:ascii="Times New Roman" w:cs="Times New Roman" w:eastAsia="Times New Roman" w:hAnsi="Times New Roman"/>
+          <w:i/>
+          <w:iCs/>
+          <w:sz w:val="24"/>
+          <w:szCs w:val="24"/>
+        </w:rPr>
+        <w:t xml:space="preserve">Promises in Equity and at Law: Proprietary Estoppel after Guest v Guest</w:t>
+      </w:r>
+      <w:r>
+        <w:rPr>
+          <w:rFonts w:ascii="Times New Roman" w:cs="Times New Roman" w:eastAsia="Times New Roman" w:hAnsi="Times New Roman"/>
+          <w:sz w:val="24"/>
+          <w:szCs w:val="24"/>
+        </w:rPr>
+        <w:t xml:space="preserve">, (2023) 86 </w:t>
+      </w:r>
+      <w:r>
+        <w:rPr>
+          <w:rFonts w:ascii="Times New Roman" w:cs="Times New Roman" w:eastAsia="Times New Roman" w:hAnsi="Times New Roman"/>
+          <w:smallCaps/>
+          <w:sz w:val="24"/>
+          <w:szCs w:val="24"/>
+        </w:rPr>
+        <w:t xml:space="preserve">Modern Law Review</w:t>
+      </w:r>
+      <w:r>
+        <w:rPr>
+          <w:rFonts w:ascii="Times New Roman" w:cs="Times New Roman" w:eastAsia="Times New Roman" w:hAnsi="Times New Roman"/>
+          <w:sz w:val="24"/>
+          <w:szCs w:val="24"/>
+        </w:rPr>
+        <w:t xml:space="preserve"> 1504.</w:t>
       </w:r>
     </w:p>
     <w:p>
@@ -8618,10 +9327,19 @@
       <w:r>
         <w:rPr>
           <w:rFonts w:ascii="Times New Roman" w:cs="Times New Roman" w:eastAsia="Times New Roman" w:hAnsi="Times New Roman"/>
-          <w:sz w:val="24"/>
-          <w:szCs w:val="24"/>
-        </w:rPr>
-        <w:t xml:space="preserve">Konrad Zweigert &amp; Hein Kötz, An Introduction to Comparative Law (Tony Weir trans., 3d ed. 1998).</w:t>
+          <w:smallCaps/>
+          <w:sz w:val="24"/>
+          <w:szCs w:val="24"/>
+        </w:rPr>
+        <w:t xml:space="preserve">Konrad Zweigert &amp; Hein Kötz, An Introduction to Comparative Law</w:t>
+      </w:r>
+      <w:r>
+        <w:rPr>
+          <w:rFonts w:ascii="Times New Roman" w:cs="Times New Roman" w:eastAsia="Times New Roman" w:hAnsi="Times New Roman"/>
+          <w:sz w:val="24"/>
+          <w:szCs w:val="24"/>
+        </w:rPr>
+        <w:t xml:space="preserve"> (Tony Weir trans., 3d ed. 1998).</w:t>
       </w:r>
     </w:p>
     <w:p>
@@ -8651,7 +9369,25 @@
           <w:sz w:val="24"/>
           <w:szCs w:val="24"/>
         </w:rPr>
-        <w:t xml:space="preserve">Law Commission, Updating the Land Registration Act 2002 (Law Com. No. 380, 2018).</w:t>
+        <w:t xml:space="preserve">Law Commission, </w:t>
+      </w:r>
+      <w:r>
+        <w:rPr>
+          <w:rFonts w:ascii="Times New Roman" w:cs="Times New Roman" w:eastAsia="Times New Roman" w:hAnsi="Times New Roman"/>
+          <w:i/>
+          <w:iCs/>
+          <w:sz w:val="24"/>
+          <w:szCs w:val="24"/>
+        </w:rPr>
+        <w:t xml:space="preserve">Updating the Land Registration Act 2002</w:t>
+      </w:r>
+      <w:r>
+        <w:rPr>
+          <w:rFonts w:ascii="Times New Roman" w:cs="Times New Roman" w:eastAsia="Times New Roman" w:hAnsi="Times New Roman"/>
+          <w:sz w:val="24"/>
+          <w:szCs w:val="24"/>
+        </w:rPr>
+        <w:t xml:space="preserve"> (Law Com. No. 380, 2018).</w:t>
       </w:r>
     </w:p>
     <w:p>
@@ -8663,10 +9399,37 @@
       <w:r>
         <w:rPr>
           <w:rFonts w:ascii="Times New Roman" w:cs="Times New Roman" w:eastAsia="Times New Roman" w:hAnsi="Times New Roman"/>
-          <w:sz w:val="24"/>
-          <w:szCs w:val="24"/>
-        </w:rPr>
-        <w:t xml:space="preserve">“More than 90% of Egypt’s Properties Are Unregistered: Justice Minister,” Daily News Egypt (Feb. 14, 2022), dailynewsegypt.com.</w:t>
+          <w:i/>
+          <w:iCs/>
+          <w:sz w:val="24"/>
+          <w:szCs w:val="24"/>
+        </w:rPr>
+        <w:t xml:space="preserve">More than 90% of Egypt’s Properties Are Unregistered: Justice Minister</w:t>
+      </w:r>
+      <w:r>
+        <w:rPr>
+          <w:rFonts w:ascii="Times New Roman" w:cs="Times New Roman" w:eastAsia="Times New Roman" w:hAnsi="Times New Roman"/>
+          <w:sz w:val="24"/>
+          <w:szCs w:val="24"/>
+        </w:rPr>
+        <w:t xml:space="preserve">, </w:t>
+      </w:r>
+      <w:r>
+        <w:rPr>
+          <w:rFonts w:ascii="Times New Roman" w:cs="Times New Roman" w:eastAsia="Times New Roman" w:hAnsi="Times New Roman"/>
+          <w:smallCaps/>
+          <w:sz w:val="24"/>
+          <w:szCs w:val="24"/>
+        </w:rPr>
+        <w:t xml:space="preserve">Daily News Egypt</w:t>
+      </w:r>
+      <w:r>
+        <w:rPr>
+          <w:rFonts w:ascii="Times New Roman" w:cs="Times New Roman" w:eastAsia="Times New Roman" w:hAnsi="Times New Roman"/>
+          <w:sz w:val="24"/>
+          <w:szCs w:val="24"/>
+        </w:rPr>
+        <w:t xml:space="preserve"> (Feb. 14, 2022), dailynewsegypt.com.</w:t>
       </w:r>
     </w:p>
     <w:p>
@@ -8678,10 +9441,37 @@
       <w:r>
         <w:rPr>
           <w:rFonts w:ascii="Times New Roman" w:cs="Times New Roman" w:eastAsia="Times New Roman" w:hAnsi="Times New Roman"/>
-          <w:sz w:val="24"/>
-          <w:szCs w:val="24"/>
-        </w:rPr>
-        <w:t xml:space="preserve">“Real Estate Registration Law Amendments – Development Brief,” The Built Environment Observatory (May 2021), marsadomran.info.</w:t>
+          <w:i/>
+          <w:iCs/>
+          <w:sz w:val="24"/>
+          <w:szCs w:val="24"/>
+        </w:rPr>
+        <w:t xml:space="preserve">Real Estate Registration Law Amendments – Development Brief</w:t>
+      </w:r>
+      <w:r>
+        <w:rPr>
+          <w:rFonts w:ascii="Times New Roman" w:cs="Times New Roman" w:eastAsia="Times New Roman" w:hAnsi="Times New Roman"/>
+          <w:sz w:val="24"/>
+          <w:szCs w:val="24"/>
+        </w:rPr>
+        <w:t xml:space="preserve">, </w:t>
+      </w:r>
+      <w:r>
+        <w:rPr>
+          <w:rFonts w:ascii="Times New Roman" w:cs="Times New Roman" w:eastAsia="Times New Roman" w:hAnsi="Times New Roman"/>
+          <w:smallCaps/>
+          <w:sz w:val="24"/>
+          <w:szCs w:val="24"/>
+        </w:rPr>
+        <w:t xml:space="preserve">The Built Environment Observatory</w:t>
+      </w:r>
+      <w:r>
+        <w:rPr>
+          <w:rFonts w:ascii="Times New Roman" w:cs="Times New Roman" w:eastAsia="Times New Roman" w:hAnsi="Times New Roman"/>
+          <w:sz w:val="24"/>
+          <w:szCs w:val="24"/>
+        </w:rPr>
+        <w:t xml:space="preserve"> (May 2021), marsadomran.info.</w:t>
       </w:r>
     </w:p>
     <w:p>
@@ -8696,7 +9486,25 @@
           <w:sz w:val="24"/>
           <w:szCs w:val="24"/>
         </w:rPr>
-        <w:t xml:space="preserve">Shalakany Law Office, “New Amendments to Real Estate Registration Law: Accelerated and Streamlined Registration Procedures” (2022), shalakany.com.</w:t>
+        <w:t xml:space="preserve">Shalakany Law Office, </w:t>
+      </w:r>
+      <w:r>
+        <w:rPr>
+          <w:rFonts w:ascii="Times New Roman" w:cs="Times New Roman" w:eastAsia="Times New Roman" w:hAnsi="Times New Roman"/>
+          <w:i/>
+          <w:iCs/>
+          <w:sz w:val="24"/>
+          <w:szCs w:val="24"/>
+        </w:rPr>
+        <w:t xml:space="preserve">New Amendments to Real Estate Registration Law: Accelerated and Streamlined Registration Procedures</w:t>
+      </w:r>
+      <w:r>
+        <w:rPr>
+          <w:rFonts w:ascii="Times New Roman" w:cs="Times New Roman" w:eastAsia="Times New Roman" w:hAnsi="Times New Roman"/>
+          <w:sz w:val="24"/>
+          <w:szCs w:val="24"/>
+        </w:rPr>
+        <w:t xml:space="preserve"> (2022), shalakany.com.</w:t>
       </w:r>
     </w:p>
     <w:sectPr>
@@ -8825,7 +9633,7 @@
           <w:szCs w:val="20"/>
           <w:rtl/>
         </w:rPr>
-        <w:t xml:space="preserve">ס׳ 7(א) לחוק המקרקעין, התשכ"ט-1969 (להלן: חוק המקרקעין).</w:t>
+        <w:t xml:space="preserve">ס׳ 7(א) לחוק המקרקעין, התשכ"ט–1969 (להלן: חוק המקרקעין).</w:t>
       </w:r>
     </w:p>
   </w:footnote>
@@ -8896,6 +9704,7 @@
       <w:r>
         <w:rPr>
           <w:rFonts w:ascii="Times New Roman" w:cs="Times New Roman" w:eastAsia="Times New Roman" w:hAnsi="Times New Roman"/>
+          <w:smallCaps/>
           <w:sz w:val="20"/>
           <w:szCs w:val="20"/>
         </w:rPr>
@@ -9086,7 +9895,27 @@
           <w:szCs w:val="20"/>
           <w:rtl/>
         </w:rPr>
-        <w:t xml:space="preserve">ס׳ 126–127 לחוק המקרקעין. לניתוח מוסדי ראו אוריאל רייכמן "הערת האזהרה – מהות, יצירה והגנה כנגד עסקות נוגדות" עיוני משפט י 297 (1984). ודוק: הערת אזהרה ניתנת לרישום רק במקרקעין הרשומים במרשם, כך שבמקרקעין בלתי רשומים אין אפילו כלי ביניים זה זמין: יהושע ויסמן </w:t>
+        <w:t xml:space="preserve">ס׳ 126–127 לחוק המקרקעין. לניתוח מוסדי ראו אוריאל רייכמן "הערת האזהרה – מהות, יצירה והגנה כנגד עסקות נוגדות" </w:t>
+      </w:r>
+      <w:r>
+        <w:rPr>
+          <w:rFonts w:ascii="David" w:cs="David" w:eastAsia="David" w:hAnsi="David"/>
+          <w:i/>
+          <w:iCs/>
+          <w:sz w:val="20"/>
+          <w:szCs w:val="20"/>
+          <w:rtl/>
+        </w:rPr>
+        <w:t xml:space="preserve">עיוני משפט</w:t>
+      </w:r>
+      <w:r>
+        <w:rPr>
+          <w:rFonts w:ascii="David" w:cs="David" w:eastAsia="David" w:hAnsi="David"/>
+          <w:sz w:val="20"/>
+          <w:szCs w:val="20"/>
+          <w:rtl/>
+        </w:rPr>
+        <w:t xml:space="preserve"> י 297 (1984). ודוק: הערת אזהרה ניתנת לרישום רק במקרקעין הרשומים במרשם, כך שבמקרקעין בלתי רשומים אין אפילו כלי ביניים זה זמין: יהושע ויסמן </w:t>
       </w:r>
       <w:r>
         <w:rPr>
@@ -9129,7 +9958,7 @@
           <w:szCs w:val="20"/>
           <w:rtl/>
         </w:rPr>
-        <w:t xml:space="preserve">פקודת הסדר זכויות במקרקעין [נוסח חדש], התשכ"ט-1969. לרקע ההיסטורי ראו חיים זנדברג </w:t>
+        <w:t xml:space="preserve">פקודת הסדר זכויות במקרקעין [נוסח חדש], התשכ"ט–1969. לרקע ההיסטורי ראו חיים זנדברג </w:t>
       </w:r>
       <w:r>
         <w:rPr>
@@ -9172,7 +10001,7 @@
           <w:szCs w:val="20"/>
           <w:rtl/>
         </w:rPr>
-        <w:t xml:space="preserve">ס׳ 81 לפקודת הסדר זכויות במקרקעין [נוסח חדש], התשכ"ט-1969.</w:t>
+        <w:t xml:space="preserve">ס׳ 81 לפקודת הסדר זכויות במקרקעין [נוסח חדש], התשכ"ט–1969.</w:t>
       </w:r>
     </w:p>
   </w:footnote>
@@ -9259,6 +10088,7 @@
       <w:r>
         <w:rPr>
           <w:rFonts w:ascii="Times New Roman" w:cs="Times New Roman" w:eastAsia="Times New Roman" w:hAnsi="Times New Roman"/>
+          <w:smallCaps/>
           <w:sz w:val="20"/>
           <w:szCs w:val="20"/>
         </w:rPr>
@@ -9299,10 +10129,54 @@
       <w:r>
         <w:rPr>
           <w:rFonts w:ascii="Times New Roman" w:cs="Times New Roman" w:eastAsia="Times New Roman" w:hAnsi="Times New Roman"/>
-          <w:sz w:val="20"/>
-          <w:szCs w:val="20"/>
-        </w:rPr>
-        <w:t xml:space="preserve">Kenneth W. Stein, The Land Question in Palestine, 1917–1939 (1984); Amos Nadan, "Colonial Misunderstanding of an Efficient Peasant Institution: Land Settlement and Musha‘ Tenure in Mandate Palestine, 1921–47," 46 J. Econ. &amp; Soc. Hist. Orient 320 (2003)</w:t>
+          <w:smallCaps/>
+          <w:sz w:val="20"/>
+          <w:szCs w:val="20"/>
+        </w:rPr>
+        <w:t xml:space="preserve">Kenneth W. Stein, The Land Question in Palestine, 1917–1939 (1984)</w:t>
+      </w:r>
+      <w:r>
+        <w:rPr>
+          <w:rFonts w:ascii="Times New Roman" w:cs="Times New Roman" w:eastAsia="Times New Roman" w:hAnsi="Times New Roman"/>
+          <w:sz w:val="20"/>
+          <w:szCs w:val="20"/>
+        </w:rPr>
+        <w:t xml:space="preserve">; Amos Nadan, </w:t>
+      </w:r>
+      <w:r>
+        <w:rPr>
+          <w:rFonts w:ascii="Times New Roman" w:cs="Times New Roman" w:eastAsia="Times New Roman" w:hAnsi="Times New Roman"/>
+          <w:i/>
+          <w:iCs/>
+          <w:sz w:val="20"/>
+          <w:szCs w:val="20"/>
+        </w:rPr>
+        <w:t xml:space="preserve">Colonial Misunderstanding of an Efficient Peasant Institution: Land Settlement and Musha‘ Tenure in Mandate Palestine, 1921–47</w:t>
+      </w:r>
+      <w:r>
+        <w:rPr>
+          <w:rFonts w:ascii="Times New Roman" w:cs="Times New Roman" w:eastAsia="Times New Roman" w:hAnsi="Times New Roman"/>
+          <w:sz w:val="20"/>
+          <w:szCs w:val="20"/>
+        </w:rPr>
+        <w:t xml:space="preserve">, 46 </w:t>
+      </w:r>
+      <w:r>
+        <w:rPr>
+          <w:rFonts w:ascii="Times New Roman" w:cs="Times New Roman" w:eastAsia="Times New Roman" w:hAnsi="Times New Roman"/>
+          <w:smallCaps/>
+          <w:sz w:val="20"/>
+          <w:szCs w:val="20"/>
+        </w:rPr>
+        <w:t xml:space="preserve">J. Econ. &amp; Soc. Hist. Orient</w:t>
+      </w:r>
+      <w:r>
+        <w:rPr>
+          <w:rFonts w:ascii="Times New Roman" w:cs="Times New Roman" w:eastAsia="Times New Roman" w:hAnsi="Times New Roman"/>
+          <w:sz w:val="20"/>
+          <w:szCs w:val="20"/>
+        </w:rPr>
+        <w:t xml:space="preserve"> 320 (2003)</w:t>
       </w:r>
       <w:r>
         <w:rPr>
@@ -9352,7 +10226,47 @@
           <w:szCs w:val="20"/>
           <w:rtl/>
         </w:rPr>
-        <w:t xml:space="preserve">על הליכי ההסדר שלא הושלמו ועל תוצאותיהם בחברה הערבית ראו אורן יפתחאל, סנדי קדר ואחמד אמארה "עיון מחדש בהלכת 'הנגב המת': זכויות קניין במרחב הבדווי" משפט וממשל יד 7 (2012); רונית לוין-שנור "הפרטה, הפרדה והפליה – זניחת ההליכים של הסדר הזכויות במקרקעין במזרח ירושלים" עיוני משפט לד 183 (2011).</w:t>
+        <w:t xml:space="preserve">על הליכי ההסדר שלא הושלמו ועל תוצאותיהם בחברה הערבית ראו אורן יפתחאל, סנדי קדר ואחמד אמארה "עיון מחדש בהלכת 'הנגב המת': זכויות קניין במרחב הבדווי" </w:t>
+      </w:r>
+      <w:r>
+        <w:rPr>
+          <w:rFonts w:ascii="David" w:cs="David" w:eastAsia="David" w:hAnsi="David"/>
+          <w:i/>
+          <w:iCs/>
+          <w:sz w:val="20"/>
+          <w:szCs w:val="20"/>
+          <w:rtl/>
+        </w:rPr>
+        <w:t xml:space="preserve">משפט וממשל</w:t>
+      </w:r>
+      <w:r>
+        <w:rPr>
+          <w:rFonts w:ascii="David" w:cs="David" w:eastAsia="David" w:hAnsi="David"/>
+          <w:sz w:val="20"/>
+          <w:szCs w:val="20"/>
+          <w:rtl/>
+        </w:rPr>
+        <w:t xml:space="preserve"> יד 7 (2012); רונית לוין-שנור "הפרטה, הפרדה והפליה – זניחת ההליכים של הסדר הזכויות במקרקעין במזרח ירושלים" </w:t>
+      </w:r>
+      <w:r>
+        <w:rPr>
+          <w:rFonts w:ascii="David" w:cs="David" w:eastAsia="David" w:hAnsi="David"/>
+          <w:i/>
+          <w:iCs/>
+          <w:sz w:val="20"/>
+          <w:szCs w:val="20"/>
+          <w:rtl/>
+        </w:rPr>
+        <w:t xml:space="preserve">עיוני משפט</w:t>
+      </w:r>
+      <w:r>
+        <w:rPr>
+          <w:rFonts w:ascii="David" w:cs="David" w:eastAsia="David" w:hAnsi="David"/>
+          <w:sz w:val="20"/>
+          <w:szCs w:val="20"/>
+          <w:rtl/>
+        </w:rPr>
+        <w:t xml:space="preserve"> לד 183 (2011).</w:t>
       </w:r>
     </w:p>
   </w:footnote>
@@ -9418,7 +10332,47 @@
           <w:szCs w:val="20"/>
           <w:rtl/>
         </w:rPr>
-        <w:t xml:space="preserve">לפרקטיקה של ייפויי כוח בלתי חוזרים כתחליף מעשי לרישום ראו יהושע ויסמן "יפוי-כוח בלתי-חוזר כתחליף לבעלות" משפטים יד 572 (תשמ"ה); ולביקורת על השימוש בהרשאה בלתי הדירה לביצוע מתנה ראו גד טדסקי "הרשאה בלתי-הדירה לביצוע מתנה לאדם שלישי" משפטים יט 205 (תשמ"ט).</w:t>
+        <w:t xml:space="preserve">לפרקטיקה של ייפויי כוח בלתי חוזרים כתחליף מעשי לרישום ראו יהושע ויסמן "יפוי-כוח בלתי-חוזר כתחליף לבעלות" </w:t>
+      </w:r>
+      <w:r>
+        <w:rPr>
+          <w:rFonts w:ascii="David" w:cs="David" w:eastAsia="David" w:hAnsi="David"/>
+          <w:i/>
+          <w:iCs/>
+          <w:sz w:val="20"/>
+          <w:szCs w:val="20"/>
+          <w:rtl/>
+        </w:rPr>
+        <w:t xml:space="preserve">משפטים</w:t>
+      </w:r>
+      <w:r>
+        <w:rPr>
+          <w:rFonts w:ascii="David" w:cs="David" w:eastAsia="David" w:hAnsi="David"/>
+          <w:sz w:val="20"/>
+          <w:szCs w:val="20"/>
+          <w:rtl/>
+        </w:rPr>
+        <w:t xml:space="preserve"> יד 572 (תשמ"ה); ולביקורת על השימוש בהרשאה בלתי הדירה לביצוע מתנה ראו גד טדסקי "הרשאה בלתי-הדירה לביצוע מתנה לאדם שלישי" </w:t>
+      </w:r>
+      <w:r>
+        <w:rPr>
+          <w:rFonts w:ascii="David" w:cs="David" w:eastAsia="David" w:hAnsi="David"/>
+          <w:i/>
+          <w:iCs/>
+          <w:sz w:val="20"/>
+          <w:szCs w:val="20"/>
+          <w:rtl/>
+        </w:rPr>
+        <w:t xml:space="preserve">משפטים</w:t>
+      </w:r>
+      <w:r>
+        <w:rPr>
+          <w:rFonts w:ascii="David" w:cs="David" w:eastAsia="David" w:hAnsi="David"/>
+          <w:sz w:val="20"/>
+          <w:szCs w:val="20"/>
+          <w:rtl/>
+        </w:rPr>
+        <w:t xml:space="preserve"> יט 205 (תשמ"ט).</w:t>
       </w:r>
     </w:p>
   </w:footnote>
@@ -9544,7 +10498,42 @@
           <w:sz w:val="20"/>
           <w:szCs w:val="20"/>
         </w:rPr>
-        <w:t xml:space="preserve">Nasr Kheir &amp; Boris A. Portnov, "Land Market Segmentation Along Ethnic Lines: Four Urban Localities in Israel as a Case Study," 136 Land Use Policy art. 106916 (2024)</w:t>
+        <w:t xml:space="preserve">Nasr Kheir &amp; Boris A. Portnov, </w:t>
+      </w:r>
+      <w:r>
+        <w:rPr>
+          <w:rFonts w:ascii="Times New Roman" w:cs="Times New Roman" w:eastAsia="Times New Roman" w:hAnsi="Times New Roman"/>
+          <w:i/>
+          <w:iCs/>
+          <w:sz w:val="20"/>
+          <w:szCs w:val="20"/>
+        </w:rPr>
+        <w:t xml:space="preserve">Land Market Segmentation Along Ethnic Lines: Four Urban Localities in Israel as a Case Study</w:t>
+      </w:r>
+      <w:r>
+        <w:rPr>
+          <w:rFonts w:ascii="Times New Roman" w:cs="Times New Roman" w:eastAsia="Times New Roman" w:hAnsi="Times New Roman"/>
+          <w:sz w:val="20"/>
+          <w:szCs w:val="20"/>
+        </w:rPr>
+        <w:t xml:space="preserve">, 136 </w:t>
+      </w:r>
+      <w:r>
+        <w:rPr>
+          <w:rFonts w:ascii="Times New Roman" w:cs="Times New Roman" w:eastAsia="Times New Roman" w:hAnsi="Times New Roman"/>
+          <w:smallCaps/>
+          <w:sz w:val="20"/>
+          <w:szCs w:val="20"/>
+        </w:rPr>
+        <w:t xml:space="preserve">Land Use Policy</w:t>
+      </w:r>
+      <w:r>
+        <w:rPr>
+          <w:rFonts w:ascii="Times New Roman" w:cs="Times New Roman" w:eastAsia="Times New Roman" w:hAnsi="Times New Roman"/>
+          <w:sz w:val="20"/>
+          <w:szCs w:val="20"/>
+        </w:rPr>
+        <w:t xml:space="preserve"> art. 106916 (2024)</w:t>
       </w:r>
       <w:r>
         <w:rPr>
@@ -9576,7 +10565,7 @@
           <w:szCs w:val="20"/>
           <w:rtl/>
         </w:rPr>
-        <w:t xml:space="preserve">לכלל הראייתי המיוחד החל בשלב זה – איסור פסיקה על סמך עדות יחידה של בעל דין נגד עיזבון בלא סיוע – ראו ס׳ 54(4) לפקודת הראיות [נוסח חדש], התשל"א-1971.</w:t>
+        <w:t xml:space="preserve">לכלל הראייתי המיוחד החל בשלב זה – איסור פסיקה על סמך עדות יחידה של בעל דין נגד עיזבון בלא סיוע – ראו ס׳ 54(4) לפקודת הראיות [נוסח חדש], התשל"א–1971.</w:t>
       </w:r>
     </w:p>
   </w:footnote>
@@ -9682,7 +10671,27 @@
           <w:szCs w:val="20"/>
           <w:rtl/>
         </w:rPr>
-        <w:t xml:space="preserve">לדיון עדכני במעמדה של הזכות האובליגטורית במקרקעין ובעסקאות בה ראו חיים זנדברג "עסקה בזכות אובליגטורית או בזכות במקרקעין? תכלית, לשון ואקטיביזם שיפוטי" משפטים על אתר יג 79 (תש"ף).</w:t>
+        <w:t xml:space="preserve">לדיון עדכני במעמדה של הזכות האובליגטורית במקרקעין ובעסקאות בה ראו חיים זנדברג "עסקה בזכות אובליגטורית או בזכות במקרקעין? תכלית, לשון ואקטיביזם שיפוטי" </w:t>
+      </w:r>
+      <w:r>
+        <w:rPr>
+          <w:rFonts w:ascii="David" w:cs="David" w:eastAsia="David" w:hAnsi="David"/>
+          <w:i/>
+          <w:iCs/>
+          <w:sz w:val="20"/>
+          <w:szCs w:val="20"/>
+          <w:rtl/>
+        </w:rPr>
+        <w:t xml:space="preserve">משפטים על אתר</w:t>
+      </w:r>
+      <w:r>
+        <w:rPr>
+          <w:rFonts w:ascii="David" w:cs="David" w:eastAsia="David" w:hAnsi="David"/>
+          <w:sz w:val="20"/>
+          <w:szCs w:val="20"/>
+          <w:rtl/>
+        </w:rPr>
+        <w:t xml:space="preserve"> יג 79 (תש"ף).</w:t>
       </w:r>
     </w:p>
   </w:footnote>
@@ -9811,7 +10820,7 @@
           <w:szCs w:val="20"/>
           <w:rtl/>
         </w:rPr>
-        <w:t xml:space="preserve"> 687–691 (מהדורה שביעית, 2018); עניין </w:t>
+        <w:t xml:space="preserve"> 687–691 (מהדורה שביעית 2018); עניין </w:t>
       </w:r>
       <w:r>
         <w:rPr>
@@ -10082,7 +11091,7 @@
           <w:szCs w:val="20"/>
           <w:rtl/>
         </w:rPr>
-        <w:t xml:space="preserve">ס׳ 14(ב) לחוק השליחות, התשכ"ה-1965. לדיון היסודי בשאלה אם ייפוי כוח בלתי חוזר מעמיד את הקונה במעמד שווה ערך לבעלים ראו ויסמן, </w:t>
+        <w:t xml:space="preserve">ס׳ 14(ב) לחוק השליחות, התשכ"ה–1965. לדיון היסודי בשאלה אם ייפוי כוח בלתי חוזר מעמיד את הקונה במעמד שווה ערך לבעלים ראו ויסמן, </w:t>
       </w:r>
       <w:r>
         <w:rPr>
@@ -10120,7 +11129,7 @@
           <w:szCs w:val="20"/>
           <w:rtl/>
         </w:rPr>
-        <w:t xml:space="preserve"> כרך ב 1241–1245 (מהדורה שנייה, 1996).</w:t>
+        <w:t xml:space="preserve"> כרך ב 1241–1245 (מהדורה שנייה 1996).</w:t>
       </w:r>
     </w:p>
   </w:footnote>
@@ -10407,7 +11416,27 @@
           <w:szCs w:val="20"/>
           <w:rtl/>
         </w:rPr>
-        <w:t xml:space="preserve">, פ"ד נ(1) 185 (1996). לדרישת הכתב וגלגוליה ראו נילי כהן "צורת החוזה" הפרקליט לח 383 (תשמ"ט).</w:t>
+        <w:t xml:space="preserve">, פ"ד נ(1) 185 (1996). לדרישת הכתב וגלגוליה ראו נילי כהן "צורת החוזה" </w:t>
+      </w:r>
+      <w:r>
+        <w:rPr>
+          <w:rFonts w:ascii="David" w:cs="David" w:eastAsia="David" w:hAnsi="David"/>
+          <w:i/>
+          <w:iCs/>
+          <w:sz w:val="20"/>
+          <w:szCs w:val="20"/>
+          <w:rtl/>
+        </w:rPr>
+        <w:t xml:space="preserve">הפרקליט</w:t>
+      </w:r>
+      <w:r>
+        <w:rPr>
+          <w:rFonts w:ascii="David" w:cs="David" w:eastAsia="David" w:hAnsi="David"/>
+          <w:sz w:val="20"/>
+          <w:szCs w:val="20"/>
+          <w:rtl/>
+        </w:rPr>
+        <w:t xml:space="preserve"> לח 383 (תשמ"ט).</w:t>
       </w:r>
     </w:p>
   </w:footnote>
@@ -10508,7 +11537,7 @@
           <w:szCs w:val="20"/>
           <w:rtl/>
         </w:rPr>
-        <w:t xml:space="preserve"> כרך א 493–525 (מהדורה שנייה, 2018) (להלן: פרידמן וכהן).</w:t>
+        <w:t xml:space="preserve"> כרך א 493–525 (מהדורה שנייה 2018) (להלן: פרידמן וכהן).</w:t>
       </w:r>
     </w:p>
   </w:footnote>
@@ -10777,27 +11806,27 @@
           <w:szCs w:val="20"/>
           <w:rtl/>
         </w:rPr>
-        <w:t xml:space="preserve">ס׳ 5(א) לחוק המתנה, התשכ"ח-1968. במקרקעין כפופה ההתחייבות גם לס׳ 8 לחוק המקרקעין. ראו מרדכי אלפרדו ראבילו </w:t>
-      </w:r>
-      <w:r>
-        <w:rPr>
-          <w:rFonts w:ascii="David" w:cs="David" w:eastAsia="David" w:hAnsi="David"/>
-          <w:i/>
-          <w:iCs/>
-          <w:sz w:val="20"/>
-          <w:szCs w:val="20"/>
-          <w:rtl/>
-        </w:rPr>
-        <w:t xml:space="preserve">חוק המתנה, תשכ"ח-1968</w:t>
-      </w:r>
-      <w:r>
-        <w:rPr>
-          <w:rFonts w:ascii="David" w:cs="David" w:eastAsia="David" w:hAnsi="David"/>
-          <w:sz w:val="20"/>
-          <w:szCs w:val="20"/>
-          <w:rtl/>
-        </w:rPr>
-        <w:t xml:space="preserve"> 331–346 (פירוש לחוקי החוזים מיסודו של ג׳ טדסקי, מהדורה שנייה, תשנ"ז).</w:t>
+        <w:t xml:space="preserve">ס׳ 5(א) לחוק המתנה, התשכ"ח–1968. במקרקעין כפופה ההתחייבות גם לס׳ 8 לחוק המקרקעין. ראו מרדכי אלפרדו ראבילו </w:t>
+      </w:r>
+      <w:r>
+        <w:rPr>
+          <w:rFonts w:ascii="David" w:cs="David" w:eastAsia="David" w:hAnsi="David"/>
+          <w:i/>
+          <w:iCs/>
+          <w:sz w:val="20"/>
+          <w:szCs w:val="20"/>
+          <w:rtl/>
+        </w:rPr>
+        <w:t xml:space="preserve">חוק המתנה, תשכ"ח–1968</w:t>
+      </w:r>
+      <w:r>
+        <w:rPr>
+          <w:rFonts w:ascii="David" w:cs="David" w:eastAsia="David" w:hAnsi="David"/>
+          <w:sz w:val="20"/>
+          <w:szCs w:val="20"/>
+          <w:rtl/>
+        </w:rPr>
+        <w:t xml:space="preserve"> 331–346 (פירוש לחוקי החוזים מיסודו של ג׳ טדסקי, מהדורה שנייה 1996).</w:t>
       </w:r>
     </w:p>
   </w:footnote>
@@ -10940,7 +11969,27 @@
           <w:szCs w:val="20"/>
           <w:rtl/>
         </w:rPr>
-        <w:t xml:space="preserve">, בעמ׳ 345–346; והשוו גד טדסקי "הרשאה בלתי-הדירה לביצוע מתנה לאדם שלישי" משפטים יט 205 (תשמ"ט).</w:t>
+        <w:t xml:space="preserve">, בעמ׳ 345–346; והשוו גד טדסקי "הרשאה בלתי-הדירה לביצוע מתנה לאדם שלישי" </w:t>
+      </w:r>
+      <w:r>
+        <w:rPr>
+          <w:rFonts w:ascii="David" w:cs="David" w:eastAsia="David" w:hAnsi="David"/>
+          <w:i/>
+          <w:iCs/>
+          <w:sz w:val="20"/>
+          <w:szCs w:val="20"/>
+          <w:rtl/>
+        </w:rPr>
+        <w:t xml:space="preserve">משפטים</w:t>
+      </w:r>
+      <w:r>
+        <w:rPr>
+          <w:rFonts w:ascii="David" w:cs="David" w:eastAsia="David" w:hAnsi="David"/>
+          <w:sz w:val="20"/>
+          <w:szCs w:val="20"/>
+          <w:rtl/>
+        </w:rPr>
+        <w:t xml:space="preserve"> יט 205 (תשמ"ט).</w:t>
       </w:r>
     </w:p>
   </w:footnote>
@@ -11110,7 +12159,27 @@
           <w:szCs w:val="20"/>
           <w:rtl/>
         </w:rPr>
-        <w:t xml:space="preserve">נינה זלצמן "רישיון במקרקעין" הפרקליט מב 24 (תשנ"ה).</w:t>
+        <w:t xml:space="preserve">נינה זלצמן "רישיון במקרקעין" </w:t>
+      </w:r>
+      <w:r>
+        <w:rPr>
+          <w:rFonts w:ascii="David" w:cs="David" w:eastAsia="David" w:hAnsi="David"/>
+          <w:i/>
+          <w:iCs/>
+          <w:sz w:val="20"/>
+          <w:szCs w:val="20"/>
+          <w:rtl/>
+        </w:rPr>
+        <w:t xml:space="preserve">הפרקליט</w:t>
+      </w:r>
+      <w:r>
+        <w:rPr>
+          <w:rFonts w:ascii="David" w:cs="David" w:eastAsia="David" w:hAnsi="David"/>
+          <w:sz w:val="20"/>
+          <w:szCs w:val="20"/>
+          <w:rtl/>
+        </w:rPr>
+        <w:t xml:space="preserve"> מב 24 (תשנ"ה).</w:t>
       </w:r>
     </w:p>
   </w:footnote>
@@ -11173,7 +12242,7 @@
           <w:szCs w:val="20"/>
           <w:rtl/>
         </w:rPr>
-        <w:t xml:space="preserve"> 405–408 (מהדורה שנייה, 2024) (להלן: שקד).</w:t>
+        <w:t xml:space="preserve"> 405–408 (מהדורה שנייה 2024) (להלן: שקד).</w:t>
       </w:r>
     </w:p>
   </w:footnote>
@@ -11604,7 +12673,7 @@
           <w:szCs w:val="20"/>
           <w:rtl/>
         </w:rPr>
-        <w:t xml:space="preserve">ס׳ 5(2) ו-20 לחוק ההתיישנות, התשי"ח-1958; ס׳ 159(ב) לחוק המקרקעין; וס׳ 78 לחוק הקרקעות העות׳מאני לעניין טענות חזקה היסטוריות. לניתוח מקיף ראו טל חבקין </w:t>
+        <w:t xml:space="preserve">ס׳ 5(2) ו-20 לחוק ההתיישנות, התשי"ח–1958; ס׳ 159(ב) לחוק המקרקעין; וס׳ 78 לחוק הקרקעות העות׳מאני לעניין טענות חזקה היסטוריות. לניתוח מקיף ראו טל חבקין </w:t>
       </w:r>
       <w:r>
         <w:rPr>
@@ -11624,7 +12693,7 @@
           <w:szCs w:val="20"/>
           <w:rtl/>
         </w:rPr>
-        <w:t xml:space="preserve"> (מהדורה שנייה, 2021); שקד, </w:t>
+        <w:t xml:space="preserve"> (מהדורה שנייה 2021); שקד, </w:t>
       </w:r>
       <w:r>
         <w:rPr>
@@ -12464,7 +13533,7 @@
           <w:szCs w:val="20"/>
           <w:rtl/>
         </w:rPr>
-        <w:t xml:space="preserve">תק׳ 36–38 לתקנות התכנון והבניה (רישוי בניה), התשע"ו-2016; וקודם לכן תק׳ 2א לתקנות התכנון והבניה (בקשה להיתר, תנאיו ואגרות), התש"ל-1970. ההלכה חזרה והדגישה כי מוסדות התכנון אינם מכריעים בסכסוכי קניין.</w:t>
+        <w:t xml:space="preserve">תק׳ 36–38 לתקנות התכנון והבניה (רישוי בניה), התשע"ו–2016; וקודם לכן תק׳ 2א לתקנות התכנון והבניה (בקשה להיתר, תנאיו ואגרות), התש"ל–1970. ההלכה חזרה והדגישה כי מוסדות התכנון אינם מכריעים בסכסוכי קניין.</w:t>
       </w:r>
     </w:p>
   </w:footnote>
@@ -12749,7 +13818,7 @@
           <w:szCs w:val="20"/>
           <w:rtl/>
         </w:rPr>
-        <w:t xml:space="preserve">ס׳ 54(4) לפקודת הראיות [נוסח חדש], התשל"א-1971. ליישום מובהק ראו ה"פ (מחוזי י-ם) 48783-04-18 </w:t>
+        <w:t xml:space="preserve">ס׳ 54(4) לפקודת הראיות [נוסח חדש], התשל"א–1971. ליישום מובהק ראו ה"פ (מחוזי י-ם) 48783-04-18 </w:t>
       </w:r>
       <w:r>
         <w:rPr>
@@ -12865,7 +13934,7 @@
           <w:szCs w:val="20"/>
           <w:rtl/>
         </w:rPr>
-        <w:t xml:space="preserve">ס׳ 16(א) לחוק מיסוי מקרקעין (שבח ורכישה), התשכ"ג-1963 (להלן: חוק מיסוי מקרקעין). לניתוח מקיף של הסעיף ראו אבי גורמן ושי אהרונוביץ׳ </w:t>
+        <w:t xml:space="preserve">ס׳ 16(א) לחוק מיסוי מקרקעין (שבח ורכישה), התשכ"ג–1963 (להלן: חוק מיסוי מקרקעין). לניתוח מקיף של הסעיף ראו אבי גורמן ושי אהרונוביץ׳ </w:t>
       </w:r>
       <w:r>
         <w:rPr>
@@ -12995,7 +14064,7 @@
           <w:szCs w:val="20"/>
           <w:rtl/>
         </w:rPr>
-        <w:t xml:space="preserve">ס׳ 324(א) לפקודת העיריות [נוסח חדש]; ולעניין היטל השבחה – ס׳ 10 לתוספת השלישית לחוק התכנון והבנייה, התשכ"ה-1965.</w:t>
+        <w:t xml:space="preserve">ס׳ 324(א) לפקודת העיריות [נוסח חדש]; ולעניין היטל השבחה – ס׳ 10 לתוספת השלישית לחוק התכנון והבנייה, התשכ"ה–1965.</w:t>
       </w:r>
     </w:p>
   </w:footnote>
@@ -13079,7 +14148,27 @@
           <w:szCs w:val="20"/>
           <w:rtl/>
         </w:rPr>
-        <w:t xml:space="preserve">, מיסים כט(3) ה-320 (2015); גורמן ואהרונוביץ׳, </w:t>
+        <w:t xml:space="preserve">, </w:t>
+      </w:r>
+      <w:r>
+        <w:rPr>
+          <w:rFonts w:ascii="David" w:cs="David" w:eastAsia="David" w:hAnsi="David"/>
+          <w:i/>
+          <w:iCs/>
+          <w:sz w:val="20"/>
+          <w:szCs w:val="20"/>
+          <w:rtl/>
+        </w:rPr>
+        <w:t xml:space="preserve">מיסים</w:t>
+      </w:r>
+      <w:r>
+        <w:rPr>
+          <w:rFonts w:ascii="David" w:cs="David" w:eastAsia="David" w:hAnsi="David"/>
+          <w:sz w:val="20"/>
+          <w:szCs w:val="20"/>
+          <w:rtl/>
+        </w:rPr>
+        <w:t xml:space="preserve"> כט/3 ה-320 (2015); גורמן ואהרונוביץ׳, </w:t>
       </w:r>
       <w:r>
         <w:rPr>
@@ -13120,7 +14209,7 @@
           <w:szCs w:val="20"/>
           <w:rtl/>
         </w:rPr>
-        <w:t xml:space="preserve">ס׳ 197 לחוק התכנון והבנייה, התשכ"ה-1965; אהרן נמדר </w:t>
+        <w:t xml:space="preserve">ס׳ 197 לחוק התכנון והבנייה, התשכ"ה–1965; אהרן נמדר </w:t>
       </w:r>
       <w:r>
         <w:rPr>
@@ -13291,6 +14380,7 @@
       <w:r>
         <w:rPr>
           <w:rFonts w:ascii="Times New Roman" w:cs="Times New Roman" w:eastAsia="Times New Roman" w:hAnsi="Times New Roman"/>
+          <w:smallCaps/>
           <w:sz w:val="20"/>
           <w:szCs w:val="20"/>
         </w:rPr>
@@ -13387,7 +14477,27 @@
           <w:szCs w:val="20"/>
           <w:rtl/>
         </w:rPr>
-        <w:t xml:space="preserve">יוער כי תופעה מקבילה קיימת גם במשפט העברי, שיטת הדין הדתית הנוספת הפועלת בישראל: קרקע נקנית בו בכסף, בשטר, בחזקה או בקניין סודר – בלא כל דרישת רישום – ובבתי הדין הרבניים רווחת העמדה שעסקת מקרקעין תקפה אף בלא רישום, תוך מחלוקת אם מכוח הכלל "דינא דמלכותא דינא" יש לאמץ את דרישת הרישום של דין המדינה. ראו "חוזים על פי דיני התורה" כתר א 71–75 (תשנ"ו). מפאת קוצר היריעה לא יורחב הדיון בשיטה זו.</w:t>
+        <w:t xml:space="preserve">יוער כי תופעה מקבילה קיימת גם במשפט העברי, שיטת הדין הדתית הנוספת הפועלת בישראל: קרקע נקנית בו בכסף, בשטר, בחזקה או בקניין סודר – בלא כל דרישת רישום – ובבתי הדין הרבניים רווחת העמדה שעסקת מקרקעין תקפה אף בלא רישום, תוך מחלוקת אם מכוח הכלל "דינא דמלכותא דינא" יש לאמץ את דרישת הרישום של דין המדינה. ראו "חוזים על פי דיני התורה" </w:t>
+      </w:r>
+      <w:r>
+        <w:rPr>
+          <w:rFonts w:ascii="David" w:cs="David" w:eastAsia="David" w:hAnsi="David"/>
+          <w:i/>
+          <w:iCs/>
+          <w:sz w:val="20"/>
+          <w:szCs w:val="20"/>
+          <w:rtl/>
+        </w:rPr>
+        <w:t xml:space="preserve">כתר</w:t>
+      </w:r>
+      <w:r>
+        <w:rPr>
+          <w:rFonts w:ascii="David" w:cs="David" w:eastAsia="David" w:hAnsi="David"/>
+          <w:sz w:val="20"/>
+          <w:szCs w:val="20"/>
+          <w:rtl/>
+        </w:rPr>
+        <w:t xml:space="preserve"> א 71–75 (תשנ"ו). מפאת קוצר היריעה לא יורחב הדיון בשיטה זו.</w:t>
       </w:r>
     </w:p>
   </w:footnote>
@@ -13532,7 +14642,7 @@
           <w:sz w:val="20"/>
           <w:szCs w:val="20"/>
         </w:rPr>
-        <w:t xml:space="preserve">Land Registration Act 2002, s 27</w:t>
+        <w:t xml:space="preserve">Land Registration Act 2002, c. 9, § 27</w:t>
       </w:r>
       <w:r>
         <w:rPr>
@@ -13580,7 +14690,7 @@
           <w:sz w:val="20"/>
           <w:szCs w:val="20"/>
         </w:rPr>
-        <w:t xml:space="preserve">Land Registration Act 2002, sch 3, para 2</w:t>
+        <w:t xml:space="preserve">Land Registration Act 2002, c. 9, sch. 3, para. 2</w:t>
       </w:r>
       <w:r>
         <w:rPr>
@@ -13620,7 +14730,42 @@
           <w:sz w:val="20"/>
           <w:szCs w:val="20"/>
         </w:rPr>
-        <w:t xml:space="preserve">Chris Bevan, "Overriding Interests under the Land Registration Act 2002: Time to Repair the ‘Cracked Mirror’?" [2024] Conv. 123</w:t>
+        <w:t xml:space="preserve">Chris Bevan, </w:t>
+      </w:r>
+      <w:r>
+        <w:rPr>
+          <w:rFonts w:ascii="Times New Roman" w:cs="Times New Roman" w:eastAsia="Times New Roman" w:hAnsi="Times New Roman"/>
+          <w:i/>
+          <w:iCs/>
+          <w:sz w:val="20"/>
+          <w:szCs w:val="20"/>
+        </w:rPr>
+        <w:t xml:space="preserve">Overriding Interests under the Land Registration Act 2002: Time to Repair the ‘Cracked Mirror’?</w:t>
+      </w:r>
+      <w:r>
+        <w:rPr>
+          <w:rFonts w:ascii="Times New Roman" w:cs="Times New Roman" w:eastAsia="Times New Roman" w:hAnsi="Times New Roman"/>
+          <w:sz w:val="20"/>
+          <w:szCs w:val="20"/>
+        </w:rPr>
+        <w:t xml:space="preserve"> [2024] </w:t>
+      </w:r>
+      <w:r>
+        <w:rPr>
+          <w:rFonts w:ascii="Times New Roman" w:cs="Times New Roman" w:eastAsia="Times New Roman" w:hAnsi="Times New Roman"/>
+          <w:smallCaps/>
+          <w:sz w:val="20"/>
+          <w:szCs w:val="20"/>
+        </w:rPr>
+        <w:t xml:space="preserve">Conv.</w:t>
+      </w:r>
+      <w:r>
+        <w:rPr>
+          <w:rFonts w:ascii="Times New Roman" w:cs="Times New Roman" w:eastAsia="Times New Roman" w:hAnsi="Times New Roman"/>
+          <w:sz w:val="20"/>
+          <w:szCs w:val="20"/>
+        </w:rPr>
+        <w:t xml:space="preserve"> 123</w:t>
       </w:r>
       <w:r>
         <w:rPr>
@@ -13730,7 +14875,77 @@
           <w:sz w:val="20"/>
           <w:szCs w:val="20"/>
         </w:rPr>
-        <w:t xml:space="preserve">Alex Waghorn, "Promises in Equity and at Law: Proprietary Estoppel after Guest v Guest" (2023) 86 MLR 1504; Brian Sloan, "Proprietary Estoppel in the Supreme Court: Banquo’s Ghost?" (2023) 82 CLJ 13</w:t>
+        <w:t xml:space="preserve">Alex Waghorn, </w:t>
+      </w:r>
+      <w:r>
+        <w:rPr>
+          <w:rFonts w:ascii="Times New Roman" w:cs="Times New Roman" w:eastAsia="Times New Roman" w:hAnsi="Times New Roman"/>
+          <w:i/>
+          <w:iCs/>
+          <w:sz w:val="20"/>
+          <w:szCs w:val="20"/>
+        </w:rPr>
+        <w:t xml:space="preserve">Promises in Equity and at Law: Proprietary Estoppel after Guest v Guest</w:t>
+      </w:r>
+      <w:r>
+        <w:rPr>
+          <w:rFonts w:ascii="Times New Roman" w:cs="Times New Roman" w:eastAsia="Times New Roman" w:hAnsi="Times New Roman"/>
+          <w:sz w:val="20"/>
+          <w:szCs w:val="20"/>
+        </w:rPr>
+        <w:t xml:space="preserve">, (2023) 86 </w:t>
+      </w:r>
+      <w:r>
+        <w:rPr>
+          <w:rFonts w:ascii="Times New Roman" w:cs="Times New Roman" w:eastAsia="Times New Roman" w:hAnsi="Times New Roman"/>
+          <w:smallCaps/>
+          <w:sz w:val="20"/>
+          <w:szCs w:val="20"/>
+        </w:rPr>
+        <w:t xml:space="preserve">MLR</w:t>
+      </w:r>
+      <w:r>
+        <w:rPr>
+          <w:rFonts w:ascii="Times New Roman" w:cs="Times New Roman" w:eastAsia="Times New Roman" w:hAnsi="Times New Roman"/>
+          <w:sz w:val="20"/>
+          <w:szCs w:val="20"/>
+        </w:rPr>
+        <w:t xml:space="preserve"> 1504; Brian Sloan, </w:t>
+      </w:r>
+      <w:r>
+        <w:rPr>
+          <w:rFonts w:ascii="Times New Roman" w:cs="Times New Roman" w:eastAsia="Times New Roman" w:hAnsi="Times New Roman"/>
+          <w:i/>
+          <w:iCs/>
+          <w:sz w:val="20"/>
+          <w:szCs w:val="20"/>
+        </w:rPr>
+        <w:t xml:space="preserve">Proprietary Estoppel in the Supreme Court: Banquo’s Ghost?</w:t>
+      </w:r>
+      <w:r>
+        <w:rPr>
+          <w:rFonts w:ascii="Times New Roman" w:cs="Times New Roman" w:eastAsia="Times New Roman" w:hAnsi="Times New Roman"/>
+          <w:sz w:val="20"/>
+          <w:szCs w:val="20"/>
+        </w:rPr>
+        <w:t xml:space="preserve">, (2023) 82 </w:t>
+      </w:r>
+      <w:r>
+        <w:rPr>
+          <w:rFonts w:ascii="Times New Roman" w:cs="Times New Roman" w:eastAsia="Times New Roman" w:hAnsi="Times New Roman"/>
+          <w:smallCaps/>
+          <w:sz w:val="20"/>
+          <w:szCs w:val="20"/>
+        </w:rPr>
+        <w:t xml:space="preserve">CLJ</w:t>
+      </w:r>
+      <w:r>
+        <w:rPr>
+          <w:rFonts w:ascii="Times New Roman" w:cs="Times New Roman" w:eastAsia="Times New Roman" w:hAnsi="Times New Roman"/>
+          <w:sz w:val="20"/>
+          <w:szCs w:val="20"/>
+        </w:rPr>
+        <w:t xml:space="preserve"> 13</w:t>
       </w:r>
       <w:r>
         <w:rPr>
@@ -13761,7 +14976,7 @@
           <w:sz w:val="20"/>
           <w:szCs w:val="20"/>
         </w:rPr>
-        <w:t xml:space="preserve">Law of Property (Miscellaneous Provisions) Act 1989, ss 1–2</w:t>
+        <w:t xml:space="preserve">Law of Property (Miscellaneous Provisions) Act 1989, c. 34, §§ 1–2</w:t>
       </w:r>
       <w:r>
         <w:rPr>
@@ -13933,7 +15148,7 @@
           <w:sz w:val="20"/>
           <w:szCs w:val="20"/>
         </w:rPr>
-        <w:t xml:space="preserve">Powers of Attorney Act 1971, s 4</w:t>
+        <w:t xml:space="preserve">Powers of Attorney Act 1971, c. 27, § 4</w:t>
       </w:r>
       <w:r>
         <w:rPr>
@@ -14014,7 +15229,42 @@
           <w:sz w:val="20"/>
           <w:szCs w:val="20"/>
         </w:rPr>
-        <w:t xml:space="preserve">Nadav Shoked, "Who Needs Adverse Possession?," 89 Fordham L. Rev. 2639 (2021)</w:t>
+        <w:t xml:space="preserve">Nadav Shoked, </w:t>
+      </w:r>
+      <w:r>
+        <w:rPr>
+          <w:rFonts w:ascii="Times New Roman" w:cs="Times New Roman" w:eastAsia="Times New Roman" w:hAnsi="Times New Roman"/>
+          <w:i/>
+          <w:iCs/>
+          <w:sz w:val="20"/>
+          <w:szCs w:val="20"/>
+        </w:rPr>
+        <w:t xml:space="preserve">Who Needs Adverse Possession?</w:t>
+      </w:r>
+      <w:r>
+        <w:rPr>
+          <w:rFonts w:ascii="Times New Roman" w:cs="Times New Roman" w:eastAsia="Times New Roman" w:hAnsi="Times New Roman"/>
+          <w:sz w:val="20"/>
+          <w:szCs w:val="20"/>
+        </w:rPr>
+        <w:t xml:space="preserve">, 89 </w:t>
+      </w:r>
+      <w:r>
+        <w:rPr>
+          <w:rFonts w:ascii="Times New Roman" w:cs="Times New Roman" w:eastAsia="Times New Roman" w:hAnsi="Times New Roman"/>
+          <w:smallCaps/>
+          <w:sz w:val="20"/>
+          <w:szCs w:val="20"/>
+        </w:rPr>
+        <w:t xml:space="preserve">Fordham L. Rev.</w:t>
+      </w:r>
+      <w:r>
+        <w:rPr>
+          <w:rFonts w:ascii="Times New Roman" w:cs="Times New Roman" w:eastAsia="Times New Roman" w:hAnsi="Times New Roman"/>
+          <w:sz w:val="20"/>
+          <w:szCs w:val="20"/>
+        </w:rPr>
+        <w:t xml:space="preserve"> 2639 (2021)</w:t>
       </w:r>
       <w:r>
         <w:rPr>
@@ -14088,10 +15338,72 @@
       <w:r>
         <w:rPr>
           <w:rFonts w:ascii="Times New Roman" w:cs="Times New Roman" w:eastAsia="Times New Roman" w:hAnsi="Times New Roman"/>
-          <w:sz w:val="20"/>
-          <w:szCs w:val="20"/>
-        </w:rPr>
-        <w:t xml:space="preserve">“More than 90% of Egypt’s Properties Are Unregistered: Justice Minister,” Daily News Egypt (Feb. 14, 2022); “Egypt’s Property Registration Rate Remains Below 10%…: World Bank,” Daily News Egypt (July 5, 2026)</w:t>
+          <w:i/>
+          <w:iCs/>
+          <w:sz w:val="20"/>
+          <w:szCs w:val="20"/>
+        </w:rPr>
+        <w:t xml:space="preserve">More than 90% of Egypt’s Properties Are Unregistered: Justice Minister</w:t>
+      </w:r>
+      <w:r>
+        <w:rPr>
+          <w:rFonts w:ascii="Times New Roman" w:cs="Times New Roman" w:eastAsia="Times New Roman" w:hAnsi="Times New Roman"/>
+          <w:sz w:val="20"/>
+          <w:szCs w:val="20"/>
+        </w:rPr>
+        <w:t xml:space="preserve">, </w:t>
+      </w:r>
+      <w:r>
+        <w:rPr>
+          <w:rFonts w:ascii="Times New Roman" w:cs="Times New Roman" w:eastAsia="Times New Roman" w:hAnsi="Times New Roman"/>
+          <w:smallCaps/>
+          <w:sz w:val="20"/>
+          <w:szCs w:val="20"/>
+        </w:rPr>
+        <w:t xml:space="preserve">Daily News Egypt</w:t>
+      </w:r>
+      <w:r>
+        <w:rPr>
+          <w:rFonts w:ascii="Times New Roman" w:cs="Times New Roman" w:eastAsia="Times New Roman" w:hAnsi="Times New Roman"/>
+          <w:sz w:val="20"/>
+          <w:szCs w:val="20"/>
+        </w:rPr>
+        <w:t xml:space="preserve"> (Feb. 14, 2022); </w:t>
+      </w:r>
+      <w:r>
+        <w:rPr>
+          <w:rFonts w:ascii="Times New Roman" w:cs="Times New Roman" w:eastAsia="Times New Roman" w:hAnsi="Times New Roman"/>
+          <w:i/>
+          <w:iCs/>
+          <w:sz w:val="20"/>
+          <w:szCs w:val="20"/>
+        </w:rPr>
+        <w:t xml:space="preserve">Egypt’s Property Registration Rate Remains Below 10%…: World Bank</w:t>
+      </w:r>
+      <w:r>
+        <w:rPr>
+          <w:rFonts w:ascii="Times New Roman" w:cs="Times New Roman" w:eastAsia="Times New Roman" w:hAnsi="Times New Roman"/>
+          <w:sz w:val="20"/>
+          <w:szCs w:val="20"/>
+        </w:rPr>
+        <w:t xml:space="preserve">, </w:t>
+      </w:r>
+      <w:r>
+        <w:rPr>
+          <w:rFonts w:ascii="Times New Roman" w:cs="Times New Roman" w:eastAsia="Times New Roman" w:hAnsi="Times New Roman"/>
+          <w:smallCaps/>
+          <w:sz w:val="20"/>
+          <w:szCs w:val="20"/>
+        </w:rPr>
+        <w:t xml:space="preserve">Daily News Egypt</w:t>
+      </w:r>
+      <w:r>
+        <w:rPr>
+          <w:rFonts w:ascii="Times New Roman" w:cs="Times New Roman" w:eastAsia="Times New Roman" w:hAnsi="Times New Roman"/>
+          <w:sz w:val="20"/>
+          <w:szCs w:val="20"/>
+        </w:rPr>
+        <w:t xml:space="preserve"> (July 5, 2026)</w:t>
       </w:r>
       <w:r>
         <w:rPr>
@@ -14172,7 +15484,42 @@
           <w:sz w:val="20"/>
           <w:szCs w:val="20"/>
         </w:rPr>
-        <w:t xml:space="preserve">David Sims, "Securing Land Tenure in Egypt: Who Needs Registered Titles?" Metropolitics (June 14, 2016)</w:t>
+        <w:t xml:space="preserve">David Sims, </w:t>
+      </w:r>
+      <w:r>
+        <w:rPr>
+          <w:rFonts w:ascii="Times New Roman" w:cs="Times New Roman" w:eastAsia="Times New Roman" w:hAnsi="Times New Roman"/>
+          <w:i/>
+          <w:iCs/>
+          <w:sz w:val="20"/>
+          <w:szCs w:val="20"/>
+        </w:rPr>
+        <w:t xml:space="preserve">Securing Land Tenure in Egypt: Who Needs Registered Titles?</w:t>
+      </w:r>
+      <w:r>
+        <w:rPr>
+          <w:rFonts w:ascii="Times New Roman" w:cs="Times New Roman" w:eastAsia="Times New Roman" w:hAnsi="Times New Roman"/>
+          <w:sz w:val="20"/>
+          <w:szCs w:val="20"/>
+        </w:rPr>
+        <w:t xml:space="preserve">, </w:t>
+      </w:r>
+      <w:r>
+        <w:rPr>
+          <w:rFonts w:ascii="Times New Roman" w:cs="Times New Roman" w:eastAsia="Times New Roman" w:hAnsi="Times New Roman"/>
+          <w:smallCaps/>
+          <w:sz w:val="20"/>
+          <w:szCs w:val="20"/>
+        </w:rPr>
+        <w:t xml:space="preserve">Metropolitics</w:t>
+      </w:r>
+      <w:r>
+        <w:rPr>
+          <w:rFonts w:ascii="Times New Roman" w:cs="Times New Roman" w:eastAsia="Times New Roman" w:hAnsi="Times New Roman"/>
+          <w:sz w:val="20"/>
+          <w:szCs w:val="20"/>
+        </w:rPr>
+        <w:t xml:space="preserve"> (June 14, 2016)</w:t>
       </w:r>
       <w:r>
         <w:rPr>
@@ -14327,10 +15674,72 @@
       <w:r>
         <w:rPr>
           <w:rFonts w:ascii="Times New Roman" w:cs="Times New Roman" w:eastAsia="Times New Roman" w:hAnsi="Times New Roman"/>
-          <w:sz w:val="20"/>
-          <w:szCs w:val="20"/>
-        </w:rPr>
-        <w:t xml:space="preserve">“Sisi Orders Delaying Implementation of Controversial Real Estate Law for 2 Years,” Ahram Online (Feb. 28, 2021); “‘Unjust’: Egypt’s Property Registration Plans Face Popular Backlash,” Middle East Eye (2021)</w:t>
+          <w:i/>
+          <w:iCs/>
+          <w:sz w:val="20"/>
+          <w:szCs w:val="20"/>
+        </w:rPr>
+        <w:t xml:space="preserve">Sisi Orders Delaying Implementation of Controversial Real Estate Law for 2 Years</w:t>
+      </w:r>
+      <w:r>
+        <w:rPr>
+          <w:rFonts w:ascii="Times New Roman" w:cs="Times New Roman" w:eastAsia="Times New Roman" w:hAnsi="Times New Roman"/>
+          <w:sz w:val="20"/>
+          <w:szCs w:val="20"/>
+        </w:rPr>
+        <w:t xml:space="preserve">, </w:t>
+      </w:r>
+      <w:r>
+        <w:rPr>
+          <w:rFonts w:ascii="Times New Roman" w:cs="Times New Roman" w:eastAsia="Times New Roman" w:hAnsi="Times New Roman"/>
+          <w:smallCaps/>
+          <w:sz w:val="20"/>
+          <w:szCs w:val="20"/>
+        </w:rPr>
+        <w:t xml:space="preserve">Ahram Online</w:t>
+      </w:r>
+      <w:r>
+        <w:rPr>
+          <w:rFonts w:ascii="Times New Roman" w:cs="Times New Roman" w:eastAsia="Times New Roman" w:hAnsi="Times New Roman"/>
+          <w:sz w:val="20"/>
+          <w:szCs w:val="20"/>
+        </w:rPr>
+        <w:t xml:space="preserve"> (Feb. 28, 2021); </w:t>
+      </w:r>
+      <w:r>
+        <w:rPr>
+          <w:rFonts w:ascii="Times New Roman" w:cs="Times New Roman" w:eastAsia="Times New Roman" w:hAnsi="Times New Roman"/>
+          <w:i/>
+          <w:iCs/>
+          <w:sz w:val="20"/>
+          <w:szCs w:val="20"/>
+        </w:rPr>
+        <w:t xml:space="preserve">‘Unjust’: Egypt’s Property Registration Plans Face Popular Backlash</w:t>
+      </w:r>
+      <w:r>
+        <w:rPr>
+          <w:rFonts w:ascii="Times New Roman" w:cs="Times New Roman" w:eastAsia="Times New Roman" w:hAnsi="Times New Roman"/>
+          <w:sz w:val="20"/>
+          <w:szCs w:val="20"/>
+        </w:rPr>
+        <w:t xml:space="preserve">, </w:t>
+      </w:r>
+      <w:r>
+        <w:rPr>
+          <w:rFonts w:ascii="Times New Roman" w:cs="Times New Roman" w:eastAsia="Times New Roman" w:hAnsi="Times New Roman"/>
+          <w:smallCaps/>
+          <w:sz w:val="20"/>
+          <w:szCs w:val="20"/>
+        </w:rPr>
+        <w:t xml:space="preserve">Middle East Eye</w:t>
+      </w:r>
+      <w:r>
+        <w:rPr>
+          <w:rFonts w:ascii="Times New Roman" w:cs="Times New Roman" w:eastAsia="Times New Roman" w:hAnsi="Times New Roman"/>
+          <w:sz w:val="20"/>
+          <w:szCs w:val="20"/>
+        </w:rPr>
+        <w:t xml:space="preserve"> (2021)</w:t>
       </w:r>
       <w:r>
         <w:rPr>
@@ -14344,10 +15753,37 @@
       <w:r>
         <w:rPr>
           <w:rFonts w:ascii="Times New Roman" w:cs="Times New Roman" w:eastAsia="Times New Roman" w:hAnsi="Times New Roman"/>
-          <w:sz w:val="20"/>
-          <w:szCs w:val="20"/>
-        </w:rPr>
-        <w:t xml:space="preserve">“Real Estate Registration Law Amendments – Development Brief,” The Built Environment Observatory (May 2021)</w:t>
+          <w:i/>
+          <w:iCs/>
+          <w:sz w:val="20"/>
+          <w:szCs w:val="20"/>
+        </w:rPr>
+        <w:t xml:space="preserve">Real Estate Registration Law Amendments – Development Brief</w:t>
+      </w:r>
+      <w:r>
+        <w:rPr>
+          <w:rFonts w:ascii="Times New Roman" w:cs="Times New Roman" w:eastAsia="Times New Roman" w:hAnsi="Times New Roman"/>
+          <w:sz w:val="20"/>
+          <w:szCs w:val="20"/>
+        </w:rPr>
+        <w:t xml:space="preserve">, </w:t>
+      </w:r>
+      <w:r>
+        <w:rPr>
+          <w:rFonts w:ascii="Times New Roman" w:cs="Times New Roman" w:eastAsia="Times New Roman" w:hAnsi="Times New Roman"/>
+          <w:smallCaps/>
+          <w:sz w:val="20"/>
+          <w:szCs w:val="20"/>
+        </w:rPr>
+        <w:t xml:space="preserve">The Built Environment Observatory</w:t>
+      </w:r>
+      <w:r>
+        <w:rPr>
+          <w:rFonts w:ascii="Times New Roman" w:cs="Times New Roman" w:eastAsia="Times New Roman" w:hAnsi="Times New Roman"/>
+          <w:sz w:val="20"/>
+          <w:szCs w:val="20"/>
+        </w:rPr>
+        <w:t xml:space="preserve"> (May 2021)</w:t>
       </w:r>
       <w:r>
         <w:rPr>
@@ -14387,7 +15823,25 @@
           <w:sz w:val="20"/>
           <w:szCs w:val="20"/>
         </w:rPr>
-        <w:t xml:space="preserve">Shalakany Law Office, “New Amendments to Real Estate Registration Law” (2022)</w:t>
+        <w:t xml:space="preserve">Shalakany Law Office, </w:t>
+      </w:r>
+      <w:r>
+        <w:rPr>
+          <w:rFonts w:ascii="Times New Roman" w:cs="Times New Roman" w:eastAsia="Times New Roman" w:hAnsi="Times New Roman"/>
+          <w:i/>
+          <w:iCs/>
+          <w:sz w:val="20"/>
+          <w:szCs w:val="20"/>
+        </w:rPr>
+        <w:t xml:space="preserve">New Amendments to Real Estate Registration Law</w:t>
+      </w:r>
+      <w:r>
+        <w:rPr>
+          <w:rFonts w:ascii="Times New Roman" w:cs="Times New Roman" w:eastAsia="Times New Roman" w:hAnsi="Times New Roman"/>
+          <w:sz w:val="20"/>
+          <w:szCs w:val="20"/>
+        </w:rPr>
+        <w:t xml:space="preserve"> (2022)</w:t>
       </w:r>
       <w:r>
         <w:rPr>
@@ -14447,6 +15901,7 @@
       <w:r>
         <w:rPr>
           <w:rFonts w:ascii="Times New Roman" w:cs="Times New Roman" w:eastAsia="Times New Roman" w:hAnsi="Times New Roman"/>
+          <w:smallCaps/>
           <w:sz w:val="20"/>
           <w:szCs w:val="20"/>
         </w:rPr>
@@ -14459,7 +15914,7 @@
           <w:szCs w:val="20"/>
           <w:rtl/>
         </w:rPr>
-        <w:t xml:space="preserve">; חוק לביטול המג׳לה, התשמ"ד-1984.</w:t>
+        <w:t xml:space="preserve">; חוק לביטול המג׳לה, התשמ"ד–1984.</w:t>
       </w:r>
     </w:p>
   </w:footnote>
@@ -14487,10 +15942,54 @@
       <w:r>
         <w:rPr>
           <w:rFonts w:ascii="Times New Roman" w:cs="Times New Roman" w:eastAsia="Times New Roman" w:hAnsi="Times New Roman"/>
-          <w:sz w:val="20"/>
-          <w:szCs w:val="20"/>
-        </w:rPr>
-        <w:t xml:space="preserve">Joseph Schacht, An Introduction to Islamic Law (1964); Y. Linant de Bellefonds, “Hiba,” in The Encyclopaedia of Islam (2d ed.)</w:t>
+          <w:smallCaps/>
+          <w:sz w:val="20"/>
+          <w:szCs w:val="20"/>
+        </w:rPr>
+        <w:t xml:space="preserve">Joseph Schacht, An Introduction to Islamic Law (1964)</w:t>
+      </w:r>
+      <w:r>
+        <w:rPr>
+          <w:rFonts w:ascii="Times New Roman" w:cs="Times New Roman" w:eastAsia="Times New Roman" w:hAnsi="Times New Roman"/>
+          <w:sz w:val="20"/>
+          <w:szCs w:val="20"/>
+        </w:rPr>
+        <w:t xml:space="preserve">; Y. Linant de Bellefonds, </w:t>
+      </w:r>
+      <w:r>
+        <w:rPr>
+          <w:rFonts w:ascii="Times New Roman" w:cs="Times New Roman" w:eastAsia="Times New Roman" w:hAnsi="Times New Roman"/>
+          <w:i/>
+          <w:iCs/>
+          <w:sz w:val="20"/>
+          <w:szCs w:val="20"/>
+        </w:rPr>
+        <w:t xml:space="preserve">Hiba</w:t>
+      </w:r>
+      <w:r>
+        <w:rPr>
+          <w:rFonts w:ascii="Times New Roman" w:cs="Times New Roman" w:eastAsia="Times New Roman" w:hAnsi="Times New Roman"/>
+          <w:sz w:val="20"/>
+          <w:szCs w:val="20"/>
+        </w:rPr>
+        <w:t xml:space="preserve">, in </w:t>
+      </w:r>
+      <w:r>
+        <w:rPr>
+          <w:rFonts w:ascii="Times New Roman" w:cs="Times New Roman" w:eastAsia="Times New Roman" w:hAnsi="Times New Roman"/>
+          <w:smallCaps/>
+          <w:sz w:val="20"/>
+          <w:szCs w:val="20"/>
+        </w:rPr>
+        <w:t xml:space="preserve">The Encyclopaedia of Islam</w:t>
+      </w:r>
+      <w:r>
+        <w:rPr>
+          <w:rFonts w:ascii="Times New Roman" w:cs="Times New Roman" w:eastAsia="Times New Roman" w:hAnsi="Times New Roman"/>
+          <w:sz w:val="20"/>
+          <w:szCs w:val="20"/>
+        </w:rPr>
+        <w:t xml:space="preserve"> (2d ed.)</w:t>
       </w:r>
       <w:r>
         <w:rPr>
@@ -14553,7 +16052,42 @@
           <w:sz w:val="20"/>
           <w:szCs w:val="20"/>
         </w:rPr>
-        <w:t xml:space="preserve">Siti Norfatirah Abdul Rahmani &amp; Mohd Zamro Muda, “Ownership Status of Hibah Marad al-Mawt,” 34(8) al-Qanatir Int’l J. Islamic Stud. (2025)</w:t>
+        <w:t xml:space="preserve">Siti Norfatirah Abdul Rahmani &amp; Mohd Zamro Muda, </w:t>
+      </w:r>
+      <w:r>
+        <w:rPr>
+          <w:rFonts w:ascii="Times New Roman" w:cs="Times New Roman" w:eastAsia="Times New Roman" w:hAnsi="Times New Roman"/>
+          <w:i/>
+          <w:iCs/>
+          <w:sz w:val="20"/>
+          <w:szCs w:val="20"/>
+        </w:rPr>
+        <w:t xml:space="preserve">Ownership Status of Hibah Marad al-Mawt</w:t>
+      </w:r>
+      <w:r>
+        <w:rPr>
+          <w:rFonts w:ascii="Times New Roman" w:cs="Times New Roman" w:eastAsia="Times New Roman" w:hAnsi="Times New Roman"/>
+          <w:sz w:val="20"/>
+          <w:szCs w:val="20"/>
+        </w:rPr>
+        <w:t xml:space="preserve">, 34(8) </w:t>
+      </w:r>
+      <w:r>
+        <w:rPr>
+          <w:rFonts w:ascii="Times New Roman" w:cs="Times New Roman" w:eastAsia="Times New Roman" w:hAnsi="Times New Roman"/>
+          <w:smallCaps/>
+          <w:sz w:val="20"/>
+          <w:szCs w:val="20"/>
+        </w:rPr>
+        <w:t xml:space="preserve">al-Qanatir Int’l J. Islamic Stud.</w:t>
+      </w:r>
+      <w:r>
+        <w:rPr>
+          <w:rFonts w:ascii="Times New Roman" w:cs="Times New Roman" w:eastAsia="Times New Roman" w:hAnsi="Times New Roman"/>
+          <w:sz w:val="20"/>
+          <w:szCs w:val="20"/>
+        </w:rPr>
+        <w:t xml:space="preserve"> (2025)</w:t>
       </w:r>
       <w:r>
         <w:rPr>
@@ -14611,7 +16145,42 @@
           <w:sz w:val="20"/>
           <w:szCs w:val="20"/>
         </w:rPr>
-        <w:t xml:space="preserve">L. Landau, “The Gift Law, 1968,” 4 Isr. L. Rev. 260 (1969)</w:t>
+        <w:t xml:space="preserve">L. Landau, </w:t>
+      </w:r>
+      <w:r>
+        <w:rPr>
+          <w:rFonts w:ascii="Times New Roman" w:cs="Times New Roman" w:eastAsia="Times New Roman" w:hAnsi="Times New Roman"/>
+          <w:i/>
+          <w:iCs/>
+          <w:sz w:val="20"/>
+          <w:szCs w:val="20"/>
+        </w:rPr>
+        <w:t xml:space="preserve">The Gift Law, 1968</w:t>
+      </w:r>
+      <w:r>
+        <w:rPr>
+          <w:rFonts w:ascii="Times New Roman" w:cs="Times New Roman" w:eastAsia="Times New Roman" w:hAnsi="Times New Roman"/>
+          <w:sz w:val="20"/>
+          <w:szCs w:val="20"/>
+        </w:rPr>
+        <w:t xml:space="preserve">, 4 </w:t>
+      </w:r>
+      <w:r>
+        <w:rPr>
+          <w:rFonts w:ascii="Times New Roman" w:cs="Times New Roman" w:eastAsia="Times New Roman" w:hAnsi="Times New Roman"/>
+          <w:smallCaps/>
+          <w:sz w:val="20"/>
+          <w:szCs w:val="20"/>
+        </w:rPr>
+        <w:t xml:space="preserve">Isr. L. Rev.</w:t>
+      </w:r>
+      <w:r>
+        <w:rPr>
+          <w:rFonts w:ascii="Times New Roman" w:cs="Times New Roman" w:eastAsia="Times New Roman" w:hAnsi="Times New Roman"/>
+          <w:sz w:val="20"/>
+          <w:szCs w:val="20"/>
+        </w:rPr>
+        <w:t xml:space="preserve"> 260 (1969)</w:t>
       </w:r>
       <w:r>
         <w:rPr>
@@ -14666,7 +16235,7 @@
           <w:szCs w:val="20"/>
           <w:rtl/>
         </w:rPr>
-        <w:t xml:space="preserve">ס׳ 1674 למג׳לה. ההקבלה לס׳ 2 לחוק ההתיישנות, התשי"ח-1958, שאף הוא קובע התיישנות דיונית שאינה מפקיעה את הזכות, גלויה לעין.</w:t>
+        <w:t xml:space="preserve">ס׳ 1674 למג׳לה. ההקבלה לס׳ 2 לחוק ההתיישנות, התשי"ח–1958, שאף הוא קובע התיישנות דיונית שאינה מפקיעה את הזכות, גלויה לעין.</w:t>
       </w:r>
     </w:p>
   </w:footnote>
@@ -14697,7 +16266,42 @@
           <w:sz w:val="20"/>
           <w:szCs w:val="20"/>
         </w:rPr>
-        <w:t xml:space="preserve">Ahmad Amara, “Dispossession by Law: How the Israeli Judicial System Utilizes Ottoman Land Law to Expel and Dispossess the Bedouins,” J. Levantine Stud. (2015)</w:t>
+        <w:t xml:space="preserve">Ahmad Amara, </w:t>
+      </w:r>
+      <w:r>
+        <w:rPr>
+          <w:rFonts w:ascii="Times New Roman" w:cs="Times New Roman" w:eastAsia="Times New Roman" w:hAnsi="Times New Roman"/>
+          <w:i/>
+          <w:iCs/>
+          <w:sz w:val="20"/>
+          <w:szCs w:val="20"/>
+        </w:rPr>
+        <w:t xml:space="preserve">Dispossession by Law: How the Israeli Judicial System Utilizes Ottoman Land Law to Expel and Dispossess the Bedouins</w:t>
+      </w:r>
+      <w:r>
+        <w:rPr>
+          <w:rFonts w:ascii="Times New Roman" w:cs="Times New Roman" w:eastAsia="Times New Roman" w:hAnsi="Times New Roman"/>
+          <w:sz w:val="20"/>
+          <w:szCs w:val="20"/>
+        </w:rPr>
+        <w:t xml:space="preserve">, </w:t>
+      </w:r>
+      <w:r>
+        <w:rPr>
+          <w:rFonts w:ascii="Times New Roman" w:cs="Times New Roman" w:eastAsia="Times New Roman" w:hAnsi="Times New Roman"/>
+          <w:smallCaps/>
+          <w:sz w:val="20"/>
+          <w:szCs w:val="20"/>
+        </w:rPr>
+        <w:t xml:space="preserve">J. Levantine Stud.</w:t>
+      </w:r>
+      <w:r>
+        <w:rPr>
+          <w:rFonts w:ascii="Times New Roman" w:cs="Times New Roman" w:eastAsia="Times New Roman" w:hAnsi="Times New Roman"/>
+          <w:sz w:val="20"/>
+          <w:szCs w:val="20"/>
+        </w:rPr>
+        <w:t xml:space="preserve"> (2015)</w:t>
       </w:r>
       <w:r>
         <w:rPr>
@@ -14844,6 +16448,7 @@
       <w:r>
         <w:rPr>
           <w:rFonts w:ascii="Times New Roman" w:cs="Times New Roman" w:eastAsia="Times New Roman" w:hAnsi="Times New Roman"/>
+          <w:smallCaps/>
           <w:sz w:val="20"/>
           <w:szCs w:val="20"/>
         </w:rPr>
@@ -14875,6 +16480,7 @@
       <w:r>
         <w:rPr>
           <w:rFonts w:ascii="Times New Roman" w:cs="Times New Roman" w:eastAsia="Times New Roman" w:hAnsi="Times New Roman"/>
+          <w:smallCaps/>
           <w:sz w:val="20"/>
           <w:szCs w:val="20"/>
         </w:rPr>
@@ -14892,6 +16498,7 @@
       <w:r>
         <w:rPr>
           <w:rFonts w:ascii="Times New Roman" w:cs="Times New Roman" w:eastAsia="Times New Roman" w:hAnsi="Times New Roman"/>
+          <w:smallCaps/>
           <w:sz w:val="20"/>
           <w:szCs w:val="20"/>
         </w:rPr>
@@ -14926,7 +16533,42 @@
           <w:sz w:val="20"/>
           <w:szCs w:val="20"/>
         </w:rPr>
-        <w:t xml:space="preserve">Ruth Kark, “Consequences of the Ottoman Land Law: Agrarian and Privatization Processes in Palestine, 1858–1918,” in Societies, Social Inequalities and Marginalization 101 (R. Chand et al. eds., 2017)</w:t>
+        <w:t xml:space="preserve">Ruth Kark, </w:t>
+      </w:r>
+      <w:r>
+        <w:rPr>
+          <w:rFonts w:ascii="Times New Roman" w:cs="Times New Roman" w:eastAsia="Times New Roman" w:hAnsi="Times New Roman"/>
+          <w:i/>
+          <w:iCs/>
+          <w:sz w:val="20"/>
+          <w:szCs w:val="20"/>
+        </w:rPr>
+        <w:t xml:space="preserve">Consequences of the Ottoman Land Law: Agrarian and Privatization Processes in Palestine, 1858–1918</w:t>
+      </w:r>
+      <w:r>
+        <w:rPr>
+          <w:rFonts w:ascii="Times New Roman" w:cs="Times New Roman" w:eastAsia="Times New Roman" w:hAnsi="Times New Roman"/>
+          <w:sz w:val="20"/>
+          <w:szCs w:val="20"/>
+        </w:rPr>
+        <w:t xml:space="preserve">, in </w:t>
+      </w:r>
+      <w:r>
+        <w:rPr>
+          <w:rFonts w:ascii="Times New Roman" w:cs="Times New Roman" w:eastAsia="Times New Roman" w:hAnsi="Times New Roman"/>
+          <w:smallCaps/>
+          <w:sz w:val="20"/>
+          <w:szCs w:val="20"/>
+        </w:rPr>
+        <w:t xml:space="preserve">Societies, Social Inequalities and Marginalization</w:t>
+      </w:r>
+      <w:r>
+        <w:rPr>
+          <w:rFonts w:ascii="Times New Roman" w:cs="Times New Roman" w:eastAsia="Times New Roman" w:hAnsi="Times New Roman"/>
+          <w:sz w:val="20"/>
+          <w:szCs w:val="20"/>
+        </w:rPr>
+        <w:t xml:space="preserve"> 101 (R. Chand et al. eds., 2017)</w:t>
       </w:r>
       <w:r>
         <w:rPr>
@@ -14984,7 +16626,42 @@
           <w:sz w:val="20"/>
           <w:szCs w:val="20"/>
         </w:rPr>
-        <w:t xml:space="preserve">Kareem Ibrahim &amp; Deena Khalil, “Land Titling: A Tool, not a Panacea — Insights from Egypt,” Metropolitics (Dec. 20, 2016)</w:t>
+        <w:t xml:space="preserve">Kareem Ibrahim &amp; Deena Khalil, </w:t>
+      </w:r>
+      <w:r>
+        <w:rPr>
+          <w:rFonts w:ascii="Times New Roman" w:cs="Times New Roman" w:eastAsia="Times New Roman" w:hAnsi="Times New Roman"/>
+          <w:i/>
+          <w:iCs/>
+          <w:sz w:val="20"/>
+          <w:szCs w:val="20"/>
+        </w:rPr>
+        <w:t xml:space="preserve">Land Titling: A Tool, not a Panacea — Insights from Egypt</w:t>
+      </w:r>
+      <w:r>
+        <w:rPr>
+          <w:rFonts w:ascii="Times New Roman" w:cs="Times New Roman" w:eastAsia="Times New Roman" w:hAnsi="Times New Roman"/>
+          <w:sz w:val="20"/>
+          <w:szCs w:val="20"/>
+        </w:rPr>
+        <w:t xml:space="preserve">, </w:t>
+      </w:r>
+      <w:r>
+        <w:rPr>
+          <w:rFonts w:ascii="Times New Roman" w:cs="Times New Roman" w:eastAsia="Times New Roman" w:hAnsi="Times New Roman"/>
+          <w:smallCaps/>
+          <w:sz w:val="20"/>
+          <w:szCs w:val="20"/>
+        </w:rPr>
+        <w:t xml:space="preserve">Metropolitics</w:t>
+      </w:r>
+      <w:r>
+        <w:rPr>
+          <w:rFonts w:ascii="Times New Roman" w:cs="Times New Roman" w:eastAsia="Times New Roman" w:hAnsi="Times New Roman"/>
+          <w:sz w:val="20"/>
+          <w:szCs w:val="20"/>
+        </w:rPr>
+        <w:t xml:space="preserve"> (Dec. 20, 2016)</w:t>
       </w:r>
       <w:r>
         <w:rPr>

</xml_diff>

<commit_message>
Add abstract page between cover and table of contents
Three-paragraph Hebrew abstract: topic and research questions with method; findings on the judicial toolbox, administrative evidence and the tax-registration barrier; comparative anchoring and integrated recommendations. Styled outside the heading hierarchy so it stays out of the TOC.

Co-Authored-By: Claude Fable 5 <noreply@anthropic.com>
Claude-Session: https://claude.ai/code/session_01PTzmkyUzTNm9DT35momqLP
</commit_message>
<xml_diff>
--- a/seminar/סמינריון-מקרקעין-לא-רשומים.docx
+++ b/seminar/סמינריון-מקרקעין-לא-רשומים.docx
@@ -213,6 +213,85 @@
           <w:rtl/>
         </w:rPr>
         <w:t xml:space="preserve">הערות השוליים והביבליוגרפיה ערוכות על פי כללי האזכור האחיד בכתיבה המשפטית (מהדורה שלישית 2021)</w:t>
+      </w:r>
+    </w:p>
+    <w:p>
+      <w:pPr>
+        <w:sectPr>
+          <w:pgSz w:w="11906" w:h="16838" w:orient="portrait"/>
+          <w:pgMar w:top="1440" w:right="1440" w:bottom="1440" w:left="1440" w:header="708" w:footer="708" w:gutter="0"/>
+          <w:pgNumType/>
+          <w:docGrid w:linePitch="360"/>
+        </w:sectPr>
+      </w:pPr>
+    </w:p>
+    <w:p>
+      <w:pPr>
+        <w:bidi/>
+        <w:spacing w:after="240"/>
+        <w:jc w:val="center"/>
+      </w:pPr>
+      <w:r>
+        <w:rPr>
+          <w:rFonts w:ascii="David" w:cs="David" w:eastAsia="David" w:hAnsi="David"/>
+          <w:b/>
+          <w:bCs/>
+          <w:sz w:val="32"/>
+          <w:szCs w:val="32"/>
+          <w:rtl/>
+        </w:rPr>
+        <w:t xml:space="preserve">תקציר</w:t>
+      </w:r>
+    </w:p>
+    <w:p>
+      <w:pPr>
+        <w:bidi/>
+        <w:spacing w:after="160" w:line="360"/>
+        <w:ind w:firstLine="420"/>
+        <w:jc w:val="both"/>
+      </w:pPr>
+      <w:r>
+        <w:rPr>
+          <w:rFonts w:ascii="David" w:cs="David" w:eastAsia="David" w:hAnsi="David"/>
+          <w:sz w:val="24"/>
+          <w:szCs w:val="24"/>
+          <w:rtl/>
+        </w:rPr>
+        <w:t xml:space="preserve">עבודה זו בוחנת כיצד מכריעים בתי המשפט בישראל בזכויות במקרקעין לא רשומים בסכסוכים פנים משפחתיים בחברה הערבית, שבה חלק ניכר מן הקרקעות מוחזק ומועבר מדור לדור על יסוד הסכמות בעל פה, ייפויי כוח בלתי חוזרים ישנים וחלוקות משפחתיות שלא נרשמו ולא דווחו לרשויות המס. העבודה נסבה על שלוש שאלות: מהם הכלים המשפטיים והראייתיים שבהם מתמודדים בתי המשפט עם היעדר הרישום; מהן ההשלכות הכלכליות של התניית הרישום בהסדרת מס לגבי עסקאות היסטוריות שלא דווחו במועדן; ומהו משקלם הראייתי של היתרי בנייה ותשלומי ארנונה כראיה לבעלות. הבירור נערך בשיטה דוקטרינרית ביקורתית, בצירוף עיון משווה פונקציונלי בשלוש שיטות: המשפט המקובל האנגלי, המשפט המצרי והמשפט השרעי האסלאמי.</w:t>
+      </w:r>
+    </w:p>
+    <w:p>
+      <w:pPr>
+        <w:bidi/>
+        <w:spacing w:after="160" w:line="360"/>
+        <w:ind w:firstLine="420"/>
+        <w:jc w:val="both"/>
+      </w:pPr>
+      <w:r>
+        <w:rPr>
+          <w:rFonts w:ascii="David" w:cs="David" w:eastAsia="David" w:hAnsi="David"/>
+          <w:sz w:val="24"/>
+          <w:szCs w:val="24"/>
+          <w:rtl/>
+        </w:rPr>
+        <w:t xml:space="preserve">ממצאי העבודה מלמדים כי הפסיקה פיתחה ארגז כלים עשיר, ובו הזכות שביושר, הכרה בייפוי הכוח הבלתי חוזר כמסמך העסקה וכוויתור על חזרה ממתנה, עקרון תום הלב ו"זעקת ההגינות", והרישיון במקרקעין; ואולם כל אלה הם פתרונות בדיעבד, התלויים בשיקול דעת שיפוטי רחב, והם מכריעים בסכסוך בלא לרפא את הכשל המבני. היתרי הבנייה והארנונה נמצאו ראיות נסיבתיות להחזקה ולהסכמה המשפחתית שבזמן אמת, אך לא ראיות בעלות, ועצם ההישענות עליהן חושפת היפוך תפקידים מוסדי שבו רשויות התכנון והגבייה משמשות רשם בפועל. ואילו "התניית הרישום" בהסדרת המס ההיסטורית נמצאה החסם המבני המרכזי: היא מקימה מלכוד כלכלי רב דורי, שבו עלות ההסדרה גדלה משנה לשנה, והוא המשמר את אי הרישום ומזין את הסכסוכים עצמם.</w:t>
+      </w:r>
+    </w:p>
+    <w:p>
+      <w:pPr>
+        <w:bidi/>
+        <w:spacing w:after="160" w:line="360"/>
+        <w:ind w:firstLine="420"/>
+        <w:jc w:val="both"/>
+      </w:pPr>
+      <w:r>
+        <w:rPr>
+          <w:rFonts w:ascii="David" w:cs="David" w:eastAsia="David" w:hAnsi="David"/>
+          <w:sz w:val="24"/>
+          <w:szCs w:val="24"/>
+          <w:rtl/>
+        </w:rPr>
+        <w:t xml:space="preserve">המבט המשווה מעגן את הממצאים בהקשר רחב: הדין האנגלי מלמד כי ניתן למסגר את ההגנה על המסתמך בעילה סדורה (השתק קנייני) ולקיים מרשם נגיש שאינו כרוך במס; הניסיון המצרי מדגים כיצד צימוד רישום ומס הוליד אי רישום המוני, עד שנותק ברפורמה של שנת 2022; והמשפט השרעי, שעל ברכיו נוצרו דפוסי ההחזקה הנחקרים, מציב את התפיסה וההחזקה הגלויה במרכז ההקניה ומסביר את התודעה הקניינית של הצדדים. מסקנת העבודה היא כי נקודת הכובד חייבת לנוע מן ההכרעה השיפוטית בדיעבד אל הסרת החסמים מראש, בשלושה מישורים משולבים: הסדרה פיסקלית מקילה לעסקאות היסטוריות, השלמת הליכי ההסדר בשיתוף הקהילות, ומסגור דוקטרינרי יציב של ההגנה על המסתמך.</w:t>
       </w:r>
     </w:p>
     <w:p>

</xml_diff>

<commit_message>
Add Ono Academic College logo and institution name to cover page
Co-Authored-By: Claude Fable 5 <noreply@anthropic.com>
Claude-Session: https://claude.ai/code/session_01PTzmkyUzTNm9DT35momqLP
</commit_message>
<xml_diff>
--- a/seminar/סמינריון-מקרקעין-לא-רשומים.docx
+++ b/seminar/סמינריון-מקרקעין-לא-רשומים.docx
@@ -5,7 +5,7 @@
     <w:p>
       <w:pPr>
         <w:bidi/>
-        <w:spacing w:after="600"/>
+        <w:spacing w:after="300"/>
         <w:jc w:val="center"/>
       </w:pPr>
       <w:r>
@@ -22,6 +22,52 @@
     </w:p>
     <w:p>
       <w:pPr>
+        <w:spacing w:after="240"/>
+        <w:jc w:val="center"/>
+      </w:pPr>
+      <w:r>
+        <w:drawing>
+          <wp:inline distT="0" distB="0" distL="0" distR="0">
+            <wp:extent cx="1428750" cy="1428750"/>
+            <wp:effectExtent t="0" r="0" b="0" l="0"/>
+            <wp:docPr id="1" name="" descr="" title=""/>
+            <wp:cNvGraphicFramePr>
+              <a:graphicFrameLocks xmlns:a="http://schemas.openxmlformats.org/drawingml/2006/main" noChangeAspect="1"/>
+            </wp:cNvGraphicFramePr>
+            <a:graphic xmlns:a="http://schemas.openxmlformats.org/drawingml/2006/main">
+              <a:graphicData uri="http://schemas.openxmlformats.org/drawingml/2006/picture">
+                <pic:pic xmlns:pic="http://schemas.openxmlformats.org/drawingml/2006/picture">
+                  <pic:nvPicPr>
+                    <pic:cNvPr id="0" name="" descr=""/>
+                    <pic:cNvPicPr>
+                      <a:picLocks noChangeAspect="1" noChangeArrowheads="1"/>
+                    </pic:cNvPicPr>
+                  </pic:nvPicPr>
+                  <pic:blipFill>
+                    <a:blip r:embed="rId8" cstate="none"/>
+                    <a:srcRect/>
+                    <a:stretch>
+                      <a:fillRect/>
+                    </a:stretch>
+                  </pic:blipFill>
+                  <pic:spPr bwMode="auto">
+                    <a:xfrm>
+                      <a:off x="0" y="0"/>
+                      <a:ext cx="1428750" cy="1428750"/>
+                    </a:xfrm>
+                    <a:prstGeom prst="rect">
+                      <a:avLst/>
+                    </a:prstGeom>
+                  </pic:spPr>
+                </pic:pic>
+              </a:graphicData>
+            </a:graphic>
+          </wp:inline>
+        </w:drawing>
+      </w:r>
+    </w:p>
+    <w:p>
+      <w:pPr>
         <w:bidi/>
         <w:spacing w:after="120"/>
         <w:jc w:val="center"/>
@@ -35,13 +81,13 @@
           <w:szCs w:val="28"/>
           <w:rtl/>
         </w:rPr>
-        <w:t xml:space="preserve">[שם המוסד האקדמי]</w:t>
-      </w:r>
-    </w:p>
-    <w:p>
-      <w:pPr>
-        <w:bidi/>
-        <w:spacing w:after="900"/>
+        <w:t xml:space="preserve">הקריה האקדמית אונו</w:t>
+      </w:r>
+    </w:p>
+    <w:p>
+      <w:pPr>
+        <w:bidi/>
+        <w:spacing w:after="700"/>
         <w:jc w:val="center"/>
       </w:pPr>
       <w:r>

</xml_diff>

<commit_message>
Align first line of opening paragraphs: no first-line indent after headings
Adds a pn() paragraph helper (justified, no first-line indent) and applies it to the first paragraph after every heading across all chapters, plus the abstract's opening paragraph, per standard academic typography.

Co-Authored-By: Claude Fable 5 <noreply@anthropic.com>
Claude-Session: https://claude.ai/code/session_01PTzmkyUzTNm9DT35momqLP
</commit_message>
<xml_diff>
--- a/seminar/סמינריון-מקרקעין-לא-רשומים.docx
+++ b/seminar/סמינריון-מקרקעין-לא-רשומים.docx
@@ -293,7 +293,6 @@
       <w:pPr>
         <w:bidi/>
         <w:spacing w:after="160" w:line="360"/>
-        <w:ind w:firstLine="420"/>
         <w:jc w:val="both"/>
       </w:pPr>
       <w:r>
@@ -420,7 +419,6 @@
       <w:pPr>
         <w:bidi/>
         <w:spacing w:after="160" w:line="360"/>
-        <w:ind w:firstLine="420"/>
         <w:jc w:val="both"/>
       </w:pPr>
       <w:r>
@@ -619,7 +617,6 @@
       <w:pPr>
         <w:bidi/>
         <w:spacing w:after="160" w:line="360"/>
-        <w:ind w:firstLine="420"/>
         <w:jc w:val="both"/>
       </w:pPr>
       <w:r>
@@ -670,7 +667,6 @@
       <w:pPr>
         <w:bidi/>
         <w:spacing w:after="160" w:line="360"/>
-        <w:ind w:firstLine="420"/>
         <w:jc w:val="both"/>
       </w:pPr>
       <w:r>
@@ -856,7 +852,6 @@
       <w:pPr>
         <w:bidi/>
         <w:spacing w:after="160" w:line="360"/>
-        <w:ind w:firstLine="420"/>
         <w:jc w:val="both"/>
       </w:pPr>
       <w:r>
@@ -1022,7 +1017,6 @@
       <w:pPr>
         <w:bidi/>
         <w:spacing w:after="160" w:line="360"/>
-        <w:ind w:firstLine="420"/>
         <w:jc w:val="both"/>
       </w:pPr>
       <w:r>
@@ -1094,7 +1088,6 @@
       <w:pPr>
         <w:bidi/>
         <w:spacing w:after="160" w:line="360"/>
-        <w:ind w:firstLine="420"/>
         <w:jc w:val="both"/>
       </w:pPr>
       <w:r>
@@ -1189,7 +1182,6 @@
       <w:pPr>
         <w:bidi/>
         <w:spacing w:after="160" w:line="360"/>
-        <w:ind w:firstLine="420"/>
         <w:jc w:val="both"/>
       </w:pPr>
       <w:r>
@@ -1270,7 +1262,6 @@
       <w:pPr>
         <w:bidi/>
         <w:spacing w:after="160" w:line="360"/>
-        <w:ind w:firstLine="420"/>
         <w:jc w:val="both"/>
       </w:pPr>
       <w:r>
@@ -1395,7 +1386,6 @@
       <w:pPr>
         <w:bidi/>
         <w:spacing w:after="160" w:line="360"/>
-        <w:ind w:firstLine="420"/>
         <w:jc w:val="both"/>
       </w:pPr>
       <w:r>
@@ -1488,7 +1478,6 @@
       <w:pPr>
         <w:bidi/>
         <w:spacing w:after="160" w:line="360"/>
-        <w:ind w:firstLine="420"/>
         <w:jc w:val="both"/>
       </w:pPr>
       <w:r>
@@ -1675,7 +1664,6 @@
       <w:pPr>
         <w:bidi/>
         <w:spacing w:after="160" w:line="360"/>
-        <w:ind w:firstLine="420"/>
         <w:jc w:val="both"/>
       </w:pPr>
       <w:r>
@@ -1977,7 +1965,6 @@
       <w:pPr>
         <w:bidi/>
         <w:spacing w:after="160" w:line="360"/>
-        <w:ind w:firstLine="420"/>
         <w:jc w:val="both"/>
       </w:pPr>
       <w:r>
@@ -2320,7 +2307,6 @@
       <w:pPr>
         <w:bidi/>
         <w:spacing w:after="160" w:line="360"/>
-        <w:ind w:firstLine="420"/>
         <w:jc w:val="both"/>
       </w:pPr>
       <w:r>
@@ -2497,7 +2483,6 @@
       <w:pPr>
         <w:bidi/>
         <w:spacing w:after="160" w:line="360"/>
-        <w:ind w:firstLine="420"/>
         <w:jc w:val="both"/>
       </w:pPr>
       <w:r>
@@ -2749,7 +2734,6 @@
       <w:pPr>
         <w:bidi/>
         <w:spacing w:after="160" w:line="360"/>
-        <w:ind w:firstLine="420"/>
         <w:jc w:val="both"/>
       </w:pPr>
       <w:r>
@@ -2806,7 +2790,6 @@
       <w:pPr>
         <w:bidi/>
         <w:spacing w:after="160" w:line="360"/>
-        <w:ind w:firstLine="420"/>
         <w:jc w:val="both"/>
       </w:pPr>
       <w:r>
@@ -3109,7 +3092,6 @@
       <w:pPr>
         <w:bidi/>
         <w:spacing w:after="160" w:line="360"/>
-        <w:ind w:firstLine="420"/>
         <w:jc w:val="both"/>
       </w:pPr>
       <w:r>
@@ -3187,7 +3169,6 @@
       <w:pPr>
         <w:bidi/>
         <w:spacing w:after="160" w:line="360"/>
-        <w:ind w:firstLine="420"/>
         <w:jc w:val="both"/>
       </w:pPr>
       <w:r>
@@ -3302,7 +3283,6 @@
       <w:pPr>
         <w:bidi/>
         <w:spacing w:after="160" w:line="360"/>
-        <w:ind w:firstLine="420"/>
         <w:jc w:val="both"/>
       </w:pPr>
       <w:r>
@@ -3368,7 +3348,6 @@
       <w:pPr>
         <w:bidi/>
         <w:spacing w:after="160" w:line="360"/>
-        <w:ind w:firstLine="420"/>
         <w:jc w:val="both"/>
       </w:pPr>
       <w:r>
@@ -3419,7 +3398,6 @@
       <w:pPr>
         <w:bidi/>
         <w:spacing w:after="160" w:line="360"/>
-        <w:ind w:firstLine="420"/>
         <w:jc w:val="both"/>
       </w:pPr>
       <w:r>
@@ -3496,7 +3474,6 @@
       <w:pPr>
         <w:bidi/>
         <w:spacing w:after="160" w:line="360"/>
-        <w:ind w:firstLine="420"/>
         <w:jc w:val="both"/>
       </w:pPr>
       <w:r>
@@ -3566,7 +3543,6 @@
       <w:pPr>
         <w:bidi/>
         <w:spacing w:after="160" w:line="360"/>
-        <w:ind w:firstLine="420"/>
         <w:jc w:val="both"/>
       </w:pPr>
       <w:r>
@@ -3730,7 +3706,6 @@
       <w:pPr>
         <w:bidi/>
         <w:spacing w:after="160" w:line="360"/>
-        <w:ind w:firstLine="420"/>
         <w:jc w:val="both"/>
       </w:pPr>
       <w:r>
@@ -3813,7 +3788,6 @@
       <w:pPr>
         <w:bidi/>
         <w:spacing w:after="160" w:line="360"/>
-        <w:ind w:firstLine="420"/>
         <w:jc w:val="both"/>
       </w:pPr>
       <w:r>
@@ -3936,7 +3910,6 @@
       <w:pPr>
         <w:bidi/>
         <w:spacing w:after="160" w:line="360"/>
-        <w:ind w:firstLine="420"/>
         <w:jc w:val="both"/>
       </w:pPr>
       <w:r>
@@ -3997,7 +3970,6 @@
       <w:pPr>
         <w:bidi/>
         <w:spacing w:after="160" w:line="360"/>
-        <w:ind w:firstLine="420"/>
         <w:jc w:val="both"/>
       </w:pPr>
       <w:r>
@@ -4127,7 +4099,6 @@
       <w:pPr>
         <w:bidi/>
         <w:spacing w:after="160" w:line="360"/>
-        <w:ind w:firstLine="420"/>
         <w:jc w:val="both"/>
       </w:pPr>
       <w:r>
@@ -4235,7 +4206,6 @@
       <w:pPr>
         <w:bidi/>
         <w:spacing w:after="160" w:line="360"/>
-        <w:ind w:firstLine="420"/>
         <w:jc w:val="both"/>
       </w:pPr>
       <w:r>
@@ -4408,7 +4378,6 @@
       <w:pPr>
         <w:bidi/>
         <w:spacing w:after="160" w:line="360"/>
-        <w:ind w:firstLine="420"/>
         <w:jc w:val="both"/>
       </w:pPr>
       <w:r>
@@ -4634,7 +4603,6 @@
       <w:pPr>
         <w:bidi/>
         <w:spacing w:after="160" w:line="360"/>
-        <w:ind w:firstLine="420"/>
         <w:jc w:val="both"/>
       </w:pPr>
       <w:r>
@@ -4721,7 +4689,6 @@
       <w:pPr>
         <w:bidi/>
         <w:spacing w:after="160" w:line="360"/>
-        <w:ind w:firstLine="420"/>
         <w:jc w:val="both"/>
       </w:pPr>
       <w:r>
@@ -4778,7 +4745,6 @@
       <w:pPr>
         <w:bidi/>
         <w:spacing w:after="160" w:line="360"/>
-        <w:ind w:firstLine="420"/>
         <w:jc w:val="both"/>
       </w:pPr>
       <w:r>
@@ -4865,7 +4831,6 @@
       <w:pPr>
         <w:bidi/>
         <w:spacing w:after="160" w:line="360"/>
-        <w:ind w:firstLine="420"/>
         <w:jc w:val="both"/>
       </w:pPr>
       <w:r>
@@ -4965,7 +4930,6 @@
       <w:pPr>
         <w:bidi/>
         <w:spacing w:after="160" w:line="360"/>
-        <w:ind w:firstLine="420"/>
         <w:jc w:val="both"/>
       </w:pPr>
       <w:r>
@@ -5016,7 +4980,6 @@
       <w:pPr>
         <w:bidi/>
         <w:spacing w:after="160" w:line="360"/>
-        <w:ind w:firstLine="420"/>
         <w:jc w:val="both"/>
       </w:pPr>
       <w:r>
@@ -5111,7 +5074,6 @@
       <w:pPr>
         <w:bidi/>
         <w:spacing w:after="160" w:line="360"/>
-        <w:ind w:firstLine="420"/>
         <w:jc w:val="both"/>
       </w:pPr>
       <w:r>
@@ -5218,7 +5180,6 @@
       <w:pPr>
         <w:bidi/>
         <w:spacing w:after="160" w:line="360"/>
-        <w:ind w:firstLine="420"/>
         <w:jc w:val="both"/>
       </w:pPr>
       <w:r>
@@ -5329,7 +5290,6 @@
       <w:pPr>
         <w:bidi/>
         <w:spacing w:after="160" w:line="360"/>
-        <w:ind w:firstLine="420"/>
         <w:jc w:val="both"/>
       </w:pPr>
       <w:r>
@@ -5466,7 +5426,6 @@
       <w:pPr>
         <w:bidi/>
         <w:spacing w:after="160" w:line="360"/>
-        <w:ind w:firstLine="420"/>
         <w:jc w:val="both"/>
       </w:pPr>
       <w:r>
@@ -5663,7 +5622,6 @@
       <w:pPr>
         <w:bidi/>
         <w:spacing w:after="160" w:line="360"/>
-        <w:ind w:firstLine="420"/>
         <w:jc w:val="both"/>
       </w:pPr>
       <w:r>

</xml_diff>